<commit_message>
assess exchange success per run
</commit_message>
<xml_diff>
--- a/Manuscript/GABI_palaeo_constraints.docx
+++ b/Manuscript/GABI_palaeo_constraints.docx
@@ -134,22 +134,13 @@
         <w:t xml:space="preserve">² Centro de Investigación Mariña, Departamento de Ecoloxía e Bioloxía Animal, Universidade de Vigo, Campus Lagoas-Marcosende, 36310 Vigo, Spain</w:t>
       </w:r>
     </w:p>
-    <w:bookmarkStart w:id="21" w:name="materials-and-methods"/>
+    <w:bookmarkStart w:id="20" w:name="potential-journals"/>
     <w:p>
       <w:pPr>
         <w:pStyle w:val="Heading1"/>
       </w:pPr>
       <w:r>
-        <w:t xml:space="preserve">Materials and methods</w:t>
-      </w:r>
-    </w:p>
-    <w:bookmarkStart w:id="20" w:name="palaeoclimate-data"/>
-    <w:p>
-      <w:pPr>
-        <w:pStyle w:val="Heading2"/>
-      </w:pPr>
-      <w:r>
-        <w:t xml:space="preserve">Palaeoclimate data</w:t>
+        <w:t xml:space="preserve">Potential journals</w:t>
       </w:r>
     </w:p>
     <w:p>
@@ -157,60 +148,541 @@
         <w:pStyle w:val="FirstParagraph"/>
       </w:pPr>
       <w:r>
-        <w:t xml:space="preserve">We used the spatio-temporal palaeoclimate series from the PALEO-PGEM atmosphere-ocean general circulation model</w:t>
-      </w:r>
-      <w:r>
-        <w:t xml:space="preserve"> </w:t>
-      </w:r>
-      <w:r>
-        <w:t xml:space="preserve">Holden et al. (2019)</w:t>
-      </w:r>
-      <w:r>
-        <w:t xml:space="preserve">, covering the last 5 Myrs with a 1</w:t>
-      </w:r>
-      <w:r>
-        <w:t xml:space="preserve"> </w:t>
-      </w:r>
-      <w:r>
-        <w:t xml:space="preserve"> </w:t>
-      </w:r>
-      <w:r>
-        <w:t xml:space="preserve">° of spatial resolution</w:t>
-      </w:r>
-      <w:r>
-        <w:t xml:space="preserve"> </w:t>
-      </w:r>
-      <w:r>
-        <w:t xml:space="preserve">Barreto et al. (2023)</w:t>
-      </w:r>
-      <w:r>
-        <w:t xml:space="preserve">. For the scope of this work, we used two bioclimatic variables: mean annual temperature (MAT, BIO1) and mean annual precipitation (MAP, BIO12).</w:t>
+        <w:t xml:space="preserve">Global ecology &amp; Biogeography? Journal of Biogeography?</w:t>
       </w:r>
     </w:p>
     <w:bookmarkEnd w:id="20"/>
+    <w:bookmarkStart w:id="24" w:name="introduction"/>
+    <w:p>
+      <w:pPr>
+        <w:pStyle w:val="Heading1"/>
+      </w:pPr>
+      <w:r>
+        <w:t xml:space="preserve">Introduction</w:t>
+      </w:r>
+    </w:p>
+    <w:bookmarkStart w:id="21" w:name="X9b434546b88f86cade7bd2a962b555402145bbd"/>
+    <w:p>
+      <w:pPr>
+        <w:pStyle w:val="Heading3"/>
+      </w:pPr>
+      <w:r>
+        <w:t xml:space="preserve">Paragraph 1. Biotic interchanges, how they shaped the history ofGABI broad description</w:t>
+      </w:r>
+    </w:p>
+    <w:p>
+      <w:pPr>
+        <w:pStyle w:val="FirstParagraph"/>
+      </w:pPr>
+      <w:r>
+        <w:t xml:space="preserve">Half of living South American mammal genera have a North American ancestry</w:t>
+      </w:r>
+      <w:r>
+        <w:t xml:space="preserve"> </w:t>
+      </w:r>
+      <w:r>
+        <w:t xml:space="preserve">(Marshall, 1988)</w:t>
+      </w:r>
+      <w:r>
+        <w:t xml:space="preserve">. Colonisation and establishment of Amazonian taxa in</w:t>
+      </w:r>
+      <w:r>
+        <w:t xml:space="preserve"> </w:t>
+      </w:r>
+      <w:r>
+        <w:t xml:space="preserve">‘</w:t>
+      </w:r>
+      <w:r>
+        <w:t xml:space="preserve">tropical North America</w:t>
+      </w:r>
+      <w:r>
+        <w:t xml:space="preserve">’</w:t>
+      </w:r>
+      <w:r>
+        <w:t xml:space="preserve"> </w:t>
+      </w:r>
+      <w:r>
+        <w:t xml:space="preserve">(</w:t>
+      </w:r>
+      <w:r>
+        <w:rPr>
+          <w:i/>
+          <w:iCs/>
+        </w:rPr>
+        <w:t xml:space="preserve">i</w:t>
+      </w:r>
+      <w:r>
+        <w:t xml:space="preserve">.</w:t>
+      </w:r>
+      <w:r>
+        <w:rPr>
+          <w:i/>
+          <w:iCs/>
+        </w:rPr>
+        <w:t xml:space="preserve">e</w:t>
+      </w:r>
+      <w:r>
+        <w:t xml:space="preserve">., Central America) =&gt; Neotropics.</w:t>
+      </w:r>
+    </w:p>
     <w:bookmarkEnd w:id="21"/>
-    <w:bookmarkStart w:id="27" w:name="references"/>
+    <w:bookmarkStart w:id="22" w:name="X1dd52ffe770150a9ad72eeee78d2a164b284d3b"/>
     <w:p>
       <w:pPr>
+        <w:pStyle w:val="Heading3"/>
+      </w:pPr>
+      <w:r>
+        <w:t xml:space="preserve">Paragraph 2. GABI =&gt; asymmetry! Drivers? History and state-of-the-art</w:t>
+      </w:r>
+    </w:p>
+    <w:p>
+      <w:pPr>
+        <w:pStyle w:val="FirstParagraph"/>
+      </w:pPr>
+      <w:r>
+        <w:t xml:space="preserve">Species pool proved relevant in the case of the interchange along the Wallacea</w:t>
+      </w:r>
+      <w:r>
+        <w:t xml:space="preserve"> </w:t>
+      </w:r>
+      <w:r>
+        <w:t xml:space="preserve">(Skeels</w:t>
+      </w:r>
+      <w:r>
+        <w:t xml:space="preserve"> </w:t>
+      </w:r>
+      <w:r>
+        <w:rPr>
+          <w:i/>
+          <w:iCs/>
+        </w:rPr>
+        <w:t xml:space="preserve">et al.</w:t>
+      </w:r>
+      <w:r>
+        <w:t xml:space="preserve">, 2023)</w:t>
+      </w:r>
+      <w:r>
+        <w:t xml:space="preserve">. But here, we expect to find more species in South America, encompassing one of earth’s major and long-standing biodiversity hotspot − Amazonia</w:t>
+      </w:r>
+      <w:r>
+        <w:t xml:space="preserve"> </w:t>
+      </w:r>
+      <w:r>
+        <w:t xml:space="preserve">(Antonelli</w:t>
+      </w:r>
+      <w:r>
+        <w:t xml:space="preserve"> </w:t>
+      </w:r>
+      <w:r>
+        <w:rPr>
+          <w:i/>
+          <w:iCs/>
+        </w:rPr>
+        <w:t xml:space="preserve">et al.</w:t>
+      </w:r>
+      <w:r>
+        <w:t xml:space="preserve">, 2018)</w:t>
+      </w:r>
+      <w:r>
+        <w:t xml:space="preserve"> </w:t>
+      </w:r>
+      <w:r>
+        <w:t xml:space="preserve">− than in North America. Therefore, what drove the notable asymmetry of the GABI? Naturally, this question has been viewed through the lens of biotic interactions. Competition involving clades of similar ecologies (</w:t>
+      </w:r>
+      <w:r>
+        <w:rPr>
+          <w:i/>
+          <w:iCs/>
+        </w:rPr>
+        <w:t xml:space="preserve">e</w:t>
+      </w:r>
+      <w:r>
+        <w:t xml:space="preserve">.</w:t>
+      </w:r>
+      <w:r>
+        <w:rPr>
+          <w:i/>
+          <w:iCs/>
+        </w:rPr>
+        <w:t xml:space="preserve">g</w:t>
+      </w:r>
+      <w:r>
+        <w:t xml:space="preserve">., artio/perissodactyls v.s. South American native ungulates; carinvorans v.s. sparassodonts) appeared as a likely first-order explanation</w:t>
+      </w:r>
+      <w:r>
+        <w:t xml:space="preserve"> </w:t>
+      </w:r>
+      <w:r>
+        <w:t xml:space="preserve">(Simpson, 1980)</w:t>
+      </w:r>
+      <w:r>
+        <w:t xml:space="preserve">. This hypothesis mostly relied on striking morphological convergences between the clades assumed to have competed (</w:t>
+      </w:r>
+      <w:r>
+        <w:rPr>
+          <w:i/>
+          <w:iCs/>
+        </w:rPr>
+        <w:t xml:space="preserve">e</w:t>
+      </w:r>
+      <w:r>
+        <w:t xml:space="preserve">.</w:t>
+      </w:r>
+      <w:r>
+        <w:rPr>
+          <w:i/>
+          <w:iCs/>
+        </w:rPr>
+        <w:t xml:space="preserve">g</w:t>
+      </w:r>
+      <w:r>
+        <w:t xml:space="preserve">., sabertooth among predators, high-crowned and ever-growing cheek teeth among herbivores). However, several analyses of the fossil record provided no evidence for competition between native South American mammals and their northern counterparts</w:t>
+      </w:r>
+      <w:r>
+        <w:t xml:space="preserve"> </w:t>
+      </w:r>
+      <w:r>
+        <w:t xml:space="preserve">(</w:t>
+      </w:r>
+      <w:r>
+        <w:rPr>
+          <w:i/>
+          <w:iCs/>
+        </w:rPr>
+        <w:t xml:space="preserve">e</w:t>
+      </w:r>
+      <w:r>
+        <w:t xml:space="preserve">.</w:t>
+      </w:r>
+      <w:r>
+        <w:rPr>
+          <w:i/>
+          <w:iCs/>
+        </w:rPr>
+        <w:t xml:space="preserve">g</w:t>
+      </w:r>
+      <w:r>
+        <w:t xml:space="preserve">., Prevosti</w:t>
+      </w:r>
+      <w:r>
+        <w:t xml:space="preserve"> </w:t>
+      </w:r>
+      <w:r>
+        <w:rPr>
+          <w:i/>
+          <w:iCs/>
+        </w:rPr>
+        <w:t xml:space="preserve">et al.</w:t>
+      </w:r>
+      <w:r>
+        <w:t xml:space="preserve">, 2013; Tarquini</w:t>
+      </w:r>
+      <w:r>
+        <w:t xml:space="preserve"> </w:t>
+      </w:r>
+      <w:r>
+        <w:rPr>
+          <w:i/>
+          <w:iCs/>
+        </w:rPr>
+        <w:t xml:space="preserve">et al.</w:t>
+      </w:r>
+      <w:r>
+        <w:t xml:space="preserve">, 2022)</w:t>
+      </w:r>
+      <w:r>
+        <w:t xml:space="preserve">. Thus, this hypothesis has been increasingly questioned.</w:t>
+      </w:r>
+    </w:p>
+    <w:bookmarkEnd w:id="22"/>
+    <w:bookmarkStart w:id="23" w:name="X3103f0312769cc5df5b5fcae21dc7ca54a5a5e7"/>
+    <w:p>
+      <w:pPr>
+        <w:pStyle w:val="Heading3"/>
+      </w:pPr>
+      <w:r>
+        <w:t xml:space="preserve">Paragraph 3. Mechanistic eco-evo modelling</w:t>
+      </w:r>
+    </w:p>
+    <w:p>
+      <w:pPr>
+        <w:pStyle w:val="FirstParagraph"/>
+      </w:pPr>
+      <w:r>
+        <w:t xml:space="preserve">Possibility to run natural experiments and draw casual links between biodiversity patterns and (a)biotic patterns. Proved efficient in a wide range of questions.</w:t>
+      </w:r>
+    </w:p>
+    <w:bookmarkEnd w:id="23"/>
+    <w:bookmarkEnd w:id="24"/>
+    <w:bookmarkStart w:id="27" w:name="materials-and-methods"/>
+    <w:p>
+      <w:pPr>
         <w:pStyle w:val="Heading1"/>
       </w:pPr>
       <w:r>
+        <w:t xml:space="preserve">Materials and methods</w:t>
+      </w:r>
+    </w:p>
+    <w:p>
+      <w:pPr>
+        <w:pStyle w:val="FirstParagraph"/>
+      </w:pPr>
+      <w:r>
+        <w:t xml:space="preserve">What we want to compare: - Proportion of successful exchanges when starting from North v.s. South - Is there any change in diversification rates after crossing Panama’s isthmus? Do crossers from the North experience enhanced diversification than in the other way round?</w:t>
+      </w:r>
+    </w:p>
+    <w:bookmarkStart w:id="25" w:name="palaeoclimate-data"/>
+    <w:p>
+      <w:pPr>
+        <w:pStyle w:val="Heading2"/>
+      </w:pPr>
+      <w:r>
+        <w:t xml:space="preserve">Palaeoclimate data</w:t>
+      </w:r>
+    </w:p>
+    <w:p>
+      <w:pPr>
+        <w:pStyle w:val="FirstParagraph"/>
+      </w:pPr>
+      <w:r>
+        <w:t xml:space="preserve">We used the spatio-temporal terrestrial palaeoclimate series from the PALEO-PGEM atmosphere-ocean general circulation model</w:t>
+      </w:r>
+      <w:r>
+        <w:t xml:space="preserve"> </w:t>
+      </w:r>
+      <w:r>
+        <w:t xml:space="preserve">(Holden</w:t>
+      </w:r>
+      <w:r>
+        <w:t xml:space="preserve"> </w:t>
+      </w:r>
+      <w:r>
+        <w:rPr>
+          <w:i/>
+          <w:iCs/>
+        </w:rPr>
+        <w:t xml:space="preserve">et al.</w:t>
+      </w:r>
+      <w:r>
+        <w:t xml:space="preserve">, 2019)</w:t>
+      </w:r>
+      <w:r>
+        <w:t xml:space="preserve">, covering the last 5 Myrs with a 1</w:t>
+      </w:r>
+      <w:r>
+        <w:t xml:space="preserve"> </w:t>
+      </w:r>
+      <w:r>
+        <w:t xml:space="preserve"> </w:t>
+      </w:r>
+      <w:r>
+        <w:t xml:space="preserve">° spatial resolution</w:t>
+      </w:r>
+      <w:r>
+        <w:t xml:space="preserve"> </w:t>
+      </w:r>
+      <w:r>
+        <w:t xml:space="preserve">(Barreto</w:t>
+      </w:r>
+      <w:r>
+        <w:t xml:space="preserve"> </w:t>
+      </w:r>
+      <w:r>
+        <w:rPr>
+          <w:i/>
+          <w:iCs/>
+        </w:rPr>
+        <w:t xml:space="preserve">et al.</w:t>
+      </w:r>
+      <w:r>
+        <w:t xml:space="preserve">, 2023)</w:t>
+      </w:r>
+      <w:r>
+        <w:t xml:space="preserve">. For the scope of this work, we used two bioclimatic variables: mean annual temperature (MAT, BIO1) and mean annual precipitation (MAP, BIO12).</w:t>
+      </w:r>
+    </w:p>
+    <w:bookmarkEnd w:id="25"/>
+    <w:bookmarkStart w:id="26" w:name="simulation-model-and-modelling-schemes"/>
+    <w:p>
+      <w:pPr>
+        <w:pStyle w:val="Heading2"/>
+      </w:pPr>
+      <w:r>
+        <w:t xml:space="preserve">Simulation model and modelling schemes</w:t>
+      </w:r>
+    </w:p>
+    <w:p>
+      <w:pPr>
+        <w:pStyle w:val="FirstParagraph"/>
+      </w:pPr>
+      <w:r>
+        <w:t xml:space="preserve">We performed our spatially-explicit simulations of biodiversity using the General Engine for Eco-Evolutionary SImulationS,</w:t>
+      </w:r>
+      <w:r>
+        <w:t xml:space="preserve"> </w:t>
+      </w:r>
+      <w:r>
+        <w:rPr>
+          <w:i/>
+          <w:iCs/>
+        </w:rPr>
+        <w:t xml:space="preserve">gen3sis</w:t>
+      </w:r>
+      <w:r>
+        <w:t xml:space="preserve">, v1.5.11</w:t>
+      </w:r>
+      <w:r>
+        <w:t xml:space="preserve"> </w:t>
+      </w:r>
+      <w:r>
+        <w:t xml:space="preserve">(Hagen</w:t>
+      </w:r>
+      <w:r>
+        <w:t xml:space="preserve"> </w:t>
+      </w:r>
+      <w:r>
+        <w:rPr>
+          <w:i/>
+          <w:iCs/>
+        </w:rPr>
+        <w:t xml:space="preserve">et al.</w:t>
+      </w:r>
+      <w:r>
+        <w:t xml:space="preserve">, 2021)</w:t>
+      </w:r>
+      <w:r>
+        <w:t xml:space="preserve">. Simulations, moving forward-in-time with a 10ky time step, tracked the dispersion and diversification of ancestral lineages either originating in North, South America or both, throughout the last 5 Myr.</w:t>
+      </w:r>
+    </w:p>
+    <w:p>
+      <w:pPr>
+        <w:pStyle w:val="TextBody"/>
+      </w:pPr>
+      <w:r>
+        <w:t xml:space="preserve">The ancestral range of a starting lineage was randomly selected within the desired ancestral area (</w:t>
+      </w:r>
+      <w:r>
+        <w:rPr>
+          <w:i/>
+          <w:iCs/>
+        </w:rPr>
+        <w:t xml:space="preserve">i</w:t>
+      </w:r>
+      <w:r>
+        <w:t xml:space="preserve">.</w:t>
+      </w:r>
+      <w:r>
+        <w:rPr>
+          <w:i/>
+          <w:iCs/>
+        </w:rPr>
+        <w:t xml:space="preserve">e</w:t>
+      </w:r>
+      <w:r>
+        <w:t xml:space="preserve">., North, South America or both). To avoid oversampling high latitudes, we merged the ancestral landscape with the centroids of an equal-area grid (~100km spacing) generated using the R package</w:t>
+      </w:r>
+      <w:r>
+        <w:t xml:space="preserve"> </w:t>
+      </w:r>
+      <w:r>
+        <w:rPr>
+          <w:i/>
+          <w:iCs/>
+        </w:rPr>
+        <w:t xml:space="preserve">h3jsr</w:t>
+      </w:r>
+      <w:r>
+        <w:t xml:space="preserve"> </w:t>
+      </w:r>
+      <w:r>
+        <w:t xml:space="preserve">(O’Brien, 2023)</w:t>
+      </w:r>
+      <w:r>
+        <w:t xml:space="preserve">. We then sampled a centroid at random and retrieved the corresponding cell in our landscape.</w:t>
+      </w:r>
+    </w:p>
+    <w:p>
+      <w:pPr>
+        <w:pStyle w:val="TextBody"/>
+      </w:pPr>
+      <w:r>
+        <w:t xml:space="preserve">Importantly, since the palaeoclimate reconstructions that we used ignored tectonic plate motion − a fairly reasonable assumption for a 5-Myr time frame − continental position in our landscapes was held constant across simulations. Therefore, in this framework, changes in connectivity between North and South America could only arise from the environment.</w:t>
+      </w:r>
+    </w:p>
+    <w:bookmarkEnd w:id="26"/>
+    <w:bookmarkEnd w:id="27"/>
+    <w:bookmarkStart w:id="48" w:name="references"/>
+    <w:p>
+      <w:pPr>
+        <w:pStyle w:val="Heading1"/>
+      </w:pPr>
+      <w:r>
         <w:t xml:space="preserve">References</w:t>
       </w:r>
     </w:p>
-    <w:bookmarkStart w:id="26" w:name="refs"/>
-    <w:bookmarkStart w:id="23" w:name="ref-barreto2023"/>
+    <w:bookmarkStart w:id="47" w:name="refs"/>
+    <w:bookmarkStart w:id="29" w:name="ref-antonelli2018"/>
     <w:p>
       <w:pPr>
         <w:pStyle w:val="Bibliography"/>
       </w:pPr>
       <w:r>
-        <w:t xml:space="preserve">Barreto E., Holden P.B., Edwards N.R., &amp; Rangel T.F. (2023)</w:t>
-      </w:r>
-      <w:r>
-        <w:t xml:space="preserve"> </w:t>
-      </w:r>
-      <w:hyperlink r:id="rId22">
+        <w:t xml:space="preserve">Antonelli, A., Kissling, W.D., Flantua, S.G.A., Bermúdez, M.A., Mulch, A., Muellner-Riehl, A.N., Kreft, H., Linder, H.P., Badgley, C., Fjeldså, J., Fritz, S.A., Rahbek, C., Herman, F., Hooghiemstra, H. &amp; Hoorn, C. (2018)</w:t>
+      </w:r>
+      <w:r>
+        <w:t xml:space="preserve"> </w:t>
+      </w:r>
+      <w:hyperlink r:id="rId28">
+        <w:r>
+          <w:rPr>
+            <w:rStyle w:val="InternetLink"/>
+          </w:rPr>
+          <w:t xml:space="preserve">Geological and climatic influences on mountain biodiversity</w:t>
+        </w:r>
+      </w:hyperlink>
+      <w:r>
+        <w:t xml:space="preserve">.</w:t>
+      </w:r>
+      <w:r>
+        <w:t xml:space="preserve"> </w:t>
+      </w:r>
+      <w:r>
+        <w:rPr>
+          <w:i/>
+          <w:iCs/>
+        </w:rPr>
+        <w:t xml:space="preserve">Nature Geoscience</w:t>
+      </w:r>
+      <w:r>
+        <w:t xml:space="preserve">,</w:t>
+      </w:r>
+      <w:r>
+        <w:t xml:space="preserve"> </w:t>
+      </w:r>
+      <w:r>
+        <w:rPr>
+          <w:b/>
+          <w:bCs/>
+        </w:rPr>
+        <w:t xml:space="preserve">11</w:t>
+      </w:r>
+      <w:r>
+        <w:t xml:space="preserve">, 718–725.</w:t>
+      </w:r>
+    </w:p>
+    <w:bookmarkEnd w:id="29"/>
+    <w:bookmarkStart w:id="31" w:name="ref-barreto2023"/>
+    <w:p>
+      <w:pPr>
+        <w:pStyle w:val="Bibliography"/>
+      </w:pPr>
+      <w:r>
+        <w:t xml:space="preserve">Barreto, E., Holden, P.B., Edwards, N.R. &amp; Rangel, T.F. (2023)</w:t>
+      </w:r>
+      <w:r>
+        <w:t xml:space="preserve"> </w:t>
+      </w:r>
+      <w:hyperlink r:id="rId30">
         <w:r>
           <w:rPr>
             <w:rStyle w:val="InternetLink"/>
@@ -248,19 +720,81 @@
         <w:t xml:space="preserve">, 1034–1045.</w:t>
       </w:r>
     </w:p>
-    <w:bookmarkEnd w:id="23"/>
-    <w:bookmarkStart w:id="25" w:name="ref-holden2019"/>
+    <w:bookmarkEnd w:id="31"/>
+    <w:bookmarkStart w:id="33" w:name="ref-hagen2021"/>
     <w:p>
       <w:pPr>
         <w:pStyle w:val="Bibliography"/>
       </w:pPr>
       <w:r>
-        <w:t xml:space="preserve">Holden P.B., Edwards N.R., Rangel T.F., Pereira E.B., Tran G.T., &amp; Wilkinson R.D. (2019)</w:t>
-      </w:r>
-      <w:r>
-        <w:t xml:space="preserve"> </w:t>
-      </w:r>
-      <w:hyperlink r:id="rId24">
+        <w:t xml:space="preserve">Hagen, O., Flück, B., Fopp, F., Cabral, J.S., Hartig, F., Pontarp, M., Rangel, T.F. &amp; Pellissier, L. (2021)</w:t>
+      </w:r>
+      <w:r>
+        <w:t xml:space="preserve"> </w:t>
+      </w:r>
+      <w:hyperlink r:id="rId32">
+        <w:r>
+          <w:rPr>
+            <w:rStyle w:val="InternetLink"/>
+          </w:rPr>
+          <w:t xml:space="preserve">gen3sis: A general engine for eco-evolutionary simulations of the processes that shape Earth</w:t>
+        </w:r>
+        <w:r>
+          <w:rPr>
+            <w:rStyle w:val="InternetLink"/>
+          </w:rPr>
+          <w:t xml:space="preserve">’</w:t>
+        </w:r>
+        <w:r>
+          <w:rPr>
+            <w:rStyle w:val="InternetLink"/>
+          </w:rPr>
+          <w:t xml:space="preserve">s biodiversity</w:t>
+        </w:r>
+      </w:hyperlink>
+      <w:r>
+        <w:t xml:space="preserve">.</w:t>
+      </w:r>
+      <w:r>
+        <w:t xml:space="preserve"> </w:t>
+      </w:r>
+      <w:r>
+        <w:rPr>
+          <w:i/>
+          <w:iCs/>
+        </w:rPr>
+        <w:t xml:space="preserve">PLOS Biology</w:t>
+      </w:r>
+      <w:r>
+        <w:t xml:space="preserve">,</w:t>
+      </w:r>
+      <w:r>
+        <w:t xml:space="preserve"> </w:t>
+      </w:r>
+      <w:r>
+        <w:rPr>
+          <w:b/>
+          <w:bCs/>
+        </w:rPr>
+        <w:t xml:space="preserve">19</w:t>
+      </w:r>
+      <w:r>
+        <w:t xml:space="preserve">, e3001340.</w:t>
+      </w:r>
+    </w:p>
+    <w:bookmarkEnd w:id="33"/>
+    <w:bookmarkStart w:id="35" w:name="ref-holden2019"/>
+    <w:p>
+      <w:pPr>
+        <w:pStyle w:val="Bibliography"/>
+      </w:pPr>
+      <w:r>
+        <w:t xml:space="preserve">Holden, P.B., Edwards, N.R., Rangel, T.F., Pereira, E.B., Tran, G.T. &amp; Wilkinson, R.D. (2019)</w:t>
+      </w:r>
+      <w:r>
+        <w:t xml:space="preserve"> </w:t>
+      </w:r>
+      <w:hyperlink r:id="rId34">
         <w:r>
           <w:rPr>
             <w:rStyle w:val="InternetLink"/>
@@ -304,9 +838,255 @@
         <w:t xml:space="preserve">, 5137–5155.</w:t>
       </w:r>
     </w:p>
-    <w:bookmarkEnd w:id="25"/>
-    <w:bookmarkEnd w:id="26"/>
-    <w:bookmarkEnd w:id="27"/>
+    <w:bookmarkEnd w:id="35"/>
+    <w:bookmarkStart w:id="37" w:name="ref-marshall1988"/>
+    <w:p>
+      <w:pPr>
+        <w:pStyle w:val="Bibliography"/>
+      </w:pPr>
+      <w:r>
+        <w:t xml:space="preserve">Marshall, L.G. (1988)</w:t>
+      </w:r>
+      <w:r>
+        <w:t xml:space="preserve"> </w:t>
+      </w:r>
+      <w:hyperlink r:id="rId36">
+        <w:r>
+          <w:rPr>
+            <w:rStyle w:val="InternetLink"/>
+          </w:rPr>
+          <w:t xml:space="preserve">Land mammals and the great american interchange</w:t>
+        </w:r>
+      </w:hyperlink>
+      <w:r>
+        <w:t xml:space="preserve">.</w:t>
+      </w:r>
+      <w:r>
+        <w:t xml:space="preserve"> </w:t>
+      </w:r>
+      <w:r>
+        <w:rPr>
+          <w:i/>
+          <w:iCs/>
+        </w:rPr>
+        <w:t xml:space="preserve">American Scientist</w:t>
+      </w:r>
+      <w:r>
+        <w:t xml:space="preserve">,</w:t>
+      </w:r>
+      <w:r>
+        <w:t xml:space="preserve"> </w:t>
+      </w:r>
+      <w:r>
+        <w:rPr>
+          <w:b/>
+          <w:bCs/>
+        </w:rPr>
+        <w:t xml:space="preserve">76</w:t>
+      </w:r>
+      <w:r>
+        <w:t xml:space="preserve">, 380–388.</w:t>
+      </w:r>
+    </w:p>
+    <w:bookmarkEnd w:id="37"/>
+    <w:bookmarkStart w:id="39" w:name="ref-obrien2023"/>
+    <w:p>
+      <w:pPr>
+        <w:pStyle w:val="Bibliography"/>
+      </w:pPr>
+      <w:r>
+        <w:t xml:space="preserve">O’Brien, L. (2023)</w:t>
+      </w:r>
+      <w:r>
+        <w:t xml:space="preserve"> </w:t>
+      </w:r>
+      <w:hyperlink r:id="rId38">
+        <w:r>
+          <w:rPr>
+            <w:rStyle w:val="InternetLink"/>
+            <w:i/>
+            <w:iCs/>
+          </w:rPr>
+          <w:t xml:space="preserve">h3jsr: Access uber’s H3 library</w:t>
+        </w:r>
+      </w:hyperlink>
+      <w:r>
+        <w:t xml:space="preserve">,.</w:t>
+      </w:r>
+    </w:p>
+    <w:bookmarkEnd w:id="39"/>
+    <w:bookmarkStart w:id="41" w:name="ref-prevosti2013"/>
+    <w:p>
+      <w:pPr>
+        <w:pStyle w:val="Bibliography"/>
+      </w:pPr>
+      <w:r>
+        <w:t xml:space="preserve">Prevosti, F.J., Forasiepi, A. &amp; Zimicz, N. (2013)</w:t>
+      </w:r>
+      <w:r>
+        <w:t xml:space="preserve"> </w:t>
+      </w:r>
+      <w:hyperlink r:id="rId40">
+        <w:r>
+          <w:rPr>
+            <w:rStyle w:val="InternetLink"/>
+          </w:rPr>
+          <w:t xml:space="preserve">The Evolution of the Cenozoic Terrestrial Mammalian Predator Guild in South America: Competition or Replacement?</w:t>
+        </w:r>
+      </w:hyperlink>
+      <w:r>
+        <w:t xml:space="preserve"> </w:t>
+      </w:r>
+      <w:r>
+        <w:rPr>
+          <w:i/>
+          <w:iCs/>
+        </w:rPr>
+        <w:t xml:space="preserve">Journal of Mammalian Evolution</w:t>
+      </w:r>
+      <w:r>
+        <w:t xml:space="preserve">,</w:t>
+      </w:r>
+      <w:r>
+        <w:t xml:space="preserve"> </w:t>
+      </w:r>
+      <w:r>
+        <w:rPr>
+          <w:b/>
+          <w:bCs/>
+        </w:rPr>
+        <w:t xml:space="preserve">20</w:t>
+      </w:r>
+      <w:r>
+        <w:t xml:space="preserve">, 3–21.</w:t>
+      </w:r>
+    </w:p>
+    <w:bookmarkEnd w:id="41"/>
+    <w:bookmarkStart w:id="42" w:name="ref-simpson1980"/>
+    <w:p>
+      <w:pPr>
+        <w:pStyle w:val="Bibliography"/>
+      </w:pPr>
+      <w:r>
+        <w:t xml:space="preserve">Simpson, G.G. (1980)</w:t>
+      </w:r>
+      <w:r>
+        <w:t xml:space="preserve"> </w:t>
+      </w:r>
+      <w:r>
+        <w:rPr>
+          <w:i/>
+          <w:iCs/>
+        </w:rPr>
+        <w:t xml:space="preserve">Splendid isolation : The curious history of south american mammals</w:t>
+      </w:r>
+      <w:r>
+        <w:t xml:space="preserve">, Yale University Press, New Haven.</w:t>
+      </w:r>
+    </w:p>
+    <w:bookmarkEnd w:id="42"/>
+    <w:bookmarkStart w:id="44" w:name="ref-skeels2023"/>
+    <w:p>
+      <w:pPr>
+        <w:pStyle w:val="Bibliography"/>
+      </w:pPr>
+      <w:r>
+        <w:t xml:space="preserve">Skeels, A., Bach, W., Hagen, O., Jetz, W. &amp; Pellissier, L. (2023)</w:t>
+      </w:r>
+      <w:r>
+        <w:t xml:space="preserve"> </w:t>
+      </w:r>
+      <w:hyperlink r:id="rId43">
+        <w:r>
+          <w:rPr>
+            <w:rStyle w:val="InternetLink"/>
+          </w:rPr>
+          <w:t xml:space="preserve">Temperature-dependent evolutionary speed shapes the evolution of biodiversity patterns across tetrapod radiations</w:t>
+        </w:r>
+      </w:hyperlink>
+      <w:r>
+        <w:t xml:space="preserve">.</w:t>
+      </w:r>
+      <w:r>
+        <w:t xml:space="preserve"> </w:t>
+      </w:r>
+      <w:r>
+        <w:rPr>
+          <w:i/>
+          <w:iCs/>
+        </w:rPr>
+        <w:t xml:space="preserve">Systematic Biology</w:t>
+      </w:r>
+      <w:r>
+        <w:t xml:space="preserve">,</w:t>
+      </w:r>
+      <w:r>
+        <w:t xml:space="preserve"> </w:t>
+      </w:r>
+      <w:r>
+        <w:rPr>
+          <w:b/>
+          <w:bCs/>
+        </w:rPr>
+        <w:t xml:space="preserve">72</w:t>
+      </w:r>
+      <w:r>
+        <w:t xml:space="preserve">, 341–356.</w:t>
+      </w:r>
+    </w:p>
+    <w:bookmarkEnd w:id="44"/>
+    <w:bookmarkStart w:id="46" w:name="ref-tarquini2022"/>
+    <w:p>
+      <w:pPr>
+        <w:pStyle w:val="Bibliography"/>
+      </w:pPr>
+      <w:r>
+        <w:t xml:space="preserve">Tarquini, S.D., Ladevèze, S. &amp; Prevosti, F.J. (2022)</w:t>
+      </w:r>
+      <w:r>
+        <w:t xml:space="preserve"> </w:t>
+      </w:r>
+      <w:hyperlink r:id="rId45">
+        <w:r>
+          <w:rPr>
+            <w:rStyle w:val="InternetLink"/>
+          </w:rPr>
+          <w:t xml:space="preserve">The multicausal twilight of South American native mammalian predators (Metatheria, Sparassodonta)</w:t>
+        </w:r>
+      </w:hyperlink>
+      <w:r>
+        <w:t xml:space="preserve">.</w:t>
+      </w:r>
+      <w:r>
+        <w:t xml:space="preserve"> </w:t>
+      </w:r>
+      <w:r>
+        <w:rPr>
+          <w:i/>
+          <w:iCs/>
+        </w:rPr>
+        <w:t xml:space="preserve">Scientific Reports</w:t>
+      </w:r>
+      <w:r>
+        <w:t xml:space="preserve">,</w:t>
+      </w:r>
+      <w:r>
+        <w:t xml:space="preserve"> </w:t>
+      </w:r>
+      <w:r>
+        <w:rPr>
+          <w:b/>
+          <w:bCs/>
+        </w:rPr>
+        <w:t xml:space="preserve">12</w:t>
+      </w:r>
+      <w:r>
+        <w:t xml:space="preserve">, 1224.</w:t>
+      </w:r>
+    </w:p>
+    <w:bookmarkEnd w:id="46"/>
+    <w:bookmarkEnd w:id="47"/>
+    <w:bookmarkEnd w:id="48"/>
     <w:sectPr>
       <w:type w:val="nextPage"/>
       <w:pgSz w:h="15840" w:w="12240"/>

</xml_diff>

<commit_message>
moving forward with the intro
</commit_message>
<xml_diff>
--- a/Manuscript/GABI_palaeo_constraints.docx
+++ b/Manuscript/GABI_palaeo_constraints.docx
@@ -219,7 +219,7 @@
         <w:t xml:space="preserve"> </w:t>
       </w:r>
       <w:r>
-        <w:t xml:space="preserve">[3]</w:t>
+        <w:t xml:space="preserve">[3–5]</w:t>
       </w:r>
       <w:r>
         <w:t xml:space="preserve">, the fossil record and molecular phylogenies both agree with a late Miocene (</w:t>
@@ -235,7 +235,7 @@
         <w:t xml:space="preserve"> </w:t>
       </w:r>
       <w:r>
-        <w:t xml:space="preserve">6 million years ago, Ma) onset of land mammal exchange between the Americas, though the vast majority of effective crossings occurred</w:t>
+        <w:t xml:space="preserve">6 million years ago, Ma) onset of land mammal exchange between the Americas, with most effective crossings occurring from</w:t>
       </w:r>
       <w:r>
         <w:t xml:space="preserve"> </w:t>
@@ -251,34 +251,100 @@
         <w:t xml:space="preserve"> </w:t>
       </w:r>
       <w:r>
-        <w:t xml:space="preserve">3.5 Ma</w:t>
-      </w:r>
-      <w:r>
-        <w:t xml:space="preserve"> </w:t>
-      </w:r>
-      <w:r>
-        <w:t xml:space="preserve">[4–6]</w:t>
-      </w:r>
-      <w:r>
-        <w:t xml:space="preserve">. Although being one of the most classical examples of geodispersal, a puzzling feature of the GABI is that it impacted both continent’s mammalian faunas very differently. Evidence from the fossil record indicates that reciprocal exchanges occurred across both sides of the isthmus in the early stages of the GABI</w:t>
-      </w:r>
-      <w:r>
-        <w:t xml:space="preserve"> </w:t>
-      </w:r>
-      <w:r>
-        <w:t xml:space="preserve">[7]</w:t>
-      </w:r>
-      <w:r>
-        <w:t xml:space="preserve">. However, only two species inhabiting North America at present have a South American ancestry, whereas it is estimated that half of living South American mammal genera have a North American ancestry</w:t>
-      </w:r>
-      <w:r>
-        <w:t xml:space="preserve"> </w:t>
-      </w:r>
-      <w:r>
-        <w:t xml:space="preserve">[8]</w:t>
-      </w:r>
-      <w:r>
-        <w:t xml:space="preserve">. It therefore results that this intercontinental faunal exchange has been highly asymmetric.</w:t>
+        <w:t xml:space="preserve">3.5 Ma onwards</w:t>
+      </w:r>
+      <w:r>
+        <w:t xml:space="preserve"> </w:t>
+      </w:r>
+      <w:r>
+        <w:t xml:space="preserve">[6–8]</w:t>
+      </w:r>
+      <w:r>
+        <w:t xml:space="preserve">. Despite its textbook nature, a puzzling feature of the GABI is that it impacted both continent’s mammalian faunas very differently. Evidence from the fossil record indicates that the early phases of the GABI were marked by reciprocal mammal exchange between the Americas, but that the Pleistocene times witnessed an increasing proportion of North American mammals establishing southwards</w:t>
+      </w:r>
+      <w:r>
+        <w:t xml:space="preserve"> </w:t>
+      </w:r>
+      <w:r>
+        <w:t xml:space="preserve">[2,9]</w:t>
+      </w:r>
+      <w:r>
+        <w:t xml:space="preserve">. At present, only around 10% of the land mammal genera inhabiting North America have a South American ancestry, whereas it is estimated that half of living South American mammal genera descend from a North American lineage</w:t>
+      </w:r>
+      <w:r>
+        <w:t xml:space="preserve"> </w:t>
+      </w:r>
+      <w:r>
+        <w:t xml:space="preserve">[10]</w:t>
+      </w:r>
+      <w:r>
+        <w:t xml:space="preserve">. Therefore, this intercontinental faunal exchange has been highly asymmetric.</w:t>
+      </w:r>
+    </w:p>
+    <w:bookmarkEnd w:id="21"/>
+    <w:bookmarkStart w:id="22" w:name="X10d481dc856fbc64b472cbfe63559590448e66c"/>
+    <w:p>
+      <w:pPr>
+        <w:pStyle w:val="Heading3"/>
+      </w:pPr>
+      <w:r>
+        <w:t xml:space="preserve">Paragraph 2. Asymmetry: Drivers? History and state-of-the-art</w:t>
+      </w:r>
+    </w:p>
+    <w:p>
+      <w:pPr>
+        <w:pStyle w:val="FirstParagraph"/>
+      </w:pPr>
+      <w:r>
+        <w:t xml:space="preserve">Higher extinction rates of endemic South American taxa in South America during the Pliocene were suggested as the prevailing mechanism explaining this asymmetry</w:t>
+      </w:r>
+      <w:r>
+        <w:t xml:space="preserve"> </w:t>
+      </w:r>
+      <w:r>
+        <w:t xml:space="preserve">[11]</w:t>
+      </w:r>
+      <w:r>
+        <w:t xml:space="preserve">. However, the drivers behind this macroevolutionary imbalance, going against MacArthur &amp; Wilson’s equilibrium theory</w:t>
+      </w:r>
+      <w:r>
+        <w:t xml:space="preserve"> </w:t>
+      </w:r>
+      <w:r>
+        <w:t xml:space="preserve">[12]</w:t>
+      </w:r>
+      <w:r>
+        <w:t xml:space="preserve">, remain unresolved. Many hypotheses have been proposed to this end. The question has been primarily viewed through the lens of biotic interactions, being either competition between clades assumed to have similar ecologies</w:t>
+      </w:r>
+      <w:r>
+        <w:t xml:space="preserve"> </w:t>
+      </w:r>
+      <w:r>
+        <w:t xml:space="preserve">[9,13,14,but see 15,16,17]</w:t>
+      </w:r>
+      <w:r>
+        <w:t xml:space="preserve"> </w:t>
+      </w:r>
+      <w:r>
+        <w:t xml:space="preserve">or predation of predator-naive preys</w:t>
+      </w:r>
+      <w:r>
+        <w:t xml:space="preserve"> </w:t>
+      </w:r>
+      <w:r>
+        <w:t xml:space="preserve">[9,18,19]</w:t>
+      </w:r>
+      <w:r>
+        <w:t xml:space="preserve">. Other studies proposed the implication of abiotic factors, putting the emphasis on Pleistocene climate fluctuations and the consequent alternating phases of emergence of savannah-like environment, favouring the dispersal of large temperate-adapted mammals to the detriment of tropical-adapted ones</w:t>
+      </w:r>
+      <w:r>
+        <w:t xml:space="preserve"> </w:t>
+      </w:r>
+      <w:r>
+        <w:t xml:space="preserve">[8,18,20]</w:t>
+      </w:r>
+      <w:r>
+        <w:t xml:space="preserve">.</w:t>
       </w:r>
     </w:p>
     <w:p>
@@ -286,32 +352,44 @@
         <w:pStyle w:val="BodyText"/>
       </w:pPr>
       <w:r>
-        <w:t xml:space="preserve">Colonisation and establishment of Amazonian taxa in</w:t>
-      </w:r>
-      <w:r>
-        <w:t xml:space="preserve"> </w:t>
-      </w:r>
-      <w:r>
-        <w:t xml:space="preserve">‘</w:t>
-      </w:r>
-      <w:r>
-        <w:t xml:space="preserve">tropical North America</w:t>
-      </w:r>
-      <w:r>
-        <w:t xml:space="preserve">’</w:t>
-      </w:r>
-      <w:r>
-        <w:t xml:space="preserve"> </w:t>
-      </w:r>
-      <w:r>
-        <w:t xml:space="preserve">(</w:t>
+        <w:t xml:space="preserve">Competition involving clades of similar ecology appeared as a likely first-order explanation to the recent demise of South American endemic mammal clades such as native ungulates</w:t>
+      </w:r>
+      <w:r>
+        <w:t xml:space="preserve"> </w:t>
+      </w:r>
+      <w:r>
+        <w:t xml:space="preserve">[21]</w:t>
+      </w:r>
+      <w:r>
+        <w:t xml:space="preserve"> </w:t>
+      </w:r>
+      <w:r>
+        <w:t xml:space="preserve">or sparassodonts (metatherian predators,</w:t>
+      </w:r>
+      <w:r>
+        <w:t xml:space="preserve"> </w:t>
+      </w:r>
+      <w:r>
+        <w:t xml:space="preserve">[16,22]</w:t>
+      </w:r>
+      <w:r>
+        <w:t xml:space="preserve">) that followed the establishment of northern lineages</w:t>
+      </w:r>
+      <w:r>
+        <w:t xml:space="preserve"> </w:t>
+      </w:r>
+      <w:r>
+        <w:t xml:space="preserve">[13]</w:t>
+      </w:r>
+      <w:r>
+        <w:t xml:space="preserve">. This hypothesis mostly relied on striking morphological convergences between the clades assumed to have competed (</w:t>
       </w:r>
       <w:r>
         <w:rPr>
           <w:i/>
           <w:iCs/>
         </w:rPr>
-        <w:t xml:space="preserve">i</w:t>
+        <w:t xml:space="preserve">e</w:t>
       </w:r>
       <w:r>
         <w:t xml:space="preserve">.</w:t>
@@ -321,74 +399,6 @@
           <w:i/>
           <w:iCs/>
         </w:rPr>
-        <w:t xml:space="preserve">e</w:t>
-      </w:r>
-      <w:r>
-        <w:t xml:space="preserve">., Central America) =&gt; Neotropics.</w:t>
-      </w:r>
-    </w:p>
-    <w:bookmarkEnd w:id="21"/>
-    <w:bookmarkStart w:id="22" w:name="X10d481dc856fbc64b472cbfe63559590448e66c"/>
-    <w:p>
-      <w:pPr>
-        <w:pStyle w:val="Heading3"/>
-      </w:pPr>
-      <w:r>
-        <w:t xml:space="preserve">Paragraph 2. Asymmetry: Drivers? History and state-of-the-art</w:t>
-      </w:r>
-    </w:p>
-    <w:p>
-      <w:pPr>
-        <w:pStyle w:val="FirstParagraph"/>
-      </w:pPr>
-      <w:r>
-        <w:t xml:space="preserve">Many hypotheses have been proposed to explain this asymmetry. Naturally, the question has been primarily viewed through the lens of biotic interactions. Competition involving clades of similar ecology appeared as a likely first-order explanation to the recent demise of South American endemic mammal clades such as native ungulates</w:t>
-      </w:r>
-      <w:r>
-        <w:t xml:space="preserve"> </w:t>
-      </w:r>
-      <w:r>
-        <w:t xml:space="preserve">[9]</w:t>
-      </w:r>
-      <w:r>
-        <w:t xml:space="preserve"> </w:t>
-      </w:r>
-      <w:r>
-        <w:t xml:space="preserve">or sparassodonts (metatherian predators,</w:t>
-      </w:r>
-      <w:r>
-        <w:t xml:space="preserve"> </w:t>
-      </w:r>
-      <w:r>
-        <w:t xml:space="preserve">[10,11]</w:t>
-      </w:r>
-      <w:r>
-        <w:t xml:space="preserve">) that followed the establishment of northern lineages</w:t>
-      </w:r>
-      <w:r>
-        <w:t xml:space="preserve"> </w:t>
-      </w:r>
-      <w:r>
-        <w:t xml:space="preserve">[12]</w:t>
-      </w:r>
-      <w:r>
-        <w:t xml:space="preserve">. This hypothesis mostly relied on striking morphological convergences between the clades assumed to have competed (</w:t>
-      </w:r>
-      <w:r>
-        <w:rPr>
-          <w:i/>
-          <w:iCs/>
-        </w:rPr>
-        <w:t xml:space="preserve">e</w:t>
-      </w:r>
-      <w:r>
-        <w:t xml:space="preserve">.</w:t>
-      </w:r>
-      <w:r>
-        <w:rPr>
-          <w:i/>
-          <w:iCs/>
-        </w:rPr>
         <w:t xml:space="preserve">g</w:t>
       </w:r>
       <w:r>
@@ -398,7 +408,7 @@
         <w:t xml:space="preserve"> </w:t>
       </w:r>
       <w:r>
-        <w:t xml:space="preserve">[11,13]</w:t>
+        <w:t xml:space="preserve">[15,16]</w:t>
       </w:r>
       <w:r>
         <w:t xml:space="preserve">. That being said, using phylogenetic regressions, Faurby et al.</w:t>
@@ -407,70 +417,19 @@
         <w:t xml:space="preserve"> </w:t>
       </w:r>
       <w:r>
+        <w:t xml:space="preserve">[19]</w:t>
+      </w:r>
+      <w:r>
+        <w:t xml:space="preserve"> </w:t>
+      </w:r>
+      <w:r>
+        <w:t xml:space="preserve">found support for another biotic interaction as a likely driver behind GABI’s asymmetry: predation. They indeed characterised a higher prevalence of traits increasing prey susceptibility among the endemic south american mammals. + larger niches of competitors</w:t>
+      </w:r>
+      <w:r>
+        <w:t xml:space="preserve"> </w:t>
+      </w:r>
+      <w:r>
         <w:t xml:space="preserve">[14]</w:t>
-      </w:r>
-      <w:r>
-        <w:t xml:space="preserve"> </w:t>
-      </w:r>
-      <w:r>
-        <w:t xml:space="preserve">found support for another biotic interaction as a likely driver behind GABI’s asymmetry: predation. They found higher prevalence of traits increasing prey susceptibility among the endemic south american mammals</w:t>
-      </w:r>
-    </w:p>
-    <w:p>
-      <w:pPr>
-        <w:pStyle w:val="BodyText"/>
-      </w:pPr>
-      <w:r>
-        <w:t xml:space="preserve">(</w:t>
-      </w:r>
-      <w:r>
-        <w:rPr>
-          <w:i/>
-          <w:iCs/>
-        </w:rPr>
-        <w:t xml:space="preserve">e</w:t>
-      </w:r>
-      <w:r>
-        <w:t xml:space="preserve">.</w:t>
-      </w:r>
-      <w:r>
-        <w:rPr>
-          <w:i/>
-          <w:iCs/>
-        </w:rPr>
-        <w:t xml:space="preserve">g</w:t>
-      </w:r>
-      <w:r>
-        <w:t xml:space="preserve">., artio/perissodactyls v.s. South American native ungulates; carinvorans v.s. sparassodonts)</w:t>
-      </w:r>
-    </w:p>
-    <w:p>
-      <w:pPr>
-        <w:pStyle w:val="BodyText"/>
-      </w:pPr>
-      <w:r>
-        <w:t xml:space="preserve">Species pool proved relevant in the case of the interchange along the Wallacea</w:t>
-      </w:r>
-      <w:r>
-        <w:t xml:space="preserve"> </w:t>
-      </w:r>
-      <w:r>
-        <w:t xml:space="preserve">[15]</w:t>
-      </w:r>
-      <w:r>
-        <w:t xml:space="preserve">. But here, we expect to find more species in South America, encompassing one of earth’s major and long-standing biodiversity hotspot – Amazonia</w:t>
-      </w:r>
-      <w:r>
-        <w:t xml:space="preserve"> </w:t>
-      </w:r>
-      <w:r>
-        <w:t xml:space="preserve">[16]</w:t>
-      </w:r>
-      <w:r>
-        <w:t xml:space="preserve"> </w:t>
-      </w:r>
-      <w:r>
-        <w:t xml:space="preserve">– than in North America. Therefore, what drove the notable asymmetry of the GABI? Thus, this hypothesis has been increasingly questioned. Fortuitous experiment?</w:t>
       </w:r>
     </w:p>
     <w:bookmarkEnd w:id="22"/>
@@ -583,7 +542,7 @@
         <w:t xml:space="preserve"> </w:t>
       </w:r>
       <w:r>
-        <w:t xml:space="preserve">[17]</w:t>
+        <w:t xml:space="preserve">[23]</w:t>
       </w:r>
       <w:r>
         <w:t xml:space="preserve">, covering the last 5 Myrs with a 1</w:t>
@@ -601,7 +560,7 @@
         <w:t xml:space="preserve"> </w:t>
       </w:r>
       <w:r>
-        <w:t xml:space="preserve">[18]</w:t>
+        <w:t xml:space="preserve">[24]</w:t>
       </w:r>
       <w:r>
         <w:t xml:space="preserve">. For the scope of this work, we used two bioclimatic variables: mean annual temperature (MAT, BIO1) and mean annual precipitation (MAP, BIO12).</w:t>
@@ -641,7 +600,7 @@
         <w:t xml:space="preserve"> </w:t>
       </w:r>
       <w:r>
-        <w:t xml:space="preserve">[19]</w:t>
+        <w:t xml:space="preserve">[25]</w:t>
       </w:r>
       <w:r>
         <w:t xml:space="preserve">. Simulations, moving forward-in-time with a 10ky time step, tracked the dispersion and diversification of ancestral lineages either originating in North, South America or both, throughout the last 5 Myr.</w:t>
@@ -688,7 +647,7 @@
         <w:t xml:space="preserve"> </w:t>
       </w:r>
       <w:r>
-        <w:t xml:space="preserve">[20]</w:t>
+        <w:t xml:space="preserve">[26]</w:t>
       </w:r>
       <w:r>
         <w:t xml:space="preserve">. We then sampled a centroid at random and retrieved the corresponding cell in our landscape.</w:t>
@@ -720,17 +679,83 @@
     </w:p>
     <w:bookmarkEnd w:id="26"/>
     <w:bookmarkEnd w:id="27"/>
-    <w:bookmarkStart w:id="68" w:name="references"/>
+    <w:bookmarkStart w:id="28" w:name="results"/>
     <w:p>
       <w:pPr>
         <w:pStyle w:val="Heading1"/>
       </w:pPr>
       <w:r>
+        <w:t xml:space="preserve">Results</w:t>
+      </w:r>
+    </w:p>
+    <w:bookmarkEnd w:id="28"/>
+    <w:bookmarkStart w:id="29" w:name="discussion"/>
+    <w:p>
+      <w:pPr>
+        <w:pStyle w:val="Heading1"/>
+      </w:pPr>
+      <w:r>
+        <w:t xml:space="preserve">Discussion</w:t>
+      </w:r>
+    </w:p>
+    <w:p>
+      <w:pPr>
+        <w:pStyle w:val="FirstParagraph"/>
+      </w:pPr>
+      <w:r>
+        <w:t xml:space="preserve">Smoothing asymmetry =&gt; echo to birds</w:t>
+      </w:r>
+      <w:r>
+        <w:t xml:space="preserve"> </w:t>
+      </w:r>
+      <w:r>
+        <w:t xml:space="preserve">[27]</w:t>
+      </w:r>
+      <w:r>
+        <w:t xml:space="preserve">, flying behaviour relaxing constraints applied to land mammals ?</w:t>
+      </w:r>
+    </w:p>
+    <w:p>
+      <w:pPr>
+        <w:pStyle w:val="BodyText"/>
+      </w:pPr>
+      <w:r>
+        <w:t xml:space="preserve">Species pool proved relevant in the case of the interchange along the Wallacea</w:t>
+      </w:r>
+      <w:r>
+        <w:t xml:space="preserve"> </w:t>
+      </w:r>
+      <w:r>
+        <w:t xml:space="preserve">[28]</w:t>
+      </w:r>
+      <w:r>
+        <w:t xml:space="preserve">. But here, we expect to find more species in South America, encompassing one of earth’s major and long-standing biodiversity hotspot – Amazonia</w:t>
+      </w:r>
+      <w:r>
+        <w:t xml:space="preserve"> </w:t>
+      </w:r>
+      <w:r>
+        <w:t xml:space="preserve">[29]</w:t>
+      </w:r>
+      <w:r>
+        <w:t xml:space="preserve"> </w:t>
+      </w:r>
+      <w:r>
+        <w:t xml:space="preserve">– than in North America.</w:t>
+      </w:r>
+    </w:p>
+    <w:bookmarkEnd w:id="29"/>
+    <w:bookmarkStart w:id="86" w:name="references"/>
+    <w:p>
+      <w:pPr>
+        <w:pStyle w:val="Heading1"/>
+      </w:pPr>
+      <w:r>
         <w:t xml:space="preserve">References</w:t>
       </w:r>
     </w:p>
-    <w:bookmarkStart w:id="67" w:name="refs"/>
-    <w:bookmarkStart w:id="29" w:name="ref-couvreur2011"/>
+    <w:bookmarkStart w:id="85" w:name="refs"/>
+    <w:bookmarkStart w:id="31" w:name="ref-couvreur2011"/>
     <w:p>
       <w:pPr>
         <w:pStyle w:val="Bibliography"/>
@@ -770,7 +795,7 @@
       <w:r>
         <w:t xml:space="preserve">, 664–680. (doi:</w:t>
       </w:r>
-      <w:hyperlink r:id="rId28">
+      <w:hyperlink r:id="rId30">
         <w:r>
           <w:rPr>
             <w:rStyle w:val="Hyperlink"/>
@@ -782,8 +807,8 @@
         <w:t xml:space="preserve">)</w:t>
       </w:r>
     </w:p>
-    <w:bookmarkEnd w:id="29"/>
-    <w:bookmarkStart w:id="31" w:name="ref-marshall1982"/>
+    <w:bookmarkEnd w:id="31"/>
+    <w:bookmarkStart w:id="33" w:name="ref-marshall1982"/>
     <w:p>
       <w:pPr>
         <w:pStyle w:val="Bibliography"/>
@@ -803,7 +828,7 @@
       <w:r>
         <w:t xml:space="preserve"> </w:t>
       </w:r>
-      <w:hyperlink r:id="rId30">
+      <w:hyperlink r:id="rId32">
         <w:r>
           <w:rPr>
             <w:rStyle w:val="Hyperlink"/>
@@ -838,8 +863,8 @@
         <w:t xml:space="preserve">, 1351–1357.</w:t>
       </w:r>
     </w:p>
-    <w:bookmarkEnd w:id="31"/>
-    <w:bookmarkStart w:id="33" w:name="ref-montes2015"/>
+    <w:bookmarkEnd w:id="33"/>
+    <w:bookmarkStart w:id="35" w:name="ref-montes2015"/>
     <w:p>
       <w:pPr>
         <w:pStyle w:val="Bibliography"/>
@@ -892,7 +917,7 @@
       <w:r>
         <w:t xml:space="preserve">, 226–229. (doi:</w:t>
       </w:r>
-      <w:hyperlink r:id="rId32">
+      <w:hyperlink r:id="rId34">
         <w:r>
           <w:rPr>
             <w:rStyle w:val="Hyperlink"/>
@@ -904,8 +929,8 @@
         <w:t xml:space="preserve">)</w:t>
       </w:r>
     </w:p>
-    <w:bookmarkEnd w:id="33"/>
-    <w:bookmarkStart w:id="35" w:name="ref-verzi2008"/>
+    <w:bookmarkEnd w:id="35"/>
+    <w:bookmarkStart w:id="37" w:name="ref-jaramillo2018"/>
     <w:p>
       <w:pPr>
         <w:pStyle w:val="Bibliography"/>
@@ -920,7 +945,43 @@
         <w:t xml:space="preserve">	</w:t>
       </w:r>
       <w:r>
-        <w:t xml:space="preserve">Verzi DH, Montalvo CI, Deschamps CM. 2008 Biostratigraphy and biochronology of the late miocene of central argentina: Evidence from rodents and taphonomy.</w:t>
+        <w:t xml:space="preserve">Jaramillo CA. 2018</w:t>
+      </w:r>
+      <w:r>
+        <w:t xml:space="preserve"> </w:t>
+      </w:r>
+      <w:hyperlink r:id="rId36">
+        <w:r>
+          <w:rPr>
+            <w:rStyle w:val="Hyperlink"/>
+          </w:rPr>
+          <w:t xml:space="preserve">Evolution of the isthmus of panama: Biological, paleoceanographic and paleoclimatological implications</w:t>
+        </w:r>
+      </w:hyperlink>
+      <w:r>
+        <w:t xml:space="preserve">. John Wiley &amp; Sons.</w:t>
+      </w:r>
+      <w:r>
+        <w:t xml:space="preserve"> </w:t>
+      </w:r>
+    </w:p>
+    <w:bookmarkEnd w:id="37"/>
+    <w:bookmarkStart w:id="39" w:name="ref-odea2016"/>
+    <w:p>
+      <w:pPr>
+        <w:pStyle w:val="Bibliography"/>
+      </w:pPr>
+      <w:r>
+        <w:t xml:space="preserve">5.</w:t>
+      </w:r>
+      <w:r>
+        <w:t xml:space="preserve"> </w:t>
+      </w:r>
+      <w:r>
+        <w:t xml:space="preserve">	</w:t>
+      </w:r>
+      <w:r>
+        <w:t xml:space="preserve">O’Dea A</w:t>
       </w:r>
       <w:r>
         <w:t xml:space="preserve"> </w:t>
@@ -930,7 +991,20 @@
           <w:i/>
           <w:iCs/>
         </w:rPr>
-        <w:t xml:space="preserve">Geobios</w:t>
+        <w:t xml:space="preserve">et al.</w:t>
+      </w:r>
+      <w:r>
+        <w:t xml:space="preserve"> 2016 Formation of the isthmus of panama.</w:t>
+      </w:r>
+      <w:r>
+        <w:t xml:space="preserve"> </w:t>
+      </w:r>
+      <w:r>
+        <w:rPr>
+          <w:i/>
+          <w:iCs/>
+        </w:rPr>
+        <w:t xml:space="preserve">Science Advances</w:t>
       </w:r>
       <w:r>
         <w:t xml:space="preserve"> </w:t>
@@ -940,12 +1014,65 @@
           <w:b/>
           <w:bCs/>
         </w:rPr>
+        <w:t xml:space="preserve">2</w:t>
+      </w:r>
+      <w:r>
+        <w:t xml:space="preserve">, e1600883. (doi:</w:t>
+      </w:r>
+      <w:hyperlink r:id="rId38">
+        <w:r>
+          <w:rPr>
+            <w:rStyle w:val="Hyperlink"/>
+          </w:rPr>
+          <w:t xml:space="preserve">10.1126/sciadv.1600883</w:t>
+        </w:r>
+      </w:hyperlink>
+      <w:r>
+        <w:t xml:space="preserve">)</w:t>
+      </w:r>
+    </w:p>
+    <w:bookmarkEnd w:id="39"/>
+    <w:bookmarkStart w:id="41" w:name="ref-verzi2008"/>
+    <w:p>
+      <w:pPr>
+        <w:pStyle w:val="Bibliography"/>
+      </w:pPr>
+      <w:r>
+        <w:t xml:space="preserve">6.</w:t>
+      </w:r>
+      <w:r>
+        <w:t xml:space="preserve"> </w:t>
+      </w:r>
+      <w:r>
+        <w:t xml:space="preserve">	</w:t>
+      </w:r>
+      <w:r>
+        <w:t xml:space="preserve">Verzi DH, Montalvo CI, Deschamps CM. 2008 Biostratigraphy and biochronology of the late miocene of central argentina: Evidence from rodents and taphonomy.</w:t>
+      </w:r>
+      <w:r>
+        <w:t xml:space="preserve"> </w:t>
+      </w:r>
+      <w:r>
+        <w:rPr>
+          <w:i/>
+          <w:iCs/>
+        </w:rPr>
+        <w:t xml:space="preserve">Geobios</w:t>
+      </w:r>
+      <w:r>
+        <w:t xml:space="preserve"> </w:t>
+      </w:r>
+      <w:r>
+        <w:rPr>
+          <w:b/>
+          <w:bCs/>
+        </w:rPr>
         <w:t xml:space="preserve">41</w:t>
       </w:r>
       <w:r>
         <w:t xml:space="preserve">, 145–155. (doi:</w:t>
       </w:r>
-      <w:hyperlink r:id="rId34">
+      <w:hyperlink r:id="rId40">
         <w:r>
           <w:rPr>
             <w:rStyle w:val="Hyperlink"/>
@@ -957,14 +1084,14 @@
         <w:t xml:space="preserve">)</w:t>
       </w:r>
     </w:p>
-    <w:bookmarkEnd w:id="35"/>
-    <w:bookmarkStart w:id="37" w:name="ref-bacon2015"/>
+    <w:bookmarkEnd w:id="41"/>
+    <w:bookmarkStart w:id="43" w:name="ref-bacon2015"/>
     <w:p>
       <w:pPr>
         <w:pStyle w:val="Bibliography"/>
       </w:pPr>
       <w:r>
-        <w:t xml:space="preserve">5.</w:t>
+        <w:t xml:space="preserve">7.</w:t>
       </w:r>
       <w:r>
         <w:t xml:space="preserve"> </w:t>
@@ -998,7 +1125,7 @@
       <w:r>
         <w:t xml:space="preserve">, 6110–6115. (doi:</w:t>
       </w:r>
-      <w:hyperlink r:id="rId36">
+      <w:hyperlink r:id="rId42">
         <w:r>
           <w:rPr>
             <w:rStyle w:val="Hyperlink"/>
@@ -1010,14 +1137,14 @@
         <w:t xml:space="preserve">)</w:t>
       </w:r>
     </w:p>
-    <w:bookmarkEnd w:id="37"/>
-    <w:bookmarkStart w:id="39" w:name="ref-bacon2016"/>
+    <w:bookmarkEnd w:id="43"/>
+    <w:bookmarkStart w:id="45" w:name="ref-bacon2016"/>
     <w:p>
       <w:pPr>
         <w:pStyle w:val="Bibliography"/>
       </w:pPr>
       <w:r>
-        <w:t xml:space="preserve">6.</w:t>
+        <w:t xml:space="preserve">8.</w:t>
       </w:r>
       <w:r>
         <w:t xml:space="preserve"> </w:t>
@@ -1051,7 +1178,7 @@
       <w:r>
         <w:t xml:space="preserve">, 375–378. (doi:</w:t>
       </w:r>
-      <w:hyperlink r:id="rId38">
+      <w:hyperlink r:id="rId44">
         <w:r>
           <w:rPr>
             <w:rStyle w:val="Hyperlink"/>
@@ -1063,14 +1190,14 @@
         <w:t xml:space="preserve">)</w:t>
       </w:r>
     </w:p>
-    <w:bookmarkEnd w:id="39"/>
-    <w:bookmarkStart w:id="41" w:name="ref-webb1976"/>
+    <w:bookmarkEnd w:id="45"/>
+    <w:bookmarkStart w:id="47" w:name="ref-webb1976"/>
     <w:p>
       <w:pPr>
         <w:pStyle w:val="Bibliography"/>
       </w:pPr>
       <w:r>
-        <w:t xml:space="preserve">7.</w:t>
+        <w:t xml:space="preserve">9.</w:t>
       </w:r>
       <w:r>
         <w:t xml:space="preserve"> </w:t>
@@ -1084,7 +1211,7 @@
       <w:r>
         <w:t xml:space="preserve"> </w:t>
       </w:r>
-      <w:hyperlink r:id="rId40">
+      <w:hyperlink r:id="rId46">
         <w:r>
           <w:rPr>
             <w:rStyle w:val="Hyperlink"/>
@@ -1119,14 +1246,14 @@
         <w:t xml:space="preserve">, 220–234.</w:t>
       </w:r>
     </w:p>
-    <w:bookmarkEnd w:id="41"/>
-    <w:bookmarkStart w:id="43" w:name="ref-marshall1988"/>
+    <w:bookmarkEnd w:id="47"/>
+    <w:bookmarkStart w:id="49" w:name="ref-marshall1988"/>
     <w:p>
       <w:pPr>
         <w:pStyle w:val="Bibliography"/>
       </w:pPr>
       <w:r>
-        <w:t xml:space="preserve">8.</w:t>
+        <w:t xml:space="preserve">10.</w:t>
       </w:r>
       <w:r>
         <w:t xml:space="preserve"> </w:t>
@@ -1140,7 +1267,7 @@
       <w:r>
         <w:t xml:space="preserve"> </w:t>
       </w:r>
-      <w:hyperlink r:id="rId42">
+      <w:hyperlink r:id="rId48">
         <w:r>
           <w:rPr>
             <w:rStyle w:val="Hyperlink"/>
@@ -1175,14 +1302,14 @@
         <w:t xml:space="preserve">, 380–388.</w:t>
       </w:r>
     </w:p>
-    <w:bookmarkEnd w:id="43"/>
-    <w:bookmarkStart w:id="45" w:name="ref-croft2020"/>
+    <w:bookmarkEnd w:id="49"/>
+    <w:bookmarkStart w:id="51" w:name="ref-carrillo2020"/>
     <w:p>
       <w:pPr>
         <w:pStyle w:val="Bibliography"/>
       </w:pPr>
       <w:r>
-        <w:t xml:space="preserve">9.</w:t>
+        <w:t xml:space="preserve">11.</w:t>
       </w:r>
       <w:r>
         <w:t xml:space="preserve"> </w:t>
@@ -1191,7 +1318,7 @@
         <w:t xml:space="preserve">	</w:t>
       </w:r>
       <w:r>
-        <w:t xml:space="preserve">Croft DA, Gelfo JN, López GM. 2020 Splendid innovation: The extinct south american native ungulates.</w:t>
+        <w:t xml:space="preserve">Carrillo JD, Faurby S, Silvestro D, Zizka A, Jaramillo C, Bacon CD, Antonelli A. 2020 Disproportionate extinction of south american mammals drove the asymmetry of the great american biotic interchange.</w:t>
       </w:r>
       <w:r>
         <w:t xml:space="preserve"> </w:t>
@@ -1201,7 +1328,7 @@
           <w:i/>
           <w:iCs/>
         </w:rPr>
-        <w:t xml:space="preserve">Annual Review of Earth and Planetary Sciences</w:t>
+        <w:t xml:space="preserve">Proceedings of the National Academy of Sciences</w:t>
       </w:r>
       <w:r>
         <w:t xml:space="preserve"> </w:t>
@@ -1211,12 +1338,513 @@
           <w:b/>
           <w:bCs/>
         </w:rPr>
+        <w:t xml:space="preserve">117</w:t>
+      </w:r>
+      <w:r>
+        <w:t xml:space="preserve">, 26281–26287. (doi:</w:t>
+      </w:r>
+      <w:hyperlink r:id="rId50">
+        <w:r>
+          <w:rPr>
+            <w:rStyle w:val="Hyperlink"/>
+          </w:rPr>
+          <w:t xml:space="preserve">10.1073/pnas.2009397117</w:t>
+        </w:r>
+      </w:hyperlink>
+      <w:r>
+        <w:t xml:space="preserve">)</w:t>
+      </w:r>
+    </w:p>
+    <w:bookmarkEnd w:id="51"/>
+    <w:bookmarkStart w:id="52" w:name="ref-macarthur1967"/>
+    <w:p>
+      <w:pPr>
+        <w:pStyle w:val="Bibliography"/>
+      </w:pPr>
+      <w:r>
+        <w:t xml:space="preserve">12.</w:t>
+      </w:r>
+      <w:r>
+        <w:t xml:space="preserve"> </w:t>
+      </w:r>
+      <w:r>
+        <w:t xml:space="preserve">	</w:t>
+      </w:r>
+      <w:r>
+        <w:t xml:space="preserve">MacArthur RH, Wilson EO. 1967</w:t>
+      </w:r>
+      <w:r>
+        <w:t xml:space="preserve"> </w:t>
+      </w:r>
+      <w:r>
+        <w:rPr>
+          <w:i/>
+          <w:iCs/>
+        </w:rPr>
+        <w:t xml:space="preserve">The theory of island biogeography</w:t>
+      </w:r>
+      <w:r>
+        <w:t xml:space="preserve">. Princeton University Press. Princeton, New Jersey.</w:t>
+      </w:r>
+      <w:r>
+        <w:t xml:space="preserve"> </w:t>
+      </w:r>
+    </w:p>
+    <w:bookmarkEnd w:id="52"/>
+    <w:bookmarkStart w:id="53" w:name="ref-simpson1980"/>
+    <w:p>
+      <w:pPr>
+        <w:pStyle w:val="Bibliography"/>
+      </w:pPr>
+      <w:r>
+        <w:t xml:space="preserve">13.</w:t>
+      </w:r>
+      <w:r>
+        <w:t xml:space="preserve"> </w:t>
+      </w:r>
+      <w:r>
+        <w:t xml:space="preserve">	</w:t>
+      </w:r>
+      <w:r>
+        <w:t xml:space="preserve">Simpson GG. 1980</w:t>
+      </w:r>
+      <w:r>
+        <w:t xml:space="preserve"> </w:t>
+      </w:r>
+      <w:r>
+        <w:rPr>
+          <w:i/>
+          <w:iCs/>
+        </w:rPr>
+        <w:t xml:space="preserve">Splendid isolation : The curious history of south american mammals</w:t>
+      </w:r>
+      <w:r>
+        <w:t xml:space="preserve">. Yale University Press, New Haven.</w:t>
+      </w:r>
+      <w:r>
+        <w:t xml:space="preserve"> </w:t>
+      </w:r>
+    </w:p>
+    <w:bookmarkEnd w:id="53"/>
+    <w:bookmarkStart w:id="55" w:name="ref-domingo2020"/>
+    <w:p>
+      <w:pPr>
+        <w:pStyle w:val="Bibliography"/>
+      </w:pPr>
+      <w:r>
+        <w:t xml:space="preserve">14.</w:t>
+      </w:r>
+      <w:r>
+        <w:t xml:space="preserve"> </w:t>
+      </w:r>
+      <w:r>
+        <w:t xml:space="preserve">	</w:t>
+      </w:r>
+      <w:r>
+        <w:t xml:space="preserve">Domingo L, Tomassini RL, Montalvo CI, Sanz-Pérez D, Alberdi MT. 2020 The Great American Biotic Interchange revisited: a new perspective from the stable isotope record of Argentine Pampas fossil mammals.</w:t>
+      </w:r>
+      <w:r>
+        <w:t xml:space="preserve"> </w:t>
+      </w:r>
+      <w:r>
+        <w:rPr>
+          <w:i/>
+          <w:iCs/>
+        </w:rPr>
+        <w:t xml:space="preserve">Scientific Reports</w:t>
+      </w:r>
+      <w:r>
+        <w:t xml:space="preserve"> </w:t>
+      </w:r>
+      <w:r>
+        <w:rPr>
+          <w:b/>
+          <w:bCs/>
+        </w:rPr>
+        <w:t xml:space="preserve">10</w:t>
+      </w:r>
+      <w:r>
+        <w:t xml:space="preserve">, 1608. (doi:</w:t>
+      </w:r>
+      <w:hyperlink r:id="rId54">
+        <w:r>
+          <w:rPr>
+            <w:rStyle w:val="Hyperlink"/>
+          </w:rPr>
+          <w:t xml:space="preserve">10.1038/s41598-020-58575-6</w:t>
+        </w:r>
+      </w:hyperlink>
+      <w:r>
+        <w:t xml:space="preserve">)</w:t>
+      </w:r>
+    </w:p>
+    <w:bookmarkEnd w:id="55"/>
+    <w:bookmarkStart w:id="57" w:name="ref-prevosti2013"/>
+    <w:p>
+      <w:pPr>
+        <w:pStyle w:val="Bibliography"/>
+      </w:pPr>
+      <w:r>
+        <w:t xml:space="preserve">15.</w:t>
+      </w:r>
+      <w:r>
+        <w:t xml:space="preserve"> </w:t>
+      </w:r>
+      <w:r>
+        <w:t xml:space="preserve">	</w:t>
+      </w:r>
+      <w:r>
+        <w:t xml:space="preserve">Prevosti FJ, Forasiepi A, Zimicz N. 2013 The Evolution of the Cenozoic Terrestrial Mammalian Predator Guild in South America: Competition or Replacement?</w:t>
+      </w:r>
+      <w:r>
+        <w:t xml:space="preserve"> </w:t>
+      </w:r>
+      <w:r>
+        <w:rPr>
+          <w:i/>
+          <w:iCs/>
+        </w:rPr>
+        <w:t xml:space="preserve">Journal of Mammalian Evolution</w:t>
+      </w:r>
+      <w:r>
+        <w:t xml:space="preserve"> </w:t>
+      </w:r>
+      <w:r>
+        <w:rPr>
+          <w:b/>
+          <w:bCs/>
+        </w:rPr>
+        <w:t xml:space="preserve">20</w:t>
+      </w:r>
+      <w:r>
+        <w:t xml:space="preserve">, 3–21. (doi:</w:t>
+      </w:r>
+      <w:hyperlink r:id="rId56">
+        <w:r>
+          <w:rPr>
+            <w:rStyle w:val="Hyperlink"/>
+          </w:rPr>
+          <w:t xml:space="preserve">10.1007/s10914-011-9175-9</w:t>
+        </w:r>
+      </w:hyperlink>
+      <w:r>
+        <w:t xml:space="preserve">)</w:t>
+      </w:r>
+    </w:p>
+    <w:bookmarkEnd w:id="57"/>
+    <w:bookmarkStart w:id="59" w:name="ref-tarquini2022"/>
+    <w:p>
+      <w:pPr>
+        <w:pStyle w:val="Bibliography"/>
+      </w:pPr>
+      <w:r>
+        <w:t xml:space="preserve">16.</w:t>
+      </w:r>
+      <w:r>
+        <w:t xml:space="preserve"> </w:t>
+      </w:r>
+      <w:r>
+        <w:t xml:space="preserve">	</w:t>
+      </w:r>
+      <w:r>
+        <w:t xml:space="preserve">Tarquini SD, Ladevèze S, Prevosti FJ. 2022 The multicausal twilight of South American native mammalian predators (Metatheria, Sparassodonta).</w:t>
+      </w:r>
+      <w:r>
+        <w:t xml:space="preserve"> </w:t>
+      </w:r>
+      <w:r>
+        <w:rPr>
+          <w:i/>
+          <w:iCs/>
+        </w:rPr>
+        <w:t xml:space="preserve">Scientific Reports</w:t>
+      </w:r>
+      <w:r>
+        <w:t xml:space="preserve"> </w:t>
+      </w:r>
+      <w:r>
+        <w:rPr>
+          <w:b/>
+          <w:bCs/>
+        </w:rPr>
+        <w:t xml:space="preserve">12</w:t>
+      </w:r>
+      <w:r>
+        <w:t xml:space="preserve">, 1224. (doi:</w:t>
+      </w:r>
+      <w:hyperlink r:id="rId58">
+        <w:r>
+          <w:rPr>
+            <w:rStyle w:val="Hyperlink"/>
+          </w:rPr>
+          <w:t xml:space="preserve">10.1038/s41598-022-05266-z</w:t>
+        </w:r>
+      </w:hyperlink>
+      <w:r>
+        <w:t xml:space="preserve">)</w:t>
+      </w:r>
+    </w:p>
+    <w:bookmarkEnd w:id="59"/>
+    <w:bookmarkStart w:id="61" w:name="ref-marsà2025"/>
+    <w:p>
+      <w:pPr>
+        <w:pStyle w:val="Bibliography"/>
+      </w:pPr>
+      <w:r>
+        <w:t xml:space="preserve">17.</w:t>
+      </w:r>
+      <w:r>
+        <w:t xml:space="preserve"> </w:t>
+      </w:r>
+      <w:r>
+        <w:t xml:space="preserve">	</w:t>
+      </w:r>
+      <w:r>
+        <w:t xml:space="preserve">Marsà JAG, Agnolín FL, Angst D, Buffetaut E. 2025 Paleohistological Analysis of</w:t>
+      </w:r>
+      <w:r>
+        <w:t xml:space="preserve"> </w:t>
+      </w:r>
+      <w:r>
+        <w:t xml:space="preserve">“</w:t>
+      </w:r>
+      <w:r>
+        <w:t xml:space="preserve">Terror Birds</w:t>
+      </w:r>
+      <w:r>
+        <w:t xml:space="preserve">”</w:t>
+      </w:r>
+      <w:r>
+        <w:t xml:space="preserve"> </w:t>
+      </w:r>
+      <w:r>
+        <w:t xml:space="preserve">(Phorusrhacidae, Brontornithidae): Paleobiological Inferences.</w:t>
+      </w:r>
+      <w:r>
+        <w:t xml:space="preserve"> </w:t>
+      </w:r>
+      <w:r>
+        <w:rPr>
+          <w:i/>
+          <w:iCs/>
+        </w:rPr>
+        <w:t xml:space="preserve">Diversity</w:t>
+      </w:r>
+      <w:r>
+        <w:t xml:space="preserve"> </w:t>
+      </w:r>
+      <w:r>
+        <w:rPr>
+          <w:b/>
+          <w:bCs/>
+        </w:rPr>
+        <w:t xml:space="preserve">17</w:t>
+      </w:r>
+      <w:r>
+        <w:t xml:space="preserve">, 153. (doi:</w:t>
+      </w:r>
+      <w:hyperlink r:id="rId60">
+        <w:r>
+          <w:rPr>
+            <w:rStyle w:val="Hyperlink"/>
+          </w:rPr>
+          <w:t xml:space="preserve">10.3390/d17030153</w:t>
+        </w:r>
+      </w:hyperlink>
+      <w:r>
+        <w:t xml:space="preserve">)</w:t>
+      </w:r>
+    </w:p>
+    <w:bookmarkEnd w:id="61"/>
+    <w:bookmarkStart w:id="62" w:name="ref-marshall1990"/>
+    <w:p>
+      <w:pPr>
+        <w:pStyle w:val="Bibliography"/>
+      </w:pPr>
+      <w:r>
+        <w:t xml:space="preserve">18.</w:t>
+      </w:r>
+      <w:r>
+        <w:t xml:space="preserve"> </w:t>
+      </w:r>
+      <w:r>
+        <w:t xml:space="preserve">	</w:t>
+      </w:r>
+      <w:r>
+        <w:t xml:space="preserve">Marshall LG, Cifelli RL. 1990 Analysis of changing diversity patterns in cenozoic land mammal age faunas, south america.</w:t>
+      </w:r>
+      <w:r>
+        <w:t xml:space="preserve"> </w:t>
+      </w:r>
+      <w:r>
+        <w:rPr>
+          <w:i/>
+          <w:iCs/>
+        </w:rPr>
+        <w:t xml:space="preserve">Palaeovertebrata</w:t>
+      </w:r>
+      <w:r>
+        <w:t xml:space="preserve"> </w:t>
+      </w:r>
+      <w:r>
+        <w:rPr>
+          <w:b/>
+          <w:bCs/>
+        </w:rPr>
+        <w:t xml:space="preserve">19</w:t>
+      </w:r>
+      <w:r>
+        <w:t xml:space="preserve">, 169–210.</w:t>
+      </w:r>
+    </w:p>
+    <w:bookmarkEnd w:id="62"/>
+    <w:bookmarkStart w:id="64" w:name="ref-faurby2016"/>
+    <w:p>
+      <w:pPr>
+        <w:pStyle w:val="Bibliography"/>
+      </w:pPr>
+      <w:r>
+        <w:t xml:space="preserve">19.</w:t>
+      </w:r>
+      <w:r>
+        <w:t xml:space="preserve"> </w:t>
+      </w:r>
+      <w:r>
+        <w:t xml:space="preserve">	</w:t>
+      </w:r>
+      <w:r>
+        <w:t xml:space="preserve">Faurby S, Svenning J-C. 2016 The asymmetry in the Great American Biotic Interchange in mammals is consistent with differential susceptibility to mammalian predation.</w:t>
+      </w:r>
+      <w:r>
+        <w:t xml:space="preserve"> </w:t>
+      </w:r>
+      <w:r>
+        <w:rPr>
+          <w:i/>
+          <w:iCs/>
+        </w:rPr>
+        <w:t xml:space="preserve">Global Ecology and Biogeography</w:t>
+      </w:r>
+      <w:r>
+        <w:t xml:space="preserve"> </w:t>
+      </w:r>
+      <w:r>
+        <w:rPr>
+          <w:b/>
+          <w:bCs/>
+        </w:rPr>
+        <w:t xml:space="preserve">25</w:t>
+      </w:r>
+      <w:r>
+        <w:t xml:space="preserve">, 1443–1453. (doi:</w:t>
+      </w:r>
+      <w:hyperlink r:id="rId63">
+        <w:r>
+          <w:rPr>
+            <w:rStyle w:val="Hyperlink"/>
+          </w:rPr>
+          <w:t xml:space="preserve">10.1111/geb.12504</w:t>
+        </w:r>
+      </w:hyperlink>
+      <w:r>
+        <w:t xml:space="preserve">)</w:t>
+      </w:r>
+    </w:p>
+    <w:bookmarkEnd w:id="64"/>
+    <w:bookmarkStart w:id="66" w:name="ref-webb1991"/>
+    <w:p>
+      <w:pPr>
+        <w:pStyle w:val="Bibliography"/>
+      </w:pPr>
+      <w:r>
+        <w:t xml:space="preserve">20.</w:t>
+      </w:r>
+      <w:r>
+        <w:t xml:space="preserve"> </w:t>
+      </w:r>
+      <w:r>
+        <w:t xml:space="preserve">	</w:t>
+      </w:r>
+      <w:r>
+        <w:t xml:space="preserve">Webb SD. 1991 Ecogeography and the Great American Interchange.</w:t>
+      </w:r>
+      <w:r>
+        <w:t xml:space="preserve"> </w:t>
+      </w:r>
+      <w:r>
+        <w:rPr>
+          <w:i/>
+          <w:iCs/>
+        </w:rPr>
+        <w:t xml:space="preserve">Paleobiology</w:t>
+      </w:r>
+      <w:r>
+        <w:t xml:space="preserve"> </w:t>
+      </w:r>
+      <w:r>
+        <w:rPr>
+          <w:b/>
+          <w:bCs/>
+        </w:rPr>
+        <w:t xml:space="preserve">17</w:t>
+      </w:r>
+      <w:r>
+        <w:t xml:space="preserve">, 266–280. (doi:</w:t>
+      </w:r>
+      <w:hyperlink r:id="rId65">
+        <w:r>
+          <w:rPr>
+            <w:rStyle w:val="Hyperlink"/>
+          </w:rPr>
+          <w:t xml:space="preserve">10.1017/S0094837300010605</w:t>
+        </w:r>
+      </w:hyperlink>
+      <w:r>
+        <w:t xml:space="preserve">)</w:t>
+      </w:r>
+    </w:p>
+    <w:bookmarkEnd w:id="66"/>
+    <w:bookmarkStart w:id="68" w:name="ref-croft2020"/>
+    <w:p>
+      <w:pPr>
+        <w:pStyle w:val="Bibliography"/>
+      </w:pPr>
+      <w:r>
+        <w:t xml:space="preserve">21.</w:t>
+      </w:r>
+      <w:r>
+        <w:t xml:space="preserve"> </w:t>
+      </w:r>
+      <w:r>
+        <w:t xml:space="preserve">	</w:t>
+      </w:r>
+      <w:r>
+        <w:t xml:space="preserve">Croft DA, Gelfo JN, López GM. 2020 Splendid innovation: The extinct south american native ungulates.</w:t>
+      </w:r>
+      <w:r>
+        <w:t xml:space="preserve"> </w:t>
+      </w:r>
+      <w:r>
+        <w:rPr>
+          <w:i/>
+          <w:iCs/>
+        </w:rPr>
+        <w:t xml:space="preserve">Annual Review of Earth and Planetary Sciences</w:t>
+      </w:r>
+      <w:r>
+        <w:t xml:space="preserve"> </w:t>
+      </w:r>
+      <w:r>
+        <w:rPr>
+          <w:b/>
+          <w:bCs/>
+        </w:rPr>
         <w:t xml:space="preserve">48</w:t>
       </w:r>
       <w:r>
         <w:t xml:space="preserve">, 259–290. (doi:</w:t>
       </w:r>
-      <w:hyperlink r:id="rId44">
+      <w:hyperlink r:id="rId67">
         <w:r>
           <w:rPr>
             <w:rStyle w:val="Hyperlink"/>
@@ -1228,14 +1856,14 @@
         <w:t xml:space="preserve">)</w:t>
       </w:r>
     </w:p>
-    <w:bookmarkEnd w:id="45"/>
-    <w:bookmarkStart w:id="47" w:name="ref-pino2022"/>
+    <w:bookmarkEnd w:id="68"/>
+    <w:bookmarkStart w:id="70" w:name="ref-pino2022"/>
     <w:p>
       <w:pPr>
         <w:pStyle w:val="Bibliography"/>
       </w:pPr>
       <w:r>
-        <w:t xml:space="preserve">10.</w:t>
+        <w:t xml:space="preserve">22.</w:t>
       </w:r>
       <w:r>
         <w:t xml:space="preserve"> </w:t>
@@ -1269,7 +1897,7 @@
       <w:r>
         <w:t xml:space="preserve">, 103758. (doi:</w:t>
       </w:r>
-      <w:hyperlink r:id="rId46">
+      <w:hyperlink r:id="rId69">
         <w:r>
           <w:rPr>
             <w:rStyle w:val="Hyperlink"/>
@@ -1281,14 +1909,14 @@
         <w:t xml:space="preserve">)</w:t>
       </w:r>
     </w:p>
-    <w:bookmarkEnd w:id="47"/>
-    <w:bookmarkStart w:id="49" w:name="ref-tarquini2022"/>
+    <w:bookmarkEnd w:id="70"/>
+    <w:bookmarkStart w:id="72" w:name="ref-holden2019"/>
     <w:p>
       <w:pPr>
         <w:pStyle w:val="Bibliography"/>
       </w:pPr>
       <w:r>
-        <w:t xml:space="preserve">11.</w:t>
+        <w:t xml:space="preserve">23.</w:t>
       </w:r>
       <w:r>
         <w:t xml:space="preserve"> </w:t>
@@ -1297,7 +1925,10 @@
         <w:t xml:space="preserve">	</w:t>
       </w:r>
       <w:r>
-        <w:t xml:space="preserve">Tarquini SD, Ladevèze S, Prevosti FJ. 2022 The multicausal twilight of South American native mammalian predators (Metatheria, Sparassodonta).</w:t>
+        <w:t xml:space="preserve">Holden PB, Edwards NR, Rangel TF, Pereira EB, Tran GT, Wilkinson RD. 2019 PALEO-PGEM v1.0: A statistical emulator of pliocene</w:t>
+      </w:r>
+      <w:r>
+        <w:t xml:space="preserve">pleistocene climate.</w:t>
       </w:r>
       <w:r>
         <w:t xml:space="preserve"> </w:t>
@@ -1307,7 +1938,7 @@
           <w:i/>
           <w:iCs/>
         </w:rPr>
-        <w:t xml:space="preserve">Scientific Reports</w:t>
+        <w:t xml:space="preserve">Geoscientific Model Development</w:t>
       </w:r>
       <w:r>
         <w:t xml:space="preserve"> </w:t>
@@ -1320,28 +1951,28 @@
         <w:t xml:space="preserve">12</w:t>
       </w:r>
       <w:r>
-        <w:t xml:space="preserve">, 1224. (doi:</w:t>
-      </w:r>
-      <w:hyperlink r:id="rId48">
+        <w:t xml:space="preserve">, 5137–5155. (doi:</w:t>
+      </w:r>
+      <w:hyperlink r:id="rId71">
         <w:r>
           <w:rPr>
             <w:rStyle w:val="Hyperlink"/>
           </w:rPr>
-          <w:t xml:space="preserve">10.1038/s41598-022-05266-z</w:t>
+          <w:t xml:space="preserve">https://doi.org/10.5194/gmd-12-5137-2019</w:t>
         </w:r>
       </w:hyperlink>
       <w:r>
         <w:t xml:space="preserve">)</w:t>
       </w:r>
     </w:p>
-    <w:bookmarkEnd w:id="49"/>
-    <w:bookmarkStart w:id="50" w:name="ref-simpson1980"/>
+    <w:bookmarkEnd w:id="72"/>
+    <w:bookmarkStart w:id="74" w:name="ref-barreto2023"/>
     <w:p>
       <w:pPr>
         <w:pStyle w:val="Bibliography"/>
       </w:pPr>
       <w:r>
-        <w:t xml:space="preserve">12.</w:t>
+        <w:t xml:space="preserve">24.</w:t>
       </w:r>
       <w:r>
         <w:t xml:space="preserve"> </w:t>
@@ -1350,7 +1981,7 @@
         <w:t xml:space="preserve">	</w:t>
       </w:r>
       <w:r>
-        <w:t xml:space="preserve">Simpson GG. 1980</w:t>
+        <w:t xml:space="preserve">Barreto E, Holden PB, Edwards NR, Rangel TF. 2023 PALEO-PGEM-Series: A spatial time series of the global climate over the last 5 million years (Plio-Pleistocene).</w:t>
       </w:r>
       <w:r>
         <w:t xml:space="preserve"> </w:t>
@@ -1360,42 +1991,7 @@
           <w:i/>
           <w:iCs/>
         </w:rPr>
-        <w:t xml:space="preserve">Splendid isolation : The curious history of south american mammals</w:t>
-      </w:r>
-      <w:r>
-        <w:t xml:space="preserve">. Yale University Press, New Haven.</w:t>
-      </w:r>
-      <w:r>
-        <w:t xml:space="preserve"> </w:t>
-      </w:r>
-    </w:p>
-    <w:bookmarkEnd w:id="50"/>
-    <w:bookmarkStart w:id="52" w:name="ref-prevosti2013"/>
-    <w:p>
-      <w:pPr>
-        <w:pStyle w:val="Bibliography"/>
-      </w:pPr>
-      <w:r>
-        <w:t xml:space="preserve">13.</w:t>
-      </w:r>
-      <w:r>
-        <w:t xml:space="preserve"> </w:t>
-      </w:r>
-      <w:r>
-        <w:t xml:space="preserve">	</w:t>
-      </w:r>
-      <w:r>
-        <w:t xml:space="preserve">Prevosti FJ, Forasiepi A, Zimicz N. 2013 The Evolution of the Cenozoic Terrestrial Mammalian Predator Guild in South America: Competition or Replacement?</w:t>
-      </w:r>
-      <w:r>
-        <w:t xml:space="preserve"> </w:t>
-      </w:r>
-      <w:r>
-        <w:rPr>
-          <w:i/>
-          <w:iCs/>
-        </w:rPr>
-        <w:t xml:space="preserve">Journal of Mammalian Evolution</w:t>
+        <w:t xml:space="preserve">Global Ecology and Biogeography</w:t>
       </w:r>
       <w:r>
         <w:t xml:space="preserve"> </w:t>
@@ -1405,31 +2001,31 @@
           <w:b/>
           <w:bCs/>
         </w:rPr>
-        <w:t xml:space="preserve">20</w:t>
-      </w:r>
-      <w:r>
-        <w:t xml:space="preserve">, 3–21. (doi:</w:t>
-      </w:r>
-      <w:hyperlink r:id="rId51">
+        <w:t xml:space="preserve">32</w:t>
+      </w:r>
+      <w:r>
+        <w:t xml:space="preserve">, 1034–1045. (doi:</w:t>
+      </w:r>
+      <w:hyperlink r:id="rId73">
         <w:r>
           <w:rPr>
             <w:rStyle w:val="Hyperlink"/>
           </w:rPr>
-          <w:t xml:space="preserve">10.1007/s10914-011-9175-9</w:t>
+          <w:t xml:space="preserve">10.1111/geb.13683</w:t>
         </w:r>
       </w:hyperlink>
       <w:r>
         <w:t xml:space="preserve">)</w:t>
       </w:r>
     </w:p>
-    <w:bookmarkEnd w:id="52"/>
-    <w:bookmarkStart w:id="54" w:name="ref-faurby2016"/>
+    <w:bookmarkEnd w:id="74"/>
+    <w:bookmarkStart w:id="76" w:name="ref-hagen2021"/>
     <w:p>
       <w:pPr>
         <w:pStyle w:val="Bibliography"/>
       </w:pPr>
       <w:r>
-        <w:t xml:space="preserve">14.</w:t>
+        <w:t xml:space="preserve">25.</w:t>
       </w:r>
       <w:r>
         <w:t xml:space="preserve"> </w:t>
@@ -1438,7 +2034,13 @@
         <w:t xml:space="preserve">	</w:t>
       </w:r>
       <w:r>
-        <w:t xml:space="preserve">Faurby S, Svenning J-C. 2016 The asymmetry in the Great American Biotic Interchange in mammals is consistent with differential susceptibility to mammalian predation.</w:t>
+        <w:t xml:space="preserve">Hagen O, Flück B, Fopp F, Cabral JS, Hartig F, Pontarp M, Rangel TF, Pellissier L. 2021 gen3sis: A general engine for eco-evolutionary simulations of the processes that shape Earth</w:t>
+      </w:r>
+      <w:r>
+        <w:t xml:space="preserve">’</w:t>
+      </w:r>
+      <w:r>
+        <w:t xml:space="preserve">s biodiversity.</w:t>
       </w:r>
       <w:r>
         <w:t xml:space="preserve"> </w:t>
@@ -1448,7 +2050,7 @@
           <w:i/>
           <w:iCs/>
         </w:rPr>
-        <w:t xml:space="preserve">Global Ecology and Biogeography</w:t>
+        <w:t xml:space="preserve">PLOS Biology</w:t>
       </w:r>
       <w:r>
         <w:t xml:space="preserve"> </w:t>
@@ -1458,31 +2060,31 @@
           <w:b/>
           <w:bCs/>
         </w:rPr>
-        <w:t xml:space="preserve">25</w:t>
-      </w:r>
-      <w:r>
-        <w:t xml:space="preserve">, 1443–1453. (doi:</w:t>
-      </w:r>
-      <w:hyperlink r:id="rId53">
+        <w:t xml:space="preserve">19</w:t>
+      </w:r>
+      <w:r>
+        <w:t xml:space="preserve">, e3001340. (doi:</w:t>
+      </w:r>
+      <w:hyperlink r:id="rId75">
         <w:r>
           <w:rPr>
             <w:rStyle w:val="Hyperlink"/>
           </w:rPr>
-          <w:t xml:space="preserve">10.1111/geb.12504</w:t>
+          <w:t xml:space="preserve">10.1371/journal.pbio.3001340</w:t>
         </w:r>
       </w:hyperlink>
       <w:r>
         <w:t xml:space="preserve">)</w:t>
       </w:r>
     </w:p>
-    <w:bookmarkEnd w:id="54"/>
-    <w:bookmarkStart w:id="56" w:name="ref-skeels2023"/>
+    <w:bookmarkEnd w:id="76"/>
+    <w:bookmarkStart w:id="78" w:name="ref-obrien2023"/>
     <w:p>
       <w:pPr>
         <w:pStyle w:val="Bibliography"/>
       </w:pPr>
       <w:r>
-        <w:t xml:space="preserve">15.</w:t>
+        <w:t xml:space="preserve">26.</w:t>
       </w:r>
       <w:r>
         <w:t xml:space="preserve"> </w:t>
@@ -1491,7 +2093,7 @@
         <w:t xml:space="preserve">	</w:t>
       </w:r>
       <w:r>
-        <w:t xml:space="preserve">Skeels A, Bach W, Hagen O, Jetz W, Pellissier L. 2023 Temperature-dependent evolutionary speed shapes the evolution of biodiversity patterns across tetrapod radiations.</w:t>
+        <w:t xml:space="preserve">O’Brien L. 2023</w:t>
       </w:r>
       <w:r>
         <w:t xml:space="preserve"> </w:t>
@@ -1501,7 +2103,53 @@
           <w:i/>
           <w:iCs/>
         </w:rPr>
-        <w:t xml:space="preserve">Systematic Biology</w:t>
+        <w:t xml:space="preserve">h3jsr: Access uber’s H3 library</w:t>
+      </w:r>
+      <w:r>
+        <w:t xml:space="preserve">. See</w:t>
+      </w:r>
+      <w:r>
+        <w:t xml:space="preserve"> </w:t>
+      </w:r>
+      <w:hyperlink r:id="rId77">
+        <w:r>
+          <w:rPr>
+            <w:rStyle w:val="Hyperlink"/>
+          </w:rPr>
+          <w:t xml:space="preserve">https://CRAN.R-project.org/package=h3jsr</w:t>
+        </w:r>
+      </w:hyperlink>
+      <w:r>
+        <w:t xml:space="preserve">.</w:t>
+      </w:r>
+    </w:p>
+    <w:bookmarkEnd w:id="78"/>
+    <w:bookmarkStart w:id="80" w:name="ref-weir2009"/>
+    <w:p>
+      <w:pPr>
+        <w:pStyle w:val="Bibliography"/>
+      </w:pPr>
+      <w:r>
+        <w:t xml:space="preserve">27.</w:t>
+      </w:r>
+      <w:r>
+        <w:t xml:space="preserve"> </w:t>
+      </w:r>
+      <w:r>
+        <w:t xml:space="preserve">	</w:t>
+      </w:r>
+      <w:r>
+        <w:t xml:space="preserve">Weir JT, Bermingham E, Schluter D. 2009 The great american biotic interchange in birds.</w:t>
+      </w:r>
+      <w:r>
+        <w:t xml:space="preserve"> </w:t>
+      </w:r>
+      <w:r>
+        <w:rPr>
+          <w:i/>
+          <w:iCs/>
+        </w:rPr>
+        <w:t xml:space="preserve">Proceedings of the National Academy of Sciences</w:t>
       </w:r>
       <w:r>
         <w:t xml:space="preserve"> </w:t>
@@ -1511,12 +2159,65 @@
           <w:b/>
           <w:bCs/>
         </w:rPr>
+        <w:t xml:space="preserve">106</w:t>
+      </w:r>
+      <w:r>
+        <w:t xml:space="preserve">, 21737–21742. (doi:</w:t>
+      </w:r>
+      <w:hyperlink r:id="rId79">
+        <w:r>
+          <w:rPr>
+            <w:rStyle w:val="Hyperlink"/>
+          </w:rPr>
+          <w:t xml:space="preserve">10.1073/pnas.0903811106</w:t>
+        </w:r>
+      </w:hyperlink>
+      <w:r>
+        <w:t xml:space="preserve">)</w:t>
+      </w:r>
+    </w:p>
+    <w:bookmarkEnd w:id="80"/>
+    <w:bookmarkStart w:id="82" w:name="ref-skeels2023"/>
+    <w:p>
+      <w:pPr>
+        <w:pStyle w:val="Bibliography"/>
+      </w:pPr>
+      <w:r>
+        <w:t xml:space="preserve">28.</w:t>
+      </w:r>
+      <w:r>
+        <w:t xml:space="preserve"> </w:t>
+      </w:r>
+      <w:r>
+        <w:t xml:space="preserve">	</w:t>
+      </w:r>
+      <w:r>
+        <w:t xml:space="preserve">Skeels A, Bach W, Hagen O, Jetz W, Pellissier L. 2023 Temperature-dependent evolutionary speed shapes the evolution of biodiversity patterns across tetrapod radiations.</w:t>
+      </w:r>
+      <w:r>
+        <w:t xml:space="preserve"> </w:t>
+      </w:r>
+      <w:r>
+        <w:rPr>
+          <w:i/>
+          <w:iCs/>
+        </w:rPr>
+        <w:t xml:space="preserve">Systematic Biology</w:t>
+      </w:r>
+      <w:r>
+        <w:t xml:space="preserve"> </w:t>
+      </w:r>
+      <w:r>
+        <w:rPr>
+          <w:b/>
+          <w:bCs/>
+        </w:rPr>
         <w:t xml:space="preserve">72</w:t>
       </w:r>
       <w:r>
         <w:t xml:space="preserve">, 341–356. (doi:</w:t>
       </w:r>
-      <w:hyperlink r:id="rId55">
+      <w:hyperlink r:id="rId81">
         <w:r>
           <w:rPr>
             <w:rStyle w:val="Hyperlink"/>
@@ -1528,14 +2229,14 @@
         <w:t xml:space="preserve">)</w:t>
       </w:r>
     </w:p>
-    <w:bookmarkEnd w:id="56"/>
-    <w:bookmarkStart w:id="58" w:name="ref-antonelli2018"/>
+    <w:bookmarkEnd w:id="82"/>
+    <w:bookmarkStart w:id="84" w:name="ref-antonelli2018"/>
     <w:p>
       <w:pPr>
         <w:pStyle w:val="Bibliography"/>
       </w:pPr>
       <w:r>
-        <w:t xml:space="preserve">16.</w:t>
+        <w:t xml:space="preserve">29.</w:t>
       </w:r>
       <w:r>
         <w:t xml:space="preserve"> </w:t>
@@ -1582,7 +2283,7 @@
       <w:r>
         <w:t xml:space="preserve">, 718–725. (doi:</w:t>
       </w:r>
-      <w:hyperlink r:id="rId57">
+      <w:hyperlink r:id="rId83">
         <w:r>
           <w:rPr>
             <w:rStyle w:val="Hyperlink"/>
@@ -1594,223 +2295,9 @@
         <w:t xml:space="preserve">)</w:t>
       </w:r>
     </w:p>
-    <w:bookmarkEnd w:id="58"/>
-    <w:bookmarkStart w:id="60" w:name="ref-holden2019"/>
-    <w:p>
-      <w:pPr>
-        <w:pStyle w:val="Bibliography"/>
-      </w:pPr>
-      <w:r>
-        <w:t xml:space="preserve">17.</w:t>
-      </w:r>
-      <w:r>
-        <w:t xml:space="preserve"> </w:t>
-      </w:r>
-      <w:r>
-        <w:t xml:space="preserve">	</w:t>
-      </w:r>
-      <w:r>
-        <w:t xml:space="preserve">Holden PB, Edwards NR, Rangel TF, Pereira EB, Tran GT, Wilkinson RD. 2019 PALEO-PGEM v1.0: A statistical emulator of pliocene</w:t>
-      </w:r>
-      <w:r>
-        <w:t xml:space="preserve">pleistocene climate.</w:t>
-      </w:r>
-      <w:r>
-        <w:t xml:space="preserve"> </w:t>
-      </w:r>
-      <w:r>
-        <w:rPr>
-          <w:i/>
-          <w:iCs/>
-        </w:rPr>
-        <w:t xml:space="preserve">Geoscientific Model Development</w:t>
-      </w:r>
-      <w:r>
-        <w:t xml:space="preserve"> </w:t>
-      </w:r>
-      <w:r>
-        <w:rPr>
-          <w:b/>
-          <w:bCs/>
-        </w:rPr>
-        <w:t xml:space="preserve">12</w:t>
-      </w:r>
-      <w:r>
-        <w:t xml:space="preserve">, 5137–5155. (doi:</w:t>
-      </w:r>
-      <w:hyperlink r:id="rId59">
-        <w:r>
-          <w:rPr>
-            <w:rStyle w:val="Hyperlink"/>
-          </w:rPr>
-          <w:t xml:space="preserve">https://doi.org/10.5194/gmd-12-5137-2019</w:t>
-        </w:r>
-      </w:hyperlink>
-      <w:r>
-        <w:t xml:space="preserve">)</w:t>
-      </w:r>
-    </w:p>
-    <w:bookmarkEnd w:id="60"/>
-    <w:bookmarkStart w:id="62" w:name="ref-barreto2023"/>
-    <w:p>
-      <w:pPr>
-        <w:pStyle w:val="Bibliography"/>
-      </w:pPr>
-      <w:r>
-        <w:t xml:space="preserve">18.</w:t>
-      </w:r>
-      <w:r>
-        <w:t xml:space="preserve"> </w:t>
-      </w:r>
-      <w:r>
-        <w:t xml:space="preserve">	</w:t>
-      </w:r>
-      <w:r>
-        <w:t xml:space="preserve">Barreto E, Holden PB, Edwards NR, Rangel TF. 2023 PALEO-PGEM-Series: A spatial time series of the global climate over the last 5 million years (Plio-Pleistocene).</w:t>
-      </w:r>
-      <w:r>
-        <w:t xml:space="preserve"> </w:t>
-      </w:r>
-      <w:r>
-        <w:rPr>
-          <w:i/>
-          <w:iCs/>
-        </w:rPr>
-        <w:t xml:space="preserve">Global Ecology and Biogeography</w:t>
-      </w:r>
-      <w:r>
-        <w:t xml:space="preserve"> </w:t>
-      </w:r>
-      <w:r>
-        <w:rPr>
-          <w:b/>
-          <w:bCs/>
-        </w:rPr>
-        <w:t xml:space="preserve">32</w:t>
-      </w:r>
-      <w:r>
-        <w:t xml:space="preserve">, 1034–1045. (doi:</w:t>
-      </w:r>
-      <w:hyperlink r:id="rId61">
-        <w:r>
-          <w:rPr>
-            <w:rStyle w:val="Hyperlink"/>
-          </w:rPr>
-          <w:t xml:space="preserve">10.1111/geb.13683</w:t>
-        </w:r>
-      </w:hyperlink>
-      <w:r>
-        <w:t xml:space="preserve">)</w:t>
-      </w:r>
-    </w:p>
-    <w:bookmarkEnd w:id="62"/>
-    <w:bookmarkStart w:id="64" w:name="ref-hagen2021"/>
-    <w:p>
-      <w:pPr>
-        <w:pStyle w:val="Bibliography"/>
-      </w:pPr>
-      <w:r>
-        <w:t xml:space="preserve">19.</w:t>
-      </w:r>
-      <w:r>
-        <w:t xml:space="preserve"> </w:t>
-      </w:r>
-      <w:r>
-        <w:t xml:space="preserve">	</w:t>
-      </w:r>
-      <w:r>
-        <w:t xml:space="preserve">Hagen O, Flück B, Fopp F, Cabral JS, Hartig F, Pontarp M, Rangel TF, Pellissier L. 2021 gen3sis: A general engine for eco-evolutionary simulations of the processes that shape Earth</w:t>
-      </w:r>
-      <w:r>
-        <w:t xml:space="preserve">’</w:t>
-      </w:r>
-      <w:r>
-        <w:t xml:space="preserve">s biodiversity.</w:t>
-      </w:r>
-      <w:r>
-        <w:t xml:space="preserve"> </w:t>
-      </w:r>
-      <w:r>
-        <w:rPr>
-          <w:i/>
-          <w:iCs/>
-        </w:rPr>
-        <w:t xml:space="preserve">PLOS Biology</w:t>
-      </w:r>
-      <w:r>
-        <w:t xml:space="preserve"> </w:t>
-      </w:r>
-      <w:r>
-        <w:rPr>
-          <w:b/>
-          <w:bCs/>
-        </w:rPr>
-        <w:t xml:space="preserve">19</w:t>
-      </w:r>
-      <w:r>
-        <w:t xml:space="preserve">, e3001340. (doi:</w:t>
-      </w:r>
-      <w:hyperlink r:id="rId63">
-        <w:r>
-          <w:rPr>
-            <w:rStyle w:val="Hyperlink"/>
-          </w:rPr>
-          <w:t xml:space="preserve">10.1371/journal.pbio.3001340</w:t>
-        </w:r>
-      </w:hyperlink>
-      <w:r>
-        <w:t xml:space="preserve">)</w:t>
-      </w:r>
-    </w:p>
-    <w:bookmarkEnd w:id="64"/>
-    <w:bookmarkStart w:id="66" w:name="ref-obrien2023"/>
-    <w:p>
-      <w:pPr>
-        <w:pStyle w:val="Bibliography"/>
-      </w:pPr>
-      <w:r>
-        <w:t xml:space="preserve">20.</w:t>
-      </w:r>
-      <w:r>
-        <w:t xml:space="preserve"> </w:t>
-      </w:r>
-      <w:r>
-        <w:t xml:space="preserve">	</w:t>
-      </w:r>
-      <w:r>
-        <w:t xml:space="preserve">O’Brien L. 2023</w:t>
-      </w:r>
-      <w:r>
-        <w:t xml:space="preserve"> </w:t>
-      </w:r>
-      <w:r>
-        <w:rPr>
-          <w:i/>
-          <w:iCs/>
-        </w:rPr>
-        <w:t xml:space="preserve">h3jsr: Access uber’s H3 library</w:t>
-      </w:r>
-      <w:r>
-        <w:t xml:space="preserve">. See</w:t>
-      </w:r>
-      <w:r>
-        <w:t xml:space="preserve"> </w:t>
-      </w:r>
-      <w:hyperlink r:id="rId65">
-        <w:r>
-          <w:rPr>
-            <w:rStyle w:val="Hyperlink"/>
-          </w:rPr>
-          <w:t xml:space="preserve">https://CRAN.R-project.org/package=h3jsr</w:t>
-        </w:r>
-      </w:hyperlink>
-      <w:r>
-        <w:t xml:space="preserve">.</w:t>
-      </w:r>
-    </w:p>
-    <w:bookmarkEnd w:id="66"/>
-    <w:bookmarkEnd w:id="67"/>
-    <w:bookmarkEnd w:id="68"/>
+    <w:bookmarkEnd w:id="84"/>
+    <w:bookmarkEnd w:id="85"/>
+    <w:bookmarkEnd w:id="86"/>
     <w:sectPr>
       <w:type w:val="nextPage"/>
       <w:pgSz w:h="15840" w:w="12240"/>

</xml_diff>

<commit_message>
some progress in ms
</commit_message>
<xml_diff>
--- a/Manuscript/GABI_palaeo_constraints.docx
+++ b/Manuscript/GABI_palaeo_constraints.docx
@@ -7,7 +7,7 @@
         <w:pStyle w:val="Title"/>
       </w:pPr>
       <w:r>
-        <w:t xml:space="preserve">Palaeoclimate</w:t>
+        <w:t xml:space="preserve">Palaeoclimatic</w:t>
       </w:r>
       <w:r>
         <w:t xml:space="preserve"> </w:t>
@@ -134,7 +134,7 @@
         <w:t xml:space="preserve">² Centro de Investigación Mariña, Departamento de Ecoloxía e Bioloxía Animal, Universidade de Vigo, Campus Lagoas-Marcosende, 36310 Vigo, Spain</w:t>
       </w:r>
     </w:p>
-    <w:bookmarkStart w:id="20" w:name="potential-journals"/>
+    <w:bookmarkStart w:id="22" w:name="potential-journals"/>
     <w:p>
       <w:pPr>
         <w:pStyle w:val="Heading1"/>
@@ -143,16 +143,44 @@
         <w:t xml:space="preserve">Potential journals</w:t>
       </w:r>
     </w:p>
+    <w:bookmarkStart w:id="20" w:name="primary-aim"/>
+    <w:p>
+      <w:pPr>
+        <w:pStyle w:val="Heading2"/>
+      </w:pPr>
+      <w:r>
+        <w:t xml:space="preserve">Primary aim</w:t>
+      </w:r>
+    </w:p>
     <w:p>
       <w:pPr>
         <w:pStyle w:val="FirstParagraph"/>
       </w:pPr>
       <w:r>
-        <w:t xml:space="preserve">Biology Letters? Proceedings B? Global ecology &amp; Biogeography? Journal of Biogeography?</w:t>
+        <w:t xml:space="preserve">Biology Letters</w:t>
       </w:r>
     </w:p>
     <w:bookmarkEnd w:id="20"/>
-    <w:bookmarkStart w:id="24" w:name="introduction"/>
+    <w:bookmarkStart w:id="21" w:name="others-that-could-fit"/>
+    <w:p>
+      <w:pPr>
+        <w:pStyle w:val="Heading2"/>
+      </w:pPr>
+      <w:r>
+        <w:t xml:space="preserve">Others that could fit</w:t>
+      </w:r>
+    </w:p>
+    <w:p>
+      <w:pPr>
+        <w:pStyle w:val="FirstParagraph"/>
+      </w:pPr>
+      <w:r>
+        <w:t xml:space="preserve">Proceedings B? Global ecology &amp; Biogeography? Journal of Biogeography? Current Biology?</w:t>
+      </w:r>
+    </w:p>
+    <w:bookmarkEnd w:id="21"/>
+    <w:bookmarkEnd w:id="22"/>
+    <w:bookmarkStart w:id="26" w:name="introduction"/>
     <w:p>
       <w:pPr>
         <w:pStyle w:val="Heading1"/>
@@ -161,7 +189,7 @@
         <w:t xml:space="preserve">Introduction</w:t>
       </w:r>
     </w:p>
-    <w:bookmarkStart w:id="21" w:name="X50c1a57397fb818a9091a51e659428cf56f9471"/>
+    <w:bookmarkStart w:id="23" w:name="X50c1a57397fb818a9091a51e659428cf56f9471"/>
     <w:p>
       <w:pPr>
         <w:pStyle w:val="Heading3"/>
@@ -175,7 +203,7 @@
         <w:pStyle w:val="FirstParagraph"/>
       </w:pPr>
       <w:r>
-        <w:t xml:space="preserve">Throughout its evolutionary history, the biosphere has been repeatedly marked by the occurrence of geodispersal events, that is, dispersal of large species pools across landmasses</w:t>
+        <w:t xml:space="preserve">Throughout its evolutionary history, the biosphere has been repeatedly marked by the occurrence of geodispersal events, that is, exchanges of large species pools across landmasses</w:t>
       </w:r>
       <w:r>
         <w:t xml:space="preserve"> </w:t>
@@ -222,7 +250,10 @@
         <w:t xml:space="preserve">[3–5]</w:t>
       </w:r>
       <w:r>
-        <w:t xml:space="preserve">, the fossil record and molecular phylogenies both agree with a late Miocene (</w:t>
+        <w:t xml:space="preserve">, the fossil record and molecular phylogenies both agree with a late Miocene onset of land mammal exchange between the Americas, with most effective crossings occurring from</w:t>
+      </w:r>
+      <w:r>
+        <w:t xml:space="preserve"> </w:t>
       </w:r>
       <w:r>
         <w:rPr>
@@ -235,22 +266,6 @@
         <w:t xml:space="preserve"> </w:t>
       </w:r>
       <w:r>
-        <w:t xml:space="preserve">6 million years ago, Ma) onset of land mammal exchange between the Americas, with most effective crossings occurring from</w:t>
-      </w:r>
-      <w:r>
-        <w:t xml:space="preserve"> </w:t>
-      </w:r>
-      <w:r>
-        <w:rPr>
-          <w:i/>
-          <w:iCs/>
-        </w:rPr>
-        <w:t xml:space="preserve">c.</w:t>
-      </w:r>
-      <w:r>
-        <w:t xml:space="preserve"> </w:t>
-      </w:r>
-      <w:r>
         <w:t xml:space="preserve">3.5 Ma onwards</w:t>
       </w:r>
       <w:r>
@@ -260,7 +275,7 @@
         <w:t xml:space="preserve">[6–8]</w:t>
       </w:r>
       <w:r>
-        <w:t xml:space="preserve">. Despite its textbook nature, a puzzling feature of the GABI is that it impacted both continent’s mammalian faunas very differently. Evidence from the fossil record indicates that the early phases of the GABI were marked by reciprocal mammal exchange between the Americas, but that the Pleistocene times witnessed an increasing proportion of North American mammals establishing southwards</w:t>
+        <w:t xml:space="preserve">. Despite its textbook nature, a puzzling feature of the GABI is that it impacted both continent’s mammalian faunas very differently. In fact, evidence from the fossil record indicates that the early phases of the GABI were marked by reciprocal mammal exchanges between the Americas, but that the Pleistocene times witnessed an increasing proportion of North American mammals establishing southwards</w:t>
       </w:r>
       <w:r>
         <w:t xml:space="preserve"> </w:t>
@@ -269,7 +284,7 @@
         <w:t xml:space="preserve">[2,9]</w:t>
       </w:r>
       <w:r>
-        <w:t xml:space="preserve">. At present, only around 10% of the land mammal genera inhabiting North America have a South American ancestry, whereas it is estimated that half of living South American mammal genera descend from a North American lineage</w:t>
+        <w:t xml:space="preserve">. At present, only around 10% of the land mammal genera inhabiting North and Central America have a South American ancestry (number reduced to two single species when considering North America above Mexico), whereas it is estimated that half of living South American mammal genera descend from a North American lineage</w:t>
       </w:r>
       <w:r>
         <w:t xml:space="preserve"> </w:t>
@@ -281,8 +296,8 @@
         <w:t xml:space="preserve">. Therefore, this intercontinental faunal exchange has been highly asymmetric.</w:t>
       </w:r>
     </w:p>
-    <w:bookmarkEnd w:id="21"/>
-    <w:bookmarkStart w:id="22" w:name="X10d481dc856fbc64b472cbfe63559590448e66c"/>
+    <w:bookmarkEnd w:id="23"/>
+    <w:bookmarkStart w:id="24" w:name="X10d481dc856fbc64b472cbfe63559590448e66c"/>
     <w:p>
       <w:pPr>
         <w:pStyle w:val="Heading3"/>
@@ -335,7 +350,7 @@
         <w:t xml:space="preserve">[9,18,19]</w:t>
       </w:r>
       <w:r>
-        <w:t xml:space="preserve">. Other studies proposed the implication of abiotic factors, putting the emphasis on Pleistocene climate fluctuations and the consequent alternating phases of emergence of savannah-like environment, favouring the dispersal of large temperate-adapted mammals to the detriment of tropical-adapted ones</w:t>
+        <w:t xml:space="preserve">. Other studies proposed the implication of abiotic factors. Some put the emphasis on Pleistocene climate fluctuations and the consequent alternating phases of emergence of landscape opening across Central America, in turn favouring the dispersal of large temperate-adapted mammals to the detriment of tropical-adapted ones</w:t>
       </w:r>
       <w:r>
         <w:t xml:space="preserve"> </w:t>
@@ -344,115 +359,79 @@
         <w:t xml:space="preserve">[8,18,20]</w:t>
       </w:r>
       <w:r>
+        <w:t xml:space="preserve">. Others drew direct relationships between the higher extinction rates of native South American mammal genera and temperature change</w:t>
+      </w:r>
+      <w:r>
+        <w:t xml:space="preserve"> </w:t>
+      </w:r>
+      <w:r>
+        <w:t xml:space="preserve">[21]</w:t>
+      </w:r>
+      <w:r>
+        <w:t xml:space="preserve">. However, our understanding of the underlying forces that drove the GABI’s asymmetry has been limited to statistical analyses primarily relying on fossil data, naturally biased and incomplete</w:t>
+      </w:r>
+      <w:r>
+        <w:t xml:space="preserve"> </w:t>
+      </w:r>
+      <w:r>
+        <w:t xml:space="preserve">[22]</w:t>
+      </w:r>
+      <w:r>
         <w:t xml:space="preserve">.</w:t>
       </w:r>
     </w:p>
+    <w:bookmarkEnd w:id="24"/>
+    <w:bookmarkStart w:id="25" w:name="X3103f0312769cc5df5b5fcae21dc7ca54a5a5e7"/>
+    <w:p>
+      <w:pPr>
+        <w:pStyle w:val="Heading3"/>
+      </w:pPr>
+      <w:r>
+        <w:t xml:space="preserve">Paragraph 3. Mechanistic eco-evo modelling</w:t>
+      </w:r>
+    </w:p>
+    <w:p>
+      <w:pPr>
+        <w:pStyle w:val="FirstParagraph"/>
+      </w:pPr>
+      <w:r>
+        <w:t xml:space="preserve">Recent improvements in process-explicit modelling have marked a turning point in the study of biodiversity patterns from a causal perspective</w:t>
+      </w:r>
+      <w:r>
+        <w:t xml:space="preserve"> </w:t>
+      </w:r>
+      <w:r>
+        <w:t xml:space="preserve">[23]</w:t>
+      </w:r>
+      <w:r>
+        <w:t xml:space="preserve">. In particular, mechanistic eco-evolutionary models …</w:t>
+      </w:r>
+      <w:r>
+        <w:t xml:space="preserve"> </w:t>
+      </w:r>
+      <w:r>
+        <w:t xml:space="preserve">[24]</w:t>
+      </w:r>
+    </w:p>
     <w:p>
       <w:pPr>
         <w:pStyle w:val="BodyText"/>
       </w:pPr>
       <w:r>
-        <w:t xml:space="preserve">Competition involving clades of similar ecology appeared as a likely first-order explanation to the recent demise of South American endemic mammal clades such as native ungulates</w:t>
-      </w:r>
-      <w:r>
-        <w:t xml:space="preserve"> </w:t>
-      </w:r>
-      <w:r>
-        <w:t xml:space="preserve">[21]</w:t>
-      </w:r>
-      <w:r>
-        <w:t xml:space="preserve"> </w:t>
-      </w:r>
-      <w:r>
-        <w:t xml:space="preserve">or sparassodonts (metatherian predators,</w:t>
-      </w:r>
-      <w:r>
-        <w:t xml:space="preserve"> </w:t>
-      </w:r>
-      <w:r>
-        <w:t xml:space="preserve">[16,22]</w:t>
-      </w:r>
-      <w:r>
-        <w:t xml:space="preserve">) that followed the establishment of northern lineages</w:t>
-      </w:r>
-      <w:r>
-        <w:t xml:space="preserve"> </w:t>
-      </w:r>
-      <w:r>
-        <w:t xml:space="preserve">[13]</w:t>
-      </w:r>
-      <w:r>
-        <w:t xml:space="preserve">. This hypothesis mostly relied on striking morphological convergences between the clades assumed to have competed (</w:t>
-      </w:r>
-      <w:r>
-        <w:rPr>
-          <w:i/>
-          <w:iCs/>
-        </w:rPr>
-        <w:t xml:space="preserve">e</w:t>
-      </w:r>
-      <w:r>
-        <w:t xml:space="preserve">.</w:t>
-      </w:r>
-      <w:r>
-        <w:rPr>
-          <w:i/>
-          <w:iCs/>
-        </w:rPr>
-        <w:t xml:space="preserve">g</w:t>
-      </w:r>
-      <w:r>
-        <w:t xml:space="preserve">., sabertooth among predators, high-crowned and ever-growing cheek teeth among herbivores). However, several analyses of the fossil record provided no evidence for competition between native South American mammals and their northern counterparts</w:t>
-      </w:r>
-      <w:r>
-        <w:t xml:space="preserve"> </w:t>
-      </w:r>
-      <w:r>
-        <w:t xml:space="preserve">[15,16]</w:t>
-      </w:r>
-      <w:r>
-        <w:t xml:space="preserve">. That being said, using phylogenetic regressions, Faurby et al.</w:t>
-      </w:r>
-      <w:r>
-        <w:t xml:space="preserve"> </w:t>
-      </w:r>
-      <w:r>
-        <w:t xml:space="preserve">[19]</w:t>
-      </w:r>
-      <w:r>
-        <w:t xml:space="preserve"> </w:t>
-      </w:r>
-      <w:r>
-        <w:t xml:space="preserve">found support for another biotic interaction as a likely driver behind GABI’s asymmetry: predation. They indeed characterised a higher prevalence of traits increasing prey susceptibility among the endemic south american mammals. + larger niches of competitors</w:t>
-      </w:r>
-      <w:r>
-        <w:t xml:space="preserve"> </w:t>
-      </w:r>
-      <w:r>
-        <w:t xml:space="preserve">[14]</w:t>
-      </w:r>
-    </w:p>
-    <w:bookmarkEnd w:id="22"/>
-    <w:bookmarkStart w:id="23" w:name="X3103f0312769cc5df5b5fcae21dc7ca54a5a5e7"/>
-    <w:p>
-      <w:pPr>
-        <w:pStyle w:val="Heading3"/>
-      </w:pPr>
-      <w:r>
-        <w:t xml:space="preserve">Paragraph 3. Mechanistic eco-evo modelling</w:t>
-      </w:r>
-    </w:p>
-    <w:p>
-      <w:pPr>
-        <w:pStyle w:val="FirstParagraph"/>
-      </w:pPr>
-      <w:r>
-        <w:t xml:space="preserve">Possibility to run natural experiments and draw casual links between biodiversity patterns and (a)biotic patterns. Proved efficient in a wide range of questions.</w:t>
-      </w:r>
-    </w:p>
-    <w:bookmarkEnd w:id="23"/>
-    <w:bookmarkEnd w:id="24"/>
-    <w:bookmarkStart w:id="27" w:name="materials-and-methods"/>
+        <w:t xml:space="preserve">Possibility to run computer experiments and draw casual links between biodiversity patterns and (a)biotic factors Proved efficient in a wide range of questions.</w:t>
+      </w:r>
+    </w:p>
+    <w:p>
+      <w:pPr>
+        <w:pStyle w:val="BodyText"/>
+      </w:pPr>
+      <w:r>
+        <w:t xml:space="preserve">Here, using a mechanistic biodiversity simulator, we explore the extent to which palaeoclimate dynamics throughout the last 5 My can explain the observed asymmetry in the land mammal exchange that occurred across the Americas.</w:t>
+      </w:r>
+    </w:p>
+    <w:bookmarkEnd w:id="25"/>
+    <w:bookmarkEnd w:id="26"/>
+    <w:bookmarkStart w:id="29" w:name="materials-and-methods"/>
     <w:p>
       <w:pPr>
         <w:pStyle w:val="Heading1"/>
@@ -522,7 +501,7 @@
         <w:t xml:space="preserve">North + Central America</w:t>
       </w:r>
     </w:p>
-    <w:bookmarkStart w:id="25" w:name="palaeoclimate-data"/>
+    <w:bookmarkStart w:id="27" w:name="palaeoclimate-data"/>
     <w:p>
       <w:pPr>
         <w:pStyle w:val="Heading2"/>
@@ -542,7 +521,7 @@
         <w:t xml:space="preserve"> </w:t>
       </w:r>
       <w:r>
-        <w:t xml:space="preserve">[23]</w:t>
+        <w:t xml:space="preserve">[25]</w:t>
       </w:r>
       <w:r>
         <w:t xml:space="preserve">, covering the last 5 Myrs with a 1</w:t>
@@ -560,14 +539,31 @@
         <w:t xml:space="preserve"> </w:t>
       </w:r>
       <w:r>
-        <w:t xml:space="preserve">[24]</w:t>
+        <w:t xml:space="preserve">[26]</w:t>
       </w:r>
       <w:r>
         <w:t xml:space="preserve">. For the scope of this work, we used two bioclimatic variables: mean annual temperature (MAT, BIO1) and mean annual precipitation (MAP, BIO12).</w:t>
       </w:r>
     </w:p>
-    <w:bookmarkEnd w:id="25"/>
-    <w:bookmarkStart w:id="26" w:name="simulation-model-and-modelling-schemes"/>
+    <w:p>
+      <w:pPr>
+        <w:pStyle w:val="BodyText"/>
+      </w:pPr>
+      <w:r>
+        <w:t xml:space="preserve">We further reclassified these monthly palaeoclimate layers across the last five million years according to Köppen-Geiger broad climate types</w:t>
+      </w:r>
+      <w:r>
+        <w:t xml:space="preserve"> </w:t>
+      </w:r>
+      <w:r>
+        <w:t xml:space="preserve">[27]</w:t>
+      </w:r>
+      <w:r>
+        <w:t xml:space="preserve">. This classification divides the world into five broad climatic regions: Polar, Cold, Temperate, Arid and Tropical.</w:t>
+      </w:r>
+    </w:p>
+    <w:bookmarkEnd w:id="27"/>
+    <w:bookmarkStart w:id="28" w:name="simulation-model-and-modelling-schemes"/>
     <w:p>
       <w:pPr>
         <w:pStyle w:val="Heading2"/>
@@ -600,7 +596,7 @@
         <w:t xml:space="preserve"> </w:t>
       </w:r>
       <w:r>
-        <w:t xml:space="preserve">[25]</w:t>
+        <w:t xml:space="preserve">[24]</w:t>
       </w:r>
       <w:r>
         <w:t xml:space="preserve">. Simulations, moving forward-in-time with a 10ky time step, tracked the dispersion and diversification of ancestral lineages either originating in North, South America or both, throughout the last 5 Myr.</w:t>
@@ -647,7 +643,7 @@
         <w:t xml:space="preserve"> </w:t>
       </w:r>
       <w:r>
-        <w:t xml:space="preserve">[26]</w:t>
+        <w:t xml:space="preserve">[28]</w:t>
       </w:r>
       <w:r>
         <w:t xml:space="preserve">. We then sampled a centroid at random and retrieved the corresponding cell in our landscape.</w:t>
@@ -677,9 +673,9 @@
         <w:t xml:space="preserve">Divergence threshold vs. divergence factor.</w:t>
       </w:r>
     </w:p>
-    <w:bookmarkEnd w:id="26"/>
-    <w:bookmarkEnd w:id="27"/>
-    <w:bookmarkStart w:id="28" w:name="results"/>
+    <w:bookmarkEnd w:id="28"/>
+    <w:bookmarkEnd w:id="29"/>
+    <w:bookmarkStart w:id="30" w:name="results"/>
     <w:p>
       <w:pPr>
         <w:pStyle w:val="Heading1"/>
@@ -688,8 +684,8 @@
         <w:t xml:space="preserve">Results</w:t>
       </w:r>
     </w:p>
-    <w:bookmarkEnd w:id="28"/>
-    <w:bookmarkStart w:id="29" w:name="discussion"/>
+    <w:bookmarkEnd w:id="30"/>
+    <w:bookmarkStart w:id="31" w:name="discussion"/>
     <w:p>
       <w:pPr>
         <w:pStyle w:val="Heading1"/>
@@ -709,7 +705,7 @@
         <w:t xml:space="preserve"> </w:t>
       </w:r>
       <w:r>
-        <w:t xml:space="preserve">[27]</w:t>
+        <w:t xml:space="preserve">[29]</w:t>
       </w:r>
       <w:r>
         <w:t xml:space="preserve">, flying behaviour relaxing constraints applied to land mammals ?</w:t>
@@ -726,7 +722,7 @@
         <w:t xml:space="preserve"> </w:t>
       </w:r>
       <w:r>
-        <w:t xml:space="preserve">[28]</w:t>
+        <w:t xml:space="preserve">[30]</w:t>
       </w:r>
       <w:r>
         <w:t xml:space="preserve">. But here, we expect to find more species in South America, encompassing one of earth’s major and long-standing biodiversity hotspot – Amazonia</w:t>
@@ -735,7 +731,7 @@
         <w:t xml:space="preserve"> </w:t>
       </w:r>
       <w:r>
-        <w:t xml:space="preserve">[29]</w:t>
+        <w:t xml:space="preserve">[31]</w:t>
       </w:r>
       <w:r>
         <w:t xml:space="preserve"> </w:t>
@@ -744,42 +740,127 @@
         <w:t xml:space="preserve">– than in North America.</w:t>
       </w:r>
     </w:p>
-    <w:bookmarkEnd w:id="29"/>
-    <w:bookmarkStart w:id="86" w:name="references"/>
-    <w:p>
-      <w:pPr>
-        <w:pStyle w:val="Heading1"/>
-      </w:pPr>
-      <w:r>
-        <w:t xml:space="preserve">References</w:t>
-      </w:r>
-    </w:p>
-    <w:bookmarkStart w:id="85" w:name="refs"/>
-    <w:bookmarkStart w:id="31" w:name="ref-couvreur2011"/>
-    <w:p>
-      <w:pPr>
-        <w:pStyle w:val="Bibliography"/>
-      </w:pPr>
-      <w:r>
-        <w:t xml:space="preserve">1.</w:t>
-      </w:r>
-      <w:r>
-        <w:t xml:space="preserve"> </w:t>
-      </w:r>
-      <w:r>
-        <w:t xml:space="preserve">	</w:t>
-      </w:r>
-      <w:r>
-        <w:t xml:space="preserve">Couvreur TLP, Pirie MD, Chatrou LW, Saunders RMK, Su YCF, Richardson JE, Erkens RHJ. 2011 Early evolutionary history of the flowering plant family Annonaceae: steady diversification and boreotropical geodispersal.</w:t>
-      </w:r>
-      <w:r>
-        <w:t xml:space="preserve"> </w:t>
+    <w:p>
+      <w:pPr>
+        <w:pStyle w:val="BodyText"/>
+      </w:pPr>
+      <w:r>
+        <w:t xml:space="preserve">Competition involving clades of similar ecology appeared as a likely first-order explanation to the recent demise of South American endemic mammal clades such as native ungulates</w:t>
+      </w:r>
+      <w:r>
+        <w:t xml:space="preserve"> </w:t>
+      </w:r>
+      <w:r>
+        <w:t xml:space="preserve">[32]</w:t>
+      </w:r>
+      <w:r>
+        <w:t xml:space="preserve"> </w:t>
+      </w:r>
+      <w:r>
+        <w:t xml:space="preserve">or sparassodonts (metatherian predators,</w:t>
+      </w:r>
+      <w:r>
+        <w:t xml:space="preserve"> </w:t>
+      </w:r>
+      <w:r>
+        <w:t xml:space="preserve">[16,33]</w:t>
+      </w:r>
+      <w:r>
+        <w:t xml:space="preserve">) that followed the establishment of northern lineages</w:t>
+      </w:r>
+      <w:r>
+        <w:t xml:space="preserve"> </w:t>
+      </w:r>
+      <w:r>
+        <w:t xml:space="preserve">[13]</w:t>
+      </w:r>
+      <w:r>
+        <w:t xml:space="preserve">. This hypothesis mostly relied on striking morphological convergences between the clades assumed to have competed (</w:t>
       </w:r>
       <w:r>
         <w:rPr>
           <w:i/>
           <w:iCs/>
         </w:rPr>
+        <w:t xml:space="preserve">e</w:t>
+      </w:r>
+      <w:r>
+        <w:t xml:space="preserve">.</w:t>
+      </w:r>
+      <w:r>
+        <w:rPr>
+          <w:i/>
+          <w:iCs/>
+        </w:rPr>
+        <w:t xml:space="preserve">g</w:t>
+      </w:r>
+      <w:r>
+        <w:t xml:space="preserve">., sabertooth among predators, high-crowned and ever-growing cheek teeth among herbivores). However, several analyses of the fossil record provided no evidence for competition between native South American mammals and their northern counterparts</w:t>
+      </w:r>
+      <w:r>
+        <w:t xml:space="preserve"> </w:t>
+      </w:r>
+      <w:r>
+        <w:t xml:space="preserve">[15,16]</w:t>
+      </w:r>
+      <w:r>
+        <w:t xml:space="preserve">. That being said, using phylogenetic regressions, Faurby et al.</w:t>
+      </w:r>
+      <w:r>
+        <w:t xml:space="preserve"> </w:t>
+      </w:r>
+      <w:r>
+        <w:t xml:space="preserve">[19]</w:t>
+      </w:r>
+      <w:r>
+        <w:t xml:space="preserve"> </w:t>
+      </w:r>
+      <w:r>
+        <w:t xml:space="preserve">found support for another biotic interaction as a likely driver behind GABI’s asymmetry: predation. They indeed characterised a higher prevalence of traits increasing prey susceptibility among the endemic south american mammals. + larger niches of competitors</w:t>
+      </w:r>
+      <w:r>
+        <w:t xml:space="preserve"> </w:t>
+      </w:r>
+      <w:r>
+        <w:t xml:space="preserve">[14]</w:t>
+      </w:r>
+    </w:p>
+    <w:bookmarkEnd w:id="31"/>
+    <w:bookmarkStart w:id="96" w:name="references"/>
+    <w:p>
+      <w:pPr>
+        <w:pStyle w:val="Heading1"/>
+      </w:pPr>
+      <w:r>
+        <w:t xml:space="preserve">References</w:t>
+      </w:r>
+    </w:p>
+    <w:bookmarkStart w:id="95" w:name="refs"/>
+    <w:bookmarkStart w:id="33" w:name="ref-couvreur2011"/>
+    <w:p>
+      <w:pPr>
+        <w:pStyle w:val="Bibliography"/>
+      </w:pPr>
+      <w:r>
+        <w:t xml:space="preserve">1.</w:t>
+      </w:r>
+      <w:r>
+        <w:t xml:space="preserve"> </w:t>
+      </w:r>
+      <w:r>
+        <w:t xml:space="preserve">	</w:t>
+      </w:r>
+      <w:r>
+        <w:t xml:space="preserve">Couvreur TLP, Pirie MD, Chatrou LW, Saunders RMK, Su YCF, Richardson JE, Erkens RHJ. 2011 Early evolutionary history of the flowering plant family Annonaceae: steady diversification and boreotropical geodispersal.</w:t>
+      </w:r>
+      <w:r>
+        <w:t xml:space="preserve"> </w:t>
+      </w:r>
+      <w:r>
+        <w:rPr>
+          <w:i/>
+          <w:iCs/>
+        </w:rPr>
         <w:t xml:space="preserve">Journal of Biogeography</w:t>
       </w:r>
       <w:r>
@@ -795,7 +876,7 @@
       <w:r>
         <w:t xml:space="preserve">, 664–680. (doi:</w:t>
       </w:r>
-      <w:hyperlink r:id="rId30">
+      <w:hyperlink r:id="rId32">
         <w:r>
           <w:rPr>
             <w:rStyle w:val="Hyperlink"/>
@@ -807,8 +888,8 @@
         <w:t xml:space="preserve">)</w:t>
       </w:r>
     </w:p>
-    <w:bookmarkEnd w:id="31"/>
-    <w:bookmarkStart w:id="33" w:name="ref-marshall1982"/>
+    <w:bookmarkEnd w:id="33"/>
+    <w:bookmarkStart w:id="35" w:name="ref-marshall1982"/>
     <w:p>
       <w:pPr>
         <w:pStyle w:val="Bibliography"/>
@@ -828,7 +909,7 @@
       <w:r>
         <w:t xml:space="preserve"> </w:t>
       </w:r>
-      <w:hyperlink r:id="rId32">
+      <w:hyperlink r:id="rId34">
         <w:r>
           <w:rPr>
             <w:rStyle w:val="Hyperlink"/>
@@ -863,8 +944,8 @@
         <w:t xml:space="preserve">, 1351–1357.</w:t>
       </w:r>
     </w:p>
-    <w:bookmarkEnd w:id="33"/>
-    <w:bookmarkStart w:id="35" w:name="ref-montes2015"/>
+    <w:bookmarkEnd w:id="35"/>
+    <w:bookmarkStart w:id="37" w:name="ref-montes2015"/>
     <w:p>
       <w:pPr>
         <w:pStyle w:val="Bibliography"/>
@@ -917,7 +998,7 @@
       <w:r>
         <w:t xml:space="preserve">, 226–229. (doi:</w:t>
       </w:r>
-      <w:hyperlink r:id="rId34">
+      <w:hyperlink r:id="rId36">
         <w:r>
           <w:rPr>
             <w:rStyle w:val="Hyperlink"/>
@@ -929,8 +1010,8 @@
         <w:t xml:space="preserve">)</w:t>
       </w:r>
     </w:p>
-    <w:bookmarkEnd w:id="35"/>
-    <w:bookmarkStart w:id="37" w:name="ref-jaramillo2018"/>
+    <w:bookmarkEnd w:id="37"/>
+    <w:bookmarkStart w:id="39" w:name="ref-jaramillo2018"/>
     <w:p>
       <w:pPr>
         <w:pStyle w:val="Bibliography"/>
@@ -950,7 +1031,7 @@
       <w:r>
         <w:t xml:space="preserve"> </w:t>
       </w:r>
-      <w:hyperlink r:id="rId36">
+      <w:hyperlink r:id="rId38">
         <w:r>
           <w:rPr>
             <w:rStyle w:val="Hyperlink"/>
@@ -965,8 +1046,8 @@
         <w:t xml:space="preserve"> </w:t>
       </w:r>
     </w:p>
-    <w:bookmarkEnd w:id="37"/>
-    <w:bookmarkStart w:id="39" w:name="ref-odea2016"/>
+    <w:bookmarkEnd w:id="39"/>
+    <w:bookmarkStart w:id="41" w:name="ref-odea2016"/>
     <w:p>
       <w:pPr>
         <w:pStyle w:val="Bibliography"/>
@@ -1019,7 +1100,7 @@
       <w:r>
         <w:t xml:space="preserve">, e1600883. (doi:</w:t>
       </w:r>
-      <w:hyperlink r:id="rId38">
+      <w:hyperlink r:id="rId40">
         <w:r>
           <w:rPr>
             <w:rStyle w:val="Hyperlink"/>
@@ -1031,8 +1112,8 @@
         <w:t xml:space="preserve">)</w:t>
       </w:r>
     </w:p>
-    <w:bookmarkEnd w:id="39"/>
-    <w:bookmarkStart w:id="41" w:name="ref-verzi2008"/>
+    <w:bookmarkEnd w:id="41"/>
+    <w:bookmarkStart w:id="43" w:name="ref-verzi2008"/>
     <w:p>
       <w:pPr>
         <w:pStyle w:val="Bibliography"/>
@@ -1072,7 +1153,7 @@
       <w:r>
         <w:t xml:space="preserve">, 145–155. (doi:</w:t>
       </w:r>
-      <w:hyperlink r:id="rId40">
+      <w:hyperlink r:id="rId42">
         <w:r>
           <w:rPr>
             <w:rStyle w:val="Hyperlink"/>
@@ -1084,8 +1165,8 @@
         <w:t xml:space="preserve">)</w:t>
       </w:r>
     </w:p>
-    <w:bookmarkEnd w:id="41"/>
-    <w:bookmarkStart w:id="43" w:name="ref-bacon2015"/>
+    <w:bookmarkEnd w:id="43"/>
+    <w:bookmarkStart w:id="45" w:name="ref-bacon2015"/>
     <w:p>
       <w:pPr>
         <w:pStyle w:val="Bibliography"/>
@@ -1125,7 +1206,7 @@
       <w:r>
         <w:t xml:space="preserve">, 6110–6115. (doi:</w:t>
       </w:r>
-      <w:hyperlink r:id="rId42">
+      <w:hyperlink r:id="rId44">
         <w:r>
           <w:rPr>
             <w:rStyle w:val="Hyperlink"/>
@@ -1137,8 +1218,8 @@
         <w:t xml:space="preserve">)</w:t>
       </w:r>
     </w:p>
-    <w:bookmarkEnd w:id="43"/>
-    <w:bookmarkStart w:id="45" w:name="ref-bacon2016"/>
+    <w:bookmarkEnd w:id="45"/>
+    <w:bookmarkStart w:id="47" w:name="ref-bacon2016"/>
     <w:p>
       <w:pPr>
         <w:pStyle w:val="Bibliography"/>
@@ -1178,7 +1259,7 @@
       <w:r>
         <w:t xml:space="preserve">, 375–378. (doi:</w:t>
       </w:r>
-      <w:hyperlink r:id="rId44">
+      <w:hyperlink r:id="rId46">
         <w:r>
           <w:rPr>
             <w:rStyle w:val="Hyperlink"/>
@@ -1190,8 +1271,8 @@
         <w:t xml:space="preserve">)</w:t>
       </w:r>
     </w:p>
-    <w:bookmarkEnd w:id="45"/>
-    <w:bookmarkStart w:id="47" w:name="ref-webb1976"/>
+    <w:bookmarkEnd w:id="47"/>
+    <w:bookmarkStart w:id="49" w:name="ref-webb1976"/>
     <w:p>
       <w:pPr>
         <w:pStyle w:val="Bibliography"/>
@@ -1211,7 +1292,7 @@
       <w:r>
         <w:t xml:space="preserve"> </w:t>
       </w:r>
-      <w:hyperlink r:id="rId46">
+      <w:hyperlink r:id="rId48">
         <w:r>
           <w:rPr>
             <w:rStyle w:val="Hyperlink"/>
@@ -1246,8 +1327,8 @@
         <w:t xml:space="preserve">, 220–234.</w:t>
       </w:r>
     </w:p>
-    <w:bookmarkEnd w:id="47"/>
-    <w:bookmarkStart w:id="49" w:name="ref-marshall1988"/>
+    <w:bookmarkEnd w:id="49"/>
+    <w:bookmarkStart w:id="51" w:name="ref-marshall1988"/>
     <w:p>
       <w:pPr>
         <w:pStyle w:val="Bibliography"/>
@@ -1267,7 +1348,7 @@
       <w:r>
         <w:t xml:space="preserve"> </w:t>
       </w:r>
-      <w:hyperlink r:id="rId48">
+      <w:hyperlink r:id="rId50">
         <w:r>
           <w:rPr>
             <w:rStyle w:val="Hyperlink"/>
@@ -1302,8 +1383,8 @@
         <w:t xml:space="preserve">, 380–388.</w:t>
       </w:r>
     </w:p>
-    <w:bookmarkEnd w:id="49"/>
-    <w:bookmarkStart w:id="51" w:name="ref-carrillo2020"/>
+    <w:bookmarkEnd w:id="51"/>
+    <w:bookmarkStart w:id="53" w:name="ref-carrillo2020"/>
     <w:p>
       <w:pPr>
         <w:pStyle w:val="Bibliography"/>
@@ -1343,7 +1424,7 @@
       <w:r>
         <w:t xml:space="preserve">, 26281–26287. (doi:</w:t>
       </w:r>
-      <w:hyperlink r:id="rId50">
+      <w:hyperlink r:id="rId52">
         <w:r>
           <w:rPr>
             <w:rStyle w:val="Hyperlink"/>
@@ -1355,8 +1436,8 @@
         <w:t xml:space="preserve">)</w:t>
       </w:r>
     </w:p>
-    <w:bookmarkEnd w:id="51"/>
-    <w:bookmarkStart w:id="52" w:name="ref-macarthur1967"/>
+    <w:bookmarkEnd w:id="53"/>
+    <w:bookmarkStart w:id="54" w:name="ref-macarthur1967"/>
     <w:p>
       <w:pPr>
         <w:pStyle w:val="Bibliography"/>
@@ -1390,8 +1471,8 @@
         <w:t xml:space="preserve"> </w:t>
       </w:r>
     </w:p>
-    <w:bookmarkEnd w:id="52"/>
-    <w:bookmarkStart w:id="53" w:name="ref-simpson1980"/>
+    <w:bookmarkEnd w:id="54"/>
+    <w:bookmarkStart w:id="55" w:name="ref-simpson1980"/>
     <w:p>
       <w:pPr>
         <w:pStyle w:val="Bibliography"/>
@@ -1425,8 +1506,8 @@
         <w:t xml:space="preserve"> </w:t>
       </w:r>
     </w:p>
-    <w:bookmarkEnd w:id="53"/>
-    <w:bookmarkStart w:id="55" w:name="ref-domingo2020"/>
+    <w:bookmarkEnd w:id="55"/>
+    <w:bookmarkStart w:id="57" w:name="ref-domingo2020"/>
     <w:p>
       <w:pPr>
         <w:pStyle w:val="Bibliography"/>
@@ -1466,7 +1547,7 @@
       <w:r>
         <w:t xml:space="preserve">, 1608. (doi:</w:t>
       </w:r>
-      <w:hyperlink r:id="rId54">
+      <w:hyperlink r:id="rId56">
         <w:r>
           <w:rPr>
             <w:rStyle w:val="Hyperlink"/>
@@ -1478,8 +1559,8 @@
         <w:t xml:space="preserve">)</w:t>
       </w:r>
     </w:p>
-    <w:bookmarkEnd w:id="55"/>
-    <w:bookmarkStart w:id="57" w:name="ref-prevosti2013"/>
+    <w:bookmarkEnd w:id="57"/>
+    <w:bookmarkStart w:id="59" w:name="ref-prevosti2013"/>
     <w:p>
       <w:pPr>
         <w:pStyle w:val="Bibliography"/>
@@ -1519,7 +1600,7 @@
       <w:r>
         <w:t xml:space="preserve">, 3–21. (doi:</w:t>
       </w:r>
-      <w:hyperlink r:id="rId56">
+      <w:hyperlink r:id="rId58">
         <w:r>
           <w:rPr>
             <w:rStyle w:val="Hyperlink"/>
@@ -1531,8 +1612,8 @@
         <w:t xml:space="preserve">)</w:t>
       </w:r>
     </w:p>
-    <w:bookmarkEnd w:id="57"/>
-    <w:bookmarkStart w:id="59" w:name="ref-tarquini2022"/>
+    <w:bookmarkEnd w:id="59"/>
+    <w:bookmarkStart w:id="61" w:name="ref-tarquini2022"/>
     <w:p>
       <w:pPr>
         <w:pStyle w:val="Bibliography"/>
@@ -1572,7 +1653,7 @@
       <w:r>
         <w:t xml:space="preserve">, 1224. (doi:</w:t>
       </w:r>
-      <w:hyperlink r:id="rId58">
+      <w:hyperlink r:id="rId60">
         <w:r>
           <w:rPr>
             <w:rStyle w:val="Hyperlink"/>
@@ -1584,8 +1665,8 @@
         <w:t xml:space="preserve">)</w:t>
       </w:r>
     </w:p>
-    <w:bookmarkEnd w:id="59"/>
-    <w:bookmarkStart w:id="61" w:name="ref-marsà2025"/>
+    <w:bookmarkEnd w:id="61"/>
+    <w:bookmarkStart w:id="63" w:name="ref-marsà2025"/>
     <w:p>
       <w:pPr>
         <w:pStyle w:val="Bibliography"/>
@@ -1643,7 +1724,7 @@
       <w:r>
         <w:t xml:space="preserve">, 153. (doi:</w:t>
       </w:r>
-      <w:hyperlink r:id="rId60">
+      <w:hyperlink r:id="rId62">
         <w:r>
           <w:rPr>
             <w:rStyle w:val="Hyperlink"/>
@@ -1655,8 +1736,8 @@
         <w:t xml:space="preserve">)</w:t>
       </w:r>
     </w:p>
-    <w:bookmarkEnd w:id="61"/>
-    <w:bookmarkStart w:id="62" w:name="ref-marshall1990"/>
+    <w:bookmarkEnd w:id="63"/>
+    <w:bookmarkStart w:id="64" w:name="ref-marshall1990"/>
     <w:p>
       <w:pPr>
         <w:pStyle w:val="Bibliography"/>
@@ -1697,8 +1778,8 @@
         <w:t xml:space="preserve">, 169–210.</w:t>
       </w:r>
     </w:p>
-    <w:bookmarkEnd w:id="62"/>
-    <w:bookmarkStart w:id="64" w:name="ref-faurby2016"/>
+    <w:bookmarkEnd w:id="64"/>
+    <w:bookmarkStart w:id="66" w:name="ref-faurby2016"/>
     <w:p>
       <w:pPr>
         <w:pStyle w:val="Bibliography"/>
@@ -1738,7 +1819,7 @@
       <w:r>
         <w:t xml:space="preserve">, 1443–1453. (doi:</w:t>
       </w:r>
-      <w:hyperlink r:id="rId63">
+      <w:hyperlink r:id="rId65">
         <w:r>
           <w:rPr>
             <w:rStyle w:val="Hyperlink"/>
@@ -1750,8 +1831,8 @@
         <w:t xml:space="preserve">)</w:t>
       </w:r>
     </w:p>
-    <w:bookmarkEnd w:id="64"/>
-    <w:bookmarkStart w:id="66" w:name="ref-webb1991"/>
+    <w:bookmarkEnd w:id="66"/>
+    <w:bookmarkStart w:id="68" w:name="ref-webb1991"/>
     <w:p>
       <w:pPr>
         <w:pStyle w:val="Bibliography"/>
@@ -1791,7 +1872,7 @@
       <w:r>
         <w:t xml:space="preserve">, 266–280. (doi:</w:t>
       </w:r>
-      <w:hyperlink r:id="rId65">
+      <w:hyperlink r:id="rId67">
         <w:r>
           <w:rPr>
             <w:rStyle w:val="Hyperlink"/>
@@ -1803,8 +1884,8 @@
         <w:t xml:space="preserve">)</w:t>
       </w:r>
     </w:p>
-    <w:bookmarkEnd w:id="66"/>
-    <w:bookmarkStart w:id="68" w:name="ref-croft2020"/>
+    <w:bookmarkEnd w:id="68"/>
+    <w:bookmarkStart w:id="70" w:name="ref-freitas-oliveira2024"/>
     <w:p>
       <w:pPr>
         <w:pStyle w:val="Bibliography"/>
@@ -1819,7 +1900,7 @@
         <w:t xml:space="preserve">	</w:t>
       </w:r>
       <w:r>
-        <w:t xml:space="preserve">Croft DA, Gelfo JN, López GM. 2020 Splendid innovation: The extinct south american native ungulates.</w:t>
+        <w:t xml:space="preserve">Freitas-Oliveira R, Lima-Ribeiro MS, Terribile LC. 2024 No evidence for niche competition in the extinction of the South American saber-tooth species.</w:t>
       </w:r>
       <w:r>
         <w:t xml:space="preserve"> </w:t>
@@ -1829,7 +1910,7 @@
           <w:i/>
           <w:iCs/>
         </w:rPr>
-        <w:t xml:space="preserve">Annual Review of Earth and Planetary Sciences</w:t>
+        <w:t xml:space="preserve">npj Biodiversity</w:t>
       </w:r>
       <w:r>
         <w:t xml:space="preserve"> </w:t>
@@ -1839,70 +1920,17 @@
           <w:b/>
           <w:bCs/>
         </w:rPr>
-        <w:t xml:space="preserve">48</w:t>
-      </w:r>
-      <w:r>
-        <w:t xml:space="preserve">, 259–290. (doi:</w:t>
-      </w:r>
-      <w:hyperlink r:id="rId67">
-        <w:r>
-          <w:rPr>
-            <w:rStyle w:val="Hyperlink"/>
-          </w:rPr>
-          <w:t xml:space="preserve">10.1146/annurev-earth-072619-060126</w:t>
-        </w:r>
-      </w:hyperlink>
-      <w:r>
-        <w:t xml:space="preserve">)</w:t>
-      </w:r>
-    </w:p>
-    <w:bookmarkEnd w:id="68"/>
-    <w:bookmarkStart w:id="70" w:name="ref-pino2022"/>
-    <w:p>
-      <w:pPr>
-        <w:pStyle w:val="Bibliography"/>
-      </w:pPr>
-      <w:r>
-        <w:t xml:space="preserve">22.</w:t>
-      </w:r>
-      <w:r>
-        <w:t xml:space="preserve"> </w:t>
-      </w:r>
-      <w:r>
-        <w:t xml:space="preserve">	</w:t>
-      </w:r>
-      <w:r>
-        <w:t xml:space="preserve">Pino K, Vallejos-Garrido P, Espinoza-Aravena N, Cooper RB, Silvestro D, Hernández CE, Rodríguez-Serrano E. 2022 Regional landscape change triggered by andean uplift: The extinction of sparassodonta (mammalia, metatheria) in south america.</w:t>
-      </w:r>
-      <w:r>
-        <w:t xml:space="preserve"> </w:t>
-      </w:r>
-      <w:r>
-        <w:rPr>
-          <w:i/>
-          <w:iCs/>
-        </w:rPr>
-        <w:t xml:space="preserve">Global and Planetary Change</w:t>
-      </w:r>
-      <w:r>
-        <w:t xml:space="preserve"> </w:t>
-      </w:r>
-      <w:r>
-        <w:rPr>
-          <w:b/>
-          <w:bCs/>
-        </w:rPr>
-        <w:t xml:space="preserve">210</w:t>
-      </w:r>
-      <w:r>
-        <w:t xml:space="preserve">, 103758. (doi:</w:t>
+        <w:t xml:space="preserve">3</w:t>
+      </w:r>
+      <w:r>
+        <w:t xml:space="preserve">, 1–5. (doi:</w:t>
       </w:r>
       <w:hyperlink r:id="rId69">
         <w:r>
           <w:rPr>
             <w:rStyle w:val="Hyperlink"/>
           </w:rPr>
-          <w:t xml:space="preserve">10.1016/j.gloplacha.2022.103758</w:t>
+          <w:t xml:space="preserve">10.1038/s44185-024-00045-7</w:t>
         </w:r>
       </w:hyperlink>
       <w:r>
@@ -1910,13 +1938,13 @@
       </w:r>
     </w:p>
     <w:bookmarkEnd w:id="70"/>
-    <w:bookmarkStart w:id="72" w:name="ref-holden2019"/>
+    <w:bookmarkStart w:id="72" w:name="ref-krone2024"/>
     <w:p>
       <w:pPr>
         <w:pStyle w:val="Bibliography"/>
       </w:pPr>
       <w:r>
-        <w:t xml:space="preserve">23.</w:t>
+        <w:t xml:space="preserve">22.</w:t>
       </w:r>
       <w:r>
         <w:t xml:space="preserve"> </w:t>
@@ -1925,10 +1953,7 @@
         <w:t xml:space="preserve">	</w:t>
       </w:r>
       <w:r>
-        <w:t xml:space="preserve">Holden PB, Edwards NR, Rangel TF, Pereira EB, Tran GT, Wilkinson RD. 2019 PALEO-PGEM v1.0: A statistical emulator of pliocene</w:t>
-      </w:r>
-      <w:r>
-        <w:t xml:space="preserve">pleistocene climate.</w:t>
+        <w:t xml:space="preserve">Krone IW, Magoulick KM, Yohler RM. 2024 All the Earth will not remember: how geographic gaps structure the record of diversity and extinction.</w:t>
       </w:r>
       <w:r>
         <w:t xml:space="preserve"> </w:t>
@@ -1938,7 +1963,7 @@
           <w:i/>
           <w:iCs/>
         </w:rPr>
-        <w:t xml:space="preserve">Geoscientific Model Development</w:t>
+        <w:t xml:space="preserve">Paleobiology</w:t>
       </w:r>
       <w:r>
         <w:t xml:space="preserve"> </w:t>
@@ -1948,17 +1973,17 @@
           <w:b/>
           <w:bCs/>
         </w:rPr>
-        <w:t xml:space="preserve">12</w:t>
-      </w:r>
-      <w:r>
-        <w:t xml:space="preserve">, 5137–5155. (doi:</w:t>
+        <w:t xml:space="preserve">50</w:t>
+      </w:r>
+      <w:r>
+        <w:t xml:space="preserve">, 214–225. (doi:</w:t>
       </w:r>
       <w:hyperlink r:id="rId71">
         <w:r>
           <w:rPr>
             <w:rStyle w:val="Hyperlink"/>
           </w:rPr>
-          <w:t xml:space="preserve">https://doi.org/10.5194/gmd-12-5137-2019</w:t>
+          <w:t xml:space="preserve">10.1017/pab.2023.34</w:t>
         </w:r>
       </w:hyperlink>
       <w:r>
@@ -1966,13 +1991,13 @@
       </w:r>
     </w:p>
     <w:bookmarkEnd w:id="72"/>
-    <w:bookmarkStart w:id="74" w:name="ref-barreto2023"/>
+    <w:bookmarkStart w:id="74" w:name="ref-pilowsky2022"/>
     <w:p>
       <w:pPr>
         <w:pStyle w:val="Bibliography"/>
       </w:pPr>
       <w:r>
-        <w:t xml:space="preserve">24.</w:t>
+        <w:t xml:space="preserve">23.</w:t>
       </w:r>
       <w:r>
         <w:t xml:space="preserve"> </w:t>
@@ -1981,7 +2006,7 @@
         <w:t xml:space="preserve">	</w:t>
       </w:r>
       <w:r>
-        <w:t xml:space="preserve">Barreto E, Holden PB, Edwards NR, Rangel TF. 2023 PALEO-PGEM-Series: A spatial time series of the global climate over the last 5 million years (Plio-Pleistocene).</w:t>
+        <w:t xml:space="preserve">Pilowsky JA, Colwell RK, Rahbek C, Fordham DA. 2022 Process-explicit models reveal the structure and dynamics of biodiversity patterns.</w:t>
       </w:r>
       <w:r>
         <w:t xml:space="preserve"> </w:t>
@@ -1991,7 +2016,7 @@
           <w:i/>
           <w:iCs/>
         </w:rPr>
-        <w:t xml:space="preserve">Global Ecology and Biogeography</w:t>
+        <w:t xml:space="preserve">Science Advances</w:t>
       </w:r>
       <w:r>
         <w:t xml:space="preserve"> </w:t>
@@ -2001,17 +2026,17 @@
           <w:b/>
           <w:bCs/>
         </w:rPr>
-        <w:t xml:space="preserve">32</w:t>
-      </w:r>
-      <w:r>
-        <w:t xml:space="preserve">, 1034–1045. (doi:</w:t>
+        <w:t xml:space="preserve">8</w:t>
+      </w:r>
+      <w:r>
+        <w:t xml:space="preserve">, eabj2271. (doi:</w:t>
       </w:r>
       <w:hyperlink r:id="rId73">
         <w:r>
           <w:rPr>
             <w:rStyle w:val="Hyperlink"/>
           </w:rPr>
-          <w:t xml:space="preserve">10.1111/geb.13683</w:t>
+          <w:t xml:space="preserve">10.1126/sciadv.abj2271</w:t>
         </w:r>
       </w:hyperlink>
       <w:r>
@@ -2025,7 +2050,7 @@
         <w:pStyle w:val="Bibliography"/>
       </w:pPr>
       <w:r>
-        <w:t xml:space="preserve">25.</w:t>
+        <w:t xml:space="preserve">24.</w:t>
       </w:r>
       <w:r>
         <w:t xml:space="preserve"> </w:t>
@@ -2078,13 +2103,13 @@
       </w:r>
     </w:p>
     <w:bookmarkEnd w:id="76"/>
-    <w:bookmarkStart w:id="78" w:name="ref-obrien2023"/>
+    <w:bookmarkStart w:id="78" w:name="ref-holden2019"/>
     <w:p>
       <w:pPr>
         <w:pStyle w:val="Bibliography"/>
       </w:pPr>
       <w:r>
-        <w:t xml:space="preserve">26.</w:t>
+        <w:t xml:space="preserve">25.</w:t>
       </w:r>
       <w:r>
         <w:t xml:space="preserve"> </w:t>
@@ -2093,7 +2118,10 @@
         <w:t xml:space="preserve">	</w:t>
       </w:r>
       <w:r>
-        <w:t xml:space="preserve">O’Brien L. 2023</w:t>
+        <w:t xml:space="preserve">Holden PB, Edwards NR, Rangel TF, Pereira EB, Tran GT, Wilkinson RD. 2019 PALEO-PGEM v1.0: A statistical emulator of pliocene</w:t>
+      </w:r>
+      <w:r>
+        <w:t xml:space="preserve">pleistocene climate.</w:t>
       </w:r>
       <w:r>
         <w:t xml:space="preserve"> </w:t>
@@ -2103,6 +2131,145 @@
           <w:i/>
           <w:iCs/>
         </w:rPr>
+        <w:t xml:space="preserve">Geoscientific Model Development</w:t>
+      </w:r>
+      <w:r>
+        <w:t xml:space="preserve"> </w:t>
+      </w:r>
+      <w:r>
+        <w:rPr>
+          <w:b/>
+          <w:bCs/>
+        </w:rPr>
+        <w:t xml:space="preserve">12</w:t>
+      </w:r>
+      <w:r>
+        <w:t xml:space="preserve">, 5137–5155. (doi:</w:t>
+      </w:r>
+      <w:hyperlink r:id="rId77">
+        <w:r>
+          <w:rPr>
+            <w:rStyle w:val="Hyperlink"/>
+          </w:rPr>
+          <w:t xml:space="preserve">https://doi.org/10.5194/gmd-12-5137-2019</w:t>
+        </w:r>
+      </w:hyperlink>
+      <w:r>
+        <w:t xml:space="preserve">)</w:t>
+      </w:r>
+    </w:p>
+    <w:bookmarkEnd w:id="78"/>
+    <w:bookmarkStart w:id="80" w:name="ref-barreto2023"/>
+    <w:p>
+      <w:pPr>
+        <w:pStyle w:val="Bibliography"/>
+      </w:pPr>
+      <w:r>
+        <w:t xml:space="preserve">26.</w:t>
+      </w:r>
+      <w:r>
+        <w:t xml:space="preserve"> </w:t>
+      </w:r>
+      <w:r>
+        <w:t xml:space="preserve">	</w:t>
+      </w:r>
+      <w:r>
+        <w:t xml:space="preserve">Barreto E, Holden PB, Edwards NR, Rangel TF. 2023 PALEO-PGEM-Series: A spatial time series of the global climate over the last 5 million years (Plio-Pleistocene).</w:t>
+      </w:r>
+      <w:r>
+        <w:t xml:space="preserve"> </w:t>
+      </w:r>
+      <w:r>
+        <w:rPr>
+          <w:i/>
+          <w:iCs/>
+        </w:rPr>
+        <w:t xml:space="preserve">Global Ecology and Biogeography</w:t>
+      </w:r>
+      <w:r>
+        <w:t xml:space="preserve"> </w:t>
+      </w:r>
+      <w:r>
+        <w:rPr>
+          <w:b/>
+          <w:bCs/>
+        </w:rPr>
+        <w:t xml:space="preserve">32</w:t>
+      </w:r>
+      <w:r>
+        <w:t xml:space="preserve">, 1034–1045. (doi:</w:t>
+      </w:r>
+      <w:hyperlink r:id="rId79">
+        <w:r>
+          <w:rPr>
+            <w:rStyle w:val="Hyperlink"/>
+          </w:rPr>
+          <w:t xml:space="preserve">10.1111/geb.13683</w:t>
+        </w:r>
+      </w:hyperlink>
+      <w:r>
+        <w:t xml:space="preserve">)</w:t>
+      </w:r>
+    </w:p>
+    <w:bookmarkEnd w:id="80"/>
+    <w:bookmarkStart w:id="82" w:name="ref-galván2023"/>
+    <w:p>
+      <w:pPr>
+        <w:pStyle w:val="Bibliography"/>
+      </w:pPr>
+      <w:r>
+        <w:t xml:space="preserve">27.</w:t>
+      </w:r>
+      <w:r>
+        <w:t xml:space="preserve"> </w:t>
+      </w:r>
+      <w:r>
+        <w:t xml:space="preserve">	</w:t>
+      </w:r>
+      <w:r>
+        <w:t xml:space="preserve">Galván S, Gamboa S, Varela S. 2023</w:t>
+      </w:r>
+      <w:r>
+        <w:t xml:space="preserve"> </w:t>
+      </w:r>
+      <w:hyperlink r:id="rId81">
+        <w:r>
+          <w:rPr>
+            <w:rStyle w:val="Hyperlink"/>
+          </w:rPr>
+          <w:t xml:space="preserve">Köppen Geiger climatic classification for R users.</w:t>
+        </w:r>
+      </w:hyperlink>
+      <w:r>
+        <w:t xml:space="preserve"> </w:t>
+      </w:r>
+    </w:p>
+    <w:bookmarkEnd w:id="82"/>
+    <w:bookmarkStart w:id="84" w:name="ref-obrien2023"/>
+    <w:p>
+      <w:pPr>
+        <w:pStyle w:val="Bibliography"/>
+      </w:pPr>
+      <w:r>
+        <w:t xml:space="preserve">28.</w:t>
+      </w:r>
+      <w:r>
+        <w:t xml:space="preserve"> </w:t>
+      </w:r>
+      <w:r>
+        <w:t xml:space="preserve">	</w:t>
+      </w:r>
+      <w:r>
+        <w:t xml:space="preserve">O’Brien L. 2023</w:t>
+      </w:r>
+      <w:r>
+        <w:t xml:space="preserve"> </w:t>
+      </w:r>
+      <w:r>
+        <w:rPr>
+          <w:i/>
+          <w:iCs/>
+        </w:rPr>
         <w:t xml:space="preserve">h3jsr: Access uber’s H3 library</w:t>
       </w:r>
       <w:r>
@@ -2111,7 +2278,7 @@
       <w:r>
         <w:t xml:space="preserve"> </w:t>
       </w:r>
-      <w:hyperlink r:id="rId77">
+      <w:hyperlink r:id="rId83">
         <w:r>
           <w:rPr>
             <w:rStyle w:val="Hyperlink"/>
@@ -2123,14 +2290,14 @@
         <w:t xml:space="preserve">.</w:t>
       </w:r>
     </w:p>
-    <w:bookmarkEnd w:id="78"/>
-    <w:bookmarkStart w:id="80" w:name="ref-weir2009"/>
+    <w:bookmarkEnd w:id="84"/>
+    <w:bookmarkStart w:id="86" w:name="ref-weir2009"/>
     <w:p>
       <w:pPr>
         <w:pStyle w:val="Bibliography"/>
       </w:pPr>
       <w:r>
-        <w:t xml:space="preserve">27.</w:t>
+        <w:t xml:space="preserve">29.</w:t>
       </w:r>
       <w:r>
         <w:t xml:space="preserve"> </w:t>
@@ -2164,7 +2331,7 @@
       <w:r>
         <w:t xml:space="preserve">, 21737–21742. (doi:</w:t>
       </w:r>
-      <w:hyperlink r:id="rId79">
+      <w:hyperlink r:id="rId85">
         <w:r>
           <w:rPr>
             <w:rStyle w:val="Hyperlink"/>
@@ -2176,14 +2343,14 @@
         <w:t xml:space="preserve">)</w:t>
       </w:r>
     </w:p>
-    <w:bookmarkEnd w:id="80"/>
-    <w:bookmarkStart w:id="82" w:name="ref-skeels2023"/>
+    <w:bookmarkEnd w:id="86"/>
+    <w:bookmarkStart w:id="88" w:name="ref-skeels2023"/>
     <w:p>
       <w:pPr>
         <w:pStyle w:val="Bibliography"/>
       </w:pPr>
       <w:r>
-        <w:t xml:space="preserve">28.</w:t>
+        <w:t xml:space="preserve">30.</w:t>
       </w:r>
       <w:r>
         <w:t xml:space="preserve"> </w:t>
@@ -2217,7 +2384,7 @@
       <w:r>
         <w:t xml:space="preserve">, 341–356. (doi:</w:t>
       </w:r>
-      <w:hyperlink r:id="rId81">
+      <w:hyperlink r:id="rId87">
         <w:r>
           <w:rPr>
             <w:rStyle w:val="Hyperlink"/>
@@ -2229,14 +2396,14 @@
         <w:t xml:space="preserve">)</w:t>
       </w:r>
     </w:p>
-    <w:bookmarkEnd w:id="82"/>
-    <w:bookmarkStart w:id="84" w:name="ref-antonelli2018"/>
+    <w:bookmarkEnd w:id="88"/>
+    <w:bookmarkStart w:id="90" w:name="ref-antonelli2018"/>
     <w:p>
       <w:pPr>
         <w:pStyle w:val="Bibliography"/>
       </w:pPr>
       <w:r>
-        <w:t xml:space="preserve">29.</w:t>
+        <w:t xml:space="preserve">31.</w:t>
       </w:r>
       <w:r>
         <w:t xml:space="preserve"> </w:t>
@@ -2283,7 +2450,7 @@
       <w:r>
         <w:t xml:space="preserve">, 718–725. (doi:</w:t>
       </w:r>
-      <w:hyperlink r:id="rId83">
+      <w:hyperlink r:id="rId89">
         <w:r>
           <w:rPr>
             <w:rStyle w:val="Hyperlink"/>
@@ -2295,9 +2462,115 @@
         <w:t xml:space="preserve">)</w:t>
       </w:r>
     </w:p>
-    <w:bookmarkEnd w:id="84"/>
-    <w:bookmarkEnd w:id="85"/>
-    <w:bookmarkEnd w:id="86"/>
+    <w:bookmarkEnd w:id="90"/>
+    <w:bookmarkStart w:id="92" w:name="ref-croft2020"/>
+    <w:p>
+      <w:pPr>
+        <w:pStyle w:val="Bibliography"/>
+      </w:pPr>
+      <w:r>
+        <w:t xml:space="preserve">32.</w:t>
+      </w:r>
+      <w:r>
+        <w:t xml:space="preserve"> </w:t>
+      </w:r>
+      <w:r>
+        <w:t xml:space="preserve">	</w:t>
+      </w:r>
+      <w:r>
+        <w:t xml:space="preserve">Croft DA, Gelfo JN, López GM. 2020 Splendid innovation: The extinct south american native ungulates.</w:t>
+      </w:r>
+      <w:r>
+        <w:t xml:space="preserve"> </w:t>
+      </w:r>
+      <w:r>
+        <w:rPr>
+          <w:i/>
+          <w:iCs/>
+        </w:rPr>
+        <w:t xml:space="preserve">Annual Review of Earth and Planetary Sciences</w:t>
+      </w:r>
+      <w:r>
+        <w:t xml:space="preserve"> </w:t>
+      </w:r>
+      <w:r>
+        <w:rPr>
+          <w:b/>
+          <w:bCs/>
+        </w:rPr>
+        <w:t xml:space="preserve">48</w:t>
+      </w:r>
+      <w:r>
+        <w:t xml:space="preserve">, 259–290. (doi:</w:t>
+      </w:r>
+      <w:hyperlink r:id="rId91">
+        <w:r>
+          <w:rPr>
+            <w:rStyle w:val="Hyperlink"/>
+          </w:rPr>
+          <w:t xml:space="preserve">10.1146/annurev-earth-072619-060126</w:t>
+        </w:r>
+      </w:hyperlink>
+      <w:r>
+        <w:t xml:space="preserve">)</w:t>
+      </w:r>
+    </w:p>
+    <w:bookmarkEnd w:id="92"/>
+    <w:bookmarkStart w:id="94" w:name="ref-pino2022"/>
+    <w:p>
+      <w:pPr>
+        <w:pStyle w:val="Bibliography"/>
+      </w:pPr>
+      <w:r>
+        <w:t xml:space="preserve">33.</w:t>
+      </w:r>
+      <w:r>
+        <w:t xml:space="preserve"> </w:t>
+      </w:r>
+      <w:r>
+        <w:t xml:space="preserve">	</w:t>
+      </w:r>
+      <w:r>
+        <w:t xml:space="preserve">Pino K, Vallejos-Garrido P, Espinoza-Aravena N, Cooper RB, Silvestro D, Hernández CE, Rodríguez-Serrano E. 2022 Regional landscape change triggered by andean uplift: The extinction of sparassodonta (mammalia, metatheria) in south america.</w:t>
+      </w:r>
+      <w:r>
+        <w:t xml:space="preserve"> </w:t>
+      </w:r>
+      <w:r>
+        <w:rPr>
+          <w:i/>
+          <w:iCs/>
+        </w:rPr>
+        <w:t xml:space="preserve">Global and Planetary Change</w:t>
+      </w:r>
+      <w:r>
+        <w:t xml:space="preserve"> </w:t>
+      </w:r>
+      <w:r>
+        <w:rPr>
+          <w:b/>
+          <w:bCs/>
+        </w:rPr>
+        <w:t xml:space="preserve">210</w:t>
+      </w:r>
+      <w:r>
+        <w:t xml:space="preserve">, 103758. (doi:</w:t>
+      </w:r>
+      <w:hyperlink r:id="rId93">
+        <w:r>
+          <w:rPr>
+            <w:rStyle w:val="Hyperlink"/>
+          </w:rPr>
+          <w:t xml:space="preserve">10.1016/j.gloplacha.2022.103758</w:t>
+        </w:r>
+      </w:hyperlink>
+      <w:r>
+        <w:t xml:space="preserve">)</w:t>
+      </w:r>
+    </w:p>
+    <w:bookmarkEnd w:id="94"/>
+    <w:bookmarkEnd w:id="95"/>
+    <w:bookmarkEnd w:id="96"/>
     <w:sectPr>
       <w:type w:val="nextPage"/>
       <w:pgSz w:h="15840" w:w="12240"/>

</xml_diff>

<commit_message>
new flavour of successful col plot
</commit_message>
<xml_diff>
--- a/Manuscript/GABI_palaeo_constraints.docx
+++ b/Manuscript/GABI_palaeo_constraints.docx
@@ -19,7 +19,7 @@
         <w:t xml:space="preserve"> </w:t>
       </w:r>
       <w:r>
-        <w:t xml:space="preserve">on</w:t>
+        <w:t xml:space="preserve">behind</w:t>
       </w:r>
       <w:r>
         <w:t xml:space="preserve"> </w:t>
@@ -49,7 +49,31 @@
         <w:t xml:space="preserve"> </w:t>
       </w:r>
       <w:r>
-        <w:t xml:space="preserve">Interchange</w:t>
+        <w:t xml:space="preserve">Interchange:</w:t>
+      </w:r>
+      <w:r>
+        <w:t xml:space="preserve"> </w:t>
+      </w:r>
+      <w:r>
+        <w:t xml:space="preserve">insights</w:t>
+      </w:r>
+      <w:r>
+        <w:t xml:space="preserve"> </w:t>
+      </w:r>
+      <w:r>
+        <w:t xml:space="preserve">from</w:t>
+      </w:r>
+      <w:r>
+        <w:t xml:space="preserve"> </w:t>
+      </w:r>
+      <w:r>
+        <w:t xml:space="preserve">eco-evolutionary</w:t>
+      </w:r>
+      <w:r>
+        <w:t xml:space="preserve"> </w:t>
+      </w:r>
+      <w:r>
+        <w:t xml:space="preserve">simulations</w:t>
       </w:r>
     </w:p>
     <w:p>
@@ -347,7 +371,7 @@
         <w:t xml:space="preserve"> </w:t>
       </w:r>
       <w:r>
-        <w:t xml:space="preserve">[10,19,20]</w:t>
+        <w:t xml:space="preserve">[10,19–21]</w:t>
       </w:r>
       <w:r>
         <w:t xml:space="preserve">. Other studies proposed the implication of abiotic factors. Some put the emphasis on Pleistocene climate fluctuations and the consequent alternating phases of emergence of landscape opening across Central America, in turn favouring the dispersal of large temperate-adapted mammals to the detriment of tropical-adapted ones</w:t>
@@ -356,7 +380,7 @@
         <w:t xml:space="preserve"> </w:t>
       </w:r>
       <w:r>
-        <w:t xml:space="preserve">[9,19,21]</w:t>
+        <w:t xml:space="preserve">[9,19,22]</w:t>
       </w:r>
       <w:r>
         <w:t xml:space="preserve">. Others drew direct relationships between the higher extinction rates of native South American mammal genera and temperature change</w:t>
@@ -365,7 +389,7 @@
         <w:t xml:space="preserve"> </w:t>
       </w:r>
       <w:r>
-        <w:t xml:space="preserve">[22]</w:t>
+        <w:t xml:space="preserve">[23]</w:t>
       </w:r>
       <w:r>
         <w:t xml:space="preserve">. However, our understanding of the underlying forces that drove the GABI’s asymmetry has been limited to statistical analyses primarily relying on fossil data, naturally biased and incomplete</w:t>
@@ -374,7 +398,7 @@
         <w:t xml:space="preserve"> </w:t>
       </w:r>
       <w:r>
-        <w:t xml:space="preserve">[23]</w:t>
+        <w:t xml:space="preserve">[24]</w:t>
       </w:r>
       <w:r>
         <w:t xml:space="preserve">.</w:t>
@@ -401,7 +425,7 @@
         <w:t xml:space="preserve"> </w:t>
       </w:r>
       <w:r>
-        <w:t xml:space="preserve">[24]</w:t>
+        <w:t xml:space="preserve">[25]</w:t>
       </w:r>
       <w:r>
         <w:t xml:space="preserve">. In particular, mechanistic eco-evolutionary models …</w:t>
@@ -410,7 +434,7 @@
         <w:t xml:space="preserve"> </w:t>
       </w:r>
       <w:r>
-        <w:t xml:space="preserve">[25]</w:t>
+        <w:t xml:space="preserve">[26]</w:t>
       </w:r>
     </w:p>
     <w:p>
@@ -418,7 +442,7 @@
         <w:pStyle w:val="BodyText"/>
       </w:pPr>
       <w:r>
-        <w:t xml:space="preserve">Possibility to run computer experiments and draw casual links between biodiversity patterns and (a)biotic factors Proved efficient in a wide range of questions.</w:t>
+        <w:t xml:space="preserve">Possibility to run computer experiments and draw causal links between biodiversity patterns and (a)biotic factors Proved efficient in a wide range of questions.</w:t>
       </w:r>
     </w:p>
     <w:p>
@@ -547,7 +571,7 @@
         <w:t xml:space="preserve"> </w:t>
       </w:r>
       <w:r>
-        <w:t xml:space="preserve">[26]</w:t>
+        <w:t xml:space="preserve">[27]</w:t>
       </w:r>
       <w:r>
         <w:t xml:space="preserve">, covering the last 5 Myrs with a 1</w:t>
@@ -565,7 +589,7 @@
         <w:t xml:space="preserve"> </w:t>
       </w:r>
       <w:r>
-        <w:t xml:space="preserve">[27]</w:t>
+        <w:t xml:space="preserve">[28]</w:t>
       </w:r>
       <w:r>
         <w:t xml:space="preserve">. For the scope of this work, we used two bioclimatic variables: mean annual temperature (MAT, BIO1) and mean annual precipitation (MAP, BIO12).</w:t>
@@ -582,7 +606,7 @@
         <w:t xml:space="preserve"> </w:t>
       </w:r>
       <w:r>
-        <w:t xml:space="preserve">[28]</w:t>
+        <w:t xml:space="preserve">[29]</w:t>
       </w:r>
       <w:r>
         <w:t xml:space="preserve">. This classification divides the world into five broad climatic regions: Polar, Cold, Temperate, Arid and Tropical.</w:t>
@@ -622,7 +646,7 @@
         <w:t xml:space="preserve"> </w:t>
       </w:r>
       <w:r>
-        <w:t xml:space="preserve">[25]</w:t>
+        <w:t xml:space="preserve">[26]</w:t>
       </w:r>
       <w:r>
         <w:t xml:space="preserve">. Simulations, moving forward-in-time with a 10ky time step, tracked the dispersion and diversification of ancestral lineages either originating in North, South America or both, throughout the last 5 Myr.</w:t>
@@ -669,7 +693,7 @@
         <w:t xml:space="preserve"> </w:t>
       </w:r>
       <w:r>
-        <w:t xml:space="preserve">[29]</w:t>
+        <w:t xml:space="preserve">[30]</w:t>
       </w:r>
       <w:r>
         <w:t xml:space="preserve">. We then sampled a centroid at random and retrieved the corresponding cell in our landscape.</w:t>
@@ -711,7 +735,7 @@
       </w:r>
     </w:p>
     <w:bookmarkEnd w:id="30"/>
-    <w:bookmarkStart w:id="31" w:name="discussion"/>
+    <w:bookmarkStart w:id="32" w:name="discussion"/>
     <w:p>
       <w:pPr>
         <w:pStyle w:val="Heading1"/>
@@ -731,7 +755,7 @@
         <w:t xml:space="preserve"> </w:t>
       </w:r>
       <w:r>
-        <w:t xml:space="preserve">[30]</w:t>
+        <w:t xml:space="preserve">[31]</w:t>
       </w:r>
       <w:r>
         <w:t xml:space="preserve">, flying behaviour relaxing constraints applied to land mammals ?</w:t>
@@ -748,7 +772,7 @@
         <w:t xml:space="preserve"> </w:t>
       </w:r>
       <w:r>
-        <w:t xml:space="preserve">[31]</w:t>
+        <w:t xml:space="preserve">[32]</w:t>
       </w:r>
       <w:r>
         <w:t xml:space="preserve">. But here, we expect to find more species in South America, encompassing one of earth’s major and long-standing biodiversity hotspot – Amazonia</w:t>
@@ -757,7 +781,7 @@
         <w:t xml:space="preserve"> </w:t>
       </w:r>
       <w:r>
-        <w:t xml:space="preserve">[32]</w:t>
+        <w:t xml:space="preserve">[33]</w:t>
       </w:r>
       <w:r>
         <w:t xml:space="preserve"> </w:t>
@@ -803,8 +827,26 @@
         <w:t xml:space="preserve">?</w:t>
       </w:r>
     </w:p>
+    <w:bookmarkStart w:id="31" w:name="limitations-perspectives"/>
+    <w:p>
+      <w:pPr>
+        <w:pStyle w:val="Heading2"/>
+      </w:pPr>
+      <w:r>
+        <w:t xml:space="preserve">Limitations &amp; perspectives</w:t>
+      </w:r>
+    </w:p>
+    <w:p>
+      <w:pPr>
+        <w:pStyle w:val="FirstParagraph"/>
+      </w:pPr>
+      <w:r>
+        <w:t xml:space="preserve">Maybe one of the most obvious caveats of our study stems from the assumption of fixed palaeogeography, particularly near the isthmus, wheras we know that this region changed across our study.</w:t>
+      </w:r>
+    </w:p>
     <w:bookmarkEnd w:id="31"/>
-    <w:bookmarkStart w:id="32" w:name="thrash"/>
+    <w:bookmarkEnd w:id="32"/>
+    <w:bookmarkStart w:id="33" w:name="thrash"/>
     <w:p>
       <w:pPr>
         <w:pStyle w:val="Heading1"/>
@@ -824,7 +866,7 @@
         <w:t xml:space="preserve"> </w:t>
       </w:r>
       <w:r>
-        <w:t xml:space="preserve">[33]</w:t>
+        <w:t xml:space="preserve">[34]</w:t>
       </w:r>
       <w:r>
         <w:t xml:space="preserve"> </w:t>
@@ -836,7 +878,7 @@
         <w:t xml:space="preserve"> </w:t>
       </w:r>
       <w:r>
-        <w:t xml:space="preserve">[17,34]</w:t>
+        <w:t xml:space="preserve">[17,35]</w:t>
       </w:r>
       <w:r>
         <w:t xml:space="preserve">) that followed the establishment of northern lineages</w:t>
@@ -898,8 +940,8 @@
         <w:t xml:space="preserve">[15]</w:t>
       </w:r>
     </w:p>
-    <w:bookmarkEnd w:id="32"/>
-    <w:bookmarkStart w:id="99" w:name="references"/>
+    <w:bookmarkEnd w:id="33"/>
+    <w:bookmarkStart w:id="102" w:name="references"/>
     <w:p>
       <w:pPr>
         <w:pStyle w:val="Heading1"/>
@@ -908,8 +950,8 @@
         <w:t xml:space="preserve">References</w:t>
       </w:r>
     </w:p>
-    <w:bookmarkStart w:id="98" w:name="refs"/>
-    <w:bookmarkStart w:id="34" w:name="ref-couvreur2011"/>
+    <w:bookmarkStart w:id="101" w:name="refs"/>
+    <w:bookmarkStart w:id="35" w:name="ref-couvreur2011"/>
     <w:p>
       <w:pPr>
         <w:pStyle w:val="Bibliography"/>
@@ -949,7 +991,7 @@
       <w:r>
         <w:t xml:space="preserve">, 664–680. (doi:</w:t>
       </w:r>
-      <w:hyperlink r:id="rId33">
+      <w:hyperlink r:id="rId34">
         <w:r>
           <w:rPr>
             <w:rStyle w:val="Hyperlink"/>
@@ -961,8 +1003,8 @@
         <w:t xml:space="preserve">)</w:t>
       </w:r>
     </w:p>
-    <w:bookmarkEnd w:id="34"/>
-    <w:bookmarkStart w:id="36" w:name="ref-marshall1982"/>
+    <w:bookmarkEnd w:id="35"/>
+    <w:bookmarkStart w:id="37" w:name="ref-marshall1982"/>
     <w:p>
       <w:pPr>
         <w:pStyle w:val="Bibliography"/>
@@ -982,7 +1024,7 @@
       <w:r>
         <w:t xml:space="preserve"> </w:t>
       </w:r>
-      <w:hyperlink r:id="rId35">
+      <w:hyperlink r:id="rId36">
         <w:r>
           <w:rPr>
             <w:rStyle w:val="Hyperlink"/>
@@ -1017,8 +1059,8 @@
         <w:t xml:space="preserve">, 1351–1357.</w:t>
       </w:r>
     </w:p>
-    <w:bookmarkEnd w:id="36"/>
-    <w:bookmarkStart w:id="38" w:name="ref-montes2015"/>
+    <w:bookmarkEnd w:id="37"/>
+    <w:bookmarkStart w:id="39" w:name="ref-montes2015"/>
     <w:p>
       <w:pPr>
         <w:pStyle w:val="Bibliography"/>
@@ -1071,7 +1113,7 @@
       <w:r>
         <w:t xml:space="preserve">, 226–229. (doi:</w:t>
       </w:r>
-      <w:hyperlink r:id="rId37">
+      <w:hyperlink r:id="rId38">
         <w:r>
           <w:rPr>
             <w:rStyle w:val="Hyperlink"/>
@@ -1083,8 +1125,8 @@
         <w:t xml:space="preserve">)</w:t>
       </w:r>
     </w:p>
-    <w:bookmarkEnd w:id="38"/>
-    <w:bookmarkStart w:id="40" w:name="ref-jaramillo2018"/>
+    <w:bookmarkEnd w:id="39"/>
+    <w:bookmarkStart w:id="41" w:name="ref-jaramillo2018"/>
     <w:p>
       <w:pPr>
         <w:pStyle w:val="Bibliography"/>
@@ -1104,7 +1146,7 @@
       <w:r>
         <w:t xml:space="preserve"> </w:t>
       </w:r>
-      <w:hyperlink r:id="rId39">
+      <w:hyperlink r:id="rId40">
         <w:r>
           <w:rPr>
             <w:rStyle w:val="Hyperlink"/>
@@ -1119,8 +1161,8 @@
         <w:t xml:space="preserve"> </w:t>
       </w:r>
     </w:p>
-    <w:bookmarkEnd w:id="40"/>
-    <w:bookmarkStart w:id="42" w:name="ref-odea2016"/>
+    <w:bookmarkEnd w:id="41"/>
+    <w:bookmarkStart w:id="43" w:name="ref-odea2016"/>
     <w:p>
       <w:pPr>
         <w:pStyle w:val="Bibliography"/>
@@ -1173,7 +1215,7 @@
       <w:r>
         <w:t xml:space="preserve">, e1600883. (doi:</w:t>
       </w:r>
-      <w:hyperlink r:id="rId41">
+      <w:hyperlink r:id="rId42">
         <w:r>
           <w:rPr>
             <w:rStyle w:val="Hyperlink"/>
@@ -1185,8 +1227,8 @@
         <w:t xml:space="preserve">)</w:t>
       </w:r>
     </w:p>
-    <w:bookmarkEnd w:id="42"/>
-    <w:bookmarkStart w:id="44" w:name="ref-verzi2008"/>
+    <w:bookmarkEnd w:id="43"/>
+    <w:bookmarkStart w:id="45" w:name="ref-verzi2008"/>
     <w:p>
       <w:pPr>
         <w:pStyle w:val="Bibliography"/>
@@ -1226,7 +1268,7 @@
       <w:r>
         <w:t xml:space="preserve">, 145–155. (doi:</w:t>
       </w:r>
-      <w:hyperlink r:id="rId43">
+      <w:hyperlink r:id="rId44">
         <w:r>
           <w:rPr>
             <w:rStyle w:val="Hyperlink"/>
@@ -1238,8 +1280,8 @@
         <w:t xml:space="preserve">)</w:t>
       </w:r>
     </w:p>
-    <w:bookmarkEnd w:id="44"/>
-    <w:bookmarkStart w:id="46" w:name="ref-woodburne2010"/>
+    <w:bookmarkEnd w:id="45"/>
+    <w:bookmarkStart w:id="47" w:name="ref-woodburne2010"/>
     <w:p>
       <w:pPr>
         <w:pStyle w:val="Bibliography"/>
@@ -1279,7 +1321,7 @@
       <w:r>
         <w:t xml:space="preserve">, 245–264. (doi:</w:t>
       </w:r>
-      <w:hyperlink r:id="rId45">
+      <w:hyperlink r:id="rId46">
         <w:r>
           <w:rPr>
             <w:rStyle w:val="Hyperlink"/>
@@ -1291,8 +1333,8 @@
         <w:t xml:space="preserve">)</w:t>
       </w:r>
     </w:p>
-    <w:bookmarkEnd w:id="46"/>
-    <w:bookmarkStart w:id="48" w:name="ref-bacon2015"/>
+    <w:bookmarkEnd w:id="47"/>
+    <w:bookmarkStart w:id="49" w:name="ref-bacon2015"/>
     <w:p>
       <w:pPr>
         <w:pStyle w:val="Bibliography"/>
@@ -1332,7 +1374,7 @@
       <w:r>
         <w:t xml:space="preserve">, 6110–6115. (doi:</w:t>
       </w:r>
-      <w:hyperlink r:id="rId47">
+      <w:hyperlink r:id="rId48">
         <w:r>
           <w:rPr>
             <w:rStyle w:val="Hyperlink"/>
@@ -1344,8 +1386,8 @@
         <w:t xml:space="preserve">)</w:t>
       </w:r>
     </w:p>
-    <w:bookmarkEnd w:id="48"/>
-    <w:bookmarkStart w:id="50" w:name="ref-bacon2016"/>
+    <w:bookmarkEnd w:id="49"/>
+    <w:bookmarkStart w:id="51" w:name="ref-bacon2016"/>
     <w:p>
       <w:pPr>
         <w:pStyle w:val="Bibliography"/>
@@ -1385,7 +1427,7 @@
       <w:r>
         <w:t xml:space="preserve">, 375–378. (doi:</w:t>
       </w:r>
-      <w:hyperlink r:id="rId49">
+      <w:hyperlink r:id="rId50">
         <w:r>
           <w:rPr>
             <w:rStyle w:val="Hyperlink"/>
@@ -1397,8 +1439,8 @@
         <w:t xml:space="preserve">)</w:t>
       </w:r>
     </w:p>
-    <w:bookmarkEnd w:id="50"/>
-    <w:bookmarkStart w:id="52" w:name="ref-webb1976"/>
+    <w:bookmarkEnd w:id="51"/>
+    <w:bookmarkStart w:id="53" w:name="ref-webb1976"/>
     <w:p>
       <w:pPr>
         <w:pStyle w:val="Bibliography"/>
@@ -1418,7 +1460,7 @@
       <w:r>
         <w:t xml:space="preserve"> </w:t>
       </w:r>
-      <w:hyperlink r:id="rId51">
+      <w:hyperlink r:id="rId52">
         <w:r>
           <w:rPr>
             <w:rStyle w:val="Hyperlink"/>
@@ -1453,8 +1495,8 @@
         <w:t xml:space="preserve">, 220–234.</w:t>
       </w:r>
     </w:p>
-    <w:bookmarkEnd w:id="52"/>
-    <w:bookmarkStart w:id="54" w:name="ref-marshall1988"/>
+    <w:bookmarkEnd w:id="53"/>
+    <w:bookmarkStart w:id="55" w:name="ref-marshall1988"/>
     <w:p>
       <w:pPr>
         <w:pStyle w:val="Bibliography"/>
@@ -1474,7 +1516,7 @@
       <w:r>
         <w:t xml:space="preserve"> </w:t>
       </w:r>
-      <w:hyperlink r:id="rId53">
+      <w:hyperlink r:id="rId54">
         <w:r>
           <w:rPr>
             <w:rStyle w:val="Hyperlink"/>
@@ -1509,8 +1551,8 @@
         <w:t xml:space="preserve">, 380–388.</w:t>
       </w:r>
     </w:p>
-    <w:bookmarkEnd w:id="54"/>
-    <w:bookmarkStart w:id="56" w:name="ref-carrillo2020"/>
+    <w:bookmarkEnd w:id="55"/>
+    <w:bookmarkStart w:id="57" w:name="ref-carrillo2020"/>
     <w:p>
       <w:pPr>
         <w:pStyle w:val="Bibliography"/>
@@ -1550,7 +1592,7 @@
       <w:r>
         <w:t xml:space="preserve">, 26281–26287. (doi:</w:t>
       </w:r>
-      <w:hyperlink r:id="rId55">
+      <w:hyperlink r:id="rId56">
         <w:r>
           <w:rPr>
             <w:rStyle w:val="Hyperlink"/>
@@ -1562,8 +1604,8 @@
         <w:t xml:space="preserve">)</w:t>
       </w:r>
     </w:p>
-    <w:bookmarkEnd w:id="56"/>
-    <w:bookmarkStart w:id="57" w:name="ref-macarthur1967"/>
+    <w:bookmarkEnd w:id="57"/>
+    <w:bookmarkStart w:id="58" w:name="ref-macarthur1967"/>
     <w:p>
       <w:pPr>
         <w:pStyle w:val="Bibliography"/>
@@ -1597,8 +1639,8 @@
         <w:t xml:space="preserve"> </w:t>
       </w:r>
     </w:p>
-    <w:bookmarkEnd w:id="57"/>
-    <w:bookmarkStart w:id="58" w:name="ref-simpson1980"/>
+    <w:bookmarkEnd w:id="58"/>
+    <w:bookmarkStart w:id="59" w:name="ref-simpson1980"/>
     <w:p>
       <w:pPr>
         <w:pStyle w:val="Bibliography"/>
@@ -1632,8 +1674,8 @@
         <w:t xml:space="preserve"> </w:t>
       </w:r>
     </w:p>
-    <w:bookmarkEnd w:id="58"/>
-    <w:bookmarkStart w:id="60" w:name="ref-domingo2020"/>
+    <w:bookmarkEnd w:id="59"/>
+    <w:bookmarkStart w:id="61" w:name="ref-domingo2020"/>
     <w:p>
       <w:pPr>
         <w:pStyle w:val="Bibliography"/>
@@ -1673,7 +1715,7 @@
       <w:r>
         <w:t xml:space="preserve">, 1608. (doi:</w:t>
       </w:r>
-      <w:hyperlink r:id="rId59">
+      <w:hyperlink r:id="rId60">
         <w:r>
           <w:rPr>
             <w:rStyle w:val="Hyperlink"/>
@@ -1685,8 +1727,8 @@
         <w:t xml:space="preserve">)</w:t>
       </w:r>
     </w:p>
-    <w:bookmarkEnd w:id="60"/>
-    <w:bookmarkStart w:id="62" w:name="ref-prevosti2013"/>
+    <w:bookmarkEnd w:id="61"/>
+    <w:bookmarkStart w:id="63" w:name="ref-prevosti2013"/>
     <w:p>
       <w:pPr>
         <w:pStyle w:val="Bibliography"/>
@@ -1726,7 +1768,7 @@
       <w:r>
         <w:t xml:space="preserve">, 3–21. (doi:</w:t>
       </w:r>
-      <w:hyperlink r:id="rId61">
+      <w:hyperlink r:id="rId62">
         <w:r>
           <w:rPr>
             <w:rStyle w:val="Hyperlink"/>
@@ -1738,8 +1780,8 @@
         <w:t xml:space="preserve">)</w:t>
       </w:r>
     </w:p>
-    <w:bookmarkEnd w:id="62"/>
-    <w:bookmarkStart w:id="64" w:name="ref-tarquini2022"/>
+    <w:bookmarkEnd w:id="63"/>
+    <w:bookmarkStart w:id="65" w:name="ref-tarquini2022"/>
     <w:p>
       <w:pPr>
         <w:pStyle w:val="Bibliography"/>
@@ -1779,7 +1821,7 @@
       <w:r>
         <w:t xml:space="preserve">, 1224. (doi:</w:t>
       </w:r>
-      <w:hyperlink r:id="rId63">
+      <w:hyperlink r:id="rId64">
         <w:r>
           <w:rPr>
             <w:rStyle w:val="Hyperlink"/>
@@ -1791,8 +1833,8 @@
         <w:t xml:space="preserve">)</w:t>
       </w:r>
     </w:p>
-    <w:bookmarkEnd w:id="64"/>
-    <w:bookmarkStart w:id="66" w:name="ref-marsà2025"/>
+    <w:bookmarkEnd w:id="65"/>
+    <w:bookmarkStart w:id="67" w:name="ref-marsà2025"/>
     <w:p>
       <w:pPr>
         <w:pStyle w:val="Bibliography"/>
@@ -1850,7 +1892,7 @@
       <w:r>
         <w:t xml:space="preserve">, 153. (doi:</w:t>
       </w:r>
-      <w:hyperlink r:id="rId65">
+      <w:hyperlink r:id="rId66">
         <w:r>
           <w:rPr>
             <w:rStyle w:val="Hyperlink"/>
@@ -1862,8 +1904,8 @@
         <w:t xml:space="preserve">)</w:t>
       </w:r>
     </w:p>
-    <w:bookmarkEnd w:id="66"/>
-    <w:bookmarkStart w:id="67" w:name="ref-marshall1990"/>
+    <w:bookmarkEnd w:id="67"/>
+    <w:bookmarkStart w:id="68" w:name="ref-marshall1990"/>
     <w:p>
       <w:pPr>
         <w:pStyle w:val="Bibliography"/>
@@ -1904,8 +1946,8 @@
         <w:t xml:space="preserve">, 169–210.</w:t>
       </w:r>
     </w:p>
-    <w:bookmarkEnd w:id="67"/>
-    <w:bookmarkStart w:id="69" w:name="ref-faurby2016"/>
+    <w:bookmarkEnd w:id="68"/>
+    <w:bookmarkStart w:id="70" w:name="ref-faurby2016"/>
     <w:p>
       <w:pPr>
         <w:pStyle w:val="Bibliography"/>
@@ -1945,7 +1987,7 @@
       <w:r>
         <w:t xml:space="preserve">, 1443–1453. (doi:</w:t>
       </w:r>
-      <w:hyperlink r:id="rId68">
+      <w:hyperlink r:id="rId69">
         <w:r>
           <w:rPr>
             <w:rStyle w:val="Hyperlink"/>
@@ -1957,8 +1999,8 @@
         <w:t xml:space="preserve">)</w:t>
       </w:r>
     </w:p>
-    <w:bookmarkEnd w:id="69"/>
-    <w:bookmarkStart w:id="71" w:name="ref-webb1991"/>
+    <w:bookmarkEnd w:id="70"/>
+    <w:bookmarkStart w:id="72" w:name="ref-fernández-monescillo2025"/>
     <w:p>
       <w:pPr>
         <w:pStyle w:val="Bibliography"/>
@@ -1973,7 +2015,7 @@
         <w:t xml:space="preserve">	</w:t>
       </w:r>
       <w:r>
-        <w:t xml:space="preserve">Webb SD. 1991 Ecogeography and the Great American Interchange.</w:t>
+        <w:t xml:space="preserve">Fernández-Monescillo M, Romero-Lebrón E, Pesquero MD, Haro A, Rodríguez PE, Krapovickas J, Tauber AA. 2025 Middle Pleistocene revelations: unravelling taphonomic processes in mammals including Mesotherium cristatum (Mesotheriidae, Notoungulata), Corralito Site, Córdoba Province, Argentina.</w:t>
       </w:r>
       <w:r>
         <w:t xml:space="preserve"> </w:t>
@@ -1983,7 +2025,7 @@
           <w:i/>
           <w:iCs/>
         </w:rPr>
-        <w:t xml:space="preserve">Paleobiology</w:t>
+        <w:t xml:space="preserve">Palaeontology</w:t>
       </w:r>
       <w:r>
         <w:t xml:space="preserve"> </w:t>
@@ -1993,12 +2035,65 @@
           <w:b/>
           <w:bCs/>
         </w:rPr>
+        <w:t xml:space="preserve">68</w:t>
+      </w:r>
+      <w:r>
+        <w:t xml:space="preserve">, e70012. (doi:</w:t>
+      </w:r>
+      <w:hyperlink r:id="rId71">
+        <w:r>
+          <w:rPr>
+            <w:rStyle w:val="Hyperlink"/>
+          </w:rPr>
+          <w:t xml:space="preserve">10.1111/pala.70012</w:t>
+        </w:r>
+      </w:hyperlink>
+      <w:r>
+        <w:t xml:space="preserve">)</w:t>
+      </w:r>
+    </w:p>
+    <w:bookmarkEnd w:id="72"/>
+    <w:bookmarkStart w:id="74" w:name="ref-webb1991"/>
+    <w:p>
+      <w:pPr>
+        <w:pStyle w:val="Bibliography"/>
+      </w:pPr>
+      <w:r>
+        <w:t xml:space="preserve">22.</w:t>
+      </w:r>
+      <w:r>
+        <w:t xml:space="preserve"> </w:t>
+      </w:r>
+      <w:r>
+        <w:t xml:space="preserve">	</w:t>
+      </w:r>
+      <w:r>
+        <w:t xml:space="preserve">Webb SD. 1991 Ecogeography and the Great American Interchange.</w:t>
+      </w:r>
+      <w:r>
+        <w:t xml:space="preserve"> </w:t>
+      </w:r>
+      <w:r>
+        <w:rPr>
+          <w:i/>
+          <w:iCs/>
+        </w:rPr>
+        <w:t xml:space="preserve">Paleobiology</w:t>
+      </w:r>
+      <w:r>
+        <w:t xml:space="preserve"> </w:t>
+      </w:r>
+      <w:r>
+        <w:rPr>
+          <w:b/>
+          <w:bCs/>
+        </w:rPr>
         <w:t xml:space="preserve">17</w:t>
       </w:r>
       <w:r>
         <w:t xml:space="preserve">, 266–280. (doi:</w:t>
       </w:r>
-      <w:hyperlink r:id="rId70">
+      <w:hyperlink r:id="rId73">
         <w:r>
           <w:rPr>
             <w:rStyle w:val="Hyperlink"/>
@@ -2010,14 +2105,14 @@
         <w:t xml:space="preserve">)</w:t>
       </w:r>
     </w:p>
-    <w:bookmarkEnd w:id="71"/>
-    <w:bookmarkStart w:id="73" w:name="ref-freitas-oliveira2024"/>
+    <w:bookmarkEnd w:id="74"/>
+    <w:bookmarkStart w:id="76" w:name="ref-freitas-oliveira2024"/>
     <w:p>
       <w:pPr>
         <w:pStyle w:val="Bibliography"/>
       </w:pPr>
       <w:r>
-        <w:t xml:space="preserve">22.</w:t>
+        <w:t xml:space="preserve">23.</w:t>
       </w:r>
       <w:r>
         <w:t xml:space="preserve"> </w:t>
@@ -2051,7 +2146,7 @@
       <w:r>
         <w:t xml:space="preserve">, 1–5. (doi:</w:t>
       </w:r>
-      <w:hyperlink r:id="rId72">
+      <w:hyperlink r:id="rId75">
         <w:r>
           <w:rPr>
             <w:rStyle w:val="Hyperlink"/>
@@ -2063,14 +2158,14 @@
         <w:t xml:space="preserve">)</w:t>
       </w:r>
     </w:p>
-    <w:bookmarkEnd w:id="73"/>
-    <w:bookmarkStart w:id="75" w:name="ref-krone2024"/>
+    <w:bookmarkEnd w:id="76"/>
+    <w:bookmarkStart w:id="78" w:name="ref-krone2024"/>
     <w:p>
       <w:pPr>
         <w:pStyle w:val="Bibliography"/>
       </w:pPr>
       <w:r>
-        <w:t xml:space="preserve">23.</w:t>
+        <w:t xml:space="preserve">24.</w:t>
       </w:r>
       <w:r>
         <w:t xml:space="preserve"> </w:t>
@@ -2104,7 +2199,7 @@
       <w:r>
         <w:t xml:space="preserve">, 214–225. (doi:</w:t>
       </w:r>
-      <w:hyperlink r:id="rId74">
+      <w:hyperlink r:id="rId77">
         <w:r>
           <w:rPr>
             <w:rStyle w:val="Hyperlink"/>
@@ -2116,14 +2211,14 @@
         <w:t xml:space="preserve">)</w:t>
       </w:r>
     </w:p>
-    <w:bookmarkEnd w:id="75"/>
-    <w:bookmarkStart w:id="77" w:name="ref-pilowsky2022"/>
+    <w:bookmarkEnd w:id="78"/>
+    <w:bookmarkStart w:id="80" w:name="ref-pilowsky2022"/>
     <w:p>
       <w:pPr>
         <w:pStyle w:val="Bibliography"/>
       </w:pPr>
       <w:r>
-        <w:t xml:space="preserve">24.</w:t>
+        <w:t xml:space="preserve">25.</w:t>
       </w:r>
       <w:r>
         <w:t xml:space="preserve"> </w:t>
@@ -2157,7 +2252,7 @@
       <w:r>
         <w:t xml:space="preserve">, eabj2271. (doi:</w:t>
       </w:r>
-      <w:hyperlink r:id="rId76">
+      <w:hyperlink r:id="rId79">
         <w:r>
           <w:rPr>
             <w:rStyle w:val="Hyperlink"/>
@@ -2169,14 +2264,14 @@
         <w:t xml:space="preserve">)</w:t>
       </w:r>
     </w:p>
-    <w:bookmarkEnd w:id="77"/>
-    <w:bookmarkStart w:id="79" w:name="ref-hagen2021"/>
+    <w:bookmarkEnd w:id="80"/>
+    <w:bookmarkStart w:id="82" w:name="ref-hagen2021"/>
     <w:p>
       <w:pPr>
         <w:pStyle w:val="Bibliography"/>
       </w:pPr>
       <w:r>
-        <w:t xml:space="preserve">25.</w:t>
+        <w:t xml:space="preserve">26.</w:t>
       </w:r>
       <w:r>
         <w:t xml:space="preserve"> </w:t>
@@ -2216,7 +2311,7 @@
       <w:r>
         <w:t xml:space="preserve">, e3001340. (doi:</w:t>
       </w:r>
-      <w:hyperlink r:id="rId78">
+      <w:hyperlink r:id="rId81">
         <w:r>
           <w:rPr>
             <w:rStyle w:val="Hyperlink"/>
@@ -2228,14 +2323,14 @@
         <w:t xml:space="preserve">)</w:t>
       </w:r>
     </w:p>
-    <w:bookmarkEnd w:id="79"/>
-    <w:bookmarkStart w:id="81" w:name="ref-holden2019"/>
+    <w:bookmarkEnd w:id="82"/>
+    <w:bookmarkStart w:id="84" w:name="ref-holden2019"/>
     <w:p>
       <w:pPr>
         <w:pStyle w:val="Bibliography"/>
       </w:pPr>
       <w:r>
-        <w:t xml:space="preserve">26.</w:t>
+        <w:t xml:space="preserve">27.</w:t>
       </w:r>
       <w:r>
         <w:t xml:space="preserve"> </w:t>
@@ -2272,7 +2367,7 @@
       <w:r>
         <w:t xml:space="preserve">, 5137–5155. (doi:</w:t>
       </w:r>
-      <w:hyperlink r:id="rId80">
+      <w:hyperlink r:id="rId83">
         <w:r>
           <w:rPr>
             <w:rStyle w:val="Hyperlink"/>
@@ -2284,14 +2379,14 @@
         <w:t xml:space="preserve">)</w:t>
       </w:r>
     </w:p>
-    <w:bookmarkEnd w:id="81"/>
-    <w:bookmarkStart w:id="83" w:name="ref-barreto2023"/>
+    <w:bookmarkEnd w:id="84"/>
+    <w:bookmarkStart w:id="86" w:name="ref-barreto2023"/>
     <w:p>
       <w:pPr>
         <w:pStyle w:val="Bibliography"/>
       </w:pPr>
       <w:r>
-        <w:t xml:space="preserve">27.</w:t>
+        <w:t xml:space="preserve">28.</w:t>
       </w:r>
       <w:r>
         <w:t xml:space="preserve"> </w:t>
@@ -2325,7 +2420,7 @@
       <w:r>
         <w:t xml:space="preserve">, 1034–1045. (doi:</w:t>
       </w:r>
-      <w:hyperlink r:id="rId82">
+      <w:hyperlink r:id="rId85">
         <w:r>
           <w:rPr>
             <w:rStyle w:val="Hyperlink"/>
@@ -2337,14 +2432,14 @@
         <w:t xml:space="preserve">)</w:t>
       </w:r>
     </w:p>
-    <w:bookmarkEnd w:id="83"/>
-    <w:bookmarkStart w:id="85" w:name="ref-galván2023"/>
+    <w:bookmarkEnd w:id="86"/>
+    <w:bookmarkStart w:id="88" w:name="ref-galván2023"/>
     <w:p>
       <w:pPr>
         <w:pStyle w:val="Bibliography"/>
       </w:pPr>
       <w:r>
-        <w:t xml:space="preserve">28.</w:t>
+        <w:t xml:space="preserve">29.</w:t>
       </w:r>
       <w:r>
         <w:t xml:space="preserve"> </w:t>
@@ -2358,7 +2453,7 @@
       <w:r>
         <w:t xml:space="preserve"> </w:t>
       </w:r>
-      <w:hyperlink r:id="rId84">
+      <w:hyperlink r:id="rId87">
         <w:r>
           <w:rPr>
             <w:rStyle w:val="Hyperlink"/>
@@ -2370,14 +2465,14 @@
         <w:t xml:space="preserve"> </w:t>
       </w:r>
     </w:p>
-    <w:bookmarkEnd w:id="85"/>
-    <w:bookmarkStart w:id="87" w:name="ref-obrien2023"/>
+    <w:bookmarkEnd w:id="88"/>
+    <w:bookmarkStart w:id="90" w:name="ref-obrien2023"/>
     <w:p>
       <w:pPr>
         <w:pStyle w:val="Bibliography"/>
       </w:pPr>
       <w:r>
-        <w:t xml:space="preserve">29.</w:t>
+        <w:t xml:space="preserve">30.</w:t>
       </w:r>
       <w:r>
         <w:t xml:space="preserve"> </w:t>
@@ -2404,7 +2499,7 @@
       <w:r>
         <w:t xml:space="preserve"> </w:t>
       </w:r>
-      <w:hyperlink r:id="rId86">
+      <w:hyperlink r:id="rId89">
         <w:r>
           <w:rPr>
             <w:rStyle w:val="Hyperlink"/>
@@ -2416,14 +2511,14 @@
         <w:t xml:space="preserve">.</w:t>
       </w:r>
     </w:p>
-    <w:bookmarkEnd w:id="87"/>
-    <w:bookmarkStart w:id="89" w:name="ref-weir2009"/>
+    <w:bookmarkEnd w:id="90"/>
+    <w:bookmarkStart w:id="92" w:name="ref-weir2009"/>
     <w:p>
       <w:pPr>
         <w:pStyle w:val="Bibliography"/>
       </w:pPr>
       <w:r>
-        <w:t xml:space="preserve">30.</w:t>
+        <w:t xml:space="preserve">31.</w:t>
       </w:r>
       <w:r>
         <w:t xml:space="preserve"> </w:t>
@@ -2457,7 +2552,7 @@
       <w:r>
         <w:t xml:space="preserve">, 21737–21742. (doi:</w:t>
       </w:r>
-      <w:hyperlink r:id="rId88">
+      <w:hyperlink r:id="rId91">
         <w:r>
           <w:rPr>
             <w:rStyle w:val="Hyperlink"/>
@@ -2469,14 +2564,14 @@
         <w:t xml:space="preserve">)</w:t>
       </w:r>
     </w:p>
-    <w:bookmarkEnd w:id="89"/>
-    <w:bookmarkStart w:id="91" w:name="ref-skeels2023"/>
+    <w:bookmarkEnd w:id="92"/>
+    <w:bookmarkStart w:id="94" w:name="ref-skeels2023"/>
     <w:p>
       <w:pPr>
         <w:pStyle w:val="Bibliography"/>
       </w:pPr>
       <w:r>
-        <w:t xml:space="preserve">31.</w:t>
+        <w:t xml:space="preserve">32.</w:t>
       </w:r>
       <w:r>
         <w:t xml:space="preserve"> </w:t>
@@ -2510,7 +2605,7 @@
       <w:r>
         <w:t xml:space="preserve">, 341–356. (doi:</w:t>
       </w:r>
-      <w:hyperlink r:id="rId90">
+      <w:hyperlink r:id="rId93">
         <w:r>
           <w:rPr>
             <w:rStyle w:val="Hyperlink"/>
@@ -2522,14 +2617,14 @@
         <w:t xml:space="preserve">)</w:t>
       </w:r>
     </w:p>
-    <w:bookmarkEnd w:id="91"/>
-    <w:bookmarkStart w:id="93" w:name="ref-antonelli2018"/>
+    <w:bookmarkEnd w:id="94"/>
+    <w:bookmarkStart w:id="96" w:name="ref-antonelli2018"/>
     <w:p>
       <w:pPr>
         <w:pStyle w:val="Bibliography"/>
       </w:pPr>
       <w:r>
-        <w:t xml:space="preserve">32.</w:t>
+        <w:t xml:space="preserve">33.</w:t>
       </w:r>
       <w:r>
         <w:t xml:space="preserve"> </w:t>
@@ -2576,7 +2671,7 @@
       <w:r>
         <w:t xml:space="preserve">, 718–725. (doi:</w:t>
       </w:r>
-      <w:hyperlink r:id="rId92">
+      <w:hyperlink r:id="rId95">
         <w:r>
           <w:rPr>
             <w:rStyle w:val="Hyperlink"/>
@@ -2588,14 +2683,14 @@
         <w:t xml:space="preserve">)</w:t>
       </w:r>
     </w:p>
-    <w:bookmarkEnd w:id="93"/>
-    <w:bookmarkStart w:id="95" w:name="ref-croft2020"/>
+    <w:bookmarkEnd w:id="96"/>
+    <w:bookmarkStart w:id="98" w:name="ref-croft2020"/>
     <w:p>
       <w:pPr>
         <w:pStyle w:val="Bibliography"/>
       </w:pPr>
       <w:r>
-        <w:t xml:space="preserve">33.</w:t>
+        <w:t xml:space="preserve">34.</w:t>
       </w:r>
       <w:r>
         <w:t xml:space="preserve"> </w:t>
@@ -2629,7 +2724,7 @@
       <w:r>
         <w:t xml:space="preserve">, 259–290. (doi:</w:t>
       </w:r>
-      <w:hyperlink r:id="rId94">
+      <w:hyperlink r:id="rId97">
         <w:r>
           <w:rPr>
             <w:rStyle w:val="Hyperlink"/>
@@ -2641,14 +2736,14 @@
         <w:t xml:space="preserve">)</w:t>
       </w:r>
     </w:p>
-    <w:bookmarkEnd w:id="95"/>
-    <w:bookmarkStart w:id="97" w:name="ref-pino2022"/>
+    <w:bookmarkEnd w:id="98"/>
+    <w:bookmarkStart w:id="100" w:name="ref-pino2022"/>
     <w:p>
       <w:pPr>
         <w:pStyle w:val="Bibliography"/>
       </w:pPr>
       <w:r>
-        <w:t xml:space="preserve">34.</w:t>
+        <w:t xml:space="preserve">35.</w:t>
       </w:r>
       <w:r>
         <w:t xml:space="preserve"> </w:t>
@@ -2682,7 +2777,7 @@
       <w:r>
         <w:t xml:space="preserve">, 103758. (doi:</w:t>
       </w:r>
-      <w:hyperlink r:id="rId96">
+      <w:hyperlink r:id="rId99">
         <w:r>
           <w:rPr>
             <w:rStyle w:val="Hyperlink"/>
@@ -2694,9 +2789,9 @@
         <w:t xml:space="preserve">)</w:t>
       </w:r>
     </w:p>
-    <w:bookmarkEnd w:id="97"/>
-    <w:bookmarkEnd w:id="98"/>
-    <w:bookmarkEnd w:id="99"/>
+    <w:bookmarkEnd w:id="100"/>
+    <w:bookmarkEnd w:id="101"/>
+    <w:bookmarkEnd w:id="102"/>
     <w:sectPr>
       <w:type w:val="nextPage"/>
       <w:pgSz w:h="15840" w:w="12240"/>

</xml_diff>

<commit_message>
save all figures as png for word manuscript
</commit_message>
<xml_diff>
--- a/Manuscript/GABI_palaeo_constraints.docx
+++ b/Manuscript/GABI_palaeo_constraints.docx
@@ -856,7 +856,7 @@
         <w:pStyle w:val="FirstParagraph"/>
       </w:pPr>
       <w:r>
-        <w:t xml:space="preserve">Unexpetedly, our simulation-based framework suggests that the proportion of simulations successfully reaching the other continent is always higher when starting from South America than from South America (Fig 1)</w:t>
+        <w:t xml:space="preserve">Unexpetedly, our simulation-based framework suggests that the proportion of simulations successfully reaching the other continent is always higher when starting from South America than from North America (Fig 1). This imbalance, strikingly going against our expectations, is maintained whether we allowed species climatic niche to evolve following climatic change (XX%, model M1) or not (XX% vs YY%, model M0, Figure 1)</w:t>
       </w:r>
     </w:p>
     <w:p>
@@ -866,14 +866,14 @@
       <w:r>
         <w:drawing>
           <wp:inline>
-            <wp:extent cx="5943600" cy="2792627"/>
+            <wp:extent cx="5943600" cy="2796378"/>
             <wp:effectExtent b="0" l="0" r="0" t="0"/>
             <wp:docPr descr="Proportion of successful exchange to the other continent, either starting from North (red) or South (blue) America." title="" id="29" name="Picture"/>
             <a:graphic>
               <a:graphicData uri="http://schemas.openxmlformats.org/drawingml/2006/picture">
                 <pic:pic>
                   <pic:nvPicPr>
-                    <pic:cNvPr descr="../Figures/prop_successful_exch/succ_exch_panel.pdf" id="30" name="Picture"/>
+                    <pic:cNvPr descr="../Figures/prop_successful_exch/succ_exch_panel.png" id="30" name="Picture"/>
                     <pic:cNvPicPr>
                       <a:picLocks noChangeArrowheads="1" noChangeAspect="1"/>
                     </pic:cNvPicPr>
@@ -887,7 +887,7 @@
                   <pic:spPr bwMode="auto">
                     <a:xfrm>
                       <a:off x="0" y="0"/>
-                      <a:ext cx="5943600" cy="2792627"/>
+                      <a:ext cx="5943600" cy="2796378"/>
                     </a:xfrm>
                     <a:prstGeom prst="rect">
                       <a:avLst/>

</xml_diff>

<commit_message>
tiny update of the day
</commit_message>
<xml_diff>
--- a/Manuscript/GABI_palaeo_constraints.docx
+++ b/Manuscript/GABI_palaeo_constraints.docx
@@ -162,22 +162,13 @@
         <w:t xml:space="preserve">² Centro de Investigación Mariña, Departamento de Ecoloxía e Bioloxía Animal, Universidade de Vigo, Campus Lagoas-Marcosende, 36310 Vigo, Spain</w:t>
       </w:r>
     </w:p>
-    <w:bookmarkStart w:id="22" w:name="potential-journals"/>
+    <w:bookmarkStart w:id="20" w:name="abstract"/>
     <w:p>
       <w:pPr>
         <w:pStyle w:val="Heading1"/>
       </w:pPr>
       <w:r>
-        <w:t xml:space="preserve">Potential journals</w:t>
-      </w:r>
-    </w:p>
-    <w:bookmarkStart w:id="20" w:name="primary-aims"/>
-    <w:p>
-      <w:pPr>
-        <w:pStyle w:val="Heading2"/>
-      </w:pPr>
-      <w:r>
-        <w:t xml:space="preserve">Primary aims</w:t>
+        <w:t xml:space="preserve">Abstract</w:t>
       </w:r>
     </w:p>
     <w:p>
@@ -185,17 +176,17 @@
         <w:pStyle w:val="FirstParagraph"/>
       </w:pPr>
       <w:r>
-        <w:t xml:space="preserve">Biology Letters or Current Biology</w:t>
+        <w:t xml:space="preserve">The Great American Biotic Interchange (GABI) refers to the admixture of North and South American faunas promoted by the Mio-Pliocene closure of the isthmus of Panama. Among mammals, this faunal exchange was asymmetric because it witnessed a greater ability of North American lineages to establish southwards, meanwhile many South Americans went extinct. Here, coupling a mechanistic eco-evolutionary simulator with high-resolution palaeoclimatic reconstructions for the last 5 million years, we explore the extent to which palaeoclimate may have shaped such a biogeographic asymmetry. When climatic variables are the only constraints to virtual species’ ecology, our results indicate that successful interchanges are more frequently achieved when simulations start from South America than from North America, contrasting with empirical observations. In addition, our models fail at explaining the higher representation of temperate-adapted mammals in the fossil record of successfully exchanged mammals, particularly of North American origin, but suggest that successful colonisers from North America occupy larger areas in South America than the other way around. This study offers valuable insights into the processes behind one of the most puzzling macroecological enigmas, suggesting that palaeoclimatic history is not sufficient to explain the imbalanced success of North American migrants in South America following the GABI.</w:t>
       </w:r>
     </w:p>
     <w:bookmarkEnd w:id="20"/>
-    <w:bookmarkStart w:id="21" w:name="others-that-could-fit"/>
-    <w:p>
-      <w:pPr>
-        <w:pStyle w:val="Heading2"/>
-      </w:pPr>
-      <w:r>
-        <w:t xml:space="preserve">Others that could fit</w:t>
+    <w:bookmarkStart w:id="21" w:name="keywords"/>
+    <w:p>
+      <w:pPr>
+        <w:pStyle w:val="Heading1"/>
+      </w:pPr>
+      <w:r>
+        <w:t xml:space="preserve">Keywords</w:t>
       </w:r>
     </w:p>
     <w:p>
@@ -203,18 +194,22 @@
         <w:pStyle w:val="FirstParagraph"/>
       </w:pPr>
       <w:r>
-        <w:t xml:space="preserve">Proceedings B? Global ecology &amp; Biogeography? Journal of Biogeography?</w:t>
+        <w:t xml:space="preserve">Eco-evolutionary simulations; Mammals; Macroecology; Palaeoclimate</w:t>
+      </w:r>
+    </w:p>
+    <w:p>
+      <w:r>
+        <w:br w:type="page"/>
       </w:r>
     </w:p>
     <w:bookmarkEnd w:id="21"/>
-    <w:bookmarkEnd w:id="22"/>
-    <w:bookmarkStart w:id="23" w:name="abstract"/>
+    <w:bookmarkStart w:id="22" w:name="introduction"/>
     <w:p>
       <w:pPr>
         <w:pStyle w:val="Heading1"/>
       </w:pPr>
       <w:r>
-        <w:t xml:space="preserve">Abstract</w:t>
+        <w:t xml:space="preserve">Introduction</w:t>
       </w:r>
     </w:p>
     <w:p>
@@ -222,63 +217,22 @@
         <w:pStyle w:val="FirstParagraph"/>
       </w:pPr>
       <w:r>
-        <w:t xml:space="preserve">The Great American Biotic Interchange (GABI) refers to the admixture of North and South American faunas promoted by the Mio-Pliocene closure of the isthmus of Panama. Among mammals, this faunal exchange was asymmetric because it witnessed a greater ability of North American lineages to establish southwards, meanwhile many South Americans went extinct. Here, coupling a mechanistic eco-evolutionary simulator with high-resolution palaeoclimatic reconstructions for the last 5 million years, we explore the extent to which palaeoclimate may have shaped such a biogeographic asymmetry. When climatic variables are the only constraints to virtual species’ ecology, our results indicate that successful interchanges are more frequently achieved when simulations start from South America than from North America, contrasting with empirical observations. In addition, our models fail at explaining the higher representation of temperate-adapted mammals in the fossil record of successfully exchanged mammals, particularly of North American origin, but suggest that successful colonisers from North America occupy larger areas in South America than the other way around. This study offers valuable insights into the processes behind one of the most puzzling macroecological enigmas, suggesting that palaeoclimatic history is not sufficient to explain the imbalanced success of North American migrants in South America following the GABI.</w:t>
-      </w:r>
-    </w:p>
-    <w:bookmarkEnd w:id="23"/>
-    <w:bookmarkStart w:id="24" w:name="keywords"/>
-    <w:p>
-      <w:pPr>
-        <w:pStyle w:val="Heading1"/>
-      </w:pPr>
-      <w:r>
-        <w:t xml:space="preserve">Keywords</w:t>
-      </w:r>
-    </w:p>
-    <w:p>
-      <w:pPr>
-        <w:pStyle w:val="FirstParagraph"/>
-      </w:pPr>
-      <w:r>
-        <w:t xml:space="preserve">Eco-evolutionary simulations; Mammals; Macroecology; Palaeoclimate</w:t>
-      </w:r>
-    </w:p>
-    <w:p>
-      <w:r>
-        <w:br w:type="page"/>
-      </w:r>
-    </w:p>
-    <w:bookmarkEnd w:id="24"/>
-    <w:bookmarkStart w:id="25" w:name="introduction"/>
-    <w:p>
-      <w:pPr>
-        <w:pStyle w:val="Heading1"/>
-      </w:pPr>
-      <w:r>
-        <w:t xml:space="preserve">Introduction</w:t>
-      </w:r>
-    </w:p>
-    <w:p>
-      <w:pPr>
-        <w:pStyle w:val="FirstParagraph"/>
-      </w:pPr>
-      <w:r>
         <w:t xml:space="preserve">The Great American Biotic Interchange (GABI) refers to the large-scale faunal exchange – mostly affecting land mammals – that occurred between the Americas, favoured by the establishment of the isthmus of Panama</w:t>
       </w:r>
       <w:r>
-        <w:t xml:space="preserve"> </w:t>
-      </w:r>
-      <w:r>
-        <w:t xml:space="preserve">[1]</w:t>
+        <w:rPr>
+          <w:vertAlign w:val="superscript"/>
+        </w:rPr>
+        <w:t xml:space="preserve">1</w:t>
       </w:r>
       <w:r>
         <w:t xml:space="preserve">. Though the exact timing of the closure of the isthmus is still debated</w:t>
       </w:r>
       <w:r>
-        <w:t xml:space="preserve"> </w:t>
-      </w:r>
-      <w:r>
-        <w:t xml:space="preserve">[2–4]</w:t>
+        <w:rPr>
+          <w:vertAlign w:val="superscript"/>
+        </w:rPr>
+        <w:t xml:space="preserve">2–4</w:t>
       </w:r>
       <w:r>
         <w:t xml:space="preserve">, palaeontological evidence and molecular phylogenies both agree with a late Miocene onset of land mammal exchange between the Americas, with most effective crossings occurring from</w:t>
@@ -300,28 +254,28 @@
         <w:t xml:space="preserve">3.5 Million years ago (Ma) onwards</w:t>
       </w:r>
       <w:r>
-        <w:t xml:space="preserve"> </w:t>
-      </w:r>
-      <w:r>
-        <w:t xml:space="preserve">[5–8]</w:t>
+        <w:rPr>
+          <w:vertAlign w:val="superscript"/>
+        </w:rPr>
+        <w:t xml:space="preserve">5–8</w:t>
       </w:r>
       <w:r>
         <w:t xml:space="preserve">. Despite its textbook nature, a puzzling feature of the GABI is that it impacted both continent’s mammalian faunas very differently. In fact, evidence from the fossil record indicates that the early phases of the GABI were marked by reciprocal exchanges between the Americas</w:t>
       </w:r>
       <w:r>
-        <w:t xml:space="preserve"> </w:t>
-      </w:r>
-      <w:r>
-        <w:t xml:space="preserve">[1,9]</w:t>
+        <w:rPr>
+          <w:vertAlign w:val="superscript"/>
+        </w:rPr>
+        <w:t xml:space="preserve">1,9</w:t>
       </w:r>
       <w:r>
         <w:t xml:space="preserve">. However, during the Quaternary, the ability of migrant lineages to maintain in the foreign area became greater in South America, and many native South American mammal lineages concomitantly declined, some of which even going totally extinct</w:t>
       </w:r>
       <w:r>
-        <w:t xml:space="preserve"> </w:t>
-      </w:r>
-      <w:r>
-        <w:t xml:space="preserve">[10–14]</w:t>
+        <w:rPr>
+          <w:vertAlign w:val="superscript"/>
+        </w:rPr>
+        <w:t xml:space="preserve">10–14</w:t>
       </w:r>
       <w:r>
         <w:t xml:space="preserve">. Hence, it turns out that this intercontinental faunal exchange has been strikingly asymmetric.</w:t>
@@ -335,10 +289,10 @@
         <w:t xml:space="preserve">Although this macroecological imbalance is unquestionable, so far, no clear consensus regarding the forces underlying this asymmetry has been established. On one hand, biotic interactions involving migrant and native species have often been proposed to this aim. These would include competition</w:t>
       </w:r>
       <w:r>
-        <w:t xml:space="preserve"> </w:t>
-      </w:r>
-      <w:r>
-        <w:t xml:space="preserve">[9,15,16]</w:t>
+        <w:rPr>
+          <w:vertAlign w:val="superscript"/>
+        </w:rPr>
+        <w:t xml:space="preserve">9,15,16</w:t>
       </w:r>
       <w:r>
         <w:t xml:space="preserve"> </w:t>
@@ -347,39 +301,41 @@
         <w:t xml:space="preserve">or predation of predator-naive preys</w:t>
       </w:r>
       <w:r>
-        <w:t xml:space="preserve"> </w:t>
-      </w:r>
-      <w:r>
-        <w:t xml:space="preserve">[9,17–19]</w:t>
+        <w:rPr>
+          <w:vertAlign w:val="superscript"/>
+        </w:rPr>
+        <w:t xml:space="preserve">9,17–19</w:t>
       </w:r>
       <w:r>
         <w:t xml:space="preserve">. However, their contribution to the asymmetry of the GABI has been increasingly called into question</w:t>
-      </w:r>
-      <w:r>
-        <w:t xml:space="preserve"> </w:t>
-      </w:r>
-      <w:r>
-        <w:t xml:space="preserve">[</w:t>
       </w:r>
       <w:r>
         <w:rPr>
           <w:i/>
           <w:iCs/>
+          <w:vertAlign w:val="superscript"/>
         </w:rPr>
         <w:t xml:space="preserve">e</w:t>
       </w:r>
       <w:r>
+        <w:rPr>
+          <w:vertAlign w:val="superscript"/>
+        </w:rPr>
         <w:t xml:space="preserve">.</w:t>
       </w:r>
       <w:r>
         <w:rPr>
           <w:i/>
           <w:iCs/>
+          <w:vertAlign w:val="superscript"/>
         </w:rPr>
         <w:t xml:space="preserve">g</w:t>
       </w:r>
       <w:r>
-        <w:t xml:space="preserve">., 20,21–23]</w:t>
+        <w:rPr>
+          <w:vertAlign w:val="superscript"/>
+        </w:rPr>
+        <w:t xml:space="preserve">., 20,21–23</w:t>
       </w:r>
       <w:r>
         <w:t xml:space="preserve">. On the other hand, several studies proposed or found support for an implication of abiotic factors –</w:t>
@@ -408,30 +364,38 @@
         <w:t xml:space="preserve">., related to species’ physical environment, such as climate – in the asymmetry of this widely-known exchange</w:t>
       </w:r>
       <w:r>
-        <w:t xml:space="preserve"> </w:t>
-      </w:r>
-      <w:r>
-        <w:t xml:space="preserve">[8,10,</w:t>
+        <w:rPr>
+          <w:vertAlign w:val="superscript"/>
+        </w:rPr>
+        <w:t xml:space="preserve">8,10,</w:t>
       </w:r>
       <w:r>
         <w:rPr>
           <w:i/>
           <w:iCs/>
+          <w:vertAlign w:val="superscript"/>
         </w:rPr>
         <w:t xml:space="preserve">e</w:t>
       </w:r>
       <w:r>
+        <w:rPr>
+          <w:vertAlign w:val="superscript"/>
+        </w:rPr>
         <w:t xml:space="preserve">.</w:t>
       </w:r>
       <w:r>
         <w:rPr>
           <w:i/>
           <w:iCs/>
+          <w:vertAlign w:val="superscript"/>
         </w:rPr>
         <w:t xml:space="preserve">g</w:t>
       </w:r>
       <w:r>
-        <w:t xml:space="preserve">., 17,20,24]</w:t>
+        <w:rPr>
+          <w:vertAlign w:val="superscript"/>
+        </w:rPr>
+        <w:t xml:space="preserve">., 17,20,24</w:t>
       </w:r>
       <w:r>
         <w:t xml:space="preserve">. However, so far, most of these works have only relied on statistical analyses of the fossil record, and there is a lack of studies tackling the issue from a mechanistic perspective.</w:t>
@@ -445,78 +409,80 @@
         <w:t xml:space="preserve">Recent improvements in process-explicit modelling have marked a turning point in the study of biodiversity</w:t>
       </w:r>
       <w:r>
-        <w:t xml:space="preserve"> </w:t>
-      </w:r>
-      <w:r>
-        <w:t xml:space="preserve">[25]</w:t>
+        <w:rPr>
+          <w:vertAlign w:val="superscript"/>
+        </w:rPr>
+        <w:t xml:space="preserve">25</w:t>
       </w:r>
       <w:r>
         <w:t xml:space="preserve">. By combining a landscape made up with palaeoenvironmental variables and a set of eco-evolutionary rules according to which virtual species are simulated, mechanistic eco-evolutionary models offer the unique opportunity to casually explore the way biodiversity patterns arise and are maintained through evolutionary times</w:t>
       </w:r>
       <w:r>
-        <w:t xml:space="preserve"> </w:t>
-      </w:r>
-      <w:r>
-        <w:t xml:space="preserve">[26]</w:t>
+        <w:rPr>
+          <w:vertAlign w:val="superscript"/>
+        </w:rPr>
+        <w:t xml:space="preserve">26</w:t>
       </w:r>
       <w:r>
         <w:t xml:space="preserve">. Recently, this family of models has provided unprecedented insights into the underlying forces behind widely-recognised biodiversity patterns, such as the latitudinal biodiversity gradient</w:t>
       </w:r>
       <w:r>
-        <w:t xml:space="preserve"> </w:t>
-      </w:r>
-      <w:r>
-        <w:t xml:space="preserve">[27]</w:t>
+        <w:rPr>
+          <w:vertAlign w:val="superscript"/>
+        </w:rPr>
+        <w:t xml:space="preserve">27</w:t>
       </w:r>
       <w:r>
         <w:t xml:space="preserve">, the diversity desequilibrium between tropical rainforests across the globe</w:t>
       </w:r>
       <w:r>
-        <w:t xml:space="preserve"> </w:t>
-      </w:r>
-      <w:r>
-        <w:t xml:space="preserve">[28]</w:t>
+        <w:rPr>
+          <w:vertAlign w:val="superscript"/>
+        </w:rPr>
+        <w:t xml:space="preserve">28</w:t>
       </w:r>
       <w:r>
         <w:t xml:space="preserve">, the build-up of the unique biodiversity along the Wallace line</w:t>
       </w:r>
       <w:r>
-        <w:t xml:space="preserve"> </w:t>
-      </w:r>
-      <w:r>
-        <w:t xml:space="preserve">[29]</w:t>
+        <w:rPr>
+          <w:vertAlign w:val="superscript"/>
+        </w:rPr>
+        <w:t xml:space="preserve">29</w:t>
       </w:r>
       <w:r>
         <w:t xml:space="preserve"> </w:t>
       </w:r>
       <w:r>
         <w:t xml:space="preserve">and many others</w:t>
-      </w:r>
-      <w:r>
-        <w:t xml:space="preserve"> </w:t>
-      </w:r>
-      <w:r>
-        <w:t xml:space="preserve">[</w:t>
       </w:r>
       <w:r>
         <w:rPr>
           <w:i/>
           <w:iCs/>
+          <w:vertAlign w:val="superscript"/>
         </w:rPr>
         <w:t xml:space="preserve">e</w:t>
       </w:r>
       <w:r>
+        <w:rPr>
+          <w:vertAlign w:val="superscript"/>
+        </w:rPr>
         <w:t xml:space="preserve">.</w:t>
       </w:r>
       <w:r>
         <w:rPr>
           <w:i/>
           <w:iCs/>
+          <w:vertAlign w:val="superscript"/>
         </w:rPr>
         <w:t xml:space="preserve">g</w:t>
       </w:r>
       <w:r>
-        <w:t xml:space="preserve">., 30,31,32]</w:t>
+        <w:rPr>
+          <w:vertAlign w:val="superscript"/>
+        </w:rPr>
+        <w:t xml:space="preserve">., 30,31,32</w:t>
       </w:r>
       <w:r>
         <w:t xml:space="preserve">.</w:t>
@@ -535,8 +501,8 @@
         <w:br w:type="page"/>
       </w:r>
     </w:p>
-    <w:bookmarkEnd w:id="25"/>
-    <w:bookmarkStart w:id="33" w:name="materials-and-methods"/>
+    <w:bookmarkEnd w:id="22"/>
+    <w:bookmarkStart w:id="30" w:name="materials-and-methods"/>
     <w:p>
       <w:pPr>
         <w:pStyle w:val="Heading1"/>
@@ -659,7 +625,7 @@
         <w:t xml:space="preserve">).</w:t>
       </w:r>
     </w:p>
-    <w:bookmarkStart w:id="30" w:name="palaeoclimate-data"/>
+    <w:bookmarkStart w:id="27" w:name="palaeoclimate-data"/>
     <w:p>
       <w:pPr>
         <w:pStyle w:val="Heading2"/>
@@ -681,7 +647,7 @@
       <w:tr>
         <w:tc>
           <w:tcPr/>
-          <w:bookmarkStart w:id="29" w:name="fig-1"/>
+          <w:bookmarkStart w:id="26" w:name="fig-1"/>
           <w:p>
             <w:pPr>
               <w:pStyle w:val="Compact"/>
@@ -692,18 +658,18 @@
                 <wp:inline>
                   <wp:extent cx="5587151" cy="5184144"/>
                   <wp:effectExtent b="0" l="0" r="0" t="0"/>
-                  <wp:docPr descr="" title="" id="27" name="Picture"/>
+                  <wp:docPr descr="" title="" id="24" name="Picture"/>
                   <a:graphic>
                     <a:graphicData uri="http://schemas.openxmlformats.org/drawingml/2006/picture">
                       <pic:pic>
                         <pic:nvPicPr>
-                          <pic:cNvPr descr="../Figures/MS/Main/Figure1/Figure1.png" id="28" name="Picture"/>
+                          <pic:cNvPr descr="../Figures/MS/Main/Figure1/Figure1.png" id="25" name="Picture"/>
                           <pic:cNvPicPr>
                             <a:picLocks noChangeArrowheads="1" noChangeAspect="1"/>
                           </pic:cNvPicPr>
                         </pic:nvPicPr>
                         <pic:blipFill>
-                          <a:blip r:embed="rId26"/>
+                          <a:blip r:embed="rId23"/>
                           <a:stretch>
                             <a:fillRect/>
                           </a:stretch>
@@ -740,19 +706,19 @@
               <w:pStyle w:val="ImageCaption"/>
             </w:pPr>
             <w:r>
-              <w:t xml:space="preserve">Figure 1: Palaeoclimate histories within our studied landmasses (North America−in red, and South America−in green). Spatially-averaged climate variables (Annual Temperature and Precipitations) are taken from the PALEO-PGEM palaeoclimate emulator</w:t>
+              <w:t xml:space="preserve">Figure 1: Palaeoclimate histories within our studied landmasses (North America is displayed in coral red and South America in cyan). Spatially-averaged climate variables (Annual Temperature and Precipitation) are taken from the PALEO-PGEM palaeoclimate emulator</w:t>
             </w:r>
             <w:r>
-              <w:t xml:space="preserve"> </w:t>
-            </w:r>
-            <w:r>
-              <w:t xml:space="preserve">[33]</w:t>
+              <w:rPr>
+                <w:vertAlign w:val="superscript"/>
+              </w:rPr>
+              <w:t xml:space="preserve">33</w:t>
             </w:r>
             <w:r>
               <w:t xml:space="preserve">. The empirically-derived asymmetry of the transcontinental land mammal exchange is represented by the thickness of the two arrows, the thicker the arrow, the more intense the exchange.</w:t>
             </w:r>
           </w:p>
-          <w:bookmarkEnd w:id="29"/>
+          <w:bookmarkEnd w:id="26"/>
         </w:tc>
       </w:tr>
     </w:tbl>
@@ -764,10 +730,10 @@
         <w:t xml:space="preserve">We used the spatio-temporal terrestrial palaeoclimate series from the PALEO-PGEM atmosphere-ocean general circulation model</w:t>
       </w:r>
       <w:r>
-        <w:t xml:space="preserve"> </w:t>
-      </w:r>
-      <w:r>
-        <w:t xml:space="preserve">[33]</w:t>
+        <w:rPr>
+          <w:vertAlign w:val="superscript"/>
+        </w:rPr>
+        <w:t xml:space="preserve">33</w:t>
       </w:r>
       <w:r>
         <w:t xml:space="preserve">, covering the last 5 Myrs with a 1</w:t>
@@ -775,17 +741,25 @@
       <w:r>
         <w:t xml:space="preserve"> </w:t>
       </w:r>
-      <w:r>
-        <w:t xml:space="preserve"> </w:t>
-      </w:r>
-      <w:r>
-        <w:t xml:space="preserve">° spatial resolution</w:t>
-      </w:r>
-      <w:r>
-        <w:t xml:space="preserve"> </w:t>
-      </w:r>
-      <w:r>
-        <w:t xml:space="preserve">[34]</w:t>
+      <m:oMath>
+        <m:r>
+          <m:rPr>
+            <m:sty m:val="p"/>
+          </m:rPr>
+          <m:t>×</m:t>
+        </m:r>
+      </m:oMath>
+      <w:r>
+        <w:t xml:space="preserve"> </w:t>
+      </w:r>
+      <w:r>
+        <w:t xml:space="preserve">1 ° spatial resolution</w:t>
+      </w:r>
+      <w:r>
+        <w:rPr>
+          <w:vertAlign w:val="superscript"/>
+        </w:rPr>
+        <w:t xml:space="preserve">34</w:t>
       </w:r>
       <w:r>
         <w:t xml:space="preserve">. For the scope of this work, we used two bioclimatic variables: mean annual temperature (MAT, BIO1) and mean annual precipitation (MAP, BIO12). To avoid reaching an overkillingly-high number of simulation steps, we reduced the temporal resolution of the climate simulations from a 1000 years-time step to a 10,000 years time-step.</w:t>
@@ -819,17 +793,17 @@
         <w:t xml:space="preserve">Myrs) according to Köppen-Geiger broad climate types</w:t>
       </w:r>
       <w:r>
-        <w:t xml:space="preserve"> </w:t>
-      </w:r>
-      <w:r>
-        <w:t xml:space="preserve">[35]</w:t>
+        <w:rPr>
+          <w:vertAlign w:val="superscript"/>
+        </w:rPr>
+        <w:t xml:space="preserve">35</w:t>
       </w:r>
       <w:r>
         <w:t xml:space="preserve">. This classification divides the world into five broad climatic regions: Polar, Cold, Temperate, Arid and Tropical.</w:t>
       </w:r>
     </w:p>
-    <w:bookmarkEnd w:id="30"/>
-    <w:bookmarkStart w:id="31" w:name="simulation-model-and-modelling-schemes"/>
+    <w:bookmarkEnd w:id="27"/>
+    <w:bookmarkStart w:id="28" w:name="simulation-model-and-modelling-schemes"/>
     <w:p>
       <w:pPr>
         <w:pStyle w:val="Heading2"/>
@@ -846,10 +820,10 @@
         <w:t xml:space="preserve">We performed our spatially-explicit simulations of biodiversity using the General Engine for Eco-Evolutionary SImulationS, gen3sis, v1.5.11</w:t>
       </w:r>
       <w:r>
-        <w:t xml:space="preserve"> </w:t>
-      </w:r>
-      <w:r>
-        <w:t xml:space="preserve">[27]</w:t>
+        <w:rPr>
+          <w:vertAlign w:val="superscript"/>
+        </w:rPr>
+        <w:t xml:space="preserve">27</w:t>
       </w:r>
       <w:r>
         <w:t xml:space="preserve">. Simulations, moving forward-in-time with a 10ky time step, tracked the radiation of a clade arising from a single ancestral population, either originating in North or in South America, throughout the last 5 Myr. In gen3sis, virtual species are made up with a set of individual populations evolving independently, following a set of four rules: dispersal, speciation, environmental filtering and trait evolution. All simulation scenarios that we implemented only differed on the last rule (trait evolution), the first three being common to all models (or at least partly).</w:t>
@@ -1390,10 +1364,10 @@
         <w:t xml:space="preserve">h3jsr</w:t>
       </w:r>
       <w:r>
-        <w:t xml:space="preserve"> </w:t>
-      </w:r>
-      <w:r>
-        <w:t xml:space="preserve">[36]</w:t>
+        <w:rPr>
+          <w:vertAlign w:val="superscript"/>
+        </w:rPr>
+        <w:t xml:space="preserve">36</w:t>
       </w:r>
       <w:r>
         <w:t xml:space="preserve">. We then sampled a centroid at random and retrieved the corresponding cell in our landscape. To reduce the probability of initial crash, the temperature and/or precipitation optima parameter of the ancestor were set to those of the local environment.</w:t>
@@ -1632,7 +1606,7 @@
         </m:d>
       </m:oMath>
       <w:r>
-        <w:t xml:space="preserve">) and (6) precipitations (</w:t>
+        <w:t xml:space="preserve">) and (6) precipitation (</w:t>
       </w:r>
       <m:oMath>
         <m:sSub>
@@ -1682,10 +1656,10 @@
         <w:t xml:space="preserve">). As done by many authors, we ensured an even sampling of the resulting multidimensional parameter space via a quasirandom sampling technique relying on Sobol’ sequences</w:t>
       </w:r>
       <w:r>
-        <w:t xml:space="preserve"> </w:t>
-      </w:r>
-      <w:r>
-        <w:t xml:space="preserve">[28,29]</w:t>
+        <w:rPr>
+          <w:vertAlign w:val="superscript"/>
+        </w:rPr>
+        <w:t xml:space="preserve">28,29</w:t>
       </w:r>
       <w:r>
         <w:t xml:space="preserve">. Parameter ranges were determined on the basis of a literature review, allowing to assess their biological relevance, and were further adjusted in order to limit the prevalence of crashing simulations. In addition to these varying parameters, we specified the value of several fixed parameters (Tab. S1)</w:t>
@@ -1805,8 +1779,8 @@
         <w:t xml:space="preserve">Last, it is important to notice that, since the palaeoclimate reconstructions that we used ignored tectonic plate motion – a reasonable assumption for a 5-Myr time frame – continental position in our landscapes was held constant across simulations. Therefore, in that framework, changes in connectivity between North and South America could only arise from the environment.</w:t>
       </w:r>
     </w:p>
-    <w:bookmarkEnd w:id="31"/>
-    <w:bookmarkStart w:id="32" w:name="postprocessing-and-quantifications"/>
+    <w:bookmarkEnd w:id="28"/>
+    <w:bookmarkStart w:id="29" w:name="postprocessing-and-quantifications"/>
     <w:p>
       <w:pPr>
         <w:pStyle w:val="Heading2"/>
@@ -1823,10 +1797,10 @@
         <w:t xml:space="preserve">At every time step, for each run of each simulation, we used a function released by Skeels et al.</w:t>
       </w:r>
       <w:r>
-        <w:t xml:space="preserve"> </w:t>
-      </w:r>
-      <w:r>
-        <w:t xml:space="preserve">[29]</w:t>
+        <w:rPr>
+          <w:vertAlign w:val="superscript"/>
+        </w:rPr>
+        <w:t xml:space="preserve">29</w:t>
       </w:r>
       <w:r>
         <w:t xml:space="preserve"> </w:t>
@@ -1936,7 +1910,7 @@
         </m:sSub>
       </m:oMath>
       <w:r>
-        <w:t xml:space="preserve">). First, we assessed the exchange success, a binary variable set to one if at least one pixel of the area to colonise (let’s call it</w:t>
+        <w:t xml:space="preserve">). First, we assessed the exchange success, a binary variable set to one if at least one pixel of the area to colonise (hereafter called</w:t>
       </w:r>
       <w:r>
         <w:t xml:space="preserve"> </w:t>
@@ -1989,69 +1963,7 @@
         <w:t xml:space="preserve">g</w:t>
       </w:r>
       <w:r>
-        <w:t xml:space="preserve">., South America if the simulation started in North America) recorded a presence. Then, in the case of a successful exchange, we quantified the proportion of</w:t>
-      </w:r>
-      <w:r>
-        <w:t xml:space="preserve"> </w:t>
-      </w:r>
-      <m:oMath>
-        <m:sSub>
-          <m:e>
-            <m:r>
-              <m:rPr>
-                <m:sty m:val="p"/>
-                <m:scr m:val="script"/>
-              </m:rPr>
-              <m:t>A</m:t>
-            </m:r>
-          </m:e>
-          <m:sub>
-            <m:r>
-              <m:t>c</m:t>
-            </m:r>
-            <m:r>
-              <m:t>o</m:t>
-            </m:r>
-            <m:r>
-              <m:t>l</m:t>
-            </m:r>
-          </m:sub>
-        </m:sSub>
-      </m:oMath>
-      <w:r>
-        <w:t xml:space="preserve"> </w:t>
-      </w:r>
-      <w:r>
-        <w:t xml:space="preserve">actually colonised at</w:t>
-      </w:r>
-      <w:r>
-        <w:t xml:space="preserve"> </w:t>
-      </w:r>
-      <m:oMath>
-        <m:sSub>
-          <m:e>
-            <m:r>
-              <m:t>t</m:t>
-            </m:r>
-          </m:e>
-          <m:sub>
-            <m:r>
-              <m:t>e</m:t>
-            </m:r>
-            <m:r>
-              <m:t>n</m:t>
-            </m:r>
-            <m:r>
-              <m:t>d</m:t>
-            </m:r>
-          </m:sub>
-        </m:sSub>
-      </m:oMath>
-      <w:r>
-        <w:t xml:space="preserve"> </w:t>
-      </w:r>
-      <w:r>
-        <w:t xml:space="preserve">as the ratio between the number of cells occupied by the colonisers and the total number of available cells (</w:t>
+        <w:t xml:space="preserve">., South America if the simulation started in North America) recorded a presence. Then, we recorded the biome in which the initial ancestor occurs (</w:t>
       </w:r>
       <w:r>
         <w:rPr>
@@ -2071,104 +1983,7 @@
         <w:t xml:space="preserve">e</w:t>
       </w:r>
       <w:r>
-        <w:t xml:space="preserve">., surface of</w:t>
-      </w:r>
-      <w:r>
-        <w:t xml:space="preserve"> </w:t>
-      </w:r>
-      <m:oMath>
-        <m:sSub>
-          <m:e>
-            <m:r>
-              <m:rPr>
-                <m:sty m:val="p"/>
-                <m:scr m:val="script"/>
-              </m:rPr>
-              <m:t>A</m:t>
-            </m:r>
-          </m:e>
-          <m:sub>
-            <m:r>
-              <m:t>c</m:t>
-            </m:r>
-            <m:r>
-              <m:t>o</m:t>
-            </m:r>
-            <m:r>
-              <m:t>l</m:t>
-            </m:r>
-          </m:sub>
-        </m:sSub>
-      </m:oMath>
-      <w:r>
-        <w:t xml:space="preserve">). We also quantified the number of virtual taxa recorded in</w:t>
-      </w:r>
-      <w:r>
-        <w:t xml:space="preserve"> </w:t>
-      </w:r>
-      <m:oMath>
-        <m:sSub>
-          <m:e>
-            <m:r>
-              <m:rPr>
-                <m:sty m:val="p"/>
-                <m:scr m:val="script"/>
-              </m:rPr>
-              <m:t>A</m:t>
-            </m:r>
-          </m:e>
-          <m:sub>
-            <m:r>
-              <m:t>c</m:t>
-            </m:r>
-            <m:r>
-              <m:t>o</m:t>
-            </m:r>
-            <m:r>
-              <m:t>l</m:t>
-            </m:r>
-          </m:sub>
-        </m:sSub>
-      </m:oMath>
-      <w:r>
-        <w:t xml:space="preserve"> </w:t>
-      </w:r>
-      <w:r>
-        <w:t xml:space="preserve">at</w:t>
-      </w:r>
-      <w:r>
-        <w:t xml:space="preserve"> </w:t>
-      </w:r>
-      <m:oMath>
-        <m:sSub>
-          <m:e>
-            <m:r>
-              <m:t>t</m:t>
-            </m:r>
-          </m:e>
-          <m:sub>
-            <m:r>
-              <m:t>e</m:t>
-            </m:r>
-            <m:r>
-              <m:t>n</m:t>
-            </m:r>
-            <m:r>
-              <m:t>d</m:t>
-            </m:r>
-          </m:sub>
-        </m:sSub>
-      </m:oMath>
-      <w:r>
-        <w:t xml:space="preserve">.</w:t>
-      </w:r>
-    </w:p>
-    <w:p>
-      <w:pPr>
-        <w:pStyle w:val="BodyText"/>
-      </w:pPr>
-      <w:r>
-        <w:t xml:space="preserve">Additionnally, we also evaluated the distance of the initial ancestor to a point arbitrarily located on the zone of the isthmus of Panama, (</w:t>
+        <w:t xml:space="preserve">., Tropical, Arid, Temperate, Cold, Polar) as well as the distance of this initial ancestor to a point arbitrarily located on the zone of the isthmus of Panama, (</w:t>
       </w:r>
       <m:oMath>
         <m:r>
@@ -2205,12 +2020,186 @@
         </m:r>
       </m:oMath>
       <w:r>
-        <w:t xml:space="preserve">lat).</w:t>
-      </w:r>
-    </w:p>
-    <w:bookmarkEnd w:id="32"/>
-    <w:bookmarkEnd w:id="33"/>
-    <w:bookmarkStart w:id="41" w:name="results"/>
+        <w:t xml:space="preserve">lat). Last, in the case of a successful exchange, we quantified the number of virtual taxa recorded in</w:t>
+      </w:r>
+      <w:r>
+        <w:t xml:space="preserve"> </w:t>
+      </w:r>
+      <m:oMath>
+        <m:sSub>
+          <m:e>
+            <m:r>
+              <m:rPr>
+                <m:sty m:val="p"/>
+                <m:scr m:val="script"/>
+              </m:rPr>
+              <m:t>A</m:t>
+            </m:r>
+          </m:e>
+          <m:sub>
+            <m:r>
+              <m:t>c</m:t>
+            </m:r>
+            <m:r>
+              <m:t>o</m:t>
+            </m:r>
+            <m:r>
+              <m:t>l</m:t>
+            </m:r>
+          </m:sub>
+        </m:sSub>
+      </m:oMath>
+      <w:r>
+        <w:t xml:space="preserve"> </w:t>
+      </w:r>
+      <w:r>
+        <w:t xml:space="preserve">at</w:t>
+      </w:r>
+      <w:r>
+        <w:t xml:space="preserve"> </w:t>
+      </w:r>
+      <m:oMath>
+        <m:sSub>
+          <m:e>
+            <m:r>
+              <m:t>t</m:t>
+            </m:r>
+          </m:e>
+          <m:sub>
+            <m:r>
+              <m:t>e</m:t>
+            </m:r>
+            <m:r>
+              <m:t>n</m:t>
+            </m:r>
+            <m:r>
+              <m:t>d</m:t>
+            </m:r>
+          </m:sub>
+        </m:sSub>
+      </m:oMath>
+      <w:r>
+        <w:t xml:space="preserve"> </w:t>
+      </w:r>
+      <w:r>
+        <w:t xml:space="preserve">and the proportion of</w:t>
+      </w:r>
+      <w:r>
+        <w:t xml:space="preserve"> </w:t>
+      </w:r>
+      <m:oMath>
+        <m:sSub>
+          <m:e>
+            <m:r>
+              <m:rPr>
+                <m:sty m:val="p"/>
+                <m:scr m:val="script"/>
+              </m:rPr>
+              <m:t>A</m:t>
+            </m:r>
+          </m:e>
+          <m:sub>
+            <m:r>
+              <m:t>c</m:t>
+            </m:r>
+            <m:r>
+              <m:t>o</m:t>
+            </m:r>
+            <m:r>
+              <m:t>l</m:t>
+            </m:r>
+          </m:sub>
+        </m:sSub>
+      </m:oMath>
+      <w:r>
+        <w:t xml:space="preserve"> </w:t>
+      </w:r>
+      <w:r>
+        <w:t xml:space="preserve">actually colonised at</w:t>
+      </w:r>
+      <w:r>
+        <w:t xml:space="preserve"> </w:t>
+      </w:r>
+      <m:oMath>
+        <m:sSub>
+          <m:e>
+            <m:r>
+              <m:t>t</m:t>
+            </m:r>
+          </m:e>
+          <m:sub>
+            <m:r>
+              <m:t>e</m:t>
+            </m:r>
+            <m:r>
+              <m:t>n</m:t>
+            </m:r>
+            <m:r>
+              <m:t>d</m:t>
+            </m:r>
+          </m:sub>
+        </m:sSub>
+      </m:oMath>
+      <w:r>
+        <w:t xml:space="preserve"> </w:t>
+      </w:r>
+      <w:r>
+        <w:t xml:space="preserve">as the ratio between the number of cells occupied by the colonisers and the total number of available cells (</w:t>
+      </w:r>
+      <w:r>
+        <w:rPr>
+          <w:i/>
+          <w:iCs/>
+        </w:rPr>
+        <w:t xml:space="preserve">i</w:t>
+      </w:r>
+      <w:r>
+        <w:t xml:space="preserve">.</w:t>
+      </w:r>
+      <w:r>
+        <w:rPr>
+          <w:i/>
+          <w:iCs/>
+        </w:rPr>
+        <w:t xml:space="preserve">e</w:t>
+      </w:r>
+      <w:r>
+        <w:t xml:space="preserve">., surface of</w:t>
+      </w:r>
+      <w:r>
+        <w:t xml:space="preserve"> </w:t>
+      </w:r>
+      <m:oMath>
+        <m:sSub>
+          <m:e>
+            <m:r>
+              <m:rPr>
+                <m:sty m:val="p"/>
+                <m:scr m:val="script"/>
+              </m:rPr>
+              <m:t>A</m:t>
+            </m:r>
+          </m:e>
+          <m:sub>
+            <m:r>
+              <m:t>c</m:t>
+            </m:r>
+            <m:r>
+              <m:t>o</m:t>
+            </m:r>
+            <m:r>
+              <m:t>l</m:t>
+            </m:r>
+          </m:sub>
+        </m:sSub>
+      </m:oMath>
+      <w:r>
+        <w:t xml:space="preserve">).</w:t>
+      </w:r>
+    </w:p>
+    <w:bookmarkEnd w:id="29"/>
+    <w:bookmarkEnd w:id="30"/>
+    <w:bookmarkStart w:id="38" w:name="results"/>
     <w:p>
       <w:pPr>
         <w:pStyle w:val="Heading1"/>
@@ -2219,13 +2208,13 @@
         <w:t xml:space="preserve">Results</w:t>
       </w:r>
     </w:p>
-    <w:bookmarkStart w:id="38" w:name="X46091cfcf02b26afcadcbdab517ba968c60939b"/>
+    <w:bookmarkStart w:id="35" w:name="Xed4bd03a92b5751ca77f2e414fb8e8b12710b4e"/>
     <w:p>
       <w:pPr>
         <w:pStyle w:val="Heading2"/>
       </w:pPr>
       <w:r>
-        <w:t xml:space="preserve">Climate makes it easier to reach North America from South America than the other way round</w:t>
+        <w:t xml:space="preserve">Climate makes it easier to reach North America from South America than the other way around</w:t>
       </w:r>
     </w:p>
     <w:p>
@@ -2233,10 +2222,52 @@
         <w:pStyle w:val="FirstParagraph"/>
       </w:pPr>
       <w:r>
-        <w:t xml:space="preserve">Unexpectedly, our simulation-based framework suggests that the proportion of simulations successfully reaching the other continent is always higher when starting from South America than from North America (Fig X). This imbalance, strikingly going against our expectations, is maintained whether we allowed species climatic niche to evolve following climatic change (44% vs. 87%, model M1) or not (29% vs 59%, model M0,</w:t>
-      </w:r>
-      <w:r>
-        <w:t xml:space="preserve"> </w:t>
+        <w:t xml:space="preserve">The contribution of palaeoclimate in the biogeographic asymmetry of the Great American Biotic Interchange (GABI) was tested in a simulation-based framework relying on gen3sis v1.5.11, a mechanistic eco-evolutionary simulator</w:t>
+      </w:r>
+      <w:r>
+        <w:rPr>
+          <w:vertAlign w:val="superscript"/>
+        </w:rPr>
+        <w:t xml:space="preserve">27</w:t>
+      </w:r>
+      <w:r>
+        <w:t xml:space="preserve"> </w:t>
+      </w:r>
+      <w:r>
+        <w:t xml:space="preserve">and palaeoclimatic layers (annual temperature and precipitation) covering the last 5 million years generated by the PALEO-PGEM emulator</w:t>
+      </w:r>
+      <w:r>
+        <w:rPr>
+          <w:vertAlign w:val="superscript"/>
+        </w:rPr>
+        <w:t xml:space="preserve">33,34</w:t>
+      </w:r>
+      <w:r>
+        <w:t xml:space="preserve">. Each set of simulations tracked the radiation of a clade either originating in North or in South America. Climate was the only ecological constraint limiting virtual species’ biogeography. We further compared the ability of virtual species to colonise the continent where they did not originate between the two initial conditions. For additional details, please refer to the</w:t>
+      </w:r>
+      <w:r>
+        <w:t xml:space="preserve"> </w:t>
+      </w:r>
+      <w:r>
+        <w:rPr>
+          <w:i/>
+          <w:iCs/>
+        </w:rPr>
+        <w:t xml:space="preserve">Star Methods</w:t>
+      </w:r>
+      <w:r>
+        <w:t xml:space="preserve"> </w:t>
+      </w:r>
+      <w:r>
+        <w:t xml:space="preserve">section.</w:t>
+      </w:r>
+    </w:p>
+    <w:p>
+      <w:pPr>
+        <w:pStyle w:val="BodyText"/>
+      </w:pPr>
+      <w:r>
+        <w:t xml:space="preserve">Our results suggest that the proportion of simulations successfully reaching the other continent is always higher when starting from South America than from North America (</w:t>
       </w:r>
       <w:hyperlink w:anchor="fig-2">
         <w:r>
@@ -2247,7 +2278,86 @@
         </w:r>
       </w:hyperlink>
       <w:r>
-        <w:t xml:space="preserve">). That being said, it has to be noticed that there the proportion of simulations resulting in no living representative (=crash) was on average twice higher for simulations starting in North America.</w:t>
+        <w:t xml:space="preserve"> </w:t>
+      </w:r>
+      <w:r>
+        <w:t xml:space="preserve">A). This imbalance, strikingly going against our expectations, is maintained whether we allow species climatic niche to evolve following climatic change (44% vs. 87%, model</w:t>
+      </w:r>
+      <w:r>
+        <w:t xml:space="preserve"> </w:t>
+      </w:r>
+      <m:oMath>
+        <m:r>
+          <m:t>M</m:t>
+        </m:r>
+        <m:r>
+          <m:t>1</m:t>
+        </m:r>
+      </m:oMath>
+      <w:r>
+        <w:t xml:space="preserve">) or not (29% vs 59%,</w:t>
+      </w:r>
+      <w:r>
+        <w:t xml:space="preserve"> </w:t>
+      </w:r>
+      <m:oMath>
+        <m:r>
+          <m:t>M</m:t>
+        </m:r>
+        <m:r>
+          <m:t>0</m:t>
+        </m:r>
+      </m:oMath>
+      <w:r>
+        <w:t xml:space="preserve">). Amputation of either the temperature (47% vs. 88%,</w:t>
+      </w:r>
+      <w:r>
+        <w:t xml:space="preserve"> </w:t>
+      </w:r>
+      <m:oMath>
+        <m:r>
+          <m:t>M</m:t>
+        </m:r>
+        <m:r>
+          <m:t>2</m:t>
+        </m:r>
+      </m:oMath>
+      <w:r>
+        <w:t xml:space="preserve">) or the precipitation (38% vs. 89%,</w:t>
+      </w:r>
+      <w:r>
+        <w:t xml:space="preserve"> </w:t>
+      </w:r>
+      <m:oMath>
+        <m:r>
+          <m:t>M</m:t>
+        </m:r>
+        <m:r>
+          <m:t>3</m:t>
+        </m:r>
+      </m:oMath>
+      <w:r>
+        <w:t xml:space="preserve">) compound of the climatic niche does not seem to alter the pattern.</w:t>
+      </w:r>
+      <w:r>
+        <w:t xml:space="preserve"> </w:t>
+      </w:r>
+      <w:r>
+        <w:t xml:space="preserve">That being said, the proportion of simulations resulting in no living representative (=crash) was on average twice higher for simulations starting in North America, except for model</w:t>
+      </w:r>
+      <w:r>
+        <w:t xml:space="preserve"> </w:t>
+      </w:r>
+      <m:oMath>
+        <m:r>
+          <m:t>M</m:t>
+        </m:r>
+        <m:r>
+          <m:t>3</m:t>
+        </m:r>
+      </m:oMath>
+      <w:r>
+        <w:t xml:space="preserve">.</w:t>
       </w:r>
     </w:p>
     <w:tbl>
@@ -2263,29 +2373,29 @@
       <w:tr>
         <w:tc>
           <w:tcPr/>
-          <w:bookmarkStart w:id="37" w:name="fig-2"/>
+          <w:bookmarkStart w:id="34" w:name="fig-2"/>
           <w:p>
             <w:pPr>
               <w:pStyle w:val="Compact"/>
-              <w:jc w:val="center"/>
+              <w:jc w:val="left"/>
             </w:pPr>
             <w:r>
               <w:drawing>
                 <wp:inline>
-                  <wp:extent cx="5943600" cy="2796378"/>
+                  <wp:extent cx="5521510" cy="7258717"/>
                   <wp:effectExtent b="0" l="0" r="0" t="0"/>
-                  <wp:docPr descr="" title="" id="35" name="Picture"/>
+                  <wp:docPr descr="" title="" id="32" name="Picture"/>
                   <a:graphic>
                     <a:graphicData uri="http://schemas.openxmlformats.org/drawingml/2006/picture">
                       <pic:pic>
                         <pic:nvPicPr>
-                          <pic:cNvPr descr="../Figures/prop_successful_exch/succ_exch_panel.png" id="36" name="Picture"/>
+                          <pic:cNvPr descr="../Figures/MS/Main/Figure2/Figure2.png" id="33" name="Picture"/>
                           <pic:cNvPicPr>
                             <a:picLocks noChangeArrowheads="1" noChangeAspect="1"/>
                           </pic:cNvPicPr>
                         </pic:nvPicPr>
                         <pic:blipFill>
-                          <a:blip r:embed="rId34"/>
+                          <a:blip r:embed="rId31"/>
                           <a:stretch>
                             <a:fillRect/>
                           </a:stretch>
@@ -2293,7 +2403,7 @@
                         <pic:spPr bwMode="auto">
                           <a:xfrm>
                             <a:off x="0" y="0"/>
-                            <a:ext cx="5943600" cy="2796378"/>
+                            <a:ext cx="5521510" cy="7258717"/>
                           </a:xfrm>
                           <a:prstGeom prst="rect">
                             <a:avLst/>
@@ -2314,7 +2424,7 @@
           </w:p>
           <w:p>
             <w:pPr>
-              <w:jc w:val="center"/>
+              <w:jc w:val="left"/>
             </w:pPr>
             <w:pPr>
               <w:jc w:val="start"/>
@@ -2322,188 +2432,433 @@
               <w:pStyle w:val="ImageCaption"/>
             </w:pPr>
             <w:r>
-              <w:t xml:space="preserve">Figure 2: Proportion of successful exchange to the other continent, either starting from North (red) or South (blue) America.</w:t>
+              <w:t xml:space="preserve">Figure 2: A few metrics summarising climate-mediated interchange. From left to right are depicted the results of the zero-adaptationist model (</w:t>
+            </w:r>
+            <m:oMath>
+              <m:r>
+                <m:t>M</m:t>
+              </m:r>
+              <m:r>
+                <m:t>0</m:t>
+              </m:r>
+            </m:oMath>
+            <w:r>
+              <w:t xml:space="preserve">, species climatic niche does not change through time – climate specialists), full adaptationist model (</w:t>
+            </w:r>
+            <m:oMath>
+              <m:r>
+                <m:t>M</m:t>
+              </m:r>
+              <m:r>
+                <m:t>1</m:t>
+              </m:r>
+            </m:oMath>
+            <w:r>
+              <w:t xml:space="preserve">, species climatic niche evolves following local environmental conditions – climate generalists) and alternative versions of</w:t>
+            </w:r>
+            <w:r>
+              <w:t xml:space="preserve"> </w:t>
+            </w:r>
+            <m:oMath>
+              <m:r>
+                <m:t>M</m:t>
+              </m:r>
+              <m:r>
+                <m:t>1</m:t>
+              </m:r>
+            </m:oMath>
+            <w:r>
+              <w:t xml:space="preserve"> </w:t>
+            </w:r>
+            <w:r>
+              <w:t xml:space="preserve">where species ecological niche is only determined by precipitation (</w:t>
+            </w:r>
+            <m:oMath>
+              <m:r>
+                <m:t>M</m:t>
+              </m:r>
+              <m:r>
+                <m:t>2</m:t>
+              </m:r>
+            </m:oMath>
+            <w:r>
+              <w:t xml:space="preserve">) or temperature (</w:t>
+            </w:r>
+            <m:oMath>
+              <m:r>
+                <m:t>M</m:t>
+              </m:r>
+              <m:r>
+                <m:t>3</m:t>
+              </m:r>
+            </m:oMath>
+            <w:r>
+              <w:t xml:space="preserve">). Each individual plot shows the outcome of simulations starting in North (red) and South (cyan) America.</w:t>
+            </w:r>
+            <w:r>
+              <w:t xml:space="preserve"> </w:t>
+            </w:r>
+            <w:r>
+              <w:rPr>
+                <w:b/>
+                <w:bCs/>
+              </w:rPr>
+              <w:t xml:space="preserve">(A)</w:t>
+            </w:r>
+            <w:r>
+              <w:t xml:space="preserve"> </w:t>
+            </w:r>
+            <w:r>
+              <w:t xml:space="preserve">Proportion of simulations leading to a successful exchange to the other continent.</w:t>
+            </w:r>
+            <w:r>
+              <w:t xml:space="preserve"> </w:t>
+            </w:r>
+            <w:r>
+              <w:rPr>
+                <w:b/>
+                <w:bCs/>
+              </w:rPr>
+              <w:t xml:space="preserve">(B)</w:t>
+            </w:r>
+            <w:r>
+              <w:t xml:space="preserve"> </w:t>
+            </w:r>
+            <w:r>
+              <w:t xml:space="preserve">Proportion of colonised area.</w:t>
+            </w:r>
+            <w:r>
+              <w:t xml:space="preserve"> </w:t>
+            </w:r>
+            <w:r>
+              <w:rPr>
+                <w:b/>
+                <w:bCs/>
+              </w:rPr>
+              <w:t xml:space="preserve">(C)</w:t>
+            </w:r>
+            <w:r>
+              <w:t xml:space="preserve"> </w:t>
+            </w:r>
+            <w:r>
+              <w:t xml:space="preserve">Distance to the isthmus. The last two metrics have been computed out of successful simulations,</w:t>
+            </w:r>
+            <w:r>
+              <w:t xml:space="preserve"> </w:t>
+            </w:r>
+            <w:r>
+              <w:rPr>
+                <w:i/>
+                <w:iCs/>
+              </w:rPr>
+              <w:t xml:space="preserve">i</w:t>
+            </w:r>
+            <w:r>
+              <w:t xml:space="preserve">.</w:t>
+            </w:r>
+            <w:r>
+              <w:rPr>
+                <w:i/>
+                <w:iCs/>
+              </w:rPr>
+              <w:t xml:space="preserve">e</w:t>
+            </w:r>
+            <w:r>
+              <w:t xml:space="preserve">., that resulted in a transcontinental faunal exchange.</w:t>
             </w:r>
           </w:p>
-          <w:bookmarkEnd w:id="37"/>
+          <w:bookmarkEnd w:id="34"/>
         </w:tc>
       </w:tr>
     </w:tbl>
+    <w:bookmarkEnd w:id="35"/>
+    <w:bookmarkStart w:id="36" w:name="success-on-the-foreign-continent"/>
+    <w:p>
+      <w:pPr>
+        <w:pStyle w:val="Heading2"/>
+      </w:pPr>
+      <w:r>
+        <w:t xml:space="preserve">Success on the foreign continent</w:t>
+      </w:r>
+    </w:p>
+    <w:p>
+      <w:pPr>
+        <w:pStyle w:val="FirstParagraph"/>
+      </w:pPr>
+      <w:r>
+        <w:t xml:space="preserve">Our findings reveal that successful simulations starting from North America result in a higher proportion of colonised area, except for the</w:t>
+      </w:r>
+      <w:r>
+        <w:t xml:space="preserve"> </w:t>
+      </w:r>
+      <m:oMath>
+        <m:r>
+          <m:t>M</m:t>
+        </m:r>
+        <m:r>
+          <m:t>3</m:t>
+        </m:r>
+      </m:oMath>
+      <w:r>
+        <w:t xml:space="preserve"> </w:t>
+      </w:r>
+      <w:r>
+        <w:t xml:space="preserve">model, relaxing the precipitation constraint on virtual species’ niche (</w:t>
+      </w:r>
+      <w:hyperlink w:anchor="fig-2">
+        <w:r>
+          <w:rPr>
+            <w:rStyle w:val="Hyperlink"/>
+          </w:rPr>
+          <w:t xml:space="preserve">Figure 2</w:t>
+        </w:r>
+      </w:hyperlink>
+      <w:r>
+        <w:t xml:space="preserve"> </w:t>
+      </w:r>
+      <w:r>
+        <w:t xml:space="preserve">B). In addition, successful simulations starting from North America generally started from an ancestor located closer to the isthmus than those starting from South America (</w:t>
+      </w:r>
+      <w:hyperlink w:anchor="fig-2">
+        <w:r>
+          <w:rPr>
+            <w:rStyle w:val="Hyperlink"/>
+          </w:rPr>
+          <w:t xml:space="preserve">Figure 2</w:t>
+        </w:r>
+      </w:hyperlink>
+      <w:r>
+        <w:t xml:space="preserve"> </w:t>
+      </w:r>
+      <w:r>
+        <w:t xml:space="preserve">C), again except for simulation generated under</w:t>
+      </w:r>
+      <w:r>
+        <w:t xml:space="preserve"> </w:t>
+      </w:r>
+      <m:oMath>
+        <m:r>
+          <m:t>M</m:t>
+        </m:r>
+        <m:r>
+          <m:t>3</m:t>
+        </m:r>
+      </m:oMath>
+      <w:r>
+        <w:t xml:space="preserve">. Also, we can highlight a general trend that the ancestral species originated closer to the isthmus in the case of successful simulations compared to unsuccessful ones (Supp. Figure 3-4).</w:t>
+      </w:r>
+    </w:p>
     <w:p>
       <w:pPr>
         <w:pStyle w:val="BodyText"/>
       </w:pPr>
+      <w:r>
+        <w:t xml:space="preserve">Last, no difference in the diversity reached on the colonised area could be characterised between simulations based on their area of origin (Supp. Figure 1).</w:t>
+      </w:r>
+    </w:p>
+    <w:bookmarkEnd w:id="36"/>
+    <w:bookmarkStart w:id="37" w:name="biome"/>
+    <w:p>
+      <w:pPr>
+        <w:pStyle w:val="Heading2"/>
+      </w:pPr>
+      <w:r>
+        <w:t xml:space="preserve">Biome</w:t>
+      </w:r>
+    </w:p>
+    <w:p>
+      <w:r>
+        <w:br w:type="page"/>
+      </w:r>
+    </w:p>
+    <w:bookmarkEnd w:id="37"/>
+    <w:bookmarkEnd w:id="38"/>
+    <w:bookmarkStart w:id="42" w:name="discussion"/>
+    <w:p>
+      <w:pPr>
+        <w:pStyle w:val="Heading1"/>
+      </w:pPr>
+      <w:r>
+        <w:t xml:space="preserve">Discussion</w:t>
+      </w:r>
+    </w:p>
+    <w:p>
+      <w:pPr>
+        <w:pStyle w:val="FirstParagraph"/>
+      </w:pPr>
+      <w:r>
+        <w:t xml:space="preserve">Smoothing asymmetry =&gt; echo to birds</w:t>
+      </w:r>
+      <w:r>
+        <w:rPr>
+          <w:vertAlign w:val="superscript"/>
+        </w:rPr>
+        <w:t xml:space="preserve">37</w:t>
+      </w:r>
+      <w:r>
+        <w:t xml:space="preserve">, flying behaviour relaxing constraints applied to land mammals ?</w:t>
+      </w:r>
+    </w:p>
+    <w:p>
+      <w:pPr>
+        <w:pStyle w:val="BodyText"/>
+      </w:pPr>
+      <w:r>
+        <w:t xml:space="preserve">Species pool proved relevant in the case of the interchange along the Wallacea</w:t>
+      </w:r>
+      <w:r>
+        <w:rPr>
+          <w:vertAlign w:val="superscript"/>
+        </w:rPr>
+        <w:t xml:space="preserve">31</w:t>
+      </w:r>
+      <w:r>
+        <w:t xml:space="preserve">. But here, we expect to find more species in South America, encompassing one of earth’s major and long-standing biodiversity hotspot – Amazonia</w:t>
+      </w:r>
+      <w:r>
+        <w:rPr>
+          <w:vertAlign w:val="superscript"/>
+        </w:rPr>
+        <w:t xml:space="preserve">38</w:t>
+      </w:r>
+      <w:r>
+        <w:t xml:space="preserve"> </w:t>
+      </w:r>
+      <w:r>
+        <w:t xml:space="preserve">– than in North America, though see Vrba.</w:t>
+      </w:r>
+    </w:p>
+    <w:bookmarkStart w:id="39" w:name="climate"/>
+    <w:p>
+      <w:pPr>
+        <w:pStyle w:val="Heading2"/>
+      </w:pPr>
+      <w:r>
+        <w:t xml:space="preserve">Climate</w:t>
+      </w:r>
+    </w:p>
+    <w:p>
+      <w:pPr>
+        <w:pStyle w:val="FirstParagraph"/>
+      </w:pPr>
+      <w:r>
+        <w:t xml:space="preserve">One of the predictions of Vrba’s ressource-use hypotheses formulated in the framework of the habitat theory</w:t>
+      </w:r>
+      <w:r>
+        <w:rPr>
+          <w:vertAlign w:val="superscript"/>
+        </w:rPr>
+        <w:t xml:space="preserve">20</w:t>
+      </w:r>
+      <w:r>
+        <w:t xml:space="preserve"> </w:t>
+      </w:r>
+      <w:r>
+        <w:t xml:space="preserve">applied to the GABI is that tropical specialists, in the aftermath of the global cooling occurring in the Plio-Pleistocene boundary, would have naturally been attracted towards the equator, in turn actively promoting some North American mammal’s establishment in South America. On the other hand, fewer mammals – only biome generalists or open-habitat specialists – from South America are expected to roam the other way round. Our virtual experiments partially corroborate with these predictions, in the sense that tropical-adapted taxa of North American origin have a higher prevalence of crossing the isthmus than species belonging to other biomes (Figure X [biomes], model M0).</w:t>
+      </w:r>
+    </w:p>
+    <w:p>
+      <w:pPr>
+        <w:pStyle w:val="BodyText"/>
+      </w:pPr>
+      <w:r>
+        <w:t xml:space="preserve">Success in South America for temperate-adapted species, posited as the most successful, not recovered, with tropical meeting the gighest success</w:t>
+      </w:r>
+    </w:p>
+    <w:p>
+      <w:pPr>
+        <w:pStyle w:val="BodyText"/>
+      </w:pPr>
+      <w:r>
+        <w:t xml:space="preserve">Precipitation niche</w:t>
+      </w:r>
+      <w:r>
+        <w:rPr>
+          <w:vertAlign w:val="superscript"/>
+        </w:rPr>
+        <w:t xml:space="preserve">29</w:t>
+      </w:r>
+      <w:r>
+        <w:t xml:space="preserve">.</w:t>
+      </w:r>
+      <w:r>
+        <w:t xml:space="preserve"> </w:t>
+      </w:r>
+      <w:r>
+        <w:t xml:space="preserve">Result of Figure 2C for</w:t>
+      </w:r>
+      <w:r>
+        <w:t xml:space="preserve"> </w:t>
+      </w:r>
+      <m:oMath>
+        <m:r>
+          <m:t>M</m:t>
+        </m:r>
+        <m:r>
+          <m:t>3</m:t>
+        </m:r>
+      </m:oMath>
+      <w:r>
+        <w:t xml:space="preserve"> </w:t>
+      </w:r>
+      <w:r>
+        <w:t xml:space="preserve">can be related to tropical biome</w:t>
+      </w:r>
+    </w:p>
+    <w:p>
+      <w:pPr>
+        <w:pStyle w:val="BodyText"/>
+      </w:pPr>
+      <w:r>
+        <w:t xml:space="preserve">Tropical Niche Conservatism</w:t>
+      </w:r>
+    </w:p>
+    <w:bookmarkEnd w:id="39"/>
+    <w:bookmarkStart w:id="40" w:name="on-the-effect-of-geography"/>
+    <w:p>
+      <w:pPr>
+        <w:pStyle w:val="Heading2"/>
+      </w:pPr>
+      <w:r>
+        <w:t xml:space="preserve">On the effect of geography</w:t>
+      </w:r>
+    </w:p>
+    <w:p>
+      <w:pPr>
+        <w:pStyle w:val="FirstParagraph"/>
+      </w:pPr>
+      <w:r>
+        <w:t xml:space="preserve">One consistent pattern, however, is the fact that the prevalence of an intercontinental interchange gets higher as the ancestral species’ coordinates get closer to the isthmus, which mirrors the results of Motta &amp; Quental</w:t>
+      </w:r>
+      <w:r>
+        <w:rPr>
+          <w:vertAlign w:val="superscript"/>
+        </w:rPr>
+        <w:t xml:space="preserve">39</w:t>
+      </w:r>
+    </w:p>
+    <w:p>
+      <w:pPr>
+        <w:pStyle w:val="BodyText"/>
+      </w:pPr>
+      <w:r>
+        <w:t xml:space="preserve">Is it just about</w:t>
+      </w:r>
+      <w:r>
+        <w:t xml:space="preserve"> </w:t>
+      </w:r>
       <w:r>
         <w:rPr>
           <w:b/>
           <w:bCs/>
         </w:rPr>
-        <w:t xml:space="preserve">Biome here?</w:t>
-      </w:r>
-    </w:p>
-    <w:bookmarkEnd w:id="38"/>
-    <w:bookmarkStart w:id="39" w:name="success-on-the-foreign-continent"/>
-    <w:p>
-      <w:pPr>
-        <w:pStyle w:val="Heading2"/>
-      </w:pPr>
-      <w:r>
-        <w:t xml:space="preserve">Success on the foreign continent</w:t>
-      </w:r>
-    </w:p>
-    <w:bookmarkEnd w:id="39"/>
-    <w:bookmarkStart w:id="40" w:name="X7a927ae912a5869e71832d686916bf60c91de1e"/>
-    <w:p>
-      <w:pPr>
-        <w:pStyle w:val="Heading2"/>
-      </w:pPr>
-      <w:r>
-        <w:t xml:space="preserve">Geographic features of the simulated interchange</w:t>
-      </w:r>
-    </w:p>
-    <w:p>
-      <w:r>
-        <w:br w:type="page"/>
-      </w:r>
-    </w:p>
-    <w:bookmarkEnd w:id="40"/>
-    <w:bookmarkEnd w:id="41"/>
-    <w:bookmarkStart w:id="45" w:name="discussion"/>
-    <w:p>
-      <w:pPr>
-        <w:pStyle w:val="Heading1"/>
-      </w:pPr>
-      <w:r>
-        <w:t xml:space="preserve">Discussion</w:t>
-      </w:r>
-    </w:p>
-    <w:p>
-      <w:pPr>
-        <w:pStyle w:val="FirstParagraph"/>
-      </w:pPr>
-      <w:r>
-        <w:t xml:space="preserve">Smoothing asymmetry =&gt; echo to birds</w:t>
-      </w:r>
-      <w:r>
-        <w:t xml:space="preserve"> </w:t>
-      </w:r>
-      <w:r>
-        <w:t xml:space="preserve">[37]</w:t>
-      </w:r>
-      <w:r>
-        <w:t xml:space="preserve">, flying behaviour relaxing constraints applied to land mammals ?</w:t>
-      </w:r>
-    </w:p>
-    <w:p>
-      <w:pPr>
-        <w:pStyle w:val="BodyText"/>
-      </w:pPr>
-      <w:r>
-        <w:t xml:space="preserve">Species pool proved relevant in the case of the interchange along the Wallacea</w:t>
-      </w:r>
-      <w:r>
-        <w:t xml:space="preserve"> </w:t>
-      </w:r>
-      <w:r>
-        <w:t xml:space="preserve">[31]</w:t>
-      </w:r>
-      <w:r>
-        <w:t xml:space="preserve">. But here, we expect to find more species in South America, encompassing one of earth’s major and long-standing biodiversity hotspot – Amazonia</w:t>
-      </w:r>
-      <w:r>
-        <w:t xml:space="preserve"> </w:t>
-      </w:r>
-      <w:r>
-        <w:t xml:space="preserve">[38]</w:t>
-      </w:r>
-      <w:r>
-        <w:t xml:space="preserve"> </w:t>
-      </w:r>
-      <w:r>
-        <w:t xml:space="preserve">– than in North America, though see Vrba.</w:t>
-      </w:r>
-    </w:p>
-    <w:bookmarkStart w:id="42" w:name="climate"/>
-    <w:p>
-      <w:pPr>
-        <w:pStyle w:val="Heading2"/>
-      </w:pPr>
-      <w:r>
-        <w:t xml:space="preserve">Climate</w:t>
-      </w:r>
-    </w:p>
-    <w:p>
-      <w:pPr>
-        <w:pStyle w:val="FirstParagraph"/>
-      </w:pPr>
-      <w:r>
-        <w:t xml:space="preserve">One of the predictions of Vrba’s ressource-use hypotheses formulated in the framework of the habitat theory</w:t>
-      </w:r>
-      <w:r>
-        <w:t xml:space="preserve"> </w:t>
-      </w:r>
-      <w:r>
-        <w:t xml:space="preserve">[20]</w:t>
-      </w:r>
-      <w:r>
-        <w:t xml:space="preserve"> </w:t>
-      </w:r>
-      <w:r>
-        <w:t xml:space="preserve">applied to the GABI is that tropical specialists, in the aftermath of the global cooling occurring in the Plio-Pleistocene boundary, would have naturally been attracted towards the equator, in turn actively promoting some North American mammal’s establishment in South America. On the other hand, fewer mammals – only biome generalists or open-habitat specialists – from South America are expected to roam the other way round. Our virtual experiments partially corroborate with these predictions, in the sense that tropical-adapted taxa of North American origin have a higher prevalence of crossing the isthmus than species belonging to other biomes (Figure X [biomes], model M0).</w:t>
-      </w:r>
-    </w:p>
-    <w:p>
-      <w:pPr>
-        <w:pStyle w:val="BodyText"/>
-      </w:pPr>
-      <w:r>
-        <w:t xml:space="preserve">Success in South America for temperate-adapted species, posited as the most successful, not recovered, with tropical meeting the gighest success</w:t>
-      </w:r>
-    </w:p>
-    <w:p>
-      <w:pPr>
-        <w:pStyle w:val="BodyText"/>
-      </w:pPr>
-      <w:r>
-        <w:t xml:space="preserve">Precipitation niche</w:t>
-      </w:r>
-      <w:r>
-        <w:t xml:space="preserve"> </w:t>
-      </w:r>
-      <w:r>
-        <w:t xml:space="preserve">[29]</w:t>
-      </w:r>
-    </w:p>
-    <w:bookmarkEnd w:id="42"/>
-    <w:bookmarkStart w:id="43" w:name="on-the-effect-of-geography"/>
-    <w:p>
-      <w:pPr>
-        <w:pStyle w:val="Heading2"/>
-      </w:pPr>
-      <w:r>
-        <w:t xml:space="preserve">On the effect of geography</w:t>
-      </w:r>
-    </w:p>
-    <w:p>
-      <w:pPr>
-        <w:pStyle w:val="FirstParagraph"/>
-      </w:pPr>
-      <w:r>
-        <w:t xml:space="preserve">One consistent pattern, however, is the fact that the prevalence of an intercontinental interchange gets higher as the ancestral species’ coordinates get closer to the isthmus, which mirrors the results of Motta &amp; Quental</w:t>
-      </w:r>
-      <w:r>
-        <w:t xml:space="preserve"> </w:t>
-      </w:r>
-      <w:r>
-        <w:t xml:space="preserve">[39]</w:t>
-      </w:r>
-    </w:p>
-    <w:p>
-      <w:pPr>
-        <w:pStyle w:val="BodyText"/>
-      </w:pPr>
-      <w:r>
-        <w:t xml:space="preserve">Is it just about</w:t>
+        <w:t xml:space="preserve">reaching</w:t>
+      </w:r>
+      <w:r>
+        <w:t xml:space="preserve"> </w:t>
+      </w:r>
+      <w:r>
+        <w:t xml:space="preserve">or more about</w:t>
       </w:r>
       <w:r>
         <w:t xml:space="preserve"> </w:t>
@@ -2513,22 +2868,6 @@
           <w:b/>
           <w:bCs/>
         </w:rPr>
-        <w:t xml:space="preserve">reaching</w:t>
-      </w:r>
-      <w:r>
-        <w:t xml:space="preserve"> </w:t>
-      </w:r>
-      <w:r>
-        <w:t xml:space="preserve">or more about</w:t>
-      </w:r>
-      <w:r>
-        <w:t xml:space="preserve"> </w:t>
-      </w:r>
-      <w:r>
-        <w:rPr>
-          <w:b/>
-          <w:bCs/>
-        </w:rPr>
         <w:t xml:space="preserve">reaching &amp; surviving</w:t>
       </w:r>
       <w:r>
@@ -2551,8 +2890,8 @@
         <w:t xml:space="preserve">Fortuitous experiment ?</w:t>
       </w:r>
     </w:p>
-    <w:bookmarkEnd w:id="43"/>
-    <w:bookmarkStart w:id="44" w:name="limitations-perspectives"/>
+    <w:bookmarkEnd w:id="40"/>
+    <w:bookmarkStart w:id="41" w:name="limitations-perspectives"/>
     <w:p>
       <w:pPr>
         <w:pStyle w:val="Heading2"/>
@@ -2566,7 +2905,7 @@
         <w:pStyle w:val="FirstParagraph"/>
       </w:pPr>
       <w:r>
-        <w:t xml:space="preserve">Maybe one of the most obvious caveats of our study stems from the assumption of fixed palaeogeography, particularly near the isthmus, whereas we know that this region changed across our study.</w:t>
+        <w:t xml:space="preserve">Assumption of fixed palaeogeography, particularly near the isthmus, whereas we know that this region changed across our study.</w:t>
       </w:r>
     </w:p>
     <w:p>
@@ -2574,197 +2913,231 @@
         <w:pStyle w:val="BodyText"/>
       </w:pPr>
       <w:r>
+        <w:t xml:space="preserve">spatial clustering of simulation crashing in temperate/cold North America =&gt; related to biome instability in the zone ?</w:t>
+      </w:r>
+    </w:p>
+    <w:p>
+      <w:pPr>
+        <w:pStyle w:val="BodyText"/>
+      </w:pPr>
+      <w:r>
         <w:t xml:space="preserve">Problem of taxonomic extinctions in Gen3sis!</w:t>
       </w:r>
     </w:p>
-    <w:bookmarkEnd w:id="44"/>
-    <w:bookmarkEnd w:id="45"/>
-    <w:bookmarkStart w:id="46" w:name="thrash"/>
-    <w:p>
-      <w:pPr>
-        <w:pStyle w:val="Heading1"/>
-      </w:pPr>
-      <w:r>
-        <w:t xml:space="preserve">Thrash</w:t>
-      </w:r>
-    </w:p>
-    <w:p>
-      <w:pPr>
-        <w:pStyle w:val="FirstParagraph"/>
-      </w:pPr>
-      <w:r>
-        <w:t xml:space="preserve">Throughout its evolutionary history, the biosphere has been repeatedly marked by the occurrence of geodispersal events, that is, exchanges of large species pools across landmasses</w:t>
-      </w:r>
-      <w:r>
-        <w:t xml:space="preserve"> </w:t>
-      </w:r>
-      <w:r>
-        <w:t xml:space="preserve">[41]</w:t>
-      </w:r>
-      <w:r>
-        <w:t xml:space="preserve">.</w:t>
-      </w:r>
-    </w:p>
     <w:p>
       <w:pPr>
         <w:pStyle w:val="BodyText"/>
       </w:pPr>
       <w:r>
-        <w:t xml:space="preserve">Competition involving clades of similar ecology appeared as a likely first-order explanation to the recent demise of South American endemic mammal clades such as native ungulates</w:t>
-      </w:r>
-      <w:r>
-        <w:t xml:space="preserve"> </w:t>
-      </w:r>
-      <w:r>
-        <w:t xml:space="preserve">[13]</w:t>
-      </w:r>
-      <w:r>
-        <w:t xml:space="preserve"> </w:t>
-      </w:r>
-      <w:r>
-        <w:t xml:space="preserve">or sparassodonts (metatherian predators,</w:t>
-      </w:r>
-      <w:r>
-        <w:t xml:space="preserve"> </w:t>
-      </w:r>
-      <w:r>
-        <w:t xml:space="preserve">[22,42]</w:t>
-      </w:r>
-      <w:r>
-        <w:t xml:space="preserve">) that followed the establishment of northern lineages</w:t>
-      </w:r>
-      <w:r>
-        <w:t xml:space="preserve"> </w:t>
-      </w:r>
-      <w:r>
-        <w:t xml:space="preserve">[15]</w:t>
-      </w:r>
-      <w:r>
-        <w:t xml:space="preserve">. This hypothesis mostly relied on striking morphological convergences between the clades assumed to have competed (</w:t>
+        <w:t xml:space="preserve">Timeline of the simulation (last 5Myrs). Some claim for an onset of the interchange further back in time, but we justify our choice as (1) most studies agree with an onset of significant mammal exchange</w:t>
+      </w:r>
+      <w:r>
+        <w:t xml:space="preserve"> </w:t>
       </w:r>
       <w:r>
         <w:rPr>
           <w:i/>
           <w:iCs/>
         </w:rPr>
-        <w:t xml:space="preserve">e</w:t>
+        <w:t xml:space="preserve">c.</w:t>
+      </w:r>
+      <w:r>
+        <w:t xml:space="preserve"> </w:t>
+      </w:r>
+      <w:r>
+        <w:t xml:space="preserve">3.5 Ma and (2) assumpltion of fixed palaeogeography.</w:t>
+      </w:r>
+    </w:p>
+    <w:bookmarkEnd w:id="41"/>
+    <w:bookmarkEnd w:id="42"/>
+    <w:bookmarkStart w:id="43" w:name="thrash"/>
+    <w:p>
+      <w:pPr>
+        <w:pStyle w:val="Heading1"/>
+      </w:pPr>
+      <w:r>
+        <w:t xml:space="preserve">Thrash</w:t>
+      </w:r>
+    </w:p>
+    <w:p>
+      <w:pPr>
+        <w:pStyle w:val="FirstParagraph"/>
+      </w:pPr>
+      <w:r>
+        <w:t xml:space="preserve">Throughout its evolutionary history, the biosphere has been repeatedly marked by the occurrence of geodispersal events, that is, exchanges of large species pools across landmasses</w:t>
+      </w:r>
+      <w:r>
+        <w:rPr>
+          <w:vertAlign w:val="superscript"/>
+        </w:rPr>
+        <w:t xml:space="preserve">41</w:t>
       </w:r>
       <w:r>
         <w:t xml:space="preserve">.</w:t>
+      </w:r>
+    </w:p>
+    <w:p>
+      <w:pPr>
+        <w:pStyle w:val="BodyText"/>
+      </w:pPr>
+      <w:r>
+        <w:t xml:space="preserve">Competition involving clades of similar ecology appeared as a likely first-order explanation to the recent demise of South American endemic mammal clades such as native ungulates</w:t>
+      </w:r>
+      <w:r>
+        <w:rPr>
+          <w:vertAlign w:val="superscript"/>
+        </w:rPr>
+        <w:t xml:space="preserve">13</w:t>
+      </w:r>
+      <w:r>
+        <w:t xml:space="preserve"> </w:t>
+      </w:r>
+      <w:r>
+        <w:t xml:space="preserve">or sparassodonts (metatherian predators,</w:t>
+      </w:r>
+      <w:r>
+        <w:rPr>
+          <w:vertAlign w:val="superscript"/>
+        </w:rPr>
+        <w:t xml:space="preserve">22,42</w:t>
+      </w:r>
+      <w:r>
+        <w:t xml:space="preserve">) that followed the establishment of northern lineages</w:t>
+      </w:r>
+      <w:r>
+        <w:rPr>
+          <w:vertAlign w:val="superscript"/>
+        </w:rPr>
+        <w:t xml:space="preserve">15</w:t>
+      </w:r>
+      <w:r>
+        <w:t xml:space="preserve">. This hypothesis mostly relied on striking morphological convergences between the clades assumed to have competed (</w:t>
       </w:r>
       <w:r>
         <w:rPr>
           <w:i/>
           <w:iCs/>
         </w:rPr>
-        <w:t xml:space="preserve">g</w:t>
-      </w:r>
-      <w:r>
-        <w:t xml:space="preserve">., sabertooth among predators, high-crowned and ever-growing cheek teeth among herbivores). However, several analyses of the fossil record provided no evidence for competition between native South American mammals and their northern counterparts</w:t>
-      </w:r>
-      <w:r>
-        <w:t xml:space="preserve"> </w:t>
-      </w:r>
-      <w:r>
-        <w:t xml:space="preserve">[21,22]</w:t>
-      </w:r>
-      <w:r>
-        <w:t xml:space="preserve">. That being said, using phylogenetic regressions, Faurby et al.</w:t>
-      </w:r>
-      <w:r>
-        <w:t xml:space="preserve"> </w:t>
-      </w:r>
-      <w:r>
-        <w:t xml:space="preserve">[18]</w:t>
-      </w:r>
-      <w:r>
-        <w:t xml:space="preserve"> </w:t>
-      </w:r>
-      <w:r>
-        <w:t xml:space="preserve">found support for another biotic interaction as a likely driver behind GABI’s asymmetry: predation. They indeed characterised a higher prevalence of traits increasing prey susceptibility among the endemic south american mammals. + larger niches of competitors</w:t>
-      </w:r>
-      <w:r>
-        <w:t xml:space="preserve"> </w:t>
-      </w:r>
-      <w:r>
-        <w:t xml:space="preserve">[16]</w:t>
-      </w:r>
-    </w:p>
-    <w:p>
-      <w:pPr>
-        <w:pStyle w:val="BodyText"/>
-      </w:pPr>
-      <w:r>
-        <w:t xml:space="preserve">These would include Pleistocene climate fluctuations and the consequent alternating phases of emergence of open landscapes across Central America, in turn favouring the dispersal of large temperate-adapted mammals to the detriment of tropical-adapted ones</w:t>
-      </w:r>
-    </w:p>
-    <w:p>
-      <w:pPr>
-        <w:pStyle w:val="BodyText"/>
-      </w:pPr>
-      <w:r>
-        <w:t xml:space="preserve">Other studies proposed the implication of abiotic factors. Some put the emphasis on Pleistocene climate fluctuations and the consequent alternating phases of emergence of landscape opening across Central America, in turn favouring the dispersal of large temperate-adapted mammals to the detriment of tropical-adapted ones</w:t>
-      </w:r>
-      <w:r>
-        <w:t xml:space="preserve"> </w:t>
-      </w:r>
-      <w:r>
-        <w:t xml:space="preserve">[8,10,17]</w:t>
-      </w:r>
-      <w:r>
-        <w:t xml:space="preserve">. Others drew direct relationships between the higher extinction rates of native South American mammal genera and temperature change</w:t>
-      </w:r>
-      <w:r>
-        <w:t xml:space="preserve"> </w:t>
-      </w:r>
-      <w:r>
-        <w:t xml:space="preserve">[24]</w:t>
+        <w:t xml:space="preserve">e</w:t>
       </w:r>
       <w:r>
         <w:t xml:space="preserve">.</w:t>
-      </w:r>
-    </w:p>
-    <w:p>
-      <w:pPr>
-        <w:pStyle w:val="BodyText"/>
-      </w:pPr>
-      <w:r>
-        <w:t xml:space="preserve">several studies proposed that palaeoclimate change shaped unequal dispersal abilities between northern and southern taxa</w:t>
-      </w:r>
-      <w:r>
-        <w:t xml:space="preserve"> </w:t>
-      </w:r>
-      <w:r>
-        <w:t xml:space="preserve">[8,10,17,24]</w:t>
-      </w:r>
-      <w:r>
-        <w:t xml:space="preserve">, although the hypothesis according to which the asymmetry of the GABI would stem from dispersal rates is still largely debated</w:t>
-      </w:r>
-      <w:r>
-        <w:t xml:space="preserve"> </w:t>
-      </w:r>
-      <w:r>
-        <w:t xml:space="preserve">[</w:t>
       </w:r>
       <w:r>
         <w:rPr>
           <w:i/>
           <w:iCs/>
         </w:rPr>
-        <w:t xml:space="preserve">e</w:t>
+        <w:t xml:space="preserve">g</w:t>
+      </w:r>
+      <w:r>
+        <w:t xml:space="preserve">., sabertooth among predators, high-crowned and ever-growing cheek teeth among herbivores). However, several analyses of the fossil record provided no evidence for competition between native South American mammals and their northern counterparts</w:t>
+      </w:r>
+      <w:r>
+        <w:rPr>
+          <w:vertAlign w:val="superscript"/>
+        </w:rPr>
+        <w:t xml:space="preserve">21,22</w:t>
+      </w:r>
+      <w:r>
+        <w:t xml:space="preserve">. That being said, using phylogenetic regressions, Faurby et al.</w:t>
+      </w:r>
+      <w:r>
+        <w:rPr>
+          <w:vertAlign w:val="superscript"/>
+        </w:rPr>
+        <w:t xml:space="preserve">18</w:t>
+      </w:r>
+      <w:r>
+        <w:t xml:space="preserve"> </w:t>
+      </w:r>
+      <w:r>
+        <w:t xml:space="preserve">found support for another biotic interaction as a likely driver behind GABI’s asymmetry: predation. They indeed characterised a higher prevalence of traits increasing prey susceptibility among the endemic south american mammals. + larger niches of competitors</w:t>
+      </w:r>
+      <w:r>
+        <w:rPr>
+          <w:vertAlign w:val="superscript"/>
+        </w:rPr>
+        <w:t xml:space="preserve">16</w:t>
+      </w:r>
+    </w:p>
+    <w:p>
+      <w:pPr>
+        <w:pStyle w:val="BodyText"/>
+      </w:pPr>
+      <w:r>
+        <w:t xml:space="preserve">These would include Pleistocene climate fluctuations and the consequent alternating phases of emergence of open landscapes across Central America, in turn favouring the dispersal of large temperate-adapted mammals to the detriment of tropical-adapted ones</w:t>
+      </w:r>
+    </w:p>
+    <w:p>
+      <w:pPr>
+        <w:pStyle w:val="BodyText"/>
+      </w:pPr>
+      <w:r>
+        <w:t xml:space="preserve">Other studies proposed the implication of abiotic factors. Some put the emphasis on Pleistocene climate fluctuations and the consequent alternating phases of emergence of landscape opening across Central America, in turn favouring the dispersal of large temperate-adapted mammals to the detriment of tropical-adapted ones</w:t>
+      </w:r>
+      <w:r>
+        <w:rPr>
+          <w:vertAlign w:val="superscript"/>
+        </w:rPr>
+        <w:t xml:space="preserve">8,10,17</w:t>
+      </w:r>
+      <w:r>
+        <w:t xml:space="preserve">. Others drew direct relationships between the higher extinction rates of native South American mammal genera and temperature change</w:t>
+      </w:r>
+      <w:r>
+        <w:rPr>
+          <w:vertAlign w:val="superscript"/>
+        </w:rPr>
+        <w:t xml:space="preserve">24</w:t>
       </w:r>
       <w:r>
         <w:t xml:space="preserve">.</w:t>
+      </w:r>
+    </w:p>
+    <w:p>
+      <w:pPr>
+        <w:pStyle w:val="BodyText"/>
+      </w:pPr>
+      <w:r>
+        <w:t xml:space="preserve">several studies proposed that palaeoclimate change shaped unequal dispersal abilities between northern and southern taxa</w:t>
+      </w:r>
+      <w:r>
+        <w:rPr>
+          <w:vertAlign w:val="superscript"/>
+        </w:rPr>
+        <w:t xml:space="preserve">8,10,17,24</w:t>
+      </w:r>
+      <w:r>
+        <w:t xml:space="preserve">, although the hypothesis according to which the asymmetry of the GABI would stem from dispersal rates is still largely debated</w:t>
       </w:r>
       <w:r>
         <w:rPr>
           <w:i/>
           <w:iCs/>
+          <w:vertAlign w:val="superscript"/>
+        </w:rPr>
+        <w:t xml:space="preserve">e</w:t>
+      </w:r>
+      <w:r>
+        <w:rPr>
+          <w:vertAlign w:val="superscript"/>
+        </w:rPr>
+        <w:t xml:space="preserve">.</w:t>
+      </w:r>
+      <w:r>
+        <w:rPr>
+          <w:i/>
+          <w:iCs/>
+          <w:vertAlign w:val="superscript"/>
         </w:rPr>
         <w:t xml:space="preserve">g</w:t>
       </w:r>
       <w:r>
-        <w:t xml:space="preserve">., 12]</w:t>
+        <w:rPr>
+          <w:vertAlign w:val="superscript"/>
+        </w:rPr>
+        <w:t xml:space="preserve">., 12</w:t>
       </w:r>
       <w:r>
         <w:t xml:space="preserve">.</w:t>
@@ -2775,8 +3148,8 @@
         <w:br w:type="page"/>
       </w:r>
     </w:p>
-    <w:bookmarkEnd w:id="46"/>
-    <w:bookmarkStart w:id="130" w:name="references"/>
+    <w:bookmarkEnd w:id="43"/>
+    <w:bookmarkStart w:id="127" w:name="references"/>
     <w:p>
       <w:pPr>
         <w:pStyle w:val="Heading1"/>
@@ -2785,8 +3158,8 @@
         <w:t xml:space="preserve">References</w:t>
       </w:r>
     </w:p>
-    <w:bookmarkStart w:id="129" w:name="refs"/>
-    <w:bookmarkStart w:id="48" w:name="ref-marshall1982"/>
+    <w:bookmarkStart w:id="126" w:name="refs"/>
+    <w:bookmarkStart w:id="45" w:name="ref-marshall1982"/>
     <w:p>
       <w:pPr>
         <w:pStyle w:val="Bibliography"/>
@@ -2801,12 +3174,12 @@
         <w:t xml:space="preserve">	</w:t>
       </w:r>
       <w:r>
-        <w:t xml:space="preserve">Marshall LG, Webb SD, Sepkoski JJ, Raup DM. 1982</w:t>
-      </w:r>
-      <w:r>
-        <w:t xml:space="preserve"> </w:t>
-      </w:r>
-      <w:hyperlink r:id="rId47">
+        <w:t xml:space="preserve">Marshall, L.G., Webb, S.D., Sepkoski, J.J., and Raup, D.M. (1982).</w:t>
+      </w:r>
+      <w:r>
+        <w:t xml:space="preserve"> </w:t>
+      </w:r>
+      <w:hyperlink r:id="rId44">
         <w:r>
           <w:rPr>
             <w:rStyle w:val="Hyperlink"/>
@@ -2815,7 +3188,7 @@
         </w:r>
       </w:hyperlink>
       <w:r>
-        <w:t xml:space="preserve">.</w:t>
+        <w:t xml:space="preserve">. Science</w:t>
       </w:r>
       <w:r>
         <w:t xml:space="preserve"> </w:t>
@@ -2825,24 +3198,14 @@
           <w:i/>
           <w:iCs/>
         </w:rPr>
-        <w:t xml:space="preserve">Science</w:t>
-      </w:r>
-      <w:r>
-        <w:t xml:space="preserve"> </w:t>
-      </w:r>
-      <w:r>
-        <w:rPr>
-          <w:b/>
-          <w:bCs/>
-        </w:rPr>
         <w:t xml:space="preserve">215</w:t>
       </w:r>
       <w:r>
         <w:t xml:space="preserve">, 1351–1357.</w:t>
       </w:r>
     </w:p>
-    <w:bookmarkEnd w:id="48"/>
-    <w:bookmarkStart w:id="50" w:name="ref-montes2015"/>
+    <w:bookmarkEnd w:id="45"/>
+    <w:bookmarkStart w:id="47" w:name="ref-montes2015"/>
     <w:p>
       <w:pPr>
         <w:pStyle w:val="Bibliography"/>
@@ -2857,7 +3220,7 @@
         <w:t xml:space="preserve">	</w:t>
       </w:r>
       <w:r>
-        <w:t xml:space="preserve">Montes C</w:t>
+        <w:t xml:space="preserve">Montes, C., Cardona, A., Jaramillo, C., Pardo, A., Silva, J.C., Valencia, V., Ayala, C., Pérez-Angel, L.C., Rodriguez-Parra, L.A., Ramirez, V., et al. (2015). Middle miocene closure of the central american seaway. Science</w:t>
       </w:r>
       <w:r>
         <w:t xml:space="preserve"> </w:t>
@@ -2867,48 +3230,28 @@
           <w:i/>
           <w:iCs/>
         </w:rPr>
-        <w:t xml:space="preserve">et al.</w:t>
-      </w:r>
-      <w:r>
-        <w:t xml:space="preserve"> 2015 Middle miocene closure of the central american seaway.</w:t>
-      </w:r>
-      <w:r>
-        <w:t xml:space="preserve"> </w:t>
-      </w:r>
-      <w:r>
-        <w:rPr>
-          <w:i/>
-          <w:iCs/>
-        </w:rPr>
-        <w:t xml:space="preserve">Science</w:t>
-      </w:r>
-      <w:r>
-        <w:t xml:space="preserve"> </w:t>
-      </w:r>
-      <w:r>
-        <w:rPr>
-          <w:b/>
-          <w:bCs/>
-        </w:rPr>
         <w:t xml:space="preserve">348</w:t>
       </w:r>
       <w:r>
-        <w:t xml:space="preserve">, 226–229. (doi:</w:t>
-      </w:r>
-      <w:hyperlink r:id="rId49">
+        <w:t xml:space="preserve">, 226–229.</w:t>
+      </w:r>
+      <w:r>
+        <w:t xml:space="preserve"> </w:t>
+      </w:r>
+      <w:hyperlink r:id="rId46">
         <w:r>
           <w:rPr>
             <w:rStyle w:val="Hyperlink"/>
           </w:rPr>
-          <w:t xml:space="preserve">10.1126/science.aaa2815</w:t>
+          <w:t xml:space="preserve">https://doi.org/10.1126/science.aaa2815</w:t>
         </w:r>
       </w:hyperlink>
       <w:r>
-        <w:t xml:space="preserve">)</w:t>
-      </w:r>
-    </w:p>
-    <w:bookmarkEnd w:id="50"/>
-    <w:bookmarkStart w:id="52" w:name="ref-jaramillo2018"/>
+        <w:t xml:space="preserve">.</w:t>
+      </w:r>
+    </w:p>
+    <w:bookmarkEnd w:id="47"/>
+    <w:bookmarkStart w:id="49" w:name="ref-jaramillo2018"/>
     <w:p>
       <w:pPr>
         <w:pStyle w:val="Bibliography"/>
@@ -2923,12 +3266,12 @@
         <w:t xml:space="preserve">	</w:t>
       </w:r>
       <w:r>
-        <w:t xml:space="preserve">Jaramillo CA. 2018</w:t>
-      </w:r>
-      <w:r>
-        <w:t xml:space="preserve"> </w:t>
-      </w:r>
-      <w:hyperlink r:id="rId51">
+        <w:t xml:space="preserve">Jaramillo, C.A. (2018).</w:t>
+      </w:r>
+      <w:r>
+        <w:t xml:space="preserve"> </w:t>
+      </w:r>
+      <w:hyperlink r:id="rId48">
         <w:r>
           <w:rPr>
             <w:rStyle w:val="Hyperlink"/>
@@ -2937,14 +3280,11 @@
         </w:r>
       </w:hyperlink>
       <w:r>
-        <w:t xml:space="preserve">. John Wiley &amp; Sons.</w:t>
-      </w:r>
-      <w:r>
-        <w:t xml:space="preserve"> </w:t>
-      </w:r>
-    </w:p>
-    <w:bookmarkEnd w:id="52"/>
-    <w:bookmarkStart w:id="54" w:name="ref-odea2016"/>
+        <w:t xml:space="preserve">. In (John Wiley &amp; Sons).</w:t>
+      </w:r>
+    </w:p>
+    <w:bookmarkEnd w:id="49"/>
+    <w:bookmarkStart w:id="51" w:name="ref-odea2016"/>
     <w:p>
       <w:pPr>
         <w:pStyle w:val="Bibliography"/>
@@ -2959,7 +3299,7 @@
         <w:t xml:space="preserve">	</w:t>
       </w:r>
       <w:r>
-        <w:t xml:space="preserve">O’Dea A</w:t>
+        <w:t xml:space="preserve">O’Dea, A., Lessios, H.A., Coates, A.G., Eytan, R.I., Restrepo-Moreno, S.A., Cione, A.L., Collins, L.S., Queiroz, A. de, Farris, D.W., Norris, R.D., et al. (2016). Formation of the isthmus of panama. Science Advances</w:t>
       </w:r>
       <w:r>
         <w:t xml:space="preserve"> </w:t>
@@ -2969,48 +3309,28 @@
           <w:i/>
           <w:iCs/>
         </w:rPr>
-        <w:t xml:space="preserve">et al.</w:t>
-      </w:r>
-      <w:r>
-        <w:t xml:space="preserve"> 2016 Formation of the isthmus of panama.</w:t>
-      </w:r>
-      <w:r>
-        <w:t xml:space="preserve"> </w:t>
-      </w:r>
-      <w:r>
-        <w:rPr>
-          <w:i/>
-          <w:iCs/>
-        </w:rPr>
-        <w:t xml:space="preserve">Science Advances</w:t>
-      </w:r>
-      <w:r>
-        <w:t xml:space="preserve"> </w:t>
-      </w:r>
-      <w:r>
-        <w:rPr>
-          <w:b/>
-          <w:bCs/>
-        </w:rPr>
         <w:t xml:space="preserve">2</w:t>
       </w:r>
       <w:r>
-        <w:t xml:space="preserve">, e1600883. (doi:</w:t>
-      </w:r>
-      <w:hyperlink r:id="rId53">
+        <w:t xml:space="preserve">, e1600883.</w:t>
+      </w:r>
+      <w:r>
+        <w:t xml:space="preserve"> </w:t>
+      </w:r>
+      <w:hyperlink r:id="rId50">
         <w:r>
           <w:rPr>
             <w:rStyle w:val="Hyperlink"/>
           </w:rPr>
-          <w:t xml:space="preserve">10.1126/sciadv.1600883</w:t>
+          <w:t xml:space="preserve">https://doi.org/10.1126/sciadv.1600883</w:t>
         </w:r>
       </w:hyperlink>
       <w:r>
-        <w:t xml:space="preserve">)</w:t>
-      </w:r>
-    </w:p>
-    <w:bookmarkEnd w:id="54"/>
-    <w:bookmarkStart w:id="56" w:name="ref-verzi2008"/>
+        <w:t xml:space="preserve">.</w:t>
+      </w:r>
+    </w:p>
+    <w:bookmarkEnd w:id="51"/>
+    <w:bookmarkStart w:id="53" w:name="ref-verzi2008"/>
     <w:p>
       <w:pPr>
         <w:pStyle w:val="Bibliography"/>
@@ -3025,7 +3345,7 @@
         <w:t xml:space="preserve">	</w:t>
       </w:r>
       <w:r>
-        <w:t xml:space="preserve">Verzi DH, Montalvo CI, Deschamps CM. 2008 Biostratigraphy and biochronology of the late miocene of central argentina: Evidence from rodents and taphonomy.</w:t>
+        <w:t xml:space="preserve">Verzi, D.H., Montalvo, C.I., and Deschamps, C.M. (2008). Biostratigraphy and biochronology of the late miocene of central argentina: Evidence from rodents and taphonomy. Geobios</w:t>
       </w:r>
       <w:r>
         <w:t xml:space="preserve"> </w:t>
@@ -3035,35 +3355,28 @@
           <w:i/>
           <w:iCs/>
         </w:rPr>
-        <w:t xml:space="preserve">Geobios</w:t>
-      </w:r>
-      <w:r>
-        <w:t xml:space="preserve"> </w:t>
-      </w:r>
-      <w:r>
-        <w:rPr>
-          <w:b/>
-          <w:bCs/>
-        </w:rPr>
         <w:t xml:space="preserve">41</w:t>
       </w:r>
       <w:r>
-        <w:t xml:space="preserve">, 145–155. (doi:</w:t>
-      </w:r>
-      <w:hyperlink r:id="rId55">
+        <w:t xml:space="preserve">, 145–155.</w:t>
+      </w:r>
+      <w:r>
+        <w:t xml:space="preserve"> </w:t>
+      </w:r>
+      <w:hyperlink r:id="rId52">
         <w:r>
           <w:rPr>
             <w:rStyle w:val="Hyperlink"/>
           </w:rPr>
-          <w:t xml:space="preserve">10.1016/j.geobios.2006.09.005</w:t>
+          <w:t xml:space="preserve">https://doi.org/10.1016/j.geobios.2006.09.005</w:t>
         </w:r>
       </w:hyperlink>
       <w:r>
-        <w:t xml:space="preserve">)</w:t>
-      </w:r>
-    </w:p>
-    <w:bookmarkEnd w:id="56"/>
-    <w:bookmarkStart w:id="58" w:name="ref-woodburne2010"/>
+        <w:t xml:space="preserve">.</w:t>
+      </w:r>
+    </w:p>
+    <w:bookmarkEnd w:id="53"/>
+    <w:bookmarkStart w:id="55" w:name="ref-woodburne2010"/>
     <w:p>
       <w:pPr>
         <w:pStyle w:val="Bibliography"/>
@@ -3078,7 +3391,7 @@
         <w:t xml:space="preserve">	</w:t>
       </w:r>
       <w:r>
-        <w:t xml:space="preserve">Woodburne MO. 2010 The Great American Biotic Interchange: Dispersals, Tectonics, Climate, Sea Level and Holding Pens.</w:t>
+        <w:t xml:space="preserve">Woodburne, M.O. (2010). The Great American Biotic Interchange: Dispersals, Tectonics, Climate, Sea Level and Holding Pens. Journal of Mammalian Evolution</w:t>
       </w:r>
       <w:r>
         <w:t xml:space="preserve"> </w:t>
@@ -3088,35 +3401,28 @@
           <w:i/>
           <w:iCs/>
         </w:rPr>
-        <w:t xml:space="preserve">Journal of Mammalian Evolution</w:t>
-      </w:r>
-      <w:r>
-        <w:t xml:space="preserve"> </w:t>
-      </w:r>
-      <w:r>
-        <w:rPr>
-          <w:b/>
-          <w:bCs/>
-        </w:rPr>
         <w:t xml:space="preserve">17</w:t>
       </w:r>
       <w:r>
-        <w:t xml:space="preserve">, 245–264. (doi:</w:t>
-      </w:r>
-      <w:hyperlink r:id="rId57">
+        <w:t xml:space="preserve">, 245–264.</w:t>
+      </w:r>
+      <w:r>
+        <w:t xml:space="preserve"> </w:t>
+      </w:r>
+      <w:hyperlink r:id="rId54">
         <w:r>
           <w:rPr>
             <w:rStyle w:val="Hyperlink"/>
           </w:rPr>
-          <w:t xml:space="preserve">10.1007/s10914-010-9144-8</w:t>
+          <w:t xml:space="preserve">https://doi.org/10.1007/s10914-010-9144-8</w:t>
         </w:r>
       </w:hyperlink>
       <w:r>
-        <w:t xml:space="preserve">)</w:t>
-      </w:r>
-    </w:p>
-    <w:bookmarkEnd w:id="58"/>
-    <w:bookmarkStart w:id="60" w:name="ref-bacon2015"/>
+        <w:t xml:space="preserve">.</w:t>
+      </w:r>
+    </w:p>
+    <w:bookmarkEnd w:id="55"/>
+    <w:bookmarkStart w:id="57" w:name="ref-bacon2015"/>
     <w:p>
       <w:pPr>
         <w:pStyle w:val="Bibliography"/>
@@ -3131,7 +3437,7 @@
         <w:t xml:space="preserve">	</w:t>
       </w:r>
       <w:r>
-        <w:t xml:space="preserve">Bacon CD, Silvestro D, Jaramillo C, Smith BT, Chakrabarty P, Antonelli A. 2015 Biological evidence supports an early and complex emergence of the isthmus of panama.</w:t>
+        <w:t xml:space="preserve">Bacon, C.D., Silvestro, D., Jaramillo, C., Smith, B.T., Chakrabarty, P., and Antonelli, A. (2015). Biological evidence supports an early and complex emergence of the isthmus of panama. Proceedings of the National Academy of Sciences</w:t>
       </w:r>
       <w:r>
         <w:t xml:space="preserve"> </w:t>
@@ -3141,35 +3447,28 @@
           <w:i/>
           <w:iCs/>
         </w:rPr>
-        <w:t xml:space="preserve">Proceedings of the National Academy of Sciences</w:t>
-      </w:r>
-      <w:r>
-        <w:t xml:space="preserve"> </w:t>
-      </w:r>
-      <w:r>
-        <w:rPr>
-          <w:b/>
-          <w:bCs/>
-        </w:rPr>
         <w:t xml:space="preserve">112</w:t>
       </w:r>
       <w:r>
-        <w:t xml:space="preserve">, 6110–6115. (doi:</w:t>
-      </w:r>
-      <w:hyperlink r:id="rId59">
+        <w:t xml:space="preserve">, 6110–6115.</w:t>
+      </w:r>
+      <w:r>
+        <w:t xml:space="preserve"> </w:t>
+      </w:r>
+      <w:hyperlink r:id="rId56">
         <w:r>
           <w:rPr>
             <w:rStyle w:val="Hyperlink"/>
           </w:rPr>
-          <w:t xml:space="preserve">10.1073/pnas.1423853112</w:t>
+          <w:t xml:space="preserve">https://doi.org/10.1073/pnas.1423853112</w:t>
         </w:r>
       </w:hyperlink>
       <w:r>
-        <w:t xml:space="preserve">)</w:t>
-      </w:r>
-    </w:p>
-    <w:bookmarkEnd w:id="60"/>
-    <w:bookmarkStart w:id="62" w:name="ref-bacon2016"/>
+        <w:t xml:space="preserve">.</w:t>
+      </w:r>
+    </w:p>
+    <w:bookmarkEnd w:id="57"/>
+    <w:bookmarkStart w:id="59" w:name="ref-bacon2016"/>
     <w:p>
       <w:pPr>
         <w:pStyle w:val="Bibliography"/>
@@ -3184,7 +3483,7 @@
         <w:t xml:space="preserve">	</w:t>
       </w:r>
       <w:r>
-        <w:t xml:space="preserve">Bacon CD, Molnar P, Antonelli A, Crawford AJ, Montes C, Vallejo-Pareja MC. 2016 Quaternary glaciation and the great american biotic interchange.</w:t>
+        <w:t xml:space="preserve">Bacon, C.D., Molnar, P., Antonelli, A., Crawford, A.J., Montes, C., and Vallejo-Pareja, M.C. (2016). Quaternary glaciation and the great american biotic interchange. Geology</w:t>
       </w:r>
       <w:r>
         <w:t xml:space="preserve"> </w:t>
@@ -3194,35 +3493,28 @@
           <w:i/>
           <w:iCs/>
         </w:rPr>
-        <w:t xml:space="preserve">Geology</w:t>
-      </w:r>
-      <w:r>
-        <w:t xml:space="preserve"> </w:t>
-      </w:r>
-      <w:r>
-        <w:rPr>
-          <w:b/>
-          <w:bCs/>
-        </w:rPr>
         <w:t xml:space="preserve">44</w:t>
       </w:r>
       <w:r>
-        <w:t xml:space="preserve">, 375–378. (doi:</w:t>
-      </w:r>
-      <w:hyperlink r:id="rId61">
+        <w:t xml:space="preserve">, 375–378.</w:t>
+      </w:r>
+      <w:r>
+        <w:t xml:space="preserve"> </w:t>
+      </w:r>
+      <w:hyperlink r:id="rId58">
         <w:r>
           <w:rPr>
             <w:rStyle w:val="Hyperlink"/>
           </w:rPr>
-          <w:t xml:space="preserve">10.1130/G37624.1</w:t>
+          <w:t xml:space="preserve">https://doi.org/10.1130/G37624.1</w:t>
         </w:r>
       </w:hyperlink>
       <w:r>
-        <w:t xml:space="preserve">)</w:t>
-      </w:r>
-    </w:p>
-    <w:bookmarkEnd w:id="62"/>
-    <w:bookmarkStart w:id="64" w:name="ref-webb1976"/>
+        <w:t xml:space="preserve">.</w:t>
+      </w:r>
+    </w:p>
+    <w:bookmarkEnd w:id="59"/>
+    <w:bookmarkStart w:id="61" w:name="ref-webb1976"/>
     <w:p>
       <w:pPr>
         <w:pStyle w:val="Bibliography"/>
@@ -3237,12 +3529,12 @@
         <w:t xml:space="preserve">	</w:t>
       </w:r>
       <w:r>
-        <w:t xml:space="preserve">Webb SD. 1976</w:t>
-      </w:r>
-      <w:r>
-        <w:t xml:space="preserve"> </w:t>
-      </w:r>
-      <w:hyperlink r:id="rId63">
+        <w:t xml:space="preserve">Webb, S.D. (1976).</w:t>
+      </w:r>
+      <w:r>
+        <w:t xml:space="preserve"> </w:t>
+      </w:r>
+      <w:hyperlink r:id="rId60">
         <w:r>
           <w:rPr>
             <w:rStyle w:val="Hyperlink"/>
@@ -3251,7 +3543,7 @@
         </w:r>
       </w:hyperlink>
       <w:r>
-        <w:t xml:space="preserve">.</w:t>
+        <w:t xml:space="preserve">. Paleobiology</w:t>
       </w:r>
       <w:r>
         <w:t xml:space="preserve"> </w:t>
@@ -3261,24 +3553,14 @@
           <w:i/>
           <w:iCs/>
         </w:rPr>
-        <w:t xml:space="preserve">Paleobiology</w:t>
-      </w:r>
-      <w:r>
-        <w:t xml:space="preserve"> </w:t>
-      </w:r>
-      <w:r>
-        <w:rPr>
-          <w:b/>
-          <w:bCs/>
-        </w:rPr>
         <w:t xml:space="preserve">2</w:t>
       </w:r>
       <w:r>
         <w:t xml:space="preserve">, 220–234.</w:t>
       </w:r>
     </w:p>
-    <w:bookmarkEnd w:id="64"/>
-    <w:bookmarkStart w:id="66" w:name="ref-webb1991"/>
+    <w:bookmarkEnd w:id="61"/>
+    <w:bookmarkStart w:id="63" w:name="ref-webb1991"/>
     <w:p>
       <w:pPr>
         <w:pStyle w:val="Bibliography"/>
@@ -3293,7 +3575,7 @@
         <w:t xml:space="preserve">	</w:t>
       </w:r>
       <w:r>
-        <w:t xml:space="preserve">Webb SD. 1991 Ecogeography and the Great American Interchange.</w:t>
+        <w:t xml:space="preserve">Webb, S.D. (1991). Ecogeography and the Great American Interchange. Paleobiology</w:t>
       </w:r>
       <w:r>
         <w:t xml:space="preserve"> </w:t>
@@ -3303,35 +3585,28 @@
           <w:i/>
           <w:iCs/>
         </w:rPr>
-        <w:t xml:space="preserve">Paleobiology</w:t>
-      </w:r>
-      <w:r>
-        <w:t xml:space="preserve"> </w:t>
-      </w:r>
-      <w:r>
-        <w:rPr>
-          <w:b/>
-          <w:bCs/>
-        </w:rPr>
         <w:t xml:space="preserve">17</w:t>
       </w:r>
       <w:r>
-        <w:t xml:space="preserve">, 266–280. (doi:</w:t>
-      </w:r>
-      <w:hyperlink r:id="rId65">
+        <w:t xml:space="preserve">, 266–280.</w:t>
+      </w:r>
+      <w:r>
+        <w:t xml:space="preserve"> </w:t>
+      </w:r>
+      <w:hyperlink r:id="rId62">
         <w:r>
           <w:rPr>
             <w:rStyle w:val="Hyperlink"/>
           </w:rPr>
-          <w:t xml:space="preserve">10.1017/S0094837300010605</w:t>
+          <w:t xml:space="preserve">https://doi.org/10.1017/S0094837300010605</w:t>
         </w:r>
       </w:hyperlink>
       <w:r>
-        <w:t xml:space="preserve">)</w:t>
-      </w:r>
-    </w:p>
-    <w:bookmarkEnd w:id="66"/>
-    <w:bookmarkStart w:id="68" w:name="ref-cione2015"/>
+        <w:t xml:space="preserve">.</w:t>
+      </w:r>
+    </w:p>
+    <w:bookmarkEnd w:id="63"/>
+    <w:bookmarkStart w:id="65" w:name="ref-cione2015"/>
     <w:p>
       <w:pPr>
         <w:pStyle w:val="Bibliography"/>
@@ -3346,38 +3621,28 @@
         <w:t xml:space="preserve">	</w:t>
       </w:r>
       <w:r>
-        <w:t xml:space="preserve">Cione AL, Gasparini GM, Soibelzon E, Soibelzon LH, Tonni EP. 2015</w:t>
-      </w:r>
-      <w:r>
-        <w:t xml:space="preserve"> </w:t>
-      </w:r>
-      <w:r>
-        <w:rPr>
-          <w:i/>
-          <w:iCs/>
-        </w:rPr>
-        <w:t xml:space="preserve">The Great American Biotic Interchange: A South American Perspective</w:t>
-      </w:r>
-      <w:r>
-        <w:t xml:space="preserve">. Dordrecht: Springer Netherlands. See</w:t>
-      </w:r>
-      <w:r>
-        <w:t xml:space="preserve"> </w:t>
-      </w:r>
-      <w:hyperlink r:id="rId67">
+        <w:t xml:space="preserve">Cione, A.L., Gasparini, G.M., Soibelzon, E., Soibelzon, L.H., and Tonni, E.P. (2015).</w:t>
+      </w:r>
+      <w:r>
+        <w:t xml:space="preserve"> </w:t>
+      </w:r>
+      <w:hyperlink r:id="rId64">
         <w:r>
           <w:rPr>
             <w:rStyle w:val="Hyperlink"/>
           </w:rPr>
-          <w:t xml:space="preserve">https://link.springer.com/10.1007/978-94-017-9792-4</w:t>
+          <w:t xml:space="preserve">The Great American Biotic Interchange: A South American Perspective</w:t>
         </w:r>
       </w:hyperlink>
       <w:r>
-        <w:t xml:space="preserve">.</w:t>
-      </w:r>
-    </w:p>
-    <w:bookmarkEnd w:id="68"/>
-    <w:bookmarkStart w:id="70" w:name="ref-carrillo2020"/>
+        <w:t xml:space="preserve"> </w:t>
+      </w:r>
+      <w:r>
+        <w:t xml:space="preserve">(Springer Netherlands).</w:t>
+      </w:r>
+    </w:p>
+    <w:bookmarkEnd w:id="65"/>
+    <w:bookmarkStart w:id="67" w:name="ref-carrillo2020"/>
     <w:p>
       <w:pPr>
         <w:pStyle w:val="Bibliography"/>
@@ -3392,7 +3657,7 @@
         <w:t xml:space="preserve">	</w:t>
       </w:r>
       <w:r>
-        <w:t xml:space="preserve">Carrillo JD, Faurby S, Silvestro D, Zizka A, Jaramillo C, Bacon CD, Antonelli A. 2020 Disproportionate extinction of south american mammals drove the asymmetry of the great american biotic interchange.</w:t>
+        <w:t xml:space="preserve">Carrillo, J.D., Faurby, S., Silvestro, D., Zizka, A., Jaramillo, C., Bacon, C.D., and Antonelli, A. (2020). Disproportionate extinction of south american mammals drove the asymmetry of the great american biotic interchange. Proceedings of the National Academy of Sciences</w:t>
       </w:r>
       <w:r>
         <w:t xml:space="preserve"> </w:t>
@@ -3402,35 +3667,28 @@
           <w:i/>
           <w:iCs/>
         </w:rPr>
-        <w:t xml:space="preserve">Proceedings of the National Academy of Sciences</w:t>
-      </w:r>
-      <w:r>
-        <w:t xml:space="preserve"> </w:t>
-      </w:r>
-      <w:r>
-        <w:rPr>
-          <w:b/>
-          <w:bCs/>
-        </w:rPr>
         <w:t xml:space="preserve">117</w:t>
       </w:r>
       <w:r>
-        <w:t xml:space="preserve">, 26281–26287. (doi:</w:t>
-      </w:r>
-      <w:hyperlink r:id="rId69">
+        <w:t xml:space="preserve">, 26281–26287.</w:t>
+      </w:r>
+      <w:r>
+        <w:t xml:space="preserve"> </w:t>
+      </w:r>
+      <w:hyperlink r:id="rId66">
         <w:r>
           <w:rPr>
             <w:rStyle w:val="Hyperlink"/>
           </w:rPr>
-          <w:t xml:space="preserve">10.1073/pnas.2009397117</w:t>
+          <w:t xml:space="preserve">https://doi.org/10.1073/pnas.2009397117</w:t>
         </w:r>
       </w:hyperlink>
       <w:r>
-        <w:t xml:space="preserve">)</w:t>
-      </w:r>
-    </w:p>
-    <w:bookmarkEnd w:id="70"/>
-    <w:bookmarkStart w:id="72" w:name="ref-croft2020"/>
+        <w:t xml:space="preserve">.</w:t>
+      </w:r>
+    </w:p>
+    <w:bookmarkEnd w:id="67"/>
+    <w:bookmarkStart w:id="69" w:name="ref-croft2020"/>
     <w:p>
       <w:pPr>
         <w:pStyle w:val="Bibliography"/>
@@ -3445,7 +3703,7 @@
         <w:t xml:space="preserve">	</w:t>
       </w:r>
       <w:r>
-        <w:t xml:space="preserve">Croft DA, Gelfo JN, López GM. 2020 Splendid innovation: The extinct south american native ungulates.</w:t>
+        <w:t xml:space="preserve">Croft, D.A., Gelfo, J.N., and López, G.M. (2020). Splendid innovation: The extinct south american native ungulates. Annual Review of Earth and Planetary Sciences</w:t>
       </w:r>
       <w:r>
         <w:t xml:space="preserve"> </w:t>
@@ -3455,35 +3713,28 @@
           <w:i/>
           <w:iCs/>
         </w:rPr>
-        <w:t xml:space="preserve">Annual Review of Earth and Planetary Sciences</w:t>
-      </w:r>
-      <w:r>
-        <w:t xml:space="preserve"> </w:t>
-      </w:r>
-      <w:r>
-        <w:rPr>
-          <w:b/>
-          <w:bCs/>
-        </w:rPr>
         <w:t xml:space="preserve">48</w:t>
       </w:r>
       <w:r>
-        <w:t xml:space="preserve">, 259–290. (doi:</w:t>
-      </w:r>
-      <w:hyperlink r:id="rId71">
+        <w:t xml:space="preserve">, 259–290.</w:t>
+      </w:r>
+      <w:r>
+        <w:t xml:space="preserve"> </w:t>
+      </w:r>
+      <w:hyperlink r:id="rId68">
         <w:r>
           <w:rPr>
             <w:rStyle w:val="Hyperlink"/>
           </w:rPr>
-          <w:t xml:space="preserve">10.1146/annurev-earth-072619-060126</w:t>
+          <w:t xml:space="preserve">https://doi.org/10.1146/annurev-earth-072619-060126</w:t>
         </w:r>
       </w:hyperlink>
       <w:r>
-        <w:t xml:space="preserve">)</w:t>
-      </w:r>
-    </w:p>
-    <w:bookmarkEnd w:id="72"/>
-    <w:bookmarkStart w:id="74" w:name="ref-boscaini2025"/>
+        <w:t xml:space="preserve">.</w:t>
+      </w:r>
+    </w:p>
+    <w:bookmarkEnd w:id="69"/>
+    <w:bookmarkStart w:id="71" w:name="ref-boscaini2025"/>
     <w:p>
       <w:pPr>
         <w:pStyle w:val="Bibliography"/>
@@ -3498,7 +3749,7 @@
         <w:t xml:space="preserve">	</w:t>
       </w:r>
       <w:r>
-        <w:t xml:space="preserve">Boscaini A</w:t>
+        <w:t xml:space="preserve">Boscaini, A., Casali, D.M., Toledo, N., Cantalapiedra, J.L., Bargo, M.S., De Iuliis, G., Gaudin, T.J., Langer, M.C., Narducci, R., Pujos, F., et al. (2025). The emergence and demise of giant sloths. Science</w:t>
       </w:r>
       <w:r>
         <w:t xml:space="preserve"> </w:t>
@@ -3508,10 +3759,62 @@
           <w:i/>
           <w:iCs/>
         </w:rPr>
-        <w:t xml:space="preserve">et al.</w:t>
-      </w:r>
-      <w:r>
-        <w:t xml:space="preserve"> 2025 The emergence and demise of giant sloths.</w:t>
+        <w:t xml:space="preserve">388</w:t>
+      </w:r>
+      <w:r>
+        <w:t xml:space="preserve">, 864–868.</w:t>
+      </w:r>
+      <w:r>
+        <w:t xml:space="preserve"> </w:t>
+      </w:r>
+      <w:hyperlink r:id="rId70">
+        <w:r>
+          <w:rPr>
+            <w:rStyle w:val="Hyperlink"/>
+          </w:rPr>
+          <w:t xml:space="preserve">https://doi.org/10.1126/science.adu0704</w:t>
+        </w:r>
+      </w:hyperlink>
+      <w:r>
+        <w:t xml:space="preserve">.</w:t>
+      </w:r>
+    </w:p>
+    <w:bookmarkEnd w:id="71"/>
+    <w:bookmarkStart w:id="72" w:name="ref-simpson1980"/>
+    <w:p>
+      <w:pPr>
+        <w:pStyle w:val="Bibliography"/>
+      </w:pPr>
+      <w:r>
+        <w:t xml:space="preserve">15.</w:t>
+      </w:r>
+      <w:r>
+        <w:t xml:space="preserve"> </w:t>
+      </w:r>
+      <w:r>
+        <w:t xml:space="preserve">	</w:t>
+      </w:r>
+      <w:r>
+        <w:t xml:space="preserve">Simpson, G.G. (1980). Splendid isolation : The curious history of south american mammals Yale University Press, New Haven.</w:t>
+      </w:r>
+    </w:p>
+    <w:bookmarkEnd w:id="72"/>
+    <w:bookmarkStart w:id="74" w:name="ref-domingo2020"/>
+    <w:p>
+      <w:pPr>
+        <w:pStyle w:val="Bibliography"/>
+      </w:pPr>
+      <w:r>
+        <w:t xml:space="preserve">16.</w:t>
+      </w:r>
+      <w:r>
+        <w:t xml:space="preserve"> </w:t>
+      </w:r>
+      <w:r>
+        <w:t xml:space="preserve">	</w:t>
+      </w:r>
+      <w:r>
+        <w:t xml:space="preserve">Domingo, L., Tomassini, R.L., Montalvo, C.I., Sanz-Pérez, D., and Alberdi, M.T. (2020). The Great American Biotic Interchange revisited: a new perspective from the stable isotope record of Argentine Pampas fossil mammals. Scientific Reports</w:t>
       </w:r>
       <w:r>
         <w:t xml:space="preserve"> </w:t>
@@ -3521,41 +3824,34 @@
           <w:i/>
           <w:iCs/>
         </w:rPr>
-        <w:t xml:space="preserve">Science</w:t>
-      </w:r>
-      <w:r>
-        <w:t xml:space="preserve"> </w:t>
-      </w:r>
-      <w:r>
-        <w:rPr>
-          <w:b/>
-          <w:bCs/>
-        </w:rPr>
-        <w:t xml:space="preserve">388</w:t>
-      </w:r>
-      <w:r>
-        <w:t xml:space="preserve">, 864–868. (doi:</w:t>
+        <w:t xml:space="preserve">10</w:t>
+      </w:r>
+      <w:r>
+        <w:t xml:space="preserve">, 1608.</w:t>
+      </w:r>
+      <w:r>
+        <w:t xml:space="preserve"> </w:t>
       </w:r>
       <w:hyperlink r:id="rId73">
         <w:r>
           <w:rPr>
             <w:rStyle w:val="Hyperlink"/>
           </w:rPr>
-          <w:t xml:space="preserve">10.1126/science.adu0704</w:t>
+          <w:t xml:space="preserve">https://doi.org/10.1038/s41598-020-58575-6</w:t>
         </w:r>
       </w:hyperlink>
       <w:r>
-        <w:t xml:space="preserve">)</w:t>
+        <w:t xml:space="preserve">.</w:t>
       </w:r>
     </w:p>
     <w:bookmarkEnd w:id="74"/>
-    <w:bookmarkStart w:id="75" w:name="ref-simpson1980"/>
+    <w:bookmarkStart w:id="75" w:name="ref-marshall1990"/>
     <w:p>
       <w:pPr>
         <w:pStyle w:val="Bibliography"/>
       </w:pPr>
       <w:r>
-        <w:t xml:space="preserve">15.</w:t>
+        <w:t xml:space="preserve">17.</w:t>
       </w:r>
       <w:r>
         <w:t xml:space="preserve"> </w:t>
@@ -3564,7 +3860,7 @@
         <w:t xml:space="preserve">	</w:t>
       </w:r>
       <w:r>
-        <w:t xml:space="preserve">Simpson GG. 1980</w:t>
+        <w:t xml:space="preserve">Marshall, L.G., and Cifelli, R.L. (1990). Analysis of changing diversity patterns in cenozoic land mammal age faunas, south america. Palaeovertebrata</w:t>
       </w:r>
       <w:r>
         <w:t xml:space="preserve"> </w:t>
@@ -3574,23 +3870,20 @@
           <w:i/>
           <w:iCs/>
         </w:rPr>
-        <w:t xml:space="preserve">Splendid isolation : The curious history of south american mammals</w:t>
-      </w:r>
-      <w:r>
-        <w:t xml:space="preserve">. Yale University Press, New Haven.</w:t>
-      </w:r>
-      <w:r>
-        <w:t xml:space="preserve"> </w:t>
+        <w:t xml:space="preserve">19</w:t>
+      </w:r>
+      <w:r>
+        <w:t xml:space="preserve">, 169–210.</w:t>
       </w:r>
     </w:p>
     <w:bookmarkEnd w:id="75"/>
-    <w:bookmarkStart w:id="77" w:name="ref-domingo2020"/>
+    <w:bookmarkStart w:id="77" w:name="ref-faurby2016"/>
     <w:p>
       <w:pPr>
         <w:pStyle w:val="Bibliography"/>
       </w:pPr>
       <w:r>
-        <w:t xml:space="preserve">16.</w:t>
+        <w:t xml:space="preserve">18.</w:t>
       </w:r>
       <w:r>
         <w:t xml:space="preserve"> </w:t>
@@ -3599,7 +3892,7 @@
         <w:t xml:space="preserve">	</w:t>
       </w:r>
       <w:r>
-        <w:t xml:space="preserve">Domingo L, Tomassini RL, Montalvo CI, Sanz-Pérez D, Alberdi MT. 2020 The Great American Biotic Interchange revisited: a new perspective from the stable isotope record of Argentine Pampas fossil mammals.</w:t>
+        <w:t xml:space="preserve">Faurby, S., and Svenning, J.-C. (2016). The asymmetry in the Great American Biotic Interchange in mammals is consistent with differential susceptibility to mammalian predation. Global Ecology and Biogeography</w:t>
       </w:r>
       <w:r>
         <w:t xml:space="preserve"> </w:t>
@@ -3609,41 +3902,34 @@
           <w:i/>
           <w:iCs/>
         </w:rPr>
-        <w:t xml:space="preserve">Scientific Reports</w:t>
-      </w:r>
-      <w:r>
-        <w:t xml:space="preserve"> </w:t>
-      </w:r>
-      <w:r>
-        <w:rPr>
-          <w:b/>
-          <w:bCs/>
-        </w:rPr>
-        <w:t xml:space="preserve">10</w:t>
-      </w:r>
-      <w:r>
-        <w:t xml:space="preserve">, 1608. (doi:</w:t>
+        <w:t xml:space="preserve">25</w:t>
+      </w:r>
+      <w:r>
+        <w:t xml:space="preserve">, 1443–1453.</w:t>
+      </w:r>
+      <w:r>
+        <w:t xml:space="preserve"> </w:t>
       </w:r>
       <w:hyperlink r:id="rId76">
         <w:r>
           <w:rPr>
             <w:rStyle w:val="Hyperlink"/>
           </w:rPr>
-          <w:t xml:space="preserve">10.1038/s41598-020-58575-6</w:t>
+          <w:t xml:space="preserve">https://doi.org/10.1111/geb.12504</w:t>
         </w:r>
       </w:hyperlink>
       <w:r>
-        <w:t xml:space="preserve">)</w:t>
+        <w:t xml:space="preserve">.</w:t>
       </w:r>
     </w:p>
     <w:bookmarkEnd w:id="77"/>
-    <w:bookmarkStart w:id="78" w:name="ref-marshall1990"/>
+    <w:bookmarkStart w:id="79" w:name="ref-fernández-monescillo2025"/>
     <w:p>
       <w:pPr>
         <w:pStyle w:val="Bibliography"/>
       </w:pPr>
       <w:r>
-        <w:t xml:space="preserve">17.</w:t>
+        <w:t xml:space="preserve">19.</w:t>
       </w:r>
       <w:r>
         <w:t xml:space="preserve"> </w:t>
@@ -3652,7 +3938,7 @@
         <w:t xml:space="preserve">	</w:t>
       </w:r>
       <w:r>
-        <w:t xml:space="preserve">Marshall LG, Cifelli RL. 1990 Analysis of changing diversity patterns in cenozoic land mammal age faunas, south america.</w:t>
+        <w:t xml:space="preserve">Fernández-Monescillo, M., Romero-Lebrón, E., Pesquero, M.D., Haro, A., Rodríguez, P.E., Krapovickas, J., and Tauber, A.A. (2025). Middle Pleistocene revelations: unravelling taphonomic processes in mammals including Mesotherium cristatum (Mesotheriidae, Notoungulata), Corralito Site, Córdoba Province, Argentina. Palaeontology</w:t>
       </w:r>
       <w:r>
         <w:t xml:space="preserve"> </w:t>
@@ -3662,83 +3948,34 @@
           <w:i/>
           <w:iCs/>
         </w:rPr>
-        <w:t xml:space="preserve">Palaeovertebrata</w:t>
-      </w:r>
-      <w:r>
-        <w:t xml:space="preserve"> </w:t>
-      </w:r>
-      <w:r>
-        <w:rPr>
-          <w:b/>
-          <w:bCs/>
-        </w:rPr>
-        <w:t xml:space="preserve">19</w:t>
-      </w:r>
-      <w:r>
-        <w:t xml:space="preserve">, 169–210.</w:t>
-      </w:r>
-    </w:p>
-    <w:bookmarkEnd w:id="78"/>
-    <w:bookmarkStart w:id="80" w:name="ref-faurby2016"/>
-    <w:p>
-      <w:pPr>
-        <w:pStyle w:val="Bibliography"/>
-      </w:pPr>
-      <w:r>
-        <w:t xml:space="preserve">18.</w:t>
-      </w:r>
-      <w:r>
-        <w:t xml:space="preserve"> </w:t>
-      </w:r>
-      <w:r>
-        <w:t xml:space="preserve">	</w:t>
-      </w:r>
-      <w:r>
-        <w:t xml:space="preserve">Faurby S, Svenning J-C. 2016 The asymmetry in the Great American Biotic Interchange in mammals is consistent with differential susceptibility to mammalian predation.</w:t>
-      </w:r>
-      <w:r>
-        <w:t xml:space="preserve"> </w:t>
-      </w:r>
-      <w:r>
-        <w:rPr>
-          <w:i/>
-          <w:iCs/>
-        </w:rPr>
-        <w:t xml:space="preserve">Global Ecology and Biogeography</w:t>
-      </w:r>
-      <w:r>
-        <w:t xml:space="preserve"> </w:t>
-      </w:r>
-      <w:r>
-        <w:rPr>
-          <w:b/>
-          <w:bCs/>
-        </w:rPr>
-        <w:t xml:space="preserve">25</w:t>
-      </w:r>
-      <w:r>
-        <w:t xml:space="preserve">, 1443–1453. (doi:</w:t>
-      </w:r>
-      <w:hyperlink r:id="rId79">
+        <w:t xml:space="preserve">68</w:t>
+      </w:r>
+      <w:r>
+        <w:t xml:space="preserve">, e70012.</w:t>
+      </w:r>
+      <w:r>
+        <w:t xml:space="preserve"> </w:t>
+      </w:r>
+      <w:hyperlink r:id="rId78">
         <w:r>
           <w:rPr>
             <w:rStyle w:val="Hyperlink"/>
           </w:rPr>
-          <w:t xml:space="preserve">10.1111/geb.12504</w:t>
+          <w:t xml:space="preserve">https://doi.org/10.1111/pala.70012</w:t>
         </w:r>
       </w:hyperlink>
       <w:r>
-        <w:t xml:space="preserve">)</w:t>
-      </w:r>
-    </w:p>
-    <w:bookmarkEnd w:id="80"/>
-    <w:bookmarkStart w:id="82" w:name="ref-fernández-monescillo2025"/>
+        <w:t xml:space="preserve">.</w:t>
+      </w:r>
+    </w:p>
+    <w:bookmarkEnd w:id="79"/>
+    <w:bookmarkStart w:id="81" w:name="ref-vrba1992"/>
     <w:p>
       <w:pPr>
         <w:pStyle w:val="Bibliography"/>
       </w:pPr>
       <w:r>
-        <w:t xml:space="preserve">19.</w:t>
+        <w:t xml:space="preserve">20.</w:t>
       </w:r>
       <w:r>
         <w:t xml:space="preserve"> </w:t>
@@ -3747,7 +3984,7 @@
         <w:t xml:space="preserve">	</w:t>
       </w:r>
       <w:r>
-        <w:t xml:space="preserve">Fernández-Monescillo M, Romero-Lebrón E, Pesquero MD, Haro A, Rodríguez PE, Krapovickas J, Tauber AA. 2025 Middle Pleistocene revelations: unravelling taphonomic processes in mammals including Mesotherium cristatum (Mesotheriidae, Notoungulata), Corralito Site, Córdoba Province, Argentina.</w:t>
+        <w:t xml:space="preserve">Vrba, E.S. (1992). Mammals as a Key to Evolutionary Theory. Journal of Mammalogy</w:t>
       </w:r>
       <w:r>
         <w:t xml:space="preserve"> </w:t>
@@ -3757,41 +3994,34 @@
           <w:i/>
           <w:iCs/>
         </w:rPr>
-        <w:t xml:space="preserve">Palaeontology</w:t>
-      </w:r>
-      <w:r>
-        <w:t xml:space="preserve"> </w:t>
-      </w:r>
-      <w:r>
-        <w:rPr>
-          <w:b/>
-          <w:bCs/>
-        </w:rPr>
-        <w:t xml:space="preserve">68</w:t>
-      </w:r>
-      <w:r>
-        <w:t xml:space="preserve">, e70012. (doi:</w:t>
-      </w:r>
-      <w:hyperlink r:id="rId81">
+        <w:t xml:space="preserve">73</w:t>
+      </w:r>
+      <w:r>
+        <w:t xml:space="preserve">, 1–28.</w:t>
+      </w:r>
+      <w:r>
+        <w:t xml:space="preserve"> </w:t>
+      </w:r>
+      <w:hyperlink r:id="rId80">
         <w:r>
           <w:rPr>
             <w:rStyle w:val="Hyperlink"/>
           </w:rPr>
-          <w:t xml:space="preserve">10.1111/pala.70012</w:t>
+          <w:t xml:space="preserve">https://doi.org/10.2307/1381862</w:t>
         </w:r>
       </w:hyperlink>
       <w:r>
-        <w:t xml:space="preserve">)</w:t>
-      </w:r>
-    </w:p>
-    <w:bookmarkEnd w:id="82"/>
-    <w:bookmarkStart w:id="84" w:name="ref-vrba1992"/>
+        <w:t xml:space="preserve">.</w:t>
+      </w:r>
+    </w:p>
+    <w:bookmarkEnd w:id="81"/>
+    <w:bookmarkStart w:id="83" w:name="ref-prevosti2013"/>
     <w:p>
       <w:pPr>
         <w:pStyle w:val="Bibliography"/>
       </w:pPr>
       <w:r>
-        <w:t xml:space="preserve">20.</w:t>
+        <w:t xml:space="preserve">21.</w:t>
       </w:r>
       <w:r>
         <w:t xml:space="preserve"> </w:t>
@@ -3800,7 +4030,7 @@
         <w:t xml:space="preserve">	</w:t>
       </w:r>
       <w:r>
-        <w:t xml:space="preserve">Vrba ES. 1992 Mammals as a Key to Evolutionary Theory.</w:t>
+        <w:t xml:space="preserve">Prevosti, F.J., Forasiepi, A., and Zimicz, N. (2013). The Evolution of the Cenozoic Terrestrial Mammalian Predator Guild in South America: Competition or Replacement? Journal of Mammalian Evolution</w:t>
       </w:r>
       <w:r>
         <w:t xml:space="preserve"> </w:t>
@@ -3810,41 +4040,34 @@
           <w:i/>
           <w:iCs/>
         </w:rPr>
-        <w:t xml:space="preserve">Journal of Mammalogy</w:t>
-      </w:r>
-      <w:r>
-        <w:t xml:space="preserve"> </w:t>
-      </w:r>
-      <w:r>
-        <w:rPr>
-          <w:b/>
-          <w:bCs/>
-        </w:rPr>
-        <w:t xml:space="preserve">73</w:t>
-      </w:r>
-      <w:r>
-        <w:t xml:space="preserve">, 1–28. (doi:</w:t>
-      </w:r>
-      <w:hyperlink r:id="rId83">
+        <w:t xml:space="preserve">20</w:t>
+      </w:r>
+      <w:r>
+        <w:t xml:space="preserve">, 3–21.</w:t>
+      </w:r>
+      <w:r>
+        <w:t xml:space="preserve"> </w:t>
+      </w:r>
+      <w:hyperlink r:id="rId82">
         <w:r>
           <w:rPr>
             <w:rStyle w:val="Hyperlink"/>
           </w:rPr>
-          <w:t xml:space="preserve">10.2307/1381862</w:t>
+          <w:t xml:space="preserve">https://doi.org/10.1007/s10914-011-9175-9</w:t>
         </w:r>
       </w:hyperlink>
       <w:r>
-        <w:t xml:space="preserve">)</w:t>
-      </w:r>
-    </w:p>
-    <w:bookmarkEnd w:id="84"/>
-    <w:bookmarkStart w:id="86" w:name="ref-prevosti2013"/>
+        <w:t xml:space="preserve">.</w:t>
+      </w:r>
+    </w:p>
+    <w:bookmarkEnd w:id="83"/>
+    <w:bookmarkStart w:id="85" w:name="ref-tarquini2022"/>
     <w:p>
       <w:pPr>
         <w:pStyle w:val="Bibliography"/>
       </w:pPr>
       <w:r>
-        <w:t xml:space="preserve">21.</w:t>
+        <w:t xml:space="preserve">22.</w:t>
       </w:r>
       <w:r>
         <w:t xml:space="preserve"> </w:t>
@@ -3853,7 +4076,7 @@
         <w:t xml:space="preserve">	</w:t>
       </w:r>
       <w:r>
-        <w:t xml:space="preserve">Prevosti FJ, Forasiepi A, Zimicz N. 2013 The Evolution of the Cenozoic Terrestrial Mammalian Predator Guild in South America: Competition or Replacement?</w:t>
+        <w:t xml:space="preserve">Tarquini, S.D., Ladevèze, S., and Prevosti, F.J. (2022). The multicausal twilight of South American native mammalian predators (Metatheria, Sparassodonta). Scientific Reports</w:t>
       </w:r>
       <w:r>
         <w:t xml:space="preserve"> </w:t>
@@ -3863,41 +4086,34 @@
           <w:i/>
           <w:iCs/>
         </w:rPr>
-        <w:t xml:space="preserve">Journal of Mammalian Evolution</w:t>
-      </w:r>
-      <w:r>
-        <w:t xml:space="preserve"> </w:t>
-      </w:r>
-      <w:r>
-        <w:rPr>
-          <w:b/>
-          <w:bCs/>
-        </w:rPr>
-        <w:t xml:space="preserve">20</w:t>
-      </w:r>
-      <w:r>
-        <w:t xml:space="preserve">, 3–21. (doi:</w:t>
-      </w:r>
-      <w:hyperlink r:id="rId85">
+        <w:t xml:space="preserve">12</w:t>
+      </w:r>
+      <w:r>
+        <w:t xml:space="preserve">, 1224.</w:t>
+      </w:r>
+      <w:r>
+        <w:t xml:space="preserve"> </w:t>
+      </w:r>
+      <w:hyperlink r:id="rId84">
         <w:r>
           <w:rPr>
             <w:rStyle w:val="Hyperlink"/>
           </w:rPr>
-          <w:t xml:space="preserve">10.1007/s10914-011-9175-9</w:t>
+          <w:t xml:space="preserve">https://doi.org/10.1038/s41598-022-05266-z</w:t>
         </w:r>
       </w:hyperlink>
       <w:r>
-        <w:t xml:space="preserve">)</w:t>
-      </w:r>
-    </w:p>
-    <w:bookmarkEnd w:id="86"/>
-    <w:bookmarkStart w:id="88" w:name="ref-tarquini2022"/>
+        <w:t xml:space="preserve">.</w:t>
+      </w:r>
+    </w:p>
+    <w:bookmarkEnd w:id="85"/>
+    <w:bookmarkStart w:id="87" w:name="ref-marsà2025"/>
     <w:p>
       <w:pPr>
         <w:pStyle w:val="Bibliography"/>
       </w:pPr>
       <w:r>
-        <w:t xml:space="preserve">22.</w:t>
+        <w:t xml:space="preserve">23.</w:t>
       </w:r>
       <w:r>
         <w:t xml:space="preserve"> </w:t>
@@ -3906,7 +4122,25 @@
         <w:t xml:space="preserve">	</w:t>
       </w:r>
       <w:r>
-        <w:t xml:space="preserve">Tarquini SD, Ladevèze S, Prevosti FJ. 2022 The multicausal twilight of South American native mammalian predators (Metatheria, Sparassodonta).</w:t>
+        <w:t xml:space="preserve">Marsà, J.A.G., Agnolín, F.L., Angst, D., and Buffetaut, E. (2025). Paleohistological Analysis of</w:t>
+      </w:r>
+      <w:r>
+        <w:t xml:space="preserve"> </w:t>
+      </w:r>
+      <w:r>
+        <w:t xml:space="preserve">“</w:t>
+      </w:r>
+      <w:r>
+        <w:t xml:space="preserve">Terror Birds</w:t>
+      </w:r>
+      <w:r>
+        <w:t xml:space="preserve">”</w:t>
+      </w:r>
+      <w:r>
+        <w:t xml:space="preserve"> </w:t>
+      </w:r>
+      <w:r>
+        <w:t xml:space="preserve">(Phorusrhacidae, Brontornithidae): Paleobiological Inferences. Diversity</w:t>
       </w:r>
       <w:r>
         <w:t xml:space="preserve"> </w:t>
@@ -3916,41 +4150,34 @@
           <w:i/>
           <w:iCs/>
         </w:rPr>
-        <w:t xml:space="preserve">Scientific Reports</w:t>
-      </w:r>
-      <w:r>
-        <w:t xml:space="preserve"> </w:t>
-      </w:r>
-      <w:r>
-        <w:rPr>
-          <w:b/>
-          <w:bCs/>
-        </w:rPr>
-        <w:t xml:space="preserve">12</w:t>
-      </w:r>
-      <w:r>
-        <w:t xml:space="preserve">, 1224. (doi:</w:t>
-      </w:r>
-      <w:hyperlink r:id="rId87">
+        <w:t xml:space="preserve">17</w:t>
+      </w:r>
+      <w:r>
+        <w:t xml:space="preserve">, 153.</w:t>
+      </w:r>
+      <w:r>
+        <w:t xml:space="preserve"> </w:t>
+      </w:r>
+      <w:hyperlink r:id="rId86">
         <w:r>
           <w:rPr>
             <w:rStyle w:val="Hyperlink"/>
           </w:rPr>
-          <w:t xml:space="preserve">10.1038/s41598-022-05266-z</w:t>
+          <w:t xml:space="preserve">https://doi.org/10.3390/d17030153</w:t>
         </w:r>
       </w:hyperlink>
       <w:r>
-        <w:t xml:space="preserve">)</w:t>
-      </w:r>
-    </w:p>
-    <w:bookmarkEnd w:id="88"/>
-    <w:bookmarkStart w:id="90" w:name="ref-marsà2025"/>
+        <w:t xml:space="preserve">.</w:t>
+      </w:r>
+    </w:p>
+    <w:bookmarkEnd w:id="87"/>
+    <w:bookmarkStart w:id="89" w:name="ref-freitas-oliveira2024"/>
     <w:p>
       <w:pPr>
         <w:pStyle w:val="Bibliography"/>
       </w:pPr>
       <w:r>
-        <w:t xml:space="preserve">23.</w:t>
+        <w:t xml:space="preserve">24.</w:t>
       </w:r>
       <w:r>
         <w:t xml:space="preserve"> </w:t>
@@ -3959,25 +4186,7 @@
         <w:t xml:space="preserve">	</w:t>
       </w:r>
       <w:r>
-        <w:t xml:space="preserve">Marsà JAG, Agnolín FL, Angst D, Buffetaut E. 2025 Paleohistological Analysis of</w:t>
-      </w:r>
-      <w:r>
-        <w:t xml:space="preserve"> </w:t>
-      </w:r>
-      <w:r>
-        <w:t xml:space="preserve">“</w:t>
-      </w:r>
-      <w:r>
-        <w:t xml:space="preserve">Terror Birds</w:t>
-      </w:r>
-      <w:r>
-        <w:t xml:space="preserve">”</w:t>
-      </w:r>
-      <w:r>
-        <w:t xml:space="preserve"> </w:t>
-      </w:r>
-      <w:r>
-        <w:t xml:space="preserve">(Phorusrhacidae, Brontornithidae): Paleobiological Inferences.</w:t>
+        <w:t xml:space="preserve">Freitas-Oliveira, R., Lima-Ribeiro, M.S., and Terribile, L.C. (2024). No evidence for niche competition in the extinction of the South American saber-tooth species. npj Biodiversity</w:t>
       </w:r>
       <w:r>
         <w:t xml:space="preserve"> </w:t>
@@ -3987,41 +4196,34 @@
           <w:i/>
           <w:iCs/>
         </w:rPr>
-        <w:t xml:space="preserve">Diversity</w:t>
-      </w:r>
-      <w:r>
-        <w:t xml:space="preserve"> </w:t>
-      </w:r>
-      <w:r>
-        <w:rPr>
-          <w:b/>
-          <w:bCs/>
-        </w:rPr>
-        <w:t xml:space="preserve">17</w:t>
-      </w:r>
-      <w:r>
-        <w:t xml:space="preserve">, 153. (doi:</w:t>
-      </w:r>
-      <w:hyperlink r:id="rId89">
+        <w:t xml:space="preserve">3</w:t>
+      </w:r>
+      <w:r>
+        <w:t xml:space="preserve">, 1–5.</w:t>
+      </w:r>
+      <w:r>
+        <w:t xml:space="preserve"> </w:t>
+      </w:r>
+      <w:hyperlink r:id="rId88">
         <w:r>
           <w:rPr>
             <w:rStyle w:val="Hyperlink"/>
           </w:rPr>
-          <w:t xml:space="preserve">10.3390/d17030153</w:t>
+          <w:t xml:space="preserve">https://doi.org/10.1038/s44185-024-00045-7</w:t>
         </w:r>
       </w:hyperlink>
       <w:r>
-        <w:t xml:space="preserve">)</w:t>
-      </w:r>
-    </w:p>
-    <w:bookmarkEnd w:id="90"/>
-    <w:bookmarkStart w:id="92" w:name="ref-freitas-oliveira2024"/>
+        <w:t xml:space="preserve">.</w:t>
+      </w:r>
+    </w:p>
+    <w:bookmarkEnd w:id="89"/>
+    <w:bookmarkStart w:id="91" w:name="ref-pilowsky2022"/>
     <w:p>
       <w:pPr>
         <w:pStyle w:val="Bibliography"/>
       </w:pPr>
       <w:r>
-        <w:t xml:space="preserve">24.</w:t>
+        <w:t xml:space="preserve">25.</w:t>
       </w:r>
       <w:r>
         <w:t xml:space="preserve"> </w:t>
@@ -4030,7 +4232,7 @@
         <w:t xml:space="preserve">	</w:t>
       </w:r>
       <w:r>
-        <w:t xml:space="preserve">Freitas-Oliveira R, Lima-Ribeiro MS, Terribile LC. 2024 No evidence for niche competition in the extinction of the South American saber-tooth species.</w:t>
+        <w:t xml:space="preserve">Pilowsky, J.A., Colwell, R.K., Rahbek, C., and Fordham, D.A. (2022). Process-explicit models reveal the structure and dynamics of biodiversity patterns. Science Advances</w:t>
       </w:r>
       <w:r>
         <w:t xml:space="preserve"> </w:t>
@@ -4040,41 +4242,34 @@
           <w:i/>
           <w:iCs/>
         </w:rPr>
-        <w:t xml:space="preserve">npj Biodiversity</w:t>
-      </w:r>
-      <w:r>
-        <w:t xml:space="preserve"> </w:t>
-      </w:r>
-      <w:r>
-        <w:rPr>
-          <w:b/>
-          <w:bCs/>
-        </w:rPr>
-        <w:t xml:space="preserve">3</w:t>
-      </w:r>
-      <w:r>
-        <w:t xml:space="preserve">, 1–5. (doi:</w:t>
-      </w:r>
-      <w:hyperlink r:id="rId91">
+        <w:t xml:space="preserve">8</w:t>
+      </w:r>
+      <w:r>
+        <w:t xml:space="preserve">, eabj2271.</w:t>
+      </w:r>
+      <w:r>
+        <w:t xml:space="preserve"> </w:t>
+      </w:r>
+      <w:hyperlink r:id="rId90">
         <w:r>
           <w:rPr>
             <w:rStyle w:val="Hyperlink"/>
           </w:rPr>
-          <w:t xml:space="preserve">10.1038/s44185-024-00045-7</w:t>
+          <w:t xml:space="preserve">https://doi.org/10.1126/sciadv.abj2271</w:t>
         </w:r>
       </w:hyperlink>
       <w:r>
-        <w:t xml:space="preserve">)</w:t>
-      </w:r>
-    </w:p>
-    <w:bookmarkEnd w:id="92"/>
-    <w:bookmarkStart w:id="94" w:name="ref-pilowsky2022"/>
+        <w:t xml:space="preserve">.</w:t>
+      </w:r>
+    </w:p>
+    <w:bookmarkEnd w:id="91"/>
+    <w:bookmarkStart w:id="93" w:name="ref-hagen2023"/>
     <w:p>
       <w:pPr>
         <w:pStyle w:val="Bibliography"/>
       </w:pPr>
       <w:r>
-        <w:t xml:space="preserve">25.</w:t>
+        <w:t xml:space="preserve">26.</w:t>
       </w:r>
       <w:r>
         <w:t xml:space="preserve"> </w:t>
@@ -4083,7 +4278,7 @@
         <w:t xml:space="preserve">	</w:t>
       </w:r>
       <w:r>
-        <w:t xml:space="preserve">Pilowsky JA, Colwell RK, Rahbek C, Fordham DA. 2022 Process-explicit models reveal the structure and dynamics of biodiversity patterns.</w:t>
+        <w:t xml:space="preserve">Hagen, O. (2023). Coupling eco-evolutionary mechanisms with deep-time environmental dynamics to understand biodiversity patterns. Ecography</w:t>
       </w:r>
       <w:r>
         <w:t xml:space="preserve"> </w:t>
@@ -4093,41 +4288,34 @@
           <w:i/>
           <w:iCs/>
         </w:rPr>
-        <w:t xml:space="preserve">Science Advances</w:t>
-      </w:r>
-      <w:r>
-        <w:t xml:space="preserve"> </w:t>
-      </w:r>
-      <w:r>
-        <w:rPr>
-          <w:b/>
-          <w:bCs/>
-        </w:rPr>
-        <w:t xml:space="preserve">8</w:t>
-      </w:r>
-      <w:r>
-        <w:t xml:space="preserve">, eabj2271. (doi:</w:t>
-      </w:r>
-      <w:hyperlink r:id="rId93">
+        <w:t xml:space="preserve">2023</w:t>
+      </w:r>
+      <w:r>
+        <w:t xml:space="preserve">, e06132.</w:t>
+      </w:r>
+      <w:r>
+        <w:t xml:space="preserve"> </w:t>
+      </w:r>
+      <w:hyperlink r:id="rId92">
         <w:r>
           <w:rPr>
             <w:rStyle w:val="Hyperlink"/>
           </w:rPr>
-          <w:t xml:space="preserve">10.1126/sciadv.abj2271</w:t>
+          <w:t xml:space="preserve">https://doi.org/10.1111/ecog.06132</w:t>
         </w:r>
       </w:hyperlink>
       <w:r>
-        <w:t xml:space="preserve">)</w:t>
-      </w:r>
-    </w:p>
-    <w:bookmarkEnd w:id="94"/>
-    <w:bookmarkStart w:id="96" w:name="ref-hagen2023"/>
+        <w:t xml:space="preserve">.</w:t>
+      </w:r>
+    </w:p>
+    <w:bookmarkEnd w:id="93"/>
+    <w:bookmarkStart w:id="95" w:name="ref-hagen2021"/>
     <w:p>
       <w:pPr>
         <w:pStyle w:val="Bibliography"/>
       </w:pPr>
       <w:r>
-        <w:t xml:space="preserve">26.</w:t>
+        <w:t xml:space="preserve">27.</w:t>
       </w:r>
       <w:r>
         <w:t xml:space="preserve"> </w:t>
@@ -4136,7 +4324,13 @@
         <w:t xml:space="preserve">	</w:t>
       </w:r>
       <w:r>
-        <w:t xml:space="preserve">Hagen O. 2023 Coupling eco-evolutionary mechanisms with deep-time environmental dynamics to understand biodiversity patterns.</w:t>
+        <w:t xml:space="preserve">Hagen, O., Flück, B., Fopp, F., Cabral, J.S., Hartig, F., Pontarp, M., Rangel, T.F., and Pellissier, L. (2021). gen3sis: A general engine for eco-evolutionary simulations of the processes that shape Earth</w:t>
+      </w:r>
+      <w:r>
+        <w:t xml:space="preserve">’</w:t>
+      </w:r>
+      <w:r>
+        <w:t xml:space="preserve">s biodiversity. PLOS Biology</w:t>
       </w:r>
       <w:r>
         <w:t xml:space="preserve"> </w:t>
@@ -4146,41 +4340,34 @@
           <w:i/>
           <w:iCs/>
         </w:rPr>
-        <w:t xml:space="preserve">Ecography</w:t>
-      </w:r>
-      <w:r>
-        <w:t xml:space="preserve"> </w:t>
-      </w:r>
-      <w:r>
-        <w:rPr>
-          <w:b/>
-          <w:bCs/>
-        </w:rPr>
-        <w:t xml:space="preserve">2023</w:t>
-      </w:r>
-      <w:r>
-        <w:t xml:space="preserve">, e06132. (doi:</w:t>
-      </w:r>
-      <w:hyperlink r:id="rId95">
+        <w:t xml:space="preserve">19</w:t>
+      </w:r>
+      <w:r>
+        <w:t xml:space="preserve">, e3001340.</w:t>
+      </w:r>
+      <w:r>
+        <w:t xml:space="preserve"> </w:t>
+      </w:r>
+      <w:hyperlink r:id="rId94">
         <w:r>
           <w:rPr>
             <w:rStyle w:val="Hyperlink"/>
           </w:rPr>
-          <w:t xml:space="preserve">10.1111/ecog.06132</w:t>
+          <w:t xml:space="preserve">https://doi.org/10.1371/journal.pbio.3001340</w:t>
         </w:r>
       </w:hyperlink>
       <w:r>
-        <w:t xml:space="preserve">)</w:t>
-      </w:r>
-    </w:p>
-    <w:bookmarkEnd w:id="96"/>
-    <w:bookmarkStart w:id="98" w:name="ref-hagen2021"/>
+        <w:t xml:space="preserve">.</w:t>
+      </w:r>
+    </w:p>
+    <w:bookmarkEnd w:id="95"/>
+    <w:bookmarkStart w:id="97" w:name="ref-hagen2021b"/>
     <w:p>
       <w:pPr>
         <w:pStyle w:val="Bibliography"/>
       </w:pPr>
       <w:r>
-        <w:t xml:space="preserve">27.</w:t>
+        <w:t xml:space="preserve">28.</w:t>
       </w:r>
       <w:r>
         <w:t xml:space="preserve"> </w:t>
@@ -4189,13 +4376,7 @@
         <w:t xml:space="preserve">	</w:t>
       </w:r>
       <w:r>
-        <w:t xml:space="preserve">Hagen O, Flück B, Fopp F, Cabral JS, Hartig F, Pontarp M, Rangel TF, Pellissier L. 2021 gen3sis: A general engine for eco-evolutionary simulations of the processes that shape Earth</w:t>
-      </w:r>
-      <w:r>
-        <w:t xml:space="preserve">’</w:t>
-      </w:r>
-      <w:r>
-        <w:t xml:space="preserve">s biodiversity.</w:t>
+        <w:t xml:space="preserve">Hagen, O., Skeels, A., Onstein, R.E., Jetz, W., and Pellissier, L. (2021). Earth history events shaped the evolution of uneven biodiversity across tropical moist forests. Proceedings of the National Academy of Sciences</w:t>
       </w:r>
       <w:r>
         <w:t xml:space="preserve"> </w:t>
@@ -4205,41 +4386,34 @@
           <w:i/>
           <w:iCs/>
         </w:rPr>
-        <w:t xml:space="preserve">PLOS Biology</w:t>
-      </w:r>
-      <w:r>
-        <w:t xml:space="preserve"> </w:t>
-      </w:r>
-      <w:r>
-        <w:rPr>
-          <w:b/>
-          <w:bCs/>
-        </w:rPr>
-        <w:t xml:space="preserve">19</w:t>
-      </w:r>
-      <w:r>
-        <w:t xml:space="preserve">, e3001340. (doi:</w:t>
-      </w:r>
-      <w:hyperlink r:id="rId97">
+        <w:t xml:space="preserve">118</w:t>
+      </w:r>
+      <w:r>
+        <w:t xml:space="preserve">, e2026347118.</w:t>
+      </w:r>
+      <w:r>
+        <w:t xml:space="preserve"> </w:t>
+      </w:r>
+      <w:hyperlink r:id="rId96">
         <w:r>
           <w:rPr>
             <w:rStyle w:val="Hyperlink"/>
           </w:rPr>
-          <w:t xml:space="preserve">10.1371/journal.pbio.3001340</w:t>
+          <w:t xml:space="preserve">https://doi.org/10.1073/pnas.2026347118</w:t>
         </w:r>
       </w:hyperlink>
       <w:r>
-        <w:t xml:space="preserve">)</w:t>
-      </w:r>
-    </w:p>
-    <w:bookmarkEnd w:id="98"/>
-    <w:bookmarkStart w:id="100" w:name="ref-hagen2021b"/>
+        <w:t xml:space="preserve">.</w:t>
+      </w:r>
+    </w:p>
+    <w:bookmarkEnd w:id="97"/>
+    <w:bookmarkStart w:id="99" w:name="ref-skeels2023b"/>
     <w:p>
       <w:pPr>
         <w:pStyle w:val="Bibliography"/>
       </w:pPr>
       <w:r>
-        <w:t xml:space="preserve">28.</w:t>
+        <w:t xml:space="preserve">29.</w:t>
       </w:r>
       <w:r>
         <w:t xml:space="preserve"> </w:t>
@@ -4248,7 +4422,7 @@
         <w:t xml:space="preserve">	</w:t>
       </w:r>
       <w:r>
-        <w:t xml:space="preserve">Hagen O, Skeels A, Onstein RE, Jetz W, Pellissier L. 2021 Earth history events shaped the evolution of uneven biodiversity across tropical moist forests.</w:t>
+        <w:t xml:space="preserve">Skeels, A., Boschman, L.M., McFadden, I.R., Joyce, E.M., Hagen, O., Jiménez Robles, O., Bach, W., Boussange, V., Keggin, T., Jetz, W., et al. (2023). Paleoenvironments shaped the exchange of terrestrial vertebrates across wallace’s line. Science</w:t>
       </w:r>
       <w:r>
         <w:t xml:space="preserve"> </w:t>
@@ -4258,41 +4432,34 @@
           <w:i/>
           <w:iCs/>
         </w:rPr>
-        <w:t xml:space="preserve">Proceedings of the National Academy of Sciences</w:t>
-      </w:r>
-      <w:r>
-        <w:t xml:space="preserve"> </w:t>
-      </w:r>
-      <w:r>
-        <w:rPr>
-          <w:b/>
-          <w:bCs/>
-        </w:rPr>
-        <w:t xml:space="preserve">118</w:t>
-      </w:r>
-      <w:r>
-        <w:t xml:space="preserve">, e2026347118. (doi:</w:t>
-      </w:r>
-      <w:hyperlink r:id="rId99">
+        <w:t xml:space="preserve">381</w:t>
+      </w:r>
+      <w:r>
+        <w:t xml:space="preserve">, 86–92.</w:t>
+      </w:r>
+      <w:r>
+        <w:t xml:space="preserve"> </w:t>
+      </w:r>
+      <w:hyperlink r:id="rId98">
         <w:r>
           <w:rPr>
             <w:rStyle w:val="Hyperlink"/>
           </w:rPr>
-          <w:t xml:space="preserve">10.1073/pnas.2026347118</w:t>
+          <w:t xml:space="preserve">https://doi.org/10.1126/science.adf7122</w:t>
         </w:r>
       </w:hyperlink>
       <w:r>
-        <w:t xml:space="preserve">)</w:t>
-      </w:r>
-    </w:p>
-    <w:bookmarkEnd w:id="100"/>
-    <w:bookmarkStart w:id="102" w:name="ref-skeels2023b"/>
+        <w:t xml:space="preserve">.</w:t>
+      </w:r>
+    </w:p>
+    <w:bookmarkEnd w:id="99"/>
+    <w:bookmarkStart w:id="101" w:name="ref-boschman2023"/>
     <w:p>
       <w:pPr>
         <w:pStyle w:val="Bibliography"/>
       </w:pPr>
       <w:r>
-        <w:t xml:space="preserve">29.</w:t>
+        <w:t xml:space="preserve">30.</w:t>
       </w:r>
       <w:r>
         <w:t xml:space="preserve"> </w:t>
@@ -4301,7 +4468,7 @@
         <w:t xml:space="preserve">	</w:t>
       </w:r>
       <w:r>
-        <w:t xml:space="preserve">Skeels A</w:t>
+        <w:t xml:space="preserve">Boschman, L.M., Carraro, L., Cassemiro, F.A.S., Vries, J. de, Altermatt, F., Hagen, O., Hoorn, C., and Pellissier, L. (2023). Freshwater fish diversity in the western Amazon basin shaped by Andean uplift since the Late Cretaceous. Nature Ecology &amp; Evolution</w:t>
       </w:r>
       <w:r>
         <w:t xml:space="preserve"> </w:t>
@@ -4311,54 +4478,34 @@
           <w:i/>
           <w:iCs/>
         </w:rPr>
-        <w:t xml:space="preserve">et al.</w:t>
-      </w:r>
-      <w:r>
-        <w:t xml:space="preserve"> 2023 Paleoenvironments shaped the exchange of terrestrial vertebrates across wallace’s line.</w:t>
-      </w:r>
-      <w:r>
-        <w:t xml:space="preserve"> </w:t>
-      </w:r>
-      <w:r>
-        <w:rPr>
-          <w:i/>
-          <w:iCs/>
-        </w:rPr>
-        <w:t xml:space="preserve">Science</w:t>
-      </w:r>
-      <w:r>
-        <w:t xml:space="preserve"> </w:t>
-      </w:r>
-      <w:r>
-        <w:rPr>
-          <w:b/>
-          <w:bCs/>
-        </w:rPr>
-        <w:t xml:space="preserve">381</w:t>
-      </w:r>
-      <w:r>
-        <w:t xml:space="preserve">, 86–92. (doi:</w:t>
-      </w:r>
-      <w:hyperlink r:id="rId101">
+        <w:t xml:space="preserve">7</w:t>
+      </w:r>
+      <w:r>
+        <w:t xml:space="preserve">, 2037–2044.</w:t>
+      </w:r>
+      <w:r>
+        <w:t xml:space="preserve"> </w:t>
+      </w:r>
+      <w:hyperlink r:id="rId100">
         <w:r>
           <w:rPr>
             <w:rStyle w:val="Hyperlink"/>
           </w:rPr>
-          <w:t xml:space="preserve">10.1126/science.adf7122</w:t>
+          <w:t xml:space="preserve">https://doi.org/10.1038/s41559-023-02220-8</w:t>
         </w:r>
       </w:hyperlink>
       <w:r>
-        <w:t xml:space="preserve">)</w:t>
-      </w:r>
-    </w:p>
-    <w:bookmarkEnd w:id="102"/>
-    <w:bookmarkStart w:id="104" w:name="ref-boschman2023"/>
+        <w:t xml:space="preserve">.</w:t>
+      </w:r>
+    </w:p>
+    <w:bookmarkEnd w:id="101"/>
+    <w:bookmarkStart w:id="103" w:name="ref-skeels2023"/>
     <w:p>
       <w:pPr>
         <w:pStyle w:val="Bibliography"/>
       </w:pPr>
       <w:r>
-        <w:t xml:space="preserve">30.</w:t>
+        <w:t xml:space="preserve">31.</w:t>
       </w:r>
       <w:r>
         <w:t xml:space="preserve"> </w:t>
@@ -4367,7 +4514,7 @@
         <w:t xml:space="preserve">	</w:t>
       </w:r>
       <w:r>
-        <w:t xml:space="preserve">Boschman LM, Carraro L, Cassemiro FAS, Vries J de, Altermatt F, Hagen O, Hoorn C, Pellissier L. 2023 Freshwater fish diversity in the western Amazon basin shaped by Andean uplift since the Late Cretaceous.</w:t>
+        <w:t xml:space="preserve">Skeels, A., Bach, W., Hagen, O., Jetz, W., and Pellissier, L. (2023). Temperature-dependent evolutionary speed shapes the evolution of biodiversity patterns across tetrapod radiations. Systematic Biology</w:t>
       </w:r>
       <w:r>
         <w:t xml:space="preserve"> </w:t>
@@ -4377,41 +4524,34 @@
           <w:i/>
           <w:iCs/>
         </w:rPr>
-        <w:t xml:space="preserve">Nature Ecology &amp; Evolution</w:t>
-      </w:r>
-      <w:r>
-        <w:t xml:space="preserve"> </w:t>
-      </w:r>
-      <w:r>
-        <w:rPr>
-          <w:b/>
-          <w:bCs/>
-        </w:rPr>
-        <w:t xml:space="preserve">7</w:t>
-      </w:r>
-      <w:r>
-        <w:t xml:space="preserve">, 2037–2044. (doi:</w:t>
-      </w:r>
-      <w:hyperlink r:id="rId103">
+        <w:t xml:space="preserve">72</w:t>
+      </w:r>
+      <w:r>
+        <w:t xml:space="preserve">, 341–356.</w:t>
+      </w:r>
+      <w:r>
+        <w:t xml:space="preserve"> </w:t>
+      </w:r>
+      <w:hyperlink r:id="rId102">
         <w:r>
           <w:rPr>
             <w:rStyle w:val="Hyperlink"/>
           </w:rPr>
-          <w:t xml:space="preserve">10.1038/s41559-023-02220-8</w:t>
+          <w:t xml:space="preserve">https://doi.org/10.1093/sysbio/syac048</w:t>
         </w:r>
       </w:hyperlink>
       <w:r>
-        <w:t xml:space="preserve">)</w:t>
-      </w:r>
-    </w:p>
-    <w:bookmarkEnd w:id="104"/>
-    <w:bookmarkStart w:id="106" w:name="ref-skeels2023"/>
+        <w:t xml:space="preserve">.</w:t>
+      </w:r>
+    </w:p>
+    <w:bookmarkEnd w:id="103"/>
+    <w:bookmarkStart w:id="105" w:name="ref-liu2024"/>
     <w:p>
       <w:pPr>
         <w:pStyle w:val="Bibliography"/>
       </w:pPr>
       <w:r>
-        <w:t xml:space="preserve">31.</w:t>
+        <w:t xml:space="preserve">32.</w:t>
       </w:r>
       <w:r>
         <w:t xml:space="preserve"> </w:t>
@@ -4420,7 +4560,7 @@
         <w:t xml:space="preserve">	</w:t>
       </w:r>
       <w:r>
-        <w:t xml:space="preserve">Skeels A, Bach W, Hagen O, Jetz W, Pellissier L. 2023 Temperature-dependent evolutionary speed shapes the evolution of biodiversity patterns across tetrapod radiations.</w:t>
+        <w:t xml:space="preserve">Liu, Y., Wang, Y., Willett, S.D., Zimmermann, N.E., and Pellissier, L. (2024). Escarpment evolution drives the diversification of the madagascar flora. Science</w:t>
       </w:r>
       <w:r>
         <w:t xml:space="preserve"> </w:t>
@@ -4430,41 +4570,34 @@
           <w:i/>
           <w:iCs/>
         </w:rPr>
-        <w:t xml:space="preserve">Systematic Biology</w:t>
-      </w:r>
-      <w:r>
-        <w:t xml:space="preserve"> </w:t>
-      </w:r>
-      <w:r>
-        <w:rPr>
-          <w:b/>
-          <w:bCs/>
-        </w:rPr>
-        <w:t xml:space="preserve">72</w:t>
-      </w:r>
-      <w:r>
-        <w:t xml:space="preserve">, 341–356. (doi:</w:t>
-      </w:r>
-      <w:hyperlink r:id="rId105">
+        <w:t xml:space="preserve">383</w:t>
+      </w:r>
+      <w:r>
+        <w:t xml:space="preserve">, 653–658.</w:t>
+      </w:r>
+      <w:r>
+        <w:t xml:space="preserve"> </w:t>
+      </w:r>
+      <w:hyperlink r:id="rId104">
         <w:r>
           <w:rPr>
             <w:rStyle w:val="Hyperlink"/>
           </w:rPr>
-          <w:t xml:space="preserve">10.1093/sysbio/syac048</w:t>
+          <w:t xml:space="preserve">https://doi.org/10.1126/science.adi0833</w:t>
         </w:r>
       </w:hyperlink>
       <w:r>
-        <w:t xml:space="preserve">)</w:t>
-      </w:r>
-    </w:p>
-    <w:bookmarkEnd w:id="106"/>
-    <w:bookmarkStart w:id="108" w:name="ref-liu2024"/>
+        <w:t xml:space="preserve">.</w:t>
+      </w:r>
+    </w:p>
+    <w:bookmarkEnd w:id="105"/>
+    <w:bookmarkStart w:id="107" w:name="ref-holden2019"/>
     <w:p>
       <w:pPr>
         <w:pStyle w:val="Bibliography"/>
       </w:pPr>
       <w:r>
-        <w:t xml:space="preserve">32.</w:t>
+        <w:t xml:space="preserve">33.</w:t>
       </w:r>
       <w:r>
         <w:t xml:space="preserve"> </w:t>
@@ -4473,7 +4606,10 @@
         <w:t xml:space="preserve">	</w:t>
       </w:r>
       <w:r>
-        <w:t xml:space="preserve">Liu Y, Wang Y, Willett SD, Zimmermann NE, Pellissier L. 2024 Escarpment evolution drives the diversification of the madagascar flora.</w:t>
+        <w:t xml:space="preserve">Holden, P.B., Edwards, N.R., Rangel, T.F., Pereira, E.B., Tran, G.T., and Wilkinson, R.D. (2019). PALEO-PGEM v1.0: A statistical emulator of pliocene</w:t>
+      </w:r>
+      <w:r>
+        <w:t xml:space="preserve">pleistocene climate. Geoscientific Model Development</w:t>
       </w:r>
       <w:r>
         <w:t xml:space="preserve"> </w:t>
@@ -4483,78 +4619,12 @@
           <w:i/>
           <w:iCs/>
         </w:rPr>
-        <w:t xml:space="preserve">Science</w:t>
-      </w:r>
-      <w:r>
-        <w:t xml:space="preserve"> </w:t>
-      </w:r>
-      <w:r>
-        <w:rPr>
-          <w:b/>
-          <w:bCs/>
-        </w:rPr>
-        <w:t xml:space="preserve">383</w:t>
-      </w:r>
-      <w:r>
-        <w:t xml:space="preserve">, 653–658. (doi:</w:t>
-      </w:r>
-      <w:hyperlink r:id="rId107">
-        <w:r>
-          <w:rPr>
-            <w:rStyle w:val="Hyperlink"/>
-          </w:rPr>
-          <w:t xml:space="preserve">10.1126/science.adi0833</w:t>
-        </w:r>
-      </w:hyperlink>
-      <w:r>
-        <w:t xml:space="preserve">)</w:t>
-      </w:r>
-    </w:p>
-    <w:bookmarkEnd w:id="108"/>
-    <w:bookmarkStart w:id="110" w:name="ref-holden2019"/>
-    <w:p>
-      <w:pPr>
-        <w:pStyle w:val="Bibliography"/>
-      </w:pPr>
-      <w:r>
-        <w:t xml:space="preserve">33.</w:t>
-      </w:r>
-      <w:r>
-        <w:t xml:space="preserve"> </w:t>
-      </w:r>
-      <w:r>
-        <w:t xml:space="preserve">	</w:t>
-      </w:r>
-      <w:r>
-        <w:t xml:space="preserve">Holden PB, Edwards NR, Rangel TF, Pereira EB, Tran GT, Wilkinson RD. 2019 PALEO-PGEM v1.0: A statistical emulator of pliocene</w:t>
-      </w:r>
-      <w:r>
-        <w:t xml:space="preserve">pleistocene climate.</w:t>
-      </w:r>
-      <w:r>
-        <w:t xml:space="preserve"> </w:t>
-      </w:r>
-      <w:r>
-        <w:rPr>
-          <w:i/>
-          <w:iCs/>
-        </w:rPr>
-        <w:t xml:space="preserve">Geoscientific Model Development</w:t>
-      </w:r>
-      <w:r>
-        <w:t xml:space="preserve"> </w:t>
-      </w:r>
-      <w:r>
-        <w:rPr>
-          <w:b/>
-          <w:bCs/>
-        </w:rPr>
         <w:t xml:space="preserve">12</w:t>
       </w:r>
       <w:r>
-        <w:t xml:space="preserve">, 5137–5155. (doi:</w:t>
-      </w:r>
-      <w:hyperlink r:id="rId109">
+        <w:t xml:space="preserve">, 5137–5155. https://doi.org/</w:t>
+      </w:r>
+      <w:hyperlink r:id="rId106">
         <w:r>
           <w:rPr>
             <w:rStyle w:val="Hyperlink"/>
@@ -4563,11 +4633,11 @@
         </w:r>
       </w:hyperlink>
       <w:r>
-        <w:t xml:space="preserve">)</w:t>
-      </w:r>
-    </w:p>
-    <w:bookmarkEnd w:id="110"/>
-    <w:bookmarkStart w:id="112" w:name="ref-barreto2023"/>
+        <w:t xml:space="preserve">.</w:t>
+      </w:r>
+    </w:p>
+    <w:bookmarkEnd w:id="107"/>
+    <w:bookmarkStart w:id="109" w:name="ref-barreto2023"/>
     <w:p>
       <w:pPr>
         <w:pStyle w:val="Bibliography"/>
@@ -4582,7 +4652,7 @@
         <w:t xml:space="preserve">	</w:t>
       </w:r>
       <w:r>
-        <w:t xml:space="preserve">Barreto E, Holden PB, Edwards NR, Rangel TF. 2023 PALEO-PGEM-Series: A spatial time series of the global climate over the last 5 million years (Plio-Pleistocene).</w:t>
+        <w:t xml:space="preserve">Barreto, E., Holden, P.B., Edwards, N.R., and Rangel, T.F. (2023). PALEO-PGEM-Series: A spatial time series of the global climate over the last 5 million years (Plio-Pleistocene). Global Ecology and Biogeography</w:t>
       </w:r>
       <w:r>
         <w:t xml:space="preserve"> </w:t>
@@ -4592,35 +4662,28 @@
           <w:i/>
           <w:iCs/>
         </w:rPr>
-        <w:t xml:space="preserve">Global Ecology and Biogeography</w:t>
-      </w:r>
-      <w:r>
-        <w:t xml:space="preserve"> </w:t>
-      </w:r>
-      <w:r>
-        <w:rPr>
-          <w:b/>
-          <w:bCs/>
-        </w:rPr>
         <w:t xml:space="preserve">32</w:t>
       </w:r>
       <w:r>
-        <w:t xml:space="preserve">, 1034–1045. (doi:</w:t>
-      </w:r>
-      <w:hyperlink r:id="rId111">
+        <w:t xml:space="preserve">, 1034–1045.</w:t>
+      </w:r>
+      <w:r>
+        <w:t xml:space="preserve"> </w:t>
+      </w:r>
+      <w:hyperlink r:id="rId108">
         <w:r>
           <w:rPr>
             <w:rStyle w:val="Hyperlink"/>
           </w:rPr>
-          <w:t xml:space="preserve">10.1111/geb.13683</w:t>
+          <w:t xml:space="preserve">https://doi.org/10.1111/geb.13683</w:t>
         </w:r>
       </w:hyperlink>
       <w:r>
-        <w:t xml:space="preserve">)</w:t>
-      </w:r>
-    </w:p>
-    <w:bookmarkEnd w:id="112"/>
-    <w:bookmarkStart w:id="114" w:name="ref-galván2023"/>
+        <w:t xml:space="preserve">.</w:t>
+      </w:r>
+    </w:p>
+    <w:bookmarkEnd w:id="109"/>
+    <w:bookmarkStart w:id="111" w:name="ref-galván2023"/>
     <w:p>
       <w:pPr>
         <w:pStyle w:val="Bibliography"/>
@@ -4635,12 +4698,12 @@
         <w:t xml:space="preserve">	</w:t>
       </w:r>
       <w:r>
-        <w:t xml:space="preserve">Galván S, Gamboa S, Varela S. 2023</w:t>
-      </w:r>
-      <w:r>
-        <w:t xml:space="preserve"> </w:t>
-      </w:r>
-      <w:hyperlink r:id="rId113">
+        <w:t xml:space="preserve">Galván, S., Gamboa, S., and Varela, S. (2023).</w:t>
+      </w:r>
+      <w:r>
+        <w:t xml:space="preserve"> </w:t>
+      </w:r>
+      <w:hyperlink r:id="rId110">
         <w:r>
           <w:rPr>
             <w:rStyle w:val="Hyperlink"/>
@@ -4648,12 +4711,9 @@
           <w:t xml:space="preserve">Köppen Geiger climatic classification for R users.</w:t>
         </w:r>
       </w:hyperlink>
-      <w:r>
-        <w:t xml:space="preserve"> </w:t>
-      </w:r>
-    </w:p>
-    <w:bookmarkEnd w:id="114"/>
-    <w:bookmarkStart w:id="116" w:name="ref-obrien2023"/>
+    </w:p>
+    <w:bookmarkEnd w:id="111"/>
+    <w:bookmarkStart w:id="113" w:name="ref-obrien2023"/>
     <w:p>
       <w:pPr>
         <w:pStyle w:val="Bibliography"/>
@@ -4668,38 +4728,25 @@
         <w:t xml:space="preserve">	</w:t>
       </w:r>
       <w:r>
-        <w:t xml:space="preserve">O’Brien L. 2023</w:t>
-      </w:r>
-      <w:r>
-        <w:t xml:space="preserve"> </w:t>
-      </w:r>
-      <w:r>
-        <w:rPr>
-          <w:i/>
-          <w:iCs/>
-        </w:rPr>
-        <w:t xml:space="preserve">h3jsr: Access uber’s H3 library</w:t>
-      </w:r>
-      <w:r>
-        <w:t xml:space="preserve">. See</w:t>
-      </w:r>
-      <w:r>
-        <w:t xml:space="preserve"> </w:t>
-      </w:r>
-      <w:hyperlink r:id="rId115">
+        <w:t xml:space="preserve">O’Brien, L. (2023).</w:t>
+      </w:r>
+      <w:r>
+        <w:t xml:space="preserve"> </w:t>
+      </w:r>
+      <w:hyperlink r:id="rId112">
         <w:r>
           <w:rPr>
             <w:rStyle w:val="Hyperlink"/>
           </w:rPr>
-          <w:t xml:space="preserve">https://CRAN.R-project.org/package=h3jsr</w:t>
+          <w:t xml:space="preserve">h3jsr: Access uber’s H3 library</w:t>
         </w:r>
       </w:hyperlink>
       <w:r>
         <w:t xml:space="preserve">.</w:t>
       </w:r>
     </w:p>
-    <w:bookmarkEnd w:id="116"/>
-    <w:bookmarkStart w:id="118" w:name="ref-weir2009"/>
+    <w:bookmarkEnd w:id="113"/>
+    <w:bookmarkStart w:id="115" w:name="ref-weir2009"/>
     <w:p>
       <w:pPr>
         <w:pStyle w:val="Bibliography"/>
@@ -4714,7 +4761,7 @@
         <w:t xml:space="preserve">	</w:t>
       </w:r>
       <w:r>
-        <w:t xml:space="preserve">Weir JT, Bermingham E, Schluter D. 2009 The great american biotic interchange in birds.</w:t>
+        <w:t xml:space="preserve">Weir, J.T., Bermingham, E., and Schluter, D. (2009). The great american biotic interchange in birds. Proceedings of the National Academy of Sciences</w:t>
       </w:r>
       <w:r>
         <w:t xml:space="preserve"> </w:t>
@@ -4724,35 +4771,28 @@
           <w:i/>
           <w:iCs/>
         </w:rPr>
-        <w:t xml:space="preserve">Proceedings of the National Academy of Sciences</w:t>
-      </w:r>
-      <w:r>
-        <w:t xml:space="preserve"> </w:t>
-      </w:r>
-      <w:r>
-        <w:rPr>
-          <w:b/>
-          <w:bCs/>
-        </w:rPr>
         <w:t xml:space="preserve">106</w:t>
       </w:r>
       <w:r>
-        <w:t xml:space="preserve">, 21737–21742. (doi:</w:t>
-      </w:r>
-      <w:hyperlink r:id="rId117">
+        <w:t xml:space="preserve">, 21737–21742.</w:t>
+      </w:r>
+      <w:r>
+        <w:t xml:space="preserve"> </w:t>
+      </w:r>
+      <w:hyperlink r:id="rId114">
         <w:r>
           <w:rPr>
             <w:rStyle w:val="Hyperlink"/>
           </w:rPr>
-          <w:t xml:space="preserve">10.1073/pnas.0903811106</w:t>
+          <w:t xml:space="preserve">https://doi.org/10.1073/pnas.0903811106</w:t>
         </w:r>
       </w:hyperlink>
       <w:r>
-        <w:t xml:space="preserve">)</w:t>
-      </w:r>
-    </w:p>
-    <w:bookmarkEnd w:id="118"/>
-    <w:bookmarkStart w:id="120" w:name="ref-antonelli2018"/>
+        <w:t xml:space="preserve">.</w:t>
+      </w:r>
+    </w:p>
+    <w:bookmarkEnd w:id="115"/>
+    <w:bookmarkStart w:id="117" w:name="ref-antonelli2018"/>
     <w:p>
       <w:pPr>
         <w:pStyle w:val="Bibliography"/>
@@ -4767,7 +4807,7 @@
         <w:t xml:space="preserve">	</w:t>
       </w:r>
       <w:r>
-        <w:t xml:space="preserve">Antonelli A</w:t>
+        <w:t xml:space="preserve">Antonelli, A., Kissling, W.D., Flantua, S.G.A., Bermúdez, M.A., Mulch, A., Muellner-Riehl, A.N., Kreft, H., Linder, H.P., Badgley, C., Fjeldså, J., et al. (2018). Geological and climatic influences on mountain biodiversity. Nature Geoscience</w:t>
       </w:r>
       <w:r>
         <w:t xml:space="preserve"> </w:t>
@@ -4777,48 +4817,28 @@
           <w:i/>
           <w:iCs/>
         </w:rPr>
-        <w:t xml:space="preserve">et al.</w:t>
-      </w:r>
-      <w:r>
-        <w:t xml:space="preserve"> 2018 Geological and climatic influences on mountain biodiversity.</w:t>
-      </w:r>
-      <w:r>
-        <w:t xml:space="preserve"> </w:t>
-      </w:r>
-      <w:r>
-        <w:rPr>
-          <w:i/>
-          <w:iCs/>
-        </w:rPr>
-        <w:t xml:space="preserve">Nature Geoscience</w:t>
-      </w:r>
-      <w:r>
-        <w:t xml:space="preserve"> </w:t>
-      </w:r>
-      <w:r>
-        <w:rPr>
-          <w:b/>
-          <w:bCs/>
-        </w:rPr>
         <w:t xml:space="preserve">11</w:t>
       </w:r>
       <w:r>
-        <w:t xml:space="preserve">, 718–725. (doi:</w:t>
-      </w:r>
-      <w:hyperlink r:id="rId119">
+        <w:t xml:space="preserve">, 718–725.</w:t>
+      </w:r>
+      <w:r>
+        <w:t xml:space="preserve"> </w:t>
+      </w:r>
+      <w:hyperlink r:id="rId116">
         <w:r>
           <w:rPr>
             <w:rStyle w:val="Hyperlink"/>
           </w:rPr>
-          <w:t xml:space="preserve">10.1038/s41561-018-0236-z</w:t>
+          <w:t xml:space="preserve">https://doi.org/10.1038/s41561-018-0236-z</w:t>
         </w:r>
       </w:hyperlink>
       <w:r>
-        <w:t xml:space="preserve">)</w:t>
-      </w:r>
-    </w:p>
-    <w:bookmarkEnd w:id="120"/>
-    <w:bookmarkStart w:id="122" w:name="ref-motta2025"/>
+        <w:t xml:space="preserve">.</w:t>
+      </w:r>
+    </w:p>
+    <w:bookmarkEnd w:id="117"/>
+    <w:bookmarkStart w:id="119" w:name="ref-motta2025"/>
     <w:p>
       <w:pPr>
         <w:pStyle w:val="Bibliography"/>
@@ -4833,7 +4853,7 @@
         <w:t xml:space="preserve">	</w:t>
       </w:r>
       <w:r>
-        <w:t xml:space="preserve">Motta LM, Quental TB. 2025 New aspects of the asymmetry of the great american biotic interchange based on an analysis of the spatial and temporal structure of immigrant taxa at local scale.</w:t>
+        <w:t xml:space="preserve">Motta, L.M., and Quental, T.B. (2025). New aspects of the asymmetry of the great american biotic interchange based on an analysis of the spatial and temporal structure of immigrant taxa at local scale. Palaeogeography, Palaeoclimatology, Palaeoecology</w:t>
       </w:r>
       <w:r>
         <w:t xml:space="preserve"> </w:t>
@@ -4843,35 +4863,28 @@
           <w:i/>
           <w:iCs/>
         </w:rPr>
-        <w:t xml:space="preserve">Palaeogeography, Palaeoclimatology, Palaeoecology</w:t>
-      </w:r>
-      <w:r>
-        <w:t xml:space="preserve"> </w:t>
-      </w:r>
-      <w:r>
-        <w:rPr>
-          <w:b/>
-          <w:bCs/>
-        </w:rPr>
         <w:t xml:space="preserve">668</w:t>
       </w:r>
       <w:r>
-        <w:t xml:space="preserve">, 112905. (doi:</w:t>
-      </w:r>
-      <w:hyperlink r:id="rId121">
+        <w:t xml:space="preserve">, 112905.</w:t>
+      </w:r>
+      <w:r>
+        <w:t xml:space="preserve"> </w:t>
+      </w:r>
+      <w:hyperlink r:id="rId118">
         <w:r>
           <w:rPr>
             <w:rStyle w:val="Hyperlink"/>
           </w:rPr>
-          <w:t xml:space="preserve">10.1016/j.palaeo.2025.112905</w:t>
+          <w:t xml:space="preserve">https://doi.org/10.1016/j.palaeo.2025.112905</w:t>
         </w:r>
       </w:hyperlink>
       <w:r>
-        <w:t xml:space="preserve">)</w:t>
-      </w:r>
-    </w:p>
-    <w:bookmarkEnd w:id="122"/>
-    <w:bookmarkStart w:id="124" w:name="ref-couvreur2011"/>
+        <w:t xml:space="preserve">.</w:t>
+      </w:r>
+    </w:p>
+    <w:bookmarkEnd w:id="119"/>
+    <w:bookmarkStart w:id="121" w:name="ref-couvreur2011"/>
     <w:p>
       <w:pPr>
         <w:pStyle w:val="Bibliography"/>
@@ -4886,7 +4899,7 @@
         <w:t xml:space="preserve">	</w:t>
       </w:r>
       <w:r>
-        <w:t xml:space="preserve">Couvreur TLP, Pirie MD, Chatrou LW, Saunders RMK, Su YCF, Richardson JE, Erkens RHJ. 2011 Early evolutionary history of the flowering plant family Annonaceae: steady diversification and boreotropical geodispersal.</w:t>
+        <w:t xml:space="preserve">Couvreur, T.L.P., Pirie, M.D., Chatrou, L.W., Saunders, R.M.K., Su, Y.C.F., Richardson, J.E., and Erkens, R.H.J. (2011). Early evolutionary history of the flowering plant family Annonaceae: steady diversification and boreotropical geodispersal. Journal of Biogeography</w:t>
       </w:r>
       <w:r>
         <w:t xml:space="preserve"> </w:t>
@@ -4896,35 +4909,28 @@
           <w:i/>
           <w:iCs/>
         </w:rPr>
-        <w:t xml:space="preserve">Journal of Biogeography</w:t>
-      </w:r>
-      <w:r>
-        <w:t xml:space="preserve"> </w:t>
-      </w:r>
-      <w:r>
-        <w:rPr>
-          <w:b/>
-          <w:bCs/>
-        </w:rPr>
         <w:t xml:space="preserve">38</w:t>
       </w:r>
       <w:r>
-        <w:t xml:space="preserve">, 664–680. (doi:</w:t>
-      </w:r>
-      <w:hyperlink r:id="rId123">
+        <w:t xml:space="preserve">, 664–680.</w:t>
+      </w:r>
+      <w:r>
+        <w:t xml:space="preserve"> </w:t>
+      </w:r>
+      <w:hyperlink r:id="rId120">
         <w:r>
           <w:rPr>
             <w:rStyle w:val="Hyperlink"/>
           </w:rPr>
-          <w:t xml:space="preserve">10.1111/j.1365-2699.2010.02434.x</w:t>
+          <w:t xml:space="preserve">https://doi.org/10.1111/j.1365-2699.2010.02434.x</w:t>
         </w:r>
       </w:hyperlink>
       <w:r>
-        <w:t xml:space="preserve">)</w:t>
-      </w:r>
-    </w:p>
-    <w:bookmarkEnd w:id="124"/>
-    <w:bookmarkStart w:id="126" w:name="ref-upchurch2024"/>
+        <w:t xml:space="preserve">.</w:t>
+      </w:r>
+    </w:p>
+    <w:bookmarkEnd w:id="121"/>
+    <w:bookmarkStart w:id="123" w:name="ref-upchurch2024"/>
     <w:p>
       <w:pPr>
         <w:pStyle w:val="Bibliography"/>
@@ -4939,7 +4945,7 @@
         <w:t xml:space="preserve">	</w:t>
       </w:r>
       <w:r>
-        <w:t xml:space="preserve">Upchurch P, Chiarenza AA. 2024 A brief review of non-avian dinosaur biogeography: State-of-the-art and prospectus.</w:t>
+        <w:t xml:space="preserve">Upchurch, P., and Chiarenza, A.A. (2024). A brief review of non-avian dinosaur biogeography: State-of-the-art and prospectus. Biology Letters</w:t>
       </w:r>
       <w:r>
         <w:t xml:space="preserve"> </w:t>
@@ -4949,35 +4955,28 @@
           <w:i/>
           <w:iCs/>
         </w:rPr>
-        <w:t xml:space="preserve">Biology Letters</w:t>
-      </w:r>
-      <w:r>
-        <w:t xml:space="preserve"> </w:t>
-      </w:r>
-      <w:r>
-        <w:rPr>
-          <w:b/>
-          <w:bCs/>
-        </w:rPr>
         <w:t xml:space="preserve">20</w:t>
       </w:r>
       <w:r>
-        <w:t xml:space="preserve">, 20240429. (doi:</w:t>
-      </w:r>
-      <w:hyperlink r:id="rId125">
+        <w:t xml:space="preserve">, 20240429.</w:t>
+      </w:r>
+      <w:r>
+        <w:t xml:space="preserve"> </w:t>
+      </w:r>
+      <w:hyperlink r:id="rId122">
         <w:r>
           <w:rPr>
             <w:rStyle w:val="Hyperlink"/>
           </w:rPr>
-          <w:t xml:space="preserve">10.1098/rsbl.2024.0429</w:t>
+          <w:t xml:space="preserve">https://doi.org/10.1098/rsbl.2024.0429</w:t>
         </w:r>
       </w:hyperlink>
       <w:r>
-        <w:t xml:space="preserve">)</w:t>
-      </w:r>
-    </w:p>
-    <w:bookmarkEnd w:id="126"/>
-    <w:bookmarkStart w:id="128" w:name="ref-pino2022"/>
+        <w:t xml:space="preserve">.</w:t>
+      </w:r>
+    </w:p>
+    <w:bookmarkEnd w:id="123"/>
+    <w:bookmarkStart w:id="125" w:name="ref-pino2022"/>
     <w:p>
       <w:pPr>
         <w:pStyle w:val="Bibliography"/>
@@ -4992,7 +4991,7 @@
         <w:t xml:space="preserve">	</w:t>
       </w:r>
       <w:r>
-        <w:t xml:space="preserve">Pino K, Vallejos-Garrido P, Espinoza-Aravena N, Cooper RB, Silvestro D, Hernández CE, Rodríguez-Serrano E. 2022 Regional landscape change triggered by andean uplift: The extinction of sparassodonta (mammalia, metatheria) in south america.</w:t>
+        <w:t xml:space="preserve">Pino, K., Vallejos-Garrido, P., Espinoza-Aravena, N., Cooper, R.B., Silvestro, D., Hernández, C.E., and Rodríguez-Serrano, E. (2022). Regional landscape change triggered by andean uplift: The extinction of sparassodonta (mammalia, metatheria) in south america. Global and Planetary Change</w:t>
       </w:r>
       <w:r>
         <w:t xml:space="preserve"> </w:t>
@@ -5002,36 +5001,29 @@
           <w:i/>
           <w:iCs/>
         </w:rPr>
-        <w:t xml:space="preserve">Global and Planetary Change</w:t>
-      </w:r>
-      <w:r>
-        <w:t xml:space="preserve"> </w:t>
-      </w:r>
-      <w:r>
-        <w:rPr>
-          <w:b/>
-          <w:bCs/>
-        </w:rPr>
         <w:t xml:space="preserve">210</w:t>
       </w:r>
       <w:r>
-        <w:t xml:space="preserve">, 103758. (doi:</w:t>
-      </w:r>
-      <w:hyperlink r:id="rId127">
+        <w:t xml:space="preserve">, 103758.</w:t>
+      </w:r>
+      <w:r>
+        <w:t xml:space="preserve"> </w:t>
+      </w:r>
+      <w:hyperlink r:id="rId124">
         <w:r>
           <w:rPr>
             <w:rStyle w:val="Hyperlink"/>
           </w:rPr>
-          <w:t xml:space="preserve">10.1016/j.gloplacha.2022.103758</w:t>
+          <w:t xml:space="preserve">https://doi.org/10.1016/j.gloplacha.2022.103758</w:t>
         </w:r>
       </w:hyperlink>
       <w:r>
-        <w:t xml:space="preserve">)</w:t>
-      </w:r>
-    </w:p>
-    <w:bookmarkEnd w:id="128"/>
-    <w:bookmarkEnd w:id="129"/>
-    <w:bookmarkEnd w:id="130"/>
+        <w:t xml:space="preserve">.</w:t>
+      </w:r>
+    </w:p>
+    <w:bookmarkEnd w:id="125"/>
+    <w:bookmarkEnd w:id="126"/>
+    <w:bookmarkEnd w:id="127"/>
     <w:sectPr>
       <w:type w:val="nextPage"/>
       <w:pgSz w:h="15840" w:w="12240"/>

</xml_diff>

<commit_message>
fig1, results and discussion
</commit_message>
<xml_diff>
--- a/Manuscript/GABI_palaeo_constraints.docx
+++ b/Manuscript/GABI_palaeo_constraints.docx
@@ -706,13 +706,34 @@
               <w:pStyle w:val="ImageCaption"/>
             </w:pPr>
             <w:r>
-              <w:t xml:space="preserve">Figure 1: Palaeoclimate histories within our studied landmasses (North America is displayed in coral red and South America in cyan). Spatially-averaged climate variables (Annual Temperature and Precipitation) are taken from the PALEO-PGEM palaeoclimate emulator</w:t>
+              <w:t xml:space="preserve">Figure 1: Average palaeoclimate histories within our studied landmasses. North America is displayed in coral red and South America in cyan. Spatially-averaged climate variables (Annual Temperature and Precipitation) are taken from the PALEO-PGEM palaeoclimate emulator</w:t>
             </w:r>
             <w:r>
               <w:rPr>
                 <w:vertAlign w:val="superscript"/>
               </w:rPr>
               <w:t xml:space="preserve">33</w:t>
+            </w:r>
+            <w:r>
+              <w:t xml:space="preserve">. This emulator being spatialised at a 1 x 1° resolution, numbers inside the continents represent the quantity of overlaying pixels from the climate grid within each continent. On climate plots, the time of the likely onset of the GABI</w:t>
+            </w:r>
+            <w:r>
+              <w:rPr>
+                <w:vertAlign w:val="superscript"/>
+              </w:rPr>
+              <w:t xml:space="preserve">8</w:t>
+            </w:r>
+            <w:r>
+              <w:t xml:space="preserve"> </w:t>
+            </w:r>
+            <w:r>
+              <w:t xml:space="preserve">is indicated by the light purple vertical bands. Geological timescale was depicted using the deeptime R package</w:t>
+            </w:r>
+            <w:r>
+              <w:rPr>
+                <w:vertAlign w:val="superscript"/>
+              </w:rPr>
+              <w:t xml:space="preserve">34</w:t>
             </w:r>
             <w:r>
               <w:t xml:space="preserve">. The empirically-derived asymmetry of the transcontinental land mammal exchange is represented by the thickness of the two arrows, the thicker the arrow, the more intense the exchange.</w:t>
@@ -759,10 +780,10 @@
         <w:rPr>
           <w:vertAlign w:val="superscript"/>
         </w:rPr>
-        <w:t xml:space="preserve">34</w:t>
-      </w:r>
-      <w:r>
-        <w:t xml:space="preserve">. For the scope of this work, we used two bioclimatic variables: mean annual temperature (MAT, BIO1) and mean annual precipitation (MAP, BIO12). To avoid reaching an overkillingly-high number of simulation steps, we reduced the temporal resolution of the climate simulations from a 1000 years-time step to a 10,000 years time-step.</w:t>
+        <w:t xml:space="preserve">35</w:t>
+      </w:r>
+      <w:r>
+        <w:t xml:space="preserve">. For the scope of this work, we used two bioclimatic variables: mean annual temperature (MAT, BIO1) and mean annual precipitation (MAP, BIO12). To avoid reaching an overkillingly-high number of simulation steps, we reduced the temporal resolution of the climate simulations from a 1000-years to a 10,000-years time step.</w:t>
       </w:r>
     </w:p>
     <w:p>
@@ -796,10 +817,19 @@
         <w:rPr>
           <w:vertAlign w:val="superscript"/>
         </w:rPr>
-        <w:t xml:space="preserve">35</w:t>
-      </w:r>
-      <w:r>
-        <w:t xml:space="preserve">. This classification divides the world into five broad climatic regions: Polar, Cold, Temperate, Arid and Tropical.</w:t>
+        <w:t xml:space="preserve">36</w:t>
+      </w:r>
+      <w:r>
+        <w:t xml:space="preserve">. This classification divides the world into five broad climatic regions: Polar, Cold, Temperate, Arid and Tropical, following the criteria proposed by</w:t>
+      </w:r>
+      <w:r>
+        <w:rPr>
+          <w:vertAlign w:val="superscript"/>
+        </w:rPr>
+        <w:t xml:space="preserve">37</w:t>
+      </w:r>
+      <w:r>
+        <w:t xml:space="preserve">.</w:t>
       </w:r>
     </w:p>
     <w:bookmarkEnd w:id="27"/>
@@ -1367,7 +1397,7 @@
         <w:rPr>
           <w:vertAlign w:val="superscript"/>
         </w:rPr>
-        <w:t xml:space="preserve">36</w:t>
+        <w:t xml:space="preserve">38</w:t>
       </w:r>
       <w:r>
         <w:t xml:space="preserve">. We then sampled a centroid at random and retrieved the corresponding cell in our landscape. To reduce the probability of initial crash, the temperature and/or precipitation optima parameter of the ancestor were set to those of the local environment.</w:t>
@@ -2240,7 +2270,7 @@
         <w:rPr>
           <w:vertAlign w:val="superscript"/>
         </w:rPr>
-        <w:t xml:space="preserve">33,34</w:t>
+        <w:t xml:space="preserve">33,35</w:t>
       </w:r>
       <w:r>
         <w:t xml:space="preserve">. Each set of simulations tracked the radiation of a clade either originating in North or in South America. Climate was the only ecological constraint limiting virtual species’ biogeography. We further compared the ability of virtual species to colonise the continent where they did not originate between the two initial conditions. For additional details, please refer to the</w:t>
@@ -2309,7 +2339,7 @@
         </m:r>
       </m:oMath>
       <w:r>
-        <w:t xml:space="preserve">). Amputation of either the temperature (47% vs. 88%,</w:t>
+        <w:t xml:space="preserve">). When climatic niches were able to evolve, amputation of either their temperature (47% vs. 88%,</w:t>
       </w:r>
       <w:r>
         <w:t xml:space="preserve"> </w:t>
@@ -2323,7 +2353,7 @@
         </m:r>
       </m:oMath>
       <w:r>
-        <w:t xml:space="preserve">) or the precipitation (38% vs. 89%,</w:t>
+        <w:t xml:space="preserve">) or precipitation (38% vs. 89%,</w:t>
       </w:r>
       <w:r>
         <w:t xml:space="preserve"> </w:t>
@@ -2337,13 +2367,20 @@
         </m:r>
       </m:oMath>
       <w:r>
-        <w:t xml:space="preserve">) compound of the climatic niche does not seem to alter the pattern.</w:t>
-      </w:r>
-      <w:r>
-        <w:t xml:space="preserve"> </w:t>
-      </w:r>
-      <w:r>
-        <w:t xml:space="preserve">That being said, the proportion of simulations resulting in no living representative (=crash) was on average twice higher for simulations starting in North America, except for model</w:t>
+        <w:t xml:space="preserve">) compounds does not seem to alter the pattern. That being said, out of the 500 runs carried out for each landmass-scenario combination (see</w:t>
+      </w:r>
+      <w:r>
+        <w:t xml:space="preserve"> </w:t>
+      </w:r>
+      <w:r>
+        <w:rPr>
+          <w:i/>
+          <w:iCs/>
+        </w:rPr>
+        <w:t xml:space="preserve">Star Methods</w:t>
+      </w:r>
+      <w:r>
+        <w:t xml:space="preserve">), the proportion of simulations leading to no living representative (=crash) was on average twice higher for simulations starting in North America, except for model</w:t>
       </w:r>
       <w:r>
         <w:t xml:space="preserve"> </w:t>
@@ -2493,7 +2530,7 @@
               </m:r>
             </m:oMath>
             <w:r>
-              <w:t xml:space="preserve">). Each individual plot shows the outcome of simulations starting in North (red) and South (cyan) America.</w:t>
+              <w:t xml:space="preserve">). Each individual plot shows the outcome of simulations starting in North (red) and South (cyan) America. Numbers on the x-axis represent the number of simulations actually considered after removing simulations leading to no living representative (=crash).</w:t>
             </w:r>
             <w:r>
               <w:t xml:space="preserve"> </w:t>
@@ -2586,7 +2623,21 @@
         <w:pStyle w:val="FirstParagraph"/>
       </w:pPr>
       <w:r>
-        <w:t xml:space="preserve">Our findings reveal that successful simulations starting from North America result in a higher proportion of colonised area, except for the</w:t>
+        <w:t xml:space="preserve">Our findings reveal that successful simulations starting from North America result in a higher proportion of colonised area, quantified as the ratio between the number of pixels recording a presence in the landmass to colonise and the total number of pixels offered by this landmass (</w:t>
+      </w:r>
+      <w:hyperlink w:anchor="fig-2">
+        <w:r>
+          <w:rPr>
+            <w:rStyle w:val="Hyperlink"/>
+          </w:rPr>
+          <w:t xml:space="preserve">Figure 2</w:t>
+        </w:r>
+      </w:hyperlink>
+      <w:r>
+        <w:t xml:space="preserve"> </w:t>
+      </w:r>
+      <w:r>
+        <w:t xml:space="preserve">B). The pattern holds for all but the</w:t>
       </w:r>
       <w:r>
         <w:t xml:space="preserve"> </w:t>
@@ -2603,7 +2654,7 @@
         <w:t xml:space="preserve"> </w:t>
       </w:r>
       <w:r>
-        <w:t xml:space="preserve">model, relaxing the precipitation constraint on virtual species’ niche (</w:t>
+        <w:t xml:space="preserve">model – relaxing the precipitation constraint on virtual species’ niche (</w:t>
       </w:r>
       <w:hyperlink w:anchor="fig-2">
         <w:r>
@@ -2673,7 +2724,7 @@
     </w:p>
     <w:bookmarkEnd w:id="37"/>
     <w:bookmarkEnd w:id="38"/>
-    <w:bookmarkStart w:id="42" w:name="discussion"/>
+    <w:bookmarkStart w:id="43" w:name="discussion"/>
     <w:p>
       <w:pPr>
         <w:pStyle w:val="Heading1"/>
@@ -2693,7 +2744,7 @@
         <w:rPr>
           <w:vertAlign w:val="superscript"/>
         </w:rPr>
-        <w:t xml:space="preserve">37</w:t>
+        <w:t xml:space="preserve">39</w:t>
       </w:r>
       <w:r>
         <w:t xml:space="preserve">, flying behaviour relaxing constraints applied to land mammals ?</w:t>
@@ -2719,7 +2770,7 @@
         <w:rPr>
           <w:vertAlign w:val="superscript"/>
         </w:rPr>
-        <w:t xml:space="preserve">38</w:t>
+        <w:t xml:space="preserve">40</w:t>
       </w:r>
       <w:r>
         <w:t xml:space="preserve"> </w:t>
@@ -2754,7 +2805,21 @@
         <w:t xml:space="preserve"> </w:t>
       </w:r>
       <w:r>
-        <w:t xml:space="preserve">applied to the GABI is that tropical specialists, in the aftermath of the global cooling occurring in the Plio-Pleistocene boundary, would have naturally been attracted towards the equator, in turn actively promoting some North American mammal’s establishment in South America. On the other hand, fewer mammals – only biome generalists or open-habitat specialists – from South America are expected to roam the other way round. Our virtual experiments partially corroborate with these predictions, in the sense that tropical-adapted taxa of North American origin have a higher prevalence of crossing the isthmus than species belonging to other biomes (Figure X [biomes], model M0).</w:t>
+        <w:t xml:space="preserve">applied to the GABI is that tropical specialists, in the aftermath of the global cooling occurring in the Plio-Pleistocene boundary (decreasing trend visible on the temperature plots displayed in</w:t>
+      </w:r>
+      <w:r>
+        <w:t xml:space="preserve"> </w:t>
+      </w:r>
+      <w:hyperlink w:anchor="fig-1">
+        <w:r>
+          <w:rPr>
+            <w:rStyle w:val="Hyperlink"/>
+          </w:rPr>
+          <w:t xml:space="preserve">Figure 1</w:t>
+        </w:r>
+      </w:hyperlink>
+      <w:r>
+        <w:t xml:space="preserve">), would have naturally been attracted towards the equator, in turn actively promoting some North American mammal’s establishment in South America. On the other hand, fewer mammals – only biome generalists or open-habitat specialists – from South America are expected to roam the other way around. Our virtual experiments partially corroborate with these predictions, in the sense that tropical-adapted taxa of North American origin have a higher prevalence of crossing the isthmus than species belonging to other biomes (Figure X [biomes], model M0).</w:t>
       </w:r>
     </w:p>
     <w:p>
@@ -2779,13 +2844,7 @@
         <w:t xml:space="preserve">29</w:t>
       </w:r>
       <w:r>
-        <w:t xml:space="preserve">.</w:t>
-      </w:r>
-      <w:r>
-        <w:t xml:space="preserve"> </w:t>
-      </w:r>
-      <w:r>
-        <w:t xml:space="preserve">Result of Figure 2C for</w:t>
+        <w:t xml:space="preserve">. Result of Figure 2C for</w:t>
       </w:r>
       <w:r>
         <w:t xml:space="preserve"> </w:t>
@@ -2834,7 +2893,10 @@
         <w:rPr>
           <w:vertAlign w:val="superscript"/>
         </w:rPr>
-        <w:t xml:space="preserve">39</w:t>
+        <w:t xml:space="preserve">41</w:t>
+      </w:r>
+      <w:r>
+        <w:t xml:space="preserve">.</w:t>
       </w:r>
     </w:p>
     <w:p>
@@ -2874,30 +2936,14 @@
         <w:t xml:space="preserve">?</w:t>
       </w:r>
     </w:p>
-    <w:p>
-      <w:pPr>
-        <w:pStyle w:val="BodyText"/>
-      </w:pPr>
-      <w:r>
-        <w:t xml:space="preserve">Temporality (red queen vs. court jester, Benton 2001) =&gt; favouring biotic ?</w:t>
-      </w:r>
-    </w:p>
-    <w:p>
-      <w:pPr>
-        <w:pStyle w:val="BodyText"/>
-      </w:pPr>
-      <w:r>
-        <w:t xml:space="preserve">Fortuitous experiment ?</w:t>
-      </w:r>
-    </w:p>
     <w:bookmarkEnd w:id="40"/>
-    <w:bookmarkStart w:id="41" w:name="limitations-perspectives"/>
+    <w:bookmarkStart w:id="41" w:name="X0160ffd22f787d001a7841291dc9859bf7a1aab"/>
     <w:p>
       <w:pPr>
         <w:pStyle w:val="Heading2"/>
       </w:pPr>
       <w:r>
-        <w:t xml:space="preserve">Limitations &amp; perspectives</w:t>
+        <w:t xml:space="preserve">On the drivers behind the asymmetry of the GABI</w:t>
       </w:r>
     </w:p>
     <w:p>
@@ -2905,129 +2951,53 @@
         <w:pStyle w:val="FirstParagraph"/>
       </w:pPr>
       <w:r>
-        <w:t xml:space="preserve">Assumption of fixed palaeogeography, particularly near the isthmus, whereas we know that this region changed across our study.</w:t>
-      </w:r>
-    </w:p>
-    <w:p>
-      <w:pPr>
-        <w:pStyle w:val="BodyText"/>
-      </w:pPr>
-      <w:r>
-        <w:t xml:space="preserve">spatial clustering of simulation crashing in temperate/cold North America =&gt; related to biome instability in the zone ?</w:t>
-      </w:r>
-    </w:p>
-    <w:p>
-      <w:pPr>
-        <w:pStyle w:val="BodyText"/>
-      </w:pPr>
-      <w:r>
-        <w:t xml:space="preserve">Problem of taxonomic extinctions in Gen3sis!</w:t>
-      </w:r>
-    </w:p>
-    <w:p>
-      <w:pPr>
-        <w:pStyle w:val="BodyText"/>
-      </w:pPr>
-      <w:r>
-        <w:t xml:space="preserve">Timeline of the simulation (last 5Myrs). Some claim for an onset of the interchange further back in time, but we justify our choice as (1) most studies agree with an onset of significant mammal exchange</w:t>
-      </w:r>
-      <w:r>
-        <w:t xml:space="preserve"> </w:t>
+        <w:t xml:space="preserve">Competition involving clades of similar ecology appeared as a likely first-order explanation to the recent demise of South American endemic mammal clades such as native ungulates</w:t>
+      </w:r>
+      <w:r>
+        <w:rPr>
+          <w:vertAlign w:val="superscript"/>
+        </w:rPr>
+        <w:t xml:space="preserve">13</w:t>
+      </w:r>
+      <w:r>
+        <w:t xml:space="preserve"> </w:t>
+      </w:r>
+      <w:r>
+        <w:t xml:space="preserve">or sparassodonts (metatherian predators,</w:t>
+      </w:r>
+      <w:r>
+        <w:rPr>
+          <w:vertAlign w:val="superscript"/>
+        </w:rPr>
+        <w:t xml:space="preserve">22,42</w:t>
+      </w:r>
+      <w:r>
+        <w:t xml:space="preserve">) that followed the establishment of northern lineages</w:t>
+      </w:r>
+      <w:r>
+        <w:rPr>
+          <w:vertAlign w:val="superscript"/>
+        </w:rPr>
+        <w:t xml:space="preserve">15</w:t>
+      </w:r>
+      <w:r>
+        <w:t xml:space="preserve">. This hypothesis mostly relied on striking morphological convergences between the clades assumed to have competed (</w:t>
       </w:r>
       <w:r>
         <w:rPr>
           <w:i/>
           <w:iCs/>
         </w:rPr>
-        <w:t xml:space="preserve">c.</w:t>
-      </w:r>
-      <w:r>
-        <w:t xml:space="preserve"> </w:t>
-      </w:r>
-      <w:r>
-        <w:t xml:space="preserve">3.5 Ma and (2) assumpltion of fixed palaeogeography.</w:t>
-      </w:r>
-    </w:p>
-    <w:bookmarkEnd w:id="41"/>
-    <w:bookmarkEnd w:id="42"/>
-    <w:bookmarkStart w:id="43" w:name="thrash"/>
-    <w:p>
-      <w:pPr>
-        <w:pStyle w:val="Heading1"/>
-      </w:pPr>
-      <w:r>
-        <w:t xml:space="preserve">Thrash</w:t>
-      </w:r>
-    </w:p>
-    <w:p>
-      <w:pPr>
-        <w:pStyle w:val="FirstParagraph"/>
-      </w:pPr>
-      <w:r>
-        <w:t xml:space="preserve">Throughout its evolutionary history, the biosphere has been repeatedly marked by the occurrence of geodispersal events, that is, exchanges of large species pools across landmasses</w:t>
-      </w:r>
-      <w:r>
-        <w:rPr>
-          <w:vertAlign w:val="superscript"/>
-        </w:rPr>
-        <w:t xml:space="preserve">41</w:t>
+        <w:t xml:space="preserve">e</w:t>
       </w:r>
       <w:r>
         <w:t xml:space="preserve">.</w:t>
-      </w:r>
-    </w:p>
-    <w:p>
-      <w:pPr>
-        <w:pStyle w:val="BodyText"/>
-      </w:pPr>
-      <w:r>
-        <w:t xml:space="preserve">Competition involving clades of similar ecology appeared as a likely first-order explanation to the recent demise of South American endemic mammal clades such as native ungulates</w:t>
-      </w:r>
-      <w:r>
-        <w:rPr>
-          <w:vertAlign w:val="superscript"/>
-        </w:rPr>
-        <w:t xml:space="preserve">13</w:t>
-      </w:r>
-      <w:r>
-        <w:t xml:space="preserve"> </w:t>
-      </w:r>
-      <w:r>
-        <w:t xml:space="preserve">or sparassodonts (metatherian predators,</w:t>
-      </w:r>
-      <w:r>
-        <w:rPr>
-          <w:vertAlign w:val="superscript"/>
-        </w:rPr>
-        <w:t xml:space="preserve">22,42</w:t>
-      </w:r>
-      <w:r>
-        <w:t xml:space="preserve">) that followed the establishment of northern lineages</w:t>
-      </w:r>
-      <w:r>
-        <w:rPr>
-          <w:vertAlign w:val="superscript"/>
-        </w:rPr>
-        <w:t xml:space="preserve">15</w:t>
-      </w:r>
-      <w:r>
-        <w:t xml:space="preserve">. This hypothesis mostly relied on striking morphological convergences between the clades assumed to have competed (</w:t>
       </w:r>
       <w:r>
         <w:rPr>
           <w:i/>
           <w:iCs/>
         </w:rPr>
-        <w:t xml:space="preserve">e</w:t>
-      </w:r>
-      <w:r>
-        <w:t xml:space="preserve">.</w:t>
-      </w:r>
-      <w:r>
-        <w:rPr>
-          <w:i/>
-          <w:iCs/>
-        </w:rPr>
         <w:t xml:space="preserve">g</w:t>
       </w:r>
       <w:r>
@@ -3066,7 +3036,7 @@
         <w:pStyle w:val="BodyText"/>
       </w:pPr>
       <w:r>
-        <w:t xml:space="preserve">These would include Pleistocene climate fluctuations and the consequent alternating phases of emergence of open landscapes across Central America, in turn favouring the dispersal of large temperate-adapted mammals to the detriment of tropical-adapted ones</w:t>
+        <w:t xml:space="preserve">Temporality (red queen vs. court jester, Benton 2001) =&gt; favouring biotic ?</w:t>
       </w:r>
     </w:p>
     <w:p>
@@ -3074,42 +3044,53 @@
         <w:pStyle w:val="BodyText"/>
       </w:pPr>
       <w:r>
-        <w:t xml:space="preserve">Other studies proposed the implication of abiotic factors. Some put the emphasis on Pleistocene climate fluctuations and the consequent alternating phases of emergence of landscape opening across Central America, in turn favouring the dispersal of large temperate-adapted mammals to the detriment of tropical-adapted ones</w:t>
+        <w:t xml:space="preserve">Fortuitous experiment ?</w:t>
+      </w:r>
+    </w:p>
+    <w:bookmarkEnd w:id="41"/>
+    <w:bookmarkStart w:id="42" w:name="limitations-perspectives"/>
+    <w:p>
+      <w:pPr>
+        <w:pStyle w:val="Heading2"/>
+      </w:pPr>
+      <w:r>
+        <w:t xml:space="preserve">Limitations &amp; perspectives</w:t>
+      </w:r>
+    </w:p>
+    <w:p>
+      <w:pPr>
+        <w:pStyle w:val="FirstParagraph"/>
+      </w:pPr>
+      <w:r>
+        <w:t xml:space="preserve">Assumption of fixed palaeogeography, particularly near the isthmus, whereas we know that this region changed across our study.</w:t>
+      </w:r>
+    </w:p>
+    <w:p>
+      <w:pPr>
+        <w:pStyle w:val="BodyText"/>
+      </w:pPr>
+      <w:r>
+        <w:t xml:space="preserve">The landscape designed for the purpose of this study (</w:t>
+      </w:r>
+      <w:hyperlink w:anchor="fig-1">
+        <w:r>
+          <w:rPr>
+            <w:rStyle w:val="Hyperlink"/>
+          </w:rPr>
+          <w:t xml:space="preserve">Figure 1</w:t>
+        </w:r>
+      </w:hyperlink>
+      <w:r>
+        <w:t xml:space="preserve">) only permitted transcontinental faunal exchange via the isthmus of Panama, the closure of which being assumed as the main trigger of the GABI</w:t>
       </w:r>
       <w:r>
         <w:rPr>
           <w:vertAlign w:val="superscript"/>
         </w:rPr>
-        <w:t xml:space="preserve">8,10,17</w:t>
-      </w:r>
-      <w:r>
-        <w:t xml:space="preserve">. Others drew direct relationships between the higher extinction rates of native South American mammal genera and temperature change</w:t>
-      </w:r>
-      <w:r>
-        <w:rPr>
-          <w:vertAlign w:val="superscript"/>
-        </w:rPr>
-        <w:t xml:space="preserve">24</w:t>
-      </w:r>
-      <w:r>
-        <w:t xml:space="preserve">.</w:t>
-      </w:r>
-    </w:p>
-    <w:p>
-      <w:pPr>
-        <w:pStyle w:val="BodyText"/>
-      </w:pPr>
-      <w:r>
-        <w:t xml:space="preserve">several studies proposed that palaeoclimate change shaped unequal dispersal abilities between northern and southern taxa</w:t>
-      </w:r>
-      <w:r>
-        <w:rPr>
-          <w:vertAlign w:val="superscript"/>
-        </w:rPr>
-        <w:t xml:space="preserve">8,10,17,24</w:t>
-      </w:r>
-      <w:r>
-        <w:t xml:space="preserve">, although the hypothesis according to which the asymmetry of the GABI would stem from dispersal rates is still largely debated</w:t>
+        <w:t xml:space="preserve">1</w:t>
+      </w:r>
+      <w:r>
+        <w:t xml:space="preserve">. Yet, the fossil record of the West Indies has provided evidence for faunal supply both from the South and the North American landmasses, in particular since the late Miocene</w:t>
       </w:r>
       <w:r>
         <w:rPr>
@@ -3137,6 +3118,216 @@
         <w:rPr>
           <w:vertAlign w:val="superscript"/>
         </w:rPr>
+        <w:t xml:space="preserve">., 43,44</w:t>
+      </w:r>
+      <w:r>
+        <w:t xml:space="preserve">. Although over-water dispersal has long been regarded as the prevailing mechanism</w:t>
+      </w:r>
+      <w:r>
+        <w:rPr>
+          <w:vertAlign w:val="superscript"/>
+        </w:rPr>
+        <w:t xml:space="preserve">43</w:t>
+      </w:r>
+      <w:r>
+        <w:t xml:space="preserve">, recent geological advances have providing evidence for (1) the emergence of land bridges connecting South America to Caribbean islands and (2) the formation of mega-islands – during Pleistocene glacial maximum episodes – several times since the Mio-Pliocene boundary</w:t>
+      </w:r>
+      <w:r>
+        <w:rPr>
+          <w:vertAlign w:val="superscript"/>
+        </w:rPr>
+        <w:t xml:space="preserve">45</w:t>
+      </w:r>
+      <w:r>
+        <w:t xml:space="preserve">. Hence, it would make sense to consider West Indies as an alternative dispersal pathway between the Americas. However, due to the idiosyncratic eco-evolutionary processes shaping insular systems</w:t>
+      </w:r>
+      <w:r>
+        <w:rPr>
+          <w:i/>
+          <w:iCs/>
+          <w:vertAlign w:val="superscript"/>
+        </w:rPr>
+        <w:t xml:space="preserve">e</w:t>
+      </w:r>
+      <w:r>
+        <w:rPr>
+          <w:vertAlign w:val="superscript"/>
+        </w:rPr>
+        <w:t xml:space="preserve">.</w:t>
+      </w:r>
+      <w:r>
+        <w:rPr>
+          <w:i/>
+          <w:iCs/>
+          <w:vertAlign w:val="superscript"/>
+        </w:rPr>
+        <w:t xml:space="preserve">g</w:t>
+      </w:r>
+      <w:r>
+        <w:rPr>
+          <w:vertAlign w:val="superscript"/>
+        </w:rPr>
+        <w:t xml:space="preserve">., 46</w:t>
+      </w:r>
+      <w:r>
+        <w:t xml:space="preserve"> </w:t>
+      </w:r>
+      <w:r>
+        <w:t xml:space="preserve">as well as the poor mention of West Indies as a stepping-stone in the literature, we believe that considering this alternative route in the framework of the GABI would rather deserve to be the topic of a study in itself.</w:t>
+      </w:r>
+    </w:p>
+    <w:p>
+      <w:pPr>
+        <w:pStyle w:val="BodyText"/>
+      </w:pPr>
+      <w:r>
+        <w:t xml:space="preserve">spatial clustering of simulation crashing in temperate/cold North America =&gt; related to biome instability in the zone ?</w:t>
+      </w:r>
+    </w:p>
+    <w:p>
+      <w:pPr>
+        <w:pStyle w:val="BodyText"/>
+      </w:pPr>
+      <w:r>
+        <w:t xml:space="preserve">Higher proportion of colonised area could come from the different size of the continents, North America being wider both in terms of absolute surface and number of pixels.</w:t>
+      </w:r>
+    </w:p>
+    <w:p>
+      <w:pPr>
+        <w:pStyle w:val="BodyText"/>
+      </w:pPr>
+      <w:r>
+        <w:t xml:space="preserve">Problem of taxonomic extinctions in Gen3sis!</w:t>
+      </w:r>
+    </w:p>
+    <w:p>
+      <w:pPr>
+        <w:pStyle w:val="BodyText"/>
+      </w:pPr>
+      <w:r>
+        <w:t xml:space="preserve">Timeline of the simulation (last 5Myrs). Some claim for an onset of the interchange further back in time, but we justify our choice as (1) most studies agree with an onset of significant mammal exchange</w:t>
+      </w:r>
+      <w:r>
+        <w:t xml:space="preserve"> </w:t>
+      </w:r>
+      <w:r>
+        <w:rPr>
+          <w:i/>
+          <w:iCs/>
+        </w:rPr>
+        <w:t xml:space="preserve">c.</w:t>
+      </w:r>
+      <w:r>
+        <w:t xml:space="preserve"> </w:t>
+      </w:r>
+      <w:r>
+        <w:t xml:space="preserve">3.5 Ma and (2) assumpltion of fixed palaeogeography.</w:t>
+      </w:r>
+    </w:p>
+    <w:bookmarkEnd w:id="42"/>
+    <w:bookmarkEnd w:id="43"/>
+    <w:bookmarkStart w:id="44" w:name="thrash"/>
+    <w:p>
+      <w:pPr>
+        <w:pStyle w:val="Heading1"/>
+      </w:pPr>
+      <w:r>
+        <w:t xml:space="preserve">Thrash</w:t>
+      </w:r>
+    </w:p>
+    <w:p>
+      <w:pPr>
+        <w:pStyle w:val="FirstParagraph"/>
+      </w:pPr>
+      <w:r>
+        <w:t xml:space="preserve">Throughout its evolutionary history, the biosphere has been repeatedly marked by the occurrence of geodispersal events, that is, exchanges of large species pools across landmasses</w:t>
+      </w:r>
+      <w:r>
+        <w:rPr>
+          <w:vertAlign w:val="superscript"/>
+        </w:rPr>
+        <w:t xml:space="preserve">48</w:t>
+      </w:r>
+      <w:r>
+        <w:t xml:space="preserve">.</w:t>
+      </w:r>
+    </w:p>
+    <w:p>
+      <w:pPr>
+        <w:pStyle w:val="BodyText"/>
+      </w:pPr>
+      <w:r>
+        <w:t xml:space="preserve">These would include Pleistocene climate fluctuations and the consequent alternating phases of emergence of open landscapes across Central America, in turn favouring the dispersal of large temperate-adapted mammals to the detriment of tropical-adapted ones</w:t>
+      </w:r>
+    </w:p>
+    <w:p>
+      <w:pPr>
+        <w:pStyle w:val="BodyText"/>
+      </w:pPr>
+      <w:r>
+        <w:t xml:space="preserve">Other studies proposed the implication of abiotic factors. Some put the emphasis on Pleistocene climate fluctuations and the consequent alternating phases of emergence of landscape opening across Central America, in turn favouring the dispersal of large temperate-adapted mammals to the detriment of tropical-adapted ones</w:t>
+      </w:r>
+      <w:r>
+        <w:rPr>
+          <w:vertAlign w:val="superscript"/>
+        </w:rPr>
+        <w:t xml:space="preserve">8,10,17</w:t>
+      </w:r>
+      <w:r>
+        <w:t xml:space="preserve">. Others drew direct relationships between the higher extinction rates of native South American mammal genera and temperature change</w:t>
+      </w:r>
+      <w:r>
+        <w:rPr>
+          <w:vertAlign w:val="superscript"/>
+        </w:rPr>
+        <w:t xml:space="preserve">24</w:t>
+      </w:r>
+      <w:r>
+        <w:t xml:space="preserve">.</w:t>
+      </w:r>
+    </w:p>
+    <w:p>
+      <w:pPr>
+        <w:pStyle w:val="BodyText"/>
+      </w:pPr>
+      <w:r>
+        <w:t xml:space="preserve">several studies proposed that palaeoclimate change shaped unequal dispersal abilities between northern and southern taxa</w:t>
+      </w:r>
+      <w:r>
+        <w:rPr>
+          <w:vertAlign w:val="superscript"/>
+        </w:rPr>
+        <w:t xml:space="preserve">8,10,17,24</w:t>
+      </w:r>
+      <w:r>
+        <w:t xml:space="preserve">, although the hypothesis according to which the asymmetry of the GABI would stem from dispersal rates is still largely debated</w:t>
+      </w:r>
+      <w:r>
+        <w:rPr>
+          <w:i/>
+          <w:iCs/>
+          <w:vertAlign w:val="superscript"/>
+        </w:rPr>
+        <w:t xml:space="preserve">e</w:t>
+      </w:r>
+      <w:r>
+        <w:rPr>
+          <w:vertAlign w:val="superscript"/>
+        </w:rPr>
+        <w:t xml:space="preserve">.</w:t>
+      </w:r>
+      <w:r>
+        <w:rPr>
+          <w:i/>
+          <w:iCs/>
+          <w:vertAlign w:val="superscript"/>
+        </w:rPr>
+        <w:t xml:space="preserve">g</w:t>
+      </w:r>
+      <w:r>
+        <w:rPr>
+          <w:vertAlign w:val="superscript"/>
+        </w:rPr>
         <w:t xml:space="preserve">., 12</w:t>
       </w:r>
       <w:r>
@@ -3148,8 +3339,8 @@
         <w:br w:type="page"/>
       </w:r>
     </w:p>
-    <w:bookmarkEnd w:id="43"/>
-    <w:bookmarkStart w:id="127" w:name="references"/>
+    <w:bookmarkEnd w:id="44"/>
+    <w:bookmarkStart w:id="140" w:name="references"/>
     <w:p>
       <w:pPr>
         <w:pStyle w:val="Heading1"/>
@@ -3158,8 +3349,8 @@
         <w:t xml:space="preserve">References</w:t>
       </w:r>
     </w:p>
-    <w:bookmarkStart w:id="126" w:name="refs"/>
-    <w:bookmarkStart w:id="45" w:name="ref-marshall1982"/>
+    <w:bookmarkStart w:id="139" w:name="refs"/>
+    <w:bookmarkStart w:id="46" w:name="ref-marshall1982"/>
     <w:p>
       <w:pPr>
         <w:pStyle w:val="Bibliography"/>
@@ -3179,7 +3370,7 @@
       <w:r>
         <w:t xml:space="preserve"> </w:t>
       </w:r>
-      <w:hyperlink r:id="rId44">
+      <w:hyperlink r:id="rId45">
         <w:r>
           <w:rPr>
             <w:rStyle w:val="Hyperlink"/>
@@ -3204,8 +3395,8 @@
         <w:t xml:space="preserve">, 1351–1357.</w:t>
       </w:r>
     </w:p>
-    <w:bookmarkEnd w:id="45"/>
-    <w:bookmarkStart w:id="47" w:name="ref-montes2015"/>
+    <w:bookmarkEnd w:id="46"/>
+    <w:bookmarkStart w:id="48" w:name="ref-montes2015"/>
     <w:p>
       <w:pPr>
         <w:pStyle w:val="Bibliography"/>
@@ -3238,7 +3429,7 @@
       <w:r>
         <w:t xml:space="preserve"> </w:t>
       </w:r>
-      <w:hyperlink r:id="rId46">
+      <w:hyperlink r:id="rId47">
         <w:r>
           <w:rPr>
             <w:rStyle w:val="Hyperlink"/>
@@ -3250,8 +3441,8 @@
         <w:t xml:space="preserve">.</w:t>
       </w:r>
     </w:p>
-    <w:bookmarkEnd w:id="47"/>
-    <w:bookmarkStart w:id="49" w:name="ref-jaramillo2018"/>
+    <w:bookmarkEnd w:id="48"/>
+    <w:bookmarkStart w:id="50" w:name="ref-jaramillo2018"/>
     <w:p>
       <w:pPr>
         <w:pStyle w:val="Bibliography"/>
@@ -3271,7 +3462,7 @@
       <w:r>
         <w:t xml:space="preserve"> </w:t>
       </w:r>
-      <w:hyperlink r:id="rId48">
+      <w:hyperlink r:id="rId49">
         <w:r>
           <w:rPr>
             <w:rStyle w:val="Hyperlink"/>
@@ -3283,8 +3474,8 @@
         <w:t xml:space="preserve">. In (John Wiley &amp; Sons).</w:t>
       </w:r>
     </w:p>
-    <w:bookmarkEnd w:id="49"/>
-    <w:bookmarkStart w:id="51" w:name="ref-odea2016"/>
+    <w:bookmarkEnd w:id="50"/>
+    <w:bookmarkStart w:id="52" w:name="ref-odea2016"/>
     <w:p>
       <w:pPr>
         <w:pStyle w:val="Bibliography"/>
@@ -3317,7 +3508,7 @@
       <w:r>
         <w:t xml:space="preserve"> </w:t>
       </w:r>
-      <w:hyperlink r:id="rId50">
+      <w:hyperlink r:id="rId51">
         <w:r>
           <w:rPr>
             <w:rStyle w:val="Hyperlink"/>
@@ -3329,8 +3520,8 @@
         <w:t xml:space="preserve">.</w:t>
       </w:r>
     </w:p>
-    <w:bookmarkEnd w:id="51"/>
-    <w:bookmarkStart w:id="53" w:name="ref-verzi2008"/>
+    <w:bookmarkEnd w:id="52"/>
+    <w:bookmarkStart w:id="54" w:name="ref-verzi2008"/>
     <w:p>
       <w:pPr>
         <w:pStyle w:val="Bibliography"/>
@@ -3363,7 +3554,7 @@
       <w:r>
         <w:t xml:space="preserve"> </w:t>
       </w:r>
-      <w:hyperlink r:id="rId52">
+      <w:hyperlink r:id="rId53">
         <w:r>
           <w:rPr>
             <w:rStyle w:val="Hyperlink"/>
@@ -3375,8 +3566,8 @@
         <w:t xml:space="preserve">.</w:t>
       </w:r>
     </w:p>
-    <w:bookmarkEnd w:id="53"/>
-    <w:bookmarkStart w:id="55" w:name="ref-woodburne2010"/>
+    <w:bookmarkEnd w:id="54"/>
+    <w:bookmarkStart w:id="56" w:name="ref-woodburne2010"/>
     <w:p>
       <w:pPr>
         <w:pStyle w:val="Bibliography"/>
@@ -3409,7 +3600,7 @@
       <w:r>
         <w:t xml:space="preserve"> </w:t>
       </w:r>
-      <w:hyperlink r:id="rId54">
+      <w:hyperlink r:id="rId55">
         <w:r>
           <w:rPr>
             <w:rStyle w:val="Hyperlink"/>
@@ -3421,8 +3612,8 @@
         <w:t xml:space="preserve">.</w:t>
       </w:r>
     </w:p>
-    <w:bookmarkEnd w:id="55"/>
-    <w:bookmarkStart w:id="57" w:name="ref-bacon2015"/>
+    <w:bookmarkEnd w:id="56"/>
+    <w:bookmarkStart w:id="58" w:name="ref-bacon2015"/>
     <w:p>
       <w:pPr>
         <w:pStyle w:val="Bibliography"/>
@@ -3455,7 +3646,7 @@
       <w:r>
         <w:t xml:space="preserve"> </w:t>
       </w:r>
-      <w:hyperlink r:id="rId56">
+      <w:hyperlink r:id="rId57">
         <w:r>
           <w:rPr>
             <w:rStyle w:val="Hyperlink"/>
@@ -3467,8 +3658,8 @@
         <w:t xml:space="preserve">.</w:t>
       </w:r>
     </w:p>
-    <w:bookmarkEnd w:id="57"/>
-    <w:bookmarkStart w:id="59" w:name="ref-bacon2016"/>
+    <w:bookmarkEnd w:id="58"/>
+    <w:bookmarkStart w:id="60" w:name="ref-bacon2016"/>
     <w:p>
       <w:pPr>
         <w:pStyle w:val="Bibliography"/>
@@ -3501,7 +3692,7 @@
       <w:r>
         <w:t xml:space="preserve"> </w:t>
       </w:r>
-      <w:hyperlink r:id="rId58">
+      <w:hyperlink r:id="rId59">
         <w:r>
           <w:rPr>
             <w:rStyle w:val="Hyperlink"/>
@@ -3513,8 +3704,8 @@
         <w:t xml:space="preserve">.</w:t>
       </w:r>
     </w:p>
-    <w:bookmarkEnd w:id="59"/>
-    <w:bookmarkStart w:id="61" w:name="ref-webb1976"/>
+    <w:bookmarkEnd w:id="60"/>
+    <w:bookmarkStart w:id="62" w:name="ref-webb1976"/>
     <w:p>
       <w:pPr>
         <w:pStyle w:val="Bibliography"/>
@@ -3534,7 +3725,7 @@
       <w:r>
         <w:t xml:space="preserve"> </w:t>
       </w:r>
-      <w:hyperlink r:id="rId60">
+      <w:hyperlink r:id="rId61">
         <w:r>
           <w:rPr>
             <w:rStyle w:val="Hyperlink"/>
@@ -3559,8 +3750,8 @@
         <w:t xml:space="preserve">, 220–234.</w:t>
       </w:r>
     </w:p>
-    <w:bookmarkEnd w:id="61"/>
-    <w:bookmarkStart w:id="63" w:name="ref-webb1991"/>
+    <w:bookmarkEnd w:id="62"/>
+    <w:bookmarkStart w:id="64" w:name="ref-webb1991"/>
     <w:p>
       <w:pPr>
         <w:pStyle w:val="Bibliography"/>
@@ -3593,7 +3784,7 @@
       <w:r>
         <w:t xml:space="preserve"> </w:t>
       </w:r>
-      <w:hyperlink r:id="rId62">
+      <w:hyperlink r:id="rId63">
         <w:r>
           <w:rPr>
             <w:rStyle w:val="Hyperlink"/>
@@ -3605,8 +3796,8 @@
         <w:t xml:space="preserve">.</w:t>
       </w:r>
     </w:p>
-    <w:bookmarkEnd w:id="63"/>
-    <w:bookmarkStart w:id="65" w:name="ref-cione2015"/>
+    <w:bookmarkEnd w:id="64"/>
+    <w:bookmarkStart w:id="66" w:name="ref-cione2015"/>
     <w:p>
       <w:pPr>
         <w:pStyle w:val="Bibliography"/>
@@ -3626,7 +3817,7 @@
       <w:r>
         <w:t xml:space="preserve"> </w:t>
       </w:r>
-      <w:hyperlink r:id="rId64">
+      <w:hyperlink r:id="rId65">
         <w:r>
           <w:rPr>
             <w:rStyle w:val="Hyperlink"/>
@@ -3641,8 +3832,8 @@
         <w:t xml:space="preserve">(Springer Netherlands).</w:t>
       </w:r>
     </w:p>
-    <w:bookmarkEnd w:id="65"/>
-    <w:bookmarkStart w:id="67" w:name="ref-carrillo2020"/>
+    <w:bookmarkEnd w:id="66"/>
+    <w:bookmarkStart w:id="68" w:name="ref-carrillo2020"/>
     <w:p>
       <w:pPr>
         <w:pStyle w:val="Bibliography"/>
@@ -3675,7 +3866,7 @@
       <w:r>
         <w:t xml:space="preserve"> </w:t>
       </w:r>
-      <w:hyperlink r:id="rId66">
+      <w:hyperlink r:id="rId67">
         <w:r>
           <w:rPr>
             <w:rStyle w:val="Hyperlink"/>
@@ -3687,8 +3878,8 @@
         <w:t xml:space="preserve">.</w:t>
       </w:r>
     </w:p>
-    <w:bookmarkEnd w:id="67"/>
-    <w:bookmarkStart w:id="69" w:name="ref-croft2020"/>
+    <w:bookmarkEnd w:id="68"/>
+    <w:bookmarkStart w:id="70" w:name="ref-croft2020"/>
     <w:p>
       <w:pPr>
         <w:pStyle w:val="Bibliography"/>
@@ -3721,7 +3912,7 @@
       <w:r>
         <w:t xml:space="preserve"> </w:t>
       </w:r>
-      <w:hyperlink r:id="rId68">
+      <w:hyperlink r:id="rId69">
         <w:r>
           <w:rPr>
             <w:rStyle w:val="Hyperlink"/>
@@ -3733,8 +3924,8 @@
         <w:t xml:space="preserve">.</w:t>
       </w:r>
     </w:p>
-    <w:bookmarkEnd w:id="69"/>
-    <w:bookmarkStart w:id="71" w:name="ref-boscaini2025"/>
+    <w:bookmarkEnd w:id="70"/>
+    <w:bookmarkStart w:id="72" w:name="ref-boscaini2025"/>
     <w:p>
       <w:pPr>
         <w:pStyle w:val="Bibliography"/>
@@ -3767,7 +3958,7 @@
       <w:r>
         <w:t xml:space="preserve"> </w:t>
       </w:r>
-      <w:hyperlink r:id="rId70">
+      <w:hyperlink r:id="rId71">
         <w:r>
           <w:rPr>
             <w:rStyle w:val="Hyperlink"/>
@@ -3779,8 +3970,8 @@
         <w:t xml:space="preserve">.</w:t>
       </w:r>
     </w:p>
-    <w:bookmarkEnd w:id="71"/>
-    <w:bookmarkStart w:id="72" w:name="ref-simpson1980"/>
+    <w:bookmarkEnd w:id="72"/>
+    <w:bookmarkStart w:id="73" w:name="ref-simpson1980"/>
     <w:p>
       <w:pPr>
         <w:pStyle w:val="Bibliography"/>
@@ -3798,8 +3989,8 @@
         <w:t xml:space="preserve">Simpson, G.G. (1980). Splendid isolation : The curious history of south american mammals Yale University Press, New Haven.</w:t>
       </w:r>
     </w:p>
-    <w:bookmarkEnd w:id="72"/>
-    <w:bookmarkStart w:id="74" w:name="ref-domingo2020"/>
+    <w:bookmarkEnd w:id="73"/>
+    <w:bookmarkStart w:id="75" w:name="ref-domingo2020"/>
     <w:p>
       <w:pPr>
         <w:pStyle w:val="Bibliography"/>
@@ -3832,7 +4023,7 @@
       <w:r>
         <w:t xml:space="preserve"> </w:t>
       </w:r>
-      <w:hyperlink r:id="rId73">
+      <w:hyperlink r:id="rId74">
         <w:r>
           <w:rPr>
             <w:rStyle w:val="Hyperlink"/>
@@ -3844,8 +4035,8 @@
         <w:t xml:space="preserve">.</w:t>
       </w:r>
     </w:p>
-    <w:bookmarkEnd w:id="74"/>
-    <w:bookmarkStart w:id="75" w:name="ref-marshall1990"/>
+    <w:bookmarkEnd w:id="75"/>
+    <w:bookmarkStart w:id="76" w:name="ref-marshall1990"/>
     <w:p>
       <w:pPr>
         <w:pStyle w:val="Bibliography"/>
@@ -3876,8 +4067,8 @@
         <w:t xml:space="preserve">, 169–210.</w:t>
       </w:r>
     </w:p>
-    <w:bookmarkEnd w:id="75"/>
-    <w:bookmarkStart w:id="77" w:name="ref-faurby2016"/>
+    <w:bookmarkEnd w:id="76"/>
+    <w:bookmarkStart w:id="78" w:name="ref-faurby2016"/>
     <w:p>
       <w:pPr>
         <w:pStyle w:val="Bibliography"/>
@@ -3910,7 +4101,7 @@
       <w:r>
         <w:t xml:space="preserve"> </w:t>
       </w:r>
-      <w:hyperlink r:id="rId76">
+      <w:hyperlink r:id="rId77">
         <w:r>
           <w:rPr>
             <w:rStyle w:val="Hyperlink"/>
@@ -3922,8 +4113,8 @@
         <w:t xml:space="preserve">.</w:t>
       </w:r>
     </w:p>
-    <w:bookmarkEnd w:id="77"/>
-    <w:bookmarkStart w:id="79" w:name="ref-fernández-monescillo2025"/>
+    <w:bookmarkEnd w:id="78"/>
+    <w:bookmarkStart w:id="80" w:name="ref-fernández-monescillo2025"/>
     <w:p>
       <w:pPr>
         <w:pStyle w:val="Bibliography"/>
@@ -3956,7 +4147,7 @@
       <w:r>
         <w:t xml:space="preserve"> </w:t>
       </w:r>
-      <w:hyperlink r:id="rId78">
+      <w:hyperlink r:id="rId79">
         <w:r>
           <w:rPr>
             <w:rStyle w:val="Hyperlink"/>
@@ -3968,8 +4159,8 @@
         <w:t xml:space="preserve">.</w:t>
       </w:r>
     </w:p>
-    <w:bookmarkEnd w:id="79"/>
-    <w:bookmarkStart w:id="81" w:name="ref-vrba1992"/>
+    <w:bookmarkEnd w:id="80"/>
+    <w:bookmarkStart w:id="82" w:name="ref-vrba1992"/>
     <w:p>
       <w:pPr>
         <w:pStyle w:val="Bibliography"/>
@@ -4002,7 +4193,7 @@
       <w:r>
         <w:t xml:space="preserve"> </w:t>
       </w:r>
-      <w:hyperlink r:id="rId80">
+      <w:hyperlink r:id="rId81">
         <w:r>
           <w:rPr>
             <w:rStyle w:val="Hyperlink"/>
@@ -4014,8 +4205,8 @@
         <w:t xml:space="preserve">.</w:t>
       </w:r>
     </w:p>
-    <w:bookmarkEnd w:id="81"/>
-    <w:bookmarkStart w:id="83" w:name="ref-prevosti2013"/>
+    <w:bookmarkEnd w:id="82"/>
+    <w:bookmarkStart w:id="84" w:name="ref-prevosti2013"/>
     <w:p>
       <w:pPr>
         <w:pStyle w:val="Bibliography"/>
@@ -4048,7 +4239,7 @@
       <w:r>
         <w:t xml:space="preserve"> </w:t>
       </w:r>
-      <w:hyperlink r:id="rId82">
+      <w:hyperlink r:id="rId83">
         <w:r>
           <w:rPr>
             <w:rStyle w:val="Hyperlink"/>
@@ -4060,8 +4251,8 @@
         <w:t xml:space="preserve">.</w:t>
       </w:r>
     </w:p>
-    <w:bookmarkEnd w:id="83"/>
-    <w:bookmarkStart w:id="85" w:name="ref-tarquini2022"/>
+    <w:bookmarkEnd w:id="84"/>
+    <w:bookmarkStart w:id="86" w:name="ref-tarquini2022"/>
     <w:p>
       <w:pPr>
         <w:pStyle w:val="Bibliography"/>
@@ -4094,7 +4285,7 @@
       <w:r>
         <w:t xml:space="preserve"> </w:t>
       </w:r>
-      <w:hyperlink r:id="rId84">
+      <w:hyperlink r:id="rId85">
         <w:r>
           <w:rPr>
             <w:rStyle w:val="Hyperlink"/>
@@ -4106,8 +4297,8 @@
         <w:t xml:space="preserve">.</w:t>
       </w:r>
     </w:p>
-    <w:bookmarkEnd w:id="85"/>
-    <w:bookmarkStart w:id="87" w:name="ref-marsà2025"/>
+    <w:bookmarkEnd w:id="86"/>
+    <w:bookmarkStart w:id="88" w:name="ref-marsà2025"/>
     <w:p>
       <w:pPr>
         <w:pStyle w:val="Bibliography"/>
@@ -4158,7 +4349,7 @@
       <w:r>
         <w:t xml:space="preserve"> </w:t>
       </w:r>
-      <w:hyperlink r:id="rId86">
+      <w:hyperlink r:id="rId87">
         <w:r>
           <w:rPr>
             <w:rStyle w:val="Hyperlink"/>
@@ -4170,8 +4361,8 @@
         <w:t xml:space="preserve">.</w:t>
       </w:r>
     </w:p>
-    <w:bookmarkEnd w:id="87"/>
-    <w:bookmarkStart w:id="89" w:name="ref-freitas-oliveira2024"/>
+    <w:bookmarkEnd w:id="88"/>
+    <w:bookmarkStart w:id="90" w:name="ref-freitas-oliveira2024"/>
     <w:p>
       <w:pPr>
         <w:pStyle w:val="Bibliography"/>
@@ -4204,7 +4395,7 @@
       <w:r>
         <w:t xml:space="preserve"> </w:t>
       </w:r>
-      <w:hyperlink r:id="rId88">
+      <w:hyperlink r:id="rId89">
         <w:r>
           <w:rPr>
             <w:rStyle w:val="Hyperlink"/>
@@ -4216,8 +4407,8 @@
         <w:t xml:space="preserve">.</w:t>
       </w:r>
     </w:p>
-    <w:bookmarkEnd w:id="89"/>
-    <w:bookmarkStart w:id="91" w:name="ref-pilowsky2022"/>
+    <w:bookmarkEnd w:id="90"/>
+    <w:bookmarkStart w:id="92" w:name="ref-pilowsky2022"/>
     <w:p>
       <w:pPr>
         <w:pStyle w:val="Bibliography"/>
@@ -4250,7 +4441,7 @@
       <w:r>
         <w:t xml:space="preserve"> </w:t>
       </w:r>
-      <w:hyperlink r:id="rId90">
+      <w:hyperlink r:id="rId91">
         <w:r>
           <w:rPr>
             <w:rStyle w:val="Hyperlink"/>
@@ -4262,8 +4453,8 @@
         <w:t xml:space="preserve">.</w:t>
       </w:r>
     </w:p>
-    <w:bookmarkEnd w:id="91"/>
-    <w:bookmarkStart w:id="93" w:name="ref-hagen2023"/>
+    <w:bookmarkEnd w:id="92"/>
+    <w:bookmarkStart w:id="94" w:name="ref-hagen2023"/>
     <w:p>
       <w:pPr>
         <w:pStyle w:val="Bibliography"/>
@@ -4296,7 +4487,7 @@
       <w:r>
         <w:t xml:space="preserve"> </w:t>
       </w:r>
-      <w:hyperlink r:id="rId92">
+      <w:hyperlink r:id="rId93">
         <w:r>
           <w:rPr>
             <w:rStyle w:val="Hyperlink"/>
@@ -4308,8 +4499,8 @@
         <w:t xml:space="preserve">.</w:t>
       </w:r>
     </w:p>
-    <w:bookmarkEnd w:id="93"/>
-    <w:bookmarkStart w:id="95" w:name="ref-hagen2021"/>
+    <w:bookmarkEnd w:id="94"/>
+    <w:bookmarkStart w:id="96" w:name="ref-hagen2021"/>
     <w:p>
       <w:pPr>
         <w:pStyle w:val="Bibliography"/>
@@ -4348,7 +4539,7 @@
       <w:r>
         <w:t xml:space="preserve"> </w:t>
       </w:r>
-      <w:hyperlink r:id="rId94">
+      <w:hyperlink r:id="rId95">
         <w:r>
           <w:rPr>
             <w:rStyle w:val="Hyperlink"/>
@@ -4360,8 +4551,8 @@
         <w:t xml:space="preserve">.</w:t>
       </w:r>
     </w:p>
-    <w:bookmarkEnd w:id="95"/>
-    <w:bookmarkStart w:id="97" w:name="ref-hagen2021b"/>
+    <w:bookmarkEnd w:id="96"/>
+    <w:bookmarkStart w:id="98" w:name="ref-hagen2021b"/>
     <w:p>
       <w:pPr>
         <w:pStyle w:val="Bibliography"/>
@@ -4394,7 +4585,7 @@
       <w:r>
         <w:t xml:space="preserve"> </w:t>
       </w:r>
-      <w:hyperlink r:id="rId96">
+      <w:hyperlink r:id="rId97">
         <w:r>
           <w:rPr>
             <w:rStyle w:val="Hyperlink"/>
@@ -4406,8 +4597,8 @@
         <w:t xml:space="preserve">.</w:t>
       </w:r>
     </w:p>
-    <w:bookmarkEnd w:id="97"/>
-    <w:bookmarkStart w:id="99" w:name="ref-skeels2023b"/>
+    <w:bookmarkEnd w:id="98"/>
+    <w:bookmarkStart w:id="100" w:name="ref-skeels2023b"/>
     <w:p>
       <w:pPr>
         <w:pStyle w:val="Bibliography"/>
@@ -4440,7 +4631,7 @@
       <w:r>
         <w:t xml:space="preserve"> </w:t>
       </w:r>
-      <w:hyperlink r:id="rId98">
+      <w:hyperlink r:id="rId99">
         <w:r>
           <w:rPr>
             <w:rStyle w:val="Hyperlink"/>
@@ -4452,8 +4643,8 @@
         <w:t xml:space="preserve">.</w:t>
       </w:r>
     </w:p>
-    <w:bookmarkEnd w:id="99"/>
-    <w:bookmarkStart w:id="101" w:name="ref-boschman2023"/>
+    <w:bookmarkEnd w:id="100"/>
+    <w:bookmarkStart w:id="102" w:name="ref-boschman2023"/>
     <w:p>
       <w:pPr>
         <w:pStyle w:val="Bibliography"/>
@@ -4486,7 +4677,7 @@
       <w:r>
         <w:t xml:space="preserve"> </w:t>
       </w:r>
-      <w:hyperlink r:id="rId100">
+      <w:hyperlink r:id="rId101">
         <w:r>
           <w:rPr>
             <w:rStyle w:val="Hyperlink"/>
@@ -4498,8 +4689,8 @@
         <w:t xml:space="preserve">.</w:t>
       </w:r>
     </w:p>
-    <w:bookmarkEnd w:id="101"/>
-    <w:bookmarkStart w:id="103" w:name="ref-skeels2023"/>
+    <w:bookmarkEnd w:id="102"/>
+    <w:bookmarkStart w:id="104" w:name="ref-skeels2023"/>
     <w:p>
       <w:pPr>
         <w:pStyle w:val="Bibliography"/>
@@ -4532,7 +4723,7 @@
       <w:r>
         <w:t xml:space="preserve"> </w:t>
       </w:r>
-      <w:hyperlink r:id="rId102">
+      <w:hyperlink r:id="rId103">
         <w:r>
           <w:rPr>
             <w:rStyle w:val="Hyperlink"/>
@@ -4544,8 +4735,8 @@
         <w:t xml:space="preserve">.</w:t>
       </w:r>
     </w:p>
-    <w:bookmarkEnd w:id="103"/>
-    <w:bookmarkStart w:id="105" w:name="ref-liu2024"/>
+    <w:bookmarkEnd w:id="104"/>
+    <w:bookmarkStart w:id="106" w:name="ref-liu2024"/>
     <w:p>
       <w:pPr>
         <w:pStyle w:val="Bibliography"/>
@@ -4578,7 +4769,7 @@
       <w:r>
         <w:t xml:space="preserve"> </w:t>
       </w:r>
-      <w:hyperlink r:id="rId104">
+      <w:hyperlink r:id="rId105">
         <w:r>
           <w:rPr>
             <w:rStyle w:val="Hyperlink"/>
@@ -4590,8 +4781,8 @@
         <w:t xml:space="preserve">.</w:t>
       </w:r>
     </w:p>
-    <w:bookmarkEnd w:id="105"/>
-    <w:bookmarkStart w:id="107" w:name="ref-holden2019"/>
+    <w:bookmarkEnd w:id="106"/>
+    <w:bookmarkStart w:id="108" w:name="ref-holden2019"/>
     <w:p>
       <w:pPr>
         <w:pStyle w:val="Bibliography"/>
@@ -4624,7 +4815,7 @@
       <w:r>
         <w:t xml:space="preserve">, 5137–5155. https://doi.org/</w:t>
       </w:r>
-      <w:hyperlink r:id="rId106">
+      <w:hyperlink r:id="rId107">
         <w:r>
           <w:rPr>
             <w:rStyle w:val="Hyperlink"/>
@@ -4636,14 +4827,44 @@
         <w:t xml:space="preserve">.</w:t>
       </w:r>
     </w:p>
-    <w:bookmarkEnd w:id="107"/>
-    <w:bookmarkStart w:id="109" w:name="ref-barreto2023"/>
+    <w:bookmarkEnd w:id="108"/>
+    <w:bookmarkStart w:id="110" w:name="ref-gearty2023"/>
     <w:p>
       <w:pPr>
         <w:pStyle w:val="Bibliography"/>
       </w:pPr>
       <w:r>
         <w:t xml:space="preserve">34.</w:t>
+      </w:r>
+      <w:r>
+        <w:t xml:space="preserve"> </w:t>
+      </w:r>
+      <w:r>
+        <w:t xml:space="preserve">	</w:t>
+      </w:r>
+      <w:r>
+        <w:t xml:space="preserve">Gearty, W. (2023).</w:t>
+      </w:r>
+      <w:r>
+        <w:t xml:space="preserve"> </w:t>
+      </w:r>
+      <w:hyperlink r:id="rId109">
+        <w:r>
+          <w:rPr>
+            <w:rStyle w:val="Hyperlink"/>
+          </w:rPr>
+          <w:t xml:space="preserve">Deeptime: Plotting tools for anyone working in deep time. R package version 1.0.1.</w:t>
+        </w:r>
+      </w:hyperlink>
+    </w:p>
+    <w:bookmarkEnd w:id="110"/>
+    <w:bookmarkStart w:id="112" w:name="ref-barreto2023"/>
+    <w:p>
+      <w:pPr>
+        <w:pStyle w:val="Bibliography"/>
+      </w:pPr>
+      <w:r>
+        <w:t xml:space="preserve">35.</w:t>
       </w:r>
       <w:r>
         <w:t xml:space="preserve"> </w:t>
@@ -4670,7 +4891,7 @@
       <w:r>
         <w:t xml:space="preserve"> </w:t>
       </w:r>
-      <w:hyperlink r:id="rId108">
+      <w:hyperlink r:id="rId111">
         <w:r>
           <w:rPr>
             <w:rStyle w:val="Hyperlink"/>
@@ -4682,14 +4903,14 @@
         <w:t xml:space="preserve">.</w:t>
       </w:r>
     </w:p>
-    <w:bookmarkEnd w:id="109"/>
-    <w:bookmarkStart w:id="111" w:name="ref-galván2023"/>
+    <w:bookmarkEnd w:id="112"/>
+    <w:bookmarkStart w:id="114" w:name="ref-galván2023"/>
     <w:p>
       <w:pPr>
         <w:pStyle w:val="Bibliography"/>
       </w:pPr>
       <w:r>
-        <w:t xml:space="preserve">35.</w:t>
+        <w:t xml:space="preserve">36.</w:t>
       </w:r>
       <w:r>
         <w:t xml:space="preserve"> </w:t>
@@ -4703,7 +4924,7 @@
       <w:r>
         <w:t xml:space="preserve"> </w:t>
       </w:r>
-      <w:hyperlink r:id="rId110">
+      <w:hyperlink r:id="rId113">
         <w:r>
           <w:rPr>
             <w:rStyle w:val="Hyperlink"/>
@@ -4712,14 +4933,14 @@
         </w:r>
       </w:hyperlink>
     </w:p>
-    <w:bookmarkEnd w:id="111"/>
-    <w:bookmarkStart w:id="113" w:name="ref-obrien2023"/>
+    <w:bookmarkEnd w:id="114"/>
+    <w:bookmarkStart w:id="116" w:name="ref-köppen1900"/>
     <w:p>
       <w:pPr>
         <w:pStyle w:val="Bibliography"/>
       </w:pPr>
       <w:r>
-        <w:t xml:space="preserve">36.</w:t>
+        <w:t xml:space="preserve">37.</w:t>
       </w:r>
       <w:r>
         <w:t xml:space="preserve"> </w:t>
@@ -4728,12 +4949,58 @@
         <w:t xml:space="preserve">	</w:t>
       </w:r>
       <w:r>
+        <w:t xml:space="preserve">Köppen, W. (1900).</w:t>
+      </w:r>
+      <w:r>
+        <w:t xml:space="preserve"> </w:t>
+      </w:r>
+      <w:hyperlink r:id="rId115">
+        <w:r>
+          <w:rPr>
+            <w:rStyle w:val="Hyperlink"/>
+          </w:rPr>
+          <w:t xml:space="preserve">Versuch einer klassifikation der klimate, vorzugsweise nach ihren beziehungen zur pflanzenwelt</w:t>
+        </w:r>
+      </w:hyperlink>
+      <w:r>
+        <w:t xml:space="preserve">. Geographische Zeitschrift</w:t>
+      </w:r>
+      <w:r>
+        <w:t xml:space="preserve"> </w:t>
+      </w:r>
+      <w:r>
+        <w:rPr>
+          <w:i/>
+          <w:iCs/>
+        </w:rPr>
+        <w:t xml:space="preserve">6</w:t>
+      </w:r>
+      <w:r>
+        <w:t xml:space="preserve">, 593–611.</w:t>
+      </w:r>
+    </w:p>
+    <w:bookmarkEnd w:id="116"/>
+    <w:bookmarkStart w:id="118" w:name="ref-obrien2023"/>
+    <w:p>
+      <w:pPr>
+        <w:pStyle w:val="Bibliography"/>
+      </w:pPr>
+      <w:r>
+        <w:t xml:space="preserve">38.</w:t>
+      </w:r>
+      <w:r>
+        <w:t xml:space="preserve"> </w:t>
+      </w:r>
+      <w:r>
+        <w:t xml:space="preserve">	</w:t>
+      </w:r>
+      <w:r>
         <w:t xml:space="preserve">O’Brien, L. (2023).</w:t>
       </w:r>
       <w:r>
         <w:t xml:space="preserve"> </w:t>
       </w:r>
-      <w:hyperlink r:id="rId112">
+      <w:hyperlink r:id="rId117">
         <w:r>
           <w:rPr>
             <w:rStyle w:val="Hyperlink"/>
@@ -4745,14 +5012,14 @@
         <w:t xml:space="preserve">.</w:t>
       </w:r>
     </w:p>
-    <w:bookmarkEnd w:id="113"/>
-    <w:bookmarkStart w:id="115" w:name="ref-weir2009"/>
+    <w:bookmarkEnd w:id="118"/>
+    <w:bookmarkStart w:id="120" w:name="ref-weir2009"/>
     <w:p>
       <w:pPr>
         <w:pStyle w:val="Bibliography"/>
       </w:pPr>
       <w:r>
-        <w:t xml:space="preserve">37.</w:t>
+        <w:t xml:space="preserve">39.</w:t>
       </w:r>
       <w:r>
         <w:t xml:space="preserve"> </w:t>
@@ -4779,7 +5046,7 @@
       <w:r>
         <w:t xml:space="preserve"> </w:t>
       </w:r>
-      <w:hyperlink r:id="rId114">
+      <w:hyperlink r:id="rId119">
         <w:r>
           <w:rPr>
             <w:rStyle w:val="Hyperlink"/>
@@ -4791,14 +5058,14 @@
         <w:t xml:space="preserve">.</w:t>
       </w:r>
     </w:p>
-    <w:bookmarkEnd w:id="115"/>
-    <w:bookmarkStart w:id="117" w:name="ref-antonelli2018"/>
+    <w:bookmarkEnd w:id="120"/>
+    <w:bookmarkStart w:id="122" w:name="ref-antonelli2018"/>
     <w:p>
       <w:pPr>
         <w:pStyle w:val="Bibliography"/>
       </w:pPr>
       <w:r>
-        <w:t xml:space="preserve">38.</w:t>
+        <w:t xml:space="preserve">40.</w:t>
       </w:r>
       <w:r>
         <w:t xml:space="preserve"> </w:t>
@@ -4825,7 +5092,7 @@
       <w:r>
         <w:t xml:space="preserve"> </w:t>
       </w:r>
-      <w:hyperlink r:id="rId116">
+      <w:hyperlink r:id="rId121">
         <w:r>
           <w:rPr>
             <w:rStyle w:val="Hyperlink"/>
@@ -4837,14 +5104,14 @@
         <w:t xml:space="preserve">.</w:t>
       </w:r>
     </w:p>
-    <w:bookmarkEnd w:id="117"/>
-    <w:bookmarkStart w:id="119" w:name="ref-motta2025"/>
+    <w:bookmarkEnd w:id="122"/>
+    <w:bookmarkStart w:id="124" w:name="ref-motta2025"/>
     <w:p>
       <w:pPr>
         <w:pStyle w:val="Bibliography"/>
       </w:pPr>
       <w:r>
-        <w:t xml:space="preserve">39.</w:t>
+        <w:t xml:space="preserve">41.</w:t>
       </w:r>
       <w:r>
         <w:t xml:space="preserve"> </w:t>
@@ -4871,7 +5138,7 @@
       <w:r>
         <w:t xml:space="preserve"> </w:t>
       </w:r>
-      <w:hyperlink r:id="rId118">
+      <w:hyperlink r:id="rId123">
         <w:r>
           <w:rPr>
             <w:rStyle w:val="Hyperlink"/>
@@ -4883,14 +5150,14 @@
         <w:t xml:space="preserve">.</w:t>
       </w:r>
     </w:p>
-    <w:bookmarkEnd w:id="119"/>
-    <w:bookmarkStart w:id="121" w:name="ref-couvreur2011"/>
+    <w:bookmarkEnd w:id="124"/>
+    <w:bookmarkStart w:id="126" w:name="ref-pino2022"/>
     <w:p>
       <w:pPr>
         <w:pStyle w:val="Bibliography"/>
       </w:pPr>
       <w:r>
-        <w:t xml:space="preserve">40.</w:t>
+        <w:t xml:space="preserve">42.</w:t>
       </w:r>
       <w:r>
         <w:t xml:space="preserve"> </w:t>
@@ -4899,7 +5166,7 @@
         <w:t xml:space="preserve">	</w:t>
       </w:r>
       <w:r>
-        <w:t xml:space="preserve">Couvreur, T.L.P., Pirie, M.D., Chatrou, L.W., Saunders, R.M.K., Su, Y.C.F., Richardson, J.E., and Erkens, R.H.J. (2011). Early evolutionary history of the flowering plant family Annonaceae: steady diversification and boreotropical geodispersal. Journal of Biogeography</w:t>
+        <w:t xml:space="preserve">Pino, K., Vallejos-Garrido, P., Espinoza-Aravena, N., Cooper, R.B., Silvestro, D., Hernández, C.E., and Rodríguez-Serrano, E. (2022). Regional landscape change triggered by andean uplift: The extinction of sparassodonta (mammalia, metatheria) in south america. Global and Planetary Change</w:t>
       </w:r>
       <w:r>
         <w:t xml:space="preserve"> </w:t>
@@ -4909,6 +5176,235 @@
           <w:i/>
           <w:iCs/>
         </w:rPr>
+        <w:t xml:space="preserve">210</w:t>
+      </w:r>
+      <w:r>
+        <w:t xml:space="preserve">, 103758.</w:t>
+      </w:r>
+      <w:r>
+        <w:t xml:space="preserve"> </w:t>
+      </w:r>
+      <w:hyperlink r:id="rId125">
+        <w:r>
+          <w:rPr>
+            <w:rStyle w:val="Hyperlink"/>
+          </w:rPr>
+          <w:t xml:space="preserve">https://doi.org/10.1016/j.gloplacha.2022.103758</w:t>
+        </w:r>
+      </w:hyperlink>
+      <w:r>
+        <w:t xml:space="preserve">.</w:t>
+      </w:r>
+    </w:p>
+    <w:bookmarkEnd w:id="126"/>
+    <w:bookmarkStart w:id="128" w:name="ref-morgan1993"/>
+    <w:p>
+      <w:pPr>
+        <w:pStyle w:val="Bibliography"/>
+      </w:pPr>
+      <w:r>
+        <w:t xml:space="preserve">43.</w:t>
+      </w:r>
+      <w:r>
+        <w:t xml:space="preserve"> </w:t>
+      </w:r>
+      <w:r>
+        <w:t xml:space="preserve">	</w:t>
+      </w:r>
+      <w:r>
+        <w:t xml:space="preserve">Morgan, G.S. (1993). Quaternary land vertebrates of jamaica. In, R. M. Wright and E. Robinson, eds. (Geological Society of America), p. 0.</w:t>
+      </w:r>
+      <w:r>
+        <w:t xml:space="preserve"> </w:t>
+      </w:r>
+      <w:hyperlink r:id="rId127">
+        <w:r>
+          <w:rPr>
+            <w:rStyle w:val="Hyperlink"/>
+          </w:rPr>
+          <w:t xml:space="preserve">https://doi.org/10.1130/MEM182-p417</w:t>
+        </w:r>
+      </w:hyperlink>
+      <w:r>
+        <w:t xml:space="preserve">.</w:t>
+      </w:r>
+    </w:p>
+    <w:bookmarkEnd w:id="128"/>
+    <w:bookmarkStart w:id="130" w:name="ref-ali2021b"/>
+    <w:p>
+      <w:pPr>
+        <w:pStyle w:val="Bibliography"/>
+      </w:pPr>
+      <w:r>
+        <w:t xml:space="preserve">44.</w:t>
+      </w:r>
+      <w:r>
+        <w:t xml:space="preserve"> </w:t>
+      </w:r>
+      <w:r>
+        <w:t xml:space="preserve">	</w:t>
+      </w:r>
+      <w:r>
+        <w:t xml:space="preserve">Ali, J.R., and Hedges, S.B. (2021). Colonizing the caribbean: New geological data and an updated land-vertebrate colonization record challenge the</w:t>
+      </w:r>
+      <w:r>
+        <w:t xml:space="preserve"> </w:t>
+      </w:r>
+      <w:r>
+        <w:t xml:space="preserve">GAARlandia</w:t>
+      </w:r>
+      <w:r>
+        <w:t xml:space="preserve"> </w:t>
+      </w:r>
+      <w:r>
+        <w:t xml:space="preserve">land-bridge hypothesis. Journal of Biogeography</w:t>
+      </w:r>
+      <w:r>
+        <w:t xml:space="preserve"> </w:t>
+      </w:r>
+      <w:r>
+        <w:rPr>
+          <w:i/>
+          <w:iCs/>
+        </w:rPr>
+        <w:t xml:space="preserve">48</w:t>
+      </w:r>
+      <w:r>
+        <w:t xml:space="preserve">, 2699–2707.</w:t>
+      </w:r>
+      <w:r>
+        <w:t xml:space="preserve"> </w:t>
+      </w:r>
+      <w:hyperlink r:id="rId129">
+        <w:r>
+          <w:rPr>
+            <w:rStyle w:val="Hyperlink"/>
+          </w:rPr>
+          <w:t xml:space="preserve">https://doi.org/10.1111/jbi.14234</w:t>
+        </w:r>
+      </w:hyperlink>
+      <w:r>
+        <w:t xml:space="preserve">.</w:t>
+      </w:r>
+    </w:p>
+    <w:bookmarkEnd w:id="130"/>
+    <w:bookmarkStart w:id="132" w:name="ref-cornée2021"/>
+    <w:p>
+      <w:pPr>
+        <w:pStyle w:val="Bibliography"/>
+      </w:pPr>
+      <w:r>
+        <w:t xml:space="preserve">45.</w:t>
+      </w:r>
+      <w:r>
+        <w:t xml:space="preserve"> </w:t>
+      </w:r>
+      <w:r>
+        <w:t xml:space="preserve">	</w:t>
+      </w:r>
+      <w:r>
+        <w:t xml:space="preserve">Cornée, J.-J., Münch, P., Philippon, M., BouDagher-Fadel, M., Quillévéré, F., Melinte-Dobrinescu, M., Lebrun, J.-F., Gay, A., Meyer, S., Montheil, L., et al. (2021). Lost islands in the northern lesser antilles: Possible milestones in the cenozoic dispersal of terrestrial organisms between south-america and the greater antilles. Earth-Science Reviews</w:t>
+      </w:r>
+      <w:r>
+        <w:t xml:space="preserve"> </w:t>
+      </w:r>
+      <w:r>
+        <w:rPr>
+          <w:i/>
+          <w:iCs/>
+        </w:rPr>
+        <w:t xml:space="preserve">217</w:t>
+      </w:r>
+      <w:r>
+        <w:t xml:space="preserve">, 103617.</w:t>
+      </w:r>
+      <w:r>
+        <w:t xml:space="preserve"> </w:t>
+      </w:r>
+      <w:hyperlink r:id="rId131">
+        <w:r>
+          <w:rPr>
+            <w:rStyle w:val="Hyperlink"/>
+          </w:rPr>
+          <w:t xml:space="preserve">https://doi.org/10.1016/j.earscirev.2021.103617</w:t>
+        </w:r>
+      </w:hyperlink>
+      <w:r>
+        <w:t xml:space="preserve">.</w:t>
+      </w:r>
+    </w:p>
+    <w:bookmarkEnd w:id="132"/>
+    <w:bookmarkStart w:id="134" w:name="ref-warren2015"/>
+    <w:p>
+      <w:pPr>
+        <w:pStyle w:val="Bibliography"/>
+      </w:pPr>
+      <w:r>
+        <w:t xml:space="preserve">46.</w:t>
+      </w:r>
+      <w:r>
+        <w:t xml:space="preserve"> </w:t>
+      </w:r>
+      <w:r>
+        <w:t xml:space="preserve">	</w:t>
+      </w:r>
+      <w:r>
+        <w:t xml:space="preserve">Warren, B.H., Simberloff, D., Ricklefs, R.E., Aguilée, R., Condamine, F.L., Gravel, D., Morlon, H., Mouquet, N., Rosindell, J., Casquet, J., et al. (2015). Islands as model systems in ecology and evolution: prospects fifty years after MacArthur-Wilson. Ecology Letters</w:t>
+      </w:r>
+      <w:r>
+        <w:t xml:space="preserve"> </w:t>
+      </w:r>
+      <w:r>
+        <w:rPr>
+          <w:i/>
+          <w:iCs/>
+        </w:rPr>
+        <w:t xml:space="preserve">18</w:t>
+      </w:r>
+      <w:r>
+        <w:t xml:space="preserve">, 200–217.</w:t>
+      </w:r>
+      <w:r>
+        <w:t xml:space="preserve"> </w:t>
+      </w:r>
+      <w:hyperlink r:id="rId133">
+        <w:r>
+          <w:rPr>
+            <w:rStyle w:val="Hyperlink"/>
+          </w:rPr>
+          <w:t xml:space="preserve">https://doi.org/10.1111/ele.12398</w:t>
+        </w:r>
+      </w:hyperlink>
+      <w:r>
+        <w:t xml:space="preserve">.</w:t>
+      </w:r>
+    </w:p>
+    <w:bookmarkEnd w:id="134"/>
+    <w:bookmarkStart w:id="136" w:name="ref-couvreur2011"/>
+    <w:p>
+      <w:pPr>
+        <w:pStyle w:val="Bibliography"/>
+      </w:pPr>
+      <w:r>
+        <w:t xml:space="preserve">47.</w:t>
+      </w:r>
+      <w:r>
+        <w:t xml:space="preserve"> </w:t>
+      </w:r>
+      <w:r>
+        <w:t xml:space="preserve">	</w:t>
+      </w:r>
+      <w:r>
+        <w:t xml:space="preserve">Couvreur, T.L.P., Pirie, M.D., Chatrou, L.W., Saunders, R.M.K., Su, Y.C.F., Richardson, J.E., and Erkens, R.H.J. (2011). Early evolutionary history of the flowering plant family Annonaceae: steady diversification and boreotropical geodispersal. Journal of Biogeography</w:t>
+      </w:r>
+      <w:r>
+        <w:t xml:space="preserve"> </w:t>
+      </w:r>
+      <w:r>
+        <w:rPr>
+          <w:i/>
+          <w:iCs/>
+        </w:rPr>
         <w:t xml:space="preserve">38</w:t>
       </w:r>
       <w:r>
@@ -4917,7 +5413,7 @@
       <w:r>
         <w:t xml:space="preserve"> </w:t>
       </w:r>
-      <w:hyperlink r:id="rId120">
+      <w:hyperlink r:id="rId135">
         <w:r>
           <w:rPr>
             <w:rStyle w:val="Hyperlink"/>
@@ -4929,14 +5425,14 @@
         <w:t xml:space="preserve">.</w:t>
       </w:r>
     </w:p>
-    <w:bookmarkEnd w:id="121"/>
-    <w:bookmarkStart w:id="123" w:name="ref-upchurch2024"/>
+    <w:bookmarkEnd w:id="136"/>
+    <w:bookmarkStart w:id="138" w:name="ref-upchurch2024"/>
     <w:p>
       <w:pPr>
         <w:pStyle w:val="Bibliography"/>
       </w:pPr>
       <w:r>
-        <w:t xml:space="preserve">41.</w:t>
+        <w:t xml:space="preserve">48.</w:t>
       </w:r>
       <w:r>
         <w:t xml:space="preserve"> </w:t>
@@ -4963,7 +5459,7 @@
       <w:r>
         <w:t xml:space="preserve"> </w:t>
       </w:r>
-      <w:hyperlink r:id="rId122">
+      <w:hyperlink r:id="rId137">
         <w:r>
           <w:rPr>
             <w:rStyle w:val="Hyperlink"/>
@@ -4975,55 +5471,9 @@
         <w:t xml:space="preserve">.</w:t>
       </w:r>
     </w:p>
-    <w:bookmarkEnd w:id="123"/>
-    <w:bookmarkStart w:id="125" w:name="ref-pino2022"/>
-    <w:p>
-      <w:pPr>
-        <w:pStyle w:val="Bibliography"/>
-      </w:pPr>
-      <w:r>
-        <w:t xml:space="preserve">42.</w:t>
-      </w:r>
-      <w:r>
-        <w:t xml:space="preserve"> </w:t>
-      </w:r>
-      <w:r>
-        <w:t xml:space="preserve">	</w:t>
-      </w:r>
-      <w:r>
-        <w:t xml:space="preserve">Pino, K., Vallejos-Garrido, P., Espinoza-Aravena, N., Cooper, R.B., Silvestro, D., Hernández, C.E., and Rodríguez-Serrano, E. (2022). Regional landscape change triggered by andean uplift: The extinction of sparassodonta (mammalia, metatheria) in south america. Global and Planetary Change</w:t>
-      </w:r>
-      <w:r>
-        <w:t xml:space="preserve"> </w:t>
-      </w:r>
-      <w:r>
-        <w:rPr>
-          <w:i/>
-          <w:iCs/>
-        </w:rPr>
-        <w:t xml:space="preserve">210</w:t>
-      </w:r>
-      <w:r>
-        <w:t xml:space="preserve">, 103758.</w:t>
-      </w:r>
-      <w:r>
-        <w:t xml:space="preserve"> </w:t>
-      </w:r>
-      <w:hyperlink r:id="rId124">
-        <w:r>
-          <w:rPr>
-            <w:rStyle w:val="Hyperlink"/>
-          </w:rPr>
-          <w:t xml:space="preserve">https://doi.org/10.1016/j.gloplacha.2022.103758</w:t>
-        </w:r>
-      </w:hyperlink>
-      <w:r>
-        <w:t xml:space="preserve">.</w:t>
-      </w:r>
-    </w:p>
-    <w:bookmarkEnd w:id="125"/>
-    <w:bookmarkEnd w:id="126"/>
-    <w:bookmarkEnd w:id="127"/>
+    <w:bookmarkEnd w:id="138"/>
+    <w:bookmarkEnd w:id="139"/>
+    <w:bookmarkEnd w:id="140"/>
     <w:sectPr>
       <w:type w:val="nextPage"/>
       <w:pgSz w:h="15840" w:w="12240"/>

</xml_diff>

<commit_message>
generate configs after standardising dist to isthmus
</commit_message>
<xml_diff>
--- a/Manuscript/GABI_palaeo_constraints.docx
+++ b/Manuscript/GABI_palaeo_constraints.docx
@@ -1108,7 +1108,7 @@
         <w:pStyle w:val="FirstParagraph"/>
       </w:pPr>
       <w:r>
-        <w:t xml:space="preserve">We classified the climatic landscape at the time where simulation starts (</w:t>
+        <w:t xml:space="preserve">We classified the climatic landscape at the time of the simulation onset (</w:t>
       </w:r>
       <m:oMath>
         <m:r>
@@ -1207,7 +1207,7 @@
         <w:t xml:space="preserve">e</w:t>
       </w:r>
       <w:r>
-        <w:t xml:space="preserve">., the proportions of simulations starting within each biome – were very uneven across classes and continents. The majority of North American ancestral species originated in the cold biome, whereas the tropical biome recorded the largest proportion of ancestral species origination in South America (Supp. Fig. 5). The distribution of</w:t>
+        <w:t xml:space="preserve">., the proportions of simulations starting within each biome – were very uneven across biome classes and continents. Indeed, the majority of North American ancestral species originated in the cold biome, whereas the tropical biome recorded the largest proportion of ancestral species origination in South America (Supp. Fig. 5). Furthermore, simulations leading to a successful establishment in South America more preferentially started from an ancestor that originated in</w:t>
       </w:r>
     </w:p>
     <w:tbl>
@@ -1552,6 +1552,38 @@
       </w:pPr>
       <w:r>
         <w:t xml:space="preserve">Success in South America for temperate-adapted species, posited as the most successful, not recovered, with tropical meeting the gighest success</w:t>
+      </w:r>
+    </w:p>
+    <w:p>
+      <w:pPr>
+        <w:pStyle w:val="BodyText"/>
+      </w:pPr>
+      <w:r>
+        <w:t xml:space="preserve">Tropics as a</w:t>
+      </w:r>
+      <w:r>
+        <w:t xml:space="preserve"> </w:t>
+      </w:r>
+      <w:r>
+        <w:t xml:space="preserve">“</w:t>
+      </w:r>
+      <w:r>
+        <w:t xml:space="preserve">holding pen</w:t>
+      </w:r>
+      <w:r>
+        <w:t xml:space="preserve">”</w:t>
+      </w:r>
+      <w:r>
+        <w:rPr>
+          <w:vertAlign w:val="superscript"/>
+        </w:rPr>
+        <w:t xml:space="preserve">6</w:t>
+      </w:r>
+      <w:r>
+        <w:t xml:space="preserve"> </w:t>
+      </w:r>
+      <w:r>
+        <w:t xml:space="preserve">– read more this paper</w:t>
       </w:r>
     </w:p>
     <w:p>

</xml_diff>

<commit_message>
detail distance-related sensitivity analyses
</commit_message>
<xml_diff>
--- a/Manuscript/GABI_palaeo_constraints.docx
+++ b/Manuscript/GABI_palaeo_constraints.docx
@@ -1207,7 +1207,34 @@
         <w:t xml:space="preserve">e</w:t>
       </w:r>
       <w:r>
-        <w:t xml:space="preserve">., the proportions of simulations starting within each biome – were very uneven across biome classes and continents. Indeed, the majority of North American ancestral species originated in the cold biome, whereas the tropical biome recorded the largest proportion of ancestral species origination in South America (Supp. Fig. 5). Furthermore, simulations leading to a successful establishment in South America more preferentially started from an ancestor that originated in</w:t>
+        <w:t xml:space="preserve">., the number of simulations starting within each biome – were very uneven across biome classes and continents. Indeed, the majority of North American ancestral species originated in the cold biome, whereas the tropical biome recorded the largest proportion of ancestral species origination in South America (Supp. Fig. 5). Besides,</w:t>
+      </w:r>
+    </w:p>
+    <w:p>
+      <w:pPr>
+        <w:pStyle w:val="BodyText"/>
+      </w:pPr>
+      <w:r>
+        <w:t xml:space="preserve">Similar proportions of successful simulations that started from</w:t>
+      </w:r>
+    </w:p>
+    <w:p>
+      <w:pPr>
+        <w:pStyle w:val="BodyText"/>
+      </w:pPr>
+      <m:oMath>
+        <m:r>
+          <m:t>M</m:t>
+        </m:r>
+        <m:r>
+          <m:t>3</m:t>
+        </m:r>
+      </m:oMath>
+      <w:r>
+        <w:t xml:space="preserve"> </w:t>
+      </w:r>
+      <w:r>
+        <w:t xml:space="preserve">more permissive towards South American species migrating northwards than the other way around</w:t>
       </w:r>
     </w:p>
     <w:tbl>
@@ -1826,14 +1853,6 @@
         <w:pStyle w:val="FirstParagraph"/>
       </w:pPr>
       <w:r>
-        <w:t xml:space="preserve">Assumption of fixed palaeogeography, particularly near the isthmus, whereas we know that this region changed across our study.</w:t>
-      </w:r>
-    </w:p>
-    <w:p>
-      <w:pPr>
-        <w:pStyle w:val="BodyText"/>
-      </w:pPr>
-      <w:r>
         <w:t xml:space="preserve">The landscape designed for the purpose of this study (</w:t>
       </w:r>
       <w:hyperlink w:anchor="fig-1">
@@ -1945,6 +1964,35 @@
         <w:pStyle w:val="BodyText"/>
       </w:pPr>
       <w:r>
+        <w:t xml:space="preserve">Bias in the number of simulations crashing, with on average twice as many crashes when simulations started in North America when compared to those starting from South America. Also, an obvious spatial clustering of crashes in North America is to be reported, mainly affecting the centre of the landmass (temperate and cold biomes)</w:t>
+      </w:r>
+      <w:r>
+        <w:t xml:space="preserve"> </w:t>
+      </w:r>
+      <w:r>
+        <w:rPr>
+          <w:b/>
+          <w:bCs/>
+        </w:rPr>
+        <w:t xml:space="preserve">biome histogram + maps in SI</w:t>
+      </w:r>
+      <w:r>
+        <w:t xml:space="preserve">.</w:t>
+      </w:r>
+    </w:p>
+    <w:p>
+      <w:pPr>
+        <w:pStyle w:val="BodyText"/>
+      </w:pPr>
+      <w:r>
+        <w:t xml:space="preserve">Assumption of fixed palaeogeography, particularly near the isthmus, whereas we know that this region changed across our study.</w:t>
+      </w:r>
+    </w:p>
+    <w:p>
+      <w:pPr>
+        <w:pStyle w:val="BodyText"/>
+      </w:pPr>
+      <w:r>
         <w:t xml:space="preserve">spatial clustering of simulation crashing in temperate/cold North America =&gt; related to biome instability in the zone ?</w:t>
       </w:r>
     </w:p>
@@ -1990,7 +2038,25 @@
     </w:p>
     <w:bookmarkEnd w:id="42"/>
     <w:bookmarkEnd w:id="43"/>
-    <w:bookmarkStart w:id="44" w:name="thrash"/>
+    <w:bookmarkStart w:id="44" w:name="acknowledgements"/>
+    <w:p>
+      <w:pPr>
+        <w:pStyle w:val="Heading1"/>
+      </w:pPr>
+      <w:r>
+        <w:t xml:space="preserve">Acknowledgements</w:t>
+      </w:r>
+    </w:p>
+    <w:p>
+      <w:pPr>
+        <w:pStyle w:val="FirstParagraph"/>
+      </w:pPr>
+      <w:r>
+        <w:t xml:space="preserve">We thank Céline Devaux for her useful comments and feedbacks on the present work.</w:t>
+      </w:r>
+    </w:p>
+    <w:bookmarkEnd w:id="44"/>
+    <w:bookmarkStart w:id="45" w:name="thrash"/>
     <w:p>
       <w:pPr>
         <w:pStyle w:val="Heading1"/>
@@ -2103,8 +2169,8 @@
         <w:br w:type="page"/>
       </w:r>
     </w:p>
-    <w:bookmarkEnd w:id="44"/>
-    <w:bookmarkStart w:id="142" w:name="references"/>
+    <w:bookmarkEnd w:id="45"/>
+    <w:bookmarkStart w:id="143" w:name="references"/>
     <w:p>
       <w:pPr>
         <w:pStyle w:val="Heading1"/>
@@ -2113,8 +2179,8 @@
         <w:t xml:space="preserve">References</w:t>
       </w:r>
     </w:p>
-    <w:bookmarkStart w:id="141" w:name="refs"/>
-    <w:bookmarkStart w:id="46" w:name="ref-marshall1982"/>
+    <w:bookmarkStart w:id="142" w:name="refs"/>
+    <w:bookmarkStart w:id="47" w:name="ref-marshall1982"/>
     <w:p>
       <w:pPr>
         <w:pStyle w:val="Bibliography"/>
@@ -2134,7 +2200,7 @@
       <w:r>
         <w:t xml:space="preserve"> </w:t>
       </w:r>
-      <w:hyperlink r:id="rId45">
+      <w:hyperlink r:id="rId46">
         <w:r>
           <w:rPr>
             <w:rStyle w:val="Hyperlink"/>
@@ -2159,8 +2225,8 @@
         <w:t xml:space="preserve">, 1351–1357.</w:t>
       </w:r>
     </w:p>
-    <w:bookmarkEnd w:id="46"/>
-    <w:bookmarkStart w:id="48" w:name="ref-montes2015"/>
+    <w:bookmarkEnd w:id="47"/>
+    <w:bookmarkStart w:id="49" w:name="ref-montes2015"/>
     <w:p>
       <w:pPr>
         <w:pStyle w:val="Bibliography"/>
@@ -2193,7 +2259,7 @@
       <w:r>
         <w:t xml:space="preserve"> </w:t>
       </w:r>
-      <w:hyperlink r:id="rId47">
+      <w:hyperlink r:id="rId48">
         <w:r>
           <w:rPr>
             <w:rStyle w:val="Hyperlink"/>
@@ -2205,8 +2271,8 @@
         <w:t xml:space="preserve">.</w:t>
       </w:r>
     </w:p>
-    <w:bookmarkEnd w:id="48"/>
-    <w:bookmarkStart w:id="50" w:name="ref-jaramillo2018"/>
+    <w:bookmarkEnd w:id="49"/>
+    <w:bookmarkStart w:id="51" w:name="ref-jaramillo2018"/>
     <w:p>
       <w:pPr>
         <w:pStyle w:val="Bibliography"/>
@@ -2226,7 +2292,7 @@
       <w:r>
         <w:t xml:space="preserve"> </w:t>
       </w:r>
-      <w:hyperlink r:id="rId49">
+      <w:hyperlink r:id="rId50">
         <w:r>
           <w:rPr>
             <w:rStyle w:val="Hyperlink"/>
@@ -2238,8 +2304,8 @@
         <w:t xml:space="preserve">. In (John Wiley &amp; Sons).</w:t>
       </w:r>
     </w:p>
-    <w:bookmarkEnd w:id="50"/>
-    <w:bookmarkStart w:id="52" w:name="ref-odea2016"/>
+    <w:bookmarkEnd w:id="51"/>
+    <w:bookmarkStart w:id="53" w:name="ref-odea2016"/>
     <w:p>
       <w:pPr>
         <w:pStyle w:val="Bibliography"/>
@@ -2272,7 +2338,7 @@
       <w:r>
         <w:t xml:space="preserve"> </w:t>
       </w:r>
-      <w:hyperlink r:id="rId51">
+      <w:hyperlink r:id="rId52">
         <w:r>
           <w:rPr>
             <w:rStyle w:val="Hyperlink"/>
@@ -2284,8 +2350,8 @@
         <w:t xml:space="preserve">.</w:t>
       </w:r>
     </w:p>
-    <w:bookmarkEnd w:id="52"/>
-    <w:bookmarkStart w:id="54" w:name="ref-verzi2008"/>
+    <w:bookmarkEnd w:id="53"/>
+    <w:bookmarkStart w:id="55" w:name="ref-verzi2008"/>
     <w:p>
       <w:pPr>
         <w:pStyle w:val="Bibliography"/>
@@ -2318,7 +2384,7 @@
       <w:r>
         <w:t xml:space="preserve"> </w:t>
       </w:r>
-      <w:hyperlink r:id="rId53">
+      <w:hyperlink r:id="rId54">
         <w:r>
           <w:rPr>
             <w:rStyle w:val="Hyperlink"/>
@@ -2330,8 +2396,8 @@
         <w:t xml:space="preserve">.</w:t>
       </w:r>
     </w:p>
-    <w:bookmarkEnd w:id="54"/>
-    <w:bookmarkStart w:id="56" w:name="ref-woodburne2010"/>
+    <w:bookmarkEnd w:id="55"/>
+    <w:bookmarkStart w:id="57" w:name="ref-woodburne2010"/>
     <w:p>
       <w:pPr>
         <w:pStyle w:val="Bibliography"/>
@@ -2364,7 +2430,7 @@
       <w:r>
         <w:t xml:space="preserve"> </w:t>
       </w:r>
-      <w:hyperlink r:id="rId55">
+      <w:hyperlink r:id="rId56">
         <w:r>
           <w:rPr>
             <w:rStyle w:val="Hyperlink"/>
@@ -2376,8 +2442,8 @@
         <w:t xml:space="preserve">.</w:t>
       </w:r>
     </w:p>
-    <w:bookmarkEnd w:id="56"/>
-    <w:bookmarkStart w:id="58" w:name="ref-bacon2015"/>
+    <w:bookmarkEnd w:id="57"/>
+    <w:bookmarkStart w:id="59" w:name="ref-bacon2015"/>
     <w:p>
       <w:pPr>
         <w:pStyle w:val="Bibliography"/>
@@ -2410,7 +2476,7 @@
       <w:r>
         <w:t xml:space="preserve"> </w:t>
       </w:r>
-      <w:hyperlink r:id="rId57">
+      <w:hyperlink r:id="rId58">
         <w:r>
           <w:rPr>
             <w:rStyle w:val="Hyperlink"/>
@@ -2422,8 +2488,8 @@
         <w:t xml:space="preserve">.</w:t>
       </w:r>
     </w:p>
-    <w:bookmarkEnd w:id="58"/>
-    <w:bookmarkStart w:id="60" w:name="ref-bacon2016"/>
+    <w:bookmarkEnd w:id="59"/>
+    <w:bookmarkStart w:id="61" w:name="ref-bacon2016"/>
     <w:p>
       <w:pPr>
         <w:pStyle w:val="Bibliography"/>
@@ -2456,7 +2522,7 @@
       <w:r>
         <w:t xml:space="preserve"> </w:t>
       </w:r>
-      <w:hyperlink r:id="rId59">
+      <w:hyperlink r:id="rId60">
         <w:r>
           <w:rPr>
             <w:rStyle w:val="Hyperlink"/>
@@ -2468,8 +2534,8 @@
         <w:t xml:space="preserve">.</w:t>
       </w:r>
     </w:p>
-    <w:bookmarkEnd w:id="60"/>
-    <w:bookmarkStart w:id="62" w:name="ref-webb1976"/>
+    <w:bookmarkEnd w:id="61"/>
+    <w:bookmarkStart w:id="63" w:name="ref-webb1976"/>
     <w:p>
       <w:pPr>
         <w:pStyle w:val="Bibliography"/>
@@ -2489,7 +2555,7 @@
       <w:r>
         <w:t xml:space="preserve"> </w:t>
       </w:r>
-      <w:hyperlink r:id="rId61">
+      <w:hyperlink r:id="rId62">
         <w:r>
           <w:rPr>
             <w:rStyle w:val="Hyperlink"/>
@@ -2514,8 +2580,8 @@
         <w:t xml:space="preserve">, 220–234.</w:t>
       </w:r>
     </w:p>
-    <w:bookmarkEnd w:id="62"/>
-    <w:bookmarkStart w:id="64" w:name="ref-webb1991"/>
+    <w:bookmarkEnd w:id="63"/>
+    <w:bookmarkStart w:id="65" w:name="ref-webb1991"/>
     <w:p>
       <w:pPr>
         <w:pStyle w:val="Bibliography"/>
@@ -2548,7 +2614,7 @@
       <w:r>
         <w:t xml:space="preserve"> </w:t>
       </w:r>
-      <w:hyperlink r:id="rId63">
+      <w:hyperlink r:id="rId64">
         <w:r>
           <w:rPr>
             <w:rStyle w:val="Hyperlink"/>
@@ -2560,8 +2626,8 @@
         <w:t xml:space="preserve">.</w:t>
       </w:r>
     </w:p>
-    <w:bookmarkEnd w:id="64"/>
-    <w:bookmarkStart w:id="66" w:name="ref-cione2015"/>
+    <w:bookmarkEnd w:id="65"/>
+    <w:bookmarkStart w:id="67" w:name="ref-cione2015"/>
     <w:p>
       <w:pPr>
         <w:pStyle w:val="Bibliography"/>
@@ -2581,7 +2647,7 @@
       <w:r>
         <w:t xml:space="preserve"> </w:t>
       </w:r>
-      <w:hyperlink r:id="rId65">
+      <w:hyperlink r:id="rId66">
         <w:r>
           <w:rPr>
             <w:rStyle w:val="Hyperlink"/>
@@ -2596,8 +2662,8 @@
         <w:t xml:space="preserve">(Springer Netherlands).</w:t>
       </w:r>
     </w:p>
-    <w:bookmarkEnd w:id="66"/>
-    <w:bookmarkStart w:id="68" w:name="ref-carrillo2020"/>
+    <w:bookmarkEnd w:id="67"/>
+    <w:bookmarkStart w:id="69" w:name="ref-carrillo2020"/>
     <w:p>
       <w:pPr>
         <w:pStyle w:val="Bibliography"/>
@@ -2630,7 +2696,7 @@
       <w:r>
         <w:t xml:space="preserve"> </w:t>
       </w:r>
-      <w:hyperlink r:id="rId67">
+      <w:hyperlink r:id="rId68">
         <w:r>
           <w:rPr>
             <w:rStyle w:val="Hyperlink"/>
@@ -2642,8 +2708,8 @@
         <w:t xml:space="preserve">.</w:t>
       </w:r>
     </w:p>
-    <w:bookmarkEnd w:id="68"/>
-    <w:bookmarkStart w:id="70" w:name="ref-croft2020"/>
+    <w:bookmarkEnd w:id="69"/>
+    <w:bookmarkStart w:id="71" w:name="ref-croft2020"/>
     <w:p>
       <w:pPr>
         <w:pStyle w:val="Bibliography"/>
@@ -2676,7 +2742,7 @@
       <w:r>
         <w:t xml:space="preserve"> </w:t>
       </w:r>
-      <w:hyperlink r:id="rId69">
+      <w:hyperlink r:id="rId70">
         <w:r>
           <w:rPr>
             <w:rStyle w:val="Hyperlink"/>
@@ -2688,8 +2754,8 @@
         <w:t xml:space="preserve">.</w:t>
       </w:r>
     </w:p>
-    <w:bookmarkEnd w:id="70"/>
-    <w:bookmarkStart w:id="72" w:name="ref-boscaini2025"/>
+    <w:bookmarkEnd w:id="71"/>
+    <w:bookmarkStart w:id="73" w:name="ref-boscaini2025"/>
     <w:p>
       <w:pPr>
         <w:pStyle w:val="Bibliography"/>
@@ -2722,7 +2788,7 @@
       <w:r>
         <w:t xml:space="preserve"> </w:t>
       </w:r>
-      <w:hyperlink r:id="rId71">
+      <w:hyperlink r:id="rId72">
         <w:r>
           <w:rPr>
             <w:rStyle w:val="Hyperlink"/>
@@ -2734,8 +2800,8 @@
         <w:t xml:space="preserve">.</w:t>
       </w:r>
     </w:p>
-    <w:bookmarkEnd w:id="72"/>
-    <w:bookmarkStart w:id="73" w:name="ref-simpson1980"/>
+    <w:bookmarkEnd w:id="73"/>
+    <w:bookmarkStart w:id="74" w:name="ref-simpson1980"/>
     <w:p>
       <w:pPr>
         <w:pStyle w:val="Bibliography"/>
@@ -2753,8 +2819,8 @@
         <w:t xml:space="preserve">Simpson, G.G. (1980). Splendid isolation : The curious history of south american mammals Yale University Press, New Haven.</w:t>
       </w:r>
     </w:p>
-    <w:bookmarkEnd w:id="73"/>
-    <w:bookmarkStart w:id="75" w:name="ref-domingo2020"/>
+    <w:bookmarkEnd w:id="74"/>
+    <w:bookmarkStart w:id="76" w:name="ref-domingo2020"/>
     <w:p>
       <w:pPr>
         <w:pStyle w:val="Bibliography"/>
@@ -2787,7 +2853,7 @@
       <w:r>
         <w:t xml:space="preserve"> </w:t>
       </w:r>
-      <w:hyperlink r:id="rId74">
+      <w:hyperlink r:id="rId75">
         <w:r>
           <w:rPr>
             <w:rStyle w:val="Hyperlink"/>
@@ -2799,8 +2865,8 @@
         <w:t xml:space="preserve">.</w:t>
       </w:r>
     </w:p>
-    <w:bookmarkEnd w:id="75"/>
-    <w:bookmarkStart w:id="76" w:name="ref-marshall1990"/>
+    <w:bookmarkEnd w:id="76"/>
+    <w:bookmarkStart w:id="77" w:name="ref-marshall1990"/>
     <w:p>
       <w:pPr>
         <w:pStyle w:val="Bibliography"/>
@@ -2831,8 +2897,8 @@
         <w:t xml:space="preserve">, 169–210.</w:t>
       </w:r>
     </w:p>
-    <w:bookmarkEnd w:id="76"/>
-    <w:bookmarkStart w:id="78" w:name="ref-faurby2016"/>
+    <w:bookmarkEnd w:id="77"/>
+    <w:bookmarkStart w:id="79" w:name="ref-faurby2016"/>
     <w:p>
       <w:pPr>
         <w:pStyle w:val="Bibliography"/>
@@ -2865,7 +2931,7 @@
       <w:r>
         <w:t xml:space="preserve"> </w:t>
       </w:r>
-      <w:hyperlink r:id="rId77">
+      <w:hyperlink r:id="rId78">
         <w:r>
           <w:rPr>
             <w:rStyle w:val="Hyperlink"/>
@@ -2877,8 +2943,8 @@
         <w:t xml:space="preserve">.</w:t>
       </w:r>
     </w:p>
-    <w:bookmarkEnd w:id="78"/>
-    <w:bookmarkStart w:id="80" w:name="ref-fernández-monescillo2025"/>
+    <w:bookmarkEnd w:id="79"/>
+    <w:bookmarkStart w:id="81" w:name="ref-fernández-monescillo2025"/>
     <w:p>
       <w:pPr>
         <w:pStyle w:val="Bibliography"/>
@@ -2911,7 +2977,7 @@
       <w:r>
         <w:t xml:space="preserve"> </w:t>
       </w:r>
-      <w:hyperlink r:id="rId79">
+      <w:hyperlink r:id="rId80">
         <w:r>
           <w:rPr>
             <w:rStyle w:val="Hyperlink"/>
@@ -2923,8 +2989,8 @@
         <w:t xml:space="preserve">.</w:t>
       </w:r>
     </w:p>
-    <w:bookmarkEnd w:id="80"/>
-    <w:bookmarkStart w:id="82" w:name="ref-vrba1992"/>
+    <w:bookmarkEnd w:id="81"/>
+    <w:bookmarkStart w:id="83" w:name="ref-vrba1992"/>
     <w:p>
       <w:pPr>
         <w:pStyle w:val="Bibliography"/>
@@ -2957,7 +3023,7 @@
       <w:r>
         <w:t xml:space="preserve"> </w:t>
       </w:r>
-      <w:hyperlink r:id="rId81">
+      <w:hyperlink r:id="rId82">
         <w:r>
           <w:rPr>
             <w:rStyle w:val="Hyperlink"/>
@@ -2969,8 +3035,8 @@
         <w:t xml:space="preserve">.</w:t>
       </w:r>
     </w:p>
-    <w:bookmarkEnd w:id="82"/>
-    <w:bookmarkStart w:id="84" w:name="ref-prevosti2013"/>
+    <w:bookmarkEnd w:id="83"/>
+    <w:bookmarkStart w:id="85" w:name="ref-prevosti2013"/>
     <w:p>
       <w:pPr>
         <w:pStyle w:val="Bibliography"/>
@@ -3003,7 +3069,7 @@
       <w:r>
         <w:t xml:space="preserve"> </w:t>
       </w:r>
-      <w:hyperlink r:id="rId83">
+      <w:hyperlink r:id="rId84">
         <w:r>
           <w:rPr>
             <w:rStyle w:val="Hyperlink"/>
@@ -3015,8 +3081,8 @@
         <w:t xml:space="preserve">.</w:t>
       </w:r>
     </w:p>
-    <w:bookmarkEnd w:id="84"/>
-    <w:bookmarkStart w:id="86" w:name="ref-tarquini2022"/>
+    <w:bookmarkEnd w:id="85"/>
+    <w:bookmarkStart w:id="87" w:name="ref-tarquini2022"/>
     <w:p>
       <w:pPr>
         <w:pStyle w:val="Bibliography"/>
@@ -3049,7 +3115,7 @@
       <w:r>
         <w:t xml:space="preserve"> </w:t>
       </w:r>
-      <w:hyperlink r:id="rId85">
+      <w:hyperlink r:id="rId86">
         <w:r>
           <w:rPr>
             <w:rStyle w:val="Hyperlink"/>
@@ -3061,8 +3127,8 @@
         <w:t xml:space="preserve">.</w:t>
       </w:r>
     </w:p>
-    <w:bookmarkEnd w:id="86"/>
-    <w:bookmarkStart w:id="88" w:name="ref-marsà2025"/>
+    <w:bookmarkEnd w:id="87"/>
+    <w:bookmarkStart w:id="89" w:name="ref-marsà2025"/>
     <w:p>
       <w:pPr>
         <w:pStyle w:val="Bibliography"/>
@@ -3113,7 +3179,7 @@
       <w:r>
         <w:t xml:space="preserve"> </w:t>
       </w:r>
-      <w:hyperlink r:id="rId87">
+      <w:hyperlink r:id="rId88">
         <w:r>
           <w:rPr>
             <w:rStyle w:val="Hyperlink"/>
@@ -3125,8 +3191,8 @@
         <w:t xml:space="preserve">.</w:t>
       </w:r>
     </w:p>
-    <w:bookmarkEnd w:id="88"/>
-    <w:bookmarkStart w:id="90" w:name="ref-freitas-oliveira2024"/>
+    <w:bookmarkEnd w:id="89"/>
+    <w:bookmarkStart w:id="91" w:name="ref-freitas-oliveira2024"/>
     <w:p>
       <w:pPr>
         <w:pStyle w:val="Bibliography"/>
@@ -3159,7 +3225,7 @@
       <w:r>
         <w:t xml:space="preserve"> </w:t>
       </w:r>
-      <w:hyperlink r:id="rId89">
+      <w:hyperlink r:id="rId90">
         <w:r>
           <w:rPr>
             <w:rStyle w:val="Hyperlink"/>
@@ -3171,8 +3237,8 @@
         <w:t xml:space="preserve">.</w:t>
       </w:r>
     </w:p>
-    <w:bookmarkEnd w:id="90"/>
-    <w:bookmarkStart w:id="92" w:name="ref-pilowsky2022"/>
+    <w:bookmarkEnd w:id="91"/>
+    <w:bookmarkStart w:id="93" w:name="ref-pilowsky2022"/>
     <w:p>
       <w:pPr>
         <w:pStyle w:val="Bibliography"/>
@@ -3205,7 +3271,7 @@
       <w:r>
         <w:t xml:space="preserve"> </w:t>
       </w:r>
-      <w:hyperlink r:id="rId91">
+      <w:hyperlink r:id="rId92">
         <w:r>
           <w:rPr>
             <w:rStyle w:val="Hyperlink"/>
@@ -3217,8 +3283,8 @@
         <w:t xml:space="preserve">.</w:t>
       </w:r>
     </w:p>
-    <w:bookmarkEnd w:id="92"/>
-    <w:bookmarkStart w:id="94" w:name="ref-hagen2023"/>
+    <w:bookmarkEnd w:id="93"/>
+    <w:bookmarkStart w:id="95" w:name="ref-hagen2023"/>
     <w:p>
       <w:pPr>
         <w:pStyle w:val="Bibliography"/>
@@ -3251,7 +3317,7 @@
       <w:r>
         <w:t xml:space="preserve"> </w:t>
       </w:r>
-      <w:hyperlink r:id="rId93">
+      <w:hyperlink r:id="rId94">
         <w:r>
           <w:rPr>
             <w:rStyle w:val="Hyperlink"/>
@@ -3263,8 +3329,8 @@
         <w:t xml:space="preserve">.</w:t>
       </w:r>
     </w:p>
-    <w:bookmarkEnd w:id="94"/>
-    <w:bookmarkStart w:id="96" w:name="ref-hagen2021"/>
+    <w:bookmarkEnd w:id="95"/>
+    <w:bookmarkStart w:id="97" w:name="ref-hagen2021"/>
     <w:p>
       <w:pPr>
         <w:pStyle w:val="Bibliography"/>
@@ -3303,7 +3369,7 @@
       <w:r>
         <w:t xml:space="preserve"> </w:t>
       </w:r>
-      <w:hyperlink r:id="rId95">
+      <w:hyperlink r:id="rId96">
         <w:r>
           <w:rPr>
             <w:rStyle w:val="Hyperlink"/>
@@ -3315,8 +3381,8 @@
         <w:t xml:space="preserve">.</w:t>
       </w:r>
     </w:p>
-    <w:bookmarkEnd w:id="96"/>
-    <w:bookmarkStart w:id="98" w:name="ref-lorcery2025"/>
+    <w:bookmarkEnd w:id="97"/>
+    <w:bookmarkStart w:id="99" w:name="ref-lorcery2025"/>
     <w:p>
       <w:pPr>
         <w:pStyle w:val="Bibliography"/>
@@ -3349,7 +3415,7 @@
       <w:r>
         <w:t xml:space="preserve"> </w:t>
       </w:r>
-      <w:hyperlink r:id="rId97">
+      <w:hyperlink r:id="rId98">
         <w:r>
           <w:rPr>
             <w:rStyle w:val="Hyperlink"/>
@@ -3361,8 +3427,8 @@
         <w:t xml:space="preserve">.</w:t>
       </w:r>
     </w:p>
-    <w:bookmarkEnd w:id="98"/>
-    <w:bookmarkStart w:id="100" w:name="ref-hagen2021b"/>
+    <w:bookmarkEnd w:id="99"/>
+    <w:bookmarkStart w:id="101" w:name="ref-hagen2021b"/>
     <w:p>
       <w:pPr>
         <w:pStyle w:val="Bibliography"/>
@@ -3395,7 +3461,7 @@
       <w:r>
         <w:t xml:space="preserve"> </w:t>
       </w:r>
-      <w:hyperlink r:id="rId99">
+      <w:hyperlink r:id="rId100">
         <w:r>
           <w:rPr>
             <w:rStyle w:val="Hyperlink"/>
@@ -3407,8 +3473,8 @@
         <w:t xml:space="preserve">.</w:t>
       </w:r>
     </w:p>
-    <w:bookmarkEnd w:id="100"/>
-    <w:bookmarkStart w:id="102" w:name="ref-skeels2023b"/>
+    <w:bookmarkEnd w:id="101"/>
+    <w:bookmarkStart w:id="103" w:name="ref-skeels2023b"/>
     <w:p>
       <w:pPr>
         <w:pStyle w:val="Bibliography"/>
@@ -3441,7 +3507,7 @@
       <w:r>
         <w:t xml:space="preserve"> </w:t>
       </w:r>
-      <w:hyperlink r:id="rId101">
+      <w:hyperlink r:id="rId102">
         <w:r>
           <w:rPr>
             <w:rStyle w:val="Hyperlink"/>
@@ -3453,8 +3519,8 @@
         <w:t xml:space="preserve">.</w:t>
       </w:r>
     </w:p>
-    <w:bookmarkEnd w:id="102"/>
-    <w:bookmarkStart w:id="104" w:name="ref-boschman2023"/>
+    <w:bookmarkEnd w:id="103"/>
+    <w:bookmarkStart w:id="105" w:name="ref-boschman2023"/>
     <w:p>
       <w:pPr>
         <w:pStyle w:val="Bibliography"/>
@@ -3487,7 +3553,7 @@
       <w:r>
         <w:t xml:space="preserve"> </w:t>
       </w:r>
-      <w:hyperlink r:id="rId103">
+      <w:hyperlink r:id="rId104">
         <w:r>
           <w:rPr>
             <w:rStyle w:val="Hyperlink"/>
@@ -3499,8 +3565,8 @@
         <w:t xml:space="preserve">.</w:t>
       </w:r>
     </w:p>
-    <w:bookmarkEnd w:id="104"/>
-    <w:bookmarkStart w:id="106" w:name="ref-skeels2023"/>
+    <w:bookmarkEnd w:id="105"/>
+    <w:bookmarkStart w:id="107" w:name="ref-skeels2023"/>
     <w:p>
       <w:pPr>
         <w:pStyle w:val="Bibliography"/>
@@ -3533,7 +3599,7 @@
       <w:r>
         <w:t xml:space="preserve"> </w:t>
       </w:r>
-      <w:hyperlink r:id="rId105">
+      <w:hyperlink r:id="rId106">
         <w:r>
           <w:rPr>
             <w:rStyle w:val="Hyperlink"/>
@@ -3545,8 +3611,8 @@
         <w:t xml:space="preserve">.</w:t>
       </w:r>
     </w:p>
-    <w:bookmarkEnd w:id="106"/>
-    <w:bookmarkStart w:id="108" w:name="ref-liu2024"/>
+    <w:bookmarkEnd w:id="107"/>
+    <w:bookmarkStart w:id="109" w:name="ref-liu2024"/>
     <w:p>
       <w:pPr>
         <w:pStyle w:val="Bibliography"/>
@@ -3579,7 +3645,7 @@
       <w:r>
         <w:t xml:space="preserve"> </w:t>
       </w:r>
-      <w:hyperlink r:id="rId107">
+      <w:hyperlink r:id="rId108">
         <w:r>
           <w:rPr>
             <w:rStyle w:val="Hyperlink"/>
@@ -3591,8 +3657,8 @@
         <w:t xml:space="preserve">.</w:t>
       </w:r>
     </w:p>
-    <w:bookmarkEnd w:id="108"/>
-    <w:bookmarkStart w:id="110" w:name="ref-holden2019"/>
+    <w:bookmarkEnd w:id="109"/>
+    <w:bookmarkStart w:id="111" w:name="ref-holden2019"/>
     <w:p>
       <w:pPr>
         <w:pStyle w:val="Bibliography"/>
@@ -3625,7 +3691,7 @@
       <w:r>
         <w:t xml:space="preserve">, 5137–5155. https://doi.org/</w:t>
       </w:r>
-      <w:hyperlink r:id="rId109">
+      <w:hyperlink r:id="rId110">
         <w:r>
           <w:rPr>
             <w:rStyle w:val="Hyperlink"/>
@@ -3637,8 +3703,8 @@
         <w:t xml:space="preserve">.</w:t>
       </w:r>
     </w:p>
-    <w:bookmarkEnd w:id="110"/>
-    <w:bookmarkStart w:id="112" w:name="ref-gearty2023"/>
+    <w:bookmarkEnd w:id="111"/>
+    <w:bookmarkStart w:id="113" w:name="ref-gearty2023"/>
     <w:p>
       <w:pPr>
         <w:pStyle w:val="Bibliography"/>
@@ -3658,7 +3724,7 @@
       <w:r>
         <w:t xml:space="preserve"> </w:t>
       </w:r>
-      <w:hyperlink r:id="rId111">
+      <w:hyperlink r:id="rId112">
         <w:r>
           <w:rPr>
             <w:rStyle w:val="Hyperlink"/>
@@ -3667,8 +3733,8 @@
         </w:r>
       </w:hyperlink>
     </w:p>
-    <w:bookmarkEnd w:id="112"/>
-    <w:bookmarkStart w:id="114" w:name="ref-barreto2023"/>
+    <w:bookmarkEnd w:id="113"/>
+    <w:bookmarkStart w:id="115" w:name="ref-barreto2023"/>
     <w:p>
       <w:pPr>
         <w:pStyle w:val="Bibliography"/>
@@ -3701,7 +3767,7 @@
       <w:r>
         <w:t xml:space="preserve"> </w:t>
       </w:r>
-      <w:hyperlink r:id="rId113">
+      <w:hyperlink r:id="rId114">
         <w:r>
           <w:rPr>
             <w:rStyle w:val="Hyperlink"/>
@@ -3713,8 +3779,8 @@
         <w:t xml:space="preserve">.</w:t>
       </w:r>
     </w:p>
-    <w:bookmarkEnd w:id="114"/>
-    <w:bookmarkStart w:id="116" w:name="ref-beck2018"/>
+    <w:bookmarkEnd w:id="115"/>
+    <w:bookmarkStart w:id="117" w:name="ref-beck2018"/>
     <w:p>
       <w:pPr>
         <w:pStyle w:val="Bibliography"/>
@@ -3747,7 +3813,7 @@
       <w:r>
         <w:t xml:space="preserve"> </w:t>
       </w:r>
-      <w:hyperlink r:id="rId115">
+      <w:hyperlink r:id="rId116">
         <w:r>
           <w:rPr>
             <w:rStyle w:val="Hyperlink"/>
@@ -3759,8 +3825,8 @@
         <w:t xml:space="preserve">.</w:t>
       </w:r>
     </w:p>
-    <w:bookmarkEnd w:id="116"/>
-    <w:bookmarkStart w:id="118" w:name="ref-galván2023"/>
+    <w:bookmarkEnd w:id="117"/>
+    <w:bookmarkStart w:id="119" w:name="ref-galván2023"/>
     <w:p>
       <w:pPr>
         <w:pStyle w:val="Bibliography"/>
@@ -3780,7 +3846,7 @@
       <w:r>
         <w:t xml:space="preserve"> </w:t>
       </w:r>
-      <w:hyperlink r:id="rId117">
+      <w:hyperlink r:id="rId118">
         <w:r>
           <w:rPr>
             <w:rStyle w:val="Hyperlink"/>
@@ -3789,8 +3855,8 @@
         </w:r>
       </w:hyperlink>
     </w:p>
-    <w:bookmarkEnd w:id="118"/>
-    <w:bookmarkStart w:id="120" w:name="ref-weir2009"/>
+    <w:bookmarkEnd w:id="119"/>
+    <w:bookmarkStart w:id="121" w:name="ref-weir2009"/>
     <w:p>
       <w:pPr>
         <w:pStyle w:val="Bibliography"/>
@@ -3823,7 +3889,7 @@
       <w:r>
         <w:t xml:space="preserve"> </w:t>
       </w:r>
-      <w:hyperlink r:id="rId119">
+      <w:hyperlink r:id="rId120">
         <w:r>
           <w:rPr>
             <w:rStyle w:val="Hyperlink"/>
@@ -3835,8 +3901,8 @@
         <w:t xml:space="preserve">.</w:t>
       </w:r>
     </w:p>
-    <w:bookmarkEnd w:id="120"/>
-    <w:bookmarkStart w:id="122" w:name="ref-antonelli2018"/>
+    <w:bookmarkEnd w:id="121"/>
+    <w:bookmarkStart w:id="123" w:name="ref-antonelli2018"/>
     <w:p>
       <w:pPr>
         <w:pStyle w:val="Bibliography"/>
@@ -3869,7 +3935,7 @@
       <w:r>
         <w:t xml:space="preserve"> </w:t>
       </w:r>
-      <w:hyperlink r:id="rId121">
+      <w:hyperlink r:id="rId122">
         <w:r>
           <w:rPr>
             <w:rStyle w:val="Hyperlink"/>
@@ -3881,8 +3947,8 @@
         <w:t xml:space="preserve">.</w:t>
       </w:r>
     </w:p>
-    <w:bookmarkEnd w:id="122"/>
-    <w:bookmarkStart w:id="124" w:name="ref-haffer1969"/>
+    <w:bookmarkEnd w:id="123"/>
+    <w:bookmarkStart w:id="125" w:name="ref-haffer1969"/>
     <w:p>
       <w:pPr>
         <w:pStyle w:val="Bibliography"/>
@@ -3915,7 +3981,7 @@
       <w:r>
         <w:t xml:space="preserve"> </w:t>
       </w:r>
-      <w:hyperlink r:id="rId123">
+      <w:hyperlink r:id="rId124">
         <w:r>
           <w:rPr>
             <w:rStyle w:val="Hyperlink"/>
@@ -3927,8 +3993,8 @@
         <w:t xml:space="preserve">.</w:t>
       </w:r>
     </w:p>
-    <w:bookmarkEnd w:id="124"/>
-    <w:bookmarkStart w:id="126" w:name="ref-motta2025"/>
+    <w:bookmarkEnd w:id="125"/>
+    <w:bookmarkStart w:id="127" w:name="ref-motta2025"/>
     <w:p>
       <w:pPr>
         <w:pStyle w:val="Bibliography"/>
@@ -3961,7 +4027,7 @@
       <w:r>
         <w:t xml:space="preserve"> </w:t>
       </w:r>
-      <w:hyperlink r:id="rId125">
+      <w:hyperlink r:id="rId126">
         <w:r>
           <w:rPr>
             <w:rStyle w:val="Hyperlink"/>
@@ -3973,8 +4039,8 @@
         <w:t xml:space="preserve">.</w:t>
       </w:r>
     </w:p>
-    <w:bookmarkEnd w:id="126"/>
-    <w:bookmarkStart w:id="128" w:name="ref-pino2022"/>
+    <w:bookmarkEnd w:id="127"/>
+    <w:bookmarkStart w:id="129" w:name="ref-pino2022"/>
     <w:p>
       <w:pPr>
         <w:pStyle w:val="Bibliography"/>
@@ -4007,7 +4073,7 @@
       <w:r>
         <w:t xml:space="preserve"> </w:t>
       </w:r>
-      <w:hyperlink r:id="rId127">
+      <w:hyperlink r:id="rId128">
         <w:r>
           <w:rPr>
             <w:rStyle w:val="Hyperlink"/>
@@ -4019,8 +4085,8 @@
         <w:t xml:space="preserve">.</w:t>
       </w:r>
     </w:p>
-    <w:bookmarkEnd w:id="128"/>
-    <w:bookmarkStart w:id="130" w:name="ref-morgan1993"/>
+    <w:bookmarkEnd w:id="129"/>
+    <w:bookmarkStart w:id="131" w:name="ref-morgan1993"/>
     <w:p>
       <w:pPr>
         <w:pStyle w:val="Bibliography"/>
@@ -4040,7 +4106,7 @@
       <w:r>
         <w:t xml:space="preserve"> </w:t>
       </w:r>
-      <w:hyperlink r:id="rId129">
+      <w:hyperlink r:id="rId130">
         <w:r>
           <w:rPr>
             <w:rStyle w:val="Hyperlink"/>
@@ -4052,8 +4118,8 @@
         <w:t xml:space="preserve">.</w:t>
       </w:r>
     </w:p>
-    <w:bookmarkEnd w:id="130"/>
-    <w:bookmarkStart w:id="132" w:name="ref-ali2021b"/>
+    <w:bookmarkEnd w:id="131"/>
+    <w:bookmarkStart w:id="133" w:name="ref-ali2021b"/>
     <w:p>
       <w:pPr>
         <w:pStyle w:val="Bibliography"/>
@@ -4098,7 +4164,7 @@
       <w:r>
         <w:t xml:space="preserve"> </w:t>
       </w:r>
-      <w:hyperlink r:id="rId131">
+      <w:hyperlink r:id="rId132">
         <w:r>
           <w:rPr>
             <w:rStyle w:val="Hyperlink"/>
@@ -4110,8 +4176,8 @@
         <w:t xml:space="preserve">.</w:t>
       </w:r>
     </w:p>
-    <w:bookmarkEnd w:id="132"/>
-    <w:bookmarkStart w:id="134" w:name="ref-cornée2021"/>
+    <w:bookmarkEnd w:id="133"/>
+    <w:bookmarkStart w:id="135" w:name="ref-cornée2021"/>
     <w:p>
       <w:pPr>
         <w:pStyle w:val="Bibliography"/>
@@ -4144,7 +4210,7 @@
       <w:r>
         <w:t xml:space="preserve"> </w:t>
       </w:r>
-      <w:hyperlink r:id="rId133">
+      <w:hyperlink r:id="rId134">
         <w:r>
           <w:rPr>
             <w:rStyle w:val="Hyperlink"/>
@@ -4156,8 +4222,8 @@
         <w:t xml:space="preserve">.</w:t>
       </w:r>
     </w:p>
-    <w:bookmarkEnd w:id="134"/>
-    <w:bookmarkStart w:id="136" w:name="ref-warren2015"/>
+    <w:bookmarkEnd w:id="135"/>
+    <w:bookmarkStart w:id="137" w:name="ref-warren2015"/>
     <w:p>
       <w:pPr>
         <w:pStyle w:val="Bibliography"/>
@@ -4190,7 +4256,7 @@
       <w:r>
         <w:t xml:space="preserve"> </w:t>
       </w:r>
-      <w:hyperlink r:id="rId135">
+      <w:hyperlink r:id="rId136">
         <w:r>
           <w:rPr>
             <w:rStyle w:val="Hyperlink"/>
@@ -4202,8 +4268,8 @@
         <w:t xml:space="preserve">.</w:t>
       </w:r>
     </w:p>
-    <w:bookmarkEnd w:id="136"/>
-    <w:bookmarkStart w:id="138" w:name="ref-couvreur2011"/>
+    <w:bookmarkEnd w:id="137"/>
+    <w:bookmarkStart w:id="139" w:name="ref-couvreur2011"/>
     <w:p>
       <w:pPr>
         <w:pStyle w:val="Bibliography"/>
@@ -4236,7 +4302,7 @@
       <w:r>
         <w:t xml:space="preserve"> </w:t>
       </w:r>
-      <w:hyperlink r:id="rId137">
+      <w:hyperlink r:id="rId138">
         <w:r>
           <w:rPr>
             <w:rStyle w:val="Hyperlink"/>
@@ -4248,8 +4314,8 @@
         <w:t xml:space="preserve">.</w:t>
       </w:r>
     </w:p>
-    <w:bookmarkEnd w:id="138"/>
-    <w:bookmarkStart w:id="140" w:name="ref-upchurch2024"/>
+    <w:bookmarkEnd w:id="139"/>
+    <w:bookmarkStart w:id="141" w:name="ref-upchurch2024"/>
     <w:p>
       <w:pPr>
         <w:pStyle w:val="Bibliography"/>
@@ -4282,7 +4348,7 @@
       <w:r>
         <w:t xml:space="preserve"> </w:t>
       </w:r>
-      <w:hyperlink r:id="rId139">
+      <w:hyperlink r:id="rId140">
         <w:r>
           <w:rPr>
             <w:rStyle w:val="Hyperlink"/>
@@ -4294,9 +4360,9 @@
         <w:t xml:space="preserve">.</w:t>
       </w:r>
     </w:p>
-    <w:bookmarkEnd w:id="140"/>
     <w:bookmarkEnd w:id="141"/>
     <w:bookmarkEnd w:id="142"/>
+    <w:bookmarkEnd w:id="143"/>
     <w:sectPr>
       <w:type w:val="nextPage"/>
       <w:pgSz w:h="15840" w:w="12240"/>

</xml_diff>

<commit_message>
introduce alpha-div + progress on results
</commit_message>
<xml_diff>
--- a/Manuscript/GABI_palaeo_constraints.docx
+++ b/Manuscript/GABI_palaeo_constraints.docx
@@ -509,13 +509,13 @@
         <w:t xml:space="preserve">Results</w:t>
       </w:r>
     </w:p>
-    <w:bookmarkStart w:id="23" w:name="Xed4bd03a92b5751ca77f2e414fb8e8b12710b4e"/>
+    <w:bookmarkStart w:id="23" w:name="Xb7793dbd9294a7fcd62dd3820231d33b8e3fd03"/>
     <w:p>
       <w:pPr>
         <w:pStyle w:val="Heading2"/>
       </w:pPr>
       <w:r>
-        <w:t xml:space="preserve">Climate makes it easier to reach North America from South America than the other way around</w:t>
+        <w:t xml:space="preserve">Climate would have made it easier to reach North America from South America than the other way around</w:t>
       </w:r>
     </w:p>
     <w:p>
@@ -877,7 +877,7 @@
         </m:r>
       </m:oMath>
       <w:r>
-        <w:t xml:space="preserve">) (Figure S4). This spatial standardisation was meant to control for the fact that simulations starting from South America originated on average closer to the isthmus than those starting from North America, therefore introducing a spatial bias (see</w:t>
+        <w:t xml:space="preserve">) (Figure S4). This spatial standardisation aimed at controlling for the fact that simulations starting from South America originated on average closer to the isthmus than those starting from North America, therefore introducing a spatial bias (see</w:t>
       </w:r>
       <w:r>
         <w:t xml:space="preserve"> </w:t>
@@ -933,7 +933,7 @@
         <w:pStyle w:val="FirstParagraph"/>
       </w:pPr>
       <w:r>
-        <w:t xml:space="preserve">Our findings highlight that, irrespective of the initial continent, successful simulations generated under models allowing species climatic niches to evolve (</w:t>
+        <w:t xml:space="preserve">Our findings highlight that, irrespective of the initial continent, at the final state, successful simulations generated under models allowing species climatic niches to evolve (</w:t>
       </w:r>
       <m:oMath>
         <m:r>
@@ -1043,7 +1043,18 @@
         <w:pStyle w:val="BodyText"/>
       </w:pPr>
       <w:r>
-        <w:t xml:space="preserve">Besides, contrary to the proportion of colonised area, diversity –</w:t>
+        <w:t xml:space="preserve">Besides, contrary to the proportion of colonised area, for a given ancestral continent, colonised</w:t>
+      </w:r>
+      <w:r>
+        <w:t xml:space="preserve"> </w:t>
+      </w:r>
+      <m:oMath>
+        <m:r>
+          <m:t>α</m:t>
+        </m:r>
+      </m:oMath>
+      <w:r>
+        <w:t xml:space="preserve">-diversities –</w:t>
       </w:r>
       <w:r>
         <w:t xml:space="preserve"> </w:t>
@@ -1066,7 +1077,7 @@
         <w:t xml:space="preserve">e</w:t>
       </w:r>
       <w:r>
-        <w:t xml:space="preserve">., number of taxa – within the colonised area does not seem to vary a lot across our four models (</w:t>
+        <w:t xml:space="preserve">., number of taxa within the colonised continent – do not exhibit huge variations across our four models (</w:t>
       </w:r>
       <w:hyperlink w:anchor="fig-metrics">
         <w:r>
@@ -1080,46 +1091,40 @@
         <w:t xml:space="preserve"> </w:t>
       </w:r>
       <w:r>
-        <w:t xml:space="preserve">B). However, it does vary between initial continents, with simulations generated under full adaptationist models (</w:t>
+        <w:t xml:space="preserve">B). However, given a model, we do retrieve changes in colonised</w:t>
+      </w:r>
+      <w:r>
+        <w:t xml:space="preserve"> </w:t>
       </w:r>
       <m:oMath>
         <m:r>
+          <m:t>α</m:t>
+        </m:r>
+      </m:oMath>
+      <w:r>
+        <w:t xml:space="preserve">-diversities across ancestral continents, with higher average values achieved for simulation starting from South America than from North America – although no difference is retrieved from simulations generated under</w:t>
+      </w:r>
+      <w:r>
+        <w:t xml:space="preserve"> </w:t>
+      </w:r>
+      <m:oMath>
+        <m:r>
           <m:t>M</m:t>
         </m:r>
         <m:r>
-          <m:t>1</m:t>
-        </m:r>
-        <m:r>
-          <m:rPr>
-            <m:sty m:val="p"/>
-          </m:rPr>
-          <m:t>−</m:t>
-        </m:r>
-        <m:r>
-          <m:t>3</m:t>
+          <m:t>0</m:t>
         </m:r>
       </m:oMath>
       <w:r>
-        <w:t xml:space="preserve">) exhibiting higher diversities on the foreign continent when starting from South America than from North America. No difference is retrieved from simulations generated under</w:t>
-      </w:r>
-      <w:r>
-        <w:t xml:space="preserve"> </w:t>
-      </w:r>
-      <m:oMath>
-        <m:r>
-          <m:t>M</m:t>
-        </m:r>
-        <m:r>
-          <m:t>0</m:t>
-        </m:r>
-      </m:oMath>
+        <w:t xml:space="preserve">.</w:t>
+      </w:r>
     </w:p>
     <w:p>
       <w:pPr>
         <w:pStyle w:val="BodyText"/>
       </w:pPr>
       <w:r>
-        <w:t xml:space="preserve">In addition, successful simulations starting in North America generally started from an ancestor located closer to the isthmus than those starting in South America (</w:t>
+        <w:t xml:space="preserve">In addition, successful simulations starting from North America generally started from an ancestor located closer to the isthmus than those starting from South America (</w:t>
       </w:r>
       <w:hyperlink w:anchor="fig-metrics">
         <w:r>
@@ -1147,15 +1152,7 @@
         </m:r>
       </m:oMath>
       <w:r>
-        <w:t xml:space="preserve">. Also, we can highlight a general trend that ancestral species originated closer to the isthmus in the case of successful simulations compared to unsuccessful ones (Figure S4-5).</w:t>
-      </w:r>
-    </w:p>
-    <w:p>
-      <w:pPr>
-        <w:pStyle w:val="BodyText"/>
-      </w:pPr>
-      <w:r>
-        <w:t xml:space="preserve">For each of the three metrics detailed here, the exact same trends were obtained after standardising initial distances to the isthmus (Figure S5).</w:t>
+        <w:t xml:space="preserve">. Also, we can highlight a general trend that ancestral species originated closer to the isthmus in the case of successful simulations compared to unsuccessful ones (Figure SX). Interestingly enough, the results obtained for this metric, just like those obtained for the other two, hold for simulations generated after standardising the initial distances to the isthmus of North American virtual species with those starting from South America (Figure S5).</w:t>
       </w:r>
     </w:p>
     <w:bookmarkEnd w:id="24"/>
@@ -4754,7 +4751,18 @@
               <w:t xml:space="preserve"> </w:t>
             </w:r>
             <w:r>
-              <w:t xml:space="preserve">Diversity, expressed as the natural logarithm of the number of lineages within the colonised area.</w:t>
+              <w:t xml:space="preserve">Colonised</w:t>
+            </w:r>
+            <w:r>
+              <w:t xml:space="preserve"> </w:t>
+            </w:r>
+            <m:oMath>
+              <m:r>
+                <m:t>α</m:t>
+              </m:r>
+            </m:oMath>
+            <w:r>
+              <w:t xml:space="preserve">-diversity, expressed as the natural logarithm of the number of lineages within the colonised area.</w:t>
             </w:r>
             <w:r>
               <w:t xml:space="preserve"> </w:t>

</xml_diff>

<commit_message>
include biome count in the main text
</commit_message>
<xml_diff>
--- a/Manuscript/GABI_palaeo_constraints.docx
+++ b/Manuscript/GABI_palaeo_constraints.docx
@@ -5071,7 +5071,7 @@
             <w:r>
               <w:drawing>
                 <wp:inline>
-                  <wp:extent cx="5399999" cy="3599999"/>
+                  <wp:extent cx="5399999" cy="5399999"/>
                   <wp:effectExtent b="0" l="0" r="0" t="0"/>
                   <wp:docPr descr="" title="" id="145" name="Picture"/>
                   <a:graphic>
@@ -5092,7 +5092,7 @@
                         <pic:spPr bwMode="auto">
                           <a:xfrm>
                             <a:off x="0" y="0"/>
-                            <a:ext cx="5399999" cy="3599999"/>
+                            <a:ext cx="5399999" cy="5399999"/>
                           </a:xfrm>
                           <a:prstGeom prst="rect">
                             <a:avLst/>
@@ -5171,6 +5171,22 @@
                 <w:bCs/>
               </w:rPr>
               <w:t xml:space="preserve">(B)</w:t>
+            </w:r>
+            <w:r>
+              <w:t xml:space="preserve"> </w:t>
+            </w:r>
+            <w:r>
+              <w:t xml:space="preserve">Biome where the ancestral species of each of the 500 simulation originated, for each continent and each scenario. We removed simulations starting from a cell that could not be assigned a biome from our counts, hence the reason why some are not exactly summing to 500.</w:t>
+            </w:r>
+            <w:r>
+              <w:t xml:space="preserve"> </w:t>
+            </w:r>
+            <w:r>
+              <w:rPr>
+                <w:b/>
+                <w:bCs/>
+              </w:rPr>
+              <w:t xml:space="preserve">(C)</w:t>
             </w:r>
             <w:r>
               <w:t xml:space="preserve"> </w:t>

</xml_diff>

<commit_message>
added " America" to panel x axis
</commit_message>
<xml_diff>
--- a/Manuscript/GABI_palaeo_constraints.docx
+++ b/Manuscript/GABI_palaeo_constraints.docx
@@ -1178,7 +1178,24 @@
         <w:t xml:space="preserve">e</w:t>
       </w:r>
       <w:r>
-        <w:t xml:space="preserve">., number of taxa within the colonised continent – does not exhibit huge variations across our four models (</w:t>
+        <w:t xml:space="preserve">., number of taxa within the colonised continent – does not exhibit huge variations across our four models, though a significant decrease is to be reported for simulations starting from North America generated under the</w:t>
+      </w:r>
+      <w:r>
+        <w:t xml:space="preserve"> </w:t>
+      </w:r>
+      <m:oMath>
+        <m:r>
+          <m:t>M</m:t>
+        </m:r>
+        <m:r>
+          <m:t>3</m:t>
+        </m:r>
+      </m:oMath>
+      <w:r>
+        <w:t xml:space="preserve"> </w:t>
+      </w:r>
+      <w:r>
+        <w:t xml:space="preserve">model (</w:t>
       </w:r>
       <w:hyperlink w:anchor="fig-metrics">
         <w:r>
@@ -1192,7 +1209,7 @@
         <w:t xml:space="preserve"> </w:t>
       </w:r>
       <w:r>
-        <w:t xml:space="preserve">B). However, given a model, we do retrieve changes in mean colonised</w:t>
+        <w:t xml:space="preserve">B). Moreover, ancestral continent does not seem to affect mean colonised</w:t>
       </w:r>
       <w:r>
         <w:t xml:space="preserve"> </w:t>
@@ -1203,7 +1220,7 @@
         </m:r>
       </m:oMath>
       <w:r>
-        <w:t xml:space="preserve">-diversity across ancestral continents, with higher values achieved for simulation starting from South America than from North America – although no difference is retrieved from simulations generated under</w:t>
+        <w:t xml:space="preserve">-diversity values in the case of the</w:t>
       </w:r>
       <w:r>
         <w:t xml:space="preserve"> </w:t>
@@ -1213,14 +1230,111 @@
           <m:t>M</m:t>
         </m:r>
         <m:r>
-          <m:t>0</m:t>
+          <m:t>1</m:t>
         </m:r>
       </m:oMath>
       <w:r>
         <w:t xml:space="preserve"> </w:t>
       </w:r>
       <w:r>
-        <w:t xml:space="preserve">().</w:t>
+        <w:t xml:space="preserve">(</w:t>
+      </w:r>
+      <m:oMath>
+        <m:r>
+          <m:t>212</m:t>
+        </m:r>
+        <m:r>
+          <m:rPr>
+            <m:sty m:val="p"/>
+          </m:rPr>
+          <m:t>±</m:t>
+        </m:r>
+        <m:r>
+          <m:t>61</m:t>
+        </m:r>
+      </m:oMath>
+      <w:r>
+        <w:t xml:space="preserve"> </w:t>
+      </w:r>
+      <w:r>
+        <w:t xml:space="preserve">vs. </w:t>
+      </w:r>
+      <m:oMath>
+        <m:r>
+          <m:t>170</m:t>
+        </m:r>
+        <m:r>
+          <m:rPr>
+            <m:sty m:val="p"/>
+          </m:rPr>
+          <m:t>±</m:t>
+        </m:r>
+        <m:r>
+          <m:t>25</m:t>
+        </m:r>
+      </m:oMath>
+      <w:r>
+        <w:t xml:space="preserve"> </w:t>
+      </w:r>
+      <w:r>
+        <w:t xml:space="preserve">species respectively retrieved in the foreign continent after starting from North or South America) and</w:t>
+      </w:r>
+      <w:r>
+        <w:t xml:space="preserve"> </w:t>
+      </w:r>
+      <m:oMath>
+        <m:r>
+          <m:t>M</m:t>
+        </m:r>
+        <m:r>
+          <m:t>2</m:t>
+        </m:r>
+      </m:oMath>
+      <w:r>
+        <w:t xml:space="preserve"> </w:t>
+      </w:r>
+      <w:r>
+        <w:t xml:space="preserve">(</w:t>
+      </w:r>
+      <m:oMath>
+        <m:r>
+          <m:t>161</m:t>
+        </m:r>
+        <m:r>
+          <m:rPr>
+            <m:sty m:val="p"/>
+          </m:rPr>
+          <m:t>±</m:t>
+        </m:r>
+        <m:r>
+          <m:t>48</m:t>
+        </m:r>
+      </m:oMath>
+      <w:r>
+        <w:t xml:space="preserve"> </w:t>
+      </w:r>
+      <w:r>
+        <w:t xml:space="preserve">vs. </w:t>
+      </w:r>
+      <m:oMath>
+        <m:r>
+          <m:t>171</m:t>
+        </m:r>
+        <m:r>
+          <m:rPr>
+            <m:sty m:val="p"/>
+          </m:rPr>
+          <m:t>±</m:t>
+        </m:r>
+        <m:r>
+          <m:t>27</m:t>
+        </m:r>
+      </m:oMath>
+      <w:r>
+        <w:t xml:space="preserve"> </w:t>
+      </w:r>
+      <w:r>
+        <w:t xml:space="preserve">species) models. It does however affect</w:t>
       </w:r>
     </w:p>
     <w:p>
@@ -1881,7 +1995,25 @@
         <w:pStyle w:val="BodyText"/>
       </w:pPr>
       <w:r>
-        <w:t xml:space="preserve">Success in South America for temperate-adapted species, posited as the most successful , not recovered, with tropical meeting the gighest success</w:t>
+        <w:t xml:space="preserve">Success in South America for temperate-adapted species, posited as the most successful , not recovered, with tropical meeting the gighest success.</w:t>
+      </w:r>
+      <w:r>
+        <w:t xml:space="preserve"> </w:t>
+      </w:r>
+      <w:r>
+        <w:t xml:space="preserve">“</w:t>
+      </w:r>
+      <w:r>
+        <w:t xml:space="preserve">major overland dispersal of terrestrial mammalian taxa apparently did not take place until the climate was conducive to support the temperate-adapted taxa that experienced the changes in their respective home ranges</w:t>
+      </w:r>
+      <w:r>
+        <w:t xml:space="preserve">”</w:t>
+      </w:r>
+      <w:r>
+        <w:rPr>
+          <w:vertAlign w:val="superscript"/>
+        </w:rPr>
+        <w:t xml:space="preserve">6</w:t>
       </w:r>
     </w:p>
     <w:p>

</xml_diff>

<commit_message>
finish writing the results
</commit_message>
<xml_diff>
--- a/Manuscript/GABI_palaeo_constraints.docx
+++ b/Manuscript/GABI_palaeo_constraints.docx
@@ -233,7 +233,7 @@
         <w:t xml:space="preserve">2–4</w:t>
       </w:r>
       <w:r>
-        <w:t xml:space="preserve">, palaeontological evidence and molecular phylogenies both agree with a late Miocene onset of land mammal exchange between the Americas, with most effective pulses of mammal crossings occurring from</w:t>
+        <w:t xml:space="preserve">, palaeontological evidence and molecular phylogenies both agree with a late Miocene onset of land mammal exchange between the Americas, but with effective pulses of mammal crossings occurring not earlier than</w:t>
       </w:r>
       <w:r>
         <w:t xml:space="preserve"> </w:t>
@@ -249,7 +249,7 @@
         <w:t xml:space="preserve"> </w:t>
       </w:r>
       <w:r>
-        <w:t xml:space="preserve">3 Million years ago (Ma) onwards</w:t>
+        <w:t xml:space="preserve">3 Million years ago</w:t>
       </w:r>
       <w:r>
         <w:rPr>
@@ -424,7 +424,19 @@
         <w:t xml:space="preserve">10</w:t>
       </w:r>
       <w:r>
-        <w:t xml:space="preserve">, consists of relating pulses of mammal exchanges with Pleistocene climatic oscillation, promoting the transition from tropical rainforests to savannah-like environments in Central America during glacial maxima. This climate-driven landscape opening would have in turn facilitated the dispersal of taxa with non-tropical ecological affinities, fitter to these environment, which goes well in line with the migrant fossil record across both sides of the isthmus</w:t>
+        <w:t xml:space="preserve"> </w:t>
+      </w:r>
+      <w:r>
+        <w:t xml:space="preserve">and Vrba.</w:t>
+      </w:r>
+      <w:r>
+        <w:rPr>
+          <w:vertAlign w:val="superscript"/>
+        </w:rPr>
+        <w:t xml:space="preserve">20</w:t>
+      </w:r>
+      <w:r>
+        <w:t xml:space="preserve">, consists of relating pulses of transcontinental mammal exchanges with Pleistocene climatic oscillation, promoting the transition from tropical rainforests to savannah-like environments in Central America during glacial maxima. This climate-driven landscape opening would have in turn facilitated the dispersal of taxa with non-tropical ecological affinities, fitter to these environment, which goes well in line with the migrant fossil record across both sides of the isthmus</w:t>
       </w:r>
       <w:r>
         <w:rPr>
@@ -546,13 +558,13 @@
         <w:t xml:space="preserve">Results</w:t>
       </w:r>
     </w:p>
-    <w:bookmarkStart w:id="23" w:name="Xfb36bcde79b6ee4f4fdf1c41b43e2de14e60110"/>
+    <w:bookmarkStart w:id="23" w:name="X4567fbc203e26536a8b2c1d2a805dae2efaff00"/>
     <w:p>
       <w:pPr>
         <w:pStyle w:val="Heading2"/>
       </w:pPr>
       <w:r>
-        <w:t xml:space="preserve">Climate would have favoured an inverted asymmetry for transcontinental faunal exchanges across the Americas</w:t>
+        <w:t xml:space="preserve">Climate makes northwards dispersal events easier than southwards ones</w:t>
       </w:r>
     </w:p>
     <w:p>
@@ -560,7 +572,7 @@
         <w:pStyle w:val="FirstParagraph"/>
       </w:pPr>
       <w:r>
-        <w:t xml:space="preserve">The contribution of palaeoclimate to the biogeographic asymmetry of the Great American Biotic Interchange (GABI) was tested in a simulation-based framework relying on gen3sis v1.5.11</w:t>
+        <w:t xml:space="preserve">The contribution of palaeoclimate to the biogeographic asymmetry of the Great American Biotic Interchange (GABI) was tested in a simulation-based framework relying on gen3sis</w:t>
       </w:r>
       <w:r>
         <w:rPr>
@@ -613,7 +625,7 @@
         </w:r>
       </w:hyperlink>
       <w:r>
-        <w:t xml:space="preserve">). This imbalance, strikingly going against our expectations, is maintained whether we allow species climatic niche to evolve following the direction of local climatic change (</w:t>
+        <w:t xml:space="preserve">). This imbalance is maintained whether we allow species climatic niche to evolve following the direction of local climatic change (</w:t>
       </w:r>
       <m:oMath>
         <m:r>
@@ -1767,7 +1779,7 @@
         <w:t xml:space="preserve"> </w:t>
       </w:r>
       <w:r>
-        <w:t xml:space="preserve">model, our results suggest similar patterns in exchange intensity between simulations starting from North and South America (</w:t>
+        <w:t xml:space="preserve">model, our results suggest similar exchange intensity patterns between simulations starting from North and South America (</w:t>
       </w:r>
       <w:hyperlink w:anchor="fig-biome">
         <w:r>
@@ -1824,14 +1836,6 @@
         <m:r>
           <m:t>90</m:t>
         </m:r>
-      </m:oMath>
-      <w:r>
-        <w:t xml:space="preserve">,</w:t>
-      </w:r>
-      <w:r>
-        <w:t xml:space="preserve"> </w:t>
-      </w:r>
-      <m:oMath>
         <m:d>
           <m:dPr>
             <m:begChr m:val="["/>
@@ -2044,26 +2048,338 @@
         <w:t xml:space="preserve"> </w:t>
       </w:r>
       <w:r>
-        <w:t xml:space="preserve">northwards), and almost no cold or polar specialist, no matter where it originated, successfully made it to the other continent.</w:t>
+        <w:t xml:space="preserve">northwards), and almost no cold or polar specialist, no matter where it originated, successfully made it to the other continent. The exact same pattern is obtained for southwards dispersal events occurring after standardising initial distances to the isthmus (Figure S8,</w:t>
+      </w:r>
+      <w:r>
+        <w:t xml:space="preserve"> </w:t>
+      </w:r>
+      <m:oMath>
+        <m:r>
+          <m:t>M</m:t>
+        </m:r>
+        <m:r>
+          <m:t>0</m:t>
+        </m:r>
+      </m:oMath>
+      <w:r>
+        <w:t xml:space="preserve">).</w:t>
       </w:r>
     </w:p>
     <w:p>
       <w:pPr>
         <w:pStyle w:val="BodyText"/>
       </w:pPr>
+      <w:r>
+        <w:t xml:space="preserve">Regarding biome generalists (models</w:t>
+      </w:r>
+      <w:r>
+        <w:t xml:space="preserve"> </w:t>
+      </w:r>
       <m:oMath>
         <m:r>
           <m:t>M</m:t>
         </m:r>
         <m:r>
+          <m:t>1</m:t>
+        </m:r>
+        <m:r>
+          <m:rPr>
+            <m:sty m:val="p"/>
+          </m:rPr>
+          <m:t>−</m:t>
+        </m:r>
+        <m:r>
           <m:t>3</m:t>
         </m:r>
       </m:oMath>
       <w:r>
-        <w:t xml:space="preserve"> </w:t>
-      </w:r>
-      <w:r>
-        <w:t xml:space="preserve">more permissive towards South American species migrating northwards than the other way around</w:t>
+        <w:t xml:space="preserve">), simulations starting from North America maintained the same distribution of exchange intensities across biomes as biome specialists. Generalists that originated in the tropical biome record the highest proportion of exchange success (</w:t>
+      </w:r>
+      <m:oMath>
+        <m:r>
+          <m:t>89</m:t>
+        </m:r>
+        <m:d>
+          <m:dPr>
+            <m:begChr m:val="["/>
+            <m:endChr m:val="]"/>
+            <m:sepChr m:val=""/>
+            <m:grow/>
+          </m:dPr>
+          <m:e>
+            <m:r>
+              <m:t>75</m:t>
+            </m:r>
+            <m:r>
+              <m:rPr>
+                <m:sty m:val="p"/>
+              </m:rPr>
+              <m:t>,</m:t>
+            </m:r>
+            <m:r>
+              <m:t>100</m:t>
+            </m:r>
+          </m:e>
+        </m:d>
+        <m:r>
+          <m:rPr>
+            <m:sty m:val="p"/>
+          </m:rPr>
+          <m:t>%</m:t>
+        </m:r>
+      </m:oMath>
+      <w:r>
+        <w:t xml:space="preserve"> </w:t>
+      </w:r>
+      <w:r>
+        <w:t xml:space="preserve">for</w:t>
+      </w:r>
+      <w:r>
+        <w:t xml:space="preserve"> </w:t>
+      </w:r>
+      <m:oMath>
+        <m:r>
+          <m:t>M</m:t>
+        </m:r>
+        <m:r>
+          <m:t>1</m:t>
+        </m:r>
+      </m:oMath>
+      <w:r>
+        <w:t xml:space="preserve">), followed by those originating in the temperate (</w:t>
+      </w:r>
+      <m:oMath>
+        <m:r>
+          <m:t>40</m:t>
+        </m:r>
+        <m:r>
+          <m:rPr>
+            <m:sty m:val="p"/>
+          </m:rPr>
+          <m:t>±</m:t>
+        </m:r>
+        <m:r>
+          <m:t>10</m:t>
+        </m:r>
+        <m:r>
+          <m:rPr>
+            <m:sty m:val="p"/>
+          </m:rPr>
+          <m:t>%</m:t>
+        </m:r>
+      </m:oMath>
+      <w:r>
+        <w:t xml:space="preserve">,</w:t>
+      </w:r>
+      <w:r>
+        <w:t xml:space="preserve"> </w:t>
+      </w:r>
+      <m:oMath>
+        <m:r>
+          <m:t>M</m:t>
+        </m:r>
+        <m:r>
+          <m:t>1</m:t>
+        </m:r>
+      </m:oMath>
+      <w:r>
+        <w:t xml:space="preserve">) and arid (</w:t>
+      </w:r>
+      <m:oMath>
+        <m:r>
+          <m:t>34</m:t>
+        </m:r>
+        <m:r>
+          <m:rPr>
+            <m:sty m:val="p"/>
+          </m:rPr>
+          <m:t>±</m:t>
+        </m:r>
+        <m:r>
+          <m:t>11</m:t>
+        </m:r>
+        <m:r>
+          <m:rPr>
+            <m:sty m:val="p"/>
+          </m:rPr>
+          <m:t>%</m:t>
+        </m:r>
+      </m:oMath>
+      <w:r>
+        <w:t xml:space="preserve">,</w:t>
+      </w:r>
+      <w:r>
+        <w:t xml:space="preserve"> </w:t>
+      </w:r>
+      <m:oMath>
+        <m:r>
+          <m:t>M</m:t>
+        </m:r>
+        <m:r>
+          <m:t>1</m:t>
+        </m:r>
+      </m:oMath>
+      <w:r>
+        <w:t xml:space="preserve">) biomes. Also, generalists originating in the cold or polar biomes almost never made it to South America (</w:t>
+      </w:r>
+      <w:hyperlink w:anchor="fig-biome">
+        <w:r>
+          <w:rPr>
+            <w:rStyle w:val="Hyperlink"/>
+          </w:rPr>
+          <w:t xml:space="preserve">Figure 4</w:t>
+        </w:r>
+      </w:hyperlink>
+      <w:r>
+        <w:t xml:space="preserve"> </w:t>
+      </w:r>
+      <w:r>
+        <w:t xml:space="preserve">C</w:t>
+      </w:r>
+      <w:r>
+        <w:t xml:space="preserve"> </w:t>
+      </w:r>
+      <m:oMath>
+        <m:r>
+          <m:t>M</m:t>
+        </m:r>
+        <m:r>
+          <m:t>1</m:t>
+        </m:r>
+        <m:r>
+          <m:rPr>
+            <m:sty m:val="p"/>
+          </m:rPr>
+          <m:t>−</m:t>
+        </m:r>
+        <m:r>
+          <m:t>2</m:t>
+        </m:r>
+      </m:oMath>
+      <w:r>
+        <w:t xml:space="preserve">). That being said, we should notice that removing the precipitation constraint on species climatic niche (</w:t>
+      </w:r>
+      <w:r>
+        <w:rPr>
+          <w:i/>
+          <w:iCs/>
+        </w:rPr>
+        <w:t xml:space="preserve">i</w:t>
+      </w:r>
+      <w:r>
+        <w:t xml:space="preserve">.</w:t>
+      </w:r>
+      <w:r>
+        <w:rPr>
+          <w:i/>
+          <w:iCs/>
+        </w:rPr>
+        <w:t xml:space="preserve">e</w:t>
+      </w:r>
+      <w:r>
+        <w:t xml:space="preserve">., model</w:t>
+      </w:r>
+      <w:r>
+        <w:t xml:space="preserve"> </w:t>
+      </w:r>
+      <m:oMath>
+        <m:r>
+          <m:t>M</m:t>
+        </m:r>
+        <m:r>
+          <m:t>3</m:t>
+        </m:r>
+      </m:oMath>
+      <w:r>
+        <w:t xml:space="preserve">) tends to attenuate this imbalance (</w:t>
+      </w:r>
+      <w:hyperlink w:anchor="fig-biome">
+        <w:r>
+          <w:rPr>
+            <w:rStyle w:val="Hyperlink"/>
+          </w:rPr>
+          <w:t xml:space="preserve">Figure 4</w:t>
+        </w:r>
+      </w:hyperlink>
+      <w:r>
+        <w:t xml:space="preserve"> </w:t>
+      </w:r>
+      <w:r>
+        <w:t xml:space="preserve">C</w:t>
+      </w:r>
+      <w:r>
+        <w:t xml:space="preserve"> </w:t>
+      </w:r>
+      <m:oMath>
+        <m:r>
+          <m:t>M</m:t>
+        </m:r>
+        <m:r>
+          <m:t>3</m:t>
+        </m:r>
+      </m:oMath>
+      <w:r>
+        <w:t xml:space="preserve">). All this still hold when standardising initial distances to the isthmus of simulations starting from North America to those starting from South America (Figure S8,</w:t>
+      </w:r>
+      <w:r>
+        <w:t xml:space="preserve"> </w:t>
+      </w:r>
+      <m:oMath>
+        <m:r>
+          <m:t>M</m:t>
+        </m:r>
+        <m:r>
+          <m:t>1</m:t>
+        </m:r>
+        <m:r>
+          <m:rPr>
+            <m:sty m:val="p"/>
+          </m:rPr>
+          <m:t>−</m:t>
+        </m:r>
+        <m:r>
+          <m:t>3</m:t>
+        </m:r>
+      </m:oMath>
+      <w:r>
+        <w:t xml:space="preserve">). Conversely, the disparity in proportion of successful exchanges across biomes was largely attenuated for biome generalists originating in South America, for which a successful exchange appears almost equally-likely, no matters the biome where they originate (</w:t>
+      </w:r>
+      <w:hyperlink w:anchor="fig-biome">
+        <w:r>
+          <w:rPr>
+            <w:rStyle w:val="Hyperlink"/>
+          </w:rPr>
+          <w:t xml:space="preserve">Figure 4</w:t>
+        </w:r>
+      </w:hyperlink>
+      <w:r>
+        <w:t xml:space="preserve"> </w:t>
+      </w:r>
+      <w:r>
+        <w:t xml:space="preserve">C</w:t>
+      </w:r>
+      <w:r>
+        <w:t xml:space="preserve"> </w:t>
+      </w:r>
+      <m:oMath>
+        <m:r>
+          <m:t>M</m:t>
+        </m:r>
+        <m:r>
+          <m:t>1</m:t>
+        </m:r>
+        <m:r>
+          <m:rPr>
+            <m:sty m:val="p"/>
+          </m:rPr>
+          <m:t>−</m:t>
+        </m:r>
+        <m:r>
+          <m:t>3</m:t>
+        </m:r>
+      </m:oMath>
+      <w:r>
+        <w:t xml:space="preserve">).</w:t>
       </w:r>
     </w:p>
     <w:p>
@@ -2807,7 +3123,7 @@
         <w:t xml:space="preserve"> </w:t>
       </w:r>
       <w:r>
-        <w:t xml:space="preserve">3.5 Ma and (2) assumpltion of fixed palaeogeography.</w:t>
+        <w:t xml:space="preserve">3.5 Ma and (2) assumption of fixed palaeogeography.</w:t>
       </w:r>
     </w:p>
     <w:bookmarkEnd w:id="30"/>

</xml_diff>

<commit_message>
remove alpha + improve discussion
</commit_message>
<xml_diff>
--- a/Manuscript/GABI_palaeo_constraints.docx
+++ b/Manuscript/GABI_palaeo_constraints.docx
@@ -176,7 +176,7 @@
         <w:pStyle w:val="FirstParagraph"/>
       </w:pPr>
       <w:r>
-        <w:t xml:space="preserve">The Great American Biotic Interchange (GABI) refers to the admixture of North and South American faunas promoted by the late Cenozoic closure of the isthmus of Panama. Among land mammals, this faunal exchange was asymmetric because it witnessed a greater ability of North American lineages to establish southwards, meanwhile many South Americans went extinct. Here, coupling a mechanistic eco-evolutionary simulator with palaeoclimatic reconstructions for the last 5 million years, we explore the extent to which palaeoclimate, alone, may have shaped such a biogeographic asymmetry. When climatic variables are the only constraints to virtual species’ dispersal, our results indicate that (1) successful interchanges are more frequently achieved when simulations start from South America than from North America, contrary to what could be expected based on empirical observations. In addition, (2) our models fail at explaining the higher representation of temperate-adapted mammals in the fossil record of successfully exchanged mammals, particularly of North American origin, but (3) suggest that successful colonisers from North America occupy larger areas in South America than the other way around. Hence, our findings stress that spatio-temporal palaeoclimate dynamics are not sufficient to explain the imbalanced success of North American migrants in South America following the GABI, suggesting the implication of additional biogeographic and ecological filters. This study offers valuable insights into the processes behind one of the most puzzling macroecological enigmas in the history of life on Earth.</w:t>
+        <w:t xml:space="preserve">The Great American Biotic Interchange (GABI) refers to the admixture of North and South American faunas promoted by the late Cenozoic closure of the isthmus of Panama. Among land mammals, this faunal exchange was asymmetric : a greater number of North American lineages established southwards, meanwhile many South Americans went extinct. Here, coupling a mechanistic eco-evolutionary simulator with palaeoclimatic reconstructions for the last 5 million years, we explore the extent to which palaeoclimate, alone, may have shaped such a biogeographic asymmetry. When climatic variables are the only constraints to virtual species’ dispersal, our results indicate that (1) successful interchanges are more frequently achieved when simulations start from South America than from North America, contrary to what could be expected based on empirical observations. In addition, (2) our models fail at explaining the higher representation of temperate-adapted mammals in the fossil record of successfully exchanged mammals, particularly of North American origin, but (3) suggest that successful colonisers from North America occupy larger areas in South America than the other way around. Hence, our findings stress that spatio-temporal palaeoclimate dynamics are not sufficient to explain the imbalanced success of North American migrants in South America following the GABI, suggesting the implication of additional biogeographic and ecological filters. This study offers valuable insights into the processes behind one of the most puzzling macroecological enigmas in the history of life on Earth.</w:t>
       </w:r>
     </w:p>
     <w:bookmarkEnd w:id="20"/>
@@ -230,7 +230,7 @@
         <w:rPr>
           <w:vertAlign w:val="superscript"/>
         </w:rPr>
-        <w:t xml:space="preserve">2–4</w:t>
+        <w:t xml:space="preserve">2–5</w:t>
       </w:r>
       <w:r>
         <w:t xml:space="preserve">, palaeontological evidence and molecular phylogenies both agree with a late Miocene onset of land mammal exchange between the Americas</w:t>
@@ -239,41 +239,25 @@
         <w:rPr>
           <w:vertAlign w:val="superscript"/>
         </w:rPr>
-        <w:t xml:space="preserve">5–7</w:t>
-      </w:r>
-      <w:r>
-        <w:t xml:space="preserve">, with effective pulses of mammal crossings occurring not earlier than</w:t>
-      </w:r>
-      <w:r>
-        <w:t xml:space="preserve"> </w:t>
-      </w:r>
-      <w:r>
-        <w:rPr>
-          <w:i/>
-          <w:iCs/>
-        </w:rPr>
-        <w:t xml:space="preserve">c.</w:t>
-      </w:r>
-      <w:r>
-        <w:t xml:space="preserve"> </w:t>
-      </w:r>
-      <w:r>
-        <w:t xml:space="preserve">3 Million years ago</w:t>
+        <w:t xml:space="preserve">6–8</w:t>
+      </w:r>
+      <w:r>
+        <w:t xml:space="preserve">, with effective pulses of mammal crossings occurring during the Plio-Pleistocene</w:t>
       </w:r>
       <w:r>
         <w:rPr>
           <w:vertAlign w:val="superscript"/>
         </w:rPr>
-        <w:t xml:space="preserve">1,8–10</w:t>
-      </w:r>
-      <w:r>
-        <w:t xml:space="preserve">. Despite its textbook nature, a puzzling feature of the GABI is that it impacted both continent’s mammalian faunas very differently. In fact, evidence from the fossil record indicates that the early phases of the GABI were marked by reciprocal exchanges between the Americas</w:t>
+        <w:t xml:space="preserve">1,9–11</w:t>
+      </w:r>
+      <w:r>
+        <w:t xml:space="preserve">. A puzzling feature of the GABI is that it impacted both continent’s mammalian faunas very differently. In fact, evidence from the fossil record indicates that the early phases of the GABI were marked by reciprocal exchanges between the Americas</w:t>
       </w:r>
       <w:r>
         <w:rPr>
           <w:vertAlign w:val="superscript"/>
         </w:rPr>
-        <w:t xml:space="preserve">1,8,11</w:t>
+        <w:t xml:space="preserve">1,9,12</w:t>
       </w:r>
       <w:r>
         <w:t xml:space="preserve">. However, during the Quaternary, the ability of migrant lineages to maintain and diversify in the foreign continent became greater in South America</w:t>
@@ -282,7 +266,7 @@
         <w:rPr>
           <w:vertAlign w:val="superscript"/>
         </w:rPr>
-        <w:t xml:space="preserve">8</w:t>
+        <w:t xml:space="preserve">9</w:t>
       </w:r>
       <w:r>
         <w:t xml:space="preserve">, and many native South American mammal lineages concomitantly declined, some of which even going totally extinct</w:t>
@@ -291,10 +275,10 @@
         <w:rPr>
           <w:vertAlign w:val="superscript"/>
         </w:rPr>
-        <w:t xml:space="preserve">12–16</w:t>
-      </w:r>
-      <w:r>
-        <w:t xml:space="preserve">. Hence, it turns out that this intercontinental faunal exchange has been strikingly asymmetric.</w:t>
+        <w:t xml:space="preserve">13–17</w:t>
+      </w:r>
+      <w:r>
+        <w:t xml:space="preserve">. Hence, this intercontinental faunal exchange was asymmetric.</w:t>
       </w:r>
     </w:p>
     <w:p>
@@ -308,7 +292,7 @@
         <w:rPr>
           <w:vertAlign w:val="superscript"/>
         </w:rPr>
-        <w:t xml:space="preserve">11,17,18</w:t>
+        <w:t xml:space="preserve">12,18,19</w:t>
       </w:r>
       <w:r>
         <w:t xml:space="preserve"> </w:t>
@@ -320,7 +304,7 @@
         <w:rPr>
           <w:vertAlign w:val="superscript"/>
         </w:rPr>
-        <w:t xml:space="preserve">11,19–21</w:t>
+        <w:t xml:space="preserve">12,20–22</w:t>
       </w:r>
       <w:r>
         <w:t xml:space="preserve">. However, their contribution to the asymmetry of the GABI has been increasingly called into question</w:t>
@@ -351,7 +335,7 @@
         <w:rPr>
           <w:vertAlign w:val="superscript"/>
         </w:rPr>
-        <w:t xml:space="preserve">., 22,23–25</w:t>
+        <w:t xml:space="preserve">., 23,24–26</w:t>
       </w:r>
       <w:r>
         <w:t xml:space="preserve">. On the other hand, several studies also proposed an implication of abiotic factors –</w:t>
@@ -421,7 +405,7 @@
         <w:rPr>
           <w:vertAlign w:val="superscript"/>
         </w:rPr>
-        <w:t xml:space="preserve">10,12,19,22,26</w:t>
+        <w:t xml:space="preserve">11,13,20,23,27,28</w:t>
       </w:r>
       <w:r>
         <w:t xml:space="preserve">. The prevailing view, proposed by Webb.</w:t>
@@ -430,7 +414,7 @@
         <w:rPr>
           <w:vertAlign w:val="superscript"/>
         </w:rPr>
-        <w:t xml:space="preserve">12</w:t>
+        <w:t xml:space="preserve">13</w:t>
       </w:r>
       <w:r>
         <w:t xml:space="preserve"> </w:t>
@@ -442,7 +426,7 @@
         <w:rPr>
           <w:vertAlign w:val="superscript"/>
         </w:rPr>
-        <w:t xml:space="preserve">22</w:t>
+        <w:t xml:space="preserve">23</w:t>
       </w:r>
       <w:r>
         <w:t xml:space="preserve">, consists of relating pulses of transcontinental mammal exchanges with Pleistocene climatic oscillations, promoting the transition from tropical rainforest to savannah-like environments in Central America as climate cooled down. This climate-driven landscape opening would have in turn facilitated the dispersal of non-tropical taxa, fitter to these environments, in line with the migrant fossil record across both sides of the isthmus. These exchange pulses would have been periodically interrupted as climate warmed up, promoting the reverse transition to rainforest in the isthmian region (tropical</w:t>
@@ -469,7 +453,7 @@
         <w:rPr>
           <w:vertAlign w:val="superscript"/>
         </w:rPr>
-        <w:t xml:space="preserve">8</w:t>
+        <w:t xml:space="preserve">9</w:t>
       </w:r>
       <w:r>
         <w:t xml:space="preserve">. However, so far, studies supporting this view have only been descriptive, tackling the issue from a pattern-oriented perspective driven by fossil data but, to our knowledge, never from a mechanistic process-oriented perspective.</w:t>
@@ -486,7 +470,7 @@
         <w:rPr>
           <w:vertAlign w:val="superscript"/>
         </w:rPr>
-        <w:t xml:space="preserve">27</w:t>
+        <w:t xml:space="preserve">29</w:t>
       </w:r>
       <w:r>
         <w:t xml:space="preserve">. By combining a landscape made up with palaeoenvironmental variables and a set of eco-evolutionary rules according to which virtual species are simulated, mechanistic eco-evolutionary models offer the unique opportunity to casually explore the way biodiversity patterns arise and are maintained through evolutionary times</w:t>
@@ -495,7 +479,7 @@
         <w:rPr>
           <w:vertAlign w:val="superscript"/>
         </w:rPr>
-        <w:t xml:space="preserve">28</w:t>
+        <w:t xml:space="preserve">30</w:t>
       </w:r>
       <w:r>
         <w:t xml:space="preserve">. Recently, this family of models has provided unprecedented insights into the underlying forces behind widely-recognised biodiversity patterns, such as the latitudinal biodiversity gradient</w:t>
@@ -504,7 +488,7 @@
         <w:rPr>
           <w:vertAlign w:val="superscript"/>
         </w:rPr>
-        <w:t xml:space="preserve">29,30</w:t>
+        <w:t xml:space="preserve">31,32</w:t>
       </w:r>
       <w:r>
         <w:t xml:space="preserve">, the diversity desequilibrium between tropical rainforests across the globe</w:t>
@@ -513,7 +497,7 @@
         <w:rPr>
           <w:vertAlign w:val="superscript"/>
         </w:rPr>
-        <w:t xml:space="preserve">31</w:t>
+        <w:t xml:space="preserve">33</w:t>
       </w:r>
       <w:r>
         <w:t xml:space="preserve">, the build-up of the unique biodiversity along the Wallace line</w:t>
@@ -522,7 +506,7 @@
         <w:rPr>
           <w:vertAlign w:val="superscript"/>
         </w:rPr>
-        <w:t xml:space="preserve">32</w:t>
+        <w:t xml:space="preserve">34</w:t>
       </w:r>
       <w:r>
         <w:t xml:space="preserve"> </w:t>
@@ -556,7 +540,7 @@
         <w:rPr>
           <w:vertAlign w:val="superscript"/>
         </w:rPr>
-        <w:t xml:space="preserve">., 33,34,35</w:t>
+        <w:t xml:space="preserve">., 35,36,37</w:t>
       </w:r>
       <w:r>
         <w:t xml:space="preserve">.</w:t>
@@ -605,7 +589,7 @@
         <w:rPr>
           <w:vertAlign w:val="superscript"/>
         </w:rPr>
-        <w:t xml:space="preserve">29</w:t>
+        <w:t xml:space="preserve">31</w:t>
       </w:r>
       <w:r>
         <w:t xml:space="preserve">, a mechanistic eco-evolutionary simulator, incorporating palaeoclimatic layers (annual temperature and precipitation) covering the last 5 million years generated by the PALEO-PGEM emulator</w:t>
@@ -614,7 +598,7 @@
         <w:rPr>
           <w:vertAlign w:val="superscript"/>
         </w:rPr>
-        <w:t xml:space="preserve">36,37</w:t>
+        <w:t xml:space="preserve">38,39</w:t>
       </w:r>
       <w:r>
         <w:t xml:space="preserve">. Each set of simulations tracked the radiation of a clade originating at a random location either in North or South America. Climate was the only ecological constraint limiting virtual species’ biogeography. We further compared the ability of virtual species to colonise the continent where they did not originate between the two initial conditions. For additional details, please refer to the</w:t>
@@ -1220,18 +1204,7 @@
         <w:pStyle w:val="BodyText"/>
       </w:pPr>
       <w:r>
-        <w:t xml:space="preserve">Besides, contrary to the proportion of colonised area, for a given ancestral continent, colonised</w:t>
-      </w:r>
-      <w:r>
-        <w:t xml:space="preserve"> </w:t>
-      </w:r>
-      <m:oMath>
-        <m:r>
-          <m:t>α</m:t>
-        </m:r>
-      </m:oMath>
-      <w:r>
-        <w:t xml:space="preserve">-diversity –</w:t>
+        <w:t xml:space="preserve">Besides, contrary to the proportion of colonised area, for a given ancestral continent, colonised diversity –</w:t>
       </w:r>
       <w:r>
         <w:t xml:space="preserve"> </w:t>
@@ -1285,18 +1258,7 @@
         <w:t xml:space="preserve"> </w:t>
       </w:r>
       <w:r>
-        <w:t xml:space="preserve">B). Moreover, ancestral continent does not seem to affect mean colonised</w:t>
-      </w:r>
-      <w:r>
-        <w:t xml:space="preserve"> </w:t>
-      </w:r>
-      <m:oMath>
-        <m:r>
-          <m:t>α</m:t>
-        </m:r>
-      </m:oMath>
-      <w:r>
-        <w:t xml:space="preserve">-diversity values in the case of the</w:t>
+        <w:t xml:space="preserve">B). Moreover, ancestral continent does not seem to affect mean colonised diversity values in the case of the</w:t>
       </w:r>
       <w:r>
         <w:t xml:space="preserve"> </w:t>
@@ -1544,7 +1506,7 @@
         <w:rPr>
           <w:vertAlign w:val="superscript"/>
         </w:rPr>
-        <w:t xml:space="preserve">38</w:t>
+        <w:t xml:space="preserve">40</w:t>
       </w:r>
       <w:r>
         <w:t xml:space="preserve"> </w:t>
@@ -1556,7 +1518,7 @@
         <w:rPr>
           <w:vertAlign w:val="superscript"/>
         </w:rPr>
-        <w:t xml:space="preserve">39</w:t>
+        <w:t xml:space="preserve">41</w:t>
       </w:r>
       <w:r>
         <w:t xml:space="preserve">: Tropical, Arid, Temperate, Cold and Polar (</w:t>
@@ -2474,13 +2436,13 @@
         <w:t xml:space="preserve">Discussion</w:t>
       </w:r>
     </w:p>
-    <w:bookmarkStart w:id="27" w:name="X9d8a47ba2ef3e670bafc0a159f2f50a714a16c0"/>
+    <w:bookmarkStart w:id="27" w:name="X29849b2dbddef87ab6d7d6609874808b4e7c498"/>
     <w:p>
       <w:pPr>
         <w:pStyle w:val="Heading2"/>
       </w:pPr>
       <w:r>
-        <w:t xml:space="preserve">The role of climate in the asymmetry of the GABI as told by computer experiments</w:t>
+        <w:t xml:space="preserve">An inverse asymmetry of exchange probability across both sides of the isthmus driven by climate</w:t>
       </w:r>
     </w:p>
     <w:p>
@@ -2488,24 +2450,7 @@
         <w:pStyle w:val="FirstParagraph"/>
       </w:pPr>
       <w:r>
-        <w:t xml:space="preserve">Our results exhibit clear contrasts with the long-recognised imbalanced success of North American mammal taxa compared to South Americans in the aftermath of the GABI</w:t>
-      </w:r>
-      <w:r>
-        <w:rPr>
-          <w:vertAlign w:val="superscript"/>
-        </w:rPr>
-        <w:t xml:space="preserve">17</w:t>
-      </w:r>
-      <w:r>
-        <w:t xml:space="preserve">. Can the apparent mismatch between simulated and empirical patterns be interpreted through the lens of macroecological processes? Are we completely going at odds with what we should find, or are we opening useful boxes to better apprehend the complexity of this unique biodiversity pattern, half a century after its first large-scale characterisation?</w:t>
-      </w:r>
-    </w:p>
-    <w:p>
-      <w:pPr>
-        <w:pStyle w:val="BodyText"/>
-      </w:pPr>
-      <w:r>
-        <w:t xml:space="preserve">Probably one of our most striking findings is that, under abiotic constraints alone, the likelihood of southwards dispersal events (</w:t>
+        <w:t xml:space="preserve">Throughout this work, we investigated the role of palaeoclimate in the asymmetry of the Great American Biotic Interchange (GABI) through the use of eco-evolutionary simulations. Based on empirical evidence, we hypothesised our virtual experiments to result in (i) a higher likelihood of southwards dispersal events (</w:t>
       </w:r>
       <w:r>
         <w:rPr>
@@ -2525,7 +2470,15 @@
         <w:t xml:space="preserve">e</w:t>
       </w:r>
       <w:r>
-        <w:t xml:space="preserve">., from North to South America) is lower than that of northwards events (</w:t>
+        <w:t xml:space="preserve">., from North to South America) compared to northwards ones; (ii) more diverse and spatially spread radiations in the foreign continent following successful southwards exchanges compared to northwards ones; and (iii) successful exchanges to be more frequently achieved among simulated biome generalists, temperate and arid specialists than tropical specialists.</w:t>
+      </w:r>
+    </w:p>
+    <w:p>
+      <w:pPr>
+        <w:pStyle w:val="BodyText"/>
+      </w:pPr>
+      <w:r>
+        <w:t xml:space="preserve">Probably one of our most striking findings is that, under climatic constraints alone, simulated South American lineages dispersed to the North with a significantly greater probability than the other way around (</w:t>
       </w:r>
       <w:hyperlink w:anchor="fig-propsuccess">
         <w:r>
@@ -2536,60 +2489,33 @@
         </w:r>
       </w:hyperlink>
       <w:r>
-        <w:t xml:space="preserve">). Although this result goes in contradiction with the actual number of realised land mammal exchanges estimated from the fossil record</w:t>
+        <w:t xml:space="preserve">). This therefore clearly contrasts with the long-recognised imbalanced success of North American mammal taxa compared to South Americans in the aftermath of the GABI</w:t>
       </w:r>
       <w:r>
         <w:rPr>
           <w:vertAlign w:val="superscript"/>
         </w:rPr>
-        <w:t xml:space="preserve">1</w:t>
-      </w:r>
-      <w:r>
-        <w:t xml:space="preserve">, it actually echoes with what occurred in other groups of vertebrates. For instance, tropical North American ichtyofauna has long been recognised as mainly composed of groups that originated in South American and further dispersed to the north, although most likely multiple dispersal events occurred, some of which predating the closure of the isthmus</w:t>
+        <w:t xml:space="preserve">18</w:t>
+      </w:r>
+      <w:r>
+        <w:t xml:space="preserve">, suggesting that filters other than climatic must have been at play to build this asymmetry.</w:t>
+      </w:r>
+    </w:p>
+    <w:p>
+      <w:pPr>
+        <w:pStyle w:val="BodyText"/>
+      </w:pPr>
+      <w:r>
+        <w:t xml:space="preserve">Seminal works primarily interpreted the empirically-derived asymmetry of the GABI through the lens of MacArthur &amp; Wilson’s equilibrium theory</w:t>
       </w:r>
       <w:r>
         <w:rPr>
           <w:vertAlign w:val="superscript"/>
         </w:rPr>
-        <w:t xml:space="preserve">40</w:t>
-      </w:r>
-      <w:r>
-        <w:t xml:space="preserve">. In addition, phylogenetic evidence suggest symmetrical avifaunal exchanges between the Americas since the closure of the panamannian seaway, with higher prevalence of northwards dispersal events around the Plio-Pleistocene boundary</w:t>
-      </w:r>
-      <w:r>
-        <w:rPr>
-          <w:vertAlign w:val="superscript"/>
-        </w:rPr>
-        <w:t xml:space="preserve">41,42</w:t>
-      </w:r>
-      <w:r>
-        <w:t xml:space="preserve">.</w:t>
-      </w:r>
-    </w:p>
-    <w:p>
-      <w:pPr>
-        <w:pStyle w:val="BodyText"/>
-      </w:pPr>
-      <w:r>
-        <w:t xml:space="preserve">As we just mentioned, empirical quantification revealed that, all across the GABI, the overall number of land mammal lineages effectively crossing the isthmus southwards has been higher than northwards</w:t>
-      </w:r>
-      <w:r>
-        <w:rPr>
-          <w:vertAlign w:val="superscript"/>
-        </w:rPr>
-        <w:t xml:space="preserve">1</w:t>
-      </w:r>
-      <w:r>
-        <w:t xml:space="preserve">. This migration imbalance has been primarily interpreted as a direct consequence of MacArthur &amp; Wilson’s equilibrium theory– extrapolated to continents</w:t>
-      </w:r>
-      <w:r>
-        <w:rPr>
-          <w:vertAlign w:val="superscript"/>
-        </w:rPr>
-        <w:t xml:space="preserve">43</w:t>
-      </w:r>
-      <w:r>
-        <w:t xml:space="preserve">. This theory establishes that, on evolutionary timescales, diversity within a given area should tend towards an equilibrium value proportional to the size of this area. It therefore predicts the equilibrium diversity of North America to be larger than that of South America, given the differences in size between the two continents (</w:t>
+        <w:t xml:space="preserve">42</w:t>
+      </w:r>
+      <w:r>
+        <w:t xml:space="preserve">, but extrapolated to continents. This theory establishes that, on evolutionary timescales, diversity within a given area should tend towards an equilibrium value proportional to the size of this area. It therefore predicts the equilibrium diversity of North America to be larger than that of South America, given the differences in size between the two continents (</w:t>
       </w:r>
       <m:oMath>
         <m:r>
@@ -2658,7 +2584,24 @@
         <w:t xml:space="preserve"> </w:t>
       </w:r>
       <w:r>
-        <w:t xml:space="preserve">established that the continent offering the larger pool of taxa – which, according to this prediction, would happen to be North America – would in turn have resulted in the larger number of species exchanged in the end. However, this conclusion only holds under the assumption that the probability for a given taxon to cross the Panamanian landbridge was independent from the side of the isthmus where it came from. Yet, our simulations revealed that the likelihood of southwards dispersal events significantly differed from that of northwards dispersal events (</w:t>
+        <w:t xml:space="preserve">argued that the continent offering the larger pool of taxa – which, according to this prediction, would happen to be North America – would in turn have resulted in the larger number of species exchanged in the end. It might be noticed that species pool imbalance between the two source areas has been identified as a key driver in the faunal exchange asymmetry that contributed to the build-up of the unique biodiversity along the Wallace line</w:t>
+      </w:r>
+      <w:r>
+        <w:rPr>
+          <w:vertAlign w:val="superscript"/>
+        </w:rPr>
+        <w:t xml:space="preserve">34</w:t>
+      </w:r>
+      <w:r>
+        <w:t xml:space="preserve">.</w:t>
+      </w:r>
+    </w:p>
+    <w:p>
+      <w:pPr>
+        <w:pStyle w:val="BodyText"/>
+      </w:pPr>
+      <w:r>
+        <w:t xml:space="preserve">Nonetheless, following such a reasoning, the probability for a given taxon to cross the Panamanian landbridge is assumed to be independent from the side of the isthmus where it came from, which, interestingly, is not supported by our findings (</w:t>
       </w:r>
       <w:hyperlink w:anchor="fig-propsuccess">
         <w:r>
@@ -2669,25 +2612,48 @@
         </w:r>
       </w:hyperlink>
       <w:r>
-        <w:t xml:space="preserve">). Hence, should species distribution primarily be mediated by climate, our results would not support the view of the asymmetry of the GABI under the prism of MacArthur &amp; Wilson’s equilibrium theory. It might also be noticed that this theory fails at explaining the actual imbalance in extant mammal species-level diversity between the Americas, being way larger in South than in North America</w:t>
+        <w:t xml:space="preserve">). In addition, this theory fails at explaining the actual imbalance in extant mammal species-level diversity between the Americas, being way larger in South than in North America</w:t>
       </w:r>
       <w:r>
         <w:rPr>
           <w:vertAlign w:val="superscript"/>
         </w:rPr>
-        <w:t xml:space="preserve">44,45</w:t>
-      </w:r>
-      <w:r>
-        <w:t xml:space="preserve"> </w:t>
-      </w:r>
-      <w:r>
-        <w:t xml:space="preserve">– though such a difference is maybe less marked for higher taxonomic levels. Species pool imbalance between the two source areas has yet been identified as a key driver in the asymmetry of the faunal exchange that contributed to the build-up of the unique biodiversity along the Wallace line</w:t>
+        <w:t xml:space="preserve">43,44</w:t>
+      </w:r>
+      <w:r>
+        <w:t xml:space="preserve">.</w:t>
+      </w:r>
+    </w:p>
+    <w:p>
+      <w:pPr>
+        <w:pStyle w:val="BodyText"/>
+      </w:pPr>
+      <w:r>
+        <w:t xml:space="preserve">Although our characterised inverse asymmetry in the likelihood of climate-driven successful dispersal across both sides of the Isthmus goes in contradiction with the mammal fossil record</w:t>
       </w:r>
       <w:r>
         <w:rPr>
           <w:vertAlign w:val="superscript"/>
         </w:rPr>
-        <w:t xml:space="preserve">32</w:t>
+        <w:t xml:space="preserve">1</w:t>
+      </w:r>
+      <w:r>
+        <w:t xml:space="preserve">, it actually echoes what occurred in other groups of vertebrates. For instance, tropical North American ichtyofauna has long been recognised as mainly composed of groups that originated in South America and further dispersed to the North, although most likely multiple dispersal events occurred, some of which predating the closure of the isthmus</w:t>
+      </w:r>
+      <w:r>
+        <w:rPr>
+          <w:vertAlign w:val="superscript"/>
+        </w:rPr>
+        <w:t xml:space="preserve">45</w:t>
+      </w:r>
+      <w:r>
+        <w:t xml:space="preserve">. In addition, phylogenetic evidence suggest symmetrical avifaunal exchanges between the Americas since the closure of the panamannian seaway, with higher prevalence of northwards dispersal events around the Plio-Pleistocene boundary</w:t>
+      </w:r>
+      <w:r>
+        <w:rPr>
+          <w:vertAlign w:val="superscript"/>
+        </w:rPr>
+        <w:t xml:space="preserve">46,47</w:t>
       </w:r>
       <w:r>
         <w:t xml:space="preserve">.</w:t>
@@ -2734,7 +2700,7 @@
         <w:rPr>
           <w:vertAlign w:val="superscript"/>
         </w:rPr>
-        <w:t xml:space="preserve">22</w:t>
+        <w:t xml:space="preserve">23</w:t>
       </w:r>
       <w:r>
         <w:t xml:space="preserve">. On the other hand, fewer mammals – only biome generalists or open-habitat specialists – from South America would be expected to roam the other way around. These predictions meet those of the</w:t>
@@ -2761,7 +2727,7 @@
         <w:rPr>
           <w:vertAlign w:val="superscript"/>
         </w:rPr>
-        <w:t xml:space="preserve">46</w:t>
+        <w:t xml:space="preserve">48</w:t>
       </w:r>
       <w:r>
         <w:t xml:space="preserve"> </w:t>
@@ -2773,7 +2739,7 @@
         <w:rPr>
           <w:vertAlign w:val="superscript"/>
         </w:rPr>
-        <w:t xml:space="preserve">46</w:t>
+        <w:t xml:space="preserve">48</w:t>
       </w:r>
       <w:r>
         <w:t xml:space="preserve">. Here, our virtual experiments partially corroborate these historical predictions. Indeed, simulated tropical-adapted taxa of North American origin – coming from simulations starting in the North American tropical biome and of which climatic niche could not evolve, model</w:t>
@@ -2837,6 +2803,14 @@
         <w:pStyle w:val="BodyText"/>
       </w:pPr>
       <w:r>
+        <w:t xml:space="preserve">We failed at related simulated exchange pulses to temperature fluctuations, yet postulated in the literature (Figure S11).</w:t>
+      </w:r>
+    </w:p>
+    <w:p>
+      <w:pPr>
+        <w:pStyle w:val="BodyText"/>
+      </w:pPr>
+      <w:r>
         <w:t xml:space="preserve">Southwards dispersals generated under</w:t>
       </w:r>
       <w:r>
@@ -2854,18 +2828,7 @@
         <w:t xml:space="preserve"> </w:t>
       </w:r>
       <w:r>
-        <w:t xml:space="preserve">are less frequent but result in a greater colonising ability – larger proportion of colonised area and colonised</w:t>
-      </w:r>
-      <w:r>
-        <w:t xml:space="preserve"> </w:t>
-      </w:r>
-      <m:oMath>
-        <m:r>
-          <m:t>α</m:t>
-        </m:r>
-      </m:oMath>
-      <w:r>
-        <w:t xml:space="preserve">-diversity – than northwards dispersals</w:t>
+        <w:t xml:space="preserve">are less frequent but result in a greater colonising ability – larger proportion of colonised area and colonised diversity – than northwards dispersals</w:t>
       </w:r>
       <w:r>
         <w:t xml:space="preserve"> </w:t>
@@ -2899,7 +2862,7 @@
         <w:rPr>
           <w:vertAlign w:val="superscript"/>
         </w:rPr>
-        <w:t xml:space="preserve">41</w:t>
+        <w:t xml:space="preserve">46</w:t>
       </w:r>
     </w:p>
     <w:p>
@@ -2919,7 +2882,7 @@
         <w:rPr>
           <w:vertAlign w:val="superscript"/>
         </w:rPr>
-        <w:t xml:space="preserve">41</w:t>
+        <w:t xml:space="preserve">46</w:t>
       </w:r>
       <w:r>
         <w:t xml:space="preserve"> </w:t>
@@ -2979,7 +2942,7 @@
         <w:rPr>
           <w:vertAlign w:val="superscript"/>
         </w:rPr>
-        <w:t xml:space="preserve">8</w:t>
+        <w:t xml:space="preserve">9</w:t>
       </w:r>
     </w:p>
     <w:p>
@@ -3001,7 +2964,7 @@
         <w:rPr>
           <w:vertAlign w:val="superscript"/>
         </w:rPr>
-        <w:t xml:space="preserve">32</w:t>
+        <w:t xml:space="preserve">34</w:t>
       </w:r>
       <w:r>
         <w:t xml:space="preserve">. Result of Figure 2C for</w:t>
@@ -3043,7 +3006,7 @@
         <w:rPr>
           <w:vertAlign w:val="superscript"/>
         </w:rPr>
-        <w:t xml:space="preserve">47</w:t>
+        <w:t xml:space="preserve">49</w:t>
       </w:r>
     </w:p>
     <w:p>
@@ -3113,7 +3076,7 @@
         <w:rPr>
           <w:vertAlign w:val="superscript"/>
         </w:rPr>
-        <w:t xml:space="preserve">15</w:t>
+        <w:t xml:space="preserve">16</w:t>
       </w:r>
       <w:r>
         <w:t xml:space="preserve"> </w:t>
@@ -3125,7 +3088,7 @@
         <w:rPr>
           <w:vertAlign w:val="superscript"/>
         </w:rPr>
-        <w:t xml:space="preserve">48</w:t>
+        <w:t xml:space="preserve">50</w:t>
       </w:r>
       <w:r>
         <w:t xml:space="preserve"> </w:t>
@@ -3137,7 +3100,7 @@
         <w:rPr>
           <w:vertAlign w:val="superscript"/>
         </w:rPr>
-        <w:t xml:space="preserve">17</w:t>
+        <w:t xml:space="preserve">18</w:t>
       </w:r>
       <w:r>
         <w:t xml:space="preserve">. Hypotheses invoking competition mostly relied on striking morphological convergences between the clades assumed to have competed –</w:t>
@@ -3169,7 +3132,7 @@
         <w:rPr>
           <w:vertAlign w:val="superscript"/>
         </w:rPr>
-        <w:t xml:space="preserve">18</w:t>
+        <w:t xml:space="preserve">19</w:t>
       </w:r>
       <w:r>
         <w:t xml:space="preserve">. Moreover, using phylogenetic regressions, Faurby et al.</w:t>
@@ -3178,7 +3141,7 @@
         <w:rPr>
           <w:vertAlign w:val="superscript"/>
         </w:rPr>
-        <w:t xml:space="preserve">20</w:t>
+        <w:t xml:space="preserve">21</w:t>
       </w:r>
       <w:r>
         <w:t xml:space="preserve"> </w:t>
@@ -3190,7 +3153,7 @@
         <w:rPr>
           <w:vertAlign w:val="superscript"/>
         </w:rPr>
-        <w:t xml:space="preserve">23,24</w:t>
+        <w:t xml:space="preserve">24,25</w:t>
       </w:r>
       <w:r>
         <w:t xml:space="preserve">. Incorporating biotic compounds in mechanistic frameworks such as the one we have implemented here would be a nice way-to-go for future studies tackling the asymmetry behind the GABI.</w:t>
@@ -3225,7 +3188,7 @@
         <w:rPr>
           <w:vertAlign w:val="superscript"/>
         </w:rPr>
-        <w:t xml:space="preserve">49</w:t>
+        <w:t xml:space="preserve">51</w:t>
       </w:r>
       <w:r>
         <w:t xml:space="preserve">.</w:t>
@@ -3273,7 +3236,7 @@
         <w:rPr>
           <w:vertAlign w:val="superscript"/>
         </w:rPr>
-        <w:t xml:space="preserve">12</w:t>
+        <w:t xml:space="preserve">13</w:t>
       </w:r>
     </w:p>
     <w:p>
@@ -3329,7 +3292,7 @@
         <w:rPr>
           <w:vertAlign w:val="superscript"/>
         </w:rPr>
-        <w:t xml:space="preserve">14</w:t>
+        <w:t xml:space="preserve">15</w:t>
       </w:r>
       <w:r>
         <w:t xml:space="preserve"> </w:t>
@@ -3401,7 +3364,7 @@
         <w:rPr>
           <w:vertAlign w:val="superscript"/>
         </w:rPr>
-        <w:t xml:space="preserve">., 50,51</w:t>
+        <w:t xml:space="preserve">., 52,53</w:t>
       </w:r>
       <w:r>
         <w:t xml:space="preserve">. Although over-water dispersal has long been regarded as the prevailing mechanism</w:t>
@@ -3410,7 +3373,7 @@
         <w:rPr>
           <w:vertAlign w:val="superscript"/>
         </w:rPr>
-        <w:t xml:space="preserve">50</w:t>
+        <w:t xml:space="preserve">52</w:t>
       </w:r>
       <w:r>
         <w:t xml:space="preserve">, recent geological advances have providing evidence for (1) the emergence of land bridges connecting South America to Caribbean islands and (2) the formation of mega-islands – during Pleistocene glacial maximum episodes – several times since the Mio-Pliocene boundary</w:t>
@@ -3419,7 +3382,7 @@
         <w:rPr>
           <w:vertAlign w:val="superscript"/>
         </w:rPr>
-        <w:t xml:space="preserve">52</w:t>
+        <w:t xml:space="preserve">54</w:t>
       </w:r>
       <w:r>
         <w:t xml:space="preserve">. Hence, it would make sense to consider West Indies as an alternative dispersal pathway between the Americas. However, due to the idiosyncratic eco-evolutionary processes shaping insular systems</w:t>
@@ -3450,7 +3413,7 @@
         <w:rPr>
           <w:vertAlign w:val="superscript"/>
         </w:rPr>
-        <w:t xml:space="preserve">., 53</w:t>
+        <w:t xml:space="preserve">., 55</w:t>
       </w:r>
       <w:r>
         <w:t xml:space="preserve"> </w:t>
@@ -3616,7 +3579,7 @@
       </w:r>
     </w:p>
     <w:bookmarkEnd w:id="35"/>
-    <w:bookmarkStart w:id="142" w:name="references"/>
+    <w:bookmarkStart w:id="146" w:name="references"/>
     <w:p>
       <w:pPr>
         <w:pStyle w:val="Heading1"/>
@@ -3625,7 +3588,7 @@
         <w:t xml:space="preserve">References</w:t>
       </w:r>
     </w:p>
-    <w:bookmarkStart w:id="141" w:name="refs"/>
+    <w:bookmarkStart w:id="145" w:name="refs"/>
     <w:bookmarkStart w:id="37" w:name="ref-marshall1982"/>
     <w:p>
       <w:pPr>
@@ -3797,7 +3760,7 @@
       </w:r>
     </w:p>
     <w:bookmarkEnd w:id="43"/>
-    <w:bookmarkStart w:id="45" w:name="ref-verzi2008"/>
+    <w:bookmarkStart w:id="45" w:name="ref-bourke2025"/>
     <w:p>
       <w:pPr>
         <w:pStyle w:val="Bibliography"/>
@@ -3812,7 +3775,7 @@
         <w:t xml:space="preserve">	</w:t>
       </w:r>
       <w:r>
-        <w:t xml:space="preserve">Verzi, D.H., Montalvo, C.I., and Deschamps, C.M. (2008). Biostratigraphy and biochronology of the late miocene of central argentina: Evidence from rodents and taphonomy. Geobios</w:t>
+        <w:t xml:space="preserve">Bourke, J.R., Link, F., Long, M.D., and Wright, J. (2025). Evidence for Caribbean Plate Subduction Beneath the Isthmus of Panama and Implications for Subduction Initiation and the Closure of the Central American Isthmus During the Miocene. Geochemistry, Geophysics, Geosystems</w:t>
       </w:r>
       <w:r>
         <w:t xml:space="preserve"> </w:t>
@@ -3822,6 +3785,52 @@
           <w:i/>
           <w:iCs/>
         </w:rPr>
+        <w:t xml:space="preserve">26</w:t>
+      </w:r>
+      <w:r>
+        <w:t xml:space="preserve">, e2025GC012288.</w:t>
+      </w:r>
+      <w:r>
+        <w:t xml:space="preserve"> </w:t>
+      </w:r>
+      <w:hyperlink r:id="rId44">
+        <w:r>
+          <w:rPr>
+            <w:rStyle w:val="Hyperlink"/>
+          </w:rPr>
+          <w:t xml:space="preserve">https://doi.org/10.1029/2025GC012288</w:t>
+        </w:r>
+      </w:hyperlink>
+      <w:r>
+        <w:t xml:space="preserve">.</w:t>
+      </w:r>
+    </w:p>
+    <w:bookmarkEnd w:id="45"/>
+    <w:bookmarkStart w:id="47" w:name="ref-verzi2008"/>
+    <w:p>
+      <w:pPr>
+        <w:pStyle w:val="Bibliography"/>
+      </w:pPr>
+      <w:r>
+        <w:t xml:space="preserve">6.</w:t>
+      </w:r>
+      <w:r>
+        <w:t xml:space="preserve"> </w:t>
+      </w:r>
+      <w:r>
+        <w:t xml:space="preserve">	</w:t>
+      </w:r>
+      <w:r>
+        <w:t xml:space="preserve">Verzi, D.H., Montalvo, C.I., and Deschamps, C.M. (2008). Biostratigraphy and biochronology of the late miocene of central argentina: Evidence from rodents and taphonomy. Geobios</w:t>
+      </w:r>
+      <w:r>
+        <w:t xml:space="preserve"> </w:t>
+      </w:r>
+      <w:r>
+        <w:rPr>
+          <w:i/>
+          <w:iCs/>
+        </w:rPr>
         <w:t xml:space="preserve">41</w:t>
       </w:r>
       <w:r>
@@ -3830,7 +3839,7 @@
       <w:r>
         <w:t xml:space="preserve"> </w:t>
       </w:r>
-      <w:hyperlink r:id="rId44">
+      <w:hyperlink r:id="rId46">
         <w:r>
           <w:rPr>
             <w:rStyle w:val="Hyperlink"/>
@@ -3842,14 +3851,14 @@
         <w:t xml:space="preserve">.</w:t>
       </w:r>
     </w:p>
-    <w:bookmarkEnd w:id="45"/>
-    <w:bookmarkStart w:id="47" w:name="ref-tedford2004"/>
+    <w:bookmarkEnd w:id="47"/>
+    <w:bookmarkStart w:id="49" w:name="ref-tedford2004"/>
     <w:p>
       <w:pPr>
         <w:pStyle w:val="Bibliography"/>
       </w:pPr>
       <w:r>
-        <w:t xml:space="preserve">6.</w:t>
+        <w:t xml:space="preserve">7.</w:t>
       </w:r>
       <w:r>
         <w:t xml:space="preserve"> </w:t>
@@ -3863,7 +3872,7 @@
       <w:r>
         <w:t xml:space="preserve"> </w:t>
       </w:r>
-      <w:hyperlink r:id="rId46">
+      <w:hyperlink r:id="rId48">
         <w:r>
           <w:rPr>
             <w:rStyle w:val="Hyperlink"/>
@@ -3875,14 +3884,14 @@
         <w:t xml:space="preserve">. In, M. O. Woodburne, ed. (Columbia University Press), pp. 169–231.</w:t>
       </w:r>
     </w:p>
-    <w:bookmarkEnd w:id="47"/>
-    <w:bookmarkStart w:id="49" w:name="ref-carrillo2015"/>
+    <w:bookmarkEnd w:id="49"/>
+    <w:bookmarkStart w:id="51" w:name="ref-carrillo2015"/>
     <w:p>
       <w:pPr>
         <w:pStyle w:val="Bibliography"/>
       </w:pPr>
       <w:r>
-        <w:t xml:space="preserve">7.</w:t>
+        <w:t xml:space="preserve">8.</w:t>
       </w:r>
       <w:r>
         <w:t xml:space="preserve"> </w:t>
@@ -3909,7 +3918,7 @@
       <w:r>
         <w:t xml:space="preserve"> </w:t>
       </w:r>
-      <w:hyperlink r:id="rId48">
+      <w:hyperlink r:id="rId50">
         <w:r>
           <w:rPr>
             <w:rStyle w:val="Hyperlink"/>
@@ -3921,14 +3930,14 @@
         <w:t xml:space="preserve">.</w:t>
       </w:r>
     </w:p>
-    <w:bookmarkEnd w:id="49"/>
-    <w:bookmarkStart w:id="51" w:name="ref-woodburne2010"/>
+    <w:bookmarkEnd w:id="51"/>
+    <w:bookmarkStart w:id="53" w:name="ref-woodburne2010"/>
     <w:p>
       <w:pPr>
         <w:pStyle w:val="Bibliography"/>
       </w:pPr>
       <w:r>
-        <w:t xml:space="preserve">8.</w:t>
+        <w:t xml:space="preserve">9.</w:t>
       </w:r>
       <w:r>
         <w:t xml:space="preserve"> </w:t>
@@ -3955,7 +3964,7 @@
       <w:r>
         <w:t xml:space="preserve"> </w:t>
       </w:r>
-      <w:hyperlink r:id="rId50">
+      <w:hyperlink r:id="rId52">
         <w:r>
           <w:rPr>
             <w:rStyle w:val="Hyperlink"/>
@@ -3967,14 +3976,14 @@
         <w:t xml:space="preserve">.</w:t>
       </w:r>
     </w:p>
-    <w:bookmarkEnd w:id="51"/>
-    <w:bookmarkStart w:id="53" w:name="ref-bacon2015"/>
+    <w:bookmarkEnd w:id="53"/>
+    <w:bookmarkStart w:id="55" w:name="ref-bacon2015"/>
     <w:p>
       <w:pPr>
         <w:pStyle w:val="Bibliography"/>
       </w:pPr>
       <w:r>
-        <w:t xml:space="preserve">9.</w:t>
+        <w:t xml:space="preserve">10.</w:t>
       </w:r>
       <w:r>
         <w:t xml:space="preserve"> </w:t>
@@ -4001,7 +4010,7 @@
       <w:r>
         <w:t xml:space="preserve"> </w:t>
       </w:r>
-      <w:hyperlink r:id="rId52">
+      <w:hyperlink r:id="rId54">
         <w:r>
           <w:rPr>
             <w:rStyle w:val="Hyperlink"/>
@@ -4013,14 +4022,14 @@
         <w:t xml:space="preserve">.</w:t>
       </w:r>
     </w:p>
-    <w:bookmarkEnd w:id="53"/>
-    <w:bookmarkStart w:id="55" w:name="ref-bacon2016"/>
+    <w:bookmarkEnd w:id="55"/>
+    <w:bookmarkStart w:id="57" w:name="ref-bacon2016"/>
     <w:p>
       <w:pPr>
         <w:pStyle w:val="Bibliography"/>
       </w:pPr>
       <w:r>
-        <w:t xml:space="preserve">10.</w:t>
+        <w:t xml:space="preserve">11.</w:t>
       </w:r>
       <w:r>
         <w:t xml:space="preserve"> </w:t>
@@ -4047,7 +4056,7 @@
       <w:r>
         <w:t xml:space="preserve"> </w:t>
       </w:r>
-      <w:hyperlink r:id="rId54">
+      <w:hyperlink r:id="rId56">
         <w:r>
           <w:rPr>
             <w:rStyle w:val="Hyperlink"/>
@@ -4059,14 +4068,14 @@
         <w:t xml:space="preserve">.</w:t>
       </w:r>
     </w:p>
-    <w:bookmarkEnd w:id="55"/>
-    <w:bookmarkStart w:id="57" w:name="ref-webb1976"/>
+    <w:bookmarkEnd w:id="57"/>
+    <w:bookmarkStart w:id="59" w:name="ref-webb1976"/>
     <w:p>
       <w:pPr>
         <w:pStyle w:val="Bibliography"/>
       </w:pPr>
       <w:r>
-        <w:t xml:space="preserve">11.</w:t>
+        <w:t xml:space="preserve">12.</w:t>
       </w:r>
       <w:r>
         <w:t xml:space="preserve"> </w:t>
@@ -4080,7 +4089,7 @@
       <w:r>
         <w:t xml:space="preserve"> </w:t>
       </w:r>
-      <w:hyperlink r:id="rId56">
+      <w:hyperlink r:id="rId58">
         <w:r>
           <w:rPr>
             <w:rStyle w:val="Hyperlink"/>
@@ -4105,14 +4114,14 @@
         <w:t xml:space="preserve">, 220–234.</w:t>
       </w:r>
     </w:p>
-    <w:bookmarkEnd w:id="57"/>
-    <w:bookmarkStart w:id="59" w:name="ref-webb1991"/>
+    <w:bookmarkEnd w:id="59"/>
+    <w:bookmarkStart w:id="61" w:name="ref-webb1991"/>
     <w:p>
       <w:pPr>
         <w:pStyle w:val="Bibliography"/>
       </w:pPr>
       <w:r>
-        <w:t xml:space="preserve">12.</w:t>
+        <w:t xml:space="preserve">13.</w:t>
       </w:r>
       <w:r>
         <w:t xml:space="preserve"> </w:t>
@@ -4139,7 +4148,7 @@
       <w:r>
         <w:t xml:space="preserve"> </w:t>
       </w:r>
-      <w:hyperlink r:id="rId58">
+      <w:hyperlink r:id="rId60">
         <w:r>
           <w:rPr>
             <w:rStyle w:val="Hyperlink"/>
@@ -4151,14 +4160,14 @@
         <w:t xml:space="preserve">.</w:t>
       </w:r>
     </w:p>
-    <w:bookmarkEnd w:id="59"/>
-    <w:bookmarkStart w:id="61" w:name="ref-cione2015"/>
+    <w:bookmarkEnd w:id="61"/>
+    <w:bookmarkStart w:id="63" w:name="ref-cione2015"/>
     <w:p>
       <w:pPr>
         <w:pStyle w:val="Bibliography"/>
       </w:pPr>
       <w:r>
-        <w:t xml:space="preserve">13.</w:t>
+        <w:t xml:space="preserve">14.</w:t>
       </w:r>
       <w:r>
         <w:t xml:space="preserve"> </w:t>
@@ -4172,7 +4181,7 @@
       <w:r>
         <w:t xml:space="preserve"> </w:t>
       </w:r>
-      <w:hyperlink r:id="rId60">
+      <w:hyperlink r:id="rId62">
         <w:r>
           <w:rPr>
             <w:rStyle w:val="Hyperlink"/>
@@ -4187,14 +4196,14 @@
         <w:t xml:space="preserve">(Springer Netherlands).</w:t>
       </w:r>
     </w:p>
-    <w:bookmarkEnd w:id="61"/>
-    <w:bookmarkStart w:id="63" w:name="ref-carrillo2020"/>
+    <w:bookmarkEnd w:id="63"/>
+    <w:bookmarkStart w:id="65" w:name="ref-carrillo2020"/>
     <w:p>
       <w:pPr>
         <w:pStyle w:val="Bibliography"/>
       </w:pPr>
       <w:r>
-        <w:t xml:space="preserve">14.</w:t>
+        <w:t xml:space="preserve">15.</w:t>
       </w:r>
       <w:r>
         <w:t xml:space="preserve"> </w:t>
@@ -4221,7 +4230,7 @@
       <w:r>
         <w:t xml:space="preserve"> </w:t>
       </w:r>
-      <w:hyperlink r:id="rId62">
+      <w:hyperlink r:id="rId64">
         <w:r>
           <w:rPr>
             <w:rStyle w:val="Hyperlink"/>
@@ -4233,14 +4242,14 @@
         <w:t xml:space="preserve">.</w:t>
       </w:r>
     </w:p>
-    <w:bookmarkEnd w:id="63"/>
-    <w:bookmarkStart w:id="65" w:name="ref-croft2020"/>
+    <w:bookmarkEnd w:id="65"/>
+    <w:bookmarkStart w:id="67" w:name="ref-croft2020"/>
     <w:p>
       <w:pPr>
         <w:pStyle w:val="Bibliography"/>
       </w:pPr>
       <w:r>
-        <w:t xml:space="preserve">15.</w:t>
+        <w:t xml:space="preserve">16.</w:t>
       </w:r>
       <w:r>
         <w:t xml:space="preserve"> </w:t>
@@ -4267,7 +4276,7 @@
       <w:r>
         <w:t xml:space="preserve"> </w:t>
       </w:r>
-      <w:hyperlink r:id="rId64">
+      <w:hyperlink r:id="rId66">
         <w:r>
           <w:rPr>
             <w:rStyle w:val="Hyperlink"/>
@@ -4279,14 +4288,14 @@
         <w:t xml:space="preserve">.</w:t>
       </w:r>
     </w:p>
-    <w:bookmarkEnd w:id="65"/>
-    <w:bookmarkStart w:id="67" w:name="ref-boscaini2025"/>
+    <w:bookmarkEnd w:id="67"/>
+    <w:bookmarkStart w:id="69" w:name="ref-boscaini2025"/>
     <w:p>
       <w:pPr>
         <w:pStyle w:val="Bibliography"/>
       </w:pPr>
       <w:r>
-        <w:t xml:space="preserve">16.</w:t>
+        <w:t xml:space="preserve">17.</w:t>
       </w:r>
       <w:r>
         <w:t xml:space="preserve"> </w:t>
@@ -4313,7 +4322,7 @@
       <w:r>
         <w:t xml:space="preserve"> </w:t>
       </w:r>
-      <w:hyperlink r:id="rId66">
+      <w:hyperlink r:id="rId68">
         <w:r>
           <w:rPr>
             <w:rStyle w:val="Hyperlink"/>
@@ -4325,14 +4334,14 @@
         <w:t xml:space="preserve">.</w:t>
       </w:r>
     </w:p>
-    <w:bookmarkEnd w:id="67"/>
-    <w:bookmarkStart w:id="68" w:name="ref-simpson1980"/>
+    <w:bookmarkEnd w:id="69"/>
+    <w:bookmarkStart w:id="70" w:name="ref-simpson1980"/>
     <w:p>
       <w:pPr>
         <w:pStyle w:val="Bibliography"/>
       </w:pPr>
       <w:r>
-        <w:t xml:space="preserve">17.</w:t>
+        <w:t xml:space="preserve">18.</w:t>
       </w:r>
       <w:r>
         <w:t xml:space="preserve"> </w:t>
@@ -4344,14 +4353,14 @@
         <w:t xml:space="preserve">Simpson, G.G. (1980). Splendid isolation : The curious history of south american mammals Yale University Press, New Haven.</w:t>
       </w:r>
     </w:p>
-    <w:bookmarkEnd w:id="68"/>
-    <w:bookmarkStart w:id="70" w:name="ref-domingo2020"/>
+    <w:bookmarkEnd w:id="70"/>
+    <w:bookmarkStart w:id="72" w:name="ref-domingo2020"/>
     <w:p>
       <w:pPr>
         <w:pStyle w:val="Bibliography"/>
       </w:pPr>
       <w:r>
-        <w:t xml:space="preserve">18.</w:t>
+        <w:t xml:space="preserve">19.</w:t>
       </w:r>
       <w:r>
         <w:t xml:space="preserve"> </w:t>
@@ -4378,7 +4387,7 @@
       <w:r>
         <w:t xml:space="preserve"> </w:t>
       </w:r>
-      <w:hyperlink r:id="rId69">
+      <w:hyperlink r:id="rId71">
         <w:r>
           <w:rPr>
             <w:rStyle w:val="Hyperlink"/>
@@ -4390,14 +4399,14 @@
         <w:t xml:space="preserve">.</w:t>
       </w:r>
     </w:p>
-    <w:bookmarkEnd w:id="70"/>
-    <w:bookmarkStart w:id="71" w:name="ref-marshall1990"/>
+    <w:bookmarkEnd w:id="72"/>
+    <w:bookmarkStart w:id="73" w:name="ref-marshall1990"/>
     <w:p>
       <w:pPr>
         <w:pStyle w:val="Bibliography"/>
       </w:pPr>
       <w:r>
-        <w:t xml:space="preserve">19.</w:t>
+        <w:t xml:space="preserve">20.</w:t>
       </w:r>
       <w:r>
         <w:t xml:space="preserve"> </w:t>
@@ -4422,14 +4431,14 @@
         <w:t xml:space="preserve">, 169–210.</w:t>
       </w:r>
     </w:p>
-    <w:bookmarkEnd w:id="71"/>
-    <w:bookmarkStart w:id="73" w:name="ref-faurby2016"/>
+    <w:bookmarkEnd w:id="73"/>
+    <w:bookmarkStart w:id="75" w:name="ref-faurby2016"/>
     <w:p>
       <w:pPr>
         <w:pStyle w:val="Bibliography"/>
       </w:pPr>
       <w:r>
-        <w:t xml:space="preserve">20.</w:t>
+        <w:t xml:space="preserve">21.</w:t>
       </w:r>
       <w:r>
         <w:t xml:space="preserve"> </w:t>
@@ -4456,7 +4465,7 @@
       <w:r>
         <w:t xml:space="preserve"> </w:t>
       </w:r>
-      <w:hyperlink r:id="rId72">
+      <w:hyperlink r:id="rId74">
         <w:r>
           <w:rPr>
             <w:rStyle w:val="Hyperlink"/>
@@ -4468,14 +4477,14 @@
         <w:t xml:space="preserve">.</w:t>
       </w:r>
     </w:p>
-    <w:bookmarkEnd w:id="73"/>
-    <w:bookmarkStart w:id="75" w:name="ref-fernández-monescillo2025"/>
+    <w:bookmarkEnd w:id="75"/>
+    <w:bookmarkStart w:id="77" w:name="ref-fernández-monescillo2025"/>
     <w:p>
       <w:pPr>
         <w:pStyle w:val="Bibliography"/>
       </w:pPr>
       <w:r>
-        <w:t xml:space="preserve">21.</w:t>
+        <w:t xml:space="preserve">22.</w:t>
       </w:r>
       <w:r>
         <w:t xml:space="preserve"> </w:t>
@@ -4502,7 +4511,7 @@
       <w:r>
         <w:t xml:space="preserve"> </w:t>
       </w:r>
-      <w:hyperlink r:id="rId74">
+      <w:hyperlink r:id="rId76">
         <w:r>
           <w:rPr>
             <w:rStyle w:val="Hyperlink"/>
@@ -4514,14 +4523,14 @@
         <w:t xml:space="preserve">.</w:t>
       </w:r>
     </w:p>
-    <w:bookmarkEnd w:id="75"/>
-    <w:bookmarkStart w:id="77" w:name="ref-vrba1992"/>
+    <w:bookmarkEnd w:id="77"/>
+    <w:bookmarkStart w:id="79" w:name="ref-vrba1992"/>
     <w:p>
       <w:pPr>
         <w:pStyle w:val="Bibliography"/>
       </w:pPr>
       <w:r>
-        <w:t xml:space="preserve">22.</w:t>
+        <w:t xml:space="preserve">23.</w:t>
       </w:r>
       <w:r>
         <w:t xml:space="preserve"> </w:t>
@@ -4548,7 +4557,7 @@
       <w:r>
         <w:t xml:space="preserve"> </w:t>
       </w:r>
-      <w:hyperlink r:id="rId76">
+      <w:hyperlink r:id="rId78">
         <w:r>
           <w:rPr>
             <w:rStyle w:val="Hyperlink"/>
@@ -4560,14 +4569,14 @@
         <w:t xml:space="preserve">.</w:t>
       </w:r>
     </w:p>
-    <w:bookmarkEnd w:id="77"/>
-    <w:bookmarkStart w:id="79" w:name="ref-prevosti2013"/>
+    <w:bookmarkEnd w:id="79"/>
+    <w:bookmarkStart w:id="81" w:name="ref-prevosti2013"/>
     <w:p>
       <w:pPr>
         <w:pStyle w:val="Bibliography"/>
       </w:pPr>
       <w:r>
-        <w:t xml:space="preserve">23.</w:t>
+        <w:t xml:space="preserve">24.</w:t>
       </w:r>
       <w:r>
         <w:t xml:space="preserve"> </w:t>
@@ -4594,7 +4603,7 @@
       <w:r>
         <w:t xml:space="preserve"> </w:t>
       </w:r>
-      <w:hyperlink r:id="rId78">
+      <w:hyperlink r:id="rId80">
         <w:r>
           <w:rPr>
             <w:rStyle w:val="Hyperlink"/>
@@ -4606,14 +4615,14 @@
         <w:t xml:space="preserve">.</w:t>
       </w:r>
     </w:p>
-    <w:bookmarkEnd w:id="79"/>
-    <w:bookmarkStart w:id="81" w:name="ref-tarquini2022"/>
+    <w:bookmarkEnd w:id="81"/>
+    <w:bookmarkStart w:id="83" w:name="ref-tarquini2022"/>
     <w:p>
       <w:pPr>
         <w:pStyle w:val="Bibliography"/>
       </w:pPr>
       <w:r>
-        <w:t xml:space="preserve">24.</w:t>
+        <w:t xml:space="preserve">25.</w:t>
       </w:r>
       <w:r>
         <w:t xml:space="preserve"> </w:t>
@@ -4640,7 +4649,7 @@
       <w:r>
         <w:t xml:space="preserve"> </w:t>
       </w:r>
-      <w:hyperlink r:id="rId80">
+      <w:hyperlink r:id="rId82">
         <w:r>
           <w:rPr>
             <w:rStyle w:val="Hyperlink"/>
@@ -4652,14 +4661,14 @@
         <w:t xml:space="preserve">.</w:t>
       </w:r>
     </w:p>
-    <w:bookmarkEnd w:id="81"/>
-    <w:bookmarkStart w:id="83" w:name="ref-marsà2025"/>
+    <w:bookmarkEnd w:id="83"/>
+    <w:bookmarkStart w:id="85" w:name="ref-marsà2025"/>
     <w:p>
       <w:pPr>
         <w:pStyle w:val="Bibliography"/>
       </w:pPr>
       <w:r>
-        <w:t xml:space="preserve">25.</w:t>
+        <w:t xml:space="preserve">26.</w:t>
       </w:r>
       <w:r>
         <w:t xml:space="preserve"> </w:t>
@@ -4704,7 +4713,7 @@
       <w:r>
         <w:t xml:space="preserve"> </w:t>
       </w:r>
-      <w:hyperlink r:id="rId82">
+      <w:hyperlink r:id="rId84">
         <w:r>
           <w:rPr>
             <w:rStyle w:val="Hyperlink"/>
@@ -4716,14 +4725,14 @@
         <w:t xml:space="preserve">.</w:t>
       </w:r>
     </w:p>
-    <w:bookmarkEnd w:id="83"/>
-    <w:bookmarkStart w:id="85" w:name="ref-freitas-oliveira2024"/>
+    <w:bookmarkEnd w:id="85"/>
+    <w:bookmarkStart w:id="87" w:name="ref-freitas-oliveira2024"/>
     <w:p>
       <w:pPr>
         <w:pStyle w:val="Bibliography"/>
       </w:pPr>
       <w:r>
-        <w:t xml:space="preserve">26.</w:t>
+        <w:t xml:space="preserve">27.</w:t>
       </w:r>
       <w:r>
         <w:t xml:space="preserve"> </w:t>
@@ -4750,7 +4759,7 @@
       <w:r>
         <w:t xml:space="preserve"> </w:t>
       </w:r>
-      <w:hyperlink r:id="rId84">
+      <w:hyperlink r:id="rId86">
         <w:r>
           <w:rPr>
             <w:rStyle w:val="Hyperlink"/>
@@ -4762,14 +4771,14 @@
         <w:t xml:space="preserve">.</w:t>
       </w:r>
     </w:p>
-    <w:bookmarkEnd w:id="85"/>
-    <w:bookmarkStart w:id="87" w:name="ref-pilowsky2022"/>
+    <w:bookmarkEnd w:id="87"/>
+    <w:bookmarkStart w:id="89" w:name="ref-freitas-oliveira2025"/>
     <w:p>
       <w:pPr>
         <w:pStyle w:val="Bibliography"/>
       </w:pPr>
       <w:r>
-        <w:t xml:space="preserve">27.</w:t>
+        <w:t xml:space="preserve">28.</w:t>
       </w:r>
       <w:r>
         <w:t xml:space="preserve"> </w:t>
@@ -4778,7 +4787,7 @@
         <w:t xml:space="preserve">	</w:t>
       </w:r>
       <w:r>
-        <w:t xml:space="preserve">Pilowsky, J.A., Colwell, R.K., Rahbek, C., and Fordham, D.A. (2022). Process-explicit models reveal the structure and dynamics of biodiversity patterns. Science Advances</w:t>
+        <w:t xml:space="preserve">Freitas-Oliveira, R., Lima-Ribeiro, M.S., Mendoza-Rodriguez, V.H., and Terribile, L.C. (2025). Reviewing the great american biotic interchange: Climate change as a trigger for biodiversity dispersal. Proceedings of the Royal Society B: Biological Sciences</w:t>
       </w:r>
       <w:r>
         <w:t xml:space="preserve"> </w:t>
@@ -4788,6 +4797,52 @@
           <w:i/>
           <w:iCs/>
         </w:rPr>
+        <w:t xml:space="preserve">292</w:t>
+      </w:r>
+      <w:r>
+        <w:t xml:space="preserve">, 20251745.</w:t>
+      </w:r>
+      <w:r>
+        <w:t xml:space="preserve"> </w:t>
+      </w:r>
+      <w:hyperlink r:id="rId88">
+        <w:r>
+          <w:rPr>
+            <w:rStyle w:val="Hyperlink"/>
+          </w:rPr>
+          <w:t xml:space="preserve">https://doi.org/10.1098/rspb.2025.1745</w:t>
+        </w:r>
+      </w:hyperlink>
+      <w:r>
+        <w:t xml:space="preserve">.</w:t>
+      </w:r>
+    </w:p>
+    <w:bookmarkEnd w:id="89"/>
+    <w:bookmarkStart w:id="91" w:name="ref-pilowsky2022"/>
+    <w:p>
+      <w:pPr>
+        <w:pStyle w:val="Bibliography"/>
+      </w:pPr>
+      <w:r>
+        <w:t xml:space="preserve">29.</w:t>
+      </w:r>
+      <w:r>
+        <w:t xml:space="preserve"> </w:t>
+      </w:r>
+      <w:r>
+        <w:t xml:space="preserve">	</w:t>
+      </w:r>
+      <w:r>
+        <w:t xml:space="preserve">Pilowsky, J.A., Colwell, R.K., Rahbek, C., and Fordham, D.A. (2022). Process-explicit models reveal the structure and dynamics of biodiversity patterns. Science Advances</w:t>
+      </w:r>
+      <w:r>
+        <w:t xml:space="preserve"> </w:t>
+      </w:r>
+      <w:r>
+        <w:rPr>
+          <w:i/>
+          <w:iCs/>
+        </w:rPr>
         <w:t xml:space="preserve">8</w:t>
       </w:r>
       <w:r>
@@ -4796,7 +4851,7 @@
       <w:r>
         <w:t xml:space="preserve"> </w:t>
       </w:r>
-      <w:hyperlink r:id="rId86">
+      <w:hyperlink r:id="rId90">
         <w:r>
           <w:rPr>
             <w:rStyle w:val="Hyperlink"/>
@@ -4808,14 +4863,14 @@
         <w:t xml:space="preserve">.</w:t>
       </w:r>
     </w:p>
-    <w:bookmarkEnd w:id="87"/>
-    <w:bookmarkStart w:id="89" w:name="ref-hagen2023"/>
+    <w:bookmarkEnd w:id="91"/>
+    <w:bookmarkStart w:id="93" w:name="ref-hagen2023"/>
     <w:p>
       <w:pPr>
         <w:pStyle w:val="Bibliography"/>
       </w:pPr>
       <w:r>
-        <w:t xml:space="preserve">28.</w:t>
+        <w:t xml:space="preserve">30.</w:t>
       </w:r>
       <w:r>
         <w:t xml:space="preserve"> </w:t>
@@ -4842,7 +4897,7 @@
       <w:r>
         <w:t xml:space="preserve"> </w:t>
       </w:r>
-      <w:hyperlink r:id="rId88">
+      <w:hyperlink r:id="rId92">
         <w:r>
           <w:rPr>
             <w:rStyle w:val="Hyperlink"/>
@@ -4854,14 +4909,14 @@
         <w:t xml:space="preserve">.</w:t>
       </w:r>
     </w:p>
-    <w:bookmarkEnd w:id="89"/>
-    <w:bookmarkStart w:id="91" w:name="ref-hagen2021"/>
+    <w:bookmarkEnd w:id="93"/>
+    <w:bookmarkStart w:id="95" w:name="ref-hagen2021"/>
     <w:p>
       <w:pPr>
         <w:pStyle w:val="Bibliography"/>
       </w:pPr>
       <w:r>
-        <w:t xml:space="preserve">29.</w:t>
+        <w:t xml:space="preserve">31.</w:t>
       </w:r>
       <w:r>
         <w:t xml:space="preserve"> </w:t>
@@ -4894,7 +4949,7 @@
       <w:r>
         <w:t xml:space="preserve"> </w:t>
       </w:r>
-      <w:hyperlink r:id="rId90">
+      <w:hyperlink r:id="rId94">
         <w:r>
           <w:rPr>
             <w:rStyle w:val="Hyperlink"/>
@@ -4906,14 +4961,14 @@
         <w:t xml:space="preserve">.</w:t>
       </w:r>
     </w:p>
-    <w:bookmarkEnd w:id="91"/>
-    <w:bookmarkStart w:id="93" w:name="ref-lorcery2025"/>
+    <w:bookmarkEnd w:id="95"/>
+    <w:bookmarkStart w:id="97" w:name="ref-lorcery2025"/>
     <w:p>
       <w:pPr>
         <w:pStyle w:val="Bibliography"/>
       </w:pPr>
       <w:r>
-        <w:t xml:space="preserve">30.</w:t>
+        <w:t xml:space="preserve">32.</w:t>
       </w:r>
       <w:r>
         <w:t xml:space="preserve"> </w:t>
@@ -4940,7 +4995,7 @@
       <w:r>
         <w:t xml:space="preserve"> </w:t>
       </w:r>
-      <w:hyperlink r:id="rId92">
+      <w:hyperlink r:id="rId96">
         <w:r>
           <w:rPr>
             <w:rStyle w:val="Hyperlink"/>
@@ -4952,14 +5007,14 @@
         <w:t xml:space="preserve">.</w:t>
       </w:r>
     </w:p>
-    <w:bookmarkEnd w:id="93"/>
-    <w:bookmarkStart w:id="95" w:name="ref-hagen2021b"/>
+    <w:bookmarkEnd w:id="97"/>
+    <w:bookmarkStart w:id="99" w:name="ref-hagen2021b"/>
     <w:p>
       <w:pPr>
         <w:pStyle w:val="Bibliography"/>
       </w:pPr>
       <w:r>
-        <w:t xml:space="preserve">31.</w:t>
+        <w:t xml:space="preserve">33.</w:t>
       </w:r>
       <w:r>
         <w:t xml:space="preserve"> </w:t>
@@ -4986,7 +5041,7 @@
       <w:r>
         <w:t xml:space="preserve"> </w:t>
       </w:r>
-      <w:hyperlink r:id="rId94">
+      <w:hyperlink r:id="rId98">
         <w:r>
           <w:rPr>
             <w:rStyle w:val="Hyperlink"/>
@@ -4998,14 +5053,14 @@
         <w:t xml:space="preserve">.</w:t>
       </w:r>
     </w:p>
-    <w:bookmarkEnd w:id="95"/>
-    <w:bookmarkStart w:id="97" w:name="ref-skeels2023b"/>
+    <w:bookmarkEnd w:id="99"/>
+    <w:bookmarkStart w:id="101" w:name="ref-skeels2023b"/>
     <w:p>
       <w:pPr>
         <w:pStyle w:val="Bibliography"/>
       </w:pPr>
       <w:r>
-        <w:t xml:space="preserve">32.</w:t>
+        <w:t xml:space="preserve">34.</w:t>
       </w:r>
       <w:r>
         <w:t xml:space="preserve"> </w:t>
@@ -5032,7 +5087,7 @@
       <w:r>
         <w:t xml:space="preserve"> </w:t>
       </w:r>
-      <w:hyperlink r:id="rId96">
+      <w:hyperlink r:id="rId100">
         <w:r>
           <w:rPr>
             <w:rStyle w:val="Hyperlink"/>
@@ -5044,14 +5099,14 @@
         <w:t xml:space="preserve">.</w:t>
       </w:r>
     </w:p>
-    <w:bookmarkEnd w:id="97"/>
-    <w:bookmarkStart w:id="99" w:name="ref-boschman2023"/>
+    <w:bookmarkEnd w:id="101"/>
+    <w:bookmarkStart w:id="103" w:name="ref-boschman2023"/>
     <w:p>
       <w:pPr>
         <w:pStyle w:val="Bibliography"/>
       </w:pPr>
       <w:r>
-        <w:t xml:space="preserve">33.</w:t>
+        <w:t xml:space="preserve">35.</w:t>
       </w:r>
       <w:r>
         <w:t xml:space="preserve"> </w:t>
@@ -5078,7 +5133,7 @@
       <w:r>
         <w:t xml:space="preserve"> </w:t>
       </w:r>
-      <w:hyperlink r:id="rId98">
+      <w:hyperlink r:id="rId102">
         <w:r>
           <w:rPr>
             <w:rStyle w:val="Hyperlink"/>
@@ -5090,14 +5145,14 @@
         <w:t xml:space="preserve">.</w:t>
       </w:r>
     </w:p>
-    <w:bookmarkEnd w:id="99"/>
-    <w:bookmarkStart w:id="101" w:name="ref-skeels2023"/>
+    <w:bookmarkEnd w:id="103"/>
+    <w:bookmarkStart w:id="105" w:name="ref-skeels2023"/>
     <w:p>
       <w:pPr>
         <w:pStyle w:val="Bibliography"/>
       </w:pPr>
       <w:r>
-        <w:t xml:space="preserve">34.</w:t>
+        <w:t xml:space="preserve">36.</w:t>
       </w:r>
       <w:r>
         <w:t xml:space="preserve"> </w:t>
@@ -5124,7 +5179,7 @@
       <w:r>
         <w:t xml:space="preserve"> </w:t>
       </w:r>
-      <w:hyperlink r:id="rId100">
+      <w:hyperlink r:id="rId104">
         <w:r>
           <w:rPr>
             <w:rStyle w:val="Hyperlink"/>
@@ -5136,14 +5191,14 @@
         <w:t xml:space="preserve">.</w:t>
       </w:r>
     </w:p>
-    <w:bookmarkEnd w:id="101"/>
-    <w:bookmarkStart w:id="103" w:name="ref-liu2024"/>
+    <w:bookmarkEnd w:id="105"/>
+    <w:bookmarkStart w:id="107" w:name="ref-liu2024"/>
     <w:p>
       <w:pPr>
         <w:pStyle w:val="Bibliography"/>
       </w:pPr>
       <w:r>
-        <w:t xml:space="preserve">35.</w:t>
+        <w:t xml:space="preserve">37.</w:t>
       </w:r>
       <w:r>
         <w:t xml:space="preserve"> </w:t>
@@ -5170,7 +5225,7 @@
       <w:r>
         <w:t xml:space="preserve"> </w:t>
       </w:r>
-      <w:hyperlink r:id="rId102">
+      <w:hyperlink r:id="rId106">
         <w:r>
           <w:rPr>
             <w:rStyle w:val="Hyperlink"/>
@@ -5182,14 +5237,14 @@
         <w:t xml:space="preserve">.</w:t>
       </w:r>
     </w:p>
-    <w:bookmarkEnd w:id="103"/>
-    <w:bookmarkStart w:id="105" w:name="ref-holden2019"/>
+    <w:bookmarkEnd w:id="107"/>
+    <w:bookmarkStart w:id="109" w:name="ref-holden2019"/>
     <w:p>
       <w:pPr>
         <w:pStyle w:val="Bibliography"/>
       </w:pPr>
       <w:r>
-        <w:t xml:space="preserve">36.</w:t>
+        <w:t xml:space="preserve">38.</w:t>
       </w:r>
       <w:r>
         <w:t xml:space="preserve"> </w:t>
@@ -5216,7 +5271,7 @@
       <w:r>
         <w:t xml:space="preserve">, 5137–5155. https://doi.org/</w:t>
       </w:r>
-      <w:hyperlink r:id="rId104">
+      <w:hyperlink r:id="rId108">
         <w:r>
           <w:rPr>
             <w:rStyle w:val="Hyperlink"/>
@@ -5228,14 +5283,14 @@
         <w:t xml:space="preserve">.</w:t>
       </w:r>
     </w:p>
-    <w:bookmarkEnd w:id="105"/>
-    <w:bookmarkStart w:id="107" w:name="ref-barreto2023"/>
+    <w:bookmarkEnd w:id="109"/>
+    <w:bookmarkStart w:id="111" w:name="ref-barreto2023"/>
     <w:p>
       <w:pPr>
         <w:pStyle w:val="Bibliography"/>
       </w:pPr>
       <w:r>
-        <w:t xml:space="preserve">37.</w:t>
+        <w:t xml:space="preserve">39.</w:t>
       </w:r>
       <w:r>
         <w:t xml:space="preserve"> </w:t>
@@ -5262,7 +5317,7 @@
       <w:r>
         <w:t xml:space="preserve"> </w:t>
       </w:r>
-      <w:hyperlink r:id="rId106">
+      <w:hyperlink r:id="rId110">
         <w:r>
           <w:rPr>
             <w:rStyle w:val="Hyperlink"/>
@@ -5274,14 +5329,14 @@
         <w:t xml:space="preserve">.</w:t>
       </w:r>
     </w:p>
-    <w:bookmarkEnd w:id="107"/>
-    <w:bookmarkStart w:id="109" w:name="ref-beck2018"/>
+    <w:bookmarkEnd w:id="111"/>
+    <w:bookmarkStart w:id="113" w:name="ref-beck2018"/>
     <w:p>
       <w:pPr>
         <w:pStyle w:val="Bibliography"/>
       </w:pPr>
       <w:r>
-        <w:t xml:space="preserve">38.</w:t>
+        <w:t xml:space="preserve">40.</w:t>
       </w:r>
       <w:r>
         <w:t xml:space="preserve"> </w:t>
@@ -5308,7 +5363,7 @@
       <w:r>
         <w:t xml:space="preserve"> </w:t>
       </w:r>
-      <w:hyperlink r:id="rId108">
+      <w:hyperlink r:id="rId112">
         <w:r>
           <w:rPr>
             <w:rStyle w:val="Hyperlink"/>
@@ -5320,14 +5375,14 @@
         <w:t xml:space="preserve">.</w:t>
       </w:r>
     </w:p>
-    <w:bookmarkEnd w:id="109"/>
-    <w:bookmarkStart w:id="111" w:name="ref-galván2023"/>
+    <w:bookmarkEnd w:id="113"/>
+    <w:bookmarkStart w:id="115" w:name="ref-galván2023"/>
     <w:p>
       <w:pPr>
         <w:pStyle w:val="Bibliography"/>
       </w:pPr>
       <w:r>
-        <w:t xml:space="preserve">39.</w:t>
+        <w:t xml:space="preserve">41.</w:t>
       </w:r>
       <w:r>
         <w:t xml:space="preserve"> </w:t>
@@ -5341,7 +5396,7 @@
       <w:r>
         <w:t xml:space="preserve"> </w:t>
       </w:r>
-      <w:hyperlink r:id="rId110">
+      <w:hyperlink r:id="rId114">
         <w:r>
           <w:rPr>
             <w:rStyle w:val="Hyperlink"/>
@@ -5350,14 +5405,14 @@
         </w:r>
       </w:hyperlink>
     </w:p>
-    <w:bookmarkEnd w:id="111"/>
-    <w:bookmarkStart w:id="113" w:name="ref-chakrabarty2011"/>
+    <w:bookmarkEnd w:id="115"/>
+    <w:bookmarkStart w:id="116" w:name="ref-macarthur1967"/>
     <w:p>
       <w:pPr>
         <w:pStyle w:val="Bibliography"/>
       </w:pPr>
       <w:r>
-        <w:t xml:space="preserve">40.</w:t>
+        <w:t xml:space="preserve">42.</w:t>
       </w:r>
       <w:r>
         <w:t xml:space="preserve"> </w:t>
@@ -5366,12 +5421,123 @@
         <w:t xml:space="preserve">	</w:t>
       </w:r>
       <w:r>
+        <w:t xml:space="preserve">MacArthur, R.H., and Wilson, E.O. (1967). The theory of island biogeography Princeton University Press.</w:t>
+      </w:r>
+    </w:p>
+    <w:bookmarkEnd w:id="116"/>
+    <w:bookmarkStart w:id="118" w:name="ref-willig2003"/>
+    <w:p>
+      <w:pPr>
+        <w:pStyle w:val="Bibliography"/>
+      </w:pPr>
+      <w:r>
+        <w:t xml:space="preserve">43.</w:t>
+      </w:r>
+      <w:r>
+        <w:t xml:space="preserve"> </w:t>
+      </w:r>
+      <w:r>
+        <w:t xml:space="preserve">	</w:t>
+      </w:r>
+      <w:r>
+        <w:t xml:space="preserve">Willig, M.R., Kaufman, D.M., and Stevens, R.D. (2003). Latitudinal gradients of biodiversity: Pattern, process, scale, and synthesis. Annual Review of Ecology, Evolution, and Systematics</w:t>
+      </w:r>
+      <w:r>
+        <w:t xml:space="preserve"> </w:t>
+      </w:r>
+      <w:r>
+        <w:rPr>
+          <w:i/>
+          <w:iCs/>
+        </w:rPr>
+        <w:t xml:space="preserve">34</w:t>
+      </w:r>
+      <w:r>
+        <w:t xml:space="preserve">, 273–309.</w:t>
+      </w:r>
+      <w:r>
+        <w:t xml:space="preserve"> </w:t>
+      </w:r>
+      <w:hyperlink r:id="rId117">
+        <w:r>
+          <w:rPr>
+            <w:rStyle w:val="Hyperlink"/>
+          </w:rPr>
+          <w:t xml:space="preserve">https://doi.org/10.1146/annurev.ecolsys.34.012103.144032</w:t>
+        </w:r>
+      </w:hyperlink>
+      <w:r>
+        <w:t xml:space="preserve">.</w:t>
+      </w:r>
+    </w:p>
+    <w:bookmarkEnd w:id="118"/>
+    <w:bookmarkStart w:id="120" w:name="ref-raven2020"/>
+    <w:p>
+      <w:pPr>
+        <w:pStyle w:val="Bibliography"/>
+      </w:pPr>
+      <w:r>
+        <w:t xml:space="preserve">44.</w:t>
+      </w:r>
+      <w:r>
+        <w:t xml:space="preserve"> </w:t>
+      </w:r>
+      <w:r>
+        <w:t xml:space="preserve">	</w:t>
+      </w:r>
+      <w:r>
+        <w:t xml:space="preserve">Raven, P.H., Gereau, R.E., Phillipson, P.B., Chatelain, C., Jenkins, C.N., and Ulloa Ulloa, C. (2020). The distribution of biodiversity richness in the tropics. Science Advances</w:t>
+      </w:r>
+      <w:r>
+        <w:t xml:space="preserve"> </w:t>
+      </w:r>
+      <w:r>
+        <w:rPr>
+          <w:i/>
+          <w:iCs/>
+        </w:rPr>
+        <w:t xml:space="preserve">6</w:t>
+      </w:r>
+      <w:r>
+        <w:t xml:space="preserve">, eabc6228.</w:t>
+      </w:r>
+      <w:r>
+        <w:t xml:space="preserve"> </w:t>
+      </w:r>
+      <w:hyperlink r:id="rId119">
+        <w:r>
+          <w:rPr>
+            <w:rStyle w:val="Hyperlink"/>
+          </w:rPr>
+          <w:t xml:space="preserve">https://doi.org/10.1126/sciadv.abc6228</w:t>
+        </w:r>
+      </w:hyperlink>
+      <w:r>
+        <w:t xml:space="preserve">.</w:t>
+      </w:r>
+    </w:p>
+    <w:bookmarkEnd w:id="120"/>
+    <w:bookmarkStart w:id="122" w:name="ref-chakrabarty2011"/>
+    <w:p>
+      <w:pPr>
+        <w:pStyle w:val="Bibliography"/>
+      </w:pPr>
+      <w:r>
+        <w:t xml:space="preserve">45.</w:t>
+      </w:r>
+      <w:r>
+        <w:t xml:space="preserve"> </w:t>
+      </w:r>
+      <w:r>
+        <w:t xml:space="preserve">	</w:t>
+      </w:r>
+      <w:r>
         <w:t xml:space="preserve">Chakrabarty, P., and Albert, J.S. (2011). Not so fast: A new take on the great american biotic interchange. In, J. Albert, ed. (University of California Press), p. 0.</w:t>
       </w:r>
       <w:r>
         <w:t xml:space="preserve"> </w:t>
       </w:r>
-      <w:hyperlink r:id="rId112">
+      <w:hyperlink r:id="rId121">
         <w:r>
           <w:rPr>
             <w:rStyle w:val="Hyperlink"/>
@@ -5383,14 +5549,14 @@
         <w:t xml:space="preserve">.</w:t>
       </w:r>
     </w:p>
-    <w:bookmarkEnd w:id="113"/>
-    <w:bookmarkStart w:id="115" w:name="ref-weir2009"/>
+    <w:bookmarkEnd w:id="122"/>
+    <w:bookmarkStart w:id="124" w:name="ref-weir2009"/>
     <w:p>
       <w:pPr>
         <w:pStyle w:val="Bibliography"/>
       </w:pPr>
       <w:r>
-        <w:t xml:space="preserve">41.</w:t>
+        <w:t xml:space="preserve">46.</w:t>
       </w:r>
       <w:r>
         <w:t xml:space="preserve"> </w:t>
@@ -5417,7 +5583,7 @@
       <w:r>
         <w:t xml:space="preserve"> </w:t>
       </w:r>
-      <w:hyperlink r:id="rId114">
+      <w:hyperlink r:id="rId123">
         <w:r>
           <w:rPr>
             <w:rStyle w:val="Hyperlink"/>
@@ -5429,14 +5595,14 @@
         <w:t xml:space="preserve">.</w:t>
       </w:r>
     </w:p>
-    <w:bookmarkEnd w:id="115"/>
-    <w:bookmarkStart w:id="117" w:name="ref-tilstonsmith2010"/>
+    <w:bookmarkEnd w:id="124"/>
+    <w:bookmarkStart w:id="126" w:name="ref-tilstonsmith2010"/>
     <w:p>
       <w:pPr>
         <w:pStyle w:val="Bibliography"/>
       </w:pPr>
       <w:r>
-        <w:t xml:space="preserve">42.</w:t>
+        <w:t xml:space="preserve">47.</w:t>
       </w:r>
       <w:r>
         <w:t xml:space="preserve"> </w:t>
@@ -5463,7 +5629,7 @@
       <w:r>
         <w:t xml:space="preserve"> </w:t>
       </w:r>
-      <w:hyperlink r:id="rId116">
+      <w:hyperlink r:id="rId125">
         <w:r>
           <w:rPr>
             <w:rStyle w:val="Hyperlink"/>
@@ -5475,14 +5641,14 @@
         <w:t xml:space="preserve">.</w:t>
       </w:r>
     </w:p>
-    <w:bookmarkEnd w:id="117"/>
-    <w:bookmarkStart w:id="118" w:name="ref-macarthur1967"/>
+    <w:bookmarkEnd w:id="126"/>
+    <w:bookmarkStart w:id="128" w:name="ref-haffer1969"/>
     <w:p>
       <w:pPr>
         <w:pStyle w:val="Bibliography"/>
       </w:pPr>
       <w:r>
-        <w:t xml:space="preserve">43.</w:t>
+        <w:t xml:space="preserve">48.</w:t>
       </w:r>
       <w:r>
         <w:t xml:space="preserve"> </w:t>
@@ -5491,26 +5657,7 @@
         <w:t xml:space="preserve">	</w:t>
       </w:r>
       <w:r>
-        <w:t xml:space="preserve">MacArthur, R.H., and Wilson, E.O. (1967). The theory of island biogeography Princeton University Press.</w:t>
-      </w:r>
-    </w:p>
-    <w:bookmarkEnd w:id="118"/>
-    <w:bookmarkStart w:id="120" w:name="ref-willig2003"/>
-    <w:p>
-      <w:pPr>
-        <w:pStyle w:val="Bibliography"/>
-      </w:pPr>
-      <w:r>
-        <w:t xml:space="preserve">44.</w:t>
-      </w:r>
-      <w:r>
-        <w:t xml:space="preserve"> </w:t>
-      </w:r>
-      <w:r>
-        <w:t xml:space="preserve">	</w:t>
-      </w:r>
-      <w:r>
-        <w:t xml:space="preserve">Willig, M.R., Kaufman, D.M., and Stevens, R.D. (2003). Latitudinal gradients of biodiversity: Pattern, process, scale, and synthesis. Annual Review of Ecology, Evolution, and Systematics</w:t>
+        <w:t xml:space="preserve">Haffer, J. (1969). Speciation in amazonian forest birds. Science</w:t>
       </w:r>
       <w:r>
         <w:t xml:space="preserve"> </w:t>
@@ -5520,98 +5667,6 @@
           <w:i/>
           <w:iCs/>
         </w:rPr>
-        <w:t xml:space="preserve">34</w:t>
-      </w:r>
-      <w:r>
-        <w:t xml:space="preserve">, 273–309.</w:t>
-      </w:r>
-      <w:r>
-        <w:t xml:space="preserve"> </w:t>
-      </w:r>
-      <w:hyperlink r:id="rId119">
-        <w:r>
-          <w:rPr>
-            <w:rStyle w:val="Hyperlink"/>
-          </w:rPr>
-          <w:t xml:space="preserve">https://doi.org/10.1146/annurev.ecolsys.34.012103.144032</w:t>
-        </w:r>
-      </w:hyperlink>
-      <w:r>
-        <w:t xml:space="preserve">.</w:t>
-      </w:r>
-    </w:p>
-    <w:bookmarkEnd w:id="120"/>
-    <w:bookmarkStart w:id="122" w:name="ref-raven2020"/>
-    <w:p>
-      <w:pPr>
-        <w:pStyle w:val="Bibliography"/>
-      </w:pPr>
-      <w:r>
-        <w:t xml:space="preserve">45.</w:t>
-      </w:r>
-      <w:r>
-        <w:t xml:space="preserve"> </w:t>
-      </w:r>
-      <w:r>
-        <w:t xml:space="preserve">	</w:t>
-      </w:r>
-      <w:r>
-        <w:t xml:space="preserve">Raven, P.H., Gereau, R.E., Phillipson, P.B., Chatelain, C., Jenkins, C.N., and Ulloa Ulloa, C. (2020). The distribution of biodiversity richness in the tropics. Science Advances</w:t>
-      </w:r>
-      <w:r>
-        <w:t xml:space="preserve"> </w:t>
-      </w:r>
-      <w:r>
-        <w:rPr>
-          <w:i/>
-          <w:iCs/>
-        </w:rPr>
-        <w:t xml:space="preserve">6</w:t>
-      </w:r>
-      <w:r>
-        <w:t xml:space="preserve">, eabc6228.</w:t>
-      </w:r>
-      <w:r>
-        <w:t xml:space="preserve"> </w:t>
-      </w:r>
-      <w:hyperlink r:id="rId121">
-        <w:r>
-          <w:rPr>
-            <w:rStyle w:val="Hyperlink"/>
-          </w:rPr>
-          <w:t xml:space="preserve">https://doi.org/10.1126/sciadv.abc6228</w:t>
-        </w:r>
-      </w:hyperlink>
-      <w:r>
-        <w:t xml:space="preserve">.</w:t>
-      </w:r>
-    </w:p>
-    <w:bookmarkEnd w:id="122"/>
-    <w:bookmarkStart w:id="124" w:name="ref-haffer1969"/>
-    <w:p>
-      <w:pPr>
-        <w:pStyle w:val="Bibliography"/>
-      </w:pPr>
-      <w:r>
-        <w:t xml:space="preserve">46.</w:t>
-      </w:r>
-      <w:r>
-        <w:t xml:space="preserve"> </w:t>
-      </w:r>
-      <w:r>
-        <w:t xml:space="preserve">	</w:t>
-      </w:r>
-      <w:r>
-        <w:t xml:space="preserve">Haffer, J. (1969). Speciation in amazonian forest birds. Science</w:t>
-      </w:r>
-      <w:r>
-        <w:t xml:space="preserve"> </w:t>
-      </w:r>
-      <w:r>
-        <w:rPr>
-          <w:i/>
-          <w:iCs/>
-        </w:rPr>
         <w:t xml:space="preserve">165</w:t>
       </w:r>
       <w:r>
@@ -5620,7 +5675,7 @@
       <w:r>
         <w:t xml:space="preserve"> </w:t>
       </w:r>
-      <w:hyperlink r:id="rId123">
+      <w:hyperlink r:id="rId127">
         <w:r>
           <w:rPr>
             <w:rStyle w:val="Hyperlink"/>
@@ -5632,14 +5687,14 @@
         <w:t xml:space="preserve">.</w:t>
       </w:r>
     </w:p>
-    <w:bookmarkEnd w:id="124"/>
-    <w:bookmarkStart w:id="126" w:name="ref-cruz2025"/>
+    <w:bookmarkEnd w:id="128"/>
+    <w:bookmarkStart w:id="130" w:name="ref-cruz2025"/>
     <w:p>
       <w:pPr>
         <w:pStyle w:val="Bibliography"/>
       </w:pPr>
       <w:r>
-        <w:t xml:space="preserve">47.</w:t>
+        <w:t xml:space="preserve">49.</w:t>
       </w:r>
       <w:r>
         <w:t xml:space="preserve"> </w:t>
@@ -5663,7 +5718,7 @@
       <w:r>
         <w:t xml:space="preserve">, e24051. https://doi.org/</w:t>
       </w:r>
-      <w:hyperlink r:id="rId125">
+      <w:hyperlink r:id="rId129">
         <w:r>
           <w:rPr>
             <w:rStyle w:val="Hyperlink"/>
@@ -5675,14 +5730,14 @@
         <w:t xml:space="preserve">.</w:t>
       </w:r>
     </w:p>
-    <w:bookmarkEnd w:id="126"/>
-    <w:bookmarkStart w:id="128" w:name="ref-pino2022"/>
+    <w:bookmarkEnd w:id="130"/>
+    <w:bookmarkStart w:id="132" w:name="ref-pino2022"/>
     <w:p>
       <w:pPr>
         <w:pStyle w:val="Bibliography"/>
       </w:pPr>
       <w:r>
-        <w:t xml:space="preserve">48.</w:t>
+        <w:t xml:space="preserve">50.</w:t>
       </w:r>
       <w:r>
         <w:t xml:space="preserve"> </w:t>
@@ -5709,7 +5764,7 @@
       <w:r>
         <w:t xml:space="preserve"> </w:t>
       </w:r>
-      <w:hyperlink r:id="rId127">
+      <w:hyperlink r:id="rId131">
         <w:r>
           <w:rPr>
             <w:rStyle w:val="Hyperlink"/>
@@ -5721,14 +5776,14 @@
         <w:t xml:space="preserve">.</w:t>
       </w:r>
     </w:p>
-    <w:bookmarkEnd w:id="128"/>
-    <w:bookmarkStart w:id="130" w:name="ref-motta2025"/>
+    <w:bookmarkEnd w:id="132"/>
+    <w:bookmarkStart w:id="134" w:name="ref-motta2025"/>
     <w:p>
       <w:pPr>
         <w:pStyle w:val="Bibliography"/>
       </w:pPr>
       <w:r>
-        <w:t xml:space="preserve">49.</w:t>
+        <w:t xml:space="preserve">51.</w:t>
       </w:r>
       <w:r>
         <w:t xml:space="preserve"> </w:t>
@@ -5755,7 +5810,7 @@
       <w:r>
         <w:t xml:space="preserve"> </w:t>
       </w:r>
-      <w:hyperlink r:id="rId129">
+      <w:hyperlink r:id="rId133">
         <w:r>
           <w:rPr>
             <w:rStyle w:val="Hyperlink"/>
@@ -5767,14 +5822,14 @@
         <w:t xml:space="preserve">.</w:t>
       </w:r>
     </w:p>
-    <w:bookmarkEnd w:id="130"/>
-    <w:bookmarkStart w:id="132" w:name="ref-morgan1993"/>
+    <w:bookmarkEnd w:id="134"/>
+    <w:bookmarkStart w:id="136" w:name="ref-morgan1993"/>
     <w:p>
       <w:pPr>
         <w:pStyle w:val="Bibliography"/>
       </w:pPr>
       <w:r>
-        <w:t xml:space="preserve">50.</w:t>
+        <w:t xml:space="preserve">52.</w:t>
       </w:r>
       <w:r>
         <w:t xml:space="preserve"> </w:t>
@@ -5788,7 +5843,7 @@
       <w:r>
         <w:t xml:space="preserve"> </w:t>
       </w:r>
-      <w:hyperlink r:id="rId131">
+      <w:hyperlink r:id="rId135">
         <w:r>
           <w:rPr>
             <w:rStyle w:val="Hyperlink"/>
@@ -5800,14 +5855,14 @@
         <w:t xml:space="preserve">.</w:t>
       </w:r>
     </w:p>
-    <w:bookmarkEnd w:id="132"/>
-    <w:bookmarkStart w:id="134" w:name="ref-ali2021b"/>
+    <w:bookmarkEnd w:id="136"/>
+    <w:bookmarkStart w:id="138" w:name="ref-ali2021b"/>
     <w:p>
       <w:pPr>
         <w:pStyle w:val="Bibliography"/>
       </w:pPr>
       <w:r>
-        <w:t xml:space="preserve">51.</w:t>
+        <w:t xml:space="preserve">53.</w:t>
       </w:r>
       <w:r>
         <w:t xml:space="preserve"> </w:t>
@@ -5846,7 +5901,7 @@
       <w:r>
         <w:t xml:space="preserve"> </w:t>
       </w:r>
-      <w:hyperlink r:id="rId133">
+      <w:hyperlink r:id="rId137">
         <w:r>
           <w:rPr>
             <w:rStyle w:val="Hyperlink"/>
@@ -5858,14 +5913,14 @@
         <w:t xml:space="preserve">.</w:t>
       </w:r>
     </w:p>
-    <w:bookmarkEnd w:id="134"/>
-    <w:bookmarkStart w:id="136" w:name="ref-cornée2021"/>
+    <w:bookmarkEnd w:id="138"/>
+    <w:bookmarkStart w:id="140" w:name="ref-cornée2021"/>
     <w:p>
       <w:pPr>
         <w:pStyle w:val="Bibliography"/>
       </w:pPr>
       <w:r>
-        <w:t xml:space="preserve">52.</w:t>
+        <w:t xml:space="preserve">54.</w:t>
       </w:r>
       <w:r>
         <w:t xml:space="preserve"> </w:t>
@@ -5892,7 +5947,7 @@
       <w:r>
         <w:t xml:space="preserve"> </w:t>
       </w:r>
-      <w:hyperlink r:id="rId135">
+      <w:hyperlink r:id="rId139">
         <w:r>
           <w:rPr>
             <w:rStyle w:val="Hyperlink"/>
@@ -5904,14 +5959,14 @@
         <w:t xml:space="preserve">.</w:t>
       </w:r>
     </w:p>
-    <w:bookmarkEnd w:id="136"/>
-    <w:bookmarkStart w:id="138" w:name="ref-warren2015"/>
+    <w:bookmarkEnd w:id="140"/>
+    <w:bookmarkStart w:id="142" w:name="ref-warren2015"/>
     <w:p>
       <w:pPr>
         <w:pStyle w:val="Bibliography"/>
       </w:pPr>
       <w:r>
-        <w:t xml:space="preserve">53.</w:t>
+        <w:t xml:space="preserve">55.</w:t>
       </w:r>
       <w:r>
         <w:t xml:space="preserve"> </w:t>
@@ -5938,7 +5993,7 @@
       <w:r>
         <w:t xml:space="preserve"> </w:t>
       </w:r>
-      <w:hyperlink r:id="rId137">
+      <w:hyperlink r:id="rId141">
         <w:r>
           <w:rPr>
             <w:rStyle w:val="Hyperlink"/>
@@ -5950,14 +6005,14 @@
         <w:t xml:space="preserve">.</w:t>
       </w:r>
     </w:p>
-    <w:bookmarkEnd w:id="138"/>
-    <w:bookmarkStart w:id="140" w:name="ref-gearty2023"/>
+    <w:bookmarkEnd w:id="142"/>
+    <w:bookmarkStart w:id="144" w:name="ref-gearty2023"/>
     <w:p>
       <w:pPr>
         <w:pStyle w:val="Bibliography"/>
       </w:pPr>
       <w:r>
-        <w:t xml:space="preserve">54.</w:t>
+        <w:t xml:space="preserve">56.</w:t>
       </w:r>
       <w:r>
         <w:t xml:space="preserve"> </w:t>
@@ -5971,7 +6026,7 @@
       <w:r>
         <w:t xml:space="preserve"> </w:t>
       </w:r>
-      <w:hyperlink r:id="rId139">
+      <w:hyperlink r:id="rId143">
         <w:r>
           <w:rPr>
             <w:rStyle w:val="Hyperlink"/>
@@ -5980,10 +6035,10 @@
         </w:r>
       </w:hyperlink>
     </w:p>
-    <w:bookmarkEnd w:id="140"/>
-    <w:bookmarkEnd w:id="141"/>
-    <w:bookmarkEnd w:id="142"/>
-    <w:bookmarkStart w:id="159" w:name="figures"/>
+    <w:bookmarkEnd w:id="144"/>
+    <w:bookmarkEnd w:id="145"/>
+    <w:bookmarkEnd w:id="146"/>
+    <w:bookmarkStart w:id="163" w:name="figures"/>
     <w:p>
       <w:pPr>
         <w:pStyle w:val="Heading1"/>
@@ -6005,7 +6060,7 @@
       <w:tr>
         <w:tc>
           <w:tcPr/>
-          <w:bookmarkStart w:id="146" w:name="fig-framework"/>
+          <w:bookmarkStart w:id="150" w:name="fig-framework"/>
           <w:p>
             <w:pPr>
               <w:pStyle w:val="Compact"/>
@@ -6016,18 +6071,18 @@
                 <wp:inline>
                   <wp:extent cx="3959999" cy="3959999"/>
                   <wp:effectExtent b="0" l="0" r="0" t="0"/>
-                  <wp:docPr descr="" title="" id="144" name="Picture"/>
+                  <wp:docPr descr="" title="" id="148" name="Picture"/>
                   <a:graphic>
                     <a:graphicData uri="http://schemas.openxmlformats.org/drawingml/2006/picture">
                       <pic:pic>
                         <pic:nvPicPr>
-                          <pic:cNvPr descr="../Figures/MS/Main/Figure_framework/Figure_framework.png" id="145" name="Picture"/>
+                          <pic:cNvPr descr="../Figures/MS/Main/Figure_framework/Figure_framework.png" id="149" name="Picture"/>
                           <pic:cNvPicPr>
                             <a:picLocks noChangeArrowheads="1" noChangeAspect="1"/>
                           </pic:cNvPicPr>
                         </pic:nvPicPr>
                         <pic:blipFill>
-                          <a:blip r:embed="rId143"/>
+                          <a:blip r:embed="rId147"/>
                           <a:stretch>
                             <a:fillRect/>
                           </a:stretch>
@@ -6070,7 +6125,7 @@
               <w:rPr>
                 <w:vertAlign w:val="superscript"/>
               </w:rPr>
-              <w:t xml:space="preserve">36</w:t>
+              <w:t xml:space="preserve">38</w:t>
             </w:r>
             <w:r>
               <w:t xml:space="preserve">. This emulator being spatialised at a 1 x 1° resolution, numbers inside the continents represent the quantity of overlaying pixels from the climate grid within each continent. On climate plots, the time frame of the onset of significant land mammal exchange across the americas</w:t>
@@ -6079,7 +6134,7 @@
               <w:rPr>
                 <w:vertAlign w:val="superscript"/>
               </w:rPr>
-              <w:t xml:space="preserve">8,10</w:t>
+              <w:t xml:space="preserve">9,11</w:t>
             </w:r>
             <w:r>
               <w:t xml:space="preserve"> </w:t>
@@ -6091,13 +6146,13 @@
               <w:rPr>
                 <w:vertAlign w:val="superscript"/>
               </w:rPr>
-              <w:t xml:space="preserve">54</w:t>
+              <w:t xml:space="preserve">56</w:t>
             </w:r>
             <w:r>
               <w:t xml:space="preserve">. The empirically-derived asymmetry of the transcontinental land mammal exchange is represented by the thickness of the two arrows, the thicker the arrow, the more intense the exchange.</w:t>
             </w:r>
           </w:p>
-          <w:bookmarkEnd w:id="146"/>
+          <w:bookmarkEnd w:id="150"/>
         </w:tc>
       </w:tr>
     </w:tbl>
@@ -6114,7 +6169,7 @@
       <w:tr>
         <w:tc>
           <w:tcPr/>
-          <w:bookmarkStart w:id="150" w:name="fig-propsuccess"/>
+          <w:bookmarkStart w:id="154" w:name="fig-propsuccess"/>
           <w:p>
             <w:pPr>
               <w:pStyle w:val="Compact"/>
@@ -6125,18 +6180,18 @@
                 <wp:inline>
                   <wp:extent cx="3599999" cy="3779999"/>
                   <wp:effectExtent b="0" l="0" r="0" t="0"/>
-                  <wp:docPr descr="" title="" id="148" name="Picture"/>
+                  <wp:docPr descr="" title="" id="152" name="Picture"/>
                   <a:graphic>
                     <a:graphicData uri="http://schemas.openxmlformats.org/drawingml/2006/picture">
                       <pic:pic>
                         <pic:nvPicPr>
-                          <pic:cNvPr descr="../Figures/MS/Main/Figure_PropSuccess/Figure_PropSuccess.png" id="149" name="Picture"/>
+                          <pic:cNvPr descr="../Figures/MS/Main/Figure_PropSuccess/Figure_PropSuccess.png" id="153" name="Picture"/>
                           <pic:cNvPicPr>
                             <a:picLocks noChangeArrowheads="1" noChangeAspect="1"/>
                           </pic:cNvPicPr>
                         </pic:nvPicPr>
                         <pic:blipFill>
-                          <a:blip r:embed="rId147"/>
+                          <a:blip r:embed="rId151"/>
                           <a:stretch>
                             <a:fillRect/>
                           </a:stretch>
@@ -6237,7 +6292,7 @@
               <w:t xml:space="preserve">). Each individual plot shows the outcome of simulations starting in North (red) and South (cyan) America. Dots represent mean proportion estimates and error bars show their associated Binomial-derived 95% confidence interval.</w:t>
             </w:r>
           </w:p>
-          <w:bookmarkEnd w:id="150"/>
+          <w:bookmarkEnd w:id="154"/>
         </w:tc>
       </w:tr>
     </w:tbl>
@@ -6254,7 +6309,7 @@
       <w:tr>
         <w:tc>
           <w:tcPr/>
-          <w:bookmarkStart w:id="154" w:name="fig-metrics"/>
+          <w:bookmarkStart w:id="158" w:name="fig-metrics"/>
           <w:p>
             <w:pPr>
               <w:pStyle w:val="Compact"/>
@@ -6265,18 +6320,18 @@
                 <wp:inline>
                   <wp:extent cx="5039999" cy="4319999"/>
                   <wp:effectExtent b="0" l="0" r="0" t="0"/>
-                  <wp:docPr descr="" title="" id="152" name="Picture"/>
+                  <wp:docPr descr="" title="" id="156" name="Picture"/>
                   <a:graphic>
                     <a:graphicData uri="http://schemas.openxmlformats.org/drawingml/2006/picture">
                       <pic:pic>
                         <pic:nvPicPr>
-                          <pic:cNvPr descr="../Figures/MS/Main/Figure_metrics/Figure_metrics.png" id="153" name="Picture"/>
+                          <pic:cNvPr descr="../Figures/MS/Main/Figure_metrics/Figure_metrics.png" id="157" name="Picture"/>
                           <pic:cNvPicPr>
                             <a:picLocks noChangeArrowheads="1" noChangeAspect="1"/>
                           </pic:cNvPicPr>
                         </pic:nvPicPr>
                         <pic:blipFill>
-                          <a:blip r:embed="rId151"/>
+                          <a:blip r:embed="rId155"/>
                           <a:stretch>
                             <a:fillRect/>
                           </a:stretch>
@@ -6385,18 +6440,7 @@
               <w:t xml:space="preserve"> </w:t>
             </w:r>
             <w:r>
-              <w:t xml:space="preserve">Colonised</w:t>
-            </w:r>
-            <w:r>
-              <w:t xml:space="preserve"> </w:t>
-            </w:r>
-            <m:oMath>
-              <m:r>
-                <m:t>α</m:t>
-              </m:r>
-            </m:oMath>
-            <w:r>
-              <w:t xml:space="preserve">-diversity, expressed as the natural logarithm of the number of lineages within the colonised area.</w:t>
+              <w:t xml:space="preserve">Colonised diversity, expressed as the natural logarithm of the number of lineages within the colonised area.</w:t>
             </w:r>
             <w:r>
               <w:t xml:space="preserve"> </w:t>
@@ -6438,7 +6482,7 @@
               <w:t xml:space="preserve">., successfully reaching the continent where it did not originate. Mean estimates and their associated Student-derived 95% confidence interval are displayed over their distribution.</w:t>
             </w:r>
           </w:p>
-          <w:bookmarkEnd w:id="154"/>
+          <w:bookmarkEnd w:id="158"/>
         </w:tc>
       </w:tr>
     </w:tbl>
@@ -6455,7 +6499,7 @@
       <w:tr>
         <w:tc>
           <w:tcPr/>
-          <w:bookmarkStart w:id="158" w:name="fig-biome"/>
+          <w:bookmarkStart w:id="162" w:name="fig-biome"/>
           <w:p>
             <w:pPr>
               <w:pStyle w:val="Compact"/>
@@ -6466,18 +6510,18 @@
                 <wp:inline>
                   <wp:extent cx="5399999" cy="5399999"/>
                   <wp:effectExtent b="0" l="0" r="0" t="0"/>
-                  <wp:docPr descr="" title="" id="156" name="Picture"/>
+                  <wp:docPr descr="" title="" id="160" name="Picture"/>
                   <a:graphic>
                     <a:graphicData uri="http://schemas.openxmlformats.org/drawingml/2006/picture">
                       <pic:pic>
                         <pic:nvPicPr>
-                          <pic:cNvPr descr="../Figures/MS/Main/Figure_biomes/Figure_biomes.png" id="157" name="Picture"/>
+                          <pic:cNvPr descr="../Figures/MS/Main/Figure_biomes/Figure_biomes.png" id="161" name="Picture"/>
                           <pic:cNvPicPr>
                             <a:picLocks noChangeArrowheads="1" noChangeAspect="1"/>
                           </pic:cNvPicPr>
                         </pic:nvPicPr>
                         <pic:blipFill>
-                          <a:blip r:embed="rId155"/>
+                          <a:blip r:embed="rId159"/>
                           <a:stretch>
                             <a:fillRect/>
                           </a:stretch>
@@ -6588,11 +6632,11 @@
               <w:t xml:space="preserve">Proportion of successful simulations based on the biome where ancestral species originates, for each modelled scenario-ancestral continent combination. This proportion is expressed as the ratio between the number of successful simulations and the total number of simulations starting from a given biome. Coloured dots and error bars respectively show proportion estimates and their associated Binomial-derived 95% confidence intervals.</w:t>
             </w:r>
           </w:p>
-          <w:bookmarkEnd w:id="158"/>
+          <w:bookmarkEnd w:id="162"/>
         </w:tc>
       </w:tr>
     </w:tbl>
-    <w:bookmarkEnd w:id="159"/>
+    <w:bookmarkEnd w:id="163"/>
     <w:sectPr>
       <w:type w:val="nextPage"/>
       <w:pgSz w:h="15840" w:w="12240"/>

</xml_diff>

<commit_message>
extract abs area distrib
</commit_message>
<xml_diff>
--- a/Manuscript/GABI_palaeo_constraints.docx
+++ b/Manuscript/GABI_palaeo_constraints.docx
@@ -88,24 +88,6 @@
       </w:r>
       <w:r>
         <w:t xml:space="preserve">Buffan¹,</w:t>
-      </w:r>
-      <w:r>
-        <w:t xml:space="preserve"> </w:t>
-      </w:r>
-      <w:r>
-        <w:t xml:space="preserve">Adrián</w:t>
-      </w:r>
-      <w:r>
-        <w:t xml:space="preserve"> </w:t>
-      </w:r>
-      <w:r>
-        <w:t xml:space="preserve">Castro</w:t>
-      </w:r>
-      <w:r>
-        <w:t xml:space="preserve"> </w:t>
-      </w:r>
-      <w:r>
-        <w:t xml:space="preserve">Insua²,</w:t>
       </w:r>
       <w:r>
         <w:t xml:space="preserve"> </w:t>
@@ -2436,13 +2418,13 @@
         <w:t xml:space="preserve">Discussion</w:t>
       </w:r>
     </w:p>
-    <w:bookmarkStart w:id="27" w:name="X29849b2dbddef87ab6d7d6609874808b4e7c498"/>
+    <w:bookmarkStart w:id="27" w:name="X7884168e0fb04c99a5fee66a3bc25e307eaddf5"/>
     <w:p>
       <w:pPr>
         <w:pStyle w:val="Heading2"/>
       </w:pPr>
       <w:r>
-        <w:t xml:space="preserve">An inverse asymmetry of exchange probability across both sides of the isthmus driven by climate</w:t>
+        <w:t xml:space="preserve">An inverse asymmetry of exchange driven by climate</w:t>
       </w:r>
     </w:p>
     <w:p>
@@ -2498,7 +2480,7 @@
         <w:t xml:space="preserve">19</w:t>
       </w:r>
       <w:r>
-        <w:t xml:space="preserve">, suggesting that filters other than climatic must have been at play to build this asymmetry.</w:t>
+        <w:t xml:space="preserve">. It may suggest that the asymmetric land mammals exchange that resulted from the GABI must have been shaped by additional factors than climate alone.</w:t>
       </w:r>
     </w:p>
     <w:p>
@@ -2506,7 +2488,7 @@
         <w:pStyle w:val="BodyText"/>
       </w:pPr>
       <w:r>
-        <w:t xml:space="preserve">Seminal works primarily interpreted the empirically-derived asymmetry of the GABI through the lens of MacArthur &amp; Wilson’s equilibrium theory</w:t>
+        <w:t xml:space="preserve">Seminal works primarily interpreted the empirically-derived asymmetry of the GABI through the lens of a continent-wide extension of the MacArthur &amp; Wilson’s equilibrium theory</w:t>
       </w:r>
       <w:r>
         <w:rPr>
@@ -2515,7 +2497,7 @@
         <w:t xml:space="preserve">44</w:t>
       </w:r>
       <w:r>
-        <w:t xml:space="preserve">, but extrapolated to continents. This theory establishes that, on evolutionary timescales, diversity within a given area should tend towards an equilibrium value proportional to the size of this area. It therefore predicts the equilibrium diversity of North America to be larger than that of South America, given the differences in size between the two continents (</w:t>
+        <w:t xml:space="preserve">. The latter theory establishes that, on evolutionary timescales, diversity within a given area should tend towards an equilibrium value proportional to the size of this area. Therefore, its continent-wide extension predicts the equilibrium diversity of North America to be larger than that of South America, given the differences in size between the two continents (</w:t>
       </w:r>
       <m:oMath>
         <m:r>
@@ -2584,7 +2566,7 @@
         <w:t xml:space="preserve"> </w:t>
       </w:r>
       <w:r>
-        <w:t xml:space="preserve">argued that the continent offering the larger pool of taxa – which, according to this prediction, would happen to be North America – would in turn have resulted in the larger number of species exchanged in the end. It might be noticed that species pool imbalance between the two source areas has been identified as a key driver in the faunal exchange asymmetry that contributed to the build-up of the unique biodiversity along the Wallace line</w:t>
+        <w:t xml:space="preserve">argued that the continent offering the largest pool of taxa – which, according to this prediction, would happen to be North America – would in turn have resulted in the larger number of species exchanged in the end. It might be noticed that species pool imbalance between the two source areas has been identified as a key driver in the faunal exchange asymmetry that contributed to the build-up of the unique biodiversity along the Wallace line</w:t>
       </w:r>
       <w:r>
         <w:rPr>
@@ -2647,7 +2629,7 @@
         <w:t xml:space="preserve">47</w:t>
       </w:r>
       <w:r>
-        <w:t xml:space="preserve">. Also, tropical North American ichtyofauna has long been recognised as mainly composed of groups that originated in South America and further dispersed to the North, although most likely multiple dispersal events occurred, some of which predating the closure of the isthmus</w:t>
+        <w:t xml:space="preserve">. Also, tropical North American ichtyofauna has long been recognised as mainly composed of groups that originated in South America and further dispersed to the North, although most likely multiple dispersal events occurred, some of which pre-dating the closure of the isthmus</w:t>
       </w:r>
       <w:r>
         <w:rPr>
@@ -2687,7 +2669,7 @@
         <w:t xml:space="preserve">50,51</w:t>
       </w:r>
       <w:r>
-        <w:t xml:space="preserve">. In particular, transcontinental exchanges occurred symmetrically among clades inhabting tropical regions, but interestingly, diversification of extra-tropical groups to tropical regions and further dispersal to the other landmass was strongly asymmetrical in favour of North American taxa</w:t>
+        <w:t xml:space="preserve">. In particular, transcontinental exchanges occurred symmetrically among clades inhabting tropical regions, but interestingly, just like land mammals, diversification of extra-tropical groups to tropical regions and further dispersal to the other landmass was strongly asymmetrical in favour of North American taxa</w:t>
       </w:r>
       <w:r>
         <w:rPr>
@@ -3157,7 +3139,7 @@
         <w:t xml:space="preserve">11</w:t>
       </w:r>
       <w:r>
-        <w:t xml:space="preserve">. That being said, as mentioned by Weir</w:t>
+        <w:t xml:space="preserve">. That being dsaid, as mentioned by Weir</w:t>
       </w:r>
       <w:r>
         <w:rPr>
@@ -3197,7 +3179,16 @@
         <w:t xml:space="preserve">., 54</w:t>
       </w:r>
       <w:r>
-        <w:t xml:space="preserve">. Furthermore, evidence from extant taxa suggest tropical niche conservatism</w:t>
+        <w:t xml:space="preserve">. Furthermore, evidence from extant mammal taxa suggest tropical niche conservatism</w:t>
+      </w:r>
+      <w:r>
+        <w:rPr>
+          <w:vertAlign w:val="superscript"/>
+        </w:rPr>
+        <w:t xml:space="preserve">49</w:t>
+      </w:r>
+      <w:r>
+        <w:t xml:space="preserve">. Thus, the fossil-derived number of mammal exchange must have been greatly underestimated, with little to no occurrence documenting interchanges constrained to the tropical biome.</w:t>
       </w:r>
     </w:p>
     <w:p>
@@ -3694,7 +3685,7 @@
         <w:pStyle w:val="FirstParagraph"/>
       </w:pPr>
       <w:r>
-        <w:t xml:space="preserve">We thank Céline Devaux for her useful comments on the present work.</w:t>
+        <w:t xml:space="preserve">We thank Adrián Castro Insua for his useful guidelines and recommendations at the onset of the project. We thank Céline Devaux for her useful comments on the present work.</w:t>
       </w:r>
     </w:p>
     <w:p>

</xml_diff>

<commit_message>
add figure intro + change text
</commit_message>
<xml_diff>
--- a/Manuscript/GABI_palaeo_constraints.docx
+++ b/Manuscript/GABI_palaeo_constraints.docx
@@ -404,205 +404,9 @@
         <w:t xml:space="preserve">13,14,21,24,29,30</w:t>
       </w:r>
       <w:r>
-        <w:t xml:space="preserve">. Proposed by Webb</w:t>
-      </w:r>
-      <w:r>
-        <w:rPr>
-          <w:vertAlign w:val="superscript"/>
-        </w:rPr>
-        <w:t xml:space="preserve">14</w:t>
-      </w:r>
-      <w:r>
-        <w:t xml:space="preserve"> </w:t>
-      </w:r>
-      <w:r>
-        <w:t xml:space="preserve">and Vrba</w:t>
-      </w:r>
-      <w:r>
-        <w:rPr>
-          <w:vertAlign w:val="superscript"/>
-        </w:rPr>
-        <w:t xml:space="preserve">24</w:t>
-      </w:r>
-      <w:r>
-        <w:t xml:space="preserve">, the prevailing view consists of relating pulses of transcontinental mammal exchanges with Pleistocene climatic oscillations, promoting the transition from tropical rainforest to savannah-like environments in Central America as climate cooled down. This climate-driven landscape opening would have in turn facilitated the dispersal of non-tropical taxa, fitter to these environments, in line with the migrant fossil record across both sides of the isthmus. These exchange pulses would have been periodically interrupted as climate warmed up, promoting the reverse transition to rainforest in the isthmian region, with rainforests acting as a barrier for species dispersal (tropical</w:t>
-      </w:r>
-      <w:r>
-        <w:t xml:space="preserve"> </w:t>
-      </w:r>
-      <w:r>
-        <w:t xml:space="preserve">‘</w:t>
-      </w:r>
-      <w:r>
-        <w:t xml:space="preserve">holding pen</w:t>
-      </w:r>
-      <w:r>
-        <w:t xml:space="preserve">’</w:t>
-      </w:r>
-      <w:r>
-        <w:t xml:space="preserve"> </w:t>
-      </w:r>
-      <w:r>
-        <w:t xml:space="preserve">hypothesis)</w:t>
-      </w:r>
-      <w:r>
-        <w:rPr>
-          <w:vertAlign w:val="superscript"/>
-        </w:rPr>
-        <w:t xml:space="preserve">11</w:t>
-      </w:r>
-      <w:r>
-        <w:t xml:space="preserve">. However, studies supporting this view have only been descriptive, tackling the issue from a pattern-oriented perspective driven by fossil data but, to our knowledge, never from a mechanistic process-oriented perspective.</w:t>
-      </w:r>
-    </w:p>
-    <w:p>
-      <w:pPr>
-        <w:pStyle w:val="BodyText"/>
-      </w:pPr>
-      <w:r>
-        <w:t xml:space="preserve">Recent improvements in process-explicit modelling have marked a turning point in the study of biodiversity</w:t>
-      </w:r>
-      <w:r>
-        <w:rPr>
-          <w:vertAlign w:val="superscript"/>
-        </w:rPr>
-        <w:t xml:space="preserve">31</w:t>
-      </w:r>
-      <w:r>
-        <w:t xml:space="preserve">. By combining a landscape including palaeoenvironmental variables and a set of eco-evolutionary rules according to which virtual species are simulated, mechanistic eco-evolutionary models offer the unique opportunity to causally explore how biodiversity patterns arise and are maintained through evolutionary times</w:t>
-      </w:r>
-      <w:r>
-        <w:rPr>
-          <w:vertAlign w:val="superscript"/>
-        </w:rPr>
-        <w:t xml:space="preserve">32</w:t>
-      </w:r>
-      <w:r>
-        <w:t xml:space="preserve">. Recently, this class of models has provided unprecedented insights into the underlying forces behind widely-recognised biodiversity patterns, such as the latitudinal biodiversity gradient</w:t>
-      </w:r>
-      <w:r>
-        <w:rPr>
-          <w:vertAlign w:val="superscript"/>
-        </w:rPr>
-        <w:t xml:space="preserve">33,34</w:t>
-      </w:r>
-      <w:r>
-        <w:t xml:space="preserve">, the diversity desequilibrium between tropical rainforests across the globe</w:t>
-      </w:r>
-      <w:r>
-        <w:rPr>
-          <w:vertAlign w:val="superscript"/>
-        </w:rPr>
-        <w:t xml:space="preserve">35</w:t>
-      </w:r>
-      <w:r>
-        <w:t xml:space="preserve">, the build-up of the unique biodiversity along the Wallace line</w:t>
-      </w:r>
-      <w:r>
-        <w:rPr>
-          <w:vertAlign w:val="superscript"/>
-        </w:rPr>
-        <w:t xml:space="preserve">36</w:t>
-      </w:r>
-      <w:r>
-        <w:t xml:space="preserve"> </w:t>
-      </w:r>
-      <w:r>
-        <w:t xml:space="preserve">and many others</w:t>
-      </w:r>
-      <w:r>
-        <w:rPr>
-          <w:i/>
-          <w:iCs/>
-          <w:vertAlign w:val="superscript"/>
-        </w:rPr>
-        <w:t xml:space="preserve">e</w:t>
-      </w:r>
-      <w:r>
-        <w:rPr>
-          <w:vertAlign w:val="superscript"/>
-        </w:rPr>
-        <w:t xml:space="preserve">.</w:t>
-      </w:r>
-      <w:r>
-        <w:rPr>
-          <w:i/>
-          <w:iCs/>
-          <w:vertAlign w:val="superscript"/>
-        </w:rPr>
-        <w:t xml:space="preserve">g</w:t>
-      </w:r>
-      <w:r>
-        <w:rPr>
-          <w:vertAlign w:val="superscript"/>
-        </w:rPr>
-        <w:t xml:space="preserve">., 37,38,39</w:t>
-      </w:r>
-      <w:r>
-        <w:t xml:space="preserve">.</w:t>
-      </w:r>
-    </w:p>
-    <w:p>
-      <w:pPr>
-        <w:pStyle w:val="BodyText"/>
-      </w:pPr>
-      <w:r>
-        <w:t xml:space="preserve">Here, we test Webb and Vrba’s hypothesis on the role of palaeoclimate dynamics in the asymmetry of the GABI using a spatially-explicit mechanistic biodiversity simulator coupled with palaeoclimate reconstructions across the last 5 million years. Our simulations tracked the diversification of a clade originating either in North or South America. The ability of a virtual species to maintain at a given place was only mediated by climatic factors. We hypothesise that (i) simulations starting from a North American ancestor would be more successful at reaching the other continent than the other way around, (ii) successful simulations starting from a North American ancestor would result in a more diverse and spatially spread radiation in the newly-colonised continent, and (iii) successful interchange would be more frequently achieved among biome generalists, extratropical specialists rather than tropical specialists.</w:t>
-      </w:r>
-    </w:p>
-    <w:p>
-      <w:r>
-        <w:br w:type="page"/>
-      </w:r>
-    </w:p>
-    <w:bookmarkEnd w:id="22"/>
-    <w:bookmarkStart w:id="26" w:name="results"/>
-    <w:p>
-      <w:pPr>
-        <w:pStyle w:val="Heading1"/>
-      </w:pPr>
-      <w:r>
-        <w:t xml:space="preserve">Results</w:t>
-      </w:r>
-    </w:p>
-    <w:bookmarkStart w:id="23" w:name="X4567fbc203e26536a8b2c1d2a805dae2efaff00"/>
-    <w:p>
-      <w:pPr>
-        <w:pStyle w:val="Heading2"/>
-      </w:pPr>
-      <w:r>
-        <w:t xml:space="preserve">Climate makes northwards dispersal events easier than southwards ones</w:t>
-      </w:r>
-    </w:p>
-    <w:p>
-      <w:pPr>
-        <w:pStyle w:val="FirstParagraph"/>
-      </w:pPr>
-      <w:r>
-        <w:t xml:space="preserve">The contribution of palaeoclimate to the biogeographic asymmetry of the Great American Biotic Interchange (GABI) was tested in a simulation-based framework relying on gen3sis</w:t>
-      </w:r>
-      <w:r>
-        <w:rPr>
-          <w:vertAlign w:val="superscript"/>
-        </w:rPr>
-        <w:t xml:space="preserve">33</w:t>
-      </w:r>
-      <w:r>
-        <w:t xml:space="preserve">, a mechanistic eco-evolutionary simulator, incorporating palaeoclimatic layers (annual temperature and precipitation) covering the last 5 million years generated by the PALEO-PGEM emulator</w:t>
-      </w:r>
-      <w:r>
-        <w:rPr>
-          <w:vertAlign w:val="superscript"/>
-        </w:rPr>
-        <w:t xml:space="preserve">40,41</w:t>
-      </w:r>
-      <w:r>
-        <w:t xml:space="preserve"> </w:t>
-      </w:r>
-      <w:r>
-        <w:t xml:space="preserve">(</w:t>
-      </w:r>
-      <w:hyperlink w:anchor="fig-framework">
+        <w:t xml:space="preserve">. The prevailing views consist of relating pulses of transcontinental mammal exchanges with Pleistocene climatic oscillations, promoting the transition from tropical rainforest to savannah-like environments in Central America as climate cooled down (</w:t>
+      </w:r>
+      <w:hyperlink w:anchor="fig-hypotheses">
         <w:r>
           <w:rPr>
             <w:rStyle w:val="Hyperlink"/>
@@ -611,23 +415,86 @@
         </w:r>
       </w:hyperlink>
       <w:r>
-        <w:t xml:space="preserve">). Each set of simulations tracked the radiation of a clade originating at a random location either in North or South America. Climate was the only ecological constraint limiting virtual species’ biogeography. We further compared the ability of virtual species to colonise the continent where they did not originate between the two initial conditions. For additional details, please refer to the</w:t>
-      </w:r>
-      <w:r>
-        <w:t xml:space="preserve"> </w:t>
-      </w:r>
-      <w:r>
-        <w:rPr>
-          <w:i/>
-          <w:iCs/>
-        </w:rPr>
-        <w:t xml:space="preserve">STAR Methods</w:t>
-      </w:r>
-      <w:r>
-        <w:t xml:space="preserve"> </w:t>
-      </w:r>
-      <w:r>
-        <w:t xml:space="preserve">section.</w:t>
+        <w:t xml:space="preserve">). Motivated by the migrant fossil record across both sides of the isthmus of Panama, Webb</w:t>
+      </w:r>
+      <w:r>
+        <w:rPr>
+          <w:vertAlign w:val="superscript"/>
+        </w:rPr>
+        <w:t xml:space="preserve">14</w:t>
+      </w:r>
+      <w:r>
+        <w:t xml:space="preserve"> </w:t>
+      </w:r>
+      <w:r>
+        <w:t xml:space="preserve">proposed that this climate-driven landscape opening would have facilitated the dispersal of open-adapted taxa. As those were assumed to be more numerous in North than in South America – the former continent offering more high-latitude temperate-to-cold environments than the latter –, a larger number of North American taxa would be predicted to disperse to the South than the other way around (</w:t>
+      </w:r>
+      <w:hyperlink w:anchor="fig-hypotheses">
+        <w:r>
+          <w:rPr>
+            <w:rStyle w:val="Hyperlink"/>
+          </w:rPr>
+          <w:t xml:space="preserve">Figure 1</w:t>
+        </w:r>
+      </w:hyperlink>
+      <w:r>
+        <w:t xml:space="preserve"> </w:t>
+      </w:r>
+      <w:r>
+        <w:t xml:space="preserve">A). The resulting exchanges would have been periodically interrupted as climate warmed up, promoting the reverse transition to rainforest in the isthmian region, with rainforests acting as a barrier for species dispersal (tropical</w:t>
+      </w:r>
+      <w:r>
+        <w:t xml:space="preserve"> </w:t>
+      </w:r>
+      <w:r>
+        <w:t xml:space="preserve">‘</w:t>
+      </w:r>
+      <w:r>
+        <w:t xml:space="preserve">holding pen</w:t>
+      </w:r>
+      <w:r>
+        <w:t xml:space="preserve">’</w:t>
+      </w:r>
+      <w:r>
+        <w:t xml:space="preserve"> </w:t>
+      </w:r>
+      <w:r>
+        <w:t xml:space="preserve">hypothesis)</w:t>
+      </w:r>
+      <w:r>
+        <w:rPr>
+          <w:vertAlign w:val="superscript"/>
+        </w:rPr>
+        <w:t xml:space="preserve">11</w:t>
+      </w:r>
+      <w:r>
+        <w:t xml:space="preserve">. In addition, Vrba</w:t>
+      </w:r>
+      <w:r>
+        <w:rPr>
+          <w:vertAlign w:val="superscript"/>
+        </w:rPr>
+        <w:t xml:space="preserve">24</w:t>
+      </w:r>
+      <w:r>
+        <w:t xml:space="preserve"> </w:t>
+      </w:r>
+      <w:r>
+        <w:t xml:space="preserve">proposed the contraction of tropical habitats towards the equator promoted by the aforementioned periodical climatic cooling to have mechanically attracted taxa suited to tropical environments southwards (</w:t>
+      </w:r>
+      <w:hyperlink w:anchor="fig-hypotheses">
+        <w:r>
+          <w:rPr>
+            <w:rStyle w:val="Hyperlink"/>
+          </w:rPr>
+          <w:t xml:space="preserve">Figure 1</w:t>
+        </w:r>
+      </w:hyperlink>
+      <w:r>
+        <w:t xml:space="preserve"> </w:t>
+      </w:r>
+      <w:r>
+        <w:t xml:space="preserve">B). However, studies supporting these views have only been descriptive, tackling the issue from a pattern-oriented perspective driven by fossil data but, to our knowledge, never from a process-oriented perspective.</w:t>
       </w:r>
     </w:p>
     <w:p>
@@ -635,9 +502,149 @@
         <w:pStyle w:val="BodyText"/>
       </w:pPr>
       <w:r>
-        <w:t xml:space="preserve">Our results suggest that the proportion of simulations successfully reaching the other continent is always higher – by approximately a factor of two – when starting from South America than from North America (</w:t>
-      </w:r>
-      <w:hyperlink w:anchor="fig-propsuccess">
+        <w:t xml:space="preserve">Recent improvements in process-explicit modelling have marked a turning point in the study of biodiversity</w:t>
+      </w:r>
+      <w:r>
+        <w:rPr>
+          <w:vertAlign w:val="superscript"/>
+        </w:rPr>
+        <w:t xml:space="preserve">31</w:t>
+      </w:r>
+      <w:r>
+        <w:t xml:space="preserve">. By combining a landscape including palaeoenvironmental variables and a set of eco-evolutionary rules according to which virtual species are simulated, mechanistic eco-evolutionary models offer the unique opportunity to causally explore how biodiversity patterns arise and are maintained through evolutionary times</w:t>
+      </w:r>
+      <w:r>
+        <w:rPr>
+          <w:vertAlign w:val="superscript"/>
+        </w:rPr>
+        <w:t xml:space="preserve">32</w:t>
+      </w:r>
+      <w:r>
+        <w:t xml:space="preserve">. Recently, this class of models has provided unprecedented insights into the underlying forces behind widely-recognised biodiversity patterns, such as the latitudinal biodiversity gradient</w:t>
+      </w:r>
+      <w:r>
+        <w:rPr>
+          <w:vertAlign w:val="superscript"/>
+        </w:rPr>
+        <w:t xml:space="preserve">33,34</w:t>
+      </w:r>
+      <w:r>
+        <w:t xml:space="preserve">, the diversity desequilibrium between tropical rainforests across the globe</w:t>
+      </w:r>
+      <w:r>
+        <w:rPr>
+          <w:vertAlign w:val="superscript"/>
+        </w:rPr>
+        <w:t xml:space="preserve">35</w:t>
+      </w:r>
+      <w:r>
+        <w:t xml:space="preserve">, the build-up of the unique biodiversity along the Wallace line</w:t>
+      </w:r>
+      <w:r>
+        <w:rPr>
+          <w:vertAlign w:val="superscript"/>
+        </w:rPr>
+        <w:t xml:space="preserve">36</w:t>
+      </w:r>
+      <w:r>
+        <w:t xml:space="preserve"> </w:t>
+      </w:r>
+      <w:r>
+        <w:t xml:space="preserve">and many others</w:t>
+      </w:r>
+      <w:r>
+        <w:rPr>
+          <w:i/>
+          <w:iCs/>
+          <w:vertAlign w:val="superscript"/>
+        </w:rPr>
+        <w:t xml:space="preserve">e</w:t>
+      </w:r>
+      <w:r>
+        <w:rPr>
+          <w:vertAlign w:val="superscript"/>
+        </w:rPr>
+        <w:t xml:space="preserve">.</w:t>
+      </w:r>
+      <w:r>
+        <w:rPr>
+          <w:i/>
+          <w:iCs/>
+          <w:vertAlign w:val="superscript"/>
+        </w:rPr>
+        <w:t xml:space="preserve">g</w:t>
+      </w:r>
+      <w:r>
+        <w:rPr>
+          <w:vertAlign w:val="superscript"/>
+        </w:rPr>
+        <w:t xml:space="preserve">., 37,38,39</w:t>
+      </w:r>
+      <w:r>
+        <w:t xml:space="preserve">.</w:t>
+      </w:r>
+    </w:p>
+    <w:p>
+      <w:pPr>
+        <w:pStyle w:val="BodyText"/>
+      </w:pPr>
+      <w:r>
+        <w:t xml:space="preserve">Here, we test Webb and Vrba’s hypotheses on the role of palaeoclimate dynamics in the asymmetry of the GABI using a spatially-explicit mechanistic biodiversity simulator coupled with palaeoclimate reconstructions across the last 5 million years. Our simulations tracked the diversification of a clade originating either in North or South America. The ability of a virtual species to maintain at a given place was only mediated by climatic factors. We hypothesise that (i) simulations starting from a North American ancestor would be more successful at reaching the other continent than the other way around, (ii) successful simulations starting from a North American ancestor would result in a more diverse and spatially spread radiation in the newly-colonised continent, and (iii) successful interchange would be more frequently achieved among biome generalists, extratropical specialists rather than tropical specialists.</w:t>
+      </w:r>
+    </w:p>
+    <w:p>
+      <w:r>
+        <w:br w:type="page"/>
+      </w:r>
+    </w:p>
+    <w:bookmarkEnd w:id="22"/>
+    <w:bookmarkStart w:id="26" w:name="results"/>
+    <w:p>
+      <w:pPr>
+        <w:pStyle w:val="Heading1"/>
+      </w:pPr>
+      <w:r>
+        <w:t xml:space="preserve">Results</w:t>
+      </w:r>
+    </w:p>
+    <w:bookmarkStart w:id="23" w:name="X4567fbc203e26536a8b2c1d2a805dae2efaff00"/>
+    <w:p>
+      <w:pPr>
+        <w:pStyle w:val="Heading2"/>
+      </w:pPr>
+      <w:r>
+        <w:t xml:space="preserve">Climate makes northwards dispersal events easier than southwards ones</w:t>
+      </w:r>
+    </w:p>
+    <w:p>
+      <w:pPr>
+        <w:pStyle w:val="FirstParagraph"/>
+      </w:pPr>
+      <w:r>
+        <w:t xml:space="preserve">The contribution of palaeoclimate to the biogeographic asymmetry of the Great American Biotic Interchange (GABI) was tested in a simulation-based framework relying on gen3sis</w:t>
+      </w:r>
+      <w:r>
+        <w:rPr>
+          <w:vertAlign w:val="superscript"/>
+        </w:rPr>
+        <w:t xml:space="preserve">33</w:t>
+      </w:r>
+      <w:r>
+        <w:t xml:space="preserve">, a mechanistic eco-evolutionary simulator, incorporating palaeoclimatic layers (annual temperature and precipitation) covering the last 5 million years generated by the PALEO-PGEM emulator</w:t>
+      </w:r>
+      <w:r>
+        <w:rPr>
+          <w:vertAlign w:val="superscript"/>
+        </w:rPr>
+        <w:t xml:space="preserve">40,41</w:t>
+      </w:r>
+      <w:r>
+        <w:t xml:space="preserve"> </w:t>
+      </w:r>
+      <w:r>
+        <w:t xml:space="preserve">(</w:t>
+      </w:r>
+      <w:hyperlink w:anchor="fig-framework">
         <w:r>
           <w:rPr>
             <w:rStyle w:val="Hyperlink"/>
@@ -646,308 +653,7 @@
         </w:r>
       </w:hyperlink>
       <w:r>
-        <w:t xml:space="preserve">). This imbalance holds whether we allow species climatic niche to evolve following the direction of local climatic change (</w:t>
-      </w:r>
-      <m:oMath>
-        <m:r>
-          <m:t>44</m:t>
-        </m:r>
-        <m:r>
-          <m:rPr>
-            <m:sty m:val="p"/>
-          </m:rPr>
-          <m:t>±</m:t>
-        </m:r>
-        <m:r>
-          <m:t>6</m:t>
-        </m:r>
-        <m:r>
-          <m:rPr>
-            <m:sty m:val="p"/>
-          </m:rPr>
-          <m:t>%</m:t>
-        </m:r>
-      </m:oMath>
-      <w:r>
-        <w:t xml:space="preserve"> </w:t>
-      </w:r>
-      <w:r>
-        <w:t xml:space="preserve">vs. </w:t>
-      </w:r>
-      <m:oMath>
-        <m:r>
-          <m:t>87</m:t>
-        </m:r>
-        <m:r>
-          <m:rPr>
-            <m:sty m:val="p"/>
-          </m:rPr>
-          <m:t>±</m:t>
-        </m:r>
-        <m:r>
-          <m:t>3</m:t>
-        </m:r>
-        <m:r>
-          <m:rPr>
-            <m:sty m:val="p"/>
-          </m:rPr>
-          <m:t>%</m:t>
-        </m:r>
-      </m:oMath>
-      <w:r>
-        <w:t xml:space="preserve">, model</w:t>
-      </w:r>
-      <w:r>
-        <w:t xml:space="preserve"> </w:t>
-      </w:r>
-      <m:oMath>
-        <m:r>
-          <m:t>M</m:t>
-        </m:r>
-        <m:r>
-          <m:t>1</m:t>
-        </m:r>
-      </m:oMath>
-      <w:r>
-        <w:t xml:space="preserve">) or not (</w:t>
-      </w:r>
-      <m:oMath>
-        <m:r>
-          <m:t>29</m:t>
-        </m:r>
-        <m:r>
-          <m:rPr>
-            <m:sty m:val="p"/>
-          </m:rPr>
-          <m:t>±</m:t>
-        </m:r>
-        <m:r>
-          <m:t>6</m:t>
-        </m:r>
-        <m:r>
-          <m:rPr>
-            <m:sty m:val="p"/>
-          </m:rPr>
-          <m:t>%</m:t>
-        </m:r>
-      </m:oMath>
-      <w:r>
-        <w:t xml:space="preserve"> </w:t>
-      </w:r>
-      <w:r>
-        <w:t xml:space="preserve">vs. </w:t>
-      </w:r>
-      <m:oMath>
-        <m:r>
-          <m:t>59</m:t>
-        </m:r>
-        <m:r>
-          <m:rPr>
-            <m:sty m:val="p"/>
-          </m:rPr>
-          <m:t>±</m:t>
-        </m:r>
-        <m:r>
-          <m:t>5</m:t>
-        </m:r>
-        <m:r>
-          <m:rPr>
-            <m:sty m:val="p"/>
-          </m:rPr>
-          <m:t>%</m:t>
-        </m:r>
-      </m:oMath>
-      <w:r>
-        <w:t xml:space="preserve">,</w:t>
-      </w:r>
-      <w:r>
-        <w:t xml:space="preserve"> </w:t>
-      </w:r>
-      <m:oMath>
-        <m:r>
-          <m:t>M</m:t>
-        </m:r>
-        <m:r>
-          <m:t>0</m:t>
-        </m:r>
-      </m:oMath>
-      <w:r>
-        <w:t xml:space="preserve">), although we can notice that overall transcontinental exchange frequencies are lower in the latter case. When allowing climatic niches to evolve, amputation of either their temperature (</w:t>
-      </w:r>
-      <m:oMath>
-        <m:r>
-          <m:t>47</m:t>
-        </m:r>
-        <m:r>
-          <m:rPr>
-            <m:sty m:val="p"/>
-          </m:rPr>
-          <m:t>±</m:t>
-        </m:r>
-        <m:r>
-          <m:t>7</m:t>
-        </m:r>
-        <m:r>
-          <m:rPr>
-            <m:sty m:val="p"/>
-          </m:rPr>
-          <m:t>%</m:t>
-        </m:r>
-      </m:oMath>
-      <w:r>
-        <w:t xml:space="preserve"> </w:t>
-      </w:r>
-      <w:r>
-        <w:t xml:space="preserve">vs. </w:t>
-      </w:r>
-      <m:oMath>
-        <m:r>
-          <m:t>88</m:t>
-        </m:r>
-        <m:r>
-          <m:rPr>
-            <m:sty m:val="p"/>
-          </m:rPr>
-          <m:t>±</m:t>
-        </m:r>
-        <m:r>
-          <m:t>3</m:t>
-        </m:r>
-        <m:r>
-          <m:rPr>
-            <m:sty m:val="p"/>
-          </m:rPr>
-          <m:t>%</m:t>
-        </m:r>
-      </m:oMath>
-      <w:r>
-        <w:t xml:space="preserve">,</w:t>
-      </w:r>
-      <w:r>
-        <w:t xml:space="preserve"> </w:t>
-      </w:r>
-      <m:oMath>
-        <m:r>
-          <m:t>M</m:t>
-        </m:r>
-        <m:r>
-          <m:t>2</m:t>
-        </m:r>
-      </m:oMath>
-      <w:r>
-        <w:t xml:space="preserve">) or precipitation (</w:t>
-      </w:r>
-      <m:oMath>
-        <m:r>
-          <m:t>38</m:t>
-        </m:r>
-        <m:r>
-          <m:rPr>
-            <m:sty m:val="p"/>
-          </m:rPr>
-          <m:t>±</m:t>
-        </m:r>
-        <m:r>
-          <m:t>4</m:t>
-        </m:r>
-        <m:r>
-          <m:rPr>
-            <m:sty m:val="p"/>
-          </m:rPr>
-          <m:t>%</m:t>
-        </m:r>
-      </m:oMath>
-      <w:r>
-        <w:t xml:space="preserve"> </w:t>
-      </w:r>
-      <w:r>
-        <w:t xml:space="preserve">vs. </w:t>
-      </w:r>
-      <m:oMath>
-        <m:r>
-          <m:t>89</m:t>
-        </m:r>
-        <m:r>
-          <m:rPr>
-            <m:sty m:val="p"/>
-          </m:rPr>
-          <m:t>±</m:t>
-        </m:r>
-        <m:r>
-          <m:t>3</m:t>
-        </m:r>
-        <m:r>
-          <m:rPr>
-            <m:sty m:val="p"/>
-          </m:rPr>
-          <m:t>%</m:t>
-        </m:r>
-      </m:oMath>
-      <w:r>
-        <w:t xml:space="preserve">,</w:t>
-      </w:r>
-      <w:r>
-        <w:t xml:space="preserve"> </w:t>
-      </w:r>
-      <m:oMath>
-        <m:r>
-          <m:t>M</m:t>
-        </m:r>
-        <m:r>
-          <m:t>3</m:t>
-        </m:r>
-      </m:oMath>
-      <w:r>
-        <w:t xml:space="preserve">) compounds did not alter the pattern. This imbalance was also maintained when standardising initial distances to the isthmus of Panama for simulated species originating in North America to those of simulated species from South America, except for simulations generated under the zero-adaptationist model (</w:t>
-      </w:r>
-      <m:oMath>
-        <m:r>
-          <m:t>50</m:t>
-        </m:r>
-        <m:r>
-          <m:rPr>
-            <m:sty m:val="p"/>
-          </m:rPr>
-          <m:t>±</m:t>
-        </m:r>
-        <m:r>
-          <m:t>6</m:t>
-        </m:r>
-        <m:r>
-          <m:rPr>
-            <m:sty m:val="p"/>
-          </m:rPr>
-          <m:t>%</m:t>
-        </m:r>
-      </m:oMath>
-      <w:r>
-        <w:t xml:space="preserve"> </w:t>
-      </w:r>
-      <w:r>
-        <w:t xml:space="preserve">vs. </w:t>
-      </w:r>
-      <m:oMath>
-        <m:r>
-          <m:t>59</m:t>
-        </m:r>
-        <m:r>
-          <m:rPr>
-            <m:sty m:val="p"/>
-          </m:rPr>
-          <m:t>±</m:t>
-        </m:r>
-        <m:r>
-          <m:t>5</m:t>
-        </m:r>
-        <m:r>
-          <m:rPr>
-            <m:sty m:val="p"/>
-          </m:rPr>
-          <m:t>%</m:t>
-        </m:r>
-      </m:oMath>
-      <w:r>
-        <w:t xml:space="preserve">) (Figure S2). This spatial standardisation aimed at controlling for the fact that simulations starting from South America originated on average closer to the isthmus of Panama than those starting from North America, therefore introducing a spatial bias (see</w:t>
+        <w:t xml:space="preserve">). Each set of simulations tracked the radiation of a clade originating at a random location either in North or South America. Climate was the only ecological constraint limiting virtual species’ biogeography. We further compared the ability of virtual species to colonise the continent where they did not originate between the two initial conditions. For additional details, please refer to the</w:t>
       </w:r>
       <w:r>
         <w:t xml:space="preserve"> </w:t>
@@ -963,7 +669,7 @@
         <w:t xml:space="preserve"> </w:t>
       </w:r>
       <w:r>
-        <w:t xml:space="preserve">and Figure S1).</w:t>
+        <w:t xml:space="preserve">section.</w:t>
       </w:r>
     </w:p>
     <w:p>
@@ -971,81 +677,9 @@
         <w:pStyle w:val="BodyText"/>
       </w:pPr>
       <w:r>
-        <w:t xml:space="preserve">Out of the 500 runs carried out for each initial landmass-modelling scenario combination, the proportion of simulations leading to no living representative (=crash) was on average three times higher for simulations starting from North America, except for model</w:t>
-      </w:r>
-      <w:r>
-        <w:t xml:space="preserve"> </w:t>
-      </w:r>
-      <m:oMath>
-        <m:r>
-          <m:t>M</m:t>
-        </m:r>
-        <m:r>
-          <m:t>3</m:t>
-        </m:r>
-      </m:oMath>
-      <w:r>
-        <w:t xml:space="preserve">, recording almost no crash (Table S2). This difference, although attenuated, persisted after the spatial standardisation procedure.</w:t>
-      </w:r>
-    </w:p>
-    <w:bookmarkEnd w:id="23"/>
-    <w:bookmarkStart w:id="24" w:name="X3f8917345488c3542ef7817a04a0a44ace1cdf0"/>
-    <w:p>
-      <w:pPr>
-        <w:pStyle w:val="Heading2"/>
-      </w:pPr>
-      <w:r>
-        <w:t xml:space="preserve">Successful establishment on the newly-colonised continent</w:t>
-      </w:r>
-    </w:p>
-    <w:p>
-      <w:pPr>
-        <w:pStyle w:val="FirstParagraph"/>
-      </w:pPr>
-      <w:r>
-        <w:t xml:space="preserve">Irrespective of the initial continent, our findings highlight that successful simulations generated under models allowing species climatic niches to evolve (</w:t>
-      </w:r>
-      <m:oMath>
-        <m:r>
-          <m:t>M</m:t>
-        </m:r>
-        <m:r>
-          <m:t>1</m:t>
-        </m:r>
-        <m:r>
-          <m:rPr>
-            <m:sty m:val="p"/>
-          </m:rPr>
-          <m:t>−</m:t>
-        </m:r>
-        <m:r>
-          <m:t>M</m:t>
-        </m:r>
-        <m:r>
-          <m:t>3</m:t>
-        </m:r>
-      </m:oMath>
-      <w:r>
-        <w:t xml:space="preserve">) colonised a larger area on the newly-colonised continent – quantified as the ratio between the number of pixels recording a presence in the landmass to colonise and the total number of pixels in this landmass – than those generated under the</w:t>
-      </w:r>
-      <w:r>
-        <w:t xml:space="preserve"> </w:t>
-      </w:r>
-      <m:oMath>
-        <m:r>
-          <m:t>M</m:t>
-        </m:r>
-        <m:r>
-          <m:t>0</m:t>
-        </m:r>
-      </m:oMath>
-      <w:r>
-        <w:t xml:space="preserve"> </w:t>
-      </w:r>
-      <w:r>
-        <w:t xml:space="preserve">model – where climatic niche evolution was not allowed (</w:t>
-      </w:r>
-      <w:hyperlink w:anchor="fig-metrics">
+        <w:t xml:space="preserve">Our results suggest that the proportion of simulations successfully reaching the other continent is always higher – by approximately a factor of two – when starting from South America than from North America (</w:t>
+      </w:r>
+      <w:hyperlink w:anchor="fig-propsuccess">
         <w:r>
           <w:rPr>
             <w:rStyle w:val="Hyperlink"/>
@@ -1054,45 +688,11 @@
         </w:r>
       </w:hyperlink>
       <w:r>
-        <w:t xml:space="preserve"> </w:t>
-      </w:r>
-      <w:r>
-        <w:t xml:space="preserve">A). Furthermore, species of North American origin that successfully made it to South America generally colonised a greater area than those of South American origin reaching North America (</w:t>
-      </w:r>
-      <w:hyperlink w:anchor="fig-metrics">
-        <w:r>
-          <w:rPr>
-            <w:rStyle w:val="Hyperlink"/>
-          </w:rPr>
-          <w:t xml:space="preserve">Figure 3</w:t>
-        </w:r>
-      </w:hyperlink>
-      <w:r>
-        <w:t xml:space="preserve"> </w:t>
-      </w:r>
-      <w:r>
-        <w:t xml:space="preserve">A). This pattern is particularly striking for simulations generated under the</w:t>
-      </w:r>
-      <w:r>
-        <w:t xml:space="preserve"> </w:t>
+        <w:t xml:space="preserve">). This imbalance holds whether we allow species climatic niche to evolve following the direction of local climatic change (</w:t>
       </w:r>
       <m:oMath>
         <m:r>
-          <m:t>M</m:t>
-        </m:r>
-        <m:r>
-          <m:t>0</m:t>
-        </m:r>
-      </m:oMath>
-      <w:r>
-        <w:t xml:space="preserve"> </w:t>
-      </w:r>
-      <w:r>
-        <w:t xml:space="preserve">model (</w:t>
-      </w:r>
-      <m:oMath>
-        <m:r>
-          <m:t>36.5</m:t>
+          <m:t>44</m:t>
         </m:r>
         <m:r>
           <m:rPr>
@@ -1101,7 +701,7 @@
           <m:t>±</m:t>
         </m:r>
         <m:r>
-          <m:t>3.5</m:t>
+          <m:t>6</m:t>
         </m:r>
         <m:r>
           <m:rPr>
@@ -1118,7 +718,7 @@
       </w:r>
       <m:oMath>
         <m:r>
-          <m:t>11.7</m:t>
+          <m:t>87</m:t>
         </m:r>
         <m:r>
           <m:rPr>
@@ -1127,7 +727,7 @@
           <m:t>±</m:t>
         </m:r>
         <m:r>
-          <m:t>0.4</m:t>
+          <m:t>3</m:t>
         </m:r>
         <m:r>
           <m:rPr>
@@ -1137,7 +737,7 @@
         </m:r>
       </m:oMath>
       <w:r>
-        <w:t xml:space="preserve">), and holds for all but the</w:t>
+        <w:t xml:space="preserve">, model</w:t>
       </w:r>
       <w:r>
         <w:t xml:space="preserve"> </w:t>
@@ -1147,18 +747,15 @@
           <m:t>M</m:t>
         </m:r>
         <m:r>
-          <m:t>3</m:t>
+          <m:t>1</m:t>
         </m:r>
       </m:oMath>
       <w:r>
-        <w:t xml:space="preserve"> </w:t>
-      </w:r>
-      <w:r>
-        <w:t xml:space="preserve">model – relaxing the precipitation constraint on species’ niche –, the latter suggesting an opposite trend (</w:t>
+        <w:t xml:space="preserve">) or not (</w:t>
       </w:r>
       <m:oMath>
         <m:r>
-          <m:t>69.9</m:t>
+          <m:t>29</m:t>
         </m:r>
         <m:r>
           <m:rPr>
@@ -1167,7 +764,7 @@
           <m:t>±</m:t>
         </m:r>
         <m:r>
-          <m:t>3.3</m:t>
+          <m:t>6</m:t>
         </m:r>
         <m:r>
           <m:rPr>
@@ -1180,14 +777,11 @@
         <w:t xml:space="preserve"> </w:t>
       </w:r>
       <w:r>
-        <w:t xml:space="preserve">vs</w:t>
-      </w:r>
-      <w:r>
-        <w:t xml:space="preserve"> </w:t>
+        <w:t xml:space="preserve">vs. </w:t>
       </w:r>
       <m:oMath>
         <m:r>
-          <m:t>79.4</m:t>
+          <m:t>59</m:t>
         </m:r>
         <m:r>
           <m:rPr>
@@ -1196,7 +790,7 @@
           <m:t>±</m:t>
         </m:r>
         <m:r>
-          <m:t>3.9</m:t>
+          <m:t>5</m:t>
         </m:r>
         <m:r>
           <m:rPr>
@@ -1206,41 +800,252 @@
         </m:r>
       </m:oMath>
       <w:r>
-        <w:t xml:space="preserve">). However, due to the difference in size (</w:t>
-      </w:r>
-      <w:r>
-        <w:rPr>
-          <w:i/>
-          <w:iCs/>
-        </w:rPr>
-        <w:t xml:space="preserve">i</w:t>
-      </w:r>
-      <w:r>
-        <w:t xml:space="preserve">.</w:t>
-      </w:r>
-      <w:r>
-        <w:rPr>
-          <w:i/>
-          <w:iCs/>
-        </w:rPr>
-        <w:t xml:space="preserve">e</w:t>
-      </w:r>
-      <w:r>
-        <w:t xml:space="preserve">., number of pixels) between the two continents (</w:t>
-      </w:r>
-      <w:hyperlink w:anchor="fig-framework">
-        <w:r>
-          <w:rPr>
-            <w:rStyle w:val="Hyperlink"/>
-          </w:rPr>
-          <w:t xml:space="preserve">Figure 1</w:t>
-        </w:r>
-      </w:hyperlink>
-      <w:r>
-        <w:t xml:space="preserve">), the actual colonised area (quantified as the number of colonised cells in our simulations) was greater when simulations generated under the</w:t>
-      </w:r>
-      <w:r>
-        <w:t xml:space="preserve"> </w:t>
+        <w:t xml:space="preserve">,</w:t>
+      </w:r>
+      <w:r>
+        <w:t xml:space="preserve"> </w:t>
+      </w:r>
+      <m:oMath>
+        <m:r>
+          <m:t>M</m:t>
+        </m:r>
+        <m:r>
+          <m:t>0</m:t>
+        </m:r>
+      </m:oMath>
+      <w:r>
+        <w:t xml:space="preserve">), although we can notice that overall transcontinental exchange frequencies are lower in the latter case. When allowing climatic niches to evolve, amputation of either their temperature (</w:t>
+      </w:r>
+      <m:oMath>
+        <m:r>
+          <m:t>47</m:t>
+        </m:r>
+        <m:r>
+          <m:rPr>
+            <m:sty m:val="p"/>
+          </m:rPr>
+          <m:t>±</m:t>
+        </m:r>
+        <m:r>
+          <m:t>7</m:t>
+        </m:r>
+        <m:r>
+          <m:rPr>
+            <m:sty m:val="p"/>
+          </m:rPr>
+          <m:t>%</m:t>
+        </m:r>
+      </m:oMath>
+      <w:r>
+        <w:t xml:space="preserve"> </w:t>
+      </w:r>
+      <w:r>
+        <w:t xml:space="preserve">vs. </w:t>
+      </w:r>
+      <m:oMath>
+        <m:r>
+          <m:t>88</m:t>
+        </m:r>
+        <m:r>
+          <m:rPr>
+            <m:sty m:val="p"/>
+          </m:rPr>
+          <m:t>±</m:t>
+        </m:r>
+        <m:r>
+          <m:t>3</m:t>
+        </m:r>
+        <m:r>
+          <m:rPr>
+            <m:sty m:val="p"/>
+          </m:rPr>
+          <m:t>%</m:t>
+        </m:r>
+      </m:oMath>
+      <w:r>
+        <w:t xml:space="preserve">,</w:t>
+      </w:r>
+      <w:r>
+        <w:t xml:space="preserve"> </w:t>
+      </w:r>
+      <m:oMath>
+        <m:r>
+          <m:t>M</m:t>
+        </m:r>
+        <m:r>
+          <m:t>2</m:t>
+        </m:r>
+      </m:oMath>
+      <w:r>
+        <w:t xml:space="preserve">) or precipitation (</w:t>
+      </w:r>
+      <m:oMath>
+        <m:r>
+          <m:t>38</m:t>
+        </m:r>
+        <m:r>
+          <m:rPr>
+            <m:sty m:val="p"/>
+          </m:rPr>
+          <m:t>±</m:t>
+        </m:r>
+        <m:r>
+          <m:t>4</m:t>
+        </m:r>
+        <m:r>
+          <m:rPr>
+            <m:sty m:val="p"/>
+          </m:rPr>
+          <m:t>%</m:t>
+        </m:r>
+      </m:oMath>
+      <w:r>
+        <w:t xml:space="preserve"> </w:t>
+      </w:r>
+      <w:r>
+        <w:t xml:space="preserve">vs. </w:t>
+      </w:r>
+      <m:oMath>
+        <m:r>
+          <m:t>89</m:t>
+        </m:r>
+        <m:r>
+          <m:rPr>
+            <m:sty m:val="p"/>
+          </m:rPr>
+          <m:t>±</m:t>
+        </m:r>
+        <m:r>
+          <m:t>3</m:t>
+        </m:r>
+        <m:r>
+          <m:rPr>
+            <m:sty m:val="p"/>
+          </m:rPr>
+          <m:t>%</m:t>
+        </m:r>
+      </m:oMath>
+      <w:r>
+        <w:t xml:space="preserve">,</w:t>
+      </w:r>
+      <w:r>
+        <w:t xml:space="preserve"> </w:t>
+      </w:r>
+      <m:oMath>
+        <m:r>
+          <m:t>M</m:t>
+        </m:r>
+        <m:r>
+          <m:t>3</m:t>
+        </m:r>
+      </m:oMath>
+      <w:r>
+        <w:t xml:space="preserve">) compounds did not alter the pattern. This imbalance was also maintained when standardising initial distances to the isthmus of Panama for simulated species originating in North America to those of simulated species from South America, except for simulations generated under the zero-adaptationist model (</w:t>
+      </w:r>
+      <m:oMath>
+        <m:r>
+          <m:t>50</m:t>
+        </m:r>
+        <m:r>
+          <m:rPr>
+            <m:sty m:val="p"/>
+          </m:rPr>
+          <m:t>±</m:t>
+        </m:r>
+        <m:r>
+          <m:t>6</m:t>
+        </m:r>
+        <m:r>
+          <m:rPr>
+            <m:sty m:val="p"/>
+          </m:rPr>
+          <m:t>%</m:t>
+        </m:r>
+      </m:oMath>
+      <w:r>
+        <w:t xml:space="preserve"> </w:t>
+      </w:r>
+      <w:r>
+        <w:t xml:space="preserve">vs. </w:t>
+      </w:r>
+      <m:oMath>
+        <m:r>
+          <m:t>59</m:t>
+        </m:r>
+        <m:r>
+          <m:rPr>
+            <m:sty m:val="p"/>
+          </m:rPr>
+          <m:t>±</m:t>
+        </m:r>
+        <m:r>
+          <m:t>5</m:t>
+        </m:r>
+        <m:r>
+          <m:rPr>
+            <m:sty m:val="p"/>
+          </m:rPr>
+          <m:t>%</m:t>
+        </m:r>
+      </m:oMath>
+      <w:r>
+        <w:t xml:space="preserve">) (Figure S2). This spatial standardisation aimed at controlling for the fact that simulations starting from South America originated on average closer to the isthmus of Panama than those starting from North America, therefore introducing a spatial bias (see</w:t>
+      </w:r>
+      <w:r>
+        <w:t xml:space="preserve"> </w:t>
+      </w:r>
+      <w:r>
+        <w:rPr>
+          <w:i/>
+          <w:iCs/>
+        </w:rPr>
+        <w:t xml:space="preserve">STAR Methods</w:t>
+      </w:r>
+      <w:r>
+        <w:t xml:space="preserve"> </w:t>
+      </w:r>
+      <w:r>
+        <w:t xml:space="preserve">and Figure S1).</w:t>
+      </w:r>
+    </w:p>
+    <w:p>
+      <w:pPr>
+        <w:pStyle w:val="BodyText"/>
+      </w:pPr>
+      <w:r>
+        <w:t xml:space="preserve">Out of the 500 runs carried out for each initial landmass-modelling scenario combination, the proportion of simulations leading to no living representative (=crash) was on average three times higher for simulations starting from North America, except for model</w:t>
+      </w:r>
+      <w:r>
+        <w:t xml:space="preserve"> </w:t>
+      </w:r>
+      <m:oMath>
+        <m:r>
+          <m:t>M</m:t>
+        </m:r>
+        <m:r>
+          <m:t>3</m:t>
+        </m:r>
+      </m:oMath>
+      <w:r>
+        <w:t xml:space="preserve">, recording almost no crash (Table S2). This difference, although attenuated, persisted after the spatial standardisation procedure.</w:t>
+      </w:r>
+    </w:p>
+    <w:bookmarkEnd w:id="23"/>
+    <w:bookmarkStart w:id="24" w:name="X3f8917345488c3542ef7817a04a0a44ace1cdf0"/>
+    <w:p>
+      <w:pPr>
+        <w:pStyle w:val="Heading2"/>
+      </w:pPr>
+      <w:r>
+        <w:t xml:space="preserve">Successful establishment on the newly-colonised continent</w:t>
+      </w:r>
+    </w:p>
+    <w:p>
+      <w:pPr>
+        <w:pStyle w:val="FirstParagraph"/>
+      </w:pPr>
+      <w:r>
+        <w:t xml:space="preserve">Irrespective of the initial continent, our findings highlight that successful simulations generated under models allowing species climatic niches to evolve (</w:t>
       </w:r>
       <m:oMath>
         <m:r>
@@ -1256,14 +1061,14 @@
           <m:t>−</m:t>
         </m:r>
         <m:r>
+          <m:t>M</m:t>
+        </m:r>
+        <m:r>
           <m:t>3</m:t>
         </m:r>
       </m:oMath>
       <w:r>
-        <w:t xml:space="preserve"> </w:t>
-      </w:r>
-      <w:r>
-        <w:t xml:space="preserve">models started from South than North America, but remained larger when simulations were generated under</w:t>
+        <w:t xml:space="preserve">) colonised a larger area on the newly-colonised continent – quantified as the ratio between the number of pixels recording a presence in the landmass to colonise and the total number of pixels in this landmass – than those generated under the</w:t>
       </w:r>
       <w:r>
         <w:t xml:space="preserve"> </w:t>
@@ -1280,331 +1085,9 @@
         <w:t xml:space="preserve"> </w:t>
       </w:r>
       <w:r>
-        <w:t xml:space="preserve">started from North America (Figure S13).</w:t>
-      </w:r>
-    </w:p>
-    <w:p>
-      <w:pPr>
-        <w:pStyle w:val="BodyText"/>
-      </w:pPr>
-      <w:r>
-        <w:t xml:space="preserve">Besides, contrary to the proportion of colonised area for a given ancestral continent, colonised diversity (</w:t>
-      </w:r>
-      <w:r>
-        <w:rPr>
-          <w:i/>
-          <w:iCs/>
-        </w:rPr>
-        <w:t xml:space="preserve">i</w:t>
-      </w:r>
-      <w:r>
-        <w:t xml:space="preserve">.</w:t>
-      </w:r>
-      <w:r>
-        <w:rPr>
-          <w:i/>
-          <w:iCs/>
-        </w:rPr>
-        <w:t xml:space="preserve">e</w:t>
-      </w:r>
-      <w:r>
-        <w:t xml:space="preserve">., the number of taxa within the colonised continent) does not vary significantly across our four models. However, a significant decrease is evident in simulations starting from North America generated under the</w:t>
-      </w:r>
-      <w:r>
-        <w:t xml:space="preserve"> </w:t>
-      </w:r>
-      <m:oMath>
-        <m:r>
-          <m:t>M</m:t>
-        </m:r>
-        <m:r>
-          <m:t>3</m:t>
-        </m:r>
-      </m:oMath>
-      <w:r>
-        <w:t xml:space="preserve"> </w:t>
-      </w:r>
-      <w:r>
-        <w:t xml:space="preserve">model (</w:t>
+        <w:t xml:space="preserve">model – where climatic niche evolution was not allowed (</w:t>
       </w:r>
       <w:hyperlink w:anchor="fig-metrics">
-        <w:r>
-          <w:rPr>
-            <w:rStyle w:val="Hyperlink"/>
-          </w:rPr>
-          <w:t xml:space="preserve">Figure 3</w:t>
-        </w:r>
-      </w:hyperlink>
-      <w:r>
-        <w:t xml:space="preserve"> </w:t>
-      </w:r>
-      <w:r>
-        <w:t xml:space="preserve">B). Moreover, ancestral continent does not seem to affect mean colonised diversity values in the case of the</w:t>
-      </w:r>
-      <w:r>
-        <w:t xml:space="preserve"> </w:t>
-      </w:r>
-      <m:oMath>
-        <m:r>
-          <m:t>M</m:t>
-        </m:r>
-        <m:r>
-          <m:t>1</m:t>
-        </m:r>
-      </m:oMath>
-      <w:r>
-        <w:t xml:space="preserve"> </w:t>
-      </w:r>
-      <w:r>
-        <w:t xml:space="preserve">(</w:t>
-      </w:r>
-      <m:oMath>
-        <m:r>
-          <m:t>212</m:t>
-        </m:r>
-        <m:r>
-          <m:rPr>
-            <m:sty m:val="p"/>
-          </m:rPr>
-          <m:t>±</m:t>
-        </m:r>
-        <m:r>
-          <m:t>61</m:t>
-        </m:r>
-      </m:oMath>
-      <w:r>
-        <w:t xml:space="preserve"> </w:t>
-      </w:r>
-      <w:r>
-        <w:t xml:space="preserve">vs. </w:t>
-      </w:r>
-      <m:oMath>
-        <m:r>
-          <m:t>170</m:t>
-        </m:r>
-        <m:r>
-          <m:rPr>
-            <m:sty m:val="p"/>
-          </m:rPr>
-          <m:t>±</m:t>
-        </m:r>
-        <m:r>
-          <m:t>25</m:t>
-        </m:r>
-      </m:oMath>
-      <w:r>
-        <w:t xml:space="preserve"> </w:t>
-      </w:r>
-      <w:r>
-        <w:t xml:space="preserve">species respectively retrieved in the newly-colonised continent after starting from North or South America) and</w:t>
-      </w:r>
-      <w:r>
-        <w:t xml:space="preserve"> </w:t>
-      </w:r>
-      <m:oMath>
-        <m:r>
-          <m:t>M</m:t>
-        </m:r>
-        <m:r>
-          <m:t>2</m:t>
-        </m:r>
-      </m:oMath>
-      <w:r>
-        <w:t xml:space="preserve"> </w:t>
-      </w:r>
-      <w:r>
-        <w:t xml:space="preserve">(</w:t>
-      </w:r>
-      <m:oMath>
-        <m:r>
-          <m:t>161</m:t>
-        </m:r>
-        <m:r>
-          <m:rPr>
-            <m:sty m:val="p"/>
-          </m:rPr>
-          <m:t>±</m:t>
-        </m:r>
-        <m:r>
-          <m:t>48</m:t>
-        </m:r>
-      </m:oMath>
-      <w:r>
-        <w:t xml:space="preserve"> </w:t>
-      </w:r>
-      <w:r>
-        <w:t xml:space="preserve">vs. </w:t>
-      </w:r>
-      <m:oMath>
-        <m:r>
-          <m:t>171</m:t>
-        </m:r>
-        <m:r>
-          <m:rPr>
-            <m:sty m:val="p"/>
-          </m:rPr>
-          <m:t>±</m:t>
-        </m:r>
-        <m:r>
-          <m:t>27</m:t>
-        </m:r>
-      </m:oMath>
-      <w:r>
-        <w:t xml:space="preserve"> </w:t>
-      </w:r>
-      <w:r>
-        <w:t xml:space="preserve">species) models. It does however have an effect for simulations generated under</w:t>
-      </w:r>
-      <w:r>
-        <w:t xml:space="preserve"> </w:t>
-      </w:r>
-      <m:oMath>
-        <m:r>
-          <m:t>M</m:t>
-        </m:r>
-        <m:r>
-          <m:t>0</m:t>
-        </m:r>
-      </m:oMath>
-      <w:r>
-        <w:t xml:space="preserve">, with higher average values obtained for simulations starting from North America (</w:t>
-      </w:r>
-      <m:oMath>
-        <m:r>
-          <m:t>247</m:t>
-        </m:r>
-        <m:r>
-          <m:rPr>
-            <m:sty m:val="p"/>
-          </m:rPr>
-          <m:t>±</m:t>
-        </m:r>
-        <m:r>
-          <m:t>85</m:t>
-        </m:r>
-      </m:oMath>
-      <w:r>
-        <w:t xml:space="preserve"> </w:t>
-      </w:r>
-      <w:r>
-        <w:t xml:space="preserve">vs. </w:t>
-      </w:r>
-      <m:oMath>
-        <m:r>
-          <m:t>79</m:t>
-        </m:r>
-        <m:r>
-          <m:rPr>
-            <m:sty m:val="p"/>
-          </m:rPr>
-          <m:t>±</m:t>
-        </m:r>
-        <m:r>
-          <m:t>20</m:t>
-        </m:r>
-      </m:oMath>
-      <w:r>
-        <w:t xml:space="preserve"> </w:t>
-      </w:r>
-      <w:r>
-        <w:t xml:space="preserve">species).</w:t>
-      </w:r>
-    </w:p>
-    <w:p>
-      <w:pPr>
-        <w:pStyle w:val="BodyText"/>
-      </w:pPr>
-      <w:r>
-        <w:t xml:space="preserve">In addition, successful simulations starting from North America generally started from an ancestor located closer to the isthmus of Panama than those starting from South America (</w:t>
-      </w:r>
-      <w:hyperlink w:anchor="fig-metrics">
-        <w:r>
-          <w:rPr>
-            <w:rStyle w:val="Hyperlink"/>
-          </w:rPr>
-          <w:t xml:space="preserve">Figure 3</w:t>
-        </w:r>
-      </w:hyperlink>
-      <w:r>
-        <w:t xml:space="preserve"> </w:t>
-      </w:r>
-      <w:r>
-        <w:t xml:space="preserve">C), again except for simulation generated under</w:t>
-      </w:r>
-      <w:r>
-        <w:t xml:space="preserve"> </w:t>
-      </w:r>
-      <m:oMath>
-        <m:r>
-          <m:t>M</m:t>
-        </m:r>
-        <m:r>
-          <m:t>3</m:t>
-        </m:r>
-      </m:oMath>
-      <w:r>
-        <w:t xml:space="preserve">. Also, we can highlight a general trend that ancestral species originated closer to the isthmus in the case of successful simulations compared to unsuccessful ones (Figure S6-7). Interestingly enough, the results obtained for this metric, just like those obtained for the other two, hold for simulations generated after standardising the initial distances to the isthmus of North American virtual species with those starting from South America (Figure S3).</w:t>
-      </w:r>
-    </w:p>
-    <w:bookmarkEnd w:id="24"/>
-    <w:bookmarkStart w:id="25" w:name="X82f98bdfcac253573425d1541df4621b4f5d747"/>
-    <w:p>
-      <w:pPr>
-        <w:pStyle w:val="Heading2"/>
-      </w:pPr>
-      <w:r>
-        <w:t xml:space="preserve">Biome selectivity of the simulated faunal exchanges</w:t>
-      </w:r>
-    </w:p>
-    <w:p>
-      <w:pPr>
-        <w:pStyle w:val="FirstParagraph"/>
-      </w:pPr>
-      <w:r>
-        <w:t xml:space="preserve">We classified the climatic landscape at the time of the simulation onset (</w:t>
-      </w:r>
-      <m:oMath>
-        <m:r>
-          <m:t>t</m:t>
-        </m:r>
-        <m:r>
-          <m:rPr>
-            <m:sty m:val="p"/>
-          </m:rPr>
-          <m:t>=</m:t>
-        </m:r>
-        <m:r>
-          <m:t>5</m:t>
-        </m:r>
-      </m:oMath>
-      <w:r>
-        <w:t xml:space="preserve"> </w:t>
-      </w:r>
-      <w:r>
-        <w:t xml:space="preserve">million years ago, Ma) following the five broad climatic zones proposed by Beck et al.</w:t>
-      </w:r>
-      <w:r>
-        <w:rPr>
-          <w:vertAlign w:val="superscript"/>
-        </w:rPr>
-        <w:t xml:space="preserve">42</w:t>
-      </w:r>
-      <w:r>
-        <w:t xml:space="preserve"> </w:t>
-      </w:r>
-      <w:r>
-        <w:t xml:space="preserve">and Galván et al.</w:t>
-      </w:r>
-      <w:r>
-        <w:rPr>
-          <w:vertAlign w:val="superscript"/>
-        </w:rPr>
-        <w:t xml:space="preserve">43</w:t>
-      </w:r>
-      <w:r>
-        <w:t xml:space="preserve">: Tropical, Arid, Temperate, Cold and Polar (</w:t>
-      </w:r>
-      <w:hyperlink w:anchor="fig-biome">
         <w:r>
           <w:rPr>
             <w:rStyle w:val="Hyperlink"/>
@@ -1616,67 +1099,9 @@
         <w:t xml:space="preserve"> </w:t>
       </w:r>
       <w:r>
-        <w:t xml:space="preserve">A). For each simulation, the ancestral species was therefore assigned an initial biome based on the location of the site where it originated, randomly drawn within an equal-area grid overlaying our landscape (see</w:t>
-      </w:r>
-      <w:r>
-        <w:t xml:space="preserve"> </w:t>
-      </w:r>
-      <w:r>
-        <w:rPr>
-          <w:i/>
-          <w:iCs/>
-        </w:rPr>
-        <w:t xml:space="preserve">STAR Methods</w:t>
-      </w:r>
-      <w:r>
-        <w:t xml:space="preserve">). Simulations generated under the</w:t>
-      </w:r>
-      <w:r>
-        <w:t xml:space="preserve"> </w:t>
-      </w:r>
-      <m:oMath>
-        <m:r>
-          <m:t>M</m:t>
-        </m:r>
-        <m:r>
-          <m:t>0</m:t>
-        </m:r>
-      </m:oMath>
-      <w:r>
-        <w:t xml:space="preserve"> </w:t>
-      </w:r>
-      <w:r>
-        <w:t xml:space="preserve">model – where climatic niche does not evolve – reflect the macroecological behaviour of biome specialists, maintaining an ecological affinity with the biome where they originated. On the other hand, species generated under the other models (</w:t>
-      </w:r>
-      <m:oMath>
-        <m:r>
-          <m:t>M</m:t>
-        </m:r>
-        <m:r>
-          <m:t>1</m:t>
-        </m:r>
-        <m:r>
-          <m:rPr>
-            <m:sty m:val="p"/>
-          </m:rPr>
-          <m:t>−</m:t>
-        </m:r>
-        <m:r>
-          <m:t>3</m:t>
-        </m:r>
-      </m:oMath>
-      <w:r>
-        <w:t xml:space="preserve">) – allowing climatic niche evolution over time – were considered biome generalists.</w:t>
-      </w:r>
-    </w:p>
-    <w:p>
-      <w:pPr>
-        <w:pStyle w:val="BodyText"/>
-      </w:pPr>
-      <w:r>
-        <w:t xml:space="preserve">Due to the unequal area occupied by each biome between the two continents, the number of simulations starting within each biome was largely uneven across biome classes and continents (</w:t>
-      </w:r>
-      <w:hyperlink w:anchor="fig-biome">
+        <w:t xml:space="preserve">A). Furthermore, species of North American origin that successfully made it to South America generally colonised a greater area than those of South American origin reaching North America (</w:t>
+      </w:r>
+      <w:hyperlink w:anchor="fig-metrics">
         <w:r>
           <w:rPr>
             <w:rStyle w:val="Hyperlink"/>
@@ -1688,11 +1113,37 @@
         <w:t xml:space="preserve"> </w:t>
       </w:r>
       <w:r>
-        <w:t xml:space="preserve">B). The majority of North American ancestral species originated in the cold biome (</w:t>
+        <w:t xml:space="preserve">A). This pattern is particularly striking for simulations generated under the</w:t>
+      </w:r>
+      <w:r>
+        <w:t xml:space="preserve"> </w:t>
       </w:r>
       <m:oMath>
         <m:r>
-          <m:t>57</m:t>
+          <m:t>M</m:t>
+        </m:r>
+        <m:r>
+          <m:t>0</m:t>
+        </m:r>
+      </m:oMath>
+      <w:r>
+        <w:t xml:space="preserve"> </w:t>
+      </w:r>
+      <w:r>
+        <w:t xml:space="preserve">model (</w:t>
+      </w:r>
+      <m:oMath>
+        <m:r>
+          <m:t>36.5</m:t>
+        </m:r>
+        <m:r>
+          <m:rPr>
+            <m:sty m:val="p"/>
+          </m:rPr>
+          <m:t>±</m:t>
+        </m:r>
+        <m:r>
+          <m:t>3.5</m:t>
         </m:r>
         <m:r>
           <m:rPr>
@@ -1702,11 +1153,23 @@
         </m:r>
       </m:oMath>
       <w:r>
-        <w:t xml:space="preserve">), whereas the tropical biome recorded the largest proportion of ancestral species origination in South America (</w:t>
+        <w:t xml:space="preserve"> </w:t>
+      </w:r>
+      <w:r>
+        <w:t xml:space="preserve">vs. </w:t>
       </w:r>
       <m:oMath>
         <m:r>
-          <m:t>58</m:t>
+          <m:t>11.7</m:t>
+        </m:r>
+        <m:r>
+          <m:rPr>
+            <m:sty m:val="p"/>
+          </m:rPr>
+          <m:t>±</m:t>
+        </m:r>
+        <m:r>
+          <m:t>0.4</m:t>
         </m:r>
         <m:r>
           <m:rPr>
@@ -1716,9 +1179,197 @@
         </m:r>
       </m:oMath>
       <w:r>
-        <w:t xml:space="preserve">). Standardising initial distances to the isthmus of Panama for simulations originating in North America increased the proportion of simulations originating under low latitudes, to the detriment of those originating in high latitude, less represented in South America (</w:t>
-      </w:r>
-      <w:hyperlink w:anchor="fig-biome">
+        <w:t xml:space="preserve">), and holds for all but the</w:t>
+      </w:r>
+      <w:r>
+        <w:t xml:space="preserve"> </w:t>
+      </w:r>
+      <m:oMath>
+        <m:r>
+          <m:t>M</m:t>
+        </m:r>
+        <m:r>
+          <m:t>3</m:t>
+        </m:r>
+      </m:oMath>
+      <w:r>
+        <w:t xml:space="preserve"> </w:t>
+      </w:r>
+      <w:r>
+        <w:t xml:space="preserve">model – relaxing the precipitation constraint on species’ niche –, the latter suggesting an opposite trend (</w:t>
+      </w:r>
+      <m:oMath>
+        <m:r>
+          <m:t>69.9</m:t>
+        </m:r>
+        <m:r>
+          <m:rPr>
+            <m:sty m:val="p"/>
+          </m:rPr>
+          <m:t>±</m:t>
+        </m:r>
+        <m:r>
+          <m:t>3.3</m:t>
+        </m:r>
+        <m:r>
+          <m:rPr>
+            <m:sty m:val="p"/>
+          </m:rPr>
+          <m:t>%</m:t>
+        </m:r>
+      </m:oMath>
+      <w:r>
+        <w:t xml:space="preserve"> </w:t>
+      </w:r>
+      <w:r>
+        <w:t xml:space="preserve">vs</w:t>
+      </w:r>
+      <w:r>
+        <w:t xml:space="preserve"> </w:t>
+      </w:r>
+      <m:oMath>
+        <m:r>
+          <m:t>79.4</m:t>
+        </m:r>
+        <m:r>
+          <m:rPr>
+            <m:sty m:val="p"/>
+          </m:rPr>
+          <m:t>±</m:t>
+        </m:r>
+        <m:r>
+          <m:t>3.9</m:t>
+        </m:r>
+        <m:r>
+          <m:rPr>
+            <m:sty m:val="p"/>
+          </m:rPr>
+          <m:t>%</m:t>
+        </m:r>
+      </m:oMath>
+      <w:r>
+        <w:t xml:space="preserve">). However, due to the difference in size (</w:t>
+      </w:r>
+      <w:r>
+        <w:rPr>
+          <w:i/>
+          <w:iCs/>
+        </w:rPr>
+        <w:t xml:space="preserve">i</w:t>
+      </w:r>
+      <w:r>
+        <w:t xml:space="preserve">.</w:t>
+      </w:r>
+      <w:r>
+        <w:rPr>
+          <w:i/>
+          <w:iCs/>
+        </w:rPr>
+        <w:t xml:space="preserve">e</w:t>
+      </w:r>
+      <w:r>
+        <w:t xml:space="preserve">., number of pixels) between the two continents (</w:t>
+      </w:r>
+      <w:hyperlink w:anchor="fig-framework">
+        <w:r>
+          <w:rPr>
+            <w:rStyle w:val="Hyperlink"/>
+          </w:rPr>
+          <w:t xml:space="preserve">Figure 2</w:t>
+        </w:r>
+      </w:hyperlink>
+      <w:r>
+        <w:t xml:space="preserve">), the actual colonised area (quantified as the number of colonised cells in our simulations) was greater when simulations generated under the</w:t>
+      </w:r>
+      <w:r>
+        <w:t xml:space="preserve"> </w:t>
+      </w:r>
+      <m:oMath>
+        <m:r>
+          <m:t>M</m:t>
+        </m:r>
+        <m:r>
+          <m:t>1</m:t>
+        </m:r>
+        <m:r>
+          <m:rPr>
+            <m:sty m:val="p"/>
+          </m:rPr>
+          <m:t>−</m:t>
+        </m:r>
+        <m:r>
+          <m:t>3</m:t>
+        </m:r>
+      </m:oMath>
+      <w:r>
+        <w:t xml:space="preserve"> </w:t>
+      </w:r>
+      <w:r>
+        <w:t xml:space="preserve">models started from South than North America, but remained larger when simulations were generated under</w:t>
+      </w:r>
+      <w:r>
+        <w:t xml:space="preserve"> </w:t>
+      </w:r>
+      <m:oMath>
+        <m:r>
+          <m:t>M</m:t>
+        </m:r>
+        <m:r>
+          <m:t>0</m:t>
+        </m:r>
+      </m:oMath>
+      <w:r>
+        <w:t xml:space="preserve"> </w:t>
+      </w:r>
+      <w:r>
+        <w:t xml:space="preserve">started from North America (Figure S13).</w:t>
+      </w:r>
+    </w:p>
+    <w:p>
+      <w:pPr>
+        <w:pStyle w:val="BodyText"/>
+      </w:pPr>
+      <w:r>
+        <w:t xml:space="preserve">Besides, contrary to the proportion of colonised area for a given ancestral continent, colonised diversity (</w:t>
+      </w:r>
+      <w:r>
+        <w:rPr>
+          <w:i/>
+          <w:iCs/>
+        </w:rPr>
+        <w:t xml:space="preserve">i</w:t>
+      </w:r>
+      <w:r>
+        <w:t xml:space="preserve">.</w:t>
+      </w:r>
+      <w:r>
+        <w:rPr>
+          <w:i/>
+          <w:iCs/>
+        </w:rPr>
+        <w:t xml:space="preserve">e</w:t>
+      </w:r>
+      <w:r>
+        <w:t xml:space="preserve">., the number of taxa within the colonised continent) does not vary significantly across our four models. However, a significant decrease is evident in simulations starting from North America generated under the</w:t>
+      </w:r>
+      <w:r>
+        <w:t xml:space="preserve"> </w:t>
+      </w:r>
+      <m:oMath>
+        <m:r>
+          <m:t>M</m:t>
+        </m:r>
+        <m:r>
+          <m:t>3</m:t>
+        </m:r>
+      </m:oMath>
+      <w:r>
+        <w:t xml:space="preserve"> </w:t>
+      </w:r>
+      <w:r>
+        <w:t xml:space="preserve">model (</w:t>
+      </w:r>
+      <w:hyperlink w:anchor="fig-metrics">
         <w:r>
           <w:rPr>
             <w:rStyle w:val="Hyperlink"/>
@@ -1730,187 +1381,578 @@
         <w:t xml:space="preserve"> </w:t>
       </w:r>
       <w:r>
-        <w:t xml:space="preserve">A and Figure S4). Consequently, this increased the representativity of the tropical (from</w:t>
+        <w:t xml:space="preserve">B). Moreover, ancestral continent does not seem to affect mean colonised diversity values in the case of the</w:t>
       </w:r>
       <w:r>
         <w:t xml:space="preserve"> </w:t>
       </w:r>
       <m:oMath>
         <m:r>
-          <m:t>5</m:t>
+          <m:t>M</m:t>
+        </m:r>
+        <m:r>
+          <m:t>1</m:t>
+        </m:r>
+      </m:oMath>
+      <w:r>
+        <w:t xml:space="preserve"> </w:t>
+      </w:r>
+      <w:r>
+        <w:t xml:space="preserve">(</w:t>
+      </w:r>
+      <m:oMath>
+        <m:r>
+          <m:t>212</m:t>
         </m:r>
         <m:r>
           <m:rPr>
             <m:sty m:val="p"/>
           </m:rPr>
-          <m:t>%</m:t>
+          <m:t>±</m:t>
+        </m:r>
+        <m:r>
+          <m:t>61</m:t>
         </m:r>
       </m:oMath>
       <w:r>
         <w:t xml:space="preserve"> </w:t>
       </w:r>
       <w:r>
-        <w:t xml:space="preserve">to</w:t>
-      </w:r>
-      <w:r>
-        <w:t xml:space="preserve"> </w:t>
+        <w:t xml:space="preserve">vs. </w:t>
       </w:r>
       <m:oMath>
         <m:r>
-          <m:t>10</m:t>
+          <m:t>170</m:t>
         </m:r>
         <m:r>
           <m:rPr>
             <m:sty m:val="p"/>
           </m:rPr>
-          <m:t>%</m:t>
+          <m:t>±</m:t>
+        </m:r>
+        <m:r>
+          <m:t>25</m:t>
         </m:r>
       </m:oMath>
       <w:r>
-        <w:t xml:space="preserve">) and arid (from</w:t>
+        <w:t xml:space="preserve"> </w:t>
+      </w:r>
+      <w:r>
+        <w:t xml:space="preserve">species respectively retrieved in the newly-colonised continent after starting from North or South America) and</w:t>
       </w:r>
       <w:r>
         <w:t xml:space="preserve"> </w:t>
       </w:r>
       <m:oMath>
         <m:r>
-          <m:t>16</m:t>
+          <m:t>M</m:t>
+        </m:r>
+        <m:r>
+          <m:t>2</m:t>
+        </m:r>
+      </m:oMath>
+      <w:r>
+        <w:t xml:space="preserve"> </w:t>
+      </w:r>
+      <w:r>
+        <w:t xml:space="preserve">(</w:t>
+      </w:r>
+      <m:oMath>
+        <m:r>
+          <m:t>161</m:t>
         </m:r>
         <m:r>
           <m:rPr>
             <m:sty m:val="p"/>
           </m:rPr>
-          <m:t>%</m:t>
+          <m:t>±</m:t>
+        </m:r>
+        <m:r>
+          <m:t>48</m:t>
         </m:r>
       </m:oMath>
       <w:r>
         <w:t xml:space="preserve"> </w:t>
       </w:r>
       <w:r>
-        <w:t xml:space="preserve">to</w:t>
-      </w:r>
-      <w:r>
-        <w:t xml:space="preserve"> </w:t>
+        <w:t xml:space="preserve">vs. </w:t>
       </w:r>
       <m:oMath>
         <m:r>
-          <m:t>26</m:t>
+          <m:t>171</m:t>
         </m:r>
         <m:r>
           <m:rPr>
             <m:sty m:val="p"/>
           </m:rPr>
-          <m:t>%</m:t>
+          <m:t>±</m:t>
+        </m:r>
+        <m:r>
+          <m:t>27</m:t>
         </m:r>
       </m:oMath>
       <w:r>
-        <w:t xml:space="preserve">) biomes in the starting ranges of simulations originating in North America, and decreased the proportion of simulations originating in the cold (from</w:t>
+        <w:t xml:space="preserve"> </w:t>
+      </w:r>
+      <w:r>
+        <w:t xml:space="preserve">species) models. It does however have an effect for simulations generated under</w:t>
       </w:r>
       <w:r>
         <w:t xml:space="preserve"> </w:t>
       </w:r>
       <m:oMath>
         <m:r>
-          <m:t>57</m:t>
+          <m:t>M</m:t>
+        </m:r>
+        <m:r>
+          <m:t>0</m:t>
+        </m:r>
+      </m:oMath>
+      <w:r>
+        <w:t xml:space="preserve">, with higher average values obtained for simulations starting from North America (</w:t>
+      </w:r>
+      <m:oMath>
+        <m:r>
+          <m:t>247</m:t>
         </m:r>
         <m:r>
           <m:rPr>
             <m:sty m:val="p"/>
           </m:rPr>
-          <m:t>%</m:t>
+          <m:t>±</m:t>
+        </m:r>
+        <m:r>
+          <m:t>85</m:t>
         </m:r>
       </m:oMath>
       <w:r>
         <w:t xml:space="preserve"> </w:t>
       </w:r>
       <w:r>
-        <w:t xml:space="preserve">to</w:t>
-      </w:r>
-      <w:r>
-        <w:t xml:space="preserve"> </w:t>
+        <w:t xml:space="preserve">vs. </w:t>
       </w:r>
       <m:oMath>
         <m:r>
-          <m:t>40</m:t>
+          <m:t>79</m:t>
         </m:r>
         <m:r>
           <m:rPr>
             <m:sty m:val="p"/>
           </m:rPr>
-          <m:t>%</m:t>
+          <m:t>±</m:t>
+        </m:r>
+        <m:r>
+          <m:t>20</m:t>
         </m:r>
       </m:oMath>
       <w:r>
-        <w:t xml:space="preserve">) and polar (from</w:t>
+        <w:t xml:space="preserve"> </w:t>
+      </w:r>
+      <w:r>
+        <w:t xml:space="preserve">species).</w:t>
+      </w:r>
+    </w:p>
+    <w:p>
+      <w:pPr>
+        <w:pStyle w:val="BodyText"/>
+      </w:pPr>
+      <w:r>
+        <w:t xml:space="preserve">In addition, successful simulations starting from North America generally started from an ancestor located closer to the isthmus of Panama than those starting from South America (</w:t>
+      </w:r>
+      <w:hyperlink w:anchor="fig-metrics">
+        <w:r>
+          <w:rPr>
+            <w:rStyle w:val="Hyperlink"/>
+          </w:rPr>
+          <w:t xml:space="preserve">Figure 4</w:t>
+        </w:r>
+      </w:hyperlink>
+      <w:r>
+        <w:t xml:space="preserve"> </w:t>
+      </w:r>
+      <w:r>
+        <w:t xml:space="preserve">C), again except for simulation generated under</w:t>
       </w:r>
       <w:r>
         <w:t xml:space="preserve"> </w:t>
       </w:r>
       <m:oMath>
         <m:r>
-          <m:t>4</m:t>
+          <m:t>M</m:t>
+        </m:r>
+        <m:r>
+          <m:t>3</m:t>
+        </m:r>
+      </m:oMath>
+      <w:r>
+        <w:t xml:space="preserve">. Also, we can highlight a general trend that ancestral species originated closer to the isthmus in the case of successful simulations compared to unsuccessful ones (Figure S6-7). Interestingly enough, the results obtained for this metric, just like those obtained for the other two, hold for simulations generated after standardising the initial distances to the isthmus of North American virtual species with those starting from South America (Figure S3).</w:t>
+      </w:r>
+    </w:p>
+    <w:bookmarkEnd w:id="24"/>
+    <w:bookmarkStart w:id="25" w:name="X82f98bdfcac253573425d1541df4621b4f5d747"/>
+    <w:p>
+      <w:pPr>
+        <w:pStyle w:val="Heading2"/>
+      </w:pPr>
+      <w:r>
+        <w:t xml:space="preserve">Biome selectivity of the simulated faunal exchanges</w:t>
+      </w:r>
+    </w:p>
+    <w:p>
+      <w:pPr>
+        <w:pStyle w:val="FirstParagraph"/>
+      </w:pPr>
+      <w:r>
+        <w:t xml:space="preserve">We classified the climatic landscape at the time of the simulation onset (</w:t>
+      </w:r>
+      <m:oMath>
+        <m:r>
+          <m:t>t</m:t>
         </m:r>
         <m:r>
           <m:rPr>
             <m:sty m:val="p"/>
           </m:rPr>
-          <m:t>%</m:t>
+          <m:t>=</m:t>
+        </m:r>
+        <m:r>
+          <m:t>5</m:t>
         </m:r>
       </m:oMath>
       <w:r>
         <w:t xml:space="preserve"> </w:t>
       </w:r>
       <w:r>
-        <w:t xml:space="preserve">to</w:t>
-      </w:r>
-      <w:r>
-        <w:t xml:space="preserve"> </w:t>
-      </w:r>
-      <m:oMath>
-        <m:r>
-          <m:t>2</m:t>
-        </m:r>
-        <m:r>
-          <m:rPr>
-            <m:sty m:val="p"/>
-          </m:rPr>
-          <m:t>%</m:t>
-        </m:r>
-      </m:oMath>
-      <w:r>
-        <w:t xml:space="preserve">) biomes (Figure S9).</w:t>
-      </w:r>
-    </w:p>
-    <w:p>
-      <w:pPr>
-        <w:pStyle w:val="BodyText"/>
-      </w:pPr>
-      <w:r>
-        <w:t xml:space="preserve">Despite this initial imbalance, when simulations were generated under the</w:t>
-      </w:r>
-      <w:r>
-        <w:t xml:space="preserve"> </w:t>
-      </w:r>
-      <m:oMath>
-        <m:r>
-          <m:t>M</m:t>
-        </m:r>
-        <m:r>
-          <m:t>0</m:t>
-        </m:r>
-      </m:oMath>
-      <w:r>
-        <w:t xml:space="preserve"> </w:t>
-      </w:r>
-      <w:r>
-        <w:t xml:space="preserve">model, our results suggest similar exchange intensity patterns between simulations starting from North and South America (</w:t>
+        <w:t xml:space="preserve">million years ago, Ma) following the five broad climatic zones proposed by Beck et al.</w:t>
+      </w:r>
+      <w:r>
+        <w:rPr>
+          <w:vertAlign w:val="superscript"/>
+        </w:rPr>
+        <w:t xml:space="preserve">42</w:t>
+      </w:r>
+      <w:r>
+        <w:t xml:space="preserve"> </w:t>
+      </w:r>
+      <w:r>
+        <w:t xml:space="preserve">and Galván et al.</w:t>
+      </w:r>
+      <w:r>
+        <w:rPr>
+          <w:vertAlign w:val="superscript"/>
+        </w:rPr>
+        <w:t xml:space="preserve">43</w:t>
+      </w:r>
+      <w:r>
+        <w:t xml:space="preserve">: Tropical, Arid, Temperate, Cold and Polar (</w:t>
       </w:r>
       <w:hyperlink w:anchor="fig-biome">
         <w:r>
           <w:rPr>
             <w:rStyle w:val="Hyperlink"/>
           </w:rPr>
-          <w:t xml:space="preserve">Figure 4</w:t>
+          <w:t xml:space="preserve">Figure 5</w:t>
+        </w:r>
+      </w:hyperlink>
+      <w:r>
+        <w:t xml:space="preserve"> </w:t>
+      </w:r>
+      <w:r>
+        <w:t xml:space="preserve">A). For each simulation, the ancestral species was therefore assigned an initial biome based on the location of the site where it originated, randomly drawn within an equal-area grid overlaying our landscape (see</w:t>
+      </w:r>
+      <w:r>
+        <w:t xml:space="preserve"> </w:t>
+      </w:r>
+      <w:r>
+        <w:rPr>
+          <w:i/>
+          <w:iCs/>
+        </w:rPr>
+        <w:t xml:space="preserve">STAR Methods</w:t>
+      </w:r>
+      <w:r>
+        <w:t xml:space="preserve">). Simulations generated under the</w:t>
+      </w:r>
+      <w:r>
+        <w:t xml:space="preserve"> </w:t>
+      </w:r>
+      <m:oMath>
+        <m:r>
+          <m:t>M</m:t>
+        </m:r>
+        <m:r>
+          <m:t>0</m:t>
+        </m:r>
+      </m:oMath>
+      <w:r>
+        <w:t xml:space="preserve"> </w:t>
+      </w:r>
+      <w:r>
+        <w:t xml:space="preserve">model – where climatic niche does not evolve – reflect the macroecological behaviour of biome specialists, maintaining an ecological affinity with the biome where they originated. On the other hand, species generated under the other models (</w:t>
+      </w:r>
+      <m:oMath>
+        <m:r>
+          <m:t>M</m:t>
+        </m:r>
+        <m:r>
+          <m:t>1</m:t>
+        </m:r>
+        <m:r>
+          <m:rPr>
+            <m:sty m:val="p"/>
+          </m:rPr>
+          <m:t>−</m:t>
+        </m:r>
+        <m:r>
+          <m:t>3</m:t>
+        </m:r>
+      </m:oMath>
+      <w:r>
+        <w:t xml:space="preserve">) – allowing climatic niche evolution over time – were considered biome generalists.</w:t>
+      </w:r>
+    </w:p>
+    <w:p>
+      <w:pPr>
+        <w:pStyle w:val="BodyText"/>
+      </w:pPr>
+      <w:r>
+        <w:t xml:space="preserve">Due to the unequal area occupied by each biome between the two continents, the number of simulations starting within each biome was largely uneven across biome classes and continents (</w:t>
+      </w:r>
+      <w:hyperlink w:anchor="fig-biome">
+        <w:r>
+          <w:rPr>
+            <w:rStyle w:val="Hyperlink"/>
+          </w:rPr>
+          <w:t xml:space="preserve">Figure 5</w:t>
+        </w:r>
+      </w:hyperlink>
+      <w:r>
+        <w:t xml:space="preserve"> </w:t>
+      </w:r>
+      <w:r>
+        <w:t xml:space="preserve">B). The majority of North American ancestral species originated in the cold biome (</w:t>
+      </w:r>
+      <m:oMath>
+        <m:r>
+          <m:t>57</m:t>
+        </m:r>
+        <m:r>
+          <m:rPr>
+            <m:sty m:val="p"/>
+          </m:rPr>
+          <m:t>%</m:t>
+        </m:r>
+      </m:oMath>
+      <w:r>
+        <w:t xml:space="preserve">), whereas the tropical biome recorded the largest proportion of ancestral species origination in South America (</w:t>
+      </w:r>
+      <m:oMath>
+        <m:r>
+          <m:t>58</m:t>
+        </m:r>
+        <m:r>
+          <m:rPr>
+            <m:sty m:val="p"/>
+          </m:rPr>
+          <m:t>%</m:t>
+        </m:r>
+      </m:oMath>
+      <w:r>
+        <w:t xml:space="preserve">). Standardising initial distances to the isthmus of Panama for simulations originating in North America increased the proportion of simulations originating under low latitudes, to the detriment of those originating in high latitude, less represented in South America (</w:t>
+      </w:r>
+      <w:hyperlink w:anchor="fig-biome">
+        <w:r>
+          <w:rPr>
+            <w:rStyle w:val="Hyperlink"/>
+          </w:rPr>
+          <w:t xml:space="preserve">Figure 5</w:t>
+        </w:r>
+      </w:hyperlink>
+      <w:r>
+        <w:t xml:space="preserve"> </w:t>
+      </w:r>
+      <w:r>
+        <w:t xml:space="preserve">A and Figure S4). Consequently, this increased the representativity of the tropical (from</w:t>
+      </w:r>
+      <w:r>
+        <w:t xml:space="preserve"> </w:t>
+      </w:r>
+      <m:oMath>
+        <m:r>
+          <m:t>5</m:t>
+        </m:r>
+        <m:r>
+          <m:rPr>
+            <m:sty m:val="p"/>
+          </m:rPr>
+          <m:t>%</m:t>
+        </m:r>
+      </m:oMath>
+      <w:r>
+        <w:t xml:space="preserve"> </w:t>
+      </w:r>
+      <w:r>
+        <w:t xml:space="preserve">to</w:t>
+      </w:r>
+      <w:r>
+        <w:t xml:space="preserve"> </w:t>
+      </w:r>
+      <m:oMath>
+        <m:r>
+          <m:t>10</m:t>
+        </m:r>
+        <m:r>
+          <m:rPr>
+            <m:sty m:val="p"/>
+          </m:rPr>
+          <m:t>%</m:t>
+        </m:r>
+      </m:oMath>
+      <w:r>
+        <w:t xml:space="preserve">) and arid (from</w:t>
+      </w:r>
+      <w:r>
+        <w:t xml:space="preserve"> </w:t>
+      </w:r>
+      <m:oMath>
+        <m:r>
+          <m:t>16</m:t>
+        </m:r>
+        <m:r>
+          <m:rPr>
+            <m:sty m:val="p"/>
+          </m:rPr>
+          <m:t>%</m:t>
+        </m:r>
+      </m:oMath>
+      <w:r>
+        <w:t xml:space="preserve"> </w:t>
+      </w:r>
+      <w:r>
+        <w:t xml:space="preserve">to</w:t>
+      </w:r>
+      <w:r>
+        <w:t xml:space="preserve"> </w:t>
+      </w:r>
+      <m:oMath>
+        <m:r>
+          <m:t>26</m:t>
+        </m:r>
+        <m:r>
+          <m:rPr>
+            <m:sty m:val="p"/>
+          </m:rPr>
+          <m:t>%</m:t>
+        </m:r>
+      </m:oMath>
+      <w:r>
+        <w:t xml:space="preserve">) biomes in the starting ranges of simulations originating in North America, and decreased the proportion of simulations originating in the cold (from</w:t>
+      </w:r>
+      <w:r>
+        <w:t xml:space="preserve"> </w:t>
+      </w:r>
+      <m:oMath>
+        <m:r>
+          <m:t>57</m:t>
+        </m:r>
+        <m:r>
+          <m:rPr>
+            <m:sty m:val="p"/>
+          </m:rPr>
+          <m:t>%</m:t>
+        </m:r>
+      </m:oMath>
+      <w:r>
+        <w:t xml:space="preserve"> </w:t>
+      </w:r>
+      <w:r>
+        <w:t xml:space="preserve">to</w:t>
+      </w:r>
+      <w:r>
+        <w:t xml:space="preserve"> </w:t>
+      </w:r>
+      <m:oMath>
+        <m:r>
+          <m:t>40</m:t>
+        </m:r>
+        <m:r>
+          <m:rPr>
+            <m:sty m:val="p"/>
+          </m:rPr>
+          <m:t>%</m:t>
+        </m:r>
+      </m:oMath>
+      <w:r>
+        <w:t xml:space="preserve">) and polar (from</w:t>
+      </w:r>
+      <w:r>
+        <w:t xml:space="preserve"> </w:t>
+      </w:r>
+      <m:oMath>
+        <m:r>
+          <m:t>4</m:t>
+        </m:r>
+        <m:r>
+          <m:rPr>
+            <m:sty m:val="p"/>
+          </m:rPr>
+          <m:t>%</m:t>
+        </m:r>
+      </m:oMath>
+      <w:r>
+        <w:t xml:space="preserve"> </w:t>
+      </w:r>
+      <w:r>
+        <w:t xml:space="preserve">to</w:t>
+      </w:r>
+      <w:r>
+        <w:t xml:space="preserve"> </w:t>
+      </w:r>
+      <m:oMath>
+        <m:r>
+          <m:t>2</m:t>
+        </m:r>
+        <m:r>
+          <m:rPr>
+            <m:sty m:val="p"/>
+          </m:rPr>
+          <m:t>%</m:t>
+        </m:r>
+      </m:oMath>
+      <w:r>
+        <w:t xml:space="preserve">) biomes (Figure S9).</w:t>
+      </w:r>
+    </w:p>
+    <w:p>
+      <w:pPr>
+        <w:pStyle w:val="BodyText"/>
+      </w:pPr>
+      <w:r>
+        <w:t xml:space="preserve">Despite this initial imbalance, when simulations were generated under the</w:t>
+      </w:r>
+      <w:r>
+        <w:t xml:space="preserve"> </w:t>
+      </w:r>
+      <m:oMath>
+        <m:r>
+          <m:t>M</m:t>
+        </m:r>
+        <m:r>
+          <m:t>0</m:t>
+        </m:r>
+      </m:oMath>
+      <w:r>
+        <w:t xml:space="preserve"> </w:t>
+      </w:r>
+      <w:r>
+        <w:t xml:space="preserve">model, our results suggest similar exchange intensity patterns between simulations starting from North and South America (</w:t>
+      </w:r>
+      <w:hyperlink w:anchor="fig-biome">
+        <w:r>
+          <w:rPr>
+            <w:rStyle w:val="Hyperlink"/>
+          </w:rPr>
+          <w:t xml:space="preserve">Figure 5</w:t>
         </w:r>
       </w:hyperlink>
       <w:r>
@@ -2351,7 +2393,7 @@
           <w:rPr>
             <w:rStyle w:val="Hyperlink"/>
           </w:rPr>
-          <w:t xml:space="preserve">Figure 4</w:t>
+          <w:t xml:space="preserve">Figure 5</w:t>
         </w:r>
       </w:hyperlink>
       <w:r>
@@ -2422,7 +2464,7 @@
           <w:rPr>
             <w:rStyle w:val="Hyperlink"/>
           </w:rPr>
-          <w:t xml:space="preserve">Figure 4</w:t>
+          <w:t xml:space="preserve">Figure 5</w:t>
         </w:r>
       </w:hyperlink>
       <w:r>
@@ -2473,7 +2515,7 @@
           <w:rPr>
             <w:rStyle w:val="Hyperlink"/>
           </w:rPr>
-          <w:t xml:space="preserve">Figure 4</w:t>
+          <w:t xml:space="preserve">Figure 5</w:t>
         </w:r>
       </w:hyperlink>
       <w:r>
@@ -2566,7 +2608,7 @@
           <w:rPr>
             <w:rStyle w:val="Hyperlink"/>
           </w:rPr>
-          <w:t xml:space="preserve">Figure 2</w:t>
+          <w:t xml:space="preserve">Figure 3</w:t>
         </w:r>
       </w:hyperlink>
       <w:r>
@@ -2672,7 +2714,7 @@
           <w:rPr>
             <w:rStyle w:val="Hyperlink"/>
           </w:rPr>
-          <w:t xml:space="preserve">Figure 2</w:t>
+          <w:t xml:space="preserve">Figure 3</w:t>
         </w:r>
       </w:hyperlink>
       <w:r>
@@ -2887,7 +2929,7 @@
           <w:rPr>
             <w:rStyle w:val="Hyperlink"/>
           </w:rPr>
-          <w:t xml:space="preserve">Figure 1</w:t>
+          <w:t xml:space="preserve">Figure 2</w:t>
         </w:r>
       </w:hyperlink>
       <w:r>
@@ -2969,6 +3011,284 @@
         <w:t xml:space="preserve">– were found to have a high prevalence of crossing the isthmus (</w:t>
       </w:r>
       <w:hyperlink w:anchor="fig-biome">
+        <w:r>
+          <w:rPr>
+            <w:rStyle w:val="Hyperlink"/>
+          </w:rPr>
+          <w:t xml:space="preserve">Figure 5</w:t>
+        </w:r>
+      </w:hyperlink>
+      <w:r>
+        <w:t xml:space="preserve"> </w:t>
+      </w:r>
+      <w:r>
+        <w:t xml:space="preserve">C, model</w:t>
+      </w:r>
+      <w:r>
+        <w:t xml:space="preserve"> </w:t>
+      </w:r>
+      <m:oMath>
+        <m:r>
+          <m:t>M</m:t>
+        </m:r>
+        <m:r>
+          <m:t>0</m:t>
+        </m:r>
+      </m:oMath>
+      <w:r>
+        <w:t xml:space="preserve">). However, the prevalence of tropical specialists from South America to disperse to the North was found to be almost equally-high, largely exceeding that of other biome specialists (</w:t>
+      </w:r>
+      <w:hyperlink w:anchor="fig-biome">
+        <w:r>
+          <w:rPr>
+            <w:rStyle w:val="Hyperlink"/>
+          </w:rPr>
+          <w:t xml:space="preserve">Figure 5</w:t>
+        </w:r>
+      </w:hyperlink>
+      <w:r>
+        <w:t xml:space="preserve"> </w:t>
+      </w:r>
+      <w:r>
+        <w:t xml:space="preserve">C, model</w:t>
+      </w:r>
+      <w:r>
+        <w:t xml:space="preserve"> </w:t>
+      </w:r>
+      <m:oMath>
+        <m:r>
+          <m:t>M</m:t>
+        </m:r>
+        <m:r>
+          <m:t>0</m:t>
+        </m:r>
+      </m:oMath>
+      <w:r>
+        <w:t xml:space="preserve">). This goes against Vrba’s seminal hypothesis, instead predicting that fewer mammals – only biome generalists or open-habitat specialists – from South America would be expected to roam the other way around in case of tropical contraction towards the equator. This finding could reflect an attenuated magnitude of the climatic fragmentation of the Panamanian region when compared to historical biome reconstructions</w:t>
+      </w:r>
+      <w:r>
+        <w:rPr>
+          <w:i/>
+          <w:iCs/>
+          <w:vertAlign w:val="superscript"/>
+        </w:rPr>
+        <w:t xml:space="preserve">e</w:t>
+      </w:r>
+      <w:r>
+        <w:rPr>
+          <w:vertAlign w:val="superscript"/>
+        </w:rPr>
+        <w:t xml:space="preserve">.</w:t>
+      </w:r>
+      <w:r>
+        <w:rPr>
+          <w:i/>
+          <w:iCs/>
+          <w:vertAlign w:val="superscript"/>
+        </w:rPr>
+        <w:t xml:space="preserve">g</w:t>
+      </w:r>
+      <w:r>
+        <w:rPr>
+          <w:vertAlign w:val="superscript"/>
+        </w:rPr>
+        <w:t xml:space="preserve">., 14</w:t>
+      </w:r>
+      <w:r>
+        <w:t xml:space="preserve">, with the persistence of a tropical corridor in turn promoting the exchange of tropical specialists between both landmasses.</w:t>
+      </w:r>
+    </w:p>
+    <w:p>
+      <w:pPr>
+        <w:pStyle w:val="BodyText"/>
+      </w:pPr>
+      <w:r>
+        <w:t xml:space="preserve">On average, one simulated radiation of open biome –</w:t>
+      </w:r>
+      <w:r>
+        <w:t xml:space="preserve"> </w:t>
+      </w:r>
+      <w:r>
+        <w:rPr>
+          <w:i/>
+          <w:iCs/>
+        </w:rPr>
+        <w:t xml:space="preserve">i</w:t>
+      </w:r>
+      <w:r>
+        <w:t xml:space="preserve">.</w:t>
+      </w:r>
+      <w:r>
+        <w:rPr>
+          <w:i/>
+          <w:iCs/>
+        </w:rPr>
+        <w:t xml:space="preserve">e</w:t>
+      </w:r>
+      <w:r>
+        <w:t xml:space="preserve">., arid or temperate – specialists out of four resulted in a successful exchange, irrespective of its ancestral continent (</w:t>
+      </w:r>
+      <w:hyperlink w:anchor="fig-biome">
+        <w:r>
+          <w:rPr>
+            <w:rStyle w:val="Hyperlink"/>
+          </w:rPr>
+          <w:t xml:space="preserve">Figure 5</w:t>
+        </w:r>
+      </w:hyperlink>
+      <w:r>
+        <w:t xml:space="preserve"> </w:t>
+      </w:r>
+      <w:r>
+        <w:t xml:space="preserve">C, model</w:t>
+      </w:r>
+      <w:r>
+        <w:t xml:space="preserve"> </w:t>
+      </w:r>
+      <m:oMath>
+        <m:r>
+          <m:t>M</m:t>
+        </m:r>
+        <m:r>
+          <m:t>0</m:t>
+        </m:r>
+      </m:oMath>
+      <w:r>
+        <w:t xml:space="preserve">). This proportion is significantly lower than that obtained for tropical specialists. Yet, it has long been acknowledged that the migrant fossil record across both sides of the isthmus was essentially composed of taxa showing affinity with open biomes</w:t>
+      </w:r>
+      <w:r>
+        <w:rPr>
+          <w:i/>
+          <w:iCs/>
+          <w:vertAlign w:val="superscript"/>
+        </w:rPr>
+        <w:t xml:space="preserve">e</w:t>
+      </w:r>
+      <w:r>
+        <w:rPr>
+          <w:vertAlign w:val="superscript"/>
+        </w:rPr>
+        <w:t xml:space="preserve">.</w:t>
+      </w:r>
+      <w:r>
+        <w:rPr>
+          <w:i/>
+          <w:iCs/>
+          <w:vertAlign w:val="superscript"/>
+        </w:rPr>
+        <w:t xml:space="preserve">g</w:t>
+      </w:r>
+      <w:r>
+        <w:rPr>
+          <w:vertAlign w:val="superscript"/>
+        </w:rPr>
+        <w:t xml:space="preserve">., 24</w:t>
+      </w:r>
+      <w:r>
+        <w:t xml:space="preserve">. Among the most emblematic, we find for instance equids, proboscids or camelids on the South American side, and ground sloths, toxodontids or glyptodontids on the North American side. The co-occurrence of distinct taxa in temporally well-delimited fossil assemblages led palaeontologists to postulate that the GABI was in fact a succession of exchange pulses punctuated by phases of interruption, further related to the climate-driven oscillations between savannah and rainforest in Central America during the Pleistocene</w:t>
+      </w:r>
+      <w:r>
+        <w:rPr>
+          <w:vertAlign w:val="superscript"/>
+        </w:rPr>
+        <w:t xml:space="preserve">14</w:t>
+      </w:r>
+      <w:r>
+        <w:t xml:space="preserve">. Under such an assumption, the majority of exchanged taxa would therefore have ecologies suited to open habitats, and would have preferentially dispersed during Pleistocene glaciations</w:t>
+      </w:r>
+      <w:r>
+        <w:rPr>
+          <w:vertAlign w:val="superscript"/>
+        </w:rPr>
+        <w:t xml:space="preserve">11,13</w:t>
+      </w:r>
+      <w:r>
+        <w:t xml:space="preserve">. As mentioned by Weir</w:t>
+      </w:r>
+      <w:r>
+        <w:rPr>
+          <w:vertAlign w:val="superscript"/>
+        </w:rPr>
+        <w:t xml:space="preserve">50</w:t>
+      </w:r>
+      <w:r>
+        <w:t xml:space="preserve">, the American mammal fossil record is highly biased, with few occurrences coming from low-latitude tropical regions, which is particularly striking in South America</w:t>
+      </w:r>
+      <w:r>
+        <w:rPr>
+          <w:i/>
+          <w:iCs/>
+          <w:vertAlign w:val="superscript"/>
+        </w:rPr>
+        <w:t xml:space="preserve">e</w:t>
+      </w:r>
+      <w:r>
+        <w:rPr>
+          <w:vertAlign w:val="superscript"/>
+        </w:rPr>
+        <w:t xml:space="preserve">.</w:t>
+      </w:r>
+      <w:r>
+        <w:rPr>
+          <w:i/>
+          <w:iCs/>
+          <w:vertAlign w:val="superscript"/>
+        </w:rPr>
+        <w:t xml:space="preserve">g</w:t>
+      </w:r>
+      <w:r>
+        <w:rPr>
+          <w:vertAlign w:val="superscript"/>
+        </w:rPr>
+        <w:t xml:space="preserve">., 56,57</w:t>
+      </w:r>
+      <w:r>
+        <w:t xml:space="preserve">. Furthermore, evidence from extant mammal taxa suggest a strong tropical niche conservatism, that is, the trend according to which newly-originated tropical taxa would remain inhabiting under tropical climates</w:t>
+      </w:r>
+      <w:r>
+        <w:rPr>
+          <w:vertAlign w:val="superscript"/>
+        </w:rPr>
+        <w:t xml:space="preserve">49,58</w:t>
+      </w:r>
+      <w:r>
+        <w:t xml:space="preserve">. Thus, the fossil-derived number of mammal exchanges must have been greatly underestimated, with little fossil evidence of interchange constrained to the tropical biome, as stressed by Carrillo</w:t>
+      </w:r>
+      <w:r>
+        <w:rPr>
+          <w:vertAlign w:val="superscript"/>
+        </w:rPr>
+        <w:t xml:space="preserve">16</w:t>
+      </w:r>
+      <w:r>
+        <w:t xml:space="preserve">. Thus, one can wonder: could the empirically-derived migration imbalance in favour of North American taxa dispersing southwards be altered by the tropical niche conservatism of south-to-north migrants, thereby obscuring the actual number of intercontinental exchanges?</w:t>
+      </w:r>
+    </w:p>
+    <w:p>
+      <w:pPr>
+        <w:pStyle w:val="BodyText"/>
+      </w:pPr>
+      <w:r>
+        <w:t xml:space="preserve">Our findings revealed that radiations following a colonisation of South America were more spatially spread than those arising from a northwards dispersal, except for simulations generated under the</w:t>
+      </w:r>
+      <w:r>
+        <w:t xml:space="preserve"> </w:t>
+      </w:r>
+      <m:oMath>
+        <m:r>
+          <m:t>M</m:t>
+        </m:r>
+        <m:r>
+          <m:t>3</m:t>
+        </m:r>
+      </m:oMath>
+      <w:r>
+        <w:t xml:space="preserve"> </w:t>
+      </w:r>
+      <w:r>
+        <w:t xml:space="preserve">model (</w:t>
+      </w:r>
+      <w:hyperlink w:anchor="fig-metrics">
         <w:r>
           <w:rPr>
             <w:rStyle w:val="Hyperlink"/>
@@ -2980,7 +3300,7 @@
         <w:t xml:space="preserve"> </w:t>
       </w:r>
       <w:r>
-        <w:t xml:space="preserve">C, model</w:t>
+        <w:t xml:space="preserve">A). The spatial spread of a migrant radiation was measured by the proportion of cells occupied within the newly-colonised continent relative to the size of the latter. When focusing on the absolute number of cells colonised – therefore without controlling for the area, in terms of number of cells, of the newly-colonised continent – such a finding only holds for successful simulations generated under</w:t>
       </w:r>
       <w:r>
         <w:t xml:space="preserve"> </w:t>
@@ -2994,9 +3314,290 @@
         </m:r>
       </m:oMath>
       <w:r>
-        <w:t xml:space="preserve">). However, the prevalence of tropical specialists from South America to disperse to the North was found to be almost equally-high, largely exceeding that of other biome specialists (</w:t>
+        <w:t xml:space="preserve"> </w:t>
+      </w:r>
+      <w:r>
+        <w:t xml:space="preserve">(Figure S13). This mirrors the fact that simulated tropical specialists from South America were more intensively exchanged than other simulated biome specialists (</w:t>
       </w:r>
       <w:hyperlink w:anchor="fig-biome">
+        <w:r>
+          <w:rPr>
+            <w:rStyle w:val="Hyperlink"/>
+          </w:rPr>
+          <w:t xml:space="preserve">Figure 5</w:t>
+        </w:r>
+      </w:hyperlink>
+      <w:r>
+        <w:t xml:space="preserve"> </w:t>
+      </w:r>
+      <w:r>
+        <w:t xml:space="preserve">C). The imposed tropical niche conservatism therefore constrained them to remain in tropical regions of North America, that are less represented in tropical North America than in South America (</w:t>
+      </w:r>
+      <w:hyperlink w:anchor="fig-biome">
+        <w:r>
+          <w:rPr>
+            <w:rStyle w:val="Hyperlink"/>
+          </w:rPr>
+          <w:t xml:space="preserve">Figure 5</w:t>
+        </w:r>
+      </w:hyperlink>
+      <w:r>
+        <w:t xml:space="preserve"> </w:t>
+      </w:r>
+      <w:r>
+        <w:t xml:space="preserve">A). This adds some evidence supporting the fact that climate would have permitted South-to-North tropical exchanges to take place, but might have been obscured by a subsequent taphonomic bias in the fossil record, as suggested by studies relying on dated phylogenies</w:t>
+      </w:r>
+      <w:r>
+        <w:rPr>
+          <w:vertAlign w:val="superscript"/>
+        </w:rPr>
+        <w:t xml:space="preserve">12,16</w:t>
+      </w:r>
+      <w:r>
+        <w:t xml:space="preserve">. Hence, our study calls for thinking about the distinction between the ability to disperse towards, and ability to maintain within the foreign area. Those two distinct processes may have been ruled by different factors.</w:t>
+      </w:r>
+    </w:p>
+    <w:p>
+      <w:pPr>
+        <w:pStyle w:val="BodyText"/>
+      </w:pPr>
+      <w:r>
+        <w:t xml:space="preserve">We tested tropical niche conservatism (Figure S12 and S14)</w:t>
+      </w:r>
+    </w:p>
+    <w:p>
+      <w:pPr>
+        <w:pStyle w:val="BodyText"/>
+      </w:pPr>
+      <w:r>
+        <w:t xml:space="preserve">Our simulations cast doubt on the interplay between the aforementioned exchange pulses and temperature fluctuations, as exemplified by the combined times of occurrence of all successful exchanges (either southwards or northwards, depending on whether the simulation started from North or South America) occurring in all the simulations generated under a given landmass-scenario combination (Figure S11). In the case of northwards dispersal events, a gradual increase in exchange frequency from the Plio-Pleistocene boundary onwards is to be reported (Figure S11,</w:t>
+      </w:r>
+      <w:r>
+        <w:t xml:space="preserve"> </w:t>
+      </w:r>
+      <w:r>
+        <w:rPr>
+          <w:i/>
+          <w:iCs/>
+        </w:rPr>
+        <w:t xml:space="preserve">right</w:t>
+      </w:r>
+      <w:r>
+        <w:t xml:space="preserve">). This might reflect the average waiting time that virtual radiations take to reach the isthmian zone, directly proportional to their initial distance to the isthmus (Figure S4−5). Note that this explanation does not invoke any implication of climate. Regarding southwards exchanges, the same pattern seems to arise for simulations generated under the</w:t>
+      </w:r>
+      <w:r>
+        <w:t xml:space="preserve"> </w:t>
+      </w:r>
+      <m:oMath>
+        <m:r>
+          <m:t>M</m:t>
+        </m:r>
+        <m:r>
+          <m:t>1</m:t>
+        </m:r>
+      </m:oMath>
+      <w:r>
+        <w:t xml:space="preserve"> </w:t>
+      </w:r>
+      <w:r>
+        <w:t xml:space="preserve">model, but not under</w:t>
+      </w:r>
+      <w:r>
+        <w:t xml:space="preserve"> </w:t>
+      </w:r>
+      <m:oMath>
+        <m:r>
+          <m:t>M</m:t>
+        </m:r>
+        <m:r>
+          <m:t>0</m:t>
+        </m:r>
+      </m:oMath>
+      <w:r>
+        <w:t xml:space="preserve"> </w:t>
+      </w:r>
+      <w:r>
+        <w:t xml:space="preserve">(Figure S11). The distribution of the exchange times in the latter case rather exhibits sporadic pulses</w:t>
+      </w:r>
+      <w:r>
+        <w:t xml:space="preserve"> </w:t>
+      </w:r>
+      <w:r>
+        <w:rPr>
+          <w:i/>
+          <w:iCs/>
+        </w:rPr>
+        <w:t xml:space="preserve">ca.</w:t>
+      </w:r>
+      <w:r>
+        <w:t xml:space="preserve"> </w:t>
+      </w:r>
+      <w:r>
+        <w:t xml:space="preserve">0.2, 0.5, 0.8, 1.2, 1.9, 2.5 Ma, which could match with some temperature minima, but accurately testing such an observation would require additional data. Rather, the sporadic character of exchange pulses in that case could simply come from the relatively low amount of successful simulations as compared to other modelling scenarios (Table S3). Overall, our simulations suggest that the relationship between temperature minima and pulses of faunal exchange between the Americas seems to be more complex than previously stated</w:t>
+      </w:r>
+      <w:r>
+        <w:rPr>
+          <w:vertAlign w:val="superscript"/>
+        </w:rPr>
+        <w:t xml:space="preserve">11,</w:t>
+      </w:r>
+      <w:r>
+        <w:rPr>
+          <w:i/>
+          <w:iCs/>
+          <w:vertAlign w:val="superscript"/>
+        </w:rPr>
+        <w:t xml:space="preserve">e</w:t>
+      </w:r>
+      <w:r>
+        <w:rPr>
+          <w:vertAlign w:val="superscript"/>
+        </w:rPr>
+        <w:t xml:space="preserve">.</w:t>
+      </w:r>
+      <w:r>
+        <w:rPr>
+          <w:i/>
+          <w:iCs/>
+          <w:vertAlign w:val="superscript"/>
+        </w:rPr>
+        <w:t xml:space="preserve">g</w:t>
+      </w:r>
+      <w:r>
+        <w:rPr>
+          <w:vertAlign w:val="superscript"/>
+        </w:rPr>
+        <w:t xml:space="preserve">., 14,24,29,30</w:t>
+      </w:r>
+      <w:r>
+        <w:t xml:space="preserve">.</w:t>
+      </w:r>
+    </w:p>
+    <w:p>
+      <w:pPr>
+        <w:pStyle w:val="BodyText"/>
+      </w:pPr>
+      <w:r>
+        <w:t xml:space="preserve">Our findings nevertheless leave some space for possible random effects purely related to geography. Indeed, irrespective of the initial landmass, successful simulations originated on average closer to the isthmus of Panama than unsuccessful ones (Figures S6–7). This may suggest that some simulations were unsuccessful not only because of climatic filters, but also because they simply started too far from the landbridge and did not have the chance to reach it throughout the duration of the simulation. The relationship between the success of a taxon to make it to the other continent and the distance between its geographic range and the isthmus of Panama has long been postulated in the literature</w:t>
+      </w:r>
+      <w:r>
+        <w:rPr>
+          <w:i/>
+          <w:iCs/>
+          <w:vertAlign w:val="superscript"/>
+        </w:rPr>
+        <w:t xml:space="preserve">e</w:t>
+      </w:r>
+      <w:r>
+        <w:rPr>
+          <w:vertAlign w:val="superscript"/>
+        </w:rPr>
+        <w:t xml:space="preserve">.</w:t>
+      </w:r>
+      <w:r>
+        <w:rPr>
+          <w:i/>
+          <w:iCs/>
+          <w:vertAlign w:val="superscript"/>
+        </w:rPr>
+        <w:t xml:space="preserve">g</w:t>
+      </w:r>
+      <w:r>
+        <w:rPr>
+          <w:vertAlign w:val="superscript"/>
+        </w:rPr>
+        <w:t xml:space="preserve">., 19</w:t>
+      </w:r>
+      <w:r>
+        <w:t xml:space="preserve">. Webb</w:t>
+      </w:r>
+      <w:r>
+        <w:rPr>
+          <w:vertAlign w:val="superscript"/>
+        </w:rPr>
+        <w:t xml:space="preserve">14</w:t>
+      </w:r>
+      <w:r>
+        <w:t xml:space="preserve"> </w:t>
+      </w:r>
+      <w:r>
+        <w:t xml:space="preserve">greatly illustrated this view with the example of antilocaprids, that</w:t>
+      </w:r>
+      <w:r>
+        <w:t xml:space="preserve"> </w:t>
+      </w:r>
+      <w:r>
+        <w:t xml:space="preserve">“</w:t>
+      </w:r>
+      <w:r>
+        <w:t xml:space="preserve">were probably capable of living somewhere in the Andes, [but] were simply too far from the isthmian link to make the exodus</w:t>
+      </w:r>
+      <w:r>
+        <w:t xml:space="preserve">”</w:t>
+      </w:r>
+      <w:r>
+        <w:t xml:space="preserve">. A recent study characterised a negative correlation between the proportion of migrant taxa within fossil assemblages of either North or South America and the distance of the fossil assemblage to the Panamanian landbridge</w:t>
+      </w:r>
+      <w:r>
+        <w:rPr>
+          <w:vertAlign w:val="superscript"/>
+        </w:rPr>
+        <w:t xml:space="preserve">59</w:t>
+      </w:r>
+      <w:r>
+        <w:t xml:space="preserve">. Therefore, geographic contingency must have also had a significant role to play in the asymmetry of the GABI.</w:t>
+      </w:r>
+    </w:p>
+    <w:bookmarkEnd w:id="28"/>
+    <w:bookmarkStart w:id="29" w:name="limitations-and-perspectives"/>
+    <w:p>
+      <w:pPr>
+        <w:pStyle w:val="Heading2"/>
+      </w:pPr>
+      <w:r>
+        <w:t xml:space="preserve">Limitations and perspectives</w:t>
+      </w:r>
+    </w:p>
+    <w:p>
+      <w:pPr>
+        <w:pStyle w:val="FirstParagraph"/>
+      </w:pPr>
+      <w:r>
+        <w:t xml:space="preserve">Differences in the pace at which migrant and native lineages diversified have long been proposed to play a significant role in the asymmetry of the GABI. By reconstructing raw macroevolutionary dynamics from the fossil record, Marshall et al.</w:t>
+      </w:r>
+      <w:r>
+        <w:rPr>
+          <w:vertAlign w:val="superscript"/>
+        </w:rPr>
+        <w:t xml:space="preserve">2</w:t>
+      </w:r>
+      <w:r>
+        <w:t xml:space="preserve"> </w:t>
+      </w:r>
+      <w:r>
+        <w:t xml:space="preserve">highlighted that northern immigrant genera experienced notoriously higher origination and lower extinction rates than native lineages in South America. More recently, using a Bayesian framework accounting for preservation heterogeneities to infer fossil-based macroevolutionary trends, Carrillo et al.</w:t>
+      </w:r>
+      <w:r>
+        <w:rPr>
+          <w:vertAlign w:val="superscript"/>
+        </w:rPr>
+        <w:t xml:space="preserve">16</w:t>
+      </w:r>
+      <w:r>
+        <w:t xml:space="preserve"> </w:t>
+      </w:r>
+      <w:r>
+        <w:t xml:space="preserve">showed that the asymmetry of the GABI was not due to differences in origination or dispersal rates, but rather in extinction rates: native South American lineages experienced more extinctions in their home range than migrant lineages. In our simulations, for a species to go extinct, it needs to disappear from each cell across the landscape. As environmental filtering – in our case, the only force driving diversification – acts at the scale of a pixel, species extinction is therefore very rare. As a result, our framework did not allow us to relate the simulated environment-dependent inter-American faunal exchange with any diversification process. Realistic modelling of macroevolutionary processes is therefore an avenue towards improvements among mechanistic eco-evolutionary simulators, particularly in the framework of the GABI.</w:t>
+      </w:r>
+    </w:p>
+    <w:p>
+      <w:pPr>
+        <w:pStyle w:val="BodyText"/>
+      </w:pPr>
+      <w:r>
+        <w:t xml:space="preserve">Also, we evidenced a nuance between the proportion of colonised area and the absolute colonised area (</w:t>
+      </w:r>
+      <w:hyperlink w:anchor="fig-metrics">
         <w:r>
           <w:rPr>
             <w:rStyle w:val="Hyperlink"/>
@@ -3008,565 +3609,6 @@
         <w:t xml:space="preserve"> </w:t>
       </w:r>
       <w:r>
-        <w:t xml:space="preserve">C, model</w:t>
-      </w:r>
-      <w:r>
-        <w:t xml:space="preserve"> </w:t>
-      </w:r>
-      <m:oMath>
-        <m:r>
-          <m:t>M</m:t>
-        </m:r>
-        <m:r>
-          <m:t>0</m:t>
-        </m:r>
-      </m:oMath>
-      <w:r>
-        <w:t xml:space="preserve">). This goes against Vrba’s seminal hypothesis, instead predicting that fewer mammals – only biome generalists or open-habitat specialists – from South America would be expected to roam the other way around in case of tropical contraction towards the equator. This finding could reflect an attenuated magnitude of the climatic fragmentation of the Panamanian region when compared to historical biome reconstructions</w:t>
-      </w:r>
-      <w:r>
-        <w:rPr>
-          <w:i/>
-          <w:iCs/>
-          <w:vertAlign w:val="superscript"/>
-        </w:rPr>
-        <w:t xml:space="preserve">e</w:t>
-      </w:r>
-      <w:r>
-        <w:rPr>
-          <w:vertAlign w:val="superscript"/>
-        </w:rPr>
-        <w:t xml:space="preserve">.</w:t>
-      </w:r>
-      <w:r>
-        <w:rPr>
-          <w:i/>
-          <w:iCs/>
-          <w:vertAlign w:val="superscript"/>
-        </w:rPr>
-        <w:t xml:space="preserve">g</w:t>
-      </w:r>
-      <w:r>
-        <w:rPr>
-          <w:vertAlign w:val="superscript"/>
-        </w:rPr>
-        <w:t xml:space="preserve">., 14</w:t>
-      </w:r>
-      <w:r>
-        <w:t xml:space="preserve">, with the persistence of a tropical corridor in turn promoting the exchange of tropical specialists between both landmasses.</w:t>
-      </w:r>
-    </w:p>
-    <w:p>
-      <w:pPr>
-        <w:pStyle w:val="BodyText"/>
-      </w:pPr>
-      <w:r>
-        <w:t xml:space="preserve">On average, one simulated radiation of open biome –</w:t>
-      </w:r>
-      <w:r>
-        <w:t xml:space="preserve"> </w:t>
-      </w:r>
-      <w:r>
-        <w:rPr>
-          <w:i/>
-          <w:iCs/>
-        </w:rPr>
-        <w:t xml:space="preserve">i</w:t>
-      </w:r>
-      <w:r>
-        <w:t xml:space="preserve">.</w:t>
-      </w:r>
-      <w:r>
-        <w:rPr>
-          <w:i/>
-          <w:iCs/>
-        </w:rPr>
-        <w:t xml:space="preserve">e</w:t>
-      </w:r>
-      <w:r>
-        <w:t xml:space="preserve">., arid or temperate – specialists out of four resulted in a successful exchange, irrespective of its ancestral continent (</w:t>
-      </w:r>
-      <w:hyperlink w:anchor="fig-biome">
-        <w:r>
-          <w:rPr>
-            <w:rStyle w:val="Hyperlink"/>
-          </w:rPr>
-          <w:t xml:space="preserve">Figure 4</w:t>
-        </w:r>
-      </w:hyperlink>
-      <w:r>
-        <w:t xml:space="preserve"> </w:t>
-      </w:r>
-      <w:r>
-        <w:t xml:space="preserve">C, model</w:t>
-      </w:r>
-      <w:r>
-        <w:t xml:space="preserve"> </w:t>
-      </w:r>
-      <m:oMath>
-        <m:r>
-          <m:t>M</m:t>
-        </m:r>
-        <m:r>
-          <m:t>0</m:t>
-        </m:r>
-      </m:oMath>
-      <w:r>
-        <w:t xml:space="preserve">). This proportion is significantly lower than that obtained for tropical specialists. Yet, it has long been acknowledged that the migrant fossil record across both sides of the isthmus was essentially composed of taxa showing affinity with open biomes</w:t>
-      </w:r>
-      <w:r>
-        <w:rPr>
-          <w:i/>
-          <w:iCs/>
-          <w:vertAlign w:val="superscript"/>
-        </w:rPr>
-        <w:t xml:space="preserve">e</w:t>
-      </w:r>
-      <w:r>
-        <w:rPr>
-          <w:vertAlign w:val="superscript"/>
-        </w:rPr>
-        <w:t xml:space="preserve">.</w:t>
-      </w:r>
-      <w:r>
-        <w:rPr>
-          <w:i/>
-          <w:iCs/>
-          <w:vertAlign w:val="superscript"/>
-        </w:rPr>
-        <w:t xml:space="preserve">g</w:t>
-      </w:r>
-      <w:r>
-        <w:rPr>
-          <w:vertAlign w:val="superscript"/>
-        </w:rPr>
-        <w:t xml:space="preserve">., 24</w:t>
-      </w:r>
-      <w:r>
-        <w:t xml:space="preserve">. Among the most emblematic, we find for instance equids, proboscids or camelids on the South American side, and ground sloths, toxodontids or glyptodontids on the North American side. The co-occurrence of distinct taxa in temporally well-delimited fossil assemblages led palaeontologists to postulate that the GABI was in fact a succession of exchange pulses punctuated by phases of interruption, further related to the climate-driven oscillations between savannah and rainforest in Central America during the Pleistocene</w:t>
-      </w:r>
-      <w:r>
-        <w:rPr>
-          <w:vertAlign w:val="superscript"/>
-        </w:rPr>
-        <w:t xml:space="preserve">14</w:t>
-      </w:r>
-      <w:r>
-        <w:t xml:space="preserve">. Under such an assumption, the majority of exchanged taxa would therefore have ecologies suited to open habitats, and would have preferentially dispersed during Pleistocene glaciations</w:t>
-      </w:r>
-      <w:r>
-        <w:rPr>
-          <w:vertAlign w:val="superscript"/>
-        </w:rPr>
-        <w:t xml:space="preserve">11,13</w:t>
-      </w:r>
-      <w:r>
-        <w:t xml:space="preserve">. As mentioned by Weir</w:t>
-      </w:r>
-      <w:r>
-        <w:rPr>
-          <w:vertAlign w:val="superscript"/>
-        </w:rPr>
-        <w:t xml:space="preserve">50</w:t>
-      </w:r>
-      <w:r>
-        <w:t xml:space="preserve">, the American mammal fossil record is highly biased, with few occurrences coming from low-latitude tropical regions, which is particularly striking in South America</w:t>
-      </w:r>
-      <w:r>
-        <w:rPr>
-          <w:i/>
-          <w:iCs/>
-          <w:vertAlign w:val="superscript"/>
-        </w:rPr>
-        <w:t xml:space="preserve">e</w:t>
-      </w:r>
-      <w:r>
-        <w:rPr>
-          <w:vertAlign w:val="superscript"/>
-        </w:rPr>
-        <w:t xml:space="preserve">.</w:t>
-      </w:r>
-      <w:r>
-        <w:rPr>
-          <w:i/>
-          <w:iCs/>
-          <w:vertAlign w:val="superscript"/>
-        </w:rPr>
-        <w:t xml:space="preserve">g</w:t>
-      </w:r>
-      <w:r>
-        <w:rPr>
-          <w:vertAlign w:val="superscript"/>
-        </w:rPr>
-        <w:t xml:space="preserve">., 56,57</w:t>
-      </w:r>
-      <w:r>
-        <w:t xml:space="preserve">. Furthermore, evidence from extant mammal taxa suggest a strong tropical niche conservatism, that is, the trend according to which newly-originated tropical taxa would remain inhabiting under tropical climates</w:t>
-      </w:r>
-      <w:r>
-        <w:rPr>
-          <w:vertAlign w:val="superscript"/>
-        </w:rPr>
-        <w:t xml:space="preserve">49,58</w:t>
-      </w:r>
-      <w:r>
-        <w:t xml:space="preserve">. Thus, the fossil-derived number of mammal exchanges must have been greatly underestimated, with little fossil evidence of interchange constrained to the tropical biome, as stressed by Carrillo</w:t>
-      </w:r>
-      <w:r>
-        <w:rPr>
-          <w:vertAlign w:val="superscript"/>
-        </w:rPr>
-        <w:t xml:space="preserve">16</w:t>
-      </w:r>
-      <w:r>
-        <w:t xml:space="preserve">. Thus, one can wonder: could the empirically-derived migration imbalance in favour of North American taxa dispersing southwards be altered by the tropical niche conservatism of south-to-north migrants, thereby obscuring the actual number of intercontinental exchanges?</w:t>
-      </w:r>
-    </w:p>
-    <w:p>
-      <w:pPr>
-        <w:pStyle w:val="BodyText"/>
-      </w:pPr>
-      <w:r>
-        <w:t xml:space="preserve">Our findings revealed that radiations following a colonisation of South America were more spatially spread than those arising from a northwards dispersal, except for simulations generated under the</w:t>
-      </w:r>
-      <w:r>
-        <w:t xml:space="preserve"> </w:t>
-      </w:r>
-      <m:oMath>
-        <m:r>
-          <m:t>M</m:t>
-        </m:r>
-        <m:r>
-          <m:t>3</m:t>
-        </m:r>
-      </m:oMath>
-      <w:r>
-        <w:t xml:space="preserve"> </w:t>
-      </w:r>
-      <w:r>
-        <w:t xml:space="preserve">model (</w:t>
-      </w:r>
-      <w:hyperlink w:anchor="fig-metrics">
-        <w:r>
-          <w:rPr>
-            <w:rStyle w:val="Hyperlink"/>
-          </w:rPr>
-          <w:t xml:space="preserve">Figure 3</w:t>
-        </w:r>
-      </w:hyperlink>
-      <w:r>
-        <w:t xml:space="preserve"> </w:t>
-      </w:r>
-      <w:r>
-        <w:t xml:space="preserve">A). The spatial spread of a migrant radiation was measured by the proportion of cells occupied within the newly-colonised continent relative to the size of the latter. When focusing on the absolute number of cells colonised – therefore without controlling for the area, in terms of number of cells, of the newly-colonised continent – such a finding only holds for successful simulations generated under</w:t>
-      </w:r>
-      <w:r>
-        <w:t xml:space="preserve"> </w:t>
-      </w:r>
-      <m:oMath>
-        <m:r>
-          <m:t>M</m:t>
-        </m:r>
-        <m:r>
-          <m:t>0</m:t>
-        </m:r>
-      </m:oMath>
-      <w:r>
-        <w:t xml:space="preserve"> </w:t>
-      </w:r>
-      <w:r>
-        <w:t xml:space="preserve">(Figure S13). This mirrors the fact that simulated tropical specialists from South America were more intensively exchanged than other simulated biome specialists (</w:t>
-      </w:r>
-      <w:hyperlink w:anchor="fig-biome">
-        <w:r>
-          <w:rPr>
-            <w:rStyle w:val="Hyperlink"/>
-          </w:rPr>
-          <w:t xml:space="preserve">Figure 4</w:t>
-        </w:r>
-      </w:hyperlink>
-      <w:r>
-        <w:t xml:space="preserve"> </w:t>
-      </w:r>
-      <w:r>
-        <w:t xml:space="preserve">C). The imposed tropical niche conservatism therefore constrained them to remain in tropical regions of North America, that are less represented in tropical North America than in South America (</w:t>
-      </w:r>
-      <w:hyperlink w:anchor="fig-biome">
-        <w:r>
-          <w:rPr>
-            <w:rStyle w:val="Hyperlink"/>
-          </w:rPr>
-          <w:t xml:space="preserve">Figure 4</w:t>
-        </w:r>
-      </w:hyperlink>
-      <w:r>
-        <w:t xml:space="preserve"> </w:t>
-      </w:r>
-      <w:r>
-        <w:t xml:space="preserve">A). This adds some evidence supporting the fact that climate would have permitted South-to-North tropical exchanges to take place, but might have been obscured by a subsequent taphonomic bias in the fossil record, as suggested by studies relying on dated phylogenies</w:t>
-      </w:r>
-      <w:r>
-        <w:rPr>
-          <w:vertAlign w:val="superscript"/>
-        </w:rPr>
-        <w:t xml:space="preserve">12,16</w:t>
-      </w:r>
-      <w:r>
-        <w:t xml:space="preserve">. Hence, our study calls for thinking about the distinction between the ability to disperse towards, and ability to maintain within the foreign area. Those two distinct processes may have been ruled by different factors.</w:t>
-      </w:r>
-    </w:p>
-    <w:p>
-      <w:pPr>
-        <w:pStyle w:val="BodyText"/>
-      </w:pPr>
-      <w:r>
-        <w:t xml:space="preserve">We tested tropical niche conservatism (Figure S12 and S14)</w:t>
-      </w:r>
-    </w:p>
-    <w:p>
-      <w:pPr>
-        <w:pStyle w:val="BodyText"/>
-      </w:pPr>
-      <w:r>
-        <w:t xml:space="preserve">Our simulations cast doubt on the interplay between the aforementioned exchange pulses and temperature fluctuations, as exemplified by the combined times of occurrence of all successful exchanges (either southwards or northwards, depending on whether the simulation started from North or South America) occurring in all the simulations generated under a given landmass-scenario combination (Figure S11). In the case of northwards dispersal events, a gradual increase in exchange frequency from the Plio-Pleistocene boundary onwards is to be reported (Figure S11,</w:t>
-      </w:r>
-      <w:r>
-        <w:t xml:space="preserve"> </w:t>
-      </w:r>
-      <w:r>
-        <w:rPr>
-          <w:i/>
-          <w:iCs/>
-        </w:rPr>
-        <w:t xml:space="preserve">right</w:t>
-      </w:r>
-      <w:r>
-        <w:t xml:space="preserve">). This might reflect the average waiting time that virtual radiations take to reach the isthmian zone, directly proportional to their initial distance to the isthmus (Figure S4−5). Note that this explanation does not invoke any implication of climate. Regarding southwards exchanges, the same pattern seems to arise for simulations generated under the</w:t>
-      </w:r>
-      <w:r>
-        <w:t xml:space="preserve"> </w:t>
-      </w:r>
-      <m:oMath>
-        <m:r>
-          <m:t>M</m:t>
-        </m:r>
-        <m:r>
-          <m:t>1</m:t>
-        </m:r>
-      </m:oMath>
-      <w:r>
-        <w:t xml:space="preserve"> </w:t>
-      </w:r>
-      <w:r>
-        <w:t xml:space="preserve">model, but not under</w:t>
-      </w:r>
-      <w:r>
-        <w:t xml:space="preserve"> </w:t>
-      </w:r>
-      <m:oMath>
-        <m:r>
-          <m:t>M</m:t>
-        </m:r>
-        <m:r>
-          <m:t>0</m:t>
-        </m:r>
-      </m:oMath>
-      <w:r>
-        <w:t xml:space="preserve"> </w:t>
-      </w:r>
-      <w:r>
-        <w:t xml:space="preserve">(Figure S11). The distribution of the exchange times in the latter case rather exhibits sporadic pulses</w:t>
-      </w:r>
-      <w:r>
-        <w:t xml:space="preserve"> </w:t>
-      </w:r>
-      <w:r>
-        <w:rPr>
-          <w:i/>
-          <w:iCs/>
-        </w:rPr>
-        <w:t xml:space="preserve">ca.</w:t>
-      </w:r>
-      <w:r>
-        <w:t xml:space="preserve"> </w:t>
-      </w:r>
-      <w:r>
-        <w:t xml:space="preserve">0.2, 0.5, 0.8, 1.2, 1.9, 2.5 Ma, which could match with some temperature minima, but accurately testing such an observation would require additional data. Rather, the sporadic character of exchange pulses in that case could simply come from the relatively low amount of successful simulations as compared to other modelling scenarios (Table S3). Overall, our simulations suggest that the relationship between temperature minima and pulses of faunal exchange between the Americas seems to be more complex than previously stated</w:t>
-      </w:r>
-      <w:r>
-        <w:rPr>
-          <w:vertAlign w:val="superscript"/>
-        </w:rPr>
-        <w:t xml:space="preserve">11,</w:t>
-      </w:r>
-      <w:r>
-        <w:rPr>
-          <w:i/>
-          <w:iCs/>
-          <w:vertAlign w:val="superscript"/>
-        </w:rPr>
-        <w:t xml:space="preserve">e</w:t>
-      </w:r>
-      <w:r>
-        <w:rPr>
-          <w:vertAlign w:val="superscript"/>
-        </w:rPr>
-        <w:t xml:space="preserve">.</w:t>
-      </w:r>
-      <w:r>
-        <w:rPr>
-          <w:i/>
-          <w:iCs/>
-          <w:vertAlign w:val="superscript"/>
-        </w:rPr>
-        <w:t xml:space="preserve">g</w:t>
-      </w:r>
-      <w:r>
-        <w:rPr>
-          <w:vertAlign w:val="superscript"/>
-        </w:rPr>
-        <w:t xml:space="preserve">., 14,24,29,30</w:t>
-      </w:r>
-      <w:r>
-        <w:t xml:space="preserve">.</w:t>
-      </w:r>
-    </w:p>
-    <w:p>
-      <w:pPr>
-        <w:pStyle w:val="BodyText"/>
-      </w:pPr>
-      <w:r>
-        <w:t xml:space="preserve">Our findings nevertheless leave some space for possible random effects purely related to geography. Indeed, irrespective of the initial landmass, successful simulations originated on average closer to the isthmus of Panama than unsuccessful ones (Figures S6–7). This may suggest that some simulations were unsuccessful not only because of climatic filters, but also because they simply started too far from the landbridge and did not have the chance to reach it throughout the duration of the simulation. The relationship between the success of a taxon to make it to the other continent and the distance between its geographic range and the isthmus of Panama has long been postulated in the literature</w:t>
-      </w:r>
-      <w:r>
-        <w:rPr>
-          <w:i/>
-          <w:iCs/>
-          <w:vertAlign w:val="superscript"/>
-        </w:rPr>
-        <w:t xml:space="preserve">e</w:t>
-      </w:r>
-      <w:r>
-        <w:rPr>
-          <w:vertAlign w:val="superscript"/>
-        </w:rPr>
-        <w:t xml:space="preserve">.</w:t>
-      </w:r>
-      <w:r>
-        <w:rPr>
-          <w:i/>
-          <w:iCs/>
-          <w:vertAlign w:val="superscript"/>
-        </w:rPr>
-        <w:t xml:space="preserve">g</w:t>
-      </w:r>
-      <w:r>
-        <w:rPr>
-          <w:vertAlign w:val="superscript"/>
-        </w:rPr>
-        <w:t xml:space="preserve">., 19</w:t>
-      </w:r>
-      <w:r>
-        <w:t xml:space="preserve">. Webb</w:t>
-      </w:r>
-      <w:r>
-        <w:rPr>
-          <w:vertAlign w:val="superscript"/>
-        </w:rPr>
-        <w:t xml:space="preserve">14</w:t>
-      </w:r>
-      <w:r>
-        <w:t xml:space="preserve"> </w:t>
-      </w:r>
-      <w:r>
-        <w:t xml:space="preserve">greatly illustrated this view with the example of antilocaprids, that</w:t>
-      </w:r>
-      <w:r>
-        <w:t xml:space="preserve"> </w:t>
-      </w:r>
-      <w:r>
-        <w:t xml:space="preserve">“</w:t>
-      </w:r>
-      <w:r>
-        <w:t xml:space="preserve">were probably capable of living somewhere in the Andes, [but] were simply too far from the isthmian link to make the exodus</w:t>
-      </w:r>
-      <w:r>
-        <w:t xml:space="preserve">”</w:t>
-      </w:r>
-      <w:r>
-        <w:t xml:space="preserve">. A recent study characterised a negative correlation between the proportion of migrant taxa within fossil assemblages of either North or South America and the distance of the fossil assemblage to the Panamanian landbridge</w:t>
-      </w:r>
-      <w:r>
-        <w:rPr>
-          <w:vertAlign w:val="superscript"/>
-        </w:rPr>
-        <w:t xml:space="preserve">59</w:t>
-      </w:r>
-      <w:r>
-        <w:t xml:space="preserve">. Therefore, geographic contingency must have also had a significant role to play in the asymmetry of the GABI.</w:t>
-      </w:r>
-    </w:p>
-    <w:bookmarkEnd w:id="28"/>
-    <w:bookmarkStart w:id="29" w:name="limitations-and-perspectives"/>
-    <w:p>
-      <w:pPr>
-        <w:pStyle w:val="Heading2"/>
-      </w:pPr>
-      <w:r>
-        <w:t xml:space="preserve">Limitations and perspectives</w:t>
-      </w:r>
-    </w:p>
-    <w:p>
-      <w:pPr>
-        <w:pStyle w:val="FirstParagraph"/>
-      </w:pPr>
-      <w:r>
-        <w:t xml:space="preserve">Differences in the pace at which migrant and native lineages diversified have long been proposed to play a significant role in the asymmetry of the GABI. By reconstructing raw macroevolutionary dynamics from the fossil record, Marshall et al.</w:t>
-      </w:r>
-      <w:r>
-        <w:rPr>
-          <w:vertAlign w:val="superscript"/>
-        </w:rPr>
-        <w:t xml:space="preserve">2</w:t>
-      </w:r>
-      <w:r>
-        <w:t xml:space="preserve"> </w:t>
-      </w:r>
-      <w:r>
-        <w:t xml:space="preserve">highlighted that northern immigrant genera experienced notoriously higher origination and lower extinction rates than native lineages in South America. More recently, using a Bayesian framework accounting for preservation heterogeneities to infer fossil-based macroevolutionary trends, Carrillo et al.</w:t>
-      </w:r>
-      <w:r>
-        <w:rPr>
-          <w:vertAlign w:val="superscript"/>
-        </w:rPr>
-        <w:t xml:space="preserve">16</w:t>
-      </w:r>
-      <w:r>
-        <w:t xml:space="preserve"> </w:t>
-      </w:r>
-      <w:r>
-        <w:t xml:space="preserve">showed that the asymmetry of the GABI was not due to differences in origination or dispersal rates, but rather in extinction rates: native South American lineages experienced more extinctions in their home range than migrant lineages. In our simulations, for a species to go extinct, it needs to disappear from each cell across the landscape. As environmental filtering – in our case, the only force driving diversification – acts at the scale of a pixel, species extinction is therefore very rare. As a result, our framework did not allow us to relate the simulated environment-dependent inter-American faunal exchange with any diversification process. Realistic modelling of macroevolutionary processes is therefore an avenue towards improvements among mechanistic eco-evolutionary simulators, particularly in the framework of the GABI.</w:t>
-      </w:r>
-    </w:p>
-    <w:p>
-      <w:pPr>
-        <w:pStyle w:val="BodyText"/>
-      </w:pPr>
-      <w:r>
-        <w:t xml:space="preserve">Also, we evidenced a nuance between the proportion of colonised area and the absolute colonised area (</w:t>
-      </w:r>
-      <w:hyperlink w:anchor="fig-metrics">
-        <w:r>
-          <w:rPr>
-            <w:rStyle w:val="Hyperlink"/>
-          </w:rPr>
-          <w:t xml:space="preserve">Figure 3</w:t>
-        </w:r>
-      </w:hyperlink>
-      <w:r>
-        <w:t xml:space="preserve"> </w:t>
-      </w:r>
-      <w:r>
         <w:t xml:space="preserve">and S13) simply comes from the imbalanced number of pixels between the two landmasses, being around two times larger for North America than for South America (</w:t>
       </w:r>
       <w:hyperlink w:anchor="fig-framework">
@@ -3574,7 +3616,7 @@
           <w:rPr>
             <w:rStyle w:val="Hyperlink"/>
           </w:rPr>
-          <w:t xml:space="preserve">Figure 1</w:t>
+          <w:t xml:space="preserve">Figure 2</w:t>
         </w:r>
       </w:hyperlink>
       <w:r>
@@ -3744,7 +3786,7 @@
           <w:rPr>
             <w:rStyle w:val="Hyperlink"/>
           </w:rPr>
-          <w:t xml:space="preserve">Figure 1</w:t>
+          <w:t xml:space="preserve">Figure 2</w:t>
         </w:r>
       </w:hyperlink>
       <w:r>
@@ -6832,7 +6874,7 @@
     <w:bookmarkEnd w:id="159"/>
     <w:bookmarkEnd w:id="160"/>
     <w:bookmarkEnd w:id="161"/>
-    <w:bookmarkStart w:id="178" w:name="figures"/>
+    <w:bookmarkStart w:id="182" w:name="figures"/>
     <w:p>
       <w:pPr>
         <w:pStyle w:val="Heading1"/>
@@ -6854,7 +6896,110 @@
       <w:tr>
         <w:tc>
           <w:tcPr/>
-          <w:bookmarkStart w:id="165" w:name="fig-framework"/>
+          <w:bookmarkStart w:id="165" w:name="fig-hypotheses"/>
+          <w:p>
+            <w:pPr>
+              <w:pStyle w:val="Compact"/>
+              <w:jc w:val="center"/>
+            </w:pPr>
+            <w:r>
+              <w:drawing>
+                <wp:inline>
+                  <wp:extent cx="4679999" cy="4679999"/>
+                  <wp:effectExtent b="0" l="0" r="0" t="0"/>
+                  <wp:docPr descr="" title="" id="163" name="Picture"/>
+                  <a:graphic>
+                    <a:graphicData uri="http://schemas.openxmlformats.org/drawingml/2006/picture">
+                      <pic:pic>
+                        <pic:nvPicPr>
+                          <pic:cNvPr descr="../Figures/MS/Main/Figure_intro/Figure_hypotheses.png" id="164" name="Picture"/>
+                          <pic:cNvPicPr>
+                            <a:picLocks noChangeArrowheads="1" noChangeAspect="1"/>
+                          </pic:cNvPicPr>
+                        </pic:nvPicPr>
+                        <pic:blipFill>
+                          <a:blip r:embed="rId162"/>
+                          <a:stretch>
+                            <a:fillRect/>
+                          </a:stretch>
+                        </pic:blipFill>
+                        <pic:spPr bwMode="auto">
+                          <a:xfrm>
+                            <a:off x="0" y="0"/>
+                            <a:ext cx="4679999" cy="4679999"/>
+                          </a:xfrm>
+                          <a:prstGeom prst="rect">
+                            <a:avLst/>
+                          </a:prstGeom>
+                          <a:noFill/>
+                          <a:ln w="9525">
+                            <a:noFill/>
+                            <a:headEnd/>
+                            <a:tailEnd/>
+                          </a:ln>
+                        </pic:spPr>
+                      </pic:pic>
+                    </a:graphicData>
+                  </a:graphic>
+                </wp:inline>
+              </w:drawing>
+            </w:r>
+          </w:p>
+          <w:p>
+            <w:pPr>
+              <w:jc w:val="center"/>
+            </w:pPr>
+            <w:pPr>
+              <w:jc w:val="start"/>
+              <w:spacing w:before="200"/>
+              <w:pStyle w:val="ImageCaption"/>
+            </w:pPr>
+            <w:r>
+              <w:t xml:space="preserve">Figure 1: The two nonmutually-exclusive hypotheses relating the asymmetry of the GABI to the Pleistocene climatic oscillations, formulated in the framework of land mammals. Both involve biome transition from close tropical rainforest (green) during interglacial periods − warm and humid − to open savannah/desert (dark yellow) during glacial maxima − cold and dry − in the isthmian region. The first one (A), formulated by Webb</w:t>
+            </w:r>
+            <w:r>
+              <w:rPr>
+                <w:vertAlign w:val="superscript"/>
+              </w:rPr>
+              <w:t xml:space="preserve">14</w:t>
+            </w:r>
+            <w:r>
+              <w:t xml:space="preserve"> </w:t>
+            </w:r>
+            <w:r>
+              <w:t xml:space="preserve">views the asymmetry of the GABI as the result from the fact that North America had a higher pool of open-adapted taxa than South America. The opening of the isthmian region acted as an ecological filter favouring the dispersal of these open-adapted taxa to the detriment of the others. Hence, given the imbalance in open-adapted pool size between the two continents, more species would have been expected to disperse to the South than the other way around. The second one (B), formulated by Vrba</w:t>
+            </w:r>
+            <w:r>
+              <w:rPr>
+                <w:vertAlign w:val="superscript"/>
+              </w:rPr>
+              <w:t xml:space="preserve">24</w:t>
+            </w:r>
+            <w:r>
+              <w:t xml:space="preserve"> </w:t>
+            </w:r>
+            <w:r>
+              <w:t xml:space="preserve">proposes that the contraction of the tropical biome towards the equator triggered by the interglacial-glacial transition would have mechanically attracted tropical specialists southwards, irrespective of their continent of origin. Silhouettes are from phylopic, credits are available in Table S3.</w:t>
+            </w:r>
+          </w:p>
+          <w:bookmarkEnd w:id="165"/>
+        </w:tc>
+      </w:tr>
+    </w:tbl>
+    <w:tbl>
+      <w:tblPr>
+        <w:tblStyle w:val="Table"/>
+        <w:tblW w:type="pct" w:w="5000"/>
+        <w:tblLayout w:type="fixed"/>
+        <w:tblLook w:firstRow="0" w:lastRow="0" w:firstColumn="0" w:lastColumn="0" w:noHBand="0" w:noVBand="0" w:val="0000"/>
+      </w:tblPr>
+      <w:tblGrid>
+        <w:gridCol w:w="7920"/>
+      </w:tblGrid>
+      <w:tr>
+        <w:tc>
+          <w:tcPr/>
+          <w:bookmarkStart w:id="169" w:name="fig-framework"/>
           <w:p>
             <w:pPr>
               <w:pStyle w:val="Compact"/>
@@ -6865,18 +7010,18 @@
                 <wp:inline>
                   <wp:extent cx="3959999" cy="3959999"/>
                   <wp:effectExtent b="0" l="0" r="0" t="0"/>
-                  <wp:docPr descr="" title="" id="163" name="Picture"/>
+                  <wp:docPr descr="" title="" id="167" name="Picture"/>
                   <a:graphic>
                     <a:graphicData uri="http://schemas.openxmlformats.org/drawingml/2006/picture">
                       <pic:pic>
                         <pic:nvPicPr>
-                          <pic:cNvPr descr="../Figures/MS/Main/Figure_framework/Figure_framework.png" id="164" name="Picture"/>
+                          <pic:cNvPr descr="../Figures/MS/Main/Figure_framework/Figure_framework.png" id="168" name="Picture"/>
                           <pic:cNvPicPr>
                             <a:picLocks noChangeArrowheads="1" noChangeAspect="1"/>
                           </pic:cNvPicPr>
                         </pic:nvPicPr>
                         <pic:blipFill>
-                          <a:blip r:embed="rId162"/>
+                          <a:blip r:embed="rId166"/>
                           <a:stretch>
                             <a:fillRect/>
                           </a:stretch>
@@ -6913,7 +7058,7 @@
               <w:pStyle w:val="ImageCaption"/>
             </w:pPr>
             <w:r>
-              <w:t xml:space="preserve">Figure 1: Average palaeoclimate histories within our studied landmasses. North America is displayed in coral red and South America in cyan. Spatially-averaged climate variables (Annual Temperature and Precipitation) are taken from the PALEO-PGEM palaeoclimate emulator</w:t>
+              <w:t xml:space="preserve">Figure 2: Average palaeoclimate histories within our studied landmasses. North America is displayed in coral red and South America in cyan. Spatially-averaged climate variables (Annual Temperature and Precipitation) are taken from the PALEO-PGEM palaeoclimate emulator</w:t>
             </w:r>
             <w:r>
               <w:rPr>
@@ -6937,7 +7082,7 @@
               <w:t xml:space="preserve">is indicated by the light purple vertical bands. The empirically-derived asymmetry of the transcontinental land mammal exchange is represented by the thickness of the two arrows, the thicker the arrow, the more intense the exchange.</w:t>
             </w:r>
           </w:p>
-          <w:bookmarkEnd w:id="165"/>
+          <w:bookmarkEnd w:id="169"/>
         </w:tc>
       </w:tr>
     </w:tbl>
@@ -6954,7 +7099,7 @@
       <w:tr>
         <w:tc>
           <w:tcPr/>
-          <w:bookmarkStart w:id="169" w:name="fig-propsuccess"/>
+          <w:bookmarkStart w:id="173" w:name="fig-propsuccess"/>
           <w:p>
             <w:pPr>
               <w:pStyle w:val="Compact"/>
@@ -6965,18 +7110,18 @@
                 <wp:inline>
                   <wp:extent cx="3599999" cy="3779999"/>
                   <wp:effectExtent b="0" l="0" r="0" t="0"/>
-                  <wp:docPr descr="" title="" id="167" name="Picture"/>
+                  <wp:docPr descr="" title="" id="171" name="Picture"/>
                   <a:graphic>
                     <a:graphicData uri="http://schemas.openxmlformats.org/drawingml/2006/picture">
                       <pic:pic>
                         <pic:nvPicPr>
-                          <pic:cNvPr descr="../Figures/MS/Main/Figure_PropSuccess/Figure_PropSuccess.png" id="168" name="Picture"/>
+                          <pic:cNvPr descr="../Figures/MS/Main/Figure_PropSuccess/Figure_PropSuccess.png" id="172" name="Picture"/>
                           <pic:cNvPicPr>
                             <a:picLocks noChangeArrowheads="1" noChangeAspect="1"/>
                           </pic:cNvPicPr>
                         </pic:nvPicPr>
                         <pic:blipFill>
-                          <a:blip r:embed="rId166"/>
+                          <a:blip r:embed="rId170"/>
                           <a:stretch>
                             <a:fillRect/>
                           </a:stretch>
@@ -7013,7 +7158,7 @@
               <w:pStyle w:val="ImageCaption"/>
             </w:pPr>
             <w:r>
-              <w:t xml:space="preserve">Figure 2: Proportion of simulations leading to a successful exchange to the other continent, computed as the ratio, given an initial continent and a modelling scenario, between the number of simulations leading to a transcontinental exchange and the total number of simulations resulting in at least one living species at the final state. From left to right are depicted the outcome of the zero-adaptationist model (</w:t>
+              <w:t xml:space="preserve">Figure 3: Proportion of simulations leading to a successful exchange to the other continent, computed as the ratio, given an initial continent and a modelling scenario, between the number of simulations leading to a transcontinental exchange and the total number of simulations resulting in at least one living species at the final state. From left to right are depicted the outcome of the zero-adaptationist model (</w:t>
             </w:r>
             <m:oMath>
               <m:r>
@@ -7077,7 +7222,7 @@
               <w:t xml:space="preserve">). Each individual plot shows the outcome of simulations starting in North (red) and South (cyan) America. Dots represent mean proportion estimates and error bars show their associated Binomial-derived 95% confidence interval.</w:t>
             </w:r>
           </w:p>
-          <w:bookmarkEnd w:id="169"/>
+          <w:bookmarkEnd w:id="173"/>
         </w:tc>
       </w:tr>
     </w:tbl>
@@ -7094,7 +7239,7 @@
       <w:tr>
         <w:tc>
           <w:tcPr/>
-          <w:bookmarkStart w:id="173" w:name="fig-metrics"/>
+          <w:bookmarkStart w:id="177" w:name="fig-metrics"/>
           <w:p>
             <w:pPr>
               <w:pStyle w:val="Compact"/>
@@ -7105,18 +7250,18 @@
                 <wp:inline>
                   <wp:extent cx="5039999" cy="4319999"/>
                   <wp:effectExtent b="0" l="0" r="0" t="0"/>
-                  <wp:docPr descr="" title="" id="171" name="Picture"/>
+                  <wp:docPr descr="" title="" id="175" name="Picture"/>
                   <a:graphic>
                     <a:graphicData uri="http://schemas.openxmlformats.org/drawingml/2006/picture">
                       <pic:pic>
                         <pic:nvPicPr>
-                          <pic:cNvPr descr="../Figures/MS/Main/Figure_metrics/Figure_metrics.png" id="172" name="Picture"/>
+                          <pic:cNvPr descr="../Figures/MS/Main/Figure_metrics/Figure_metrics.png" id="176" name="Picture"/>
                           <pic:cNvPicPr>
                             <a:picLocks noChangeArrowheads="1" noChangeAspect="1"/>
                           </pic:cNvPicPr>
                         </pic:nvPicPr>
                         <pic:blipFill>
-                          <a:blip r:embed="rId170"/>
+                          <a:blip r:embed="rId174"/>
                           <a:stretch>
                             <a:fillRect/>
                           </a:stretch>
@@ -7153,7 +7298,7 @@
               <w:pStyle w:val="ImageCaption"/>
             </w:pPr>
             <w:r>
-              <w:t xml:space="preserve">Figure 3: A few metrics summarising climate-mediated interchange derived from successful simulations,</w:t>
+              <w:t xml:space="preserve">Figure 4: A few metrics summarising climate-mediated interchange derived from successful simulations,</w:t>
             </w:r>
             <w:r>
               <w:t xml:space="preserve"> </w:t>
@@ -7186,7 +7331,7 @@
                 <w:rPr>
                   <w:rStyle w:val="Hyperlink"/>
                 </w:rPr>
-                <w:t xml:space="preserve">Figure 2</w:t>
+                <w:t xml:space="preserve">Figure 3</w:t>
               </w:r>
             </w:hyperlink>
             <w:r>
@@ -7267,7 +7412,7 @@
               <w:t xml:space="preserve">., successfully reaching the continent where it did not originate. Mean estimates and their associated Student-derived 95% confidence interval are displayed over their distribution.</w:t>
             </w:r>
           </w:p>
-          <w:bookmarkEnd w:id="173"/>
+          <w:bookmarkEnd w:id="177"/>
         </w:tc>
       </w:tr>
     </w:tbl>
@@ -7284,7 +7429,7 @@
       <w:tr>
         <w:tc>
           <w:tcPr/>
-          <w:bookmarkStart w:id="177" w:name="fig-biome"/>
+          <w:bookmarkStart w:id="181" w:name="fig-biome"/>
           <w:p>
             <w:pPr>
               <w:pStyle w:val="Compact"/>
@@ -7295,18 +7440,18 @@
                 <wp:inline>
                   <wp:extent cx="5399999" cy="5399999"/>
                   <wp:effectExtent b="0" l="0" r="0" t="0"/>
-                  <wp:docPr descr="" title="" id="175" name="Picture"/>
+                  <wp:docPr descr="" title="" id="179" name="Picture"/>
                   <a:graphic>
                     <a:graphicData uri="http://schemas.openxmlformats.org/drawingml/2006/picture">
                       <pic:pic>
                         <pic:nvPicPr>
-                          <pic:cNvPr descr="../Figures/MS/Main/Figure_biomes/Figure_biomes.png" id="176" name="Picture"/>
+                          <pic:cNvPr descr="../Figures/MS/Main/Figure_biomes/Figure_biomes.png" id="180" name="Picture"/>
                           <pic:cNvPicPr>
                             <a:picLocks noChangeArrowheads="1" noChangeAspect="1"/>
                           </pic:cNvPicPr>
                         </pic:nvPicPr>
                         <pic:blipFill>
-                          <a:blip r:embed="rId174"/>
+                          <a:blip r:embed="rId178"/>
                           <a:stretch>
                             <a:fillRect/>
                           </a:stretch>
@@ -7343,7 +7488,7 @@
               <w:pStyle w:val="ImageCaption"/>
             </w:pPr>
             <w:r>
-              <w:t xml:space="preserve">Figure 4: Initial biome where each ancestral species leading to successful simulations is recorded at the time of the onset of the simulations (5 Ma).</w:t>
+              <w:t xml:space="preserve">Figure 5: Initial biome where each ancestral species leading to successful simulations is recorded at the time of the onset of the simulations (5 Ma).</w:t>
             </w:r>
             <w:r>
               <w:t xml:space="preserve"> </w:t>
@@ -7417,11 +7562,11 @@
               <w:t xml:space="preserve">Proportion of successful simulations based on the biome where ancestral species originates, for each modelled scenario-ancestral continent combination. This proportion is expressed as the ratio between the number of successful simulations and the total number of simulations starting from a given biome. Coloured dots and error bars respectively show proportion estimates and their associated Binomial-derived 95% confidence intervals.</w:t>
             </w:r>
           </w:p>
-          <w:bookmarkEnd w:id="177"/>
+          <w:bookmarkEnd w:id="181"/>
         </w:tc>
       </w:tr>
     </w:tbl>
-    <w:bookmarkEnd w:id="178"/>
+    <w:bookmarkEnd w:id="182"/>
     <w:sectPr>
       <w:type w:val="nextPage"/>
       <w:pgSz w:h="15840" w:w="12240"/>

</xml_diff>